<commit_message>
Update India–Pakistan Relations lecturette to the new six-stage flow
Co-Authored-By: Claude Opus 5.5 <noreply@anthropic.com>
Claude-Session: https://claude.ai/code/session_01EyrV2JLtXrELkAF97b5fch
</commit_message>
<xml_diff>
--- a/SSB_Lecturettes.docx
+++ b/SSB_Lecturettes.docx
@@ -218,7 +218,7 @@
                 <w:sz w:val="21"/>
                 <w:szCs w:val="21"/>
               </w:rPr>
-              <w:t xml:space="preserve">Origin</w:t>
+              <w:t xml:space="preserve">What is it</w:t>
             </w:r>
           </w:p>
         </w:tc>
@@ -248,41 +248,24 @@
                 <w:sz w:val="21"/>
                 <w:szCs w:val="21"/>
               </w:rPr>
-              <w:t xml:space="preserve">1947 Partition</w:t>
-            </w:r>
-            <w:r>
-              <w:rPr>
-                <w:b/>
-                <w:bCs/>
-                <w:color w:val="C00000"/>
-                <w:sz w:val="21"/>
-                <w:szCs w:val="21"/>
-              </w:rPr>
-              <w:t xml:space="preserve">  →  </w:t>
-            </w:r>
-            <w:r>
-              <w:rPr>
-                <w:sz w:val="21"/>
-                <w:szCs w:val="21"/>
-              </w:rPr>
-              <w:t xml:space="preserve">Kashmir dispute</w:t>
-            </w:r>
-            <w:r>
-              <w:rPr>
-                <w:b/>
-                <w:bCs/>
-                <w:color w:val="C00000"/>
-                <w:sz w:val="21"/>
-                <w:szCs w:val="21"/>
-              </w:rPr>
-              <w:t xml:space="preserve">  →  </w:t>
-            </w:r>
-            <w:r>
-              <w:rPr>
-                <w:sz w:val="21"/>
-                <w:szCs w:val="21"/>
-              </w:rPr>
-              <w:t xml:space="preserve">1948 first war</w:t>
+              <w:t xml:space="preserve">Relationship between two nuclear-armed neighbours, born of the 1947 Partition</w:t>
+            </w:r>
+            <w:r>
+              <w:rPr>
+                <w:b/>
+                <w:bCs/>
+                <w:color w:val="C00000"/>
+                <w:sz w:val="21"/>
+                <w:szCs w:val="21"/>
+              </w:rPr>
+              <w:t xml:space="preserve">  →  </w:t>
+            </w:r>
+            <w:r>
+              <w:rPr>
+                <w:sz w:val="21"/>
+                <w:szCs w:val="21"/>
+              </w:rPr>
+              <w:t xml:space="preserve">Shaped by Kashmir, four wars (1947–48, 1965, 1971, 1999 Kargil) and cross-border terrorism</w:t>
             </w:r>
           </w:p>
         </w:tc>
@@ -354,7 +337,7 @@
                 <w:sz w:val="21"/>
                 <w:szCs w:val="21"/>
               </w:rPr>
-              <w:t xml:space="preserve">Wars &amp; conflicts</w:t>
+              <w:t xml:space="preserve">Why it matters</w:t>
             </w:r>
           </w:p>
         </w:tc>
@@ -385,58 +368,75 @@
                 <w:sz w:val="21"/>
                 <w:szCs w:val="21"/>
               </w:rPr>
-              <w:t xml:space="preserve">1965</w:t>
-            </w:r>
-            <w:r>
-              <w:rPr>
-                <w:b/>
-                <w:bCs/>
-                <w:color w:val="C00000"/>
-                <w:sz w:val="21"/>
-                <w:szCs w:val="21"/>
-              </w:rPr>
-              <w:t xml:space="preserve">  →  </w:t>
-            </w:r>
-            <w:r>
-              <w:rPr>
-                <w:sz w:val="21"/>
-                <w:szCs w:val="21"/>
-              </w:rPr>
-              <w:t xml:space="preserve">1971 (Bangladesh created)</w:t>
-            </w:r>
-            <w:r>
-              <w:rPr>
-                <w:b/>
-                <w:bCs/>
-                <w:color w:val="C00000"/>
-                <w:sz w:val="21"/>
-                <w:szCs w:val="21"/>
-              </w:rPr>
-              <w:t xml:space="preserve">  →  </w:t>
-            </w:r>
-            <w:r>
-              <w:rPr>
-                <w:sz w:val="21"/>
-                <w:szCs w:val="21"/>
-              </w:rPr>
-              <w:t xml:space="preserve">1999 Kargil</w:t>
-            </w:r>
-            <w:r>
-              <w:rPr>
-                <w:b/>
-                <w:bCs/>
-                <w:color w:val="C00000"/>
-                <w:sz w:val="21"/>
-                <w:szCs w:val="21"/>
-              </w:rPr>
-              <w:t xml:space="preserve">  →  </w:t>
-            </w:r>
-            <w:r>
-              <w:rPr>
-                <w:sz w:val="21"/>
-                <w:szCs w:val="21"/>
-              </w:rPr>
-              <w:t xml:space="preserve">recurring LoC tensions</w:t>
+              <w:t xml:space="preserve">Security: nuclear flashpoint, active LoC</w:t>
+            </w:r>
+            <w:r>
+              <w:rPr>
+                <w:b/>
+                <w:bCs/>
+                <w:color w:val="C00000"/>
+                <w:sz w:val="21"/>
+                <w:szCs w:val="21"/>
+              </w:rPr>
+              <w:t xml:space="preserve">  →  </w:t>
+            </w:r>
+            <w:r>
+              <w:rPr>
+                <w:sz w:val="21"/>
+                <w:szCs w:val="21"/>
+              </w:rPr>
+              <w:t xml:space="preserve">Regional: SAARC stalled, South Asia's growth held back</w:t>
+            </w:r>
+            <w:r>
+              <w:rPr>
+                <w:b/>
+                <w:bCs/>
+                <w:color w:val="C00000"/>
+                <w:sz w:val="21"/>
+                <w:szCs w:val="21"/>
+              </w:rPr>
+              <w:t xml:space="preserve">  →  </w:t>
+            </w:r>
+            <w:r>
+              <w:rPr>
+                <w:sz w:val="21"/>
+                <w:szCs w:val="21"/>
+              </w:rPr>
+              <w:t xml:space="preserve">Strategic: China–Pakistan nexus, Afghanistan</w:t>
+            </w:r>
+            <w:r>
+              <w:rPr>
+                <w:b/>
+                <w:bCs/>
+                <w:color w:val="C00000"/>
+                <w:sz w:val="21"/>
+                <w:szCs w:val="21"/>
+              </w:rPr>
+              <w:t xml:space="preserve">  →  </w:t>
+            </w:r>
+            <w:r>
+              <w:rPr>
+                <w:sz w:val="21"/>
+                <w:szCs w:val="21"/>
+              </w:rPr>
+              <w:t xml:space="preserve">Economic: heavy defence spending, lost trade</w:t>
+            </w:r>
+            <w:r>
+              <w:rPr>
+                <w:b/>
+                <w:bCs/>
+                <w:color w:val="C00000"/>
+                <w:sz w:val="21"/>
+                <w:szCs w:val="21"/>
+              </w:rPr>
+              <w:t xml:space="preserve">  →  </w:t>
+            </w:r>
+            <w:r>
+              <w:rPr>
+                <w:sz w:val="21"/>
+                <w:szCs w:val="21"/>
+              </w:rPr>
+              <w:t xml:space="preserve">Global: terrorism and nuclear risk concern the world</w:t>
             </w:r>
           </w:p>
         </w:tc>
@@ -506,7 +506,7 @@
                 <w:sz w:val="21"/>
                 <w:szCs w:val="21"/>
               </w:rPr>
-              <w:t xml:space="preserve">Core issues</w:t>
+              <w:t xml:space="preserve">Current status in India</w:t>
             </w:r>
           </w:p>
         </w:tc>
@@ -536,58 +536,109 @@
                 <w:sz w:val="21"/>
                 <w:szCs w:val="21"/>
               </w:rPr>
-              <w:t xml:space="preserve">Kashmir</w:t>
-            </w:r>
-            <w:r>
-              <w:rPr>
-                <w:b/>
-                <w:bCs/>
-                <w:color w:val="C00000"/>
-                <w:sz w:val="21"/>
-                <w:szCs w:val="21"/>
-              </w:rPr>
-              <w:t xml:space="preserve">  →  </w:t>
-            </w:r>
-            <w:r>
-              <w:rPr>
-                <w:sz w:val="21"/>
-                <w:szCs w:val="21"/>
-              </w:rPr>
-              <w:t xml:space="preserve">cross-border terrorism</w:t>
-            </w:r>
-            <w:r>
-              <w:rPr>
-                <w:b/>
-                <w:bCs/>
-                <w:color w:val="C00000"/>
-                <w:sz w:val="21"/>
-                <w:szCs w:val="21"/>
-              </w:rPr>
-              <w:t xml:space="preserve">  →  </w:t>
-            </w:r>
-            <w:r>
-              <w:rPr>
-                <w:sz w:val="21"/>
-                <w:szCs w:val="21"/>
-              </w:rPr>
-              <w:t xml:space="preserve">water sharing (Indus Waters Treaty 1960)</w:t>
-            </w:r>
-            <w:r>
-              <w:rPr>
-                <w:b/>
-                <w:bCs/>
-                <w:color w:val="C00000"/>
-                <w:sz w:val="21"/>
-                <w:szCs w:val="21"/>
-              </w:rPr>
-              <w:t xml:space="preserve">  →  </w:t>
-            </w:r>
-            <w:r>
-              <w:rPr>
-                <w:sz w:val="21"/>
-                <w:szCs w:val="21"/>
-              </w:rPr>
-              <w:t xml:space="preserve">nuclear rivalry (since 1998)</w:t>
+              <w:t xml:space="preserve">Article 370 abrogated (2019)</w:t>
+            </w:r>
+            <w:r>
+              <w:rPr>
+                <w:b/>
+                <w:bCs/>
+                <w:color w:val="C00000"/>
+                <w:sz w:val="21"/>
+                <w:szCs w:val="21"/>
+              </w:rPr>
+              <w:t xml:space="preserve">  →  </w:t>
+            </w:r>
+            <w:r>
+              <w:rPr>
+                <w:sz w:val="21"/>
+                <w:szCs w:val="21"/>
+              </w:rPr>
+              <w:t xml:space="preserve">Pahalgam attack (Apr 2025)</w:t>
+            </w:r>
+            <w:r>
+              <w:rPr>
+                <w:b/>
+                <w:bCs/>
+                <w:color w:val="C00000"/>
+                <w:sz w:val="21"/>
+                <w:szCs w:val="21"/>
+              </w:rPr>
+              <w:t xml:space="preserve">  →  </w:t>
+            </w:r>
+            <w:r>
+              <w:rPr>
+                <w:sz w:val="21"/>
+                <w:szCs w:val="21"/>
+              </w:rPr>
+              <w:t xml:space="preserve">Operation Sindoor (May 2025)</w:t>
+            </w:r>
+            <w:r>
+              <w:rPr>
+                <w:b/>
+                <w:bCs/>
+                <w:color w:val="C00000"/>
+                <w:sz w:val="21"/>
+                <w:szCs w:val="21"/>
+              </w:rPr>
+              <w:t xml:space="preserve">  →  </w:t>
+            </w:r>
+            <w:r>
+              <w:rPr>
+                <w:sz w:val="21"/>
+                <w:szCs w:val="21"/>
+              </w:rPr>
+              <w:t xml:space="preserve">Indus Waters Treaty in abeyance</w:t>
+            </w:r>
+            <w:r>
+              <w:rPr>
+                <w:b/>
+                <w:bCs/>
+                <w:color w:val="C00000"/>
+                <w:sz w:val="21"/>
+                <w:szCs w:val="21"/>
+              </w:rPr>
+              <w:t xml:space="preserve">  →  </w:t>
+            </w:r>
+            <w:r>
+              <w:rPr>
+                <w:sz w:val="21"/>
+                <w:szCs w:val="21"/>
+              </w:rPr>
+              <w:t xml:space="preserve">Attari border closed, trade and visas suspended, diplomatic strength reduced</w:t>
+            </w:r>
+            <w:r>
+              <w:rPr>
+                <w:b/>
+                <w:bCs/>
+                <w:color w:val="C00000"/>
+                <w:sz w:val="21"/>
+                <w:szCs w:val="21"/>
+              </w:rPr>
+              <w:t xml:space="preserve">  →  </w:t>
+            </w:r>
+            <w:r>
+              <w:rPr>
+                <w:sz w:val="21"/>
+                <w:szCs w:val="21"/>
+              </w:rPr>
+              <w:t xml:space="preserve">Ceasefire understanding (May 2025)</w:t>
+            </w:r>
+            <w:r>
+              <w:rPr>
+                <w:b/>
+                <w:bCs/>
+                <w:color w:val="C00000"/>
+                <w:sz w:val="21"/>
+                <w:szCs w:val="21"/>
+              </w:rPr>
+              <w:t xml:space="preserve">  →  </w:t>
+            </w:r>
+            <w:r>
+              <w:rPr>
+                <w:sz w:val="21"/>
+                <w:szCs w:val="21"/>
+              </w:rPr>
+              <w:t xml:space="preserve">India's doctrine: terror attack = act of war, no tolerance of nuclear blackmail, "talks and terror cannot go together"</w:t>
             </w:r>
           </w:p>
         </w:tc>
@@ -659,7 +710,7 @@
                 <w:sz w:val="21"/>
                 <w:szCs w:val="21"/>
               </w:rPr>
-              <w:t xml:space="preserve">Attempts at peace</w:t>
+              <w:t xml:space="preserve">Problems</w:t>
             </w:r>
           </w:p>
         </w:tc>
@@ -690,58 +741,109 @@
                 <w:sz w:val="21"/>
                 <w:szCs w:val="21"/>
               </w:rPr>
-              <w:t xml:space="preserve">Tashkent 1966</w:t>
-            </w:r>
-            <w:r>
-              <w:rPr>
-                <w:b/>
-                <w:bCs/>
-                <w:color w:val="C00000"/>
-                <w:sz w:val="21"/>
-                <w:szCs w:val="21"/>
-              </w:rPr>
-              <w:t xml:space="preserve">  →  </w:t>
-            </w:r>
-            <w:r>
-              <w:rPr>
-                <w:sz w:val="21"/>
-                <w:szCs w:val="21"/>
-              </w:rPr>
-              <w:t xml:space="preserve">Shimla 1972</w:t>
-            </w:r>
-            <w:r>
-              <w:rPr>
-                <w:b/>
-                <w:bCs/>
-                <w:color w:val="C00000"/>
-                <w:sz w:val="21"/>
-                <w:szCs w:val="21"/>
-              </w:rPr>
-              <w:t xml:space="preserve">  →  </w:t>
-            </w:r>
-            <w:r>
-              <w:rPr>
-                <w:sz w:val="21"/>
-                <w:szCs w:val="21"/>
-              </w:rPr>
-              <w:t xml:space="preserve">Lahore Bus Diplomacy 1999</w:t>
-            </w:r>
-            <w:r>
-              <w:rPr>
-                <w:b/>
-                <w:bCs/>
-                <w:color w:val="C00000"/>
-                <w:sz w:val="21"/>
-                <w:szCs w:val="21"/>
-              </w:rPr>
-              <w:t xml:space="preserve">  →  </w:t>
-            </w:r>
-            <w:r>
-              <w:rPr>
-                <w:sz w:val="21"/>
-                <w:szCs w:val="21"/>
-              </w:rPr>
-              <w:t xml:space="preserve">Composite Dialogue 2004</w:t>
+              <w:t xml:space="preserve">Kashmir dispute</w:t>
+            </w:r>
+            <w:r>
+              <w:rPr>
+                <w:b/>
+                <w:bCs/>
+                <w:color w:val="C00000"/>
+                <w:sz w:val="21"/>
+                <w:szCs w:val="21"/>
+              </w:rPr>
+              <w:t xml:space="preserve">  →  </w:t>
+            </w:r>
+            <w:r>
+              <w:rPr>
+                <w:sz w:val="21"/>
+                <w:szCs w:val="21"/>
+              </w:rPr>
+              <w:t xml:space="preserve">State-sponsored terrorism (LeT, JeM)</w:t>
+            </w:r>
+            <w:r>
+              <w:rPr>
+                <w:b/>
+                <w:bCs/>
+                <w:color w:val="C00000"/>
+                <w:sz w:val="21"/>
+                <w:szCs w:val="21"/>
+              </w:rPr>
+              <w:t xml:space="preserve">  →  </w:t>
+            </w:r>
+            <w:r>
+              <w:rPr>
+                <w:sz w:val="21"/>
+                <w:szCs w:val="21"/>
+              </w:rPr>
+              <w:t xml:space="preserve">China–Pakistan nexus (CPEC through PoK, UN veto)</w:t>
+            </w:r>
+            <w:r>
+              <w:rPr>
+                <w:b/>
+                <w:bCs/>
+                <w:color w:val="C00000"/>
+                <w:sz w:val="21"/>
+                <w:szCs w:val="21"/>
+              </w:rPr>
+              <w:t xml:space="preserve">  →  </w:t>
+            </w:r>
+            <w:r>
+              <w:rPr>
+                <w:sz w:val="21"/>
+                <w:szCs w:val="21"/>
+              </w:rPr>
+              <w:t xml:space="preserve">Water dispute</w:t>
+            </w:r>
+            <w:r>
+              <w:rPr>
+                <w:b/>
+                <w:bCs/>
+                <w:color w:val="C00000"/>
+                <w:sz w:val="21"/>
+                <w:szCs w:val="21"/>
+              </w:rPr>
+              <w:t xml:space="preserve">  →  </w:t>
+            </w:r>
+            <w:r>
+              <w:rPr>
+                <w:sz w:val="21"/>
+                <w:szCs w:val="21"/>
+              </w:rPr>
+              <w:t xml:space="preserve">Drones and narcotics smuggling across the Punjab border</w:t>
+            </w:r>
+            <w:r>
+              <w:rPr>
+                <w:b/>
+                <w:bCs/>
+                <w:color w:val="C00000"/>
+                <w:sz w:val="21"/>
+                <w:szCs w:val="21"/>
+              </w:rPr>
+              <w:t xml:space="preserve">  →  </w:t>
+            </w:r>
+            <w:r>
+              <w:rPr>
+                <w:sz w:val="21"/>
+                <w:szCs w:val="21"/>
+              </w:rPr>
+              <w:t xml:space="preserve">Disinformation and cyber threats</w:t>
+            </w:r>
+            <w:r>
+              <w:rPr>
+                <w:b/>
+                <w:bCs/>
+                <w:color w:val="C00000"/>
+                <w:sz w:val="21"/>
+                <w:szCs w:val="21"/>
+              </w:rPr>
+              <w:t xml:space="preserve">  →  </w:t>
+            </w:r>
+            <w:r>
+              <w:rPr>
+                <w:sz w:val="21"/>
+                <w:szCs w:val="21"/>
+              </w:rPr>
+              <w:t xml:space="preserve">Deep trust deficit, no structured dialogue</w:t>
             </w:r>
           </w:p>
         </w:tc>
@@ -811,7 +913,7 @@
                 <w:sz w:val="21"/>
                 <w:szCs w:val="21"/>
               </w:rPr>
-              <w:t xml:space="preserve">Breakdown</w:t>
+              <w:t xml:space="preserve">Solutions</w:t>
             </w:r>
           </w:p>
         </w:tc>
@@ -841,75 +943,126 @@
                 <w:sz w:val="21"/>
                 <w:szCs w:val="21"/>
               </w:rPr>
-              <w:t xml:space="preserve">Mumbai 26/11 (2008)</w:t>
-            </w:r>
-            <w:r>
-              <w:rPr>
-                <w:b/>
-                <w:bCs/>
-                <w:color w:val="C00000"/>
-                <w:sz w:val="21"/>
-                <w:szCs w:val="21"/>
-              </w:rPr>
-              <w:t xml:space="preserve">  →  </w:t>
-            </w:r>
-            <w:r>
-              <w:rPr>
-                <w:sz w:val="21"/>
-                <w:szCs w:val="21"/>
-              </w:rPr>
-              <w:t xml:space="preserve">Pathankot, Uri (2016)</w:t>
-            </w:r>
-            <w:r>
-              <w:rPr>
-                <w:b/>
-                <w:bCs/>
-                <w:color w:val="C00000"/>
-                <w:sz w:val="21"/>
-                <w:szCs w:val="21"/>
-              </w:rPr>
-              <w:t xml:space="preserve">  →  </w:t>
-            </w:r>
-            <w:r>
-              <w:rPr>
-                <w:sz w:val="21"/>
-                <w:szCs w:val="21"/>
-              </w:rPr>
-              <w:t xml:space="preserve">Pulwama and Balakot (2019)</w:t>
-            </w:r>
-            <w:r>
-              <w:rPr>
-                <w:b/>
-                <w:bCs/>
-                <w:color w:val="C00000"/>
-                <w:sz w:val="21"/>
-                <w:szCs w:val="21"/>
-              </w:rPr>
-              <w:t xml:space="preserve">  →  </w:t>
-            </w:r>
-            <w:r>
-              <w:rPr>
-                <w:sz w:val="21"/>
-                <w:szCs w:val="21"/>
-              </w:rPr>
-              <w:t xml:space="preserve">Article 370 abrogation (2019)</w:t>
-            </w:r>
-            <w:r>
-              <w:rPr>
-                <w:b/>
-                <w:bCs/>
-                <w:color w:val="C00000"/>
-                <w:sz w:val="21"/>
-                <w:szCs w:val="21"/>
-              </w:rPr>
-              <w:t xml:space="preserve">  →  </w:t>
-            </w:r>
-            <w:r>
-              <w:rPr>
-                <w:sz w:val="21"/>
-                <w:szCs w:val="21"/>
-              </w:rPr>
-              <w:t xml:space="preserve">diplomatic ties downgraded</w:t>
+              <w:t xml:space="preserve">Zero tolerance for terror, backed by strong deterrence</w:t>
+            </w:r>
+            <w:r>
+              <w:rPr>
+                <w:b/>
+                <w:bCs/>
+                <w:color w:val="C00000"/>
+                <w:sz w:val="21"/>
+                <w:szCs w:val="21"/>
+              </w:rPr>
+              <w:t xml:space="preserve">  →  </w:t>
+            </w:r>
+            <w:r>
+              <w:rPr>
+                <w:sz w:val="21"/>
+                <w:szCs w:val="21"/>
+              </w:rPr>
+              <w:t xml:space="preserve">Military modernisation (air defence, drones, surveillance)</w:t>
+            </w:r>
+            <w:r>
+              <w:rPr>
+                <w:b/>
+                <w:bCs/>
+                <w:color w:val="C00000"/>
+                <w:sz w:val="21"/>
+                <w:szCs w:val="21"/>
+              </w:rPr>
+              <w:t xml:space="preserve">  →  </w:t>
+            </w:r>
+            <w:r>
+              <w:rPr>
+                <w:sz w:val="21"/>
+                <w:szCs w:val="21"/>
+              </w:rPr>
+              <w:t xml:space="preserve">Diplomatic pressure (FATF, UN, global outreach)</w:t>
+            </w:r>
+            <w:r>
+              <w:rPr>
+                <w:b/>
+                <w:bCs/>
+                <w:color w:val="C00000"/>
+                <w:sz w:val="21"/>
+                <w:szCs w:val="21"/>
+              </w:rPr>
+              <w:t xml:space="preserve">  →  </w:t>
+            </w:r>
+            <w:r>
+              <w:rPr>
+                <w:sz w:val="21"/>
+                <w:szCs w:val="21"/>
+              </w:rPr>
+              <w:t xml:space="preserve">Secure borders (smart fencing, anti-drone systems)</w:t>
+            </w:r>
+            <w:r>
+              <w:rPr>
+                <w:b/>
+                <w:bCs/>
+                <w:color w:val="C00000"/>
+                <w:sz w:val="21"/>
+                <w:szCs w:val="21"/>
+              </w:rPr>
+              <w:t xml:space="preserve">  →  </w:t>
+            </w:r>
+            <w:r>
+              <w:rPr>
+                <w:sz w:val="21"/>
+                <w:szCs w:val="21"/>
+              </w:rPr>
+              <w:t xml:space="preserve">Kashmir: development, integration, peace</w:t>
+            </w:r>
+            <w:r>
+              <w:rPr>
+                <w:b/>
+                <w:bCs/>
+                <w:color w:val="C00000"/>
+                <w:sz w:val="21"/>
+                <w:szCs w:val="21"/>
+              </w:rPr>
+              <w:t xml:space="preserve">  →  </w:t>
+            </w:r>
+            <w:r>
+              <w:rPr>
+                <w:sz w:val="21"/>
+                <w:szCs w:val="21"/>
+              </w:rPr>
+              <w:t xml:space="preserve">Economic strength to reduce vulnerabilities</w:t>
+            </w:r>
+            <w:r>
+              <w:rPr>
+                <w:b/>
+                <w:bCs/>
+                <w:color w:val="C00000"/>
+                <w:sz w:val="21"/>
+                <w:szCs w:val="21"/>
+              </w:rPr>
+              <w:t xml:space="preserve">  →  </w:t>
+            </w:r>
+            <w:r>
+              <w:rPr>
+                <w:sz w:val="21"/>
+                <w:szCs w:val="21"/>
+              </w:rPr>
+              <w:t xml:space="preserve">Keep backchannels open</w:t>
+            </w:r>
+            <w:r>
+              <w:rPr>
+                <w:b/>
+                <w:bCs/>
+                <w:color w:val="C00000"/>
+                <w:sz w:val="21"/>
+                <w:szCs w:val="21"/>
+              </w:rPr>
+              <w:t xml:space="preserve">  →  </w:t>
+            </w:r>
+            <w:r>
+              <w:rPr>
+                <w:sz w:val="21"/>
+                <w:szCs w:val="21"/>
+              </w:rPr>
+              <w:t xml:space="preserve">People-to-people ties once Pakistan acts against terror</w:t>
             </w:r>
           </w:p>
         </w:tc>
@@ -981,7 +1134,7 @@
                 <w:sz w:val="21"/>
                 <w:szCs w:val="21"/>
               </w:rPr>
-              <w:t xml:space="preserve">Recent phase</w:t>
+              <w:t xml:space="preserve">Conclusion</w:t>
             </w:r>
           </w:p>
         </w:tc>
@@ -1012,480 +1165,41 @@
                 <w:sz w:val="21"/>
                 <w:szCs w:val="21"/>
               </w:rPr>
-              <w:t xml:space="preserve">Pahalgam attack (April 2025)</w:t>
-            </w:r>
-            <w:r>
-              <w:rPr>
-                <w:b/>
-                <w:bCs/>
-                <w:color w:val="C00000"/>
-                <w:sz w:val="21"/>
-                <w:szCs w:val="21"/>
-              </w:rPr>
-              <w:t xml:space="preserve">  →  </w:t>
-            </w:r>
-            <w:r>
-              <w:rPr>
-                <w:sz w:val="21"/>
-                <w:szCs w:val="21"/>
-              </w:rPr>
-              <w:t xml:space="preserve">Operation Sindoor (May 2025)</w:t>
-            </w:r>
-            <w:r>
-              <w:rPr>
-                <w:b/>
-                <w:bCs/>
-                <w:color w:val="C00000"/>
-                <w:sz w:val="21"/>
-                <w:szCs w:val="21"/>
-              </w:rPr>
-              <w:t xml:space="preserve">  →  </w:t>
-            </w:r>
-            <w:r>
-              <w:rPr>
-                <w:sz w:val="21"/>
-                <w:szCs w:val="21"/>
-              </w:rPr>
-              <w:t xml:space="preserve">Indus Waters Treaty put in abeyance</w:t>
-            </w:r>
-            <w:r>
-              <w:rPr>
-                <w:b/>
-                <w:bCs/>
-                <w:color w:val="C00000"/>
-                <w:sz w:val="21"/>
-                <w:szCs w:val="21"/>
-              </w:rPr>
-              <w:t xml:space="preserve">  →  </w:t>
-            </w:r>
-            <w:r>
-              <w:rPr>
-                <w:sz w:val="21"/>
-                <w:szCs w:val="21"/>
-              </w:rPr>
-              <w:t xml:space="preserve">trade, travel and cultural links frozen</w:t>
-            </w:r>
-          </w:p>
-        </w:tc>
-      </w:tr>
-      <w:tr>
-        <w:trPr>
-          <w:cantSplit/>
-        </w:trPr>
-        <w:tc>
-          <w:tcPr>
-            <w:tcW w:type="dxa" w:w="520"/>
-            <w:tcBorders>
-              <w:top w:val="single" w:color="BFBFBF" w:sz="4"/>
-              <w:left w:val="single" w:color="BFBFBF" w:sz="4"/>
-              <w:bottom w:val="single" w:color="BFBFBF" w:sz="4"/>
-              <w:right w:val="single" w:color="BFBFBF" w:sz="4"/>
-            </w:tcBorders>
-            <w:tcMar>
-              <w:top w:type="dxa" w:w="70"/>
-              <w:left w:type="dxa" w:w="100"/>
-              <w:bottom w:type="dxa" w:w="70"/>
-              <w:right w:type="dxa" w:w="100"/>
-            </w:tcMar>
-            <w:vAlign w:val="center"/>
-          </w:tcPr>
-          <w:p>
-            <w:pPr>
-              <w:spacing w:after="0" w:before="0" w:line="300"/>
-              <w:jc w:val="center"/>
-            </w:pPr>
-            <w:r>
-              <w:rPr>
-                <w:color w:val="7F7F7F"/>
-                <w:sz w:val="21"/>
-                <w:szCs w:val="21"/>
-              </w:rPr>
-              <w:t xml:space="preserve">7</w:t>
-            </w:r>
-          </w:p>
-        </w:tc>
-        <w:tc>
-          <w:tcPr>
-            <w:tcW w:type="dxa" w:w="2200"/>
-            <w:tcBorders>
-              <w:top w:val="single" w:color="BFBFBF" w:sz="4"/>
-              <w:left w:val="single" w:color="BFBFBF" w:sz="4"/>
-              <w:bottom w:val="single" w:color="BFBFBF" w:sz="4"/>
-              <w:right w:val="single" w:color="BFBFBF" w:sz="4"/>
-            </w:tcBorders>
-            <w:tcMar>
-              <w:top w:type="dxa" w:w="70"/>
-              <w:left w:type="dxa" w:w="100"/>
-              <w:bottom w:type="dxa" w:w="70"/>
-              <w:right w:type="dxa" w:w="100"/>
-            </w:tcMar>
-            <w:vAlign w:val="center"/>
-          </w:tcPr>
-          <w:p>
-            <w:pPr>
-              <w:spacing w:after="0" w:before="0" w:line="300"/>
-            </w:pPr>
-            <w:r>
-              <w:rPr>
-                <w:b/>
-                <w:bCs/>
-                <w:color w:val="1F3864"/>
-                <w:sz w:val="21"/>
-                <w:szCs w:val="21"/>
-              </w:rPr>
-              <w:t xml:space="preserve">Impact</w:t>
-            </w:r>
-          </w:p>
-        </w:tc>
-        <w:tc>
-          <w:tcPr>
-            <w:tcW w:type="dxa" w:w="7986"/>
-            <w:tcBorders>
-              <w:top w:val="single" w:color="BFBFBF" w:sz="4"/>
-              <w:left w:val="single" w:color="BFBFBF" w:sz="4"/>
-              <w:bottom w:val="single" w:color="BFBFBF" w:sz="4"/>
-              <w:right w:val="single" w:color="BFBFBF" w:sz="4"/>
-            </w:tcBorders>
-            <w:tcMar>
-              <w:top w:type="dxa" w:w="70"/>
-              <w:left w:type="dxa" w:w="100"/>
-              <w:bottom w:type="dxa" w:w="70"/>
-              <w:right w:type="dxa" w:w="100"/>
-            </w:tcMar>
-            <w:vAlign w:val="center"/>
-          </w:tcPr>
-          <w:p>
-            <w:pPr>
-              <w:spacing w:after="0" w:before="0" w:line="300"/>
-            </w:pPr>
-            <w:r>
-              <w:rPr>
-                <w:sz w:val="21"/>
-                <w:szCs w:val="21"/>
-              </w:rPr>
-              <w:t xml:space="preserve">regional instability</w:t>
-            </w:r>
-            <w:r>
-              <w:rPr>
-                <w:b/>
-                <w:bCs/>
-                <w:color w:val="C00000"/>
-                <w:sz w:val="21"/>
-                <w:szCs w:val="21"/>
-              </w:rPr>
-              <w:t xml:space="preserve">  →  </w:t>
-            </w:r>
-            <w:r>
-              <w:rPr>
-                <w:sz w:val="21"/>
-                <w:szCs w:val="21"/>
-              </w:rPr>
-              <w:t xml:space="preserve">SAARC stalled</w:t>
-            </w:r>
-            <w:r>
-              <w:rPr>
-                <w:b/>
-                <w:bCs/>
-                <w:color w:val="C00000"/>
-                <w:sz w:val="21"/>
-                <w:szCs w:val="21"/>
-              </w:rPr>
-              <w:t xml:space="preserve">  →  </w:t>
-            </w:r>
-            <w:r>
-              <w:rPr>
-                <w:sz w:val="21"/>
-                <w:szCs w:val="21"/>
-              </w:rPr>
-              <w:t xml:space="preserve">defence spending burden</w:t>
-            </w:r>
-            <w:r>
-              <w:rPr>
-                <w:b/>
-                <w:bCs/>
-                <w:color w:val="C00000"/>
-                <w:sz w:val="21"/>
-                <w:szCs w:val="21"/>
-              </w:rPr>
-              <w:t xml:space="preserve">  →  </w:t>
-            </w:r>
-            <w:r>
-              <w:rPr>
-                <w:sz w:val="21"/>
-                <w:szCs w:val="21"/>
-              </w:rPr>
-              <w:t xml:space="preserve">human cost on border populations</w:t>
-            </w:r>
-          </w:p>
-        </w:tc>
-      </w:tr>
-      <w:tr>
-        <w:trPr>
-          <w:cantSplit/>
-        </w:trPr>
-        <w:tc>
-          <w:tcPr>
-            <w:tcW w:type="dxa" w:w="520"/>
-            <w:tcBorders>
-              <w:top w:val="single" w:color="BFBFBF" w:sz="4"/>
-              <w:left w:val="single" w:color="BFBFBF" w:sz="4"/>
-              <w:bottom w:val="single" w:color="BFBFBF" w:sz="4"/>
-              <w:right w:val="single" w:color="BFBFBF" w:sz="4"/>
-            </w:tcBorders>
-            <w:shd w:fill="F5F7FB" w:color="auto" w:val="clear"/>
-            <w:tcMar>
-              <w:top w:type="dxa" w:w="70"/>
-              <w:left w:type="dxa" w:w="100"/>
-              <w:bottom w:type="dxa" w:w="70"/>
-              <w:right w:type="dxa" w:w="100"/>
-            </w:tcMar>
-            <w:vAlign w:val="center"/>
-          </w:tcPr>
-          <w:p>
-            <w:pPr>
-              <w:spacing w:after="0" w:before="0" w:line="300"/>
-              <w:jc w:val="center"/>
-            </w:pPr>
-            <w:r>
-              <w:rPr>
-                <w:color w:val="7F7F7F"/>
-                <w:sz w:val="21"/>
-                <w:szCs w:val="21"/>
-              </w:rPr>
-              <w:t xml:space="preserve">8</w:t>
-            </w:r>
-          </w:p>
-        </w:tc>
-        <w:tc>
-          <w:tcPr>
-            <w:tcW w:type="dxa" w:w="2200"/>
-            <w:tcBorders>
-              <w:top w:val="single" w:color="BFBFBF" w:sz="4"/>
-              <w:left w:val="single" w:color="BFBFBF" w:sz="4"/>
-              <w:bottom w:val="single" w:color="BFBFBF" w:sz="4"/>
-              <w:right w:val="single" w:color="BFBFBF" w:sz="4"/>
-            </w:tcBorders>
-            <w:shd w:fill="F5F7FB" w:color="auto" w:val="clear"/>
-            <w:tcMar>
-              <w:top w:type="dxa" w:w="70"/>
-              <w:left w:type="dxa" w:w="100"/>
-              <w:bottom w:type="dxa" w:w="70"/>
-              <w:right w:type="dxa" w:w="100"/>
-            </w:tcMar>
-            <w:vAlign w:val="center"/>
-          </w:tcPr>
-          <w:p>
-            <w:pPr>
-              <w:spacing w:after="0" w:before="0" w:line="300"/>
-            </w:pPr>
-            <w:r>
-              <w:rPr>
-                <w:b/>
-                <w:bCs/>
-                <w:color w:val="1F3864"/>
-                <w:sz w:val="21"/>
-                <w:szCs w:val="21"/>
-              </w:rPr>
-              <w:t xml:space="preserve">Way forward</w:t>
-            </w:r>
-          </w:p>
-        </w:tc>
-        <w:tc>
-          <w:tcPr>
-            <w:tcW w:type="dxa" w:w="7986"/>
-            <w:tcBorders>
-              <w:top w:val="single" w:color="BFBFBF" w:sz="4"/>
-              <w:left w:val="single" w:color="BFBFBF" w:sz="4"/>
-              <w:bottom w:val="single" w:color="BFBFBF" w:sz="4"/>
-              <w:right w:val="single" w:color="BFBFBF" w:sz="4"/>
-            </w:tcBorders>
-            <w:shd w:fill="F5F7FB" w:color="auto" w:val="clear"/>
-            <w:tcMar>
-              <w:top w:type="dxa" w:w="70"/>
-              <w:left w:type="dxa" w:w="100"/>
-              <w:bottom w:type="dxa" w:w="70"/>
-              <w:right w:type="dxa" w:w="100"/>
-            </w:tcMar>
-            <w:vAlign w:val="center"/>
-          </w:tcPr>
-          <w:p>
-            <w:pPr>
-              <w:spacing w:after="0" w:before="0" w:line="300"/>
-            </w:pPr>
-            <w:r>
-              <w:rPr>
-                <w:sz w:val="21"/>
-                <w:szCs w:val="21"/>
-              </w:rPr>
-              <w:t xml:space="preserve">zero tolerance for terrorism</w:t>
-            </w:r>
-            <w:r>
-              <w:rPr>
-                <w:b/>
-                <w:bCs/>
-                <w:color w:val="C00000"/>
-                <w:sz w:val="21"/>
-                <w:szCs w:val="21"/>
-              </w:rPr>
-              <w:t xml:space="preserve">  →  </w:t>
-            </w:r>
-            <w:r>
-              <w:rPr>
-                <w:sz w:val="21"/>
-                <w:szCs w:val="21"/>
-              </w:rPr>
-              <w:t xml:space="preserve">strong military deterrence</w:t>
-            </w:r>
-            <w:r>
-              <w:rPr>
-                <w:b/>
-                <w:bCs/>
-                <w:color w:val="C00000"/>
-                <w:sz w:val="21"/>
-                <w:szCs w:val="21"/>
-              </w:rPr>
-              <w:t xml:space="preserve">  →  </w:t>
-            </w:r>
-            <w:r>
-              <w:rPr>
-                <w:sz w:val="21"/>
-                <w:szCs w:val="21"/>
-              </w:rPr>
-              <w:t xml:space="preserve">keep diplomatic backchannels open</w:t>
-            </w:r>
-            <w:r>
-              <w:rPr>
-                <w:b/>
-                <w:bCs/>
-                <w:color w:val="C00000"/>
-                <w:sz w:val="21"/>
-                <w:szCs w:val="21"/>
-              </w:rPr>
-              <w:t xml:space="preserve">  →  </w:t>
-            </w:r>
-            <w:r>
-              <w:rPr>
-                <w:sz w:val="21"/>
-                <w:szCs w:val="21"/>
-              </w:rPr>
-              <w:t xml:space="preserve">people-to-people and economic cooperation</w:t>
-            </w:r>
-            <w:r>
-              <w:rPr>
-                <w:b/>
-                <w:bCs/>
-                <w:color w:val="C00000"/>
-                <w:sz w:val="21"/>
-                <w:szCs w:val="21"/>
-              </w:rPr>
-              <w:t xml:space="preserve">  →  </w:t>
-            </w:r>
-            <w:r>
-              <w:rPr>
-                <w:sz w:val="21"/>
-                <w:szCs w:val="21"/>
-              </w:rPr>
-              <w:t xml:space="preserve">India's stand: "Talks and terror cannot go together"</w:t>
-            </w:r>
-          </w:p>
-        </w:tc>
-      </w:tr>
-      <w:tr>
-        <w:trPr>
-          <w:cantSplit/>
-        </w:trPr>
-        <w:tc>
-          <w:tcPr>
-            <w:tcW w:type="dxa" w:w="520"/>
-            <w:tcBorders>
-              <w:top w:val="single" w:color="BFBFBF" w:sz="4"/>
-              <w:left w:val="single" w:color="BFBFBF" w:sz="4"/>
-              <w:bottom w:val="single" w:color="BFBFBF" w:sz="4"/>
-              <w:right w:val="single" w:color="BFBFBF" w:sz="4"/>
-            </w:tcBorders>
-            <w:tcMar>
-              <w:top w:type="dxa" w:w="70"/>
-              <w:left w:type="dxa" w:w="100"/>
-              <w:bottom w:type="dxa" w:w="70"/>
-              <w:right w:type="dxa" w:w="100"/>
-            </w:tcMar>
-            <w:vAlign w:val="center"/>
-          </w:tcPr>
-          <w:p>
-            <w:pPr>
-              <w:spacing w:after="0" w:before="0" w:line="300"/>
-              <w:jc w:val="center"/>
-            </w:pPr>
-            <w:r>
-              <w:rPr>
-                <w:color w:val="7F7F7F"/>
-                <w:sz w:val="21"/>
-                <w:szCs w:val="21"/>
-              </w:rPr>
-              <w:t xml:space="preserve">9</w:t>
-            </w:r>
-          </w:p>
-        </w:tc>
-        <w:tc>
-          <w:tcPr>
-            <w:tcW w:type="dxa" w:w="2200"/>
-            <w:tcBorders>
-              <w:top w:val="single" w:color="BFBFBF" w:sz="4"/>
-              <w:left w:val="single" w:color="BFBFBF" w:sz="4"/>
-              <w:bottom w:val="single" w:color="BFBFBF" w:sz="4"/>
-              <w:right w:val="single" w:color="BFBFBF" w:sz="4"/>
-            </w:tcBorders>
-            <w:tcMar>
-              <w:top w:type="dxa" w:w="70"/>
-              <w:left w:type="dxa" w:w="100"/>
-              <w:bottom w:type="dxa" w:w="70"/>
-              <w:right w:type="dxa" w:w="100"/>
-            </w:tcMar>
-            <w:vAlign w:val="center"/>
-          </w:tcPr>
-          <w:p>
-            <w:pPr>
-              <w:spacing w:after="0" w:before="0" w:line="300"/>
-            </w:pPr>
-            <w:r>
-              <w:rPr>
-                <w:b/>
-                <w:bCs/>
-                <w:color w:val="1F3864"/>
-                <w:sz w:val="21"/>
-                <w:szCs w:val="21"/>
-              </w:rPr>
-              <w:t xml:space="preserve">Conclusion</w:t>
-            </w:r>
-          </w:p>
-        </w:tc>
-        <w:tc>
-          <w:tcPr>
-            <w:tcW w:type="dxa" w:w="7986"/>
-            <w:tcBorders>
-              <w:top w:val="single" w:color="BFBFBF" w:sz="4"/>
-              <w:left w:val="single" w:color="BFBFBF" w:sz="4"/>
-              <w:bottom w:val="single" w:color="BFBFBF" w:sz="4"/>
-              <w:right w:val="single" w:color="BFBFBF" w:sz="4"/>
-            </w:tcBorders>
-            <w:tcMar>
-              <w:top w:type="dxa" w:w="70"/>
-              <w:left w:type="dxa" w:w="100"/>
-              <w:bottom w:type="dxa" w:w="70"/>
-              <w:right w:type="dxa" w:w="100"/>
-            </w:tcMar>
-            <w:vAlign w:val="center"/>
-          </w:tcPr>
-          <w:p>
-            <w:pPr>
-              <w:spacing w:after="0" w:before="0" w:line="300"/>
-            </w:pPr>
-            <w:r>
-              <w:rPr>
-                <w:sz w:val="21"/>
-                <w:szCs w:val="21"/>
-              </w:rPr>
-              <w:t xml:space="preserve">Peace is desirable, but only on the basis of security, sovereignty and an end to terror</w:t>
+              <w:t xml:space="preserve">India wants peace, but not at the cost of security or sovereignty</w:t>
+            </w:r>
+            <w:r>
+              <w:rPr>
+                <w:b/>
+                <w:bCs/>
+                <w:color w:val="C00000"/>
+                <w:sz w:val="21"/>
+                <w:szCs w:val="21"/>
+              </w:rPr>
+              <w:t xml:space="preserve">  →  </w:t>
+            </w:r>
+            <w:r>
+              <w:rPr>
+                <w:sz w:val="21"/>
+                <w:szCs w:val="21"/>
+              </w:rPr>
+              <w:t xml:space="preserve">A strong, self-reliant and confident India can deal with Pakistan from a position of strength</w:t>
+            </w:r>
+            <w:r>
+              <w:rPr>
+                <w:b/>
+                <w:bCs/>
+                <w:color w:val="C00000"/>
+                <w:sz w:val="21"/>
+                <w:szCs w:val="21"/>
+              </w:rPr>
+              <w:t xml:space="preserve">  →  </w:t>
+            </w:r>
+            <w:r>
+              <w:rPr>
+                <w:sz w:val="21"/>
+                <w:szCs w:val="21"/>
+              </w:rPr>
+              <w:t xml:space="preserve">Lasting peace depends on Pakistan ending terror</w:t>
             </w:r>
           </w:p>
         </w:tc>

</xml_diff>

<commit_message>
Update lecturettes to Sept 2026, add India–China Relations, list points one per line
Co-Authored-By: Claude Opus 5.5 <noreply@anthropic.com>
Claude-Session: https://claude.ai/code/session_01EyrV2JLtXrELkAF97b5fch
</commit_message>
<xml_diff>
--- a/SSB_Lecturettes.docx
+++ b/SSB_Lecturettes.docx
@@ -241,31 +241,54 @@
           </w:tcPr>
           <w:p>
             <w:pPr>
-              <w:spacing w:after="0" w:before="0" w:line="300"/>
-            </w:pPr>
-            <w:r>
-              <w:rPr>
-                <w:sz w:val="21"/>
-                <w:szCs w:val="21"/>
-              </w:rPr>
-              <w:t xml:space="preserve">Relationship between two nuclear-armed neighbours, born of the 1947 Partition</w:t>
-            </w:r>
-            <w:r>
-              <w:rPr>
-                <w:b/>
-                <w:bCs/>
-                <w:color w:val="C00000"/>
-                <w:sz w:val="21"/>
-                <w:szCs w:val="21"/>
-              </w:rPr>
-              <w:t xml:space="preserve">  →  </w:t>
-            </w:r>
-            <w:r>
-              <w:rPr>
-                <w:sz w:val="21"/>
-                <w:szCs w:val="21"/>
-              </w:rPr>
-              <w:t xml:space="preserve">Shaped by Kashmir, four wars (1947–48, 1965, 1971, 1999 Kargil) and cross-border terrorism</w:t>
+              <w:tabs>
+                <w:tab w:val="left" w:pos="260"/>
+              </w:tabs>
+              <w:spacing w:after="0" w:before="0" w:line="280"/>
+              <w:ind w:left="260" w:hanging="260"/>
+            </w:pPr>
+            <w:r>
+              <w:rPr>
+                <w:b/>
+                <w:bCs/>
+                <w:color w:val="C00000"/>
+                <w:sz w:val="21"/>
+                <w:szCs w:val="21"/>
+              </w:rPr>
+              <w:t xml:space="preserve">→	</w:t>
+            </w:r>
+            <w:r>
+              <w:rPr>
+                <w:sz w:val="21"/>
+                <w:szCs w:val="21"/>
+              </w:rPr>
+              <w:t xml:space="preserve">Two nuclear-armed neighbours, born of the 1947 Partition</w:t>
+            </w:r>
+          </w:p>
+          <w:p>
+            <w:pPr>
+              <w:tabs>
+                <w:tab w:val="left" w:pos="260"/>
+              </w:tabs>
+              <w:spacing w:after="0" w:before="40" w:line="280"/>
+              <w:ind w:left="260" w:hanging="260"/>
+            </w:pPr>
+            <w:r>
+              <w:rPr>
+                <w:b/>
+                <w:bCs/>
+                <w:color w:val="C00000"/>
+                <w:sz w:val="21"/>
+                <w:szCs w:val="21"/>
+              </w:rPr>
+              <w:t xml:space="preserve">→	</w:t>
+            </w:r>
+            <w:r>
+              <w:rPr>
+                <w:sz w:val="21"/>
+                <w:szCs w:val="21"/>
+              </w:rPr>
+              <w:t xml:space="preserve">Shaped by Kashmir, four wars and cross-border terrorism</w:t>
             </w:r>
           </w:p>
         </w:tc>
@@ -361,82 +384,177 @@
           </w:tcPr>
           <w:p>
             <w:pPr>
-              <w:spacing w:after="0" w:before="0" w:line="300"/>
-            </w:pPr>
-            <w:r>
-              <w:rPr>
-                <w:sz w:val="21"/>
-                <w:szCs w:val="21"/>
-              </w:rPr>
-              <w:t xml:space="preserve">Security: nuclear flashpoint, active LoC</w:t>
-            </w:r>
-            <w:r>
-              <w:rPr>
-                <w:b/>
-                <w:bCs/>
-                <w:color w:val="C00000"/>
-                <w:sz w:val="21"/>
-                <w:szCs w:val="21"/>
-              </w:rPr>
-              <w:t xml:space="preserve">  →  </w:t>
-            </w:r>
-            <w:r>
-              <w:rPr>
-                <w:sz w:val="21"/>
-                <w:szCs w:val="21"/>
-              </w:rPr>
-              <w:t xml:space="preserve">Regional: SAARC stalled, South Asia's growth held back</w:t>
-            </w:r>
-            <w:r>
-              <w:rPr>
-                <w:b/>
-                <w:bCs/>
-                <w:color w:val="C00000"/>
-                <w:sz w:val="21"/>
-                <w:szCs w:val="21"/>
-              </w:rPr>
-              <w:t xml:space="preserve">  →  </w:t>
-            </w:r>
-            <w:r>
-              <w:rPr>
-                <w:sz w:val="21"/>
-                <w:szCs w:val="21"/>
-              </w:rPr>
-              <w:t xml:space="preserve">Strategic: China–Pakistan nexus, Afghanistan</w:t>
-            </w:r>
-            <w:r>
-              <w:rPr>
-                <w:b/>
-                <w:bCs/>
-                <w:color w:val="C00000"/>
-                <w:sz w:val="21"/>
-                <w:szCs w:val="21"/>
-              </w:rPr>
-              <w:t xml:space="preserve">  →  </w:t>
-            </w:r>
-            <w:r>
-              <w:rPr>
-                <w:sz w:val="21"/>
-                <w:szCs w:val="21"/>
-              </w:rPr>
-              <w:t xml:space="preserve">Economic: heavy defence spending, lost trade</w:t>
-            </w:r>
-            <w:r>
-              <w:rPr>
-                <w:b/>
-                <w:bCs/>
-                <w:color w:val="C00000"/>
-                <w:sz w:val="21"/>
-                <w:szCs w:val="21"/>
-              </w:rPr>
-              <w:t xml:space="preserve">  →  </w:t>
-            </w:r>
-            <w:r>
-              <w:rPr>
-                <w:sz w:val="21"/>
-                <w:szCs w:val="21"/>
-              </w:rPr>
-              <w:t xml:space="preserve">Global: terrorism and nuclear risk concern the world</w:t>
+              <w:tabs>
+                <w:tab w:val="left" w:pos="260"/>
+              </w:tabs>
+              <w:spacing w:after="0" w:before="0" w:line="280"/>
+              <w:ind w:left="260" w:hanging="260"/>
+            </w:pPr>
+            <w:r>
+              <w:rPr>
+                <w:b/>
+                <w:bCs/>
+                <w:color w:val="C00000"/>
+                <w:sz w:val="21"/>
+                <w:szCs w:val="21"/>
+              </w:rPr>
+              <w:t xml:space="preserve">→	</w:t>
+            </w:r>
+            <w:r>
+              <w:rPr>
+                <w:b/>
+                <w:bCs/>
+                <w:sz w:val="21"/>
+                <w:szCs w:val="21"/>
+              </w:rPr>
+              <w:t xml:space="preserve">Security:</w:t>
+            </w:r>
+            <w:r>
+              <w:rPr>
+                <w:sz w:val="21"/>
+                <w:szCs w:val="21"/>
+              </w:rPr>
+              <w:t xml:space="preserve"> nuclear flashpoint, active LoC</w:t>
+            </w:r>
+          </w:p>
+          <w:p>
+            <w:pPr>
+              <w:tabs>
+                <w:tab w:val="left" w:pos="260"/>
+              </w:tabs>
+              <w:spacing w:after="0" w:before="40" w:line="280"/>
+              <w:ind w:left="260" w:hanging="260"/>
+            </w:pPr>
+            <w:r>
+              <w:rPr>
+                <w:b/>
+                <w:bCs/>
+                <w:color w:val="C00000"/>
+                <w:sz w:val="21"/>
+                <w:szCs w:val="21"/>
+              </w:rPr>
+              <w:t xml:space="preserve">→	</w:t>
+            </w:r>
+            <w:r>
+              <w:rPr>
+                <w:b/>
+                <w:bCs/>
+                <w:sz w:val="21"/>
+                <w:szCs w:val="21"/>
+              </w:rPr>
+              <w:t xml:space="preserve">Regional:</w:t>
+            </w:r>
+            <w:r>
+              <w:rPr>
+                <w:sz w:val="21"/>
+                <w:szCs w:val="21"/>
+              </w:rPr>
+              <w:t xml:space="preserve"> SAARC stalled</w:t>
+            </w:r>
+          </w:p>
+          <w:p>
+            <w:pPr>
+              <w:tabs>
+                <w:tab w:val="left" w:pos="260"/>
+              </w:tabs>
+              <w:spacing w:after="0" w:before="40" w:line="280"/>
+              <w:ind w:left="260" w:hanging="260"/>
+            </w:pPr>
+            <w:r>
+              <w:rPr>
+                <w:b/>
+                <w:bCs/>
+                <w:color w:val="C00000"/>
+                <w:sz w:val="21"/>
+                <w:szCs w:val="21"/>
+              </w:rPr>
+              <w:t xml:space="preserve">→	</w:t>
+            </w:r>
+            <w:r>
+              <w:rPr>
+                <w:b/>
+                <w:bCs/>
+                <w:sz w:val="21"/>
+                <w:szCs w:val="21"/>
+              </w:rPr>
+              <w:t xml:space="preserve">Strategic:</w:t>
+            </w:r>
+            <w:r>
+              <w:rPr>
+                <w:sz w:val="21"/>
+                <w:szCs w:val="21"/>
+              </w:rPr>
+              <w:t xml:space="preserve"> China–Pakistan nexus, Afghanistan</w:t>
+            </w:r>
+          </w:p>
+          <w:p>
+            <w:pPr>
+              <w:tabs>
+                <w:tab w:val="left" w:pos="260"/>
+              </w:tabs>
+              <w:spacing w:after="0" w:before="40" w:line="280"/>
+              <w:ind w:left="260" w:hanging="260"/>
+            </w:pPr>
+            <w:r>
+              <w:rPr>
+                <w:b/>
+                <w:bCs/>
+                <w:color w:val="C00000"/>
+                <w:sz w:val="21"/>
+                <w:szCs w:val="21"/>
+              </w:rPr>
+              <w:t xml:space="preserve">→	</w:t>
+            </w:r>
+            <w:r>
+              <w:rPr>
+                <w:b/>
+                <w:bCs/>
+                <w:sz w:val="21"/>
+                <w:szCs w:val="21"/>
+              </w:rPr>
+              <w:t xml:space="preserve">Economic:</w:t>
+            </w:r>
+            <w:r>
+              <w:rPr>
+                <w:sz w:val="21"/>
+                <w:szCs w:val="21"/>
+              </w:rPr>
+              <w:t xml:space="preserve"> defence burden, lost trade</w:t>
+            </w:r>
+          </w:p>
+          <w:p>
+            <w:pPr>
+              <w:tabs>
+                <w:tab w:val="left" w:pos="260"/>
+              </w:tabs>
+              <w:spacing w:after="0" w:before="40" w:line="280"/>
+              <w:ind w:left="260" w:hanging="260"/>
+            </w:pPr>
+            <w:r>
+              <w:rPr>
+                <w:b/>
+                <w:bCs/>
+                <w:color w:val="C00000"/>
+                <w:sz w:val="21"/>
+                <w:szCs w:val="21"/>
+              </w:rPr>
+              <w:t xml:space="preserve">→	</w:t>
+            </w:r>
+            <w:r>
+              <w:rPr>
+                <w:b/>
+                <w:bCs/>
+                <w:sz w:val="21"/>
+                <w:szCs w:val="21"/>
+              </w:rPr>
+              <w:t xml:space="preserve">Global:</w:t>
+            </w:r>
+            <w:r>
+              <w:rPr>
+                <w:sz w:val="21"/>
+                <w:szCs w:val="21"/>
+              </w:rPr>
+              <w:t xml:space="preserve"> terrorism and nuclear risk</w:t>
             </w:r>
           </w:p>
         </w:tc>
@@ -506,7 +624,7 @@
                 <w:sz w:val="21"/>
                 <w:szCs w:val="21"/>
               </w:rPr>
-              <w:t xml:space="preserve">Current status in India</w:t>
+              <w:t xml:space="preserve">Current status (Sept 2026)</w:t>
             </w:r>
           </w:p>
         </w:tc>
@@ -529,116 +647,185 @@
           </w:tcPr>
           <w:p>
             <w:pPr>
-              <w:spacing w:after="0" w:before="0" w:line="300"/>
-            </w:pPr>
-            <w:r>
-              <w:rPr>
-                <w:sz w:val="21"/>
-                <w:szCs w:val="21"/>
-              </w:rPr>
-              <w:t xml:space="preserve">Article 370 abrogated (2019)</w:t>
-            </w:r>
-            <w:r>
-              <w:rPr>
-                <w:b/>
-                <w:bCs/>
-                <w:color w:val="C00000"/>
-                <w:sz w:val="21"/>
-                <w:szCs w:val="21"/>
-              </w:rPr>
-              <w:t xml:space="preserve">  →  </w:t>
-            </w:r>
-            <w:r>
-              <w:rPr>
-                <w:sz w:val="21"/>
-                <w:szCs w:val="21"/>
-              </w:rPr>
-              <w:t xml:space="preserve">Pahalgam attack (Apr 2025)</w:t>
-            </w:r>
-            <w:r>
-              <w:rPr>
-                <w:b/>
-                <w:bCs/>
-                <w:color w:val="C00000"/>
-                <w:sz w:val="21"/>
-                <w:szCs w:val="21"/>
-              </w:rPr>
-              <w:t xml:space="preserve">  →  </w:t>
-            </w:r>
-            <w:r>
-              <w:rPr>
-                <w:sz w:val="21"/>
-                <w:szCs w:val="21"/>
-              </w:rPr>
-              <w:t xml:space="preserve">Operation Sindoor (May 2025)</w:t>
-            </w:r>
-            <w:r>
-              <w:rPr>
-                <w:b/>
-                <w:bCs/>
-                <w:color w:val="C00000"/>
-                <w:sz w:val="21"/>
-                <w:szCs w:val="21"/>
-              </w:rPr>
-              <w:t xml:space="preserve">  →  </w:t>
-            </w:r>
-            <w:r>
-              <w:rPr>
-                <w:sz w:val="21"/>
-                <w:szCs w:val="21"/>
-              </w:rPr>
-              <w:t xml:space="preserve">Indus Waters Treaty in abeyance</w:t>
-            </w:r>
-            <w:r>
-              <w:rPr>
-                <w:b/>
-                <w:bCs/>
-                <w:color w:val="C00000"/>
-                <w:sz w:val="21"/>
-                <w:szCs w:val="21"/>
-              </w:rPr>
-              <w:t xml:space="preserve">  →  </w:t>
-            </w:r>
-            <w:r>
-              <w:rPr>
-                <w:sz w:val="21"/>
-                <w:szCs w:val="21"/>
-              </w:rPr>
-              <w:t xml:space="preserve">Attari border closed, trade and visas suspended, diplomatic strength reduced</w:t>
-            </w:r>
-            <w:r>
-              <w:rPr>
-                <w:b/>
-                <w:bCs/>
-                <w:color w:val="C00000"/>
-                <w:sz w:val="21"/>
-                <w:szCs w:val="21"/>
-              </w:rPr>
-              <w:t xml:space="preserve">  →  </w:t>
-            </w:r>
-            <w:r>
-              <w:rPr>
-                <w:sz w:val="21"/>
-                <w:szCs w:val="21"/>
-              </w:rPr>
-              <w:t xml:space="preserve">Ceasefire understanding (May 2025)</w:t>
-            </w:r>
-            <w:r>
-              <w:rPr>
-                <w:b/>
-                <w:bCs/>
-                <w:color w:val="C00000"/>
-                <w:sz w:val="21"/>
-                <w:szCs w:val="21"/>
-              </w:rPr>
-              <w:t xml:space="preserve">  →  </w:t>
-            </w:r>
-            <w:r>
-              <w:rPr>
-                <w:sz w:val="21"/>
-                <w:szCs w:val="21"/>
-              </w:rPr>
-              <w:t xml:space="preserve">India's doctrine: terror attack = act of war, no tolerance of nuclear blackmail, "talks and terror cannot go together"</w:t>
+              <w:tabs>
+                <w:tab w:val="left" w:pos="260"/>
+              </w:tabs>
+              <w:spacing w:after="0" w:before="0" w:line="280"/>
+              <w:ind w:left="260" w:hanging="260"/>
+            </w:pPr>
+            <w:r>
+              <w:rPr>
+                <w:b/>
+                <w:bCs/>
+                <w:color w:val="C00000"/>
+                <w:sz w:val="21"/>
+                <w:szCs w:val="21"/>
+              </w:rPr>
+              <w:t xml:space="preserve">→	</w:t>
+            </w:r>
+            <w:r>
+              <w:rPr>
+                <w:sz w:val="21"/>
+                <w:szCs w:val="21"/>
+              </w:rPr>
+              <w:t xml:space="preserve">Pahalgam (Apr 2025) and Operation Sindoor (May 2025) remain the reference point</w:t>
+            </w:r>
+          </w:p>
+          <w:p>
+            <w:pPr>
+              <w:tabs>
+                <w:tab w:val="left" w:pos="260"/>
+              </w:tabs>
+              <w:spacing w:after="0" w:before="40" w:line="280"/>
+              <w:ind w:left="260" w:hanging="260"/>
+            </w:pPr>
+            <w:r>
+              <w:rPr>
+                <w:b/>
+                <w:bCs/>
+                <w:color w:val="C00000"/>
+                <w:sz w:val="21"/>
+                <w:szCs w:val="21"/>
+              </w:rPr>
+              <w:t xml:space="preserve">→	</w:t>
+            </w:r>
+            <w:r>
+              <w:rPr>
+                <w:b/>
+                <w:bCs/>
+                <w:sz w:val="21"/>
+                <w:szCs w:val="21"/>
+              </w:rPr>
+              <w:t xml:space="preserve">IWT:</w:t>
+            </w:r>
+            <w:r>
+              <w:rPr>
+                <w:sz w:val="21"/>
+                <w:szCs w:val="21"/>
+              </w:rPr>
+              <w:t xml:space="preserve"> Court of Arbitration ruled the treaty still binding (31 Aug 2026); India rejected the ruling</w:t>
+            </w:r>
+          </w:p>
+          <w:p>
+            <w:pPr>
+              <w:tabs>
+                <w:tab w:val="left" w:pos="260"/>
+              </w:tabs>
+              <w:spacing w:after="0" w:before="40" w:line="280"/>
+              <w:ind w:left="260" w:hanging="260"/>
+            </w:pPr>
+            <w:r>
+              <w:rPr>
+                <w:b/>
+                <w:bCs/>
+                <w:color w:val="C00000"/>
+                <w:sz w:val="21"/>
+                <w:szCs w:val="21"/>
+              </w:rPr>
+              <w:t xml:space="preserve">→	</w:t>
+            </w:r>
+            <w:r>
+              <w:rPr>
+                <w:sz w:val="21"/>
+                <w:szCs w:val="21"/>
+              </w:rPr>
+              <w:t xml:space="preserve">Naval collision in the Arabian Sea (15 Sep 2026): first direct clash since 2025, diplomats summoned</w:t>
+            </w:r>
+          </w:p>
+          <w:p>
+            <w:pPr>
+              <w:tabs>
+                <w:tab w:val="left" w:pos="260"/>
+              </w:tabs>
+              <w:spacing w:after="0" w:before="40" w:line="280"/>
+              <w:ind w:left="260" w:hanging="260"/>
+            </w:pPr>
+            <w:r>
+              <w:rPr>
+                <w:b/>
+                <w:bCs/>
+                <w:color w:val="C00000"/>
+                <w:sz w:val="21"/>
+                <w:szCs w:val="21"/>
+              </w:rPr>
+              <w:t xml:space="preserve">→	</w:t>
+            </w:r>
+            <w:r>
+              <w:rPr>
+                <w:b/>
+                <w:bCs/>
+                <w:sz w:val="21"/>
+                <w:szCs w:val="21"/>
+              </w:rPr>
+              <w:t xml:space="preserve">Kashmir:</w:t>
+            </w:r>
+            <w:r>
+              <w:rPr>
+                <w:sz w:val="21"/>
+                <w:szCs w:val="21"/>
+              </w:rPr>
+              <w:t xml:space="preserve"> statehood demand continues; US called J&amp;K an important part of India (Aug 2026), Pakistan protested</w:t>
+            </w:r>
+          </w:p>
+          <w:p>
+            <w:pPr>
+              <w:tabs>
+                <w:tab w:val="left" w:pos="260"/>
+              </w:tabs>
+              <w:spacing w:after="0" w:before="40" w:line="280"/>
+              <w:ind w:left="260" w:hanging="260"/>
+            </w:pPr>
+            <w:r>
+              <w:rPr>
+                <w:b/>
+                <w:bCs/>
+                <w:color w:val="C00000"/>
+                <w:sz w:val="21"/>
+                <w:szCs w:val="21"/>
+              </w:rPr>
+              <w:t xml:space="preserve">→	</w:t>
+            </w:r>
+            <w:r>
+              <w:rPr>
+                <w:sz w:val="21"/>
+                <w:szCs w:val="21"/>
+              </w:rPr>
+              <w:t xml:space="preserve">Some signs of a thaw, nothing confirmed</w:t>
+            </w:r>
+          </w:p>
+          <w:p>
+            <w:pPr>
+              <w:tabs>
+                <w:tab w:val="left" w:pos="260"/>
+              </w:tabs>
+              <w:spacing w:after="0" w:before="40" w:line="280"/>
+              <w:ind w:left="260" w:hanging="260"/>
+            </w:pPr>
+            <w:r>
+              <w:rPr>
+                <w:b/>
+                <w:bCs/>
+                <w:color w:val="C00000"/>
+                <w:sz w:val="21"/>
+                <w:szCs w:val="21"/>
+              </w:rPr>
+              <w:t xml:space="preserve">→	</w:t>
+            </w:r>
+            <w:r>
+              <w:rPr>
+                <w:b/>
+                <w:bCs/>
+                <w:sz w:val="21"/>
+                <w:szCs w:val="21"/>
+              </w:rPr>
+              <w:t xml:space="preserve">India's doctrine:</w:t>
+            </w:r>
+            <w:r>
+              <w:rPr>
+                <w:sz w:val="21"/>
+                <w:szCs w:val="21"/>
+              </w:rPr>
+              <w:t xml:space="preserve"> terror attack = act of war, no nuclear blackmail, "talks and terror cannot go together"</w:t>
             </w:r>
           </w:p>
         </w:tc>
@@ -734,116 +921,184 @@
           </w:tcPr>
           <w:p>
             <w:pPr>
-              <w:spacing w:after="0" w:before="0" w:line="300"/>
-            </w:pPr>
-            <w:r>
-              <w:rPr>
-                <w:sz w:val="21"/>
-                <w:szCs w:val="21"/>
-              </w:rPr>
-              <w:t xml:space="preserve">Kashmir dispute</w:t>
-            </w:r>
-            <w:r>
-              <w:rPr>
-                <w:b/>
-                <w:bCs/>
-                <w:color w:val="C00000"/>
-                <w:sz w:val="21"/>
-                <w:szCs w:val="21"/>
-              </w:rPr>
-              <w:t xml:space="preserve">  →  </w:t>
-            </w:r>
-            <w:r>
-              <w:rPr>
-                <w:sz w:val="21"/>
-                <w:szCs w:val="21"/>
-              </w:rPr>
-              <w:t xml:space="preserve">State-sponsored terrorism (LeT, JeM)</w:t>
-            </w:r>
-            <w:r>
-              <w:rPr>
-                <w:b/>
-                <w:bCs/>
-                <w:color w:val="C00000"/>
-                <w:sz w:val="21"/>
-                <w:szCs w:val="21"/>
-              </w:rPr>
-              <w:t xml:space="preserve">  →  </w:t>
-            </w:r>
-            <w:r>
-              <w:rPr>
-                <w:sz w:val="21"/>
-                <w:szCs w:val="21"/>
-              </w:rPr>
-              <w:t xml:space="preserve">China–Pakistan nexus (CPEC through PoK, UN veto)</w:t>
-            </w:r>
-            <w:r>
-              <w:rPr>
-                <w:b/>
-                <w:bCs/>
-                <w:color w:val="C00000"/>
-                <w:sz w:val="21"/>
-                <w:szCs w:val="21"/>
-              </w:rPr>
-              <w:t xml:space="preserve">  →  </w:t>
-            </w:r>
-            <w:r>
-              <w:rPr>
-                <w:sz w:val="21"/>
-                <w:szCs w:val="21"/>
-              </w:rPr>
-              <w:t xml:space="preserve">Water dispute</w:t>
-            </w:r>
-            <w:r>
-              <w:rPr>
-                <w:b/>
-                <w:bCs/>
-                <w:color w:val="C00000"/>
-                <w:sz w:val="21"/>
-                <w:szCs w:val="21"/>
-              </w:rPr>
-              <w:t xml:space="preserve">  →  </w:t>
-            </w:r>
-            <w:r>
-              <w:rPr>
-                <w:sz w:val="21"/>
-                <w:szCs w:val="21"/>
-              </w:rPr>
-              <w:t xml:space="preserve">Drones and narcotics smuggling across the Punjab border</w:t>
-            </w:r>
-            <w:r>
-              <w:rPr>
-                <w:b/>
-                <w:bCs/>
-                <w:color w:val="C00000"/>
-                <w:sz w:val="21"/>
-                <w:szCs w:val="21"/>
-              </w:rPr>
-              <w:t xml:space="preserve">  →  </w:t>
-            </w:r>
-            <w:r>
-              <w:rPr>
-                <w:sz w:val="21"/>
-                <w:szCs w:val="21"/>
-              </w:rPr>
-              <w:t xml:space="preserve">Disinformation and cyber threats</w:t>
-            </w:r>
-            <w:r>
-              <w:rPr>
-                <w:b/>
-                <w:bCs/>
-                <w:color w:val="C00000"/>
-                <w:sz w:val="21"/>
-                <w:szCs w:val="21"/>
-              </w:rPr>
-              <w:t xml:space="preserve">  →  </w:t>
-            </w:r>
-            <w:r>
-              <w:rPr>
-                <w:sz w:val="21"/>
-                <w:szCs w:val="21"/>
-              </w:rPr>
-              <w:t xml:space="preserve">Deep trust deficit, no structured dialogue</w:t>
+              <w:tabs>
+                <w:tab w:val="left" w:pos="260"/>
+              </w:tabs>
+              <w:spacing w:after="0" w:before="0" w:line="280"/>
+              <w:ind w:left="260" w:hanging="260"/>
+            </w:pPr>
+            <w:r>
+              <w:rPr>
+                <w:b/>
+                <w:bCs/>
+                <w:color w:val="C00000"/>
+                <w:sz w:val="21"/>
+                <w:szCs w:val="21"/>
+              </w:rPr>
+              <w:t xml:space="preserve">→	</w:t>
+            </w:r>
+            <w:r>
+              <w:rPr>
+                <w:sz w:val="21"/>
+                <w:szCs w:val="21"/>
+              </w:rPr>
+              <w:t xml:space="preserve">Kashmir and state-sponsored terrorism (LeT, JeM)</w:t>
+            </w:r>
+          </w:p>
+          <w:p>
+            <w:pPr>
+              <w:tabs>
+                <w:tab w:val="left" w:pos="260"/>
+              </w:tabs>
+              <w:spacing w:after="0" w:before="40" w:line="280"/>
+              <w:ind w:left="260" w:hanging="260"/>
+            </w:pPr>
+            <w:r>
+              <w:rPr>
+                <w:b/>
+                <w:bCs/>
+                <w:color w:val="C00000"/>
+                <w:sz w:val="21"/>
+                <w:szCs w:val="21"/>
+              </w:rPr>
+              <w:t xml:space="preserve">→	</w:t>
+            </w:r>
+            <w:r>
+              <w:rPr>
+                <w:sz w:val="21"/>
+                <w:szCs w:val="21"/>
+              </w:rPr>
+              <w:t xml:space="preserve">Water dispute now a legal contest at The Hague</w:t>
+            </w:r>
+          </w:p>
+          <w:p>
+            <w:pPr>
+              <w:tabs>
+                <w:tab w:val="left" w:pos="260"/>
+              </w:tabs>
+              <w:spacing w:after="0" w:before="40" w:line="280"/>
+              <w:ind w:left="260" w:hanging="260"/>
+            </w:pPr>
+            <w:r>
+              <w:rPr>
+                <w:b/>
+                <w:bCs/>
+                <w:color w:val="C00000"/>
+                <w:sz w:val="21"/>
+                <w:szCs w:val="21"/>
+              </w:rPr>
+              <w:t xml:space="preserve">→	</w:t>
+            </w:r>
+            <w:r>
+              <w:rPr>
+                <w:sz w:val="21"/>
+                <w:szCs w:val="21"/>
+              </w:rPr>
+              <w:t xml:space="preserve">Maritime and LoC incidents, no hotline trust</w:t>
+            </w:r>
+          </w:p>
+          <w:p>
+            <w:pPr>
+              <w:tabs>
+                <w:tab w:val="left" w:pos="260"/>
+              </w:tabs>
+              <w:spacing w:after="0" w:before="40" w:line="280"/>
+              <w:ind w:left="260" w:hanging="260"/>
+            </w:pPr>
+            <w:r>
+              <w:rPr>
+                <w:b/>
+                <w:bCs/>
+                <w:color w:val="C00000"/>
+                <w:sz w:val="21"/>
+                <w:szCs w:val="21"/>
+              </w:rPr>
+              <w:t xml:space="preserve">→	</w:t>
+            </w:r>
+            <w:r>
+              <w:rPr>
+                <w:sz w:val="21"/>
+                <w:szCs w:val="21"/>
+              </w:rPr>
+              <w:t xml:space="preserve">China–Pakistan nexus (CPEC, UN terror-listing blocks)</w:t>
+            </w:r>
+          </w:p>
+          <w:p>
+            <w:pPr>
+              <w:tabs>
+                <w:tab w:val="left" w:pos="260"/>
+              </w:tabs>
+              <w:spacing w:after="0" w:before="40" w:line="280"/>
+              <w:ind w:left="260" w:hanging="260"/>
+            </w:pPr>
+            <w:r>
+              <w:rPr>
+                <w:b/>
+                <w:bCs/>
+                <w:color w:val="C00000"/>
+                <w:sz w:val="21"/>
+                <w:szCs w:val="21"/>
+              </w:rPr>
+              <w:t xml:space="preserve">→	</w:t>
+            </w:r>
+            <w:r>
+              <w:rPr>
+                <w:sz w:val="21"/>
+                <w:szCs w:val="21"/>
+              </w:rPr>
+              <w:t xml:space="preserve">Changing US–Pakistan equation</w:t>
+            </w:r>
+          </w:p>
+          <w:p>
+            <w:pPr>
+              <w:tabs>
+                <w:tab w:val="left" w:pos="260"/>
+              </w:tabs>
+              <w:spacing w:after="0" w:before="40" w:line="280"/>
+              <w:ind w:left="260" w:hanging="260"/>
+            </w:pPr>
+            <w:r>
+              <w:rPr>
+                <w:b/>
+                <w:bCs/>
+                <w:color w:val="C00000"/>
+                <w:sz w:val="21"/>
+                <w:szCs w:val="21"/>
+              </w:rPr>
+              <w:t xml:space="preserve">→	</w:t>
+            </w:r>
+            <w:r>
+              <w:rPr>
+                <w:sz w:val="21"/>
+                <w:szCs w:val="21"/>
+              </w:rPr>
+              <w:t xml:space="preserve">Drones, narcotics, disinformation</w:t>
+            </w:r>
+          </w:p>
+          <w:p>
+            <w:pPr>
+              <w:tabs>
+                <w:tab w:val="left" w:pos="260"/>
+              </w:tabs>
+              <w:spacing w:after="0" w:before="40" w:line="280"/>
+              <w:ind w:left="260" w:hanging="260"/>
+            </w:pPr>
+            <w:r>
+              <w:rPr>
+                <w:b/>
+                <w:bCs/>
+                <w:color w:val="C00000"/>
+                <w:sz w:val="21"/>
+                <w:szCs w:val="21"/>
+              </w:rPr>
+              <w:t xml:space="preserve">→	</w:t>
+            </w:r>
+            <w:r>
+              <w:rPr>
+                <w:sz w:val="21"/>
+                <w:szCs w:val="21"/>
+              </w:rPr>
+              <w:t xml:space="preserve">No structured dialogue</w:t>
             </w:r>
           </w:p>
         </w:tc>
@@ -936,133 +1191,219 @@
           </w:tcPr>
           <w:p>
             <w:pPr>
-              <w:spacing w:after="0" w:before="0" w:line="300"/>
-            </w:pPr>
-            <w:r>
-              <w:rPr>
-                <w:sz w:val="21"/>
-                <w:szCs w:val="21"/>
-              </w:rPr>
-              <w:t xml:space="preserve">Zero tolerance for terror, backed by strong deterrence</w:t>
-            </w:r>
-            <w:r>
-              <w:rPr>
-                <w:b/>
-                <w:bCs/>
-                <w:color w:val="C00000"/>
-                <w:sz w:val="21"/>
-                <w:szCs w:val="21"/>
-              </w:rPr>
-              <w:t xml:space="preserve">  →  </w:t>
-            </w:r>
-            <w:r>
-              <w:rPr>
-                <w:sz w:val="21"/>
-                <w:szCs w:val="21"/>
-              </w:rPr>
-              <w:t xml:space="preserve">Military modernisation (air defence, drones, surveillance)</w:t>
-            </w:r>
-            <w:r>
-              <w:rPr>
-                <w:b/>
-                <w:bCs/>
-                <w:color w:val="C00000"/>
-                <w:sz w:val="21"/>
-                <w:szCs w:val="21"/>
-              </w:rPr>
-              <w:t xml:space="preserve">  →  </w:t>
-            </w:r>
-            <w:r>
-              <w:rPr>
-                <w:sz w:val="21"/>
-                <w:szCs w:val="21"/>
-              </w:rPr>
-              <w:t xml:space="preserve">Diplomatic pressure (FATF, UN, global outreach)</w:t>
-            </w:r>
-            <w:r>
-              <w:rPr>
-                <w:b/>
-                <w:bCs/>
-                <w:color w:val="C00000"/>
-                <w:sz w:val="21"/>
-                <w:szCs w:val="21"/>
-              </w:rPr>
-              <w:t xml:space="preserve">  →  </w:t>
-            </w:r>
-            <w:r>
-              <w:rPr>
-                <w:sz w:val="21"/>
-                <w:szCs w:val="21"/>
-              </w:rPr>
-              <w:t xml:space="preserve">Secure borders (smart fencing, anti-drone systems)</w:t>
-            </w:r>
-            <w:r>
-              <w:rPr>
-                <w:b/>
-                <w:bCs/>
-                <w:color w:val="C00000"/>
-                <w:sz w:val="21"/>
-                <w:szCs w:val="21"/>
-              </w:rPr>
-              <w:t xml:space="preserve">  →  </w:t>
-            </w:r>
-            <w:r>
-              <w:rPr>
-                <w:sz w:val="21"/>
-                <w:szCs w:val="21"/>
-              </w:rPr>
-              <w:t xml:space="preserve">Kashmir: development, integration, peace</w:t>
-            </w:r>
-            <w:r>
-              <w:rPr>
-                <w:b/>
-                <w:bCs/>
-                <w:color w:val="C00000"/>
-                <w:sz w:val="21"/>
-                <w:szCs w:val="21"/>
-              </w:rPr>
-              <w:t xml:space="preserve">  →  </w:t>
-            </w:r>
-            <w:r>
-              <w:rPr>
-                <w:sz w:val="21"/>
-                <w:szCs w:val="21"/>
-              </w:rPr>
-              <w:t xml:space="preserve">Economic strength to reduce vulnerabilities</w:t>
-            </w:r>
-            <w:r>
-              <w:rPr>
-                <w:b/>
-                <w:bCs/>
-                <w:color w:val="C00000"/>
-                <w:sz w:val="21"/>
-                <w:szCs w:val="21"/>
-              </w:rPr>
-              <w:t xml:space="preserve">  →  </w:t>
-            </w:r>
-            <w:r>
-              <w:rPr>
-                <w:sz w:val="21"/>
-                <w:szCs w:val="21"/>
-              </w:rPr>
-              <w:t xml:space="preserve">Keep backchannels open</w:t>
-            </w:r>
-            <w:r>
-              <w:rPr>
-                <w:b/>
-                <w:bCs/>
-                <w:color w:val="C00000"/>
-                <w:sz w:val="21"/>
-                <w:szCs w:val="21"/>
-              </w:rPr>
-              <w:t xml:space="preserve">  →  </w:t>
-            </w:r>
-            <w:r>
-              <w:rPr>
-                <w:sz w:val="21"/>
-                <w:szCs w:val="21"/>
-              </w:rPr>
-              <w:t xml:space="preserve">People-to-people ties once Pakistan acts against terror</w:t>
+              <w:tabs>
+                <w:tab w:val="left" w:pos="260"/>
+              </w:tabs>
+              <w:spacing w:after="0" w:before="0" w:line="280"/>
+              <w:ind w:left="260" w:hanging="260"/>
+            </w:pPr>
+            <w:r>
+              <w:rPr>
+                <w:b/>
+                <w:bCs/>
+                <w:color w:val="C00000"/>
+                <w:sz w:val="21"/>
+                <w:szCs w:val="21"/>
+              </w:rPr>
+              <w:t xml:space="preserve">→	</w:t>
+            </w:r>
+            <w:r>
+              <w:rPr>
+                <w:sz w:val="21"/>
+                <w:szCs w:val="21"/>
+              </w:rPr>
+              <w:t xml:space="preserve">Zero tolerance for terror, strong deterrence</w:t>
+            </w:r>
+          </w:p>
+          <w:p>
+            <w:pPr>
+              <w:tabs>
+                <w:tab w:val="left" w:pos="260"/>
+              </w:tabs>
+              <w:spacing w:after="0" w:before="40" w:line="280"/>
+              <w:ind w:left="260" w:hanging="260"/>
+            </w:pPr>
+            <w:r>
+              <w:rPr>
+                <w:b/>
+                <w:bCs/>
+                <w:color w:val="C00000"/>
+                <w:sz w:val="21"/>
+                <w:szCs w:val="21"/>
+              </w:rPr>
+              <w:t xml:space="preserve">→	</w:t>
+            </w:r>
+            <w:r>
+              <w:rPr>
+                <w:sz w:val="21"/>
+                <w:szCs w:val="21"/>
+              </w:rPr>
+              <w:t xml:space="preserve">Military modernisation (air defence, drones, naval readiness, self-reliance)</w:t>
+            </w:r>
+          </w:p>
+          <w:p>
+            <w:pPr>
+              <w:tabs>
+                <w:tab w:val="left" w:pos="260"/>
+              </w:tabs>
+              <w:spacing w:after="0" w:before="40" w:line="280"/>
+              <w:ind w:left="260" w:hanging="260"/>
+            </w:pPr>
+            <w:r>
+              <w:rPr>
+                <w:b/>
+                <w:bCs/>
+                <w:color w:val="C00000"/>
+                <w:sz w:val="21"/>
+                <w:szCs w:val="21"/>
+              </w:rPr>
+              <w:t xml:space="preserve">→	</w:t>
+            </w:r>
+            <w:r>
+              <w:rPr>
+                <w:sz w:val="21"/>
+                <w:szCs w:val="21"/>
+              </w:rPr>
+              <w:t xml:space="preserve">Diplomatic pressure (FATF, UN)</w:t>
+            </w:r>
+          </w:p>
+          <w:p>
+            <w:pPr>
+              <w:tabs>
+                <w:tab w:val="left" w:pos="260"/>
+              </w:tabs>
+              <w:spacing w:after="0" w:before="40" w:line="280"/>
+              <w:ind w:left="260" w:hanging="260"/>
+            </w:pPr>
+            <w:r>
+              <w:rPr>
+                <w:b/>
+                <w:bCs/>
+                <w:color w:val="C00000"/>
+                <w:sz w:val="21"/>
+                <w:szCs w:val="21"/>
+              </w:rPr>
+              <w:t xml:space="preserve">→	</w:t>
+            </w:r>
+            <w:r>
+              <w:rPr>
+                <w:sz w:val="21"/>
+                <w:szCs w:val="21"/>
+              </w:rPr>
+              <w:t xml:space="preserve">Firm IWT stand, backed by legal and diplomatic strategy</w:t>
+            </w:r>
+          </w:p>
+          <w:p>
+            <w:pPr>
+              <w:tabs>
+                <w:tab w:val="left" w:pos="260"/>
+              </w:tabs>
+              <w:spacing w:after="0" w:before="40" w:line="280"/>
+              <w:ind w:left="260" w:hanging="260"/>
+            </w:pPr>
+            <w:r>
+              <w:rPr>
+                <w:b/>
+                <w:bCs/>
+                <w:color w:val="C00000"/>
+                <w:sz w:val="21"/>
+                <w:szCs w:val="21"/>
+              </w:rPr>
+              <w:t xml:space="preserve">→	</w:t>
+            </w:r>
+            <w:r>
+              <w:rPr>
+                <w:sz w:val="21"/>
+                <w:szCs w:val="21"/>
+              </w:rPr>
+              <w:t xml:space="preserve">Secure borders (anti-drone systems, smart fencing)</w:t>
+            </w:r>
+          </w:p>
+          <w:p>
+            <w:pPr>
+              <w:tabs>
+                <w:tab w:val="left" w:pos="260"/>
+              </w:tabs>
+              <w:spacing w:after="0" w:before="40" w:line="280"/>
+              <w:ind w:left="260" w:hanging="260"/>
+            </w:pPr>
+            <w:r>
+              <w:rPr>
+                <w:b/>
+                <w:bCs/>
+                <w:color w:val="C00000"/>
+                <w:sz w:val="21"/>
+                <w:szCs w:val="21"/>
+              </w:rPr>
+              <w:t xml:space="preserve">→	</w:t>
+            </w:r>
+            <w:r>
+              <w:rPr>
+                <w:b/>
+                <w:bCs/>
+                <w:sz w:val="21"/>
+                <w:szCs w:val="21"/>
+              </w:rPr>
+              <w:t xml:space="preserve">Kashmir:</w:t>
+            </w:r>
+            <w:r>
+              <w:rPr>
+                <w:sz w:val="21"/>
+                <w:szCs w:val="21"/>
+              </w:rPr>
+              <w:t xml:space="preserve"> development, integration, statehood in due course</w:t>
+            </w:r>
+          </w:p>
+          <w:p>
+            <w:pPr>
+              <w:tabs>
+                <w:tab w:val="left" w:pos="260"/>
+              </w:tabs>
+              <w:spacing w:after="0" w:before="40" w:line="280"/>
+              <w:ind w:left="260" w:hanging="260"/>
+            </w:pPr>
+            <w:r>
+              <w:rPr>
+                <w:b/>
+                <w:bCs/>
+                <w:color w:val="C00000"/>
+                <w:sz w:val="21"/>
+                <w:szCs w:val="21"/>
+              </w:rPr>
+              <w:t xml:space="preserve">→	</w:t>
+            </w:r>
+            <w:r>
+              <w:rPr>
+                <w:sz w:val="21"/>
+                <w:szCs w:val="21"/>
+              </w:rPr>
+              <w:t xml:space="preserve">Crisis hotlines and maritime confidence-building measures</w:t>
+            </w:r>
+          </w:p>
+          <w:p>
+            <w:pPr>
+              <w:tabs>
+                <w:tab w:val="left" w:pos="260"/>
+              </w:tabs>
+              <w:spacing w:after="0" w:before="40" w:line="280"/>
+              <w:ind w:left="260" w:hanging="260"/>
+            </w:pPr>
+            <w:r>
+              <w:rPr>
+                <w:b/>
+                <w:bCs/>
+                <w:color w:val="C00000"/>
+                <w:sz w:val="21"/>
+                <w:szCs w:val="21"/>
+              </w:rPr>
+              <w:t xml:space="preserve">→	</w:t>
+            </w:r>
+            <w:r>
+              <w:rPr>
+                <w:sz w:val="21"/>
+                <w:szCs w:val="21"/>
+              </w:rPr>
+              <w:t xml:space="preserve">Backchannels open; people-to-people ties once Pakistan acts on terror</w:t>
             </w:r>
           </w:p>
         </w:tc>
@@ -1158,48 +1499,1779 @@
           </w:tcPr>
           <w:p>
             <w:pPr>
+              <w:tabs>
+                <w:tab w:val="left" w:pos="260"/>
+              </w:tabs>
+              <w:spacing w:after="0" w:before="0" w:line="280"/>
+              <w:ind w:left="260" w:hanging="260"/>
+            </w:pPr>
+            <w:r>
+              <w:rPr>
+                <w:b/>
+                <w:bCs/>
+                <w:color w:val="C00000"/>
+                <w:sz w:val="21"/>
+                <w:szCs w:val="21"/>
+              </w:rPr>
+              <w:t xml:space="preserve">→	</w:t>
+            </w:r>
+            <w:r>
+              <w:rPr>
+                <w:sz w:val="21"/>
+                <w:szCs w:val="21"/>
+              </w:rPr>
+              <w:t xml:space="preserve">India wants peace, but not at the cost of security or sovereignty</w:t>
+            </w:r>
+          </w:p>
+          <w:p>
+            <w:pPr>
+              <w:tabs>
+                <w:tab w:val="left" w:pos="260"/>
+              </w:tabs>
+              <w:spacing w:after="0" w:before="40" w:line="280"/>
+              <w:ind w:left="260" w:hanging="260"/>
+            </w:pPr>
+            <w:r>
+              <w:rPr>
+                <w:b/>
+                <w:bCs/>
+                <w:color w:val="C00000"/>
+                <w:sz w:val="21"/>
+                <w:szCs w:val="21"/>
+              </w:rPr>
+              <w:t xml:space="preserve">→	</w:t>
+            </w:r>
+            <w:r>
+              <w:rPr>
+                <w:sz w:val="21"/>
+                <w:szCs w:val="21"/>
+              </w:rPr>
+              <w:t xml:space="preserve">A strong, self-reliant India deals with Pakistan from a position of strength</w:t>
+            </w:r>
+          </w:p>
+          <w:p>
+            <w:pPr>
+              <w:tabs>
+                <w:tab w:val="left" w:pos="260"/>
+              </w:tabs>
+              <w:spacing w:after="0" w:before="40" w:line="280"/>
+              <w:ind w:left="260" w:hanging="260"/>
+            </w:pPr>
+            <w:r>
+              <w:rPr>
+                <w:b/>
+                <w:bCs/>
+                <w:color w:val="C00000"/>
+                <w:sz w:val="21"/>
+                <w:szCs w:val="21"/>
+              </w:rPr>
+              <w:t xml:space="preserve">→	</w:t>
+            </w:r>
+            <w:r>
+              <w:rPr>
+                <w:sz w:val="21"/>
+                <w:szCs w:val="21"/>
+              </w:rPr>
+              <w:t xml:space="preserve">Lasting peace depends on Pakistan ending terror</w:t>
+            </w:r>
+          </w:p>
+        </w:tc>
+      </w:tr>
+    </w:tbl>
+    <w:p>
+      <w:pPr>
+        <w:pStyle w:val="Heading1"/>
+        <w:pageBreakBefore/>
+        <w:shd w:fill="1F3864" w:color="auto" w:val="clear"/>
+        <w:spacing w:after="160" w:before="0"/>
+        <w:ind w:left="100" w:right="100"/>
+      </w:pPr>
+      <w:r>
+        <w:t xml:space="preserve">Topic 2: India–China Relations</w:t>
+      </w:r>
+    </w:p>
+    <w:tbl>
+      <w:tblPr>
+        <w:tblW w:type="dxa" w:w="10706"/>
+        <w:tblBorders>
+          <w:top w:val="single" w:color="auto" w:sz="4"/>
+          <w:left w:val="single" w:color="auto" w:sz="4"/>
+          <w:bottom w:val="single" w:color="auto" w:sz="4"/>
+          <w:right w:val="single" w:color="auto" w:sz="4"/>
+          <w:insideH w:val="single" w:color="auto" w:sz="4"/>
+          <w:insideV w:val="single" w:color="auto" w:sz="4"/>
+        </w:tblBorders>
+      </w:tblPr>
+      <w:tblGrid>
+        <w:gridCol w:w="520"/>
+        <w:gridCol w:w="2200"/>
+        <w:gridCol w:w="7986"/>
+      </w:tblGrid>
+      <w:tr>
+        <w:trPr>
+          <w:tblHeader/>
+        </w:trPr>
+        <w:tc>
+          <w:tcPr>
+            <w:tcW w:type="dxa" w:w="520"/>
+            <w:tcBorders>
+              <w:top w:val="single" w:color="BFBFBF" w:sz="4"/>
+              <w:left w:val="single" w:color="BFBFBF" w:sz="4"/>
+              <w:bottom w:val="single" w:color="BFBFBF" w:sz="4"/>
+              <w:right w:val="single" w:color="BFBFBF" w:sz="4"/>
+            </w:tcBorders>
+            <w:shd w:fill="DCE3F0" w:color="auto" w:val="clear"/>
+            <w:tcMar>
+              <w:top w:type="dxa" w:w="70"/>
+              <w:left w:type="dxa" w:w="100"/>
+              <w:bottom w:type="dxa" w:w="70"/>
+              <w:right w:type="dxa" w:w="100"/>
+            </w:tcMar>
+            <w:vAlign w:val="center"/>
+          </w:tcPr>
+          <w:p>
+            <w:pPr>
               <w:spacing w:after="0" w:before="0" w:line="300"/>
-            </w:pPr>
-            <w:r>
-              <w:rPr>
-                <w:sz w:val="21"/>
-                <w:szCs w:val="21"/>
-              </w:rPr>
-              <w:t xml:space="preserve">India wants peace, but not at the cost of security or sovereignty</w:t>
-            </w:r>
-            <w:r>
-              <w:rPr>
-                <w:b/>
-                <w:bCs/>
-                <w:color w:val="C00000"/>
-                <w:sz w:val="21"/>
-                <w:szCs w:val="21"/>
-              </w:rPr>
-              <w:t xml:space="preserve">  →  </w:t>
-            </w:r>
-            <w:r>
-              <w:rPr>
-                <w:sz w:val="21"/>
-                <w:szCs w:val="21"/>
-              </w:rPr>
-              <w:t xml:space="preserve">A strong, self-reliant and confident India can deal with Pakistan from a position of strength</w:t>
-            </w:r>
-            <w:r>
-              <w:rPr>
-                <w:b/>
-                <w:bCs/>
-                <w:color w:val="C00000"/>
-                <w:sz w:val="21"/>
-                <w:szCs w:val="21"/>
-              </w:rPr>
-              <w:t xml:space="preserve">  →  </w:t>
-            </w:r>
-            <w:r>
-              <w:rPr>
-                <w:sz w:val="21"/>
-                <w:szCs w:val="21"/>
-              </w:rPr>
-              <w:t xml:space="preserve">Lasting peace depends on Pakistan ending terror</w:t>
+              <w:jc w:val="center"/>
+            </w:pPr>
+            <w:r>
+              <w:rPr>
+                <w:b/>
+                <w:bCs/>
+                <w:sz w:val="21"/>
+                <w:szCs w:val="21"/>
+              </w:rPr>
+              <w:t xml:space="preserve">#</w:t>
+            </w:r>
+          </w:p>
+        </w:tc>
+        <w:tc>
+          <w:tcPr>
+            <w:tcW w:type="dxa" w:w="2200"/>
+            <w:tcBorders>
+              <w:top w:val="single" w:color="BFBFBF" w:sz="4"/>
+              <w:left w:val="single" w:color="BFBFBF" w:sz="4"/>
+              <w:bottom w:val="single" w:color="BFBFBF" w:sz="4"/>
+              <w:right w:val="single" w:color="BFBFBF" w:sz="4"/>
+            </w:tcBorders>
+            <w:shd w:fill="DCE3F0" w:color="auto" w:val="clear"/>
+            <w:tcMar>
+              <w:top w:type="dxa" w:w="70"/>
+              <w:left w:type="dxa" w:w="100"/>
+              <w:bottom w:type="dxa" w:w="70"/>
+              <w:right w:type="dxa" w:w="100"/>
+            </w:tcMar>
+            <w:vAlign w:val="center"/>
+          </w:tcPr>
+          <w:p>
+            <w:pPr>
+              <w:spacing w:after="0" w:before="0" w:line="300"/>
+            </w:pPr>
+            <w:r>
+              <w:rPr>
+                <w:b/>
+                <w:bCs/>
+                <w:sz w:val="21"/>
+                <w:szCs w:val="21"/>
+              </w:rPr>
+              <w:t xml:space="preserve">Stage</w:t>
+            </w:r>
+          </w:p>
+        </w:tc>
+        <w:tc>
+          <w:tcPr>
+            <w:tcW w:type="dxa" w:w="7986"/>
+            <w:tcBorders>
+              <w:top w:val="single" w:color="BFBFBF" w:sz="4"/>
+              <w:left w:val="single" w:color="BFBFBF" w:sz="4"/>
+              <w:bottom w:val="single" w:color="BFBFBF" w:sz="4"/>
+              <w:right w:val="single" w:color="BFBFBF" w:sz="4"/>
+            </w:tcBorders>
+            <w:shd w:fill="DCE3F0" w:color="auto" w:val="clear"/>
+            <w:tcMar>
+              <w:top w:type="dxa" w:w="70"/>
+              <w:left w:type="dxa" w:w="100"/>
+              <w:bottom w:type="dxa" w:w="70"/>
+              <w:right w:type="dxa" w:w="100"/>
+            </w:tcMar>
+            <w:vAlign w:val="center"/>
+          </w:tcPr>
+          <w:p>
+            <w:pPr>
+              <w:spacing w:after="0" w:before="0" w:line="300"/>
+            </w:pPr>
+            <w:r>
+              <w:rPr>
+                <w:b/>
+                <w:bCs/>
+                <w:sz w:val="21"/>
+                <w:szCs w:val="21"/>
+              </w:rPr>
+              <w:t xml:space="preserve">Flow</w:t>
+            </w:r>
+          </w:p>
+        </w:tc>
+      </w:tr>
+      <w:tr>
+        <w:trPr>
+          <w:cantSplit/>
+        </w:trPr>
+        <w:tc>
+          <w:tcPr>
+            <w:tcW w:type="dxa" w:w="520"/>
+            <w:tcBorders>
+              <w:top w:val="single" w:color="BFBFBF" w:sz="4"/>
+              <w:left w:val="single" w:color="BFBFBF" w:sz="4"/>
+              <w:bottom w:val="single" w:color="BFBFBF" w:sz="4"/>
+              <w:right w:val="single" w:color="BFBFBF" w:sz="4"/>
+            </w:tcBorders>
+            <w:tcMar>
+              <w:top w:type="dxa" w:w="70"/>
+              <w:left w:type="dxa" w:w="100"/>
+              <w:bottom w:type="dxa" w:w="70"/>
+              <w:right w:type="dxa" w:w="100"/>
+            </w:tcMar>
+            <w:vAlign w:val="center"/>
+          </w:tcPr>
+          <w:p>
+            <w:pPr>
+              <w:spacing w:after="0" w:before="0" w:line="300"/>
+              <w:jc w:val="center"/>
+            </w:pPr>
+            <w:r>
+              <w:rPr>
+                <w:color w:val="7F7F7F"/>
+                <w:sz w:val="21"/>
+                <w:szCs w:val="21"/>
+              </w:rPr>
+              <w:t xml:space="preserve">1</w:t>
+            </w:r>
+          </w:p>
+        </w:tc>
+        <w:tc>
+          <w:tcPr>
+            <w:tcW w:type="dxa" w:w="2200"/>
+            <w:tcBorders>
+              <w:top w:val="single" w:color="BFBFBF" w:sz="4"/>
+              <w:left w:val="single" w:color="BFBFBF" w:sz="4"/>
+              <w:bottom w:val="single" w:color="BFBFBF" w:sz="4"/>
+              <w:right w:val="single" w:color="BFBFBF" w:sz="4"/>
+            </w:tcBorders>
+            <w:tcMar>
+              <w:top w:type="dxa" w:w="70"/>
+              <w:left w:type="dxa" w:w="100"/>
+              <w:bottom w:type="dxa" w:w="70"/>
+              <w:right w:type="dxa" w:w="100"/>
+            </w:tcMar>
+            <w:vAlign w:val="center"/>
+          </w:tcPr>
+          <w:p>
+            <w:pPr>
+              <w:spacing w:after="0" w:before="0" w:line="300"/>
+            </w:pPr>
+            <w:r>
+              <w:rPr>
+                <w:b/>
+                <w:bCs/>
+                <w:color w:val="1F3864"/>
+                <w:sz w:val="21"/>
+                <w:szCs w:val="21"/>
+              </w:rPr>
+              <w:t xml:space="preserve">What is it</w:t>
+            </w:r>
+          </w:p>
+        </w:tc>
+        <w:tc>
+          <w:tcPr>
+            <w:tcW w:type="dxa" w:w="7986"/>
+            <w:tcBorders>
+              <w:top w:val="single" w:color="BFBFBF" w:sz="4"/>
+              <w:left w:val="single" w:color="BFBFBF" w:sz="4"/>
+              <w:bottom w:val="single" w:color="BFBFBF" w:sz="4"/>
+              <w:right w:val="single" w:color="BFBFBF" w:sz="4"/>
+            </w:tcBorders>
+            <w:tcMar>
+              <w:top w:type="dxa" w:w="70"/>
+              <w:left w:type="dxa" w:w="100"/>
+              <w:bottom w:type="dxa" w:w="70"/>
+              <w:right w:type="dxa" w:w="100"/>
+            </w:tcMar>
+            <w:vAlign w:val="center"/>
+          </w:tcPr>
+          <w:p>
+            <w:pPr>
+              <w:tabs>
+                <w:tab w:val="left" w:pos="260"/>
+              </w:tabs>
+              <w:spacing w:after="0" w:before="0" w:line="280"/>
+              <w:ind w:left="260" w:hanging="260"/>
+            </w:pPr>
+            <w:r>
+              <w:rPr>
+                <w:b/>
+                <w:bCs/>
+                <w:color w:val="C00000"/>
+                <w:sz w:val="21"/>
+                <w:szCs w:val="21"/>
+              </w:rPr>
+              <w:t xml:space="preserve">→	</w:t>
+            </w:r>
+            <w:r>
+              <w:rPr>
+                <w:sz w:val="21"/>
+                <w:szCs w:val="21"/>
+              </w:rPr>
+              <w:t xml:space="preserve">Two ancient civilisations and Asia's largest neighbours, both nuclear-armed rising powers</w:t>
+            </w:r>
+          </w:p>
+          <w:p>
+            <w:pPr>
+              <w:tabs>
+                <w:tab w:val="left" w:pos="260"/>
+              </w:tabs>
+              <w:spacing w:after="0" w:before="40" w:line="280"/>
+              <w:ind w:left="260" w:hanging="260"/>
+            </w:pPr>
+            <w:r>
+              <w:rPr>
+                <w:b/>
+                <w:bCs/>
+                <w:color w:val="C00000"/>
+                <w:sz w:val="21"/>
+                <w:szCs w:val="21"/>
+              </w:rPr>
+              <w:t xml:space="preserve">→	</w:t>
+            </w:r>
+            <w:r>
+              <w:rPr>
+                <w:sz w:val="21"/>
+                <w:szCs w:val="21"/>
+              </w:rPr>
+              <w:t xml:space="preserve">Cooperation, competition and conflict together</w:t>
+            </w:r>
+          </w:p>
+          <w:p>
+            <w:pPr>
+              <w:tabs>
+                <w:tab w:val="left" w:pos="260"/>
+              </w:tabs>
+              <w:spacing w:after="0" w:before="40" w:line="280"/>
+              <w:ind w:left="260" w:hanging="260"/>
+            </w:pPr>
+            <w:r>
+              <w:rPr>
+                <w:b/>
+                <w:bCs/>
+                <w:color w:val="C00000"/>
+                <w:sz w:val="21"/>
+                <w:szCs w:val="21"/>
+              </w:rPr>
+              <w:t xml:space="preserve">→	</w:t>
+            </w:r>
+            <w:r>
+              <w:rPr>
+                <w:sz w:val="21"/>
+                <w:szCs w:val="21"/>
+              </w:rPr>
+              <w:t xml:space="preserve">About 3,500 km disputed LAC</w:t>
+            </w:r>
+          </w:p>
+          <w:p>
+            <w:pPr>
+              <w:tabs>
+                <w:tab w:val="left" w:pos="260"/>
+              </w:tabs>
+              <w:spacing w:after="0" w:before="40" w:line="280"/>
+              <w:ind w:left="260" w:hanging="260"/>
+            </w:pPr>
+            <w:r>
+              <w:rPr>
+                <w:b/>
+                <w:bCs/>
+                <w:color w:val="C00000"/>
+                <w:sz w:val="21"/>
+                <w:szCs w:val="21"/>
+              </w:rPr>
+              <w:t xml:space="preserve">→	</w:t>
+            </w:r>
+            <w:r>
+              <w:rPr>
+                <w:sz w:val="21"/>
+                <w:szCs w:val="21"/>
+              </w:rPr>
+              <w:t xml:space="preserve">1962 war, Doklam 2017, Galwan 2020</w:t>
+            </w:r>
+          </w:p>
+        </w:tc>
+      </w:tr>
+      <w:tr>
+        <w:trPr>
+          <w:cantSplit/>
+        </w:trPr>
+        <w:tc>
+          <w:tcPr>
+            <w:tcW w:type="dxa" w:w="520"/>
+            <w:tcBorders>
+              <w:top w:val="single" w:color="BFBFBF" w:sz="4"/>
+              <w:left w:val="single" w:color="BFBFBF" w:sz="4"/>
+              <w:bottom w:val="single" w:color="BFBFBF" w:sz="4"/>
+              <w:right w:val="single" w:color="BFBFBF" w:sz="4"/>
+            </w:tcBorders>
+            <w:shd w:fill="F5F7FB" w:color="auto" w:val="clear"/>
+            <w:tcMar>
+              <w:top w:type="dxa" w:w="70"/>
+              <w:left w:type="dxa" w:w="100"/>
+              <w:bottom w:type="dxa" w:w="70"/>
+              <w:right w:type="dxa" w:w="100"/>
+            </w:tcMar>
+            <w:vAlign w:val="center"/>
+          </w:tcPr>
+          <w:p>
+            <w:pPr>
+              <w:spacing w:after="0" w:before="0" w:line="300"/>
+              <w:jc w:val="center"/>
+            </w:pPr>
+            <w:r>
+              <w:rPr>
+                <w:color w:val="7F7F7F"/>
+                <w:sz w:val="21"/>
+                <w:szCs w:val="21"/>
+              </w:rPr>
+              <w:t xml:space="preserve">2</w:t>
+            </w:r>
+          </w:p>
+        </w:tc>
+        <w:tc>
+          <w:tcPr>
+            <w:tcW w:type="dxa" w:w="2200"/>
+            <w:tcBorders>
+              <w:top w:val="single" w:color="BFBFBF" w:sz="4"/>
+              <w:left w:val="single" w:color="BFBFBF" w:sz="4"/>
+              <w:bottom w:val="single" w:color="BFBFBF" w:sz="4"/>
+              <w:right w:val="single" w:color="BFBFBF" w:sz="4"/>
+            </w:tcBorders>
+            <w:shd w:fill="F5F7FB" w:color="auto" w:val="clear"/>
+            <w:tcMar>
+              <w:top w:type="dxa" w:w="70"/>
+              <w:left w:type="dxa" w:w="100"/>
+              <w:bottom w:type="dxa" w:w="70"/>
+              <w:right w:type="dxa" w:w="100"/>
+            </w:tcMar>
+            <w:vAlign w:val="center"/>
+          </w:tcPr>
+          <w:p>
+            <w:pPr>
+              <w:spacing w:after="0" w:before="0" w:line="300"/>
+            </w:pPr>
+            <w:r>
+              <w:rPr>
+                <w:b/>
+                <w:bCs/>
+                <w:color w:val="1F3864"/>
+                <w:sz w:val="21"/>
+                <w:szCs w:val="21"/>
+              </w:rPr>
+              <w:t xml:space="preserve">Why it matters</w:t>
+            </w:r>
+          </w:p>
+        </w:tc>
+        <w:tc>
+          <w:tcPr>
+            <w:tcW w:type="dxa" w:w="7986"/>
+            <w:tcBorders>
+              <w:top w:val="single" w:color="BFBFBF" w:sz="4"/>
+              <w:left w:val="single" w:color="BFBFBF" w:sz="4"/>
+              <w:bottom w:val="single" w:color="BFBFBF" w:sz="4"/>
+              <w:right w:val="single" w:color="BFBFBF" w:sz="4"/>
+            </w:tcBorders>
+            <w:shd w:fill="F5F7FB" w:color="auto" w:val="clear"/>
+            <w:tcMar>
+              <w:top w:type="dxa" w:w="70"/>
+              <w:left w:type="dxa" w:w="100"/>
+              <w:bottom w:type="dxa" w:w="70"/>
+              <w:right w:type="dxa" w:w="100"/>
+            </w:tcMar>
+            <w:vAlign w:val="center"/>
+          </w:tcPr>
+          <w:p>
+            <w:pPr>
+              <w:tabs>
+                <w:tab w:val="left" w:pos="260"/>
+              </w:tabs>
+              <w:spacing w:after="0" w:before="0" w:line="280"/>
+              <w:ind w:left="260" w:hanging="260"/>
+            </w:pPr>
+            <w:r>
+              <w:rPr>
+                <w:b/>
+                <w:bCs/>
+                <w:color w:val="C00000"/>
+                <w:sz w:val="21"/>
+                <w:szCs w:val="21"/>
+              </w:rPr>
+              <w:t xml:space="preserve">→	</w:t>
+            </w:r>
+            <w:r>
+              <w:rPr>
+                <w:b/>
+                <w:bCs/>
+                <w:sz w:val="21"/>
+                <w:szCs w:val="21"/>
+              </w:rPr>
+              <w:t xml:space="preserve">Security:</w:t>
+            </w:r>
+            <w:r>
+              <w:rPr>
+                <w:sz w:val="21"/>
+                <w:szCs w:val="21"/>
+              </w:rPr>
+              <w:t xml:space="preserve"> two-front threat</w:t>
+            </w:r>
+          </w:p>
+          <w:p>
+            <w:pPr>
+              <w:tabs>
+                <w:tab w:val="left" w:pos="260"/>
+              </w:tabs>
+              <w:spacing w:after="0" w:before="40" w:line="280"/>
+              <w:ind w:left="260" w:hanging="260"/>
+            </w:pPr>
+            <w:r>
+              <w:rPr>
+                <w:b/>
+                <w:bCs/>
+                <w:color w:val="C00000"/>
+                <w:sz w:val="21"/>
+                <w:szCs w:val="21"/>
+              </w:rPr>
+              <w:t xml:space="preserve">→	</w:t>
+            </w:r>
+            <w:r>
+              <w:rPr>
+                <w:b/>
+                <w:bCs/>
+                <w:sz w:val="21"/>
+                <w:szCs w:val="21"/>
+              </w:rPr>
+              <w:t xml:space="preserve">Economic:</w:t>
+            </w:r>
+            <w:r>
+              <w:rPr>
+                <w:sz w:val="21"/>
+                <w:szCs w:val="21"/>
+              </w:rPr>
+              <w:t xml:space="preserve"> supply-chain dependence (electronics, pharma inputs, rare earths)</w:t>
+            </w:r>
+          </w:p>
+          <w:p>
+            <w:pPr>
+              <w:tabs>
+                <w:tab w:val="left" w:pos="260"/>
+              </w:tabs>
+              <w:spacing w:after="0" w:before="40" w:line="280"/>
+              <w:ind w:left="260" w:hanging="260"/>
+            </w:pPr>
+            <w:r>
+              <w:rPr>
+                <w:b/>
+                <w:bCs/>
+                <w:color w:val="C00000"/>
+                <w:sz w:val="21"/>
+                <w:szCs w:val="21"/>
+              </w:rPr>
+              <w:t xml:space="preserve">→	</w:t>
+            </w:r>
+            <w:r>
+              <w:rPr>
+                <w:b/>
+                <w:bCs/>
+                <w:sz w:val="21"/>
+                <w:szCs w:val="21"/>
+              </w:rPr>
+              <w:t xml:space="preserve">Strategic:</w:t>
+            </w:r>
+            <w:r>
+              <w:rPr>
+                <w:sz w:val="21"/>
+                <w:szCs w:val="21"/>
+              </w:rPr>
+              <w:t xml:space="preserve"> Indian Ocean, Indo-Pacific, China–Pakistan nexus</w:t>
+            </w:r>
+          </w:p>
+          <w:p>
+            <w:pPr>
+              <w:tabs>
+                <w:tab w:val="left" w:pos="260"/>
+              </w:tabs>
+              <w:spacing w:after="0" w:before="40" w:line="280"/>
+              <w:ind w:left="260" w:hanging="260"/>
+            </w:pPr>
+            <w:r>
+              <w:rPr>
+                <w:b/>
+                <w:bCs/>
+                <w:color w:val="C00000"/>
+                <w:sz w:val="21"/>
+                <w:szCs w:val="21"/>
+              </w:rPr>
+              <w:t xml:space="preserve">→	</w:t>
+            </w:r>
+            <w:r>
+              <w:rPr>
+                <w:b/>
+                <w:bCs/>
+                <w:sz w:val="21"/>
+                <w:szCs w:val="21"/>
+              </w:rPr>
+              <w:t xml:space="preserve">Global:</w:t>
+            </w:r>
+            <w:r>
+              <w:rPr>
+                <w:sz w:val="21"/>
+                <w:szCs w:val="21"/>
+              </w:rPr>
+              <w:t xml:space="preserve"> the "Asian century" depends on these ties</w:t>
+            </w:r>
+          </w:p>
+        </w:tc>
+      </w:tr>
+      <w:tr>
+        <w:trPr>
+          <w:cantSplit/>
+        </w:trPr>
+        <w:tc>
+          <w:tcPr>
+            <w:tcW w:type="dxa" w:w="520"/>
+            <w:tcBorders>
+              <w:top w:val="single" w:color="BFBFBF" w:sz="4"/>
+              <w:left w:val="single" w:color="BFBFBF" w:sz="4"/>
+              <w:bottom w:val="single" w:color="BFBFBF" w:sz="4"/>
+              <w:right w:val="single" w:color="BFBFBF" w:sz="4"/>
+            </w:tcBorders>
+            <w:tcMar>
+              <w:top w:type="dxa" w:w="70"/>
+              <w:left w:type="dxa" w:w="100"/>
+              <w:bottom w:type="dxa" w:w="70"/>
+              <w:right w:type="dxa" w:w="100"/>
+            </w:tcMar>
+            <w:vAlign w:val="center"/>
+          </w:tcPr>
+          <w:p>
+            <w:pPr>
+              <w:spacing w:after="0" w:before="0" w:line="300"/>
+              <w:jc w:val="center"/>
+            </w:pPr>
+            <w:r>
+              <w:rPr>
+                <w:color w:val="7F7F7F"/>
+                <w:sz w:val="21"/>
+                <w:szCs w:val="21"/>
+              </w:rPr>
+              <w:t xml:space="preserve">3</w:t>
+            </w:r>
+          </w:p>
+        </w:tc>
+        <w:tc>
+          <w:tcPr>
+            <w:tcW w:type="dxa" w:w="2200"/>
+            <w:tcBorders>
+              <w:top w:val="single" w:color="BFBFBF" w:sz="4"/>
+              <w:left w:val="single" w:color="BFBFBF" w:sz="4"/>
+              <w:bottom w:val="single" w:color="BFBFBF" w:sz="4"/>
+              <w:right w:val="single" w:color="BFBFBF" w:sz="4"/>
+            </w:tcBorders>
+            <w:tcMar>
+              <w:top w:type="dxa" w:w="70"/>
+              <w:left w:type="dxa" w:w="100"/>
+              <w:bottom w:type="dxa" w:w="70"/>
+              <w:right w:type="dxa" w:w="100"/>
+            </w:tcMar>
+            <w:vAlign w:val="center"/>
+          </w:tcPr>
+          <w:p>
+            <w:pPr>
+              <w:spacing w:after="0" w:before="0" w:line="300"/>
+            </w:pPr>
+            <w:r>
+              <w:rPr>
+                <w:b/>
+                <w:bCs/>
+                <w:color w:val="1F3864"/>
+                <w:sz w:val="21"/>
+                <w:szCs w:val="21"/>
+              </w:rPr>
+              <w:t xml:space="preserve">Current status (Sept 2026)</w:t>
+            </w:r>
+          </w:p>
+        </w:tc>
+        <w:tc>
+          <w:tcPr>
+            <w:tcW w:type="dxa" w:w="7986"/>
+            <w:tcBorders>
+              <w:top w:val="single" w:color="BFBFBF" w:sz="4"/>
+              <w:left w:val="single" w:color="BFBFBF" w:sz="4"/>
+              <w:bottom w:val="single" w:color="BFBFBF" w:sz="4"/>
+              <w:right w:val="single" w:color="BFBFBF" w:sz="4"/>
+            </w:tcBorders>
+            <w:tcMar>
+              <w:top w:type="dxa" w:w="70"/>
+              <w:left w:type="dxa" w:w="100"/>
+              <w:bottom w:type="dxa" w:w="70"/>
+              <w:right w:type="dxa" w:w="100"/>
+            </w:tcMar>
+            <w:vAlign w:val="center"/>
+          </w:tcPr>
+          <w:p>
+            <w:pPr>
+              <w:tabs>
+                <w:tab w:val="left" w:pos="260"/>
+              </w:tabs>
+              <w:spacing w:after="0" w:before="0" w:line="280"/>
+              <w:ind w:left="260" w:hanging="260"/>
+            </w:pPr>
+            <w:r>
+              <w:rPr>
+                <w:b/>
+                <w:bCs/>
+                <w:color w:val="C00000"/>
+                <w:sz w:val="21"/>
+                <w:szCs w:val="21"/>
+              </w:rPr>
+              <w:t xml:space="preserve">→	</w:t>
+            </w:r>
+            <w:r>
+              <w:rPr>
+                <w:sz w:val="21"/>
+                <w:szCs w:val="21"/>
+              </w:rPr>
+              <w:t xml:space="preserve">BRICS Summit, New Delhi (12–13 Sep 2026): Xi's first India visit since 2019, Modi–Xi bilateral</w:t>
+            </w:r>
+          </w:p>
+          <w:p>
+            <w:pPr>
+              <w:tabs>
+                <w:tab w:val="left" w:pos="260"/>
+              </w:tabs>
+              <w:spacing w:after="0" w:before="40" w:line="280"/>
+              <w:ind w:left="260" w:hanging="260"/>
+            </w:pPr>
+            <w:r>
+              <w:rPr>
+                <w:b/>
+                <w:bCs/>
+                <w:color w:val="C00000"/>
+                <w:sz w:val="21"/>
+                <w:szCs w:val="21"/>
+              </w:rPr>
+              <w:t xml:space="preserve">→	</w:t>
+            </w:r>
+            <w:r>
+              <w:rPr>
+                <w:b/>
+                <w:bCs/>
+                <w:sz w:val="21"/>
+                <w:szCs w:val="21"/>
+              </w:rPr>
+              <w:t xml:space="preserve">SR talks:</w:t>
+            </w:r>
+            <w:r>
+              <w:rPr>
+                <w:sz w:val="21"/>
+                <w:szCs w:val="21"/>
+              </w:rPr>
+              <w:t xml:space="preserve"> NSA Doval and Wang Yi, just before the summit</w:t>
+            </w:r>
+          </w:p>
+          <w:p>
+            <w:pPr>
+              <w:tabs>
+                <w:tab w:val="left" w:pos="260"/>
+              </w:tabs>
+              <w:spacing w:after="0" w:before="40" w:line="280"/>
+              <w:ind w:left="260" w:hanging="260"/>
+            </w:pPr>
+            <w:r>
+              <w:rPr>
+                <w:b/>
+                <w:bCs/>
+                <w:color w:val="C00000"/>
+                <w:sz w:val="21"/>
+                <w:szCs w:val="21"/>
+              </w:rPr>
+              <w:t xml:space="preserve">→	</w:t>
+            </w:r>
+            <w:r>
+              <w:rPr>
+                <w:sz w:val="21"/>
+                <w:szCs w:val="21"/>
+              </w:rPr>
+              <w:t xml:space="preserve">First Corps Commander talks in Arunachal Pradesh (Sept 2026)</w:t>
+            </w:r>
+          </w:p>
+          <w:p>
+            <w:pPr>
+              <w:tabs>
+                <w:tab w:val="left" w:pos="260"/>
+              </w:tabs>
+              <w:spacing w:after="0" w:before="40" w:line="280"/>
+              <w:ind w:left="260" w:hanging="260"/>
+            </w:pPr>
+            <w:r>
+              <w:rPr>
+                <w:b/>
+                <w:bCs/>
+                <w:color w:val="C00000"/>
+                <w:sz w:val="21"/>
+                <w:szCs w:val="21"/>
+              </w:rPr>
+              <w:t xml:space="preserve">→	</w:t>
+            </w:r>
+            <w:r>
+              <w:rPr>
+                <w:b/>
+                <w:bCs/>
+                <w:sz w:val="21"/>
+                <w:szCs w:val="21"/>
+              </w:rPr>
+              <w:t xml:space="preserve">Trade:</w:t>
+            </w:r>
+            <w:r>
+              <w:rPr>
+                <w:sz w:val="21"/>
+                <w:szCs w:val="21"/>
+              </w:rPr>
+              <w:t xml:space="preserve"> up 7.9% to $127.7 bn (2025–26); China raising imports from India</w:t>
+            </w:r>
+          </w:p>
+          <w:p>
+            <w:pPr>
+              <w:tabs>
+                <w:tab w:val="left" w:pos="260"/>
+              </w:tabs>
+              <w:spacing w:after="0" w:before="40" w:line="280"/>
+              <w:ind w:left="260" w:hanging="260"/>
+            </w:pPr>
+            <w:r>
+              <w:rPr>
+                <w:b/>
+                <w:bCs/>
+                <w:color w:val="C00000"/>
+                <w:sz w:val="21"/>
+                <w:szCs w:val="21"/>
+              </w:rPr>
+              <w:t xml:space="preserve">→	</w:t>
+            </w:r>
+            <w:r>
+              <w:rPr>
+                <w:sz w:val="21"/>
+                <w:szCs w:val="21"/>
+              </w:rPr>
+              <w:t xml:space="preserve">Post-Galwan visa curbs still hit business and academic exchanges</w:t>
+            </w:r>
+          </w:p>
+          <w:p>
+            <w:pPr>
+              <w:tabs>
+                <w:tab w:val="left" w:pos="260"/>
+              </w:tabs>
+              <w:spacing w:after="0" w:before="40" w:line="280"/>
+              <w:ind w:left="260" w:hanging="260"/>
+            </w:pPr>
+            <w:r>
+              <w:rPr>
+                <w:b/>
+                <w:bCs/>
+                <w:color w:val="C00000"/>
+                <w:sz w:val="21"/>
+                <w:szCs w:val="21"/>
+              </w:rPr>
+              <w:t xml:space="preserve">→	</w:t>
+            </w:r>
+            <w:r>
+              <w:rPr>
+                <w:b/>
+                <w:bCs/>
+                <w:sz w:val="21"/>
+                <w:szCs w:val="21"/>
+              </w:rPr>
+              <w:t xml:space="preserve">Arunachal:</w:t>
+            </w:r>
+            <w:r>
+              <w:rPr>
+                <w:sz w:val="21"/>
+                <w:szCs w:val="21"/>
+              </w:rPr>
+              <w:t xml:space="preserve"> India says the state of the border will reflect on the state of ties (Aug 2026)</w:t>
+            </w:r>
+          </w:p>
+          <w:p>
+            <w:pPr>
+              <w:tabs>
+                <w:tab w:val="left" w:pos="260"/>
+              </w:tabs>
+              <w:spacing w:after="0" w:before="40" w:line="280"/>
+              <w:ind w:left="260" w:hanging="260"/>
+            </w:pPr>
+            <w:r>
+              <w:rPr>
+                <w:b/>
+                <w:bCs/>
+                <w:color w:val="C00000"/>
+                <w:sz w:val="21"/>
+                <w:szCs w:val="21"/>
+              </w:rPr>
+              <w:t xml:space="preserve">→	</w:t>
+            </w:r>
+            <w:r>
+              <w:rPr>
+                <w:b/>
+                <w:bCs/>
+                <w:sz w:val="21"/>
+                <w:szCs w:val="21"/>
+              </w:rPr>
+              <w:t xml:space="preserve">India:</w:t>
+            </w:r>
+            <w:r>
+              <w:rPr>
+                <w:sz w:val="21"/>
+                <w:szCs w:val="21"/>
+              </w:rPr>
+              <w:t xml:space="preserve"> border peace is the basis of ties; China: keep the boundary separate</w:t>
+            </w:r>
+          </w:p>
+          <w:p>
+            <w:pPr>
+              <w:tabs>
+                <w:tab w:val="left" w:pos="260"/>
+              </w:tabs>
+              <w:spacing w:after="0" w:before="40" w:line="280"/>
+              <w:ind w:left="260" w:hanging="260"/>
+            </w:pPr>
+            <w:r>
+              <w:rPr>
+                <w:b/>
+                <w:bCs/>
+                <w:color w:val="C00000"/>
+                <w:sz w:val="21"/>
+                <w:szCs w:val="21"/>
+              </w:rPr>
+              <w:t xml:space="preserve">→	</w:t>
+            </w:r>
+            <w:r>
+              <w:rPr>
+                <w:b/>
+                <w:bCs/>
+                <w:sz w:val="21"/>
+                <w:szCs w:val="21"/>
+              </w:rPr>
+              <w:t xml:space="preserve">Overall:</w:t>
+            </w:r>
+            <w:r>
+              <w:rPr>
+                <w:sz w:val="21"/>
+                <w:szCs w:val="21"/>
+              </w:rPr>
+              <w:t xml:space="preserve"> cautious thaw, managed competition, not a full reset</w:t>
+            </w:r>
+          </w:p>
+        </w:tc>
+      </w:tr>
+      <w:tr>
+        <w:trPr>
+          <w:cantSplit/>
+        </w:trPr>
+        <w:tc>
+          <w:tcPr>
+            <w:tcW w:type="dxa" w:w="520"/>
+            <w:tcBorders>
+              <w:top w:val="single" w:color="BFBFBF" w:sz="4"/>
+              <w:left w:val="single" w:color="BFBFBF" w:sz="4"/>
+              <w:bottom w:val="single" w:color="BFBFBF" w:sz="4"/>
+              <w:right w:val="single" w:color="BFBFBF" w:sz="4"/>
+            </w:tcBorders>
+            <w:shd w:fill="F5F7FB" w:color="auto" w:val="clear"/>
+            <w:tcMar>
+              <w:top w:type="dxa" w:w="70"/>
+              <w:left w:type="dxa" w:w="100"/>
+              <w:bottom w:type="dxa" w:w="70"/>
+              <w:right w:type="dxa" w:w="100"/>
+            </w:tcMar>
+            <w:vAlign w:val="center"/>
+          </w:tcPr>
+          <w:p>
+            <w:pPr>
+              <w:spacing w:after="0" w:before="0" w:line="300"/>
+              <w:jc w:val="center"/>
+            </w:pPr>
+            <w:r>
+              <w:rPr>
+                <w:color w:val="7F7F7F"/>
+                <w:sz w:val="21"/>
+                <w:szCs w:val="21"/>
+              </w:rPr>
+              <w:t xml:space="preserve">4</w:t>
+            </w:r>
+          </w:p>
+        </w:tc>
+        <w:tc>
+          <w:tcPr>
+            <w:tcW w:type="dxa" w:w="2200"/>
+            <w:tcBorders>
+              <w:top w:val="single" w:color="BFBFBF" w:sz="4"/>
+              <w:left w:val="single" w:color="BFBFBF" w:sz="4"/>
+              <w:bottom w:val="single" w:color="BFBFBF" w:sz="4"/>
+              <w:right w:val="single" w:color="BFBFBF" w:sz="4"/>
+            </w:tcBorders>
+            <w:shd w:fill="F5F7FB" w:color="auto" w:val="clear"/>
+            <w:tcMar>
+              <w:top w:type="dxa" w:w="70"/>
+              <w:left w:type="dxa" w:w="100"/>
+              <w:bottom w:type="dxa" w:w="70"/>
+              <w:right w:type="dxa" w:w="100"/>
+            </w:tcMar>
+            <w:vAlign w:val="center"/>
+          </w:tcPr>
+          <w:p>
+            <w:pPr>
+              <w:spacing w:after="0" w:before="0" w:line="300"/>
+            </w:pPr>
+            <w:r>
+              <w:rPr>
+                <w:b/>
+                <w:bCs/>
+                <w:color w:val="1F3864"/>
+                <w:sz w:val="21"/>
+                <w:szCs w:val="21"/>
+              </w:rPr>
+              <w:t xml:space="preserve">Problems</w:t>
+            </w:r>
+          </w:p>
+        </w:tc>
+        <w:tc>
+          <w:tcPr>
+            <w:tcW w:type="dxa" w:w="7986"/>
+            <w:tcBorders>
+              <w:top w:val="single" w:color="BFBFBF" w:sz="4"/>
+              <w:left w:val="single" w:color="BFBFBF" w:sz="4"/>
+              <w:bottom w:val="single" w:color="BFBFBF" w:sz="4"/>
+              <w:right w:val="single" w:color="BFBFBF" w:sz="4"/>
+            </w:tcBorders>
+            <w:shd w:fill="F5F7FB" w:color="auto" w:val="clear"/>
+            <w:tcMar>
+              <w:top w:type="dxa" w:w="70"/>
+              <w:left w:type="dxa" w:w="100"/>
+              <w:bottom w:type="dxa" w:w="70"/>
+              <w:right w:type="dxa" w:w="100"/>
+            </w:tcMar>
+            <w:vAlign w:val="center"/>
+          </w:tcPr>
+          <w:p>
+            <w:pPr>
+              <w:tabs>
+                <w:tab w:val="left" w:pos="260"/>
+              </w:tabs>
+              <w:spacing w:after="0" w:before="0" w:line="280"/>
+              <w:ind w:left="260" w:hanging="260"/>
+            </w:pPr>
+            <w:r>
+              <w:rPr>
+                <w:b/>
+                <w:bCs/>
+                <w:color w:val="C00000"/>
+                <w:sz w:val="21"/>
+                <w:szCs w:val="21"/>
+              </w:rPr>
+              <w:t xml:space="preserve">→	</w:t>
+            </w:r>
+            <w:r>
+              <w:rPr>
+                <w:sz w:val="21"/>
+                <w:szCs w:val="21"/>
+              </w:rPr>
+              <w:t xml:space="preserve">Unresolved boundary (Aksai Chin, Arunachal)</w:t>
+            </w:r>
+          </w:p>
+          <w:p>
+            <w:pPr>
+              <w:tabs>
+                <w:tab w:val="left" w:pos="260"/>
+              </w:tabs>
+              <w:spacing w:after="0" w:before="40" w:line="280"/>
+              <w:ind w:left="260" w:hanging="260"/>
+            </w:pPr>
+            <w:r>
+              <w:rPr>
+                <w:b/>
+                <w:bCs/>
+                <w:color w:val="C00000"/>
+                <w:sz w:val="21"/>
+                <w:szCs w:val="21"/>
+              </w:rPr>
+              <w:t xml:space="preserve">→	</w:t>
+            </w:r>
+            <w:r>
+              <w:rPr>
+                <w:sz w:val="21"/>
+                <w:szCs w:val="21"/>
+              </w:rPr>
+              <w:t xml:space="preserve">Trust deficit, salami slicing</w:t>
+            </w:r>
+          </w:p>
+          <w:p>
+            <w:pPr>
+              <w:tabs>
+                <w:tab w:val="left" w:pos="260"/>
+              </w:tabs>
+              <w:spacing w:after="0" w:before="40" w:line="280"/>
+              <w:ind w:left="260" w:hanging="260"/>
+            </w:pPr>
+            <w:r>
+              <w:rPr>
+                <w:b/>
+                <w:bCs/>
+                <w:color w:val="C00000"/>
+                <w:sz w:val="21"/>
+                <w:szCs w:val="21"/>
+              </w:rPr>
+              <w:t xml:space="preserve">→	</w:t>
+            </w:r>
+            <w:r>
+              <w:rPr>
+                <w:sz w:val="21"/>
+                <w:szCs w:val="21"/>
+              </w:rPr>
+              <w:t xml:space="preserve">China–Pakistan military nexus</w:t>
+            </w:r>
+          </w:p>
+          <w:p>
+            <w:pPr>
+              <w:tabs>
+                <w:tab w:val="left" w:pos="260"/>
+              </w:tabs>
+              <w:spacing w:after="0" w:before="40" w:line="280"/>
+              <w:ind w:left="260" w:hanging="260"/>
+            </w:pPr>
+            <w:r>
+              <w:rPr>
+                <w:b/>
+                <w:bCs/>
+                <w:color w:val="C00000"/>
+                <w:sz w:val="21"/>
+                <w:szCs w:val="21"/>
+              </w:rPr>
+              <w:t xml:space="preserve">→	</w:t>
+            </w:r>
+            <w:r>
+              <w:rPr>
+                <w:sz w:val="21"/>
+                <w:szCs w:val="21"/>
+              </w:rPr>
+              <w:t xml:space="preserve">Large trade deficit, import dependence</w:t>
+            </w:r>
+          </w:p>
+          <w:p>
+            <w:pPr>
+              <w:tabs>
+                <w:tab w:val="left" w:pos="260"/>
+              </w:tabs>
+              <w:spacing w:after="0" w:before="40" w:line="280"/>
+              <w:ind w:left="260" w:hanging="260"/>
+            </w:pPr>
+            <w:r>
+              <w:rPr>
+                <w:b/>
+                <w:bCs/>
+                <w:color w:val="C00000"/>
+                <w:sz w:val="21"/>
+                <w:szCs w:val="21"/>
+              </w:rPr>
+              <w:t xml:space="preserve">→	</w:t>
+            </w:r>
+            <w:r>
+              <w:rPr>
+                <w:sz w:val="21"/>
+                <w:szCs w:val="21"/>
+              </w:rPr>
+              <w:t xml:space="preserve">Investment and technology curbs</w:t>
+            </w:r>
+          </w:p>
+          <w:p>
+            <w:pPr>
+              <w:tabs>
+                <w:tab w:val="left" w:pos="260"/>
+              </w:tabs>
+              <w:spacing w:after="0" w:before="40" w:line="280"/>
+              <w:ind w:left="260" w:hanging="260"/>
+            </w:pPr>
+            <w:r>
+              <w:rPr>
+                <w:b/>
+                <w:bCs/>
+                <w:color w:val="C00000"/>
+                <w:sz w:val="21"/>
+                <w:szCs w:val="21"/>
+              </w:rPr>
+              <w:t xml:space="preserve">→	</w:t>
+            </w:r>
+            <w:r>
+              <w:rPr>
+                <w:sz w:val="21"/>
+                <w:szCs w:val="21"/>
+              </w:rPr>
+              <w:t xml:space="preserve">Brahmaputra dam</w:t>
+            </w:r>
+          </w:p>
+          <w:p>
+            <w:pPr>
+              <w:tabs>
+                <w:tab w:val="left" w:pos="260"/>
+              </w:tabs>
+              <w:spacing w:after="0" w:before="40" w:line="280"/>
+              <w:ind w:left="260" w:hanging="260"/>
+            </w:pPr>
+            <w:r>
+              <w:rPr>
+                <w:b/>
+                <w:bCs/>
+                <w:color w:val="C00000"/>
+                <w:sz w:val="21"/>
+                <w:szCs w:val="21"/>
+              </w:rPr>
+              <w:t xml:space="preserve">→	</w:t>
+            </w:r>
+            <w:r>
+              <w:rPr>
+                <w:sz w:val="21"/>
+                <w:szCs w:val="21"/>
+              </w:rPr>
+              <w:t xml:space="preserve">Tibet and Dalai Lama succession</w:t>
+            </w:r>
+          </w:p>
+          <w:p>
+            <w:pPr>
+              <w:tabs>
+                <w:tab w:val="left" w:pos="260"/>
+              </w:tabs>
+              <w:spacing w:after="0" w:before="40" w:line="280"/>
+              <w:ind w:left="260" w:hanging="260"/>
+            </w:pPr>
+            <w:r>
+              <w:rPr>
+                <w:b/>
+                <w:bCs/>
+                <w:color w:val="C00000"/>
+                <w:sz w:val="21"/>
+                <w:szCs w:val="21"/>
+              </w:rPr>
+              <w:t xml:space="preserve">→	</w:t>
+            </w:r>
+            <w:r>
+              <w:rPr>
+                <w:sz w:val="21"/>
+                <w:szCs w:val="21"/>
+              </w:rPr>
+              <w:t xml:space="preserve">Chinese presence in the Indian Ocean</w:t>
+            </w:r>
+          </w:p>
+        </w:tc>
+      </w:tr>
+      <w:tr>
+        <w:trPr>
+          <w:cantSplit/>
+        </w:trPr>
+        <w:tc>
+          <w:tcPr>
+            <w:tcW w:type="dxa" w:w="520"/>
+            <w:tcBorders>
+              <w:top w:val="single" w:color="BFBFBF" w:sz="4"/>
+              <w:left w:val="single" w:color="BFBFBF" w:sz="4"/>
+              <w:bottom w:val="single" w:color="BFBFBF" w:sz="4"/>
+              <w:right w:val="single" w:color="BFBFBF" w:sz="4"/>
+            </w:tcBorders>
+            <w:tcMar>
+              <w:top w:type="dxa" w:w="70"/>
+              <w:left w:type="dxa" w:w="100"/>
+              <w:bottom w:type="dxa" w:w="70"/>
+              <w:right w:type="dxa" w:w="100"/>
+            </w:tcMar>
+            <w:vAlign w:val="center"/>
+          </w:tcPr>
+          <w:p>
+            <w:pPr>
+              <w:spacing w:after="0" w:before="0" w:line="300"/>
+              <w:jc w:val="center"/>
+            </w:pPr>
+            <w:r>
+              <w:rPr>
+                <w:color w:val="7F7F7F"/>
+                <w:sz w:val="21"/>
+                <w:szCs w:val="21"/>
+              </w:rPr>
+              <w:t xml:space="preserve">5</w:t>
+            </w:r>
+          </w:p>
+        </w:tc>
+        <w:tc>
+          <w:tcPr>
+            <w:tcW w:type="dxa" w:w="2200"/>
+            <w:tcBorders>
+              <w:top w:val="single" w:color="BFBFBF" w:sz="4"/>
+              <w:left w:val="single" w:color="BFBFBF" w:sz="4"/>
+              <w:bottom w:val="single" w:color="BFBFBF" w:sz="4"/>
+              <w:right w:val="single" w:color="BFBFBF" w:sz="4"/>
+            </w:tcBorders>
+            <w:tcMar>
+              <w:top w:type="dxa" w:w="70"/>
+              <w:left w:type="dxa" w:w="100"/>
+              <w:bottom w:type="dxa" w:w="70"/>
+              <w:right w:type="dxa" w:w="100"/>
+            </w:tcMar>
+            <w:vAlign w:val="center"/>
+          </w:tcPr>
+          <w:p>
+            <w:pPr>
+              <w:spacing w:after="0" w:before="0" w:line="300"/>
+            </w:pPr>
+            <w:r>
+              <w:rPr>
+                <w:b/>
+                <w:bCs/>
+                <w:color w:val="1F3864"/>
+                <w:sz w:val="21"/>
+                <w:szCs w:val="21"/>
+              </w:rPr>
+              <w:t xml:space="preserve">Solutions</w:t>
+            </w:r>
+          </w:p>
+        </w:tc>
+        <w:tc>
+          <w:tcPr>
+            <w:tcW w:type="dxa" w:w="7986"/>
+            <w:tcBorders>
+              <w:top w:val="single" w:color="BFBFBF" w:sz="4"/>
+              <w:left w:val="single" w:color="BFBFBF" w:sz="4"/>
+              <w:bottom w:val="single" w:color="BFBFBF" w:sz="4"/>
+              <w:right w:val="single" w:color="BFBFBF" w:sz="4"/>
+            </w:tcBorders>
+            <w:tcMar>
+              <w:top w:type="dxa" w:w="70"/>
+              <w:left w:type="dxa" w:w="100"/>
+              <w:bottom w:type="dxa" w:w="70"/>
+              <w:right w:type="dxa" w:w="100"/>
+            </w:tcMar>
+            <w:vAlign w:val="center"/>
+          </w:tcPr>
+          <w:p>
+            <w:pPr>
+              <w:tabs>
+                <w:tab w:val="left" w:pos="260"/>
+              </w:tabs>
+              <w:spacing w:after="0" w:before="0" w:line="280"/>
+              <w:ind w:left="260" w:hanging="260"/>
+            </w:pPr>
+            <w:r>
+              <w:rPr>
+                <w:b/>
+                <w:bCs/>
+                <w:color w:val="C00000"/>
+                <w:sz w:val="21"/>
+                <w:szCs w:val="21"/>
+              </w:rPr>
+              <w:t xml:space="preserve">→	</w:t>
+            </w:r>
+            <w:r>
+              <w:rPr>
+                <w:b/>
+                <w:bCs/>
+                <w:sz w:val="21"/>
+                <w:szCs w:val="21"/>
+              </w:rPr>
+              <w:t xml:space="preserve">Border first:</w:t>
+            </w:r>
+            <w:r>
+              <w:rPr>
+                <w:sz w:val="21"/>
+                <w:szCs w:val="21"/>
+              </w:rPr>
+              <w:t xml:space="preserve"> disengagement, de-escalation</w:t>
+            </w:r>
+          </w:p>
+          <w:p>
+            <w:pPr>
+              <w:tabs>
+                <w:tab w:val="left" w:pos="260"/>
+              </w:tabs>
+              <w:spacing w:after="0" w:before="40" w:line="280"/>
+              <w:ind w:left="260" w:hanging="260"/>
+            </w:pPr>
+            <w:r>
+              <w:rPr>
+                <w:b/>
+                <w:bCs/>
+                <w:color w:val="C00000"/>
+                <w:sz w:val="21"/>
+                <w:szCs w:val="21"/>
+              </w:rPr>
+              <w:t xml:space="preserve">→	</w:t>
+            </w:r>
+            <w:r>
+              <w:rPr>
+                <w:b/>
+                <w:bCs/>
+                <w:sz w:val="21"/>
+                <w:szCs w:val="21"/>
+              </w:rPr>
+              <w:t xml:space="preserve">Strong deterrence:</w:t>
+            </w:r>
+            <w:r>
+              <w:rPr>
+                <w:sz w:val="21"/>
+                <w:szCs w:val="21"/>
+              </w:rPr>
+              <w:t xml:space="preserve"> border infrastructure, military modernisation</w:t>
+            </w:r>
+          </w:p>
+          <w:p>
+            <w:pPr>
+              <w:tabs>
+                <w:tab w:val="left" w:pos="260"/>
+              </w:tabs>
+              <w:spacing w:after="0" w:before="40" w:line="280"/>
+              <w:ind w:left="260" w:hanging="260"/>
+            </w:pPr>
+            <w:r>
+              <w:rPr>
+                <w:b/>
+                <w:bCs/>
+                <w:color w:val="C00000"/>
+                <w:sz w:val="21"/>
+                <w:szCs w:val="21"/>
+              </w:rPr>
+              <w:t xml:space="preserve">→	</w:t>
+            </w:r>
+            <w:r>
+              <w:rPr>
+                <w:b/>
+                <w:bCs/>
+                <w:sz w:val="21"/>
+                <w:szCs w:val="21"/>
+              </w:rPr>
+              <w:t xml:space="preserve">Regular dialogue:</w:t>
+            </w:r>
+            <w:r>
+              <w:rPr>
+                <w:sz w:val="21"/>
+                <w:szCs w:val="21"/>
+              </w:rPr>
+              <w:t xml:space="preserve"> SR talks, Corps Commander talks</w:t>
+            </w:r>
+          </w:p>
+          <w:p>
+            <w:pPr>
+              <w:tabs>
+                <w:tab w:val="left" w:pos="260"/>
+              </w:tabs>
+              <w:spacing w:after="0" w:before="40" w:line="280"/>
+              <w:ind w:left="260" w:hanging="260"/>
+            </w:pPr>
+            <w:r>
+              <w:rPr>
+                <w:b/>
+                <w:bCs/>
+                <w:color w:val="C00000"/>
+                <w:sz w:val="21"/>
+                <w:szCs w:val="21"/>
+              </w:rPr>
+              <w:t xml:space="preserve">→	</w:t>
+            </w:r>
+            <w:r>
+              <w:rPr>
+                <w:sz w:val="21"/>
+                <w:szCs w:val="21"/>
+              </w:rPr>
+              <w:t xml:space="preserve">Atmanirbhar Bharat, PLI, diversified supply chains</w:t>
+            </w:r>
+          </w:p>
+          <w:p>
+            <w:pPr>
+              <w:tabs>
+                <w:tab w:val="left" w:pos="260"/>
+              </w:tabs>
+              <w:spacing w:after="0" w:before="40" w:line="280"/>
+              <w:ind w:left="260" w:hanging="260"/>
+            </w:pPr>
+            <w:r>
+              <w:rPr>
+                <w:b/>
+                <w:bCs/>
+                <w:color w:val="C00000"/>
+                <w:sz w:val="21"/>
+                <w:szCs w:val="21"/>
+              </w:rPr>
+              <w:t xml:space="preserve">→	</w:t>
+            </w:r>
+            <w:r>
+              <w:rPr>
+                <w:sz w:val="21"/>
+                <w:szCs w:val="21"/>
+              </w:rPr>
+              <w:t xml:space="preserve">Calibrated economic engagement with security screening</w:t>
+            </w:r>
+          </w:p>
+          <w:p>
+            <w:pPr>
+              <w:tabs>
+                <w:tab w:val="left" w:pos="260"/>
+              </w:tabs>
+              <w:spacing w:after="0" w:before="40" w:line="280"/>
+              <w:ind w:left="260" w:hanging="260"/>
+            </w:pPr>
+            <w:r>
+              <w:rPr>
+                <w:b/>
+                <w:bCs/>
+                <w:color w:val="C00000"/>
+                <w:sz w:val="21"/>
+                <w:szCs w:val="21"/>
+              </w:rPr>
+              <w:t xml:space="preserve">→	</w:t>
+            </w:r>
+            <w:r>
+              <w:rPr>
+                <w:sz w:val="21"/>
+                <w:szCs w:val="21"/>
+              </w:rPr>
+              <w:t xml:space="preserve">Quad, Act East, Indo-Pacific partnerships</w:t>
+            </w:r>
+          </w:p>
+          <w:p>
+            <w:pPr>
+              <w:tabs>
+                <w:tab w:val="left" w:pos="260"/>
+              </w:tabs>
+              <w:spacing w:after="0" w:before="40" w:line="280"/>
+              <w:ind w:left="260" w:hanging="260"/>
+            </w:pPr>
+            <w:r>
+              <w:rPr>
+                <w:b/>
+                <w:bCs/>
+                <w:color w:val="C00000"/>
+                <w:sz w:val="21"/>
+                <w:szCs w:val="21"/>
+              </w:rPr>
+              <w:t xml:space="preserve">→	</w:t>
+            </w:r>
+            <w:r>
+              <w:rPr>
+                <w:sz w:val="21"/>
+                <w:szCs w:val="21"/>
+              </w:rPr>
+              <w:t xml:space="preserve">Brahmaputra data-sharing</w:t>
+            </w:r>
+          </w:p>
+          <w:p>
+            <w:pPr>
+              <w:tabs>
+                <w:tab w:val="left" w:pos="260"/>
+              </w:tabs>
+              <w:spacing w:after="0" w:before="40" w:line="280"/>
+              <w:ind w:left="260" w:hanging="260"/>
+            </w:pPr>
+            <w:r>
+              <w:rPr>
+                <w:b/>
+                <w:bCs/>
+                <w:color w:val="C00000"/>
+                <w:sz w:val="21"/>
+                <w:szCs w:val="21"/>
+              </w:rPr>
+              <w:t xml:space="preserve">→	</w:t>
+            </w:r>
+            <w:r>
+              <w:rPr>
+                <w:sz w:val="21"/>
+                <w:szCs w:val="21"/>
+              </w:rPr>
+              <w:t xml:space="preserve">Strategic autonomy</w:t>
+            </w:r>
+          </w:p>
+        </w:tc>
+      </w:tr>
+      <w:tr>
+        <w:trPr>
+          <w:cantSplit/>
+        </w:trPr>
+        <w:tc>
+          <w:tcPr>
+            <w:tcW w:type="dxa" w:w="520"/>
+            <w:tcBorders>
+              <w:top w:val="single" w:color="BFBFBF" w:sz="4"/>
+              <w:left w:val="single" w:color="BFBFBF" w:sz="4"/>
+              <w:bottom w:val="single" w:color="BFBFBF" w:sz="4"/>
+              <w:right w:val="single" w:color="BFBFBF" w:sz="4"/>
+            </w:tcBorders>
+            <w:shd w:fill="F5F7FB" w:color="auto" w:val="clear"/>
+            <w:tcMar>
+              <w:top w:type="dxa" w:w="70"/>
+              <w:left w:type="dxa" w:w="100"/>
+              <w:bottom w:type="dxa" w:w="70"/>
+              <w:right w:type="dxa" w:w="100"/>
+            </w:tcMar>
+            <w:vAlign w:val="center"/>
+          </w:tcPr>
+          <w:p>
+            <w:pPr>
+              <w:spacing w:after="0" w:before="0" w:line="300"/>
+              <w:jc w:val="center"/>
+            </w:pPr>
+            <w:r>
+              <w:rPr>
+                <w:color w:val="7F7F7F"/>
+                <w:sz w:val="21"/>
+                <w:szCs w:val="21"/>
+              </w:rPr>
+              <w:t xml:space="preserve">6</w:t>
+            </w:r>
+          </w:p>
+        </w:tc>
+        <w:tc>
+          <w:tcPr>
+            <w:tcW w:type="dxa" w:w="2200"/>
+            <w:tcBorders>
+              <w:top w:val="single" w:color="BFBFBF" w:sz="4"/>
+              <w:left w:val="single" w:color="BFBFBF" w:sz="4"/>
+              <w:bottom w:val="single" w:color="BFBFBF" w:sz="4"/>
+              <w:right w:val="single" w:color="BFBFBF" w:sz="4"/>
+            </w:tcBorders>
+            <w:shd w:fill="F5F7FB" w:color="auto" w:val="clear"/>
+            <w:tcMar>
+              <w:top w:type="dxa" w:w="70"/>
+              <w:left w:type="dxa" w:w="100"/>
+              <w:bottom w:type="dxa" w:w="70"/>
+              <w:right w:type="dxa" w:w="100"/>
+            </w:tcMar>
+            <w:vAlign w:val="center"/>
+          </w:tcPr>
+          <w:p>
+            <w:pPr>
+              <w:spacing w:after="0" w:before="0" w:line="300"/>
+            </w:pPr>
+            <w:r>
+              <w:rPr>
+                <w:b/>
+                <w:bCs/>
+                <w:color w:val="1F3864"/>
+                <w:sz w:val="21"/>
+                <w:szCs w:val="21"/>
+              </w:rPr>
+              <w:t xml:space="preserve">Conclusion</w:t>
+            </w:r>
+          </w:p>
+        </w:tc>
+        <w:tc>
+          <w:tcPr>
+            <w:tcW w:type="dxa" w:w="7986"/>
+            <w:tcBorders>
+              <w:top w:val="single" w:color="BFBFBF" w:sz="4"/>
+              <w:left w:val="single" w:color="BFBFBF" w:sz="4"/>
+              <w:bottom w:val="single" w:color="BFBFBF" w:sz="4"/>
+              <w:right w:val="single" w:color="BFBFBF" w:sz="4"/>
+            </w:tcBorders>
+            <w:shd w:fill="F5F7FB" w:color="auto" w:val="clear"/>
+            <w:tcMar>
+              <w:top w:type="dxa" w:w="70"/>
+              <w:left w:type="dxa" w:w="100"/>
+              <w:bottom w:type="dxa" w:w="70"/>
+              <w:right w:type="dxa" w:w="100"/>
+            </w:tcMar>
+            <w:vAlign w:val="center"/>
+          </w:tcPr>
+          <w:p>
+            <w:pPr>
+              <w:tabs>
+                <w:tab w:val="left" w:pos="260"/>
+              </w:tabs>
+              <w:spacing w:after="0" w:before="0" w:line="280"/>
+              <w:ind w:left="260" w:hanging="260"/>
+            </w:pPr>
+            <w:r>
+              <w:rPr>
+                <w:b/>
+                <w:bCs/>
+                <w:color w:val="C00000"/>
+                <w:sz w:val="21"/>
+                <w:szCs w:val="21"/>
+              </w:rPr>
+              <w:t xml:space="preserve">→	</w:t>
+            </w:r>
+            <w:r>
+              <w:rPr>
+                <w:sz w:val="21"/>
+                <w:szCs w:val="21"/>
+              </w:rPr>
+              <w:t xml:space="preserve">India seeks a stable, mutually respectful relationship</w:t>
+            </w:r>
+          </w:p>
+          <w:p>
+            <w:pPr>
+              <w:tabs>
+                <w:tab w:val="left" w:pos="260"/>
+              </w:tabs>
+              <w:spacing w:after="0" w:before="40" w:line="280"/>
+              <w:ind w:left="260" w:hanging="260"/>
+            </w:pPr>
+            <w:r>
+              <w:rPr>
+                <w:b/>
+                <w:bCs/>
+                <w:color w:val="C00000"/>
+                <w:sz w:val="21"/>
+                <w:szCs w:val="21"/>
+              </w:rPr>
+              <w:t xml:space="preserve">→	</w:t>
+            </w:r>
+            <w:r>
+              <w:rPr>
+                <w:sz w:val="21"/>
+                <w:szCs w:val="21"/>
+              </w:rPr>
+              <w:t xml:space="preserve">Border peace is the foundation of everything else</w:t>
+            </w:r>
+          </w:p>
+          <w:p>
+            <w:pPr>
+              <w:tabs>
+                <w:tab w:val="left" w:pos="260"/>
+              </w:tabs>
+              <w:spacing w:after="0" w:before="40" w:line="280"/>
+              <w:ind w:left="260" w:hanging="260"/>
+            </w:pPr>
+            <w:r>
+              <w:rPr>
+                <w:b/>
+                <w:bCs/>
+                <w:color w:val="C00000"/>
+                <w:sz w:val="21"/>
+                <w:szCs w:val="21"/>
+              </w:rPr>
+              <w:t xml:space="preserve">→	</w:t>
+            </w:r>
+            <w:r>
+              <w:rPr>
+                <w:b/>
+                <w:bCs/>
+                <w:sz w:val="21"/>
+                <w:szCs w:val="21"/>
+              </w:rPr>
+              <w:t xml:space="preserve">Negotiate from strength:</w:t>
+            </w:r>
+            <w:r>
+              <w:rPr>
+                <w:sz w:val="21"/>
+                <w:szCs w:val="21"/>
+              </w:rPr>
+              <w:t xml:space="preserve"> military, economy and partnerships</w:t>
             </w:r>
           </w:p>
         </w:tc>

</xml_diff>

<commit_message>
Use a proper tab after each lecturette point arrow
Co-Authored-By: Claude Opus 5.5 <noreply@anthropic.com>
Claude-Session: https://claude.ai/code/session_01EyrV2JLtXrELkAF97b5fch
</commit_message>
<xml_diff>
--- a/SSB_Lecturettes.docx
+++ b/SSB_Lecturettes.docx
@@ -255,7 +255,10 @@
                 <w:sz w:val="21"/>
                 <w:szCs w:val="21"/>
               </w:rPr>
-              <w:t xml:space="preserve">→	</w:t>
+              <w:t xml:space="preserve">→</w:t>
+            </w:r>
+            <w:r>
+              <w:tab/>
             </w:r>
             <w:r>
               <w:rPr>
@@ -281,7 +284,10 @@
                 <w:sz w:val="21"/>
                 <w:szCs w:val="21"/>
               </w:rPr>
-              <w:t xml:space="preserve">→	</w:t>
+              <w:t xml:space="preserve">→</w:t>
+            </w:r>
+            <w:r>
+              <w:tab/>
             </w:r>
             <w:r>
               <w:rPr>
@@ -398,7 +404,10 @@
                 <w:sz w:val="21"/>
                 <w:szCs w:val="21"/>
               </w:rPr>
-              <w:t xml:space="preserve">→	</w:t>
+              <w:t xml:space="preserve">→</w:t>
+            </w:r>
+            <w:r>
+              <w:tab/>
             </w:r>
             <w:r>
               <w:rPr>
@@ -433,7 +442,10 @@
                 <w:sz w:val="21"/>
                 <w:szCs w:val="21"/>
               </w:rPr>
-              <w:t xml:space="preserve">→	</w:t>
+              <w:t xml:space="preserve">→</w:t>
+            </w:r>
+            <w:r>
+              <w:tab/>
             </w:r>
             <w:r>
               <w:rPr>
@@ -468,7 +480,10 @@
                 <w:sz w:val="21"/>
                 <w:szCs w:val="21"/>
               </w:rPr>
-              <w:t xml:space="preserve">→	</w:t>
+              <w:t xml:space="preserve">→</w:t>
+            </w:r>
+            <w:r>
+              <w:tab/>
             </w:r>
             <w:r>
               <w:rPr>
@@ -503,7 +518,10 @@
                 <w:sz w:val="21"/>
                 <w:szCs w:val="21"/>
               </w:rPr>
-              <w:t xml:space="preserve">→	</w:t>
+              <w:t xml:space="preserve">→</w:t>
+            </w:r>
+            <w:r>
+              <w:tab/>
             </w:r>
             <w:r>
               <w:rPr>
@@ -538,7 +556,10 @@
                 <w:sz w:val="21"/>
                 <w:szCs w:val="21"/>
               </w:rPr>
-              <w:t xml:space="preserve">→	</w:t>
+              <w:t xml:space="preserve">→</w:t>
+            </w:r>
+            <w:r>
+              <w:tab/>
             </w:r>
             <w:r>
               <w:rPr>
@@ -661,7 +682,10 @@
                 <w:sz w:val="21"/>
                 <w:szCs w:val="21"/>
               </w:rPr>
-              <w:t xml:space="preserve">→	</w:t>
+              <w:t xml:space="preserve">→</w:t>
+            </w:r>
+            <w:r>
+              <w:tab/>
             </w:r>
             <w:r>
               <w:rPr>
@@ -687,7 +711,10 @@
                 <w:sz w:val="21"/>
                 <w:szCs w:val="21"/>
               </w:rPr>
-              <w:t xml:space="preserve">→	</w:t>
+              <w:t xml:space="preserve">→</w:t>
+            </w:r>
+            <w:r>
+              <w:tab/>
             </w:r>
             <w:r>
               <w:rPr>
@@ -722,7 +749,10 @@
                 <w:sz w:val="21"/>
                 <w:szCs w:val="21"/>
               </w:rPr>
-              <w:t xml:space="preserve">→	</w:t>
+              <w:t xml:space="preserve">→</w:t>
+            </w:r>
+            <w:r>
+              <w:tab/>
             </w:r>
             <w:r>
               <w:rPr>
@@ -748,7 +778,10 @@
                 <w:sz w:val="21"/>
                 <w:szCs w:val="21"/>
               </w:rPr>
-              <w:t xml:space="preserve">→	</w:t>
+              <w:t xml:space="preserve">→</w:t>
+            </w:r>
+            <w:r>
+              <w:tab/>
             </w:r>
             <w:r>
               <w:rPr>
@@ -783,7 +816,10 @@
                 <w:sz w:val="21"/>
                 <w:szCs w:val="21"/>
               </w:rPr>
-              <w:t xml:space="preserve">→	</w:t>
+              <w:t xml:space="preserve">→</w:t>
+            </w:r>
+            <w:r>
+              <w:tab/>
             </w:r>
             <w:r>
               <w:rPr>
@@ -809,7 +845,10 @@
                 <w:sz w:val="21"/>
                 <w:szCs w:val="21"/>
               </w:rPr>
-              <w:t xml:space="preserve">→	</w:t>
+              <w:t xml:space="preserve">→</w:t>
+            </w:r>
+            <w:r>
+              <w:tab/>
             </w:r>
             <w:r>
               <w:rPr>
@@ -935,7 +974,10 @@
                 <w:sz w:val="21"/>
                 <w:szCs w:val="21"/>
               </w:rPr>
-              <w:t xml:space="preserve">→	</w:t>
+              <w:t xml:space="preserve">→</w:t>
+            </w:r>
+            <w:r>
+              <w:tab/>
             </w:r>
             <w:r>
               <w:rPr>
@@ -961,7 +1003,10 @@
                 <w:sz w:val="21"/>
                 <w:szCs w:val="21"/>
               </w:rPr>
-              <w:t xml:space="preserve">→	</w:t>
+              <w:t xml:space="preserve">→</w:t>
+            </w:r>
+            <w:r>
+              <w:tab/>
             </w:r>
             <w:r>
               <w:rPr>
@@ -987,7 +1032,10 @@
                 <w:sz w:val="21"/>
                 <w:szCs w:val="21"/>
               </w:rPr>
-              <w:t xml:space="preserve">→	</w:t>
+              <w:t xml:space="preserve">→</w:t>
+            </w:r>
+            <w:r>
+              <w:tab/>
             </w:r>
             <w:r>
               <w:rPr>
@@ -1013,7 +1061,10 @@
                 <w:sz w:val="21"/>
                 <w:szCs w:val="21"/>
               </w:rPr>
-              <w:t xml:space="preserve">→	</w:t>
+              <w:t xml:space="preserve">→</w:t>
+            </w:r>
+            <w:r>
+              <w:tab/>
             </w:r>
             <w:r>
               <w:rPr>
@@ -1039,7 +1090,10 @@
                 <w:sz w:val="21"/>
                 <w:szCs w:val="21"/>
               </w:rPr>
-              <w:t xml:space="preserve">→	</w:t>
+              <w:t xml:space="preserve">→</w:t>
+            </w:r>
+            <w:r>
+              <w:tab/>
             </w:r>
             <w:r>
               <w:rPr>
@@ -1065,7 +1119,10 @@
                 <w:sz w:val="21"/>
                 <w:szCs w:val="21"/>
               </w:rPr>
-              <w:t xml:space="preserve">→	</w:t>
+              <w:t xml:space="preserve">→</w:t>
+            </w:r>
+            <w:r>
+              <w:tab/>
             </w:r>
             <w:r>
               <w:rPr>
@@ -1091,7 +1148,10 @@
                 <w:sz w:val="21"/>
                 <w:szCs w:val="21"/>
               </w:rPr>
-              <w:t xml:space="preserve">→	</w:t>
+              <w:t xml:space="preserve">→</w:t>
+            </w:r>
+            <w:r>
+              <w:tab/>
             </w:r>
             <w:r>
               <w:rPr>
@@ -1205,7 +1265,10 @@
                 <w:sz w:val="21"/>
                 <w:szCs w:val="21"/>
               </w:rPr>
-              <w:t xml:space="preserve">→	</w:t>
+              <w:t xml:space="preserve">→</w:t>
+            </w:r>
+            <w:r>
+              <w:tab/>
             </w:r>
             <w:r>
               <w:rPr>
@@ -1231,7 +1294,10 @@
                 <w:sz w:val="21"/>
                 <w:szCs w:val="21"/>
               </w:rPr>
-              <w:t xml:space="preserve">→	</w:t>
+              <w:t xml:space="preserve">→</w:t>
+            </w:r>
+            <w:r>
+              <w:tab/>
             </w:r>
             <w:r>
               <w:rPr>
@@ -1257,7 +1323,10 @@
                 <w:sz w:val="21"/>
                 <w:szCs w:val="21"/>
               </w:rPr>
-              <w:t xml:space="preserve">→	</w:t>
+              <w:t xml:space="preserve">→</w:t>
+            </w:r>
+            <w:r>
+              <w:tab/>
             </w:r>
             <w:r>
               <w:rPr>
@@ -1283,7 +1352,10 @@
                 <w:sz w:val="21"/>
                 <w:szCs w:val="21"/>
               </w:rPr>
-              <w:t xml:space="preserve">→	</w:t>
+              <w:t xml:space="preserve">→</w:t>
+            </w:r>
+            <w:r>
+              <w:tab/>
             </w:r>
             <w:r>
               <w:rPr>
@@ -1309,7 +1381,10 @@
                 <w:sz w:val="21"/>
                 <w:szCs w:val="21"/>
               </w:rPr>
-              <w:t xml:space="preserve">→	</w:t>
+              <w:t xml:space="preserve">→</w:t>
+            </w:r>
+            <w:r>
+              <w:tab/>
             </w:r>
             <w:r>
               <w:rPr>
@@ -1335,7 +1410,10 @@
                 <w:sz w:val="21"/>
                 <w:szCs w:val="21"/>
               </w:rPr>
-              <w:t xml:space="preserve">→	</w:t>
+              <w:t xml:space="preserve">→</w:t>
+            </w:r>
+            <w:r>
+              <w:tab/>
             </w:r>
             <w:r>
               <w:rPr>
@@ -1370,7 +1448,10 @@
                 <w:sz w:val="21"/>
                 <w:szCs w:val="21"/>
               </w:rPr>
-              <w:t xml:space="preserve">→	</w:t>
+              <w:t xml:space="preserve">→</w:t>
+            </w:r>
+            <w:r>
+              <w:tab/>
             </w:r>
             <w:r>
               <w:rPr>
@@ -1396,7 +1477,10 @@
                 <w:sz w:val="21"/>
                 <w:szCs w:val="21"/>
               </w:rPr>
-              <w:t xml:space="preserve">→	</w:t>
+              <w:t xml:space="preserve">→</w:t>
+            </w:r>
+            <w:r>
+              <w:tab/>
             </w:r>
             <w:r>
               <w:rPr>
@@ -1513,7 +1597,10 @@
                 <w:sz w:val="21"/>
                 <w:szCs w:val="21"/>
               </w:rPr>
-              <w:t xml:space="preserve">→	</w:t>
+              <w:t xml:space="preserve">→</w:t>
+            </w:r>
+            <w:r>
+              <w:tab/>
             </w:r>
             <w:r>
               <w:rPr>
@@ -1539,7 +1626,10 @@
                 <w:sz w:val="21"/>
                 <w:szCs w:val="21"/>
               </w:rPr>
-              <w:t xml:space="preserve">→	</w:t>
+              <w:t xml:space="preserve">→</w:t>
+            </w:r>
+            <w:r>
+              <w:tab/>
             </w:r>
             <w:r>
               <w:rPr>
@@ -1565,7 +1655,10 @@
                 <w:sz w:val="21"/>
                 <w:szCs w:val="21"/>
               </w:rPr>
-              <w:t xml:space="preserve">→	</w:t>
+              <w:t xml:space="preserve">→</w:t>
+            </w:r>
+            <w:r>
+              <w:tab/>
             </w:r>
             <w:r>
               <w:rPr>
@@ -1814,7 +1907,10 @@
                 <w:sz w:val="21"/>
                 <w:szCs w:val="21"/>
               </w:rPr>
-              <w:t xml:space="preserve">→	</w:t>
+              <w:t xml:space="preserve">→</w:t>
+            </w:r>
+            <w:r>
+              <w:tab/>
             </w:r>
             <w:r>
               <w:rPr>
@@ -1840,7 +1936,10 @@
                 <w:sz w:val="21"/>
                 <w:szCs w:val="21"/>
               </w:rPr>
-              <w:t xml:space="preserve">→	</w:t>
+              <w:t xml:space="preserve">→</w:t>
+            </w:r>
+            <w:r>
+              <w:tab/>
             </w:r>
             <w:r>
               <w:rPr>
@@ -1866,7 +1965,10 @@
                 <w:sz w:val="21"/>
                 <w:szCs w:val="21"/>
               </w:rPr>
-              <w:t xml:space="preserve">→	</w:t>
+              <w:t xml:space="preserve">→</w:t>
+            </w:r>
+            <w:r>
+              <w:tab/>
             </w:r>
             <w:r>
               <w:rPr>
@@ -1892,7 +1994,10 @@
                 <w:sz w:val="21"/>
                 <w:szCs w:val="21"/>
               </w:rPr>
-              <w:t xml:space="preserve">→	</w:t>
+              <w:t xml:space="preserve">→</w:t>
+            </w:r>
+            <w:r>
+              <w:tab/>
             </w:r>
             <w:r>
               <w:rPr>
@@ -2009,7 +2114,10 @@
                 <w:sz w:val="21"/>
                 <w:szCs w:val="21"/>
               </w:rPr>
-              <w:t xml:space="preserve">→	</w:t>
+              <w:t xml:space="preserve">→</w:t>
+            </w:r>
+            <w:r>
+              <w:tab/>
             </w:r>
             <w:r>
               <w:rPr>
@@ -2044,7 +2152,10 @@
                 <w:sz w:val="21"/>
                 <w:szCs w:val="21"/>
               </w:rPr>
-              <w:t xml:space="preserve">→	</w:t>
+              <w:t xml:space="preserve">→</w:t>
+            </w:r>
+            <w:r>
+              <w:tab/>
             </w:r>
             <w:r>
               <w:rPr>
@@ -2079,7 +2190,10 @@
                 <w:sz w:val="21"/>
                 <w:szCs w:val="21"/>
               </w:rPr>
-              <w:t xml:space="preserve">→	</w:t>
+              <w:t xml:space="preserve">→</w:t>
+            </w:r>
+            <w:r>
+              <w:tab/>
             </w:r>
             <w:r>
               <w:rPr>
@@ -2114,7 +2228,10 @@
                 <w:sz w:val="21"/>
                 <w:szCs w:val="21"/>
               </w:rPr>
-              <w:t xml:space="preserve">→	</w:t>
+              <w:t xml:space="preserve">→</w:t>
+            </w:r>
+            <w:r>
+              <w:tab/>
             </w:r>
             <w:r>
               <w:rPr>
@@ -2237,7 +2354,10 @@
                 <w:sz w:val="21"/>
                 <w:szCs w:val="21"/>
               </w:rPr>
-              <w:t xml:space="preserve">→	</w:t>
+              <w:t xml:space="preserve">→</w:t>
+            </w:r>
+            <w:r>
+              <w:tab/>
             </w:r>
             <w:r>
               <w:rPr>
@@ -2263,7 +2383,10 @@
                 <w:sz w:val="21"/>
                 <w:szCs w:val="21"/>
               </w:rPr>
-              <w:t xml:space="preserve">→	</w:t>
+              <w:t xml:space="preserve">→</w:t>
+            </w:r>
+            <w:r>
+              <w:tab/>
             </w:r>
             <w:r>
               <w:rPr>
@@ -2298,7 +2421,10 @@
                 <w:sz w:val="21"/>
                 <w:szCs w:val="21"/>
               </w:rPr>
-              <w:t xml:space="preserve">→	</w:t>
+              <w:t xml:space="preserve">→</w:t>
+            </w:r>
+            <w:r>
+              <w:tab/>
             </w:r>
             <w:r>
               <w:rPr>
@@ -2324,7 +2450,10 @@
                 <w:sz w:val="21"/>
                 <w:szCs w:val="21"/>
               </w:rPr>
-              <w:t xml:space="preserve">→	</w:t>
+              <w:t xml:space="preserve">→</w:t>
+            </w:r>
+            <w:r>
+              <w:tab/>
             </w:r>
             <w:r>
               <w:rPr>
@@ -2359,7 +2488,10 @@
                 <w:sz w:val="21"/>
                 <w:szCs w:val="21"/>
               </w:rPr>
-              <w:t xml:space="preserve">→	</w:t>
+              <w:t xml:space="preserve">→</w:t>
+            </w:r>
+            <w:r>
+              <w:tab/>
             </w:r>
             <w:r>
               <w:rPr>
@@ -2385,7 +2517,10 @@
                 <w:sz w:val="21"/>
                 <w:szCs w:val="21"/>
               </w:rPr>
-              <w:t xml:space="preserve">→	</w:t>
+              <w:t xml:space="preserve">→</w:t>
+            </w:r>
+            <w:r>
+              <w:tab/>
             </w:r>
             <w:r>
               <w:rPr>
@@ -2420,7 +2555,10 @@
                 <w:sz w:val="21"/>
                 <w:szCs w:val="21"/>
               </w:rPr>
-              <w:t xml:space="preserve">→	</w:t>
+              <w:t xml:space="preserve">→</w:t>
+            </w:r>
+            <w:r>
+              <w:tab/>
             </w:r>
             <w:r>
               <w:rPr>
@@ -2455,7 +2593,10 @@
                 <w:sz w:val="21"/>
                 <w:szCs w:val="21"/>
               </w:rPr>
-              <w:t xml:space="preserve">→	</w:t>
+              <w:t xml:space="preserve">→</w:t>
+            </w:r>
+            <w:r>
+              <w:tab/>
             </w:r>
             <w:r>
               <w:rPr>
@@ -2581,7 +2722,10 @@
                 <w:sz w:val="21"/>
                 <w:szCs w:val="21"/>
               </w:rPr>
-              <w:t xml:space="preserve">→	</w:t>
+              <w:t xml:space="preserve">→</w:t>
+            </w:r>
+            <w:r>
+              <w:tab/>
             </w:r>
             <w:r>
               <w:rPr>
@@ -2607,7 +2751,10 @@
                 <w:sz w:val="21"/>
                 <w:szCs w:val="21"/>
               </w:rPr>
-              <w:t xml:space="preserve">→	</w:t>
+              <w:t xml:space="preserve">→</w:t>
+            </w:r>
+            <w:r>
+              <w:tab/>
             </w:r>
             <w:r>
               <w:rPr>
@@ -2633,7 +2780,10 @@
                 <w:sz w:val="21"/>
                 <w:szCs w:val="21"/>
               </w:rPr>
-              <w:t xml:space="preserve">→	</w:t>
+              <w:t xml:space="preserve">→</w:t>
+            </w:r>
+            <w:r>
+              <w:tab/>
             </w:r>
             <w:r>
               <w:rPr>
@@ -2659,7 +2809,10 @@
                 <w:sz w:val="21"/>
                 <w:szCs w:val="21"/>
               </w:rPr>
-              <w:t xml:space="preserve">→	</w:t>
+              <w:t xml:space="preserve">→</w:t>
+            </w:r>
+            <w:r>
+              <w:tab/>
             </w:r>
             <w:r>
               <w:rPr>
@@ -2685,7 +2838,10 @@
                 <w:sz w:val="21"/>
                 <w:szCs w:val="21"/>
               </w:rPr>
-              <w:t xml:space="preserve">→	</w:t>
+              <w:t xml:space="preserve">→</w:t>
+            </w:r>
+            <w:r>
+              <w:tab/>
             </w:r>
             <w:r>
               <w:rPr>
@@ -2711,7 +2867,10 @@
                 <w:sz w:val="21"/>
                 <w:szCs w:val="21"/>
               </w:rPr>
-              <w:t xml:space="preserve">→	</w:t>
+              <w:t xml:space="preserve">→</w:t>
+            </w:r>
+            <w:r>
+              <w:tab/>
             </w:r>
             <w:r>
               <w:rPr>
@@ -2737,7 +2896,10 @@
                 <w:sz w:val="21"/>
                 <w:szCs w:val="21"/>
               </w:rPr>
-              <w:t xml:space="preserve">→	</w:t>
+              <w:t xml:space="preserve">→</w:t>
+            </w:r>
+            <w:r>
+              <w:tab/>
             </w:r>
             <w:r>
               <w:rPr>
@@ -2763,7 +2925,10 @@
                 <w:sz w:val="21"/>
                 <w:szCs w:val="21"/>
               </w:rPr>
-              <w:t xml:space="preserve">→	</w:t>
+              <w:t xml:space="preserve">→</w:t>
+            </w:r>
+            <w:r>
+              <w:tab/>
             </w:r>
             <w:r>
               <w:rPr>
@@ -2877,7 +3042,10 @@
                 <w:sz w:val="21"/>
                 <w:szCs w:val="21"/>
               </w:rPr>
-              <w:t xml:space="preserve">→	</w:t>
+              <w:t xml:space="preserve">→</w:t>
+            </w:r>
+            <w:r>
+              <w:tab/>
             </w:r>
             <w:r>
               <w:rPr>
@@ -2912,7 +3080,10 @@
                 <w:sz w:val="21"/>
                 <w:szCs w:val="21"/>
               </w:rPr>
-              <w:t xml:space="preserve">→	</w:t>
+              <w:t xml:space="preserve">→</w:t>
+            </w:r>
+            <w:r>
+              <w:tab/>
             </w:r>
             <w:r>
               <w:rPr>
@@ -2947,7 +3118,10 @@
                 <w:sz w:val="21"/>
                 <w:szCs w:val="21"/>
               </w:rPr>
-              <w:t xml:space="preserve">→	</w:t>
+              <w:t xml:space="preserve">→</w:t>
+            </w:r>
+            <w:r>
+              <w:tab/>
             </w:r>
             <w:r>
               <w:rPr>
@@ -2982,7 +3156,10 @@
                 <w:sz w:val="21"/>
                 <w:szCs w:val="21"/>
               </w:rPr>
-              <w:t xml:space="preserve">→	</w:t>
+              <w:t xml:space="preserve">→</w:t>
+            </w:r>
+            <w:r>
+              <w:tab/>
             </w:r>
             <w:r>
               <w:rPr>
@@ -3008,7 +3185,10 @@
                 <w:sz w:val="21"/>
                 <w:szCs w:val="21"/>
               </w:rPr>
-              <w:t xml:space="preserve">→	</w:t>
+              <w:t xml:space="preserve">→</w:t>
+            </w:r>
+            <w:r>
+              <w:tab/>
             </w:r>
             <w:r>
               <w:rPr>
@@ -3034,7 +3214,10 @@
                 <w:sz w:val="21"/>
                 <w:szCs w:val="21"/>
               </w:rPr>
-              <w:t xml:space="preserve">→	</w:t>
+              <w:t xml:space="preserve">→</w:t>
+            </w:r>
+            <w:r>
+              <w:tab/>
             </w:r>
             <w:r>
               <w:rPr>
@@ -3060,7 +3243,10 @@
                 <w:sz w:val="21"/>
                 <w:szCs w:val="21"/>
               </w:rPr>
-              <w:t xml:space="preserve">→	</w:t>
+              <w:t xml:space="preserve">→</w:t>
+            </w:r>
+            <w:r>
+              <w:tab/>
             </w:r>
             <w:r>
               <w:rPr>
@@ -3086,7 +3272,10 @@
                 <w:sz w:val="21"/>
                 <w:szCs w:val="21"/>
               </w:rPr>
-              <w:t xml:space="preserve">→	</w:t>
+              <w:t xml:space="preserve">→</w:t>
+            </w:r>
+            <w:r>
+              <w:tab/>
             </w:r>
             <w:r>
               <w:rPr>
@@ -3203,7 +3392,10 @@
                 <w:sz w:val="21"/>
                 <w:szCs w:val="21"/>
               </w:rPr>
-              <w:t xml:space="preserve">→	</w:t>
+              <w:t xml:space="preserve">→</w:t>
+            </w:r>
+            <w:r>
+              <w:tab/>
             </w:r>
             <w:r>
               <w:rPr>
@@ -3229,7 +3421,10 @@
                 <w:sz w:val="21"/>
                 <w:szCs w:val="21"/>
               </w:rPr>
-              <w:t xml:space="preserve">→	</w:t>
+              <w:t xml:space="preserve">→</w:t>
+            </w:r>
+            <w:r>
+              <w:tab/>
             </w:r>
             <w:r>
               <w:rPr>
@@ -3255,7 +3450,10 @@
                 <w:sz w:val="21"/>
                 <w:szCs w:val="21"/>
               </w:rPr>
-              <w:t xml:space="preserve">→	</w:t>
+              <w:t xml:space="preserve">→</w:t>
+            </w:r>
+            <w:r>
+              <w:tab/>
             </w:r>
             <w:r>
               <w:rPr>

</xml_diff>

<commit_message>
Add India–Afghanistan Relations lecturette
Co-Authored-By: Claude Opus 5.5 <noreply@anthropic.com>
Claude-Session: https://claude.ai/code/session_01EyrV2JLtXrELkAF97b5fch
</commit_message>
<xml_diff>
--- a/SSB_Lecturettes.docx
+++ b/SSB_Lecturettes.docx
@@ -3470,6 +3470,1714 @@
                 <w:szCs w:val="21"/>
               </w:rPr>
               <w:t xml:space="preserve"> military, economy and partnerships</w:t>
+            </w:r>
+          </w:p>
+        </w:tc>
+      </w:tr>
+    </w:tbl>
+    <w:p>
+      <w:pPr>
+        <w:pStyle w:val="Heading1"/>
+        <w:pageBreakBefore/>
+        <w:shd w:fill="1F3864" w:color="auto" w:val="clear"/>
+        <w:spacing w:after="160" w:before="0"/>
+        <w:ind w:left="100" w:right="100"/>
+      </w:pPr>
+      <w:r>
+        <w:t xml:space="preserve">Topic 3: India–Afghanistan Relations</w:t>
+      </w:r>
+    </w:p>
+    <w:tbl>
+      <w:tblPr>
+        <w:tblW w:type="dxa" w:w="10706"/>
+        <w:tblBorders>
+          <w:top w:val="single" w:color="auto" w:sz="4"/>
+          <w:left w:val="single" w:color="auto" w:sz="4"/>
+          <w:bottom w:val="single" w:color="auto" w:sz="4"/>
+          <w:right w:val="single" w:color="auto" w:sz="4"/>
+          <w:insideH w:val="single" w:color="auto" w:sz="4"/>
+          <w:insideV w:val="single" w:color="auto" w:sz="4"/>
+        </w:tblBorders>
+      </w:tblPr>
+      <w:tblGrid>
+        <w:gridCol w:w="520"/>
+        <w:gridCol w:w="2200"/>
+        <w:gridCol w:w="7986"/>
+      </w:tblGrid>
+      <w:tr>
+        <w:trPr>
+          <w:tblHeader/>
+        </w:trPr>
+        <w:tc>
+          <w:tcPr>
+            <w:tcW w:type="dxa" w:w="520"/>
+            <w:tcBorders>
+              <w:top w:val="single" w:color="BFBFBF" w:sz="4"/>
+              <w:left w:val="single" w:color="BFBFBF" w:sz="4"/>
+              <w:bottom w:val="single" w:color="BFBFBF" w:sz="4"/>
+              <w:right w:val="single" w:color="BFBFBF" w:sz="4"/>
+            </w:tcBorders>
+            <w:shd w:fill="DCE3F0" w:color="auto" w:val="clear"/>
+            <w:tcMar>
+              <w:top w:type="dxa" w:w="70"/>
+              <w:left w:type="dxa" w:w="100"/>
+              <w:bottom w:type="dxa" w:w="70"/>
+              <w:right w:type="dxa" w:w="100"/>
+            </w:tcMar>
+            <w:vAlign w:val="center"/>
+          </w:tcPr>
+          <w:p>
+            <w:pPr>
+              <w:spacing w:after="0" w:before="0" w:line="300"/>
+              <w:jc w:val="center"/>
+            </w:pPr>
+            <w:r>
+              <w:rPr>
+                <w:b/>
+                <w:bCs/>
+                <w:sz w:val="21"/>
+                <w:szCs w:val="21"/>
+              </w:rPr>
+              <w:t xml:space="preserve">#</w:t>
+            </w:r>
+          </w:p>
+        </w:tc>
+        <w:tc>
+          <w:tcPr>
+            <w:tcW w:type="dxa" w:w="2200"/>
+            <w:tcBorders>
+              <w:top w:val="single" w:color="BFBFBF" w:sz="4"/>
+              <w:left w:val="single" w:color="BFBFBF" w:sz="4"/>
+              <w:bottom w:val="single" w:color="BFBFBF" w:sz="4"/>
+              <w:right w:val="single" w:color="BFBFBF" w:sz="4"/>
+            </w:tcBorders>
+            <w:shd w:fill="DCE3F0" w:color="auto" w:val="clear"/>
+            <w:tcMar>
+              <w:top w:type="dxa" w:w="70"/>
+              <w:left w:type="dxa" w:w="100"/>
+              <w:bottom w:type="dxa" w:w="70"/>
+              <w:right w:type="dxa" w:w="100"/>
+            </w:tcMar>
+            <w:vAlign w:val="center"/>
+          </w:tcPr>
+          <w:p>
+            <w:pPr>
+              <w:spacing w:after="0" w:before="0" w:line="300"/>
+            </w:pPr>
+            <w:r>
+              <w:rPr>
+                <w:b/>
+                <w:bCs/>
+                <w:sz w:val="21"/>
+                <w:szCs w:val="21"/>
+              </w:rPr>
+              <w:t xml:space="preserve">Stage</w:t>
+            </w:r>
+          </w:p>
+        </w:tc>
+        <w:tc>
+          <w:tcPr>
+            <w:tcW w:type="dxa" w:w="7986"/>
+            <w:tcBorders>
+              <w:top w:val="single" w:color="BFBFBF" w:sz="4"/>
+              <w:left w:val="single" w:color="BFBFBF" w:sz="4"/>
+              <w:bottom w:val="single" w:color="BFBFBF" w:sz="4"/>
+              <w:right w:val="single" w:color="BFBFBF" w:sz="4"/>
+            </w:tcBorders>
+            <w:shd w:fill="DCE3F0" w:color="auto" w:val="clear"/>
+            <w:tcMar>
+              <w:top w:type="dxa" w:w="70"/>
+              <w:left w:type="dxa" w:w="100"/>
+              <w:bottom w:type="dxa" w:w="70"/>
+              <w:right w:type="dxa" w:w="100"/>
+            </w:tcMar>
+            <w:vAlign w:val="center"/>
+          </w:tcPr>
+          <w:p>
+            <w:pPr>
+              <w:spacing w:after="0" w:before="0" w:line="300"/>
+            </w:pPr>
+            <w:r>
+              <w:rPr>
+                <w:b/>
+                <w:bCs/>
+                <w:sz w:val="21"/>
+                <w:szCs w:val="21"/>
+              </w:rPr>
+              <w:t xml:space="preserve">Flow</w:t>
+            </w:r>
+          </w:p>
+        </w:tc>
+      </w:tr>
+      <w:tr>
+        <w:trPr>
+          <w:cantSplit/>
+        </w:trPr>
+        <w:tc>
+          <w:tcPr>
+            <w:tcW w:type="dxa" w:w="520"/>
+            <w:tcBorders>
+              <w:top w:val="single" w:color="BFBFBF" w:sz="4"/>
+              <w:left w:val="single" w:color="BFBFBF" w:sz="4"/>
+              <w:bottom w:val="single" w:color="BFBFBF" w:sz="4"/>
+              <w:right w:val="single" w:color="BFBFBF" w:sz="4"/>
+            </w:tcBorders>
+            <w:tcMar>
+              <w:top w:type="dxa" w:w="70"/>
+              <w:left w:type="dxa" w:w="100"/>
+              <w:bottom w:type="dxa" w:w="70"/>
+              <w:right w:type="dxa" w:w="100"/>
+            </w:tcMar>
+            <w:vAlign w:val="center"/>
+          </w:tcPr>
+          <w:p>
+            <w:pPr>
+              <w:spacing w:after="0" w:before="0" w:line="300"/>
+              <w:jc w:val="center"/>
+            </w:pPr>
+            <w:r>
+              <w:rPr>
+                <w:color w:val="7F7F7F"/>
+                <w:sz w:val="21"/>
+                <w:szCs w:val="21"/>
+              </w:rPr>
+              <w:t xml:space="preserve">1</w:t>
+            </w:r>
+          </w:p>
+        </w:tc>
+        <w:tc>
+          <w:tcPr>
+            <w:tcW w:type="dxa" w:w="2200"/>
+            <w:tcBorders>
+              <w:top w:val="single" w:color="BFBFBF" w:sz="4"/>
+              <w:left w:val="single" w:color="BFBFBF" w:sz="4"/>
+              <w:bottom w:val="single" w:color="BFBFBF" w:sz="4"/>
+              <w:right w:val="single" w:color="BFBFBF" w:sz="4"/>
+            </w:tcBorders>
+            <w:tcMar>
+              <w:top w:type="dxa" w:w="70"/>
+              <w:left w:type="dxa" w:w="100"/>
+              <w:bottom w:type="dxa" w:w="70"/>
+              <w:right w:type="dxa" w:w="100"/>
+            </w:tcMar>
+            <w:vAlign w:val="center"/>
+          </w:tcPr>
+          <w:p>
+            <w:pPr>
+              <w:spacing w:after="0" w:before="0" w:line="300"/>
+            </w:pPr>
+            <w:r>
+              <w:rPr>
+                <w:b/>
+                <w:bCs/>
+                <w:color w:val="1F3864"/>
+                <w:sz w:val="21"/>
+                <w:szCs w:val="21"/>
+              </w:rPr>
+              <w:t xml:space="preserve">What is it</w:t>
+            </w:r>
+          </w:p>
+        </w:tc>
+        <w:tc>
+          <w:tcPr>
+            <w:tcW w:type="dxa" w:w="7986"/>
+            <w:tcBorders>
+              <w:top w:val="single" w:color="BFBFBF" w:sz="4"/>
+              <w:left w:val="single" w:color="BFBFBF" w:sz="4"/>
+              <w:bottom w:val="single" w:color="BFBFBF" w:sz="4"/>
+              <w:right w:val="single" w:color="BFBFBF" w:sz="4"/>
+            </w:tcBorders>
+            <w:tcMar>
+              <w:top w:type="dxa" w:w="70"/>
+              <w:left w:type="dxa" w:w="100"/>
+              <w:bottom w:type="dxa" w:w="70"/>
+              <w:right w:type="dxa" w:w="100"/>
+            </w:tcMar>
+            <w:vAlign w:val="center"/>
+          </w:tcPr>
+          <w:p>
+            <w:pPr>
+              <w:tabs>
+                <w:tab w:val="left" w:pos="260"/>
+              </w:tabs>
+              <w:spacing w:after="0" w:before="0" w:line="280"/>
+              <w:ind w:left="260" w:hanging="260"/>
+            </w:pPr>
+            <w:r>
+              <w:rPr>
+                <w:b/>
+                <w:bCs/>
+                <w:color w:val="C00000"/>
+                <w:sz w:val="21"/>
+                <w:szCs w:val="21"/>
+              </w:rPr>
+              <w:t xml:space="preserve">→</w:t>
+            </w:r>
+            <w:r>
+              <w:tab/>
+            </w:r>
+            <w:r>
+              <w:rPr>
+                <w:sz w:val="21"/>
+                <w:szCs w:val="21"/>
+              </w:rPr>
+              <w:t xml:space="preserve">Old civilisational ties; India the largest regional development partner for two decades (Salma Dam, Parliament building, Zaranj–Delaram highway)</w:t>
+            </w:r>
+          </w:p>
+          <w:p>
+            <w:pPr>
+              <w:tabs>
+                <w:tab w:val="left" w:pos="260"/>
+              </w:tabs>
+              <w:spacing w:after="0" w:before="40" w:line="280"/>
+              <w:ind w:left="260" w:hanging="260"/>
+            </w:pPr>
+            <w:r>
+              <w:rPr>
+                <w:b/>
+                <w:bCs/>
+                <w:color w:val="C00000"/>
+                <w:sz w:val="21"/>
+                <w:szCs w:val="21"/>
+              </w:rPr>
+              <w:t xml:space="preserve">→</w:t>
+            </w:r>
+            <w:r>
+              <w:tab/>
+            </w:r>
+            <w:r>
+              <w:rPr>
+                <w:sz w:val="21"/>
+                <w:szCs w:val="21"/>
+              </w:rPr>
+              <w:t xml:space="preserve">Backed the Northern Alliance and the Ghani government</w:t>
+            </w:r>
+          </w:p>
+          <w:p>
+            <w:pPr>
+              <w:tabs>
+                <w:tab w:val="left" w:pos="260"/>
+              </w:tabs>
+              <w:spacing w:after="0" w:before="40" w:line="280"/>
+              <w:ind w:left="260" w:hanging="260"/>
+            </w:pPr>
+            <w:r>
+              <w:rPr>
+                <w:b/>
+                <w:bCs/>
+                <w:color w:val="C00000"/>
+                <w:sz w:val="21"/>
+                <w:szCs w:val="21"/>
+              </w:rPr>
+              <w:t xml:space="preserve">→</w:t>
+            </w:r>
+            <w:r>
+              <w:tab/>
+            </w:r>
+            <w:r>
+              <w:rPr>
+                <w:sz w:val="21"/>
+                <w:szCs w:val="21"/>
+              </w:rPr>
+              <w:t xml:space="preserve">Taliban takeover (Aug 2021): India shut its embassy</w:t>
+            </w:r>
+          </w:p>
+          <w:p>
+            <w:pPr>
+              <w:tabs>
+                <w:tab w:val="left" w:pos="260"/>
+              </w:tabs>
+              <w:spacing w:after="0" w:before="40" w:line="280"/>
+              <w:ind w:left="260" w:hanging="260"/>
+            </w:pPr>
+            <w:r>
+              <w:rPr>
+                <w:b/>
+                <w:bCs/>
+                <w:color w:val="C00000"/>
+                <w:sz w:val="21"/>
+                <w:szCs w:val="21"/>
+              </w:rPr>
+              <w:t xml:space="preserve">→</w:t>
+            </w:r>
+            <w:r>
+              <w:tab/>
+            </w:r>
+            <w:r>
+              <w:rPr>
+                <w:sz w:val="21"/>
+                <w:szCs w:val="21"/>
+              </w:rPr>
+              <w:t xml:space="preserve">Now pragmatic re-engagement with the Taliban regime</w:t>
+            </w:r>
+          </w:p>
+        </w:tc>
+      </w:tr>
+      <w:tr>
+        <w:trPr>
+          <w:cantSplit/>
+        </w:trPr>
+        <w:tc>
+          <w:tcPr>
+            <w:tcW w:type="dxa" w:w="520"/>
+            <w:tcBorders>
+              <w:top w:val="single" w:color="BFBFBF" w:sz="4"/>
+              <w:left w:val="single" w:color="BFBFBF" w:sz="4"/>
+              <w:bottom w:val="single" w:color="BFBFBF" w:sz="4"/>
+              <w:right w:val="single" w:color="BFBFBF" w:sz="4"/>
+            </w:tcBorders>
+            <w:shd w:fill="F5F7FB" w:color="auto" w:val="clear"/>
+            <w:tcMar>
+              <w:top w:type="dxa" w:w="70"/>
+              <w:left w:type="dxa" w:w="100"/>
+              <w:bottom w:type="dxa" w:w="70"/>
+              <w:right w:type="dxa" w:w="100"/>
+            </w:tcMar>
+            <w:vAlign w:val="center"/>
+          </w:tcPr>
+          <w:p>
+            <w:pPr>
+              <w:spacing w:after="0" w:before="0" w:line="300"/>
+              <w:jc w:val="center"/>
+            </w:pPr>
+            <w:r>
+              <w:rPr>
+                <w:color w:val="7F7F7F"/>
+                <w:sz w:val="21"/>
+                <w:szCs w:val="21"/>
+              </w:rPr>
+              <w:t xml:space="preserve">2</w:t>
+            </w:r>
+          </w:p>
+        </w:tc>
+        <w:tc>
+          <w:tcPr>
+            <w:tcW w:type="dxa" w:w="2200"/>
+            <w:tcBorders>
+              <w:top w:val="single" w:color="BFBFBF" w:sz="4"/>
+              <w:left w:val="single" w:color="BFBFBF" w:sz="4"/>
+              <w:bottom w:val="single" w:color="BFBFBF" w:sz="4"/>
+              <w:right w:val="single" w:color="BFBFBF" w:sz="4"/>
+            </w:tcBorders>
+            <w:shd w:fill="F5F7FB" w:color="auto" w:val="clear"/>
+            <w:tcMar>
+              <w:top w:type="dxa" w:w="70"/>
+              <w:left w:type="dxa" w:w="100"/>
+              <w:bottom w:type="dxa" w:w="70"/>
+              <w:right w:type="dxa" w:w="100"/>
+            </w:tcMar>
+            <w:vAlign w:val="center"/>
+          </w:tcPr>
+          <w:p>
+            <w:pPr>
+              <w:spacing w:after="0" w:before="0" w:line="300"/>
+            </w:pPr>
+            <w:r>
+              <w:rPr>
+                <w:b/>
+                <w:bCs/>
+                <w:color w:val="1F3864"/>
+                <w:sz w:val="21"/>
+                <w:szCs w:val="21"/>
+              </w:rPr>
+              <w:t xml:space="preserve">Why it matters</w:t>
+            </w:r>
+          </w:p>
+        </w:tc>
+        <w:tc>
+          <w:tcPr>
+            <w:tcW w:type="dxa" w:w="7986"/>
+            <w:tcBorders>
+              <w:top w:val="single" w:color="BFBFBF" w:sz="4"/>
+              <w:left w:val="single" w:color="BFBFBF" w:sz="4"/>
+              <w:bottom w:val="single" w:color="BFBFBF" w:sz="4"/>
+              <w:right w:val="single" w:color="BFBFBF" w:sz="4"/>
+            </w:tcBorders>
+            <w:shd w:fill="F5F7FB" w:color="auto" w:val="clear"/>
+            <w:tcMar>
+              <w:top w:type="dxa" w:w="70"/>
+              <w:left w:type="dxa" w:w="100"/>
+              <w:bottom w:type="dxa" w:w="70"/>
+              <w:right w:type="dxa" w:w="100"/>
+            </w:tcMar>
+            <w:vAlign w:val="center"/>
+          </w:tcPr>
+          <w:p>
+            <w:pPr>
+              <w:tabs>
+                <w:tab w:val="left" w:pos="260"/>
+              </w:tabs>
+              <w:spacing w:after="0" w:before="0" w:line="280"/>
+              <w:ind w:left="260" w:hanging="260"/>
+            </w:pPr>
+            <w:r>
+              <w:rPr>
+                <w:b/>
+                <w:bCs/>
+                <w:color w:val="C00000"/>
+                <w:sz w:val="21"/>
+                <w:szCs w:val="21"/>
+              </w:rPr>
+              <w:t xml:space="preserve">→</w:t>
+            </w:r>
+            <w:r>
+              <w:tab/>
+            </w:r>
+            <w:r>
+              <w:rPr>
+                <w:b/>
+                <w:bCs/>
+                <w:sz w:val="21"/>
+                <w:szCs w:val="21"/>
+              </w:rPr>
+              <w:t xml:space="preserve">Security:</w:t>
+            </w:r>
+            <w:r>
+              <w:rPr>
+                <w:sz w:val="21"/>
+                <w:szCs w:val="21"/>
+              </w:rPr>
+              <w:t xml:space="preserve"> no Afghan soil for terror against India</w:t>
+            </w:r>
+          </w:p>
+          <w:p>
+            <w:pPr>
+              <w:tabs>
+                <w:tab w:val="left" w:pos="260"/>
+              </w:tabs>
+              <w:spacing w:after="0" w:before="40" w:line="280"/>
+              <w:ind w:left="260" w:hanging="260"/>
+            </w:pPr>
+            <w:r>
+              <w:rPr>
+                <w:b/>
+                <w:bCs/>
+                <w:color w:val="C00000"/>
+                <w:sz w:val="21"/>
+                <w:szCs w:val="21"/>
+              </w:rPr>
+              <w:t xml:space="preserve">→</w:t>
+            </w:r>
+            <w:r>
+              <w:tab/>
+            </w:r>
+            <w:r>
+              <w:rPr>
+                <w:b/>
+                <w:bCs/>
+                <w:sz w:val="21"/>
+                <w:szCs w:val="21"/>
+              </w:rPr>
+              <w:t xml:space="preserve">Strategic:</w:t>
+            </w:r>
+            <w:r>
+              <w:rPr>
+                <w:sz w:val="21"/>
+                <w:szCs w:val="21"/>
+              </w:rPr>
+              <w:t xml:space="preserve"> counters Pakistan's "strategic depth" and China's footprint</w:t>
+            </w:r>
+          </w:p>
+          <w:p>
+            <w:pPr>
+              <w:tabs>
+                <w:tab w:val="left" w:pos="260"/>
+              </w:tabs>
+              <w:spacing w:after="0" w:before="40" w:line="280"/>
+              <w:ind w:left="260" w:hanging="260"/>
+            </w:pPr>
+            <w:r>
+              <w:rPr>
+                <w:b/>
+                <w:bCs/>
+                <w:color w:val="C00000"/>
+                <w:sz w:val="21"/>
+                <w:szCs w:val="21"/>
+              </w:rPr>
+              <w:t xml:space="preserve">→</w:t>
+            </w:r>
+            <w:r>
+              <w:tab/>
+            </w:r>
+            <w:r>
+              <w:rPr>
+                <w:b/>
+                <w:bCs/>
+                <w:sz w:val="21"/>
+                <w:szCs w:val="21"/>
+              </w:rPr>
+              <w:t xml:space="preserve">Connectivity:</w:t>
+            </w:r>
+            <w:r>
+              <w:rPr>
+                <w:sz w:val="21"/>
+                <w:szCs w:val="21"/>
+              </w:rPr>
+              <w:t xml:space="preserve"> gateway to Central Asia via Chabahar and INSTC</w:t>
+            </w:r>
+          </w:p>
+          <w:p>
+            <w:pPr>
+              <w:tabs>
+                <w:tab w:val="left" w:pos="260"/>
+              </w:tabs>
+              <w:spacing w:after="0" w:before="40" w:line="280"/>
+              <w:ind w:left="260" w:hanging="260"/>
+            </w:pPr>
+            <w:r>
+              <w:rPr>
+                <w:b/>
+                <w:bCs/>
+                <w:color w:val="C00000"/>
+                <w:sz w:val="21"/>
+                <w:szCs w:val="21"/>
+              </w:rPr>
+              <w:t xml:space="preserve">→</w:t>
+            </w:r>
+            <w:r>
+              <w:tab/>
+            </w:r>
+            <w:r>
+              <w:rPr>
+                <w:b/>
+                <w:bCs/>
+                <w:sz w:val="21"/>
+                <w:szCs w:val="21"/>
+              </w:rPr>
+              <w:t xml:space="preserve">Economic:</w:t>
+            </w:r>
+            <w:r>
+              <w:rPr>
+                <w:sz w:val="21"/>
+                <w:szCs w:val="21"/>
+              </w:rPr>
+              <w:t xml:space="preserve"> market, minerals, trade</w:t>
+            </w:r>
+          </w:p>
+          <w:p>
+            <w:pPr>
+              <w:tabs>
+                <w:tab w:val="left" w:pos="260"/>
+              </w:tabs>
+              <w:spacing w:after="0" w:before="40" w:line="280"/>
+              <w:ind w:left="260" w:hanging="260"/>
+            </w:pPr>
+            <w:r>
+              <w:rPr>
+                <w:b/>
+                <w:bCs/>
+                <w:color w:val="C00000"/>
+                <w:sz w:val="21"/>
+                <w:szCs w:val="21"/>
+              </w:rPr>
+              <w:t xml:space="preserve">→</w:t>
+            </w:r>
+            <w:r>
+              <w:tab/>
+            </w:r>
+            <w:r>
+              <w:rPr>
+                <w:b/>
+                <w:bCs/>
+                <w:sz w:val="21"/>
+                <w:szCs w:val="21"/>
+              </w:rPr>
+              <w:t xml:space="preserve">Humanitarian:</w:t>
+            </w:r>
+            <w:r>
+              <w:rPr>
+                <w:sz w:val="21"/>
+                <w:szCs w:val="21"/>
+              </w:rPr>
+              <w:t xml:space="preserve"> goodwill among the Afghan people</w:t>
+            </w:r>
+          </w:p>
+        </w:tc>
+      </w:tr>
+      <w:tr>
+        <w:trPr>
+          <w:cantSplit/>
+        </w:trPr>
+        <w:tc>
+          <w:tcPr>
+            <w:tcW w:type="dxa" w:w="520"/>
+            <w:tcBorders>
+              <w:top w:val="single" w:color="BFBFBF" w:sz="4"/>
+              <w:left w:val="single" w:color="BFBFBF" w:sz="4"/>
+              <w:bottom w:val="single" w:color="BFBFBF" w:sz="4"/>
+              <w:right w:val="single" w:color="BFBFBF" w:sz="4"/>
+            </w:tcBorders>
+            <w:tcMar>
+              <w:top w:type="dxa" w:w="70"/>
+              <w:left w:type="dxa" w:w="100"/>
+              <w:bottom w:type="dxa" w:w="70"/>
+              <w:right w:type="dxa" w:w="100"/>
+            </w:tcMar>
+            <w:vAlign w:val="center"/>
+          </w:tcPr>
+          <w:p>
+            <w:pPr>
+              <w:spacing w:after="0" w:before="0" w:line="300"/>
+              <w:jc w:val="center"/>
+            </w:pPr>
+            <w:r>
+              <w:rPr>
+                <w:color w:val="7F7F7F"/>
+                <w:sz w:val="21"/>
+                <w:szCs w:val="21"/>
+              </w:rPr>
+              <w:t xml:space="preserve">3</w:t>
+            </w:r>
+          </w:p>
+        </w:tc>
+        <w:tc>
+          <w:tcPr>
+            <w:tcW w:type="dxa" w:w="2200"/>
+            <w:tcBorders>
+              <w:top w:val="single" w:color="BFBFBF" w:sz="4"/>
+              <w:left w:val="single" w:color="BFBFBF" w:sz="4"/>
+              <w:bottom w:val="single" w:color="BFBFBF" w:sz="4"/>
+              <w:right w:val="single" w:color="BFBFBF" w:sz="4"/>
+            </w:tcBorders>
+            <w:tcMar>
+              <w:top w:type="dxa" w:w="70"/>
+              <w:left w:type="dxa" w:w="100"/>
+              <w:bottom w:type="dxa" w:w="70"/>
+              <w:right w:type="dxa" w:w="100"/>
+            </w:tcMar>
+            <w:vAlign w:val="center"/>
+          </w:tcPr>
+          <w:p>
+            <w:pPr>
+              <w:spacing w:after="0" w:before="0" w:line="300"/>
+            </w:pPr>
+            <w:r>
+              <w:rPr>
+                <w:b/>
+                <w:bCs/>
+                <w:color w:val="1F3864"/>
+                <w:sz w:val="21"/>
+                <w:szCs w:val="21"/>
+              </w:rPr>
+              <w:t xml:space="preserve">Current status (Sept 2026)</w:t>
+            </w:r>
+          </w:p>
+        </w:tc>
+        <w:tc>
+          <w:tcPr>
+            <w:tcW w:type="dxa" w:w="7986"/>
+            <w:tcBorders>
+              <w:top w:val="single" w:color="BFBFBF" w:sz="4"/>
+              <w:left w:val="single" w:color="BFBFBF" w:sz="4"/>
+              <w:bottom w:val="single" w:color="BFBFBF" w:sz="4"/>
+              <w:right w:val="single" w:color="BFBFBF" w:sz="4"/>
+            </w:tcBorders>
+            <w:tcMar>
+              <w:top w:type="dxa" w:w="70"/>
+              <w:left w:type="dxa" w:w="100"/>
+              <w:bottom w:type="dxa" w:w="70"/>
+              <w:right w:type="dxa" w:w="100"/>
+            </w:tcMar>
+            <w:vAlign w:val="center"/>
+          </w:tcPr>
+          <w:p>
+            <w:pPr>
+              <w:tabs>
+                <w:tab w:val="left" w:pos="260"/>
+              </w:tabs>
+              <w:spacing w:after="0" w:before="0" w:line="280"/>
+              <w:ind w:left="260" w:hanging="260"/>
+            </w:pPr>
+            <w:r>
+              <w:rPr>
+                <w:b/>
+                <w:bCs/>
+                <w:color w:val="C00000"/>
+                <w:sz w:val="21"/>
+                <w:szCs w:val="21"/>
+              </w:rPr>
+              <w:t xml:space="preserve">→</w:t>
+            </w:r>
+            <w:r>
+              <w:tab/>
+            </w:r>
+            <w:r>
+              <w:rPr>
+                <w:sz w:val="21"/>
+                <w:szCs w:val="21"/>
+              </w:rPr>
+              <w:t xml:space="preserve">Kabul mission upgraded to full embassy (Oct 2025); Afghan embassy in Delhi handed to the Taliban, first Taliban diplomat in India</w:t>
+            </w:r>
+          </w:p>
+          <w:p>
+            <w:pPr>
+              <w:tabs>
+                <w:tab w:val="left" w:pos="260"/>
+              </w:tabs>
+              <w:spacing w:after="0" w:before="40" w:line="280"/>
+              <w:ind w:left="260" w:hanging="260"/>
+            </w:pPr>
+            <w:r>
+              <w:rPr>
+                <w:b/>
+                <w:bCs/>
+                <w:color w:val="C00000"/>
+                <w:sz w:val="21"/>
+                <w:szCs w:val="21"/>
+              </w:rPr>
+              <w:t xml:space="preserve">→</w:t>
+            </w:r>
+            <w:r>
+              <w:tab/>
+            </w:r>
+            <w:r>
+              <w:rPr>
+                <w:b/>
+                <w:bCs/>
+                <w:sz w:val="21"/>
+                <w:szCs w:val="21"/>
+              </w:rPr>
+              <w:t xml:space="preserve">Ministerial visits:</w:t>
+            </w:r>
+            <w:r>
+              <w:rPr>
+                <w:sz w:val="21"/>
+                <w:szCs w:val="21"/>
+              </w:rPr>
+              <w:t xml:space="preserve"> agriculture minister (Jul 2026) the fourth, after foreign, health and commerce</w:t>
+            </w:r>
+          </w:p>
+          <w:p>
+            <w:pPr>
+              <w:tabs>
+                <w:tab w:val="left" w:pos="260"/>
+              </w:tabs>
+              <w:spacing w:after="0" w:before="40" w:line="280"/>
+              <w:ind w:left="260" w:hanging="260"/>
+            </w:pPr>
+            <w:r>
+              <w:rPr>
+                <w:b/>
+                <w:bCs/>
+                <w:color w:val="C00000"/>
+                <w:sz w:val="21"/>
+                <w:szCs w:val="21"/>
+              </w:rPr>
+              <w:t xml:space="preserve">→</w:t>
+            </w:r>
+            <w:r>
+              <w:tab/>
+            </w:r>
+            <w:r>
+              <w:rPr>
+                <w:b/>
+                <w:bCs/>
+                <w:sz w:val="21"/>
+                <w:szCs w:val="21"/>
+              </w:rPr>
+              <w:t xml:space="preserve">Trade:</w:t>
+            </w:r>
+            <w:r>
+              <w:rPr>
+                <w:sz w:val="21"/>
+                <w:szCs w:val="21"/>
+              </w:rPr>
+              <w:t xml:space="preserve"> Kabul–Amritsar and Kabul–Delhi air freight corridors reactivated (Dec 2025); trade above $1.5 bn last fiscal</w:t>
+            </w:r>
+          </w:p>
+          <w:p>
+            <w:pPr>
+              <w:tabs>
+                <w:tab w:val="left" w:pos="260"/>
+              </w:tabs>
+              <w:spacing w:after="0" w:before="40" w:line="280"/>
+              <w:ind w:left="260" w:hanging="260"/>
+            </w:pPr>
+            <w:r>
+              <w:rPr>
+                <w:b/>
+                <w:bCs/>
+                <w:color w:val="C00000"/>
+                <w:sz w:val="21"/>
+                <w:szCs w:val="21"/>
+              </w:rPr>
+              <w:t xml:space="preserve">→</w:t>
+            </w:r>
+            <w:r>
+              <w:tab/>
+            </w:r>
+            <w:r>
+              <w:rPr>
+                <w:b/>
+                <w:bCs/>
+                <w:sz w:val="21"/>
+                <w:szCs w:val="21"/>
+              </w:rPr>
+              <w:t xml:space="preserve">Recognition:</w:t>
+            </w:r>
+            <w:r>
+              <w:rPr>
+                <w:sz w:val="21"/>
+                <w:szCs w:val="21"/>
+              </w:rPr>
+              <w:t xml:space="preserve"> no formal recognition of the Taliban government yet</w:t>
+            </w:r>
+          </w:p>
+          <w:p>
+            <w:pPr>
+              <w:tabs>
+                <w:tab w:val="left" w:pos="260"/>
+              </w:tabs>
+              <w:spacing w:after="0" w:before="40" w:line="280"/>
+              <w:ind w:left="260" w:hanging="260"/>
+            </w:pPr>
+            <w:r>
+              <w:rPr>
+                <w:b/>
+                <w:bCs/>
+                <w:color w:val="C00000"/>
+                <w:sz w:val="21"/>
+                <w:szCs w:val="21"/>
+              </w:rPr>
+              <w:t xml:space="preserve">→</w:t>
+            </w:r>
+            <w:r>
+              <w:tab/>
+            </w:r>
+            <w:r>
+              <w:rPr>
+                <w:b/>
+                <w:bCs/>
+                <w:sz w:val="21"/>
+                <w:szCs w:val="21"/>
+              </w:rPr>
+              <w:t xml:space="preserve">Pakistan factor:</w:t>
+            </w:r>
+            <w:r>
+              <w:rPr>
+                <w:sz w:val="21"/>
+                <w:szCs w:val="21"/>
+              </w:rPr>
+              <w:t xml:space="preserve"> India condemned Pakistan's strikes in Afghanistan at the UN; Pakistan calls Afghanistan a "colony of India"</w:t>
+            </w:r>
+          </w:p>
+          <w:p>
+            <w:pPr>
+              <w:tabs>
+                <w:tab w:val="left" w:pos="260"/>
+              </w:tabs>
+              <w:spacing w:after="0" w:before="40" w:line="280"/>
+              <w:ind w:left="260" w:hanging="260"/>
+            </w:pPr>
+            <w:r>
+              <w:rPr>
+                <w:b/>
+                <w:bCs/>
+                <w:color w:val="C00000"/>
+                <w:sz w:val="21"/>
+                <w:szCs w:val="21"/>
+              </w:rPr>
+              <w:t xml:space="preserve">→</w:t>
+            </w:r>
+            <w:r>
+              <w:tab/>
+            </w:r>
+            <w:r>
+              <w:rPr>
+                <w:b/>
+                <w:bCs/>
+                <w:sz w:val="21"/>
+                <w:szCs w:val="21"/>
+              </w:rPr>
+              <w:t xml:space="preserve">MEA (Aug 2026):</w:t>
+            </w:r>
+            <w:r>
+              <w:rPr>
+                <w:sz w:val="21"/>
+                <w:szCs w:val="21"/>
+              </w:rPr>
+              <w:t xml:space="preserve"> engagement expanded through diplomacy, humanitarian aid and development assistance</w:t>
+            </w:r>
+          </w:p>
+        </w:tc>
+      </w:tr>
+      <w:tr>
+        <w:trPr>
+          <w:cantSplit/>
+        </w:trPr>
+        <w:tc>
+          <w:tcPr>
+            <w:tcW w:type="dxa" w:w="520"/>
+            <w:tcBorders>
+              <w:top w:val="single" w:color="BFBFBF" w:sz="4"/>
+              <w:left w:val="single" w:color="BFBFBF" w:sz="4"/>
+              <w:bottom w:val="single" w:color="BFBFBF" w:sz="4"/>
+              <w:right w:val="single" w:color="BFBFBF" w:sz="4"/>
+            </w:tcBorders>
+            <w:shd w:fill="F5F7FB" w:color="auto" w:val="clear"/>
+            <w:tcMar>
+              <w:top w:type="dxa" w:w="70"/>
+              <w:left w:type="dxa" w:w="100"/>
+              <w:bottom w:type="dxa" w:w="70"/>
+              <w:right w:type="dxa" w:w="100"/>
+            </w:tcMar>
+            <w:vAlign w:val="center"/>
+          </w:tcPr>
+          <w:p>
+            <w:pPr>
+              <w:spacing w:after="0" w:before="0" w:line="300"/>
+              <w:jc w:val="center"/>
+            </w:pPr>
+            <w:r>
+              <w:rPr>
+                <w:color w:val="7F7F7F"/>
+                <w:sz w:val="21"/>
+                <w:szCs w:val="21"/>
+              </w:rPr>
+              <w:t xml:space="preserve">4</w:t>
+            </w:r>
+          </w:p>
+        </w:tc>
+        <w:tc>
+          <w:tcPr>
+            <w:tcW w:type="dxa" w:w="2200"/>
+            <w:tcBorders>
+              <w:top w:val="single" w:color="BFBFBF" w:sz="4"/>
+              <w:left w:val="single" w:color="BFBFBF" w:sz="4"/>
+              <w:bottom w:val="single" w:color="BFBFBF" w:sz="4"/>
+              <w:right w:val="single" w:color="BFBFBF" w:sz="4"/>
+            </w:tcBorders>
+            <w:shd w:fill="F5F7FB" w:color="auto" w:val="clear"/>
+            <w:tcMar>
+              <w:top w:type="dxa" w:w="70"/>
+              <w:left w:type="dxa" w:w="100"/>
+              <w:bottom w:type="dxa" w:w="70"/>
+              <w:right w:type="dxa" w:w="100"/>
+            </w:tcMar>
+            <w:vAlign w:val="center"/>
+          </w:tcPr>
+          <w:p>
+            <w:pPr>
+              <w:spacing w:after="0" w:before="0" w:line="300"/>
+            </w:pPr>
+            <w:r>
+              <w:rPr>
+                <w:b/>
+                <w:bCs/>
+                <w:color w:val="1F3864"/>
+                <w:sz w:val="21"/>
+                <w:szCs w:val="21"/>
+              </w:rPr>
+              <w:t xml:space="preserve">Problems</w:t>
+            </w:r>
+          </w:p>
+        </w:tc>
+        <w:tc>
+          <w:tcPr>
+            <w:tcW w:type="dxa" w:w="7986"/>
+            <w:tcBorders>
+              <w:top w:val="single" w:color="BFBFBF" w:sz="4"/>
+              <w:left w:val="single" w:color="BFBFBF" w:sz="4"/>
+              <w:bottom w:val="single" w:color="BFBFBF" w:sz="4"/>
+              <w:right w:val="single" w:color="BFBFBF" w:sz="4"/>
+            </w:tcBorders>
+            <w:shd w:fill="F5F7FB" w:color="auto" w:val="clear"/>
+            <w:tcMar>
+              <w:top w:type="dxa" w:w="70"/>
+              <w:left w:type="dxa" w:w="100"/>
+              <w:bottom w:type="dxa" w:w="70"/>
+              <w:right w:type="dxa" w:w="100"/>
+            </w:tcMar>
+            <w:vAlign w:val="center"/>
+          </w:tcPr>
+          <w:p>
+            <w:pPr>
+              <w:tabs>
+                <w:tab w:val="left" w:pos="260"/>
+              </w:tabs>
+              <w:spacing w:after="0" w:before="0" w:line="280"/>
+              <w:ind w:left="260" w:hanging="260"/>
+            </w:pPr>
+            <w:r>
+              <w:rPr>
+                <w:b/>
+                <w:bCs/>
+                <w:color w:val="C00000"/>
+                <w:sz w:val="21"/>
+                <w:szCs w:val="21"/>
+              </w:rPr>
+              <w:t xml:space="preserve">→</w:t>
+            </w:r>
+            <w:r>
+              <w:tab/>
+            </w:r>
+            <w:r>
+              <w:rPr>
+                <w:b/>
+                <w:bCs/>
+                <w:sz w:val="21"/>
+                <w:szCs w:val="21"/>
+              </w:rPr>
+              <w:t xml:space="preserve">No direct land route:</w:t>
+            </w:r>
+            <w:r>
+              <w:rPr>
+                <w:sz w:val="21"/>
+                <w:szCs w:val="21"/>
+              </w:rPr>
+              <w:t xml:space="preserve"> Pakistan blocks transit, Attari–Wagah closed since May 2025</w:t>
+            </w:r>
+          </w:p>
+          <w:p>
+            <w:pPr>
+              <w:tabs>
+                <w:tab w:val="left" w:pos="260"/>
+              </w:tabs>
+              <w:spacing w:after="0" w:before="40" w:line="280"/>
+              <w:ind w:left="260" w:hanging="260"/>
+            </w:pPr>
+            <w:r>
+              <w:rPr>
+                <w:b/>
+                <w:bCs/>
+                <w:color w:val="C00000"/>
+                <w:sz w:val="21"/>
+                <w:szCs w:val="21"/>
+              </w:rPr>
+              <w:t xml:space="preserve">→</w:t>
+            </w:r>
+            <w:r>
+              <w:tab/>
+            </w:r>
+            <w:r>
+              <w:rPr>
+                <w:sz w:val="21"/>
+                <w:szCs w:val="21"/>
+              </w:rPr>
+              <w:t xml:space="preserve">Chabahar under pressure from the US–Iran conflict</w:t>
+            </w:r>
+          </w:p>
+          <w:p>
+            <w:pPr>
+              <w:tabs>
+                <w:tab w:val="left" w:pos="260"/>
+              </w:tabs>
+              <w:spacing w:after="0" w:before="40" w:line="280"/>
+              <w:ind w:left="260" w:hanging="260"/>
+            </w:pPr>
+            <w:r>
+              <w:rPr>
+                <w:b/>
+                <w:bCs/>
+                <w:color w:val="C00000"/>
+                <w:sz w:val="21"/>
+                <w:szCs w:val="21"/>
+              </w:rPr>
+              <w:t xml:space="preserve">→</w:t>
+            </w:r>
+            <w:r>
+              <w:tab/>
+            </w:r>
+            <w:r>
+              <w:rPr>
+                <w:sz w:val="21"/>
+                <w:szCs w:val="21"/>
+              </w:rPr>
+              <w:t xml:space="preserve">Taliban curbs on women and human rights</w:t>
+            </w:r>
+          </w:p>
+          <w:p>
+            <w:pPr>
+              <w:tabs>
+                <w:tab w:val="left" w:pos="260"/>
+              </w:tabs>
+              <w:spacing w:after="0" w:before="40" w:line="280"/>
+              <w:ind w:left="260" w:hanging="260"/>
+            </w:pPr>
+            <w:r>
+              <w:rPr>
+                <w:b/>
+                <w:bCs/>
+                <w:color w:val="C00000"/>
+                <w:sz w:val="21"/>
+                <w:szCs w:val="21"/>
+              </w:rPr>
+              <w:t xml:space="preserve">→</w:t>
+            </w:r>
+            <w:r>
+              <w:tab/>
+            </w:r>
+            <w:r>
+              <w:rPr>
+                <w:sz w:val="21"/>
+                <w:szCs w:val="21"/>
+              </w:rPr>
+              <w:t xml:space="preserve">Pakistan–Afghanistan conflict spillover, Pakistan alleging an Indian hand</w:t>
+            </w:r>
+          </w:p>
+          <w:p>
+            <w:pPr>
+              <w:tabs>
+                <w:tab w:val="left" w:pos="260"/>
+              </w:tabs>
+              <w:spacing w:after="0" w:before="40" w:line="280"/>
+              <w:ind w:left="260" w:hanging="260"/>
+            </w:pPr>
+            <w:r>
+              <w:rPr>
+                <w:b/>
+                <w:bCs/>
+                <w:color w:val="C00000"/>
+                <w:sz w:val="21"/>
+                <w:szCs w:val="21"/>
+              </w:rPr>
+              <w:t xml:space="preserve">→</w:t>
+            </w:r>
+            <w:r>
+              <w:tab/>
+            </w:r>
+            <w:r>
+              <w:rPr>
+                <w:sz w:val="21"/>
+                <w:szCs w:val="21"/>
+              </w:rPr>
+              <w:t xml:space="preserve">China's economic push in Afghanistan</w:t>
+            </w:r>
+          </w:p>
+          <w:p>
+            <w:pPr>
+              <w:tabs>
+                <w:tab w:val="left" w:pos="260"/>
+              </w:tabs>
+              <w:spacing w:after="0" w:before="40" w:line="280"/>
+              <w:ind w:left="260" w:hanging="260"/>
+            </w:pPr>
+            <w:r>
+              <w:rPr>
+                <w:b/>
+                <w:bCs/>
+                <w:color w:val="C00000"/>
+                <w:sz w:val="21"/>
+                <w:szCs w:val="21"/>
+              </w:rPr>
+              <w:t xml:space="preserve">→</w:t>
+            </w:r>
+            <w:r>
+              <w:tab/>
+            </w:r>
+            <w:r>
+              <w:rPr>
+                <w:sz w:val="21"/>
+                <w:szCs w:val="21"/>
+              </w:rPr>
+              <w:t xml:space="preserve">Terror groups still active (TTP, ISKP, LeT/JeM links)</w:t>
+            </w:r>
+          </w:p>
+          <w:p>
+            <w:pPr>
+              <w:tabs>
+                <w:tab w:val="left" w:pos="260"/>
+              </w:tabs>
+              <w:spacing w:after="0" w:before="40" w:line="280"/>
+              <w:ind w:left="260" w:hanging="260"/>
+            </w:pPr>
+            <w:r>
+              <w:rPr>
+                <w:b/>
+                <w:bCs/>
+                <w:color w:val="C00000"/>
+                <w:sz w:val="21"/>
+                <w:szCs w:val="21"/>
+              </w:rPr>
+              <w:t xml:space="preserve">→</w:t>
+            </w:r>
+            <w:r>
+              <w:tab/>
+            </w:r>
+            <w:r>
+              <w:rPr>
+                <w:sz w:val="21"/>
+                <w:szCs w:val="21"/>
+              </w:rPr>
+              <w:t xml:space="preserve">Taliban an unpredictable partner</w:t>
+            </w:r>
+          </w:p>
+        </w:tc>
+      </w:tr>
+      <w:tr>
+        <w:trPr>
+          <w:cantSplit/>
+        </w:trPr>
+        <w:tc>
+          <w:tcPr>
+            <w:tcW w:type="dxa" w:w="520"/>
+            <w:tcBorders>
+              <w:top w:val="single" w:color="BFBFBF" w:sz="4"/>
+              <w:left w:val="single" w:color="BFBFBF" w:sz="4"/>
+              <w:bottom w:val="single" w:color="BFBFBF" w:sz="4"/>
+              <w:right w:val="single" w:color="BFBFBF" w:sz="4"/>
+            </w:tcBorders>
+            <w:tcMar>
+              <w:top w:type="dxa" w:w="70"/>
+              <w:left w:type="dxa" w:w="100"/>
+              <w:bottom w:type="dxa" w:w="70"/>
+              <w:right w:type="dxa" w:w="100"/>
+            </w:tcMar>
+            <w:vAlign w:val="center"/>
+          </w:tcPr>
+          <w:p>
+            <w:pPr>
+              <w:spacing w:after="0" w:before="0" w:line="300"/>
+              <w:jc w:val="center"/>
+            </w:pPr>
+            <w:r>
+              <w:rPr>
+                <w:color w:val="7F7F7F"/>
+                <w:sz w:val="21"/>
+                <w:szCs w:val="21"/>
+              </w:rPr>
+              <w:t xml:space="preserve">5</w:t>
+            </w:r>
+          </w:p>
+        </w:tc>
+        <w:tc>
+          <w:tcPr>
+            <w:tcW w:type="dxa" w:w="2200"/>
+            <w:tcBorders>
+              <w:top w:val="single" w:color="BFBFBF" w:sz="4"/>
+              <w:left w:val="single" w:color="BFBFBF" w:sz="4"/>
+              <w:bottom w:val="single" w:color="BFBFBF" w:sz="4"/>
+              <w:right w:val="single" w:color="BFBFBF" w:sz="4"/>
+            </w:tcBorders>
+            <w:tcMar>
+              <w:top w:type="dxa" w:w="70"/>
+              <w:left w:type="dxa" w:w="100"/>
+              <w:bottom w:type="dxa" w:w="70"/>
+              <w:right w:type="dxa" w:w="100"/>
+            </w:tcMar>
+            <w:vAlign w:val="center"/>
+          </w:tcPr>
+          <w:p>
+            <w:pPr>
+              <w:spacing w:after="0" w:before="0" w:line="300"/>
+            </w:pPr>
+            <w:r>
+              <w:rPr>
+                <w:b/>
+                <w:bCs/>
+                <w:color w:val="1F3864"/>
+                <w:sz w:val="21"/>
+                <w:szCs w:val="21"/>
+              </w:rPr>
+              <w:t xml:space="preserve">Solutions</w:t>
+            </w:r>
+          </w:p>
+        </w:tc>
+        <w:tc>
+          <w:tcPr>
+            <w:tcW w:type="dxa" w:w="7986"/>
+            <w:tcBorders>
+              <w:top w:val="single" w:color="BFBFBF" w:sz="4"/>
+              <w:left w:val="single" w:color="BFBFBF" w:sz="4"/>
+              <w:bottom w:val="single" w:color="BFBFBF" w:sz="4"/>
+              <w:right w:val="single" w:color="BFBFBF" w:sz="4"/>
+            </w:tcBorders>
+            <w:tcMar>
+              <w:top w:type="dxa" w:w="70"/>
+              <w:left w:type="dxa" w:w="100"/>
+              <w:bottom w:type="dxa" w:w="70"/>
+              <w:right w:type="dxa" w:w="100"/>
+            </w:tcMar>
+            <w:vAlign w:val="center"/>
+          </w:tcPr>
+          <w:p>
+            <w:pPr>
+              <w:tabs>
+                <w:tab w:val="left" w:pos="260"/>
+              </w:tabs>
+              <w:spacing w:after="0" w:before="0" w:line="280"/>
+              <w:ind w:left="260" w:hanging="260"/>
+            </w:pPr>
+            <w:r>
+              <w:rPr>
+                <w:b/>
+                <w:bCs/>
+                <w:color w:val="C00000"/>
+                <w:sz w:val="21"/>
+                <w:szCs w:val="21"/>
+              </w:rPr>
+              <w:t xml:space="preserve">→</w:t>
+            </w:r>
+            <w:r>
+              <w:tab/>
+            </w:r>
+            <w:r>
+              <w:rPr>
+                <w:b/>
+                <w:bCs/>
+                <w:sz w:val="21"/>
+                <w:szCs w:val="21"/>
+              </w:rPr>
+              <w:t xml:space="preserve">Calibrated engagement:</w:t>
+            </w:r>
+            <w:r>
+              <w:rPr>
+                <w:sz w:val="21"/>
+                <w:szCs w:val="21"/>
+              </w:rPr>
+              <w:t xml:space="preserve"> aid and development, no recognition until the Taliban delivers on terror and inclusivity</w:t>
+            </w:r>
+          </w:p>
+          <w:p>
+            <w:pPr>
+              <w:tabs>
+                <w:tab w:val="left" w:pos="260"/>
+              </w:tabs>
+              <w:spacing w:after="0" w:before="40" w:line="280"/>
+              <w:ind w:left="260" w:hanging="260"/>
+            </w:pPr>
+            <w:r>
+              <w:rPr>
+                <w:b/>
+                <w:bCs/>
+                <w:color w:val="C00000"/>
+                <w:sz w:val="21"/>
+                <w:szCs w:val="21"/>
+              </w:rPr>
+              <w:t xml:space="preserve">→</w:t>
+            </w:r>
+            <w:r>
+              <w:tab/>
+            </w:r>
+            <w:r>
+              <w:rPr>
+                <w:sz w:val="21"/>
+                <w:szCs w:val="21"/>
+              </w:rPr>
+              <w:t xml:space="preserve">Expand the air corridor and Chabahar; keep the US sanctions waiver alive</w:t>
+            </w:r>
+          </w:p>
+          <w:p>
+            <w:pPr>
+              <w:tabs>
+                <w:tab w:val="left" w:pos="260"/>
+              </w:tabs>
+              <w:spacing w:after="0" w:before="40" w:line="280"/>
+              <w:ind w:left="260" w:hanging="260"/>
+            </w:pPr>
+            <w:r>
+              <w:rPr>
+                <w:b/>
+                <w:bCs/>
+                <w:color w:val="C00000"/>
+                <w:sz w:val="21"/>
+                <w:szCs w:val="21"/>
+              </w:rPr>
+              <w:t xml:space="preserve">→</w:t>
+            </w:r>
+            <w:r>
+              <w:tab/>
+            </w:r>
+            <w:r>
+              <w:rPr>
+                <w:sz w:val="21"/>
+                <w:szCs w:val="21"/>
+              </w:rPr>
+              <w:t xml:space="preserve">Targeted projects in health, agriculture and education</w:t>
+            </w:r>
+          </w:p>
+          <w:p>
+            <w:pPr>
+              <w:tabs>
+                <w:tab w:val="left" w:pos="260"/>
+              </w:tabs>
+              <w:spacing w:after="0" w:before="40" w:line="280"/>
+              <w:ind w:left="260" w:hanging="260"/>
+            </w:pPr>
+            <w:r>
+              <w:rPr>
+                <w:b/>
+                <w:bCs/>
+                <w:color w:val="C00000"/>
+                <w:sz w:val="21"/>
+                <w:szCs w:val="21"/>
+              </w:rPr>
+              <w:t xml:space="preserve">→</w:t>
+            </w:r>
+            <w:r>
+              <w:tab/>
+            </w:r>
+            <w:r>
+              <w:rPr>
+                <w:sz w:val="21"/>
+                <w:szCs w:val="21"/>
+              </w:rPr>
+              <w:t xml:space="preserve">Written assurances that Afghan soil won't be used against India</w:t>
+            </w:r>
+          </w:p>
+          <w:p>
+            <w:pPr>
+              <w:tabs>
+                <w:tab w:val="left" w:pos="260"/>
+              </w:tabs>
+              <w:spacing w:after="0" w:before="40" w:line="280"/>
+              <w:ind w:left="260" w:hanging="260"/>
+            </w:pPr>
+            <w:r>
+              <w:rPr>
+                <w:b/>
+                <w:bCs/>
+                <w:color w:val="C00000"/>
+                <w:sz w:val="21"/>
+                <w:szCs w:val="21"/>
+              </w:rPr>
+              <w:t xml:space="preserve">→</w:t>
+            </w:r>
+            <w:r>
+              <w:tab/>
+            </w:r>
+            <w:r>
+              <w:rPr>
+                <w:sz w:val="21"/>
+                <w:szCs w:val="21"/>
+              </w:rPr>
+              <w:t xml:space="preserve">Coordinate with Russia, Iran and Central Asia (Moscow format)</w:t>
+            </w:r>
+          </w:p>
+          <w:p>
+            <w:pPr>
+              <w:tabs>
+                <w:tab w:val="left" w:pos="260"/>
+              </w:tabs>
+              <w:spacing w:after="0" w:before="40" w:line="280"/>
+              <w:ind w:left="260" w:hanging="260"/>
+            </w:pPr>
+            <w:r>
+              <w:rPr>
+                <w:b/>
+                <w:bCs/>
+                <w:color w:val="C00000"/>
+                <w:sz w:val="21"/>
+                <w:szCs w:val="21"/>
+              </w:rPr>
+              <w:t xml:space="preserve">→</w:t>
+            </w:r>
+            <w:r>
+              <w:tab/>
+            </w:r>
+            <w:r>
+              <w:rPr>
+                <w:sz w:val="21"/>
+                <w:szCs w:val="21"/>
+              </w:rPr>
+              <w:t xml:space="preserve">Raise women's rights quietly through diplomacy and multilateral forums</w:t>
+            </w:r>
+          </w:p>
+          <w:p>
+            <w:pPr>
+              <w:tabs>
+                <w:tab w:val="left" w:pos="260"/>
+              </w:tabs>
+              <w:spacing w:after="0" w:before="40" w:line="280"/>
+              <w:ind w:left="260" w:hanging="260"/>
+            </w:pPr>
+            <w:r>
+              <w:rPr>
+                <w:b/>
+                <w:bCs/>
+                <w:color w:val="C00000"/>
+                <w:sz w:val="21"/>
+                <w:szCs w:val="21"/>
+              </w:rPr>
+              <w:t xml:space="preserve">→</w:t>
+            </w:r>
+            <w:r>
+              <w:tab/>
+            </w:r>
+            <w:r>
+              <w:rPr>
+                <w:sz w:val="21"/>
+                <w:szCs w:val="21"/>
+              </w:rPr>
+              <w:t xml:space="preserve">Stay out of the Pakistan–Afghanistan fight</w:t>
+            </w:r>
+          </w:p>
+        </w:tc>
+      </w:tr>
+      <w:tr>
+        <w:trPr>
+          <w:cantSplit/>
+        </w:trPr>
+        <w:tc>
+          <w:tcPr>
+            <w:tcW w:type="dxa" w:w="520"/>
+            <w:tcBorders>
+              <w:top w:val="single" w:color="BFBFBF" w:sz="4"/>
+              <w:left w:val="single" w:color="BFBFBF" w:sz="4"/>
+              <w:bottom w:val="single" w:color="BFBFBF" w:sz="4"/>
+              <w:right w:val="single" w:color="BFBFBF" w:sz="4"/>
+            </w:tcBorders>
+            <w:shd w:fill="F5F7FB" w:color="auto" w:val="clear"/>
+            <w:tcMar>
+              <w:top w:type="dxa" w:w="70"/>
+              <w:left w:type="dxa" w:w="100"/>
+              <w:bottom w:type="dxa" w:w="70"/>
+              <w:right w:type="dxa" w:w="100"/>
+            </w:tcMar>
+            <w:vAlign w:val="center"/>
+          </w:tcPr>
+          <w:p>
+            <w:pPr>
+              <w:spacing w:after="0" w:before="0" w:line="300"/>
+              <w:jc w:val="center"/>
+            </w:pPr>
+            <w:r>
+              <w:rPr>
+                <w:color w:val="7F7F7F"/>
+                <w:sz w:val="21"/>
+                <w:szCs w:val="21"/>
+              </w:rPr>
+              <w:t xml:space="preserve">6</w:t>
+            </w:r>
+          </w:p>
+        </w:tc>
+        <w:tc>
+          <w:tcPr>
+            <w:tcW w:type="dxa" w:w="2200"/>
+            <w:tcBorders>
+              <w:top w:val="single" w:color="BFBFBF" w:sz="4"/>
+              <w:left w:val="single" w:color="BFBFBF" w:sz="4"/>
+              <w:bottom w:val="single" w:color="BFBFBF" w:sz="4"/>
+              <w:right w:val="single" w:color="BFBFBF" w:sz="4"/>
+            </w:tcBorders>
+            <w:shd w:fill="F5F7FB" w:color="auto" w:val="clear"/>
+            <w:tcMar>
+              <w:top w:type="dxa" w:w="70"/>
+              <w:left w:type="dxa" w:w="100"/>
+              <w:bottom w:type="dxa" w:w="70"/>
+              <w:right w:type="dxa" w:w="100"/>
+            </w:tcMar>
+            <w:vAlign w:val="center"/>
+          </w:tcPr>
+          <w:p>
+            <w:pPr>
+              <w:spacing w:after="0" w:before="0" w:line="300"/>
+            </w:pPr>
+            <w:r>
+              <w:rPr>
+                <w:b/>
+                <w:bCs/>
+                <w:color w:val="1F3864"/>
+                <w:sz w:val="21"/>
+                <w:szCs w:val="21"/>
+              </w:rPr>
+              <w:t xml:space="preserve">Conclusion</w:t>
+            </w:r>
+          </w:p>
+        </w:tc>
+        <w:tc>
+          <w:tcPr>
+            <w:tcW w:type="dxa" w:w="7986"/>
+            <w:tcBorders>
+              <w:top w:val="single" w:color="BFBFBF" w:sz="4"/>
+              <w:left w:val="single" w:color="BFBFBF" w:sz="4"/>
+              <w:bottom w:val="single" w:color="BFBFBF" w:sz="4"/>
+              <w:right w:val="single" w:color="BFBFBF" w:sz="4"/>
+            </w:tcBorders>
+            <w:shd w:fill="F5F7FB" w:color="auto" w:val="clear"/>
+            <w:tcMar>
+              <w:top w:type="dxa" w:w="70"/>
+              <w:left w:type="dxa" w:w="100"/>
+              <w:bottom w:type="dxa" w:w="70"/>
+              <w:right w:type="dxa" w:w="100"/>
+            </w:tcMar>
+            <w:vAlign w:val="center"/>
+          </w:tcPr>
+          <w:p>
+            <w:pPr>
+              <w:tabs>
+                <w:tab w:val="left" w:pos="260"/>
+              </w:tabs>
+              <w:spacing w:after="0" w:before="0" w:line="280"/>
+              <w:ind w:left="260" w:hanging="260"/>
+            </w:pPr>
+            <w:r>
+              <w:rPr>
+                <w:b/>
+                <w:bCs/>
+                <w:color w:val="C00000"/>
+                <w:sz w:val="21"/>
+                <w:szCs w:val="21"/>
+              </w:rPr>
+              <w:t xml:space="preserve">→</w:t>
+            </w:r>
+            <w:r>
+              <w:tab/>
+            </w:r>
+            <w:r>
+              <w:rPr>
+                <w:sz w:val="21"/>
+                <w:szCs w:val="21"/>
+              </w:rPr>
+              <w:t xml:space="preserve">India's policy is guided by national interest, not ideology</w:t>
+            </w:r>
+          </w:p>
+          <w:p>
+            <w:pPr>
+              <w:tabs>
+                <w:tab w:val="left" w:pos="260"/>
+              </w:tabs>
+              <w:spacing w:after="0" w:before="40" w:line="280"/>
+              <w:ind w:left="260" w:hanging="260"/>
+            </w:pPr>
+            <w:r>
+              <w:rPr>
+                <w:b/>
+                <w:bCs/>
+                <w:color w:val="C00000"/>
+                <w:sz w:val="21"/>
+                <w:szCs w:val="21"/>
+              </w:rPr>
+              <w:t xml:space="preserve">→</w:t>
+            </w:r>
+            <w:r>
+              <w:tab/>
+            </w:r>
+            <w:r>
+              <w:rPr>
+                <w:sz w:val="21"/>
+                <w:szCs w:val="21"/>
+              </w:rPr>
+              <w:t xml:space="preserve">The Afghan people remain India's friend, whoever rules in Kabul</w:t>
+            </w:r>
+          </w:p>
+          <w:p>
+            <w:pPr>
+              <w:tabs>
+                <w:tab w:val="left" w:pos="260"/>
+              </w:tabs>
+              <w:spacing w:after="0" w:before="40" w:line="280"/>
+              <w:ind w:left="260" w:hanging="260"/>
+            </w:pPr>
+            <w:r>
+              <w:rPr>
+                <w:b/>
+                <w:bCs/>
+                <w:color w:val="C00000"/>
+                <w:sz w:val="21"/>
+                <w:szCs w:val="21"/>
+              </w:rPr>
+              <w:t xml:space="preserve">→</w:t>
+            </w:r>
+            <w:r>
+              <w:tab/>
+            </w:r>
+            <w:r>
+              <w:rPr>
+                <w:sz w:val="21"/>
+                <w:szCs w:val="21"/>
+              </w:rPr>
+              <w:t xml:space="preserve">Safe borders, regional connectivity and a terror-free neighbourhood come first</w:t>
             </w:r>
           </w:p>
         </w:tc>

</xml_diff>

<commit_message>
Add India–Nepal Relations lecturette
Co-Authored-By: Claude Opus 5.5 <noreply@anthropic.com>
Claude-Session: https://claude.ai/code/session_01EyrV2JLtXrELkAF97b5fch
</commit_message>
<xml_diff>
--- a/SSB_Lecturettes.docx
+++ b/SSB_Lecturettes.docx
@@ -5178,6 +5178,1761 @@
                 <w:szCs w:val="21"/>
               </w:rPr>
               <w:t xml:space="preserve">Safe borders, regional connectivity and a terror-free neighbourhood come first</w:t>
+            </w:r>
+          </w:p>
+        </w:tc>
+      </w:tr>
+    </w:tbl>
+    <w:p>
+      <w:pPr>
+        <w:pStyle w:val="Heading1"/>
+        <w:pageBreakBefore/>
+        <w:shd w:fill="1F3864" w:color="auto" w:val="clear"/>
+        <w:spacing w:after="160" w:before="0"/>
+        <w:ind w:left="100" w:right="100"/>
+      </w:pPr>
+      <w:r>
+        <w:t xml:space="preserve">Topic 4: India–Nepal Relations</w:t>
+      </w:r>
+    </w:p>
+    <w:tbl>
+      <w:tblPr>
+        <w:tblW w:type="dxa" w:w="10706"/>
+        <w:tblBorders>
+          <w:top w:val="single" w:color="auto" w:sz="4"/>
+          <w:left w:val="single" w:color="auto" w:sz="4"/>
+          <w:bottom w:val="single" w:color="auto" w:sz="4"/>
+          <w:right w:val="single" w:color="auto" w:sz="4"/>
+          <w:insideH w:val="single" w:color="auto" w:sz="4"/>
+          <w:insideV w:val="single" w:color="auto" w:sz="4"/>
+        </w:tblBorders>
+      </w:tblPr>
+      <w:tblGrid>
+        <w:gridCol w:w="520"/>
+        <w:gridCol w:w="2200"/>
+        <w:gridCol w:w="7986"/>
+      </w:tblGrid>
+      <w:tr>
+        <w:trPr>
+          <w:tblHeader/>
+        </w:trPr>
+        <w:tc>
+          <w:tcPr>
+            <w:tcW w:type="dxa" w:w="520"/>
+            <w:tcBorders>
+              <w:top w:val="single" w:color="BFBFBF" w:sz="4"/>
+              <w:left w:val="single" w:color="BFBFBF" w:sz="4"/>
+              <w:bottom w:val="single" w:color="BFBFBF" w:sz="4"/>
+              <w:right w:val="single" w:color="BFBFBF" w:sz="4"/>
+            </w:tcBorders>
+            <w:shd w:fill="DCE3F0" w:color="auto" w:val="clear"/>
+            <w:tcMar>
+              <w:top w:type="dxa" w:w="70"/>
+              <w:left w:type="dxa" w:w="100"/>
+              <w:bottom w:type="dxa" w:w="70"/>
+              <w:right w:type="dxa" w:w="100"/>
+            </w:tcMar>
+            <w:vAlign w:val="center"/>
+          </w:tcPr>
+          <w:p>
+            <w:pPr>
+              <w:spacing w:after="0" w:before="0" w:line="300"/>
+              <w:jc w:val="center"/>
+            </w:pPr>
+            <w:r>
+              <w:rPr>
+                <w:b/>
+                <w:bCs/>
+                <w:sz w:val="21"/>
+                <w:szCs w:val="21"/>
+              </w:rPr>
+              <w:t xml:space="preserve">#</w:t>
+            </w:r>
+          </w:p>
+        </w:tc>
+        <w:tc>
+          <w:tcPr>
+            <w:tcW w:type="dxa" w:w="2200"/>
+            <w:tcBorders>
+              <w:top w:val="single" w:color="BFBFBF" w:sz="4"/>
+              <w:left w:val="single" w:color="BFBFBF" w:sz="4"/>
+              <w:bottom w:val="single" w:color="BFBFBF" w:sz="4"/>
+              <w:right w:val="single" w:color="BFBFBF" w:sz="4"/>
+            </w:tcBorders>
+            <w:shd w:fill="DCE3F0" w:color="auto" w:val="clear"/>
+            <w:tcMar>
+              <w:top w:type="dxa" w:w="70"/>
+              <w:left w:type="dxa" w:w="100"/>
+              <w:bottom w:type="dxa" w:w="70"/>
+              <w:right w:type="dxa" w:w="100"/>
+            </w:tcMar>
+            <w:vAlign w:val="center"/>
+          </w:tcPr>
+          <w:p>
+            <w:pPr>
+              <w:spacing w:after="0" w:before="0" w:line="300"/>
+            </w:pPr>
+            <w:r>
+              <w:rPr>
+                <w:b/>
+                <w:bCs/>
+                <w:sz w:val="21"/>
+                <w:szCs w:val="21"/>
+              </w:rPr>
+              <w:t xml:space="preserve">Stage</w:t>
+            </w:r>
+          </w:p>
+        </w:tc>
+        <w:tc>
+          <w:tcPr>
+            <w:tcW w:type="dxa" w:w="7986"/>
+            <w:tcBorders>
+              <w:top w:val="single" w:color="BFBFBF" w:sz="4"/>
+              <w:left w:val="single" w:color="BFBFBF" w:sz="4"/>
+              <w:bottom w:val="single" w:color="BFBFBF" w:sz="4"/>
+              <w:right w:val="single" w:color="BFBFBF" w:sz="4"/>
+            </w:tcBorders>
+            <w:shd w:fill="DCE3F0" w:color="auto" w:val="clear"/>
+            <w:tcMar>
+              <w:top w:type="dxa" w:w="70"/>
+              <w:left w:type="dxa" w:w="100"/>
+              <w:bottom w:type="dxa" w:w="70"/>
+              <w:right w:type="dxa" w:w="100"/>
+            </w:tcMar>
+            <w:vAlign w:val="center"/>
+          </w:tcPr>
+          <w:p>
+            <w:pPr>
+              <w:spacing w:after="0" w:before="0" w:line="300"/>
+            </w:pPr>
+            <w:r>
+              <w:rPr>
+                <w:b/>
+                <w:bCs/>
+                <w:sz w:val="21"/>
+                <w:szCs w:val="21"/>
+              </w:rPr>
+              <w:t xml:space="preserve">Flow</w:t>
+            </w:r>
+          </w:p>
+        </w:tc>
+      </w:tr>
+      <w:tr>
+        <w:trPr>
+          <w:cantSplit/>
+        </w:trPr>
+        <w:tc>
+          <w:tcPr>
+            <w:tcW w:type="dxa" w:w="520"/>
+            <w:tcBorders>
+              <w:top w:val="single" w:color="BFBFBF" w:sz="4"/>
+              <w:left w:val="single" w:color="BFBFBF" w:sz="4"/>
+              <w:bottom w:val="single" w:color="BFBFBF" w:sz="4"/>
+              <w:right w:val="single" w:color="BFBFBF" w:sz="4"/>
+            </w:tcBorders>
+            <w:tcMar>
+              <w:top w:type="dxa" w:w="70"/>
+              <w:left w:type="dxa" w:w="100"/>
+              <w:bottom w:type="dxa" w:w="70"/>
+              <w:right w:type="dxa" w:w="100"/>
+            </w:tcMar>
+            <w:vAlign w:val="center"/>
+          </w:tcPr>
+          <w:p>
+            <w:pPr>
+              <w:spacing w:after="0" w:before="0" w:line="300"/>
+              <w:jc w:val="center"/>
+            </w:pPr>
+            <w:r>
+              <w:rPr>
+                <w:color w:val="7F7F7F"/>
+                <w:sz w:val="21"/>
+                <w:szCs w:val="21"/>
+              </w:rPr>
+              <w:t xml:space="preserve">1</w:t>
+            </w:r>
+          </w:p>
+        </w:tc>
+        <w:tc>
+          <w:tcPr>
+            <w:tcW w:type="dxa" w:w="2200"/>
+            <w:tcBorders>
+              <w:top w:val="single" w:color="BFBFBF" w:sz="4"/>
+              <w:left w:val="single" w:color="BFBFBF" w:sz="4"/>
+              <w:bottom w:val="single" w:color="BFBFBF" w:sz="4"/>
+              <w:right w:val="single" w:color="BFBFBF" w:sz="4"/>
+            </w:tcBorders>
+            <w:tcMar>
+              <w:top w:type="dxa" w:w="70"/>
+              <w:left w:type="dxa" w:w="100"/>
+              <w:bottom w:type="dxa" w:w="70"/>
+              <w:right w:type="dxa" w:w="100"/>
+            </w:tcMar>
+            <w:vAlign w:val="center"/>
+          </w:tcPr>
+          <w:p>
+            <w:pPr>
+              <w:spacing w:after="0" w:before="0" w:line="300"/>
+            </w:pPr>
+            <w:r>
+              <w:rPr>
+                <w:b/>
+                <w:bCs/>
+                <w:color w:val="1F3864"/>
+                <w:sz w:val="21"/>
+                <w:szCs w:val="21"/>
+              </w:rPr>
+              <w:t xml:space="preserve">What is it</w:t>
+            </w:r>
+          </w:p>
+        </w:tc>
+        <w:tc>
+          <w:tcPr>
+            <w:tcW w:type="dxa" w:w="7986"/>
+            <w:tcBorders>
+              <w:top w:val="single" w:color="BFBFBF" w:sz="4"/>
+              <w:left w:val="single" w:color="BFBFBF" w:sz="4"/>
+              <w:bottom w:val="single" w:color="BFBFBF" w:sz="4"/>
+              <w:right w:val="single" w:color="BFBFBF" w:sz="4"/>
+            </w:tcBorders>
+            <w:tcMar>
+              <w:top w:type="dxa" w:w="70"/>
+              <w:left w:type="dxa" w:w="100"/>
+              <w:bottom w:type="dxa" w:w="70"/>
+              <w:right w:type="dxa" w:w="100"/>
+            </w:tcMar>
+            <w:vAlign w:val="center"/>
+          </w:tcPr>
+          <w:p>
+            <w:pPr>
+              <w:tabs>
+                <w:tab w:val="left" w:pos="260"/>
+              </w:tabs>
+              <w:spacing w:after="0" w:before="0" w:line="280"/>
+              <w:ind w:left="260" w:hanging="260"/>
+            </w:pPr>
+            <w:r>
+              <w:rPr>
+                <w:b/>
+                <w:bCs/>
+                <w:color w:val="C00000"/>
+                <w:sz w:val="21"/>
+                <w:szCs w:val="21"/>
+              </w:rPr>
+              <w:t xml:space="preserve">→</w:t>
+            </w:r>
+            <w:r>
+              <w:tab/>
+            </w:r>
+            <w:r>
+              <w:rPr>
+                <w:sz w:val="21"/>
+                <w:szCs w:val="21"/>
+              </w:rPr>
+              <w:t xml:space="preserve">Unique "Roti-Beti" bond; open border with five Indian states (Sikkim, West Bengal, Bihar, UP, Uttarakhand)</w:t>
+            </w:r>
+          </w:p>
+          <w:p>
+            <w:pPr>
+              <w:tabs>
+                <w:tab w:val="left" w:pos="260"/>
+              </w:tabs>
+              <w:spacing w:after="0" w:before="40" w:line="280"/>
+              <w:ind w:left="260" w:hanging="260"/>
+            </w:pPr>
+            <w:r>
+              <w:rPr>
+                <w:b/>
+                <w:bCs/>
+                <w:color w:val="C00000"/>
+                <w:sz w:val="21"/>
+                <w:szCs w:val="21"/>
+              </w:rPr>
+              <w:t xml:space="preserve">→</w:t>
+            </w:r>
+            <w:r>
+              <w:tab/>
+            </w:r>
+            <w:r>
+              <w:rPr>
+                <w:sz w:val="21"/>
+                <w:szCs w:val="21"/>
+              </w:rPr>
+              <w:t xml:space="preserve">1950 Treaty of Peace and Friendship as the bedrock</w:t>
+            </w:r>
+          </w:p>
+          <w:p>
+            <w:pPr>
+              <w:tabs>
+                <w:tab w:val="left" w:pos="260"/>
+              </w:tabs>
+              <w:spacing w:after="0" w:before="40" w:line="280"/>
+              <w:ind w:left="260" w:hanging="260"/>
+            </w:pPr>
+            <w:r>
+              <w:rPr>
+                <w:b/>
+                <w:bCs/>
+                <w:color w:val="C00000"/>
+                <w:sz w:val="21"/>
+                <w:szCs w:val="21"/>
+              </w:rPr>
+              <w:t xml:space="preserve">→</w:t>
+            </w:r>
+            <w:r>
+              <w:tab/>
+            </w:r>
+            <w:r>
+              <w:rPr>
+                <w:sz w:val="21"/>
+                <w:szCs w:val="21"/>
+              </w:rPr>
+              <w:t xml:space="preserve">Landlocked Nepal depends on India for transit and sea access</w:t>
+            </w:r>
+          </w:p>
+          <w:p>
+            <w:pPr>
+              <w:tabs>
+                <w:tab w:val="left" w:pos="260"/>
+              </w:tabs>
+              <w:spacing w:after="0" w:before="40" w:line="280"/>
+              <w:ind w:left="260" w:hanging="260"/>
+            </w:pPr>
+            <w:r>
+              <w:rPr>
+                <w:b/>
+                <w:bCs/>
+                <w:color w:val="C00000"/>
+                <w:sz w:val="21"/>
+                <w:szCs w:val="21"/>
+              </w:rPr>
+              <w:t xml:space="preserve">→</w:t>
+            </w:r>
+            <w:r>
+              <w:tab/>
+            </w:r>
+            <w:r>
+              <w:rPr>
+                <w:sz w:val="21"/>
+                <w:szCs w:val="21"/>
+              </w:rPr>
+              <w:t xml:space="preserve">Gorkha soldiers in the Indian Army; shared Hindu–Buddhist heritage</w:t>
+            </w:r>
+          </w:p>
+        </w:tc>
+      </w:tr>
+      <w:tr>
+        <w:trPr>
+          <w:cantSplit/>
+        </w:trPr>
+        <w:tc>
+          <w:tcPr>
+            <w:tcW w:type="dxa" w:w="520"/>
+            <w:tcBorders>
+              <w:top w:val="single" w:color="BFBFBF" w:sz="4"/>
+              <w:left w:val="single" w:color="BFBFBF" w:sz="4"/>
+              <w:bottom w:val="single" w:color="BFBFBF" w:sz="4"/>
+              <w:right w:val="single" w:color="BFBFBF" w:sz="4"/>
+            </w:tcBorders>
+            <w:shd w:fill="F5F7FB" w:color="auto" w:val="clear"/>
+            <w:tcMar>
+              <w:top w:type="dxa" w:w="70"/>
+              <w:left w:type="dxa" w:w="100"/>
+              <w:bottom w:type="dxa" w:w="70"/>
+              <w:right w:type="dxa" w:w="100"/>
+            </w:tcMar>
+            <w:vAlign w:val="center"/>
+          </w:tcPr>
+          <w:p>
+            <w:pPr>
+              <w:spacing w:after="0" w:before="0" w:line="300"/>
+              <w:jc w:val="center"/>
+            </w:pPr>
+            <w:r>
+              <w:rPr>
+                <w:color w:val="7F7F7F"/>
+                <w:sz w:val="21"/>
+                <w:szCs w:val="21"/>
+              </w:rPr>
+              <w:t xml:space="preserve">2</w:t>
+            </w:r>
+          </w:p>
+        </w:tc>
+        <w:tc>
+          <w:tcPr>
+            <w:tcW w:type="dxa" w:w="2200"/>
+            <w:tcBorders>
+              <w:top w:val="single" w:color="BFBFBF" w:sz="4"/>
+              <w:left w:val="single" w:color="BFBFBF" w:sz="4"/>
+              <w:bottom w:val="single" w:color="BFBFBF" w:sz="4"/>
+              <w:right w:val="single" w:color="BFBFBF" w:sz="4"/>
+            </w:tcBorders>
+            <w:shd w:fill="F5F7FB" w:color="auto" w:val="clear"/>
+            <w:tcMar>
+              <w:top w:type="dxa" w:w="70"/>
+              <w:left w:type="dxa" w:w="100"/>
+              <w:bottom w:type="dxa" w:w="70"/>
+              <w:right w:type="dxa" w:w="100"/>
+            </w:tcMar>
+            <w:vAlign w:val="center"/>
+          </w:tcPr>
+          <w:p>
+            <w:pPr>
+              <w:spacing w:after="0" w:before="0" w:line="300"/>
+            </w:pPr>
+            <w:r>
+              <w:rPr>
+                <w:b/>
+                <w:bCs/>
+                <w:color w:val="1F3864"/>
+                <w:sz w:val="21"/>
+                <w:szCs w:val="21"/>
+              </w:rPr>
+              <w:t xml:space="preserve">Why it matters</w:t>
+            </w:r>
+          </w:p>
+        </w:tc>
+        <w:tc>
+          <w:tcPr>
+            <w:tcW w:type="dxa" w:w="7986"/>
+            <w:tcBorders>
+              <w:top w:val="single" w:color="BFBFBF" w:sz="4"/>
+              <w:left w:val="single" w:color="BFBFBF" w:sz="4"/>
+              <w:bottom w:val="single" w:color="BFBFBF" w:sz="4"/>
+              <w:right w:val="single" w:color="BFBFBF" w:sz="4"/>
+            </w:tcBorders>
+            <w:shd w:fill="F5F7FB" w:color="auto" w:val="clear"/>
+            <w:tcMar>
+              <w:top w:type="dxa" w:w="70"/>
+              <w:left w:type="dxa" w:w="100"/>
+              <w:bottom w:type="dxa" w:w="70"/>
+              <w:right w:type="dxa" w:w="100"/>
+            </w:tcMar>
+            <w:vAlign w:val="center"/>
+          </w:tcPr>
+          <w:p>
+            <w:pPr>
+              <w:tabs>
+                <w:tab w:val="left" w:pos="260"/>
+              </w:tabs>
+              <w:spacing w:after="0" w:before="0" w:line="280"/>
+              <w:ind w:left="260" w:hanging="260"/>
+            </w:pPr>
+            <w:r>
+              <w:rPr>
+                <w:b/>
+                <w:bCs/>
+                <w:color w:val="C00000"/>
+                <w:sz w:val="21"/>
+                <w:szCs w:val="21"/>
+              </w:rPr>
+              <w:t xml:space="preserve">→</w:t>
+            </w:r>
+            <w:r>
+              <w:tab/>
+            </w:r>
+            <w:r>
+              <w:rPr>
+                <w:b/>
+                <w:bCs/>
+                <w:sz w:val="21"/>
+                <w:szCs w:val="21"/>
+              </w:rPr>
+              <w:t xml:space="preserve">Security:</w:t>
+            </w:r>
+            <w:r>
+              <w:rPr>
+                <w:sz w:val="21"/>
+                <w:szCs w:val="21"/>
+              </w:rPr>
+              <w:t xml:space="preserve"> open border, Siliguri Corridor, buffer with China</w:t>
+            </w:r>
+          </w:p>
+          <w:p>
+            <w:pPr>
+              <w:tabs>
+                <w:tab w:val="left" w:pos="260"/>
+              </w:tabs>
+              <w:spacing w:after="0" w:before="40" w:line="280"/>
+              <w:ind w:left="260" w:hanging="260"/>
+            </w:pPr>
+            <w:r>
+              <w:rPr>
+                <w:b/>
+                <w:bCs/>
+                <w:color w:val="C00000"/>
+                <w:sz w:val="21"/>
+                <w:szCs w:val="21"/>
+              </w:rPr>
+              <w:t xml:space="preserve">→</w:t>
+            </w:r>
+            <w:r>
+              <w:tab/>
+            </w:r>
+            <w:r>
+              <w:rPr>
+                <w:b/>
+                <w:bCs/>
+                <w:sz w:val="21"/>
+                <w:szCs w:val="21"/>
+              </w:rPr>
+              <w:t xml:space="preserve">Strategic:</w:t>
+            </w:r>
+            <w:r>
+              <w:rPr>
+                <w:sz w:val="21"/>
+                <w:szCs w:val="21"/>
+              </w:rPr>
+              <w:t xml:space="preserve"> counters Chinese influence in the Himalayas</w:t>
+            </w:r>
+          </w:p>
+          <w:p>
+            <w:pPr>
+              <w:tabs>
+                <w:tab w:val="left" w:pos="260"/>
+              </w:tabs>
+              <w:spacing w:after="0" w:before="40" w:line="280"/>
+              <w:ind w:left="260" w:hanging="260"/>
+            </w:pPr>
+            <w:r>
+              <w:rPr>
+                <w:b/>
+                <w:bCs/>
+                <w:color w:val="C00000"/>
+                <w:sz w:val="21"/>
+                <w:szCs w:val="21"/>
+              </w:rPr>
+              <w:t xml:space="preserve">→</w:t>
+            </w:r>
+            <w:r>
+              <w:tab/>
+            </w:r>
+            <w:r>
+              <w:rPr>
+                <w:b/>
+                <w:bCs/>
+                <w:sz w:val="21"/>
+                <w:szCs w:val="21"/>
+              </w:rPr>
+              <w:t xml:space="preserve">Economic:</w:t>
+            </w:r>
+            <w:r>
+              <w:rPr>
+                <w:sz w:val="21"/>
+                <w:szCs w:val="21"/>
+              </w:rPr>
+              <w:t xml:space="preserve"> hydropower, trade, remittances</w:t>
+            </w:r>
+          </w:p>
+          <w:p>
+            <w:pPr>
+              <w:tabs>
+                <w:tab w:val="left" w:pos="260"/>
+              </w:tabs>
+              <w:spacing w:after="0" w:before="40" w:line="280"/>
+              <w:ind w:left="260" w:hanging="260"/>
+            </w:pPr>
+            <w:r>
+              <w:rPr>
+                <w:b/>
+                <w:bCs/>
+                <w:color w:val="C00000"/>
+                <w:sz w:val="21"/>
+                <w:szCs w:val="21"/>
+              </w:rPr>
+              <w:t xml:space="preserve">→</w:t>
+            </w:r>
+            <w:r>
+              <w:tab/>
+            </w:r>
+            <w:r>
+              <w:rPr>
+                <w:b/>
+                <w:bCs/>
+                <w:sz w:val="21"/>
+                <w:szCs w:val="21"/>
+              </w:rPr>
+              <w:t xml:space="preserve">Cultural:</w:t>
+            </w:r>
+            <w:r>
+              <w:rPr>
+                <w:sz w:val="21"/>
+                <w:szCs w:val="21"/>
+              </w:rPr>
+              <w:t xml:space="preserve"> Janakpur–Ayodhya, Lumbini, Pashupatinath</w:t>
+            </w:r>
+          </w:p>
+          <w:p>
+            <w:pPr>
+              <w:tabs>
+                <w:tab w:val="left" w:pos="260"/>
+              </w:tabs>
+              <w:spacing w:after="0" w:before="40" w:line="280"/>
+              <w:ind w:left="260" w:hanging="260"/>
+            </w:pPr>
+            <w:r>
+              <w:rPr>
+                <w:b/>
+                <w:bCs/>
+                <w:color w:val="C00000"/>
+                <w:sz w:val="21"/>
+                <w:szCs w:val="21"/>
+              </w:rPr>
+              <w:t xml:space="preserve">→</w:t>
+            </w:r>
+            <w:r>
+              <w:tab/>
+            </w:r>
+            <w:r>
+              <w:rPr>
+                <w:b/>
+                <w:bCs/>
+                <w:sz w:val="21"/>
+                <w:szCs w:val="21"/>
+              </w:rPr>
+              <w:t xml:space="preserve">Neighbourhood First:</w:t>
+            </w:r>
+            <w:r>
+              <w:rPr>
+                <w:sz w:val="21"/>
+                <w:szCs w:val="21"/>
+              </w:rPr>
+              <w:t xml:space="preserve"> a test case for India's regional diplomacy</w:t>
+            </w:r>
+          </w:p>
+        </w:tc>
+      </w:tr>
+      <w:tr>
+        <w:trPr>
+          <w:cantSplit/>
+        </w:trPr>
+        <w:tc>
+          <w:tcPr>
+            <w:tcW w:type="dxa" w:w="520"/>
+            <w:tcBorders>
+              <w:top w:val="single" w:color="BFBFBF" w:sz="4"/>
+              <w:left w:val="single" w:color="BFBFBF" w:sz="4"/>
+              <w:bottom w:val="single" w:color="BFBFBF" w:sz="4"/>
+              <w:right w:val="single" w:color="BFBFBF" w:sz="4"/>
+            </w:tcBorders>
+            <w:tcMar>
+              <w:top w:type="dxa" w:w="70"/>
+              <w:left w:type="dxa" w:w="100"/>
+              <w:bottom w:type="dxa" w:w="70"/>
+              <w:right w:type="dxa" w:w="100"/>
+            </w:tcMar>
+            <w:vAlign w:val="center"/>
+          </w:tcPr>
+          <w:p>
+            <w:pPr>
+              <w:spacing w:after="0" w:before="0" w:line="300"/>
+              <w:jc w:val="center"/>
+            </w:pPr>
+            <w:r>
+              <w:rPr>
+                <w:color w:val="7F7F7F"/>
+                <w:sz w:val="21"/>
+                <w:szCs w:val="21"/>
+              </w:rPr>
+              <w:t xml:space="preserve">3</w:t>
+            </w:r>
+          </w:p>
+        </w:tc>
+        <w:tc>
+          <w:tcPr>
+            <w:tcW w:type="dxa" w:w="2200"/>
+            <w:tcBorders>
+              <w:top w:val="single" w:color="BFBFBF" w:sz="4"/>
+              <w:left w:val="single" w:color="BFBFBF" w:sz="4"/>
+              <w:bottom w:val="single" w:color="BFBFBF" w:sz="4"/>
+              <w:right w:val="single" w:color="BFBFBF" w:sz="4"/>
+            </w:tcBorders>
+            <w:tcMar>
+              <w:top w:type="dxa" w:w="70"/>
+              <w:left w:type="dxa" w:w="100"/>
+              <w:bottom w:type="dxa" w:w="70"/>
+              <w:right w:type="dxa" w:w="100"/>
+            </w:tcMar>
+            <w:vAlign w:val="center"/>
+          </w:tcPr>
+          <w:p>
+            <w:pPr>
+              <w:spacing w:after="0" w:before="0" w:line="300"/>
+            </w:pPr>
+            <w:r>
+              <w:rPr>
+                <w:b/>
+                <w:bCs/>
+                <w:color w:val="1F3864"/>
+                <w:sz w:val="21"/>
+                <w:szCs w:val="21"/>
+              </w:rPr>
+              <w:t xml:space="preserve">Current status (Sept 2026)</w:t>
+            </w:r>
+          </w:p>
+        </w:tc>
+        <w:tc>
+          <w:tcPr>
+            <w:tcW w:type="dxa" w:w="7986"/>
+            <w:tcBorders>
+              <w:top w:val="single" w:color="BFBFBF" w:sz="4"/>
+              <w:left w:val="single" w:color="BFBFBF" w:sz="4"/>
+              <w:bottom w:val="single" w:color="BFBFBF" w:sz="4"/>
+              <w:right w:val="single" w:color="BFBFBF" w:sz="4"/>
+            </w:tcBorders>
+            <w:tcMar>
+              <w:top w:type="dxa" w:w="70"/>
+              <w:left w:type="dxa" w:w="100"/>
+              <w:bottom w:type="dxa" w:w="70"/>
+              <w:right w:type="dxa" w:w="100"/>
+            </w:tcMar>
+            <w:vAlign w:val="center"/>
+          </w:tcPr>
+          <w:p>
+            <w:pPr>
+              <w:tabs>
+                <w:tab w:val="left" w:pos="260"/>
+              </w:tabs>
+              <w:spacing w:after="0" w:before="0" w:line="280"/>
+              <w:ind w:left="260" w:hanging="260"/>
+            </w:pPr>
+            <w:r>
+              <w:rPr>
+                <w:b/>
+                <w:bCs/>
+                <w:color w:val="C00000"/>
+                <w:sz w:val="21"/>
+                <w:szCs w:val="21"/>
+              </w:rPr>
+              <w:t xml:space="preserve">→</w:t>
+            </w:r>
+            <w:r>
+              <w:tab/>
+            </w:r>
+            <w:r>
+              <w:rPr>
+                <w:b/>
+                <w:bCs/>
+                <w:sz w:val="21"/>
+                <w:szCs w:val="21"/>
+              </w:rPr>
+              <w:t xml:space="preserve">Political change:</w:t>
+            </w:r>
+            <w:r>
+              <w:rPr>
+                <w:sz w:val="21"/>
+                <w:szCs w:val="21"/>
+              </w:rPr>
+              <w:t xml:space="preserve"> Gen Z protests forced PM Oli out; Balendra Shah (RSP) government took office (27 Mar 2026)</w:t>
+            </w:r>
+          </w:p>
+          <w:p>
+            <w:pPr>
+              <w:tabs>
+                <w:tab w:val="left" w:pos="260"/>
+              </w:tabs>
+              <w:spacing w:after="0" w:before="40" w:line="280"/>
+              <w:ind w:left="260" w:hanging="260"/>
+            </w:pPr>
+            <w:r>
+              <w:rPr>
+                <w:b/>
+                <w:bCs/>
+                <w:color w:val="C00000"/>
+                <w:sz w:val="21"/>
+                <w:szCs w:val="21"/>
+              </w:rPr>
+              <w:t xml:space="preserve">→</w:t>
+            </w:r>
+            <w:r>
+              <w:tab/>
+            </w:r>
+            <w:r>
+              <w:rPr>
+                <w:b/>
+                <w:bCs/>
+                <w:sz w:val="21"/>
+                <w:szCs w:val="21"/>
+              </w:rPr>
+              <w:t xml:space="preserve">Lipulekh:</w:t>
+            </w:r>
+            <w:r>
+              <w:rPr>
+                <w:sz w:val="21"/>
+                <w:szCs w:val="21"/>
+              </w:rPr>
+              <w:t xml:space="preserve"> Nepal objected to its use for the Kailash Mansarovar Yatra (3 May 2026); India says it is bilateral, no third-party role; Boundary Working Group doing field work</w:t>
+            </w:r>
+          </w:p>
+          <w:p>
+            <w:pPr>
+              <w:tabs>
+                <w:tab w:val="left" w:pos="260"/>
+              </w:tabs>
+              <w:spacing w:after="0" w:before="40" w:line="280"/>
+              <w:ind w:left="260" w:hanging="260"/>
+            </w:pPr>
+            <w:r>
+              <w:rPr>
+                <w:b/>
+                <w:bCs/>
+                <w:color w:val="C00000"/>
+                <w:sz w:val="21"/>
+                <w:szCs w:val="21"/>
+              </w:rPr>
+              <w:t xml:space="preserve">→</w:t>
+            </w:r>
+            <w:r>
+              <w:tab/>
+            </w:r>
+            <w:r>
+              <w:rPr>
+                <w:b/>
+                <w:bCs/>
+                <w:sz w:val="21"/>
+                <w:szCs w:val="21"/>
+              </w:rPr>
+              <w:t xml:space="preserve">Engagement:</w:t>
+            </w:r>
+            <w:r>
+              <w:rPr>
+                <w:sz w:val="21"/>
+                <w:szCs w:val="21"/>
+              </w:rPr>
+              <w:t xml:space="preserve"> Lamichhane met Modi (3 Jun); FM Shisir Khanal visited India (5–7 Jun); Jaishankar met FM Swarnim Wagle (18 Sep) on economy, energy, connectivity and a "reset"</w:t>
+            </w:r>
+          </w:p>
+          <w:p>
+            <w:pPr>
+              <w:tabs>
+                <w:tab w:val="left" w:pos="260"/>
+              </w:tabs>
+              <w:spacing w:after="0" w:before="40" w:line="280"/>
+              <w:ind w:left="260" w:hanging="260"/>
+            </w:pPr>
+            <w:r>
+              <w:rPr>
+                <w:b/>
+                <w:bCs/>
+                <w:color w:val="C00000"/>
+                <w:sz w:val="21"/>
+                <w:szCs w:val="21"/>
+              </w:rPr>
+              <w:t xml:space="preserve">→</w:t>
+            </w:r>
+            <w:r>
+              <w:tab/>
+            </w:r>
+            <w:r>
+              <w:rPr>
+                <w:b/>
+                <w:bCs/>
+                <w:sz w:val="21"/>
+                <w:szCs w:val="21"/>
+              </w:rPr>
+              <w:t xml:space="preserve">Digital and power:</w:t>
+            </w:r>
+            <w:r>
+              <w:rPr>
+                <w:sz w:val="21"/>
+                <w:szCs w:val="21"/>
+              </w:rPr>
+              <w:t xml:space="preserve"> UPI–NPI remittance link (Jun 2026); Nepal importing 1,154 MW from India</w:t>
+            </w:r>
+          </w:p>
+          <w:p>
+            <w:pPr>
+              <w:tabs>
+                <w:tab w:val="left" w:pos="260"/>
+              </w:tabs>
+              <w:spacing w:after="0" w:before="40" w:line="280"/>
+              <w:ind w:left="260" w:hanging="260"/>
+            </w:pPr>
+            <w:r>
+              <w:rPr>
+                <w:b/>
+                <w:bCs/>
+                <w:color w:val="C00000"/>
+                <w:sz w:val="21"/>
+                <w:szCs w:val="21"/>
+              </w:rPr>
+              <w:t xml:space="preserve">→</w:t>
+            </w:r>
+            <w:r>
+              <w:tab/>
+            </w:r>
+            <w:r>
+              <w:rPr>
+                <w:b/>
+                <w:bCs/>
+                <w:sz w:val="21"/>
+                <w:szCs w:val="21"/>
+              </w:rPr>
+              <w:t xml:space="preserve">Tone:</w:t>
+            </w:r>
+            <w:r>
+              <w:rPr>
+                <w:sz w:val="21"/>
+                <w:szCs w:val="21"/>
+              </w:rPr>
+              <w:t xml:space="preserve"> PM Shah calls ties harmonious and strong (29 Sep 2026)</w:t>
+            </w:r>
+          </w:p>
+        </w:tc>
+      </w:tr>
+      <w:tr>
+        <w:trPr>
+          <w:cantSplit/>
+        </w:trPr>
+        <w:tc>
+          <w:tcPr>
+            <w:tcW w:type="dxa" w:w="520"/>
+            <w:tcBorders>
+              <w:top w:val="single" w:color="BFBFBF" w:sz="4"/>
+              <w:left w:val="single" w:color="BFBFBF" w:sz="4"/>
+              <w:bottom w:val="single" w:color="BFBFBF" w:sz="4"/>
+              <w:right w:val="single" w:color="BFBFBF" w:sz="4"/>
+            </w:tcBorders>
+            <w:shd w:fill="F5F7FB" w:color="auto" w:val="clear"/>
+            <w:tcMar>
+              <w:top w:type="dxa" w:w="70"/>
+              <w:left w:type="dxa" w:w="100"/>
+              <w:bottom w:type="dxa" w:w="70"/>
+              <w:right w:type="dxa" w:w="100"/>
+            </w:tcMar>
+            <w:vAlign w:val="center"/>
+          </w:tcPr>
+          <w:p>
+            <w:pPr>
+              <w:spacing w:after="0" w:before="0" w:line="300"/>
+              <w:jc w:val="center"/>
+            </w:pPr>
+            <w:r>
+              <w:rPr>
+                <w:color w:val="7F7F7F"/>
+                <w:sz w:val="21"/>
+                <w:szCs w:val="21"/>
+              </w:rPr>
+              <w:t xml:space="preserve">4</w:t>
+            </w:r>
+          </w:p>
+        </w:tc>
+        <w:tc>
+          <w:tcPr>
+            <w:tcW w:type="dxa" w:w="2200"/>
+            <w:tcBorders>
+              <w:top w:val="single" w:color="BFBFBF" w:sz="4"/>
+              <w:left w:val="single" w:color="BFBFBF" w:sz="4"/>
+              <w:bottom w:val="single" w:color="BFBFBF" w:sz="4"/>
+              <w:right w:val="single" w:color="BFBFBF" w:sz="4"/>
+            </w:tcBorders>
+            <w:shd w:fill="F5F7FB" w:color="auto" w:val="clear"/>
+            <w:tcMar>
+              <w:top w:type="dxa" w:w="70"/>
+              <w:left w:type="dxa" w:w="100"/>
+              <w:bottom w:type="dxa" w:w="70"/>
+              <w:right w:type="dxa" w:w="100"/>
+            </w:tcMar>
+            <w:vAlign w:val="center"/>
+          </w:tcPr>
+          <w:p>
+            <w:pPr>
+              <w:spacing w:after="0" w:before="0" w:line="300"/>
+            </w:pPr>
+            <w:r>
+              <w:rPr>
+                <w:b/>
+                <w:bCs/>
+                <w:color w:val="1F3864"/>
+                <w:sz w:val="21"/>
+                <w:szCs w:val="21"/>
+              </w:rPr>
+              <w:t xml:space="preserve">Problems</w:t>
+            </w:r>
+          </w:p>
+        </w:tc>
+        <w:tc>
+          <w:tcPr>
+            <w:tcW w:type="dxa" w:w="7986"/>
+            <w:tcBorders>
+              <w:top w:val="single" w:color="BFBFBF" w:sz="4"/>
+              <w:left w:val="single" w:color="BFBFBF" w:sz="4"/>
+              <w:bottom w:val="single" w:color="BFBFBF" w:sz="4"/>
+              <w:right w:val="single" w:color="BFBFBF" w:sz="4"/>
+            </w:tcBorders>
+            <w:shd w:fill="F5F7FB" w:color="auto" w:val="clear"/>
+            <w:tcMar>
+              <w:top w:type="dxa" w:w="70"/>
+              <w:left w:type="dxa" w:w="100"/>
+              <w:bottom w:type="dxa" w:w="70"/>
+              <w:right w:type="dxa" w:w="100"/>
+            </w:tcMar>
+            <w:vAlign w:val="center"/>
+          </w:tcPr>
+          <w:p>
+            <w:pPr>
+              <w:tabs>
+                <w:tab w:val="left" w:pos="260"/>
+              </w:tabs>
+              <w:spacing w:after="0" w:before="0" w:line="280"/>
+              <w:ind w:left="260" w:hanging="260"/>
+            </w:pPr>
+            <w:r>
+              <w:rPr>
+                <w:b/>
+                <w:bCs/>
+                <w:color w:val="C00000"/>
+                <w:sz w:val="21"/>
+                <w:szCs w:val="21"/>
+              </w:rPr>
+              <w:t xml:space="preserve">→</w:t>
+            </w:r>
+            <w:r>
+              <w:tab/>
+            </w:r>
+            <w:r>
+              <w:rPr>
+                <w:sz w:val="21"/>
+                <w:szCs w:val="21"/>
+              </w:rPr>
+              <w:t xml:space="preserve">Kalapani–Lipulekh–Limpiyadhura dispute (Treaty of Sugauli, 1816)</w:t>
+            </w:r>
+          </w:p>
+          <w:p>
+            <w:pPr>
+              <w:tabs>
+                <w:tab w:val="left" w:pos="260"/>
+              </w:tabs>
+              <w:spacing w:after="0" w:before="40" w:line="280"/>
+              <w:ind w:left="260" w:hanging="260"/>
+            </w:pPr>
+            <w:r>
+              <w:rPr>
+                <w:b/>
+                <w:bCs/>
+                <w:color w:val="C00000"/>
+                <w:sz w:val="21"/>
+                <w:szCs w:val="21"/>
+              </w:rPr>
+              <w:t xml:space="preserve">→</w:t>
+            </w:r>
+            <w:r>
+              <w:tab/>
+            </w:r>
+            <w:r>
+              <w:rPr>
+                <w:sz w:val="21"/>
+                <w:szCs w:val="21"/>
+              </w:rPr>
+              <w:t xml:space="preserve">Nepal's demand for "sovereign equality" and a revised 1950 Treaty</w:t>
+            </w:r>
+          </w:p>
+          <w:p>
+            <w:pPr>
+              <w:tabs>
+                <w:tab w:val="left" w:pos="260"/>
+              </w:tabs>
+              <w:spacing w:after="0" w:before="40" w:line="280"/>
+              <w:ind w:left="260" w:hanging="260"/>
+            </w:pPr>
+            <w:r>
+              <w:rPr>
+                <w:b/>
+                <w:bCs/>
+                <w:color w:val="C00000"/>
+                <w:sz w:val="21"/>
+                <w:szCs w:val="21"/>
+              </w:rPr>
+              <w:t xml:space="preserve">→</w:t>
+            </w:r>
+            <w:r>
+              <w:tab/>
+            </w:r>
+            <w:r>
+              <w:rPr>
+                <w:sz w:val="21"/>
+                <w:szCs w:val="21"/>
+              </w:rPr>
+              <w:t xml:space="preserve">Agnipath and Gorkha recruitment friction</w:t>
+            </w:r>
+          </w:p>
+          <w:p>
+            <w:pPr>
+              <w:tabs>
+                <w:tab w:val="left" w:pos="260"/>
+              </w:tabs>
+              <w:spacing w:after="0" w:before="40" w:line="280"/>
+              <w:ind w:left="260" w:hanging="260"/>
+            </w:pPr>
+            <w:r>
+              <w:rPr>
+                <w:b/>
+                <w:bCs/>
+                <w:color w:val="C00000"/>
+                <w:sz w:val="21"/>
+                <w:szCs w:val="21"/>
+              </w:rPr>
+              <w:t xml:space="preserve">→</w:t>
+            </w:r>
+            <w:r>
+              <w:tab/>
+            </w:r>
+            <w:r>
+              <w:rPr>
+                <w:sz w:val="21"/>
+                <w:szCs w:val="21"/>
+              </w:rPr>
+              <w:t xml:space="preserve">China's growing role (BRI, grants, projects)</w:t>
+            </w:r>
+          </w:p>
+          <w:p>
+            <w:pPr>
+              <w:tabs>
+                <w:tab w:val="left" w:pos="260"/>
+              </w:tabs>
+              <w:spacing w:after="0" w:before="40" w:line="280"/>
+              <w:ind w:left="260" w:hanging="260"/>
+            </w:pPr>
+            <w:r>
+              <w:rPr>
+                <w:b/>
+                <w:bCs/>
+                <w:color w:val="C00000"/>
+                <w:sz w:val="21"/>
+                <w:szCs w:val="21"/>
+              </w:rPr>
+              <w:t xml:space="preserve">→</w:t>
+            </w:r>
+            <w:r>
+              <w:tab/>
+            </w:r>
+            <w:r>
+              <w:rPr>
+                <w:sz w:val="21"/>
+                <w:szCs w:val="21"/>
+              </w:rPr>
+              <w:t xml:space="preserve">Anti-India "big brother" narrative in Nepali politics</w:t>
+            </w:r>
+          </w:p>
+          <w:p>
+            <w:pPr>
+              <w:tabs>
+                <w:tab w:val="left" w:pos="260"/>
+              </w:tabs>
+              <w:spacing w:after="0" w:before="40" w:line="280"/>
+              <w:ind w:left="260" w:hanging="260"/>
+            </w:pPr>
+            <w:r>
+              <w:rPr>
+                <w:b/>
+                <w:bCs/>
+                <w:color w:val="C00000"/>
+                <w:sz w:val="21"/>
+                <w:szCs w:val="21"/>
+              </w:rPr>
+              <w:t xml:space="preserve">→</w:t>
+            </w:r>
+            <w:r>
+              <w:tab/>
+            </w:r>
+            <w:r>
+              <w:rPr>
+                <w:b/>
+                <w:bCs/>
+                <w:sz w:val="21"/>
+                <w:szCs w:val="21"/>
+              </w:rPr>
+              <w:t xml:space="preserve">Open-border security:</w:t>
+            </w:r>
+            <w:r>
+              <w:rPr>
+                <w:sz w:val="21"/>
+                <w:szCs w:val="21"/>
+              </w:rPr>
+              <w:t xml:space="preserve"> smuggling, trafficking, fake currency</w:t>
+            </w:r>
+          </w:p>
+          <w:p>
+            <w:pPr>
+              <w:tabs>
+                <w:tab w:val="left" w:pos="260"/>
+              </w:tabs>
+              <w:spacing w:after="0" w:before="40" w:line="280"/>
+              <w:ind w:left="260" w:hanging="260"/>
+            </w:pPr>
+            <w:r>
+              <w:rPr>
+                <w:b/>
+                <w:bCs/>
+                <w:color w:val="C00000"/>
+                <w:sz w:val="21"/>
+                <w:szCs w:val="21"/>
+              </w:rPr>
+              <w:t xml:space="preserve">→</w:t>
+            </w:r>
+            <w:r>
+              <w:tab/>
+            </w:r>
+            <w:r>
+              <w:rPr>
+                <w:b/>
+                <w:bCs/>
+                <w:sz w:val="21"/>
+                <w:szCs w:val="21"/>
+              </w:rPr>
+              <w:t xml:space="preserve">Water:</w:t>
+            </w:r>
+            <w:r>
+              <w:rPr>
+                <w:sz w:val="21"/>
+                <w:szCs w:val="21"/>
+              </w:rPr>
+              <w:t xml:space="preserve"> Kosi floods, hydropower sharing</w:t>
+            </w:r>
+          </w:p>
+          <w:p>
+            <w:pPr>
+              <w:tabs>
+                <w:tab w:val="left" w:pos="260"/>
+              </w:tabs>
+              <w:spacing w:after="0" w:before="40" w:line="280"/>
+              <w:ind w:left="260" w:hanging="260"/>
+            </w:pPr>
+            <w:r>
+              <w:rPr>
+                <w:b/>
+                <w:bCs/>
+                <w:color w:val="C00000"/>
+                <w:sz w:val="21"/>
+                <w:szCs w:val="21"/>
+              </w:rPr>
+              <w:t xml:space="preserve">→</w:t>
+            </w:r>
+            <w:r>
+              <w:tab/>
+            </w:r>
+            <w:r>
+              <w:rPr>
+                <w:sz w:val="21"/>
+                <w:szCs w:val="21"/>
+              </w:rPr>
+              <w:t xml:space="preserve">Political instability in Nepal</w:t>
+            </w:r>
+          </w:p>
+        </w:tc>
+      </w:tr>
+      <w:tr>
+        <w:trPr>
+          <w:cantSplit/>
+        </w:trPr>
+        <w:tc>
+          <w:tcPr>
+            <w:tcW w:type="dxa" w:w="520"/>
+            <w:tcBorders>
+              <w:top w:val="single" w:color="BFBFBF" w:sz="4"/>
+              <w:left w:val="single" w:color="BFBFBF" w:sz="4"/>
+              <w:bottom w:val="single" w:color="BFBFBF" w:sz="4"/>
+              <w:right w:val="single" w:color="BFBFBF" w:sz="4"/>
+            </w:tcBorders>
+            <w:tcMar>
+              <w:top w:type="dxa" w:w="70"/>
+              <w:left w:type="dxa" w:w="100"/>
+              <w:bottom w:type="dxa" w:w="70"/>
+              <w:right w:type="dxa" w:w="100"/>
+            </w:tcMar>
+            <w:vAlign w:val="center"/>
+          </w:tcPr>
+          <w:p>
+            <w:pPr>
+              <w:spacing w:after="0" w:before="0" w:line="300"/>
+              <w:jc w:val="center"/>
+            </w:pPr>
+            <w:r>
+              <w:rPr>
+                <w:color w:val="7F7F7F"/>
+                <w:sz w:val="21"/>
+                <w:szCs w:val="21"/>
+              </w:rPr>
+              <w:t xml:space="preserve">5</w:t>
+            </w:r>
+          </w:p>
+        </w:tc>
+        <w:tc>
+          <w:tcPr>
+            <w:tcW w:type="dxa" w:w="2200"/>
+            <w:tcBorders>
+              <w:top w:val="single" w:color="BFBFBF" w:sz="4"/>
+              <w:left w:val="single" w:color="BFBFBF" w:sz="4"/>
+              <w:bottom w:val="single" w:color="BFBFBF" w:sz="4"/>
+              <w:right w:val="single" w:color="BFBFBF" w:sz="4"/>
+            </w:tcBorders>
+            <w:tcMar>
+              <w:top w:type="dxa" w:w="70"/>
+              <w:left w:type="dxa" w:w="100"/>
+              <w:bottom w:type="dxa" w:w="70"/>
+              <w:right w:type="dxa" w:w="100"/>
+            </w:tcMar>
+            <w:vAlign w:val="center"/>
+          </w:tcPr>
+          <w:p>
+            <w:pPr>
+              <w:spacing w:after="0" w:before="0" w:line="300"/>
+            </w:pPr>
+            <w:r>
+              <w:rPr>
+                <w:b/>
+                <w:bCs/>
+                <w:color w:val="1F3864"/>
+                <w:sz w:val="21"/>
+                <w:szCs w:val="21"/>
+              </w:rPr>
+              <w:t xml:space="preserve">Solutions</w:t>
+            </w:r>
+          </w:p>
+        </w:tc>
+        <w:tc>
+          <w:tcPr>
+            <w:tcW w:type="dxa" w:w="7986"/>
+            <w:tcBorders>
+              <w:top w:val="single" w:color="BFBFBF" w:sz="4"/>
+              <w:left w:val="single" w:color="BFBFBF" w:sz="4"/>
+              <w:bottom w:val="single" w:color="BFBFBF" w:sz="4"/>
+              <w:right w:val="single" w:color="BFBFBF" w:sz="4"/>
+            </w:tcBorders>
+            <w:tcMar>
+              <w:top w:type="dxa" w:w="70"/>
+              <w:left w:type="dxa" w:w="100"/>
+              <w:bottom w:type="dxa" w:w="70"/>
+              <w:right w:type="dxa" w:w="100"/>
+            </w:tcMar>
+            <w:vAlign w:val="center"/>
+          </w:tcPr>
+          <w:p>
+            <w:pPr>
+              <w:tabs>
+                <w:tab w:val="left" w:pos="260"/>
+              </w:tabs>
+              <w:spacing w:after="0" w:before="0" w:line="280"/>
+              <w:ind w:left="260" w:hanging="260"/>
+            </w:pPr>
+            <w:r>
+              <w:rPr>
+                <w:b/>
+                <w:bCs/>
+                <w:color w:val="C00000"/>
+                <w:sz w:val="21"/>
+                <w:szCs w:val="21"/>
+              </w:rPr>
+              <w:t xml:space="preserve">→</w:t>
+            </w:r>
+            <w:r>
+              <w:tab/>
+            </w:r>
+            <w:r>
+              <w:rPr>
+                <w:sz w:val="21"/>
+                <w:szCs w:val="21"/>
+              </w:rPr>
+              <w:t xml:space="preserve">Settle the boundary quietly through the Boundary Working Group, no third party</w:t>
+            </w:r>
+          </w:p>
+          <w:p>
+            <w:pPr>
+              <w:tabs>
+                <w:tab w:val="left" w:pos="260"/>
+              </w:tabs>
+              <w:spacing w:after="0" w:before="40" w:line="280"/>
+              <w:ind w:left="260" w:hanging="260"/>
+            </w:pPr>
+            <w:r>
+              <w:rPr>
+                <w:b/>
+                <w:bCs/>
+                <w:color w:val="C00000"/>
+                <w:sz w:val="21"/>
+                <w:szCs w:val="21"/>
+              </w:rPr>
+              <w:t xml:space="preserve">→</w:t>
+            </w:r>
+            <w:r>
+              <w:tab/>
+            </w:r>
+            <w:r>
+              <w:rPr>
+                <w:sz w:val="21"/>
+                <w:szCs w:val="21"/>
+              </w:rPr>
+              <w:t xml:space="preserve">People-centric diplomacy beyond the political elite</w:t>
+            </w:r>
+          </w:p>
+          <w:p>
+            <w:pPr>
+              <w:tabs>
+                <w:tab w:val="left" w:pos="260"/>
+              </w:tabs>
+              <w:spacing w:after="0" w:before="40" w:line="280"/>
+              <w:ind w:left="260" w:hanging="260"/>
+            </w:pPr>
+            <w:r>
+              <w:rPr>
+                <w:b/>
+                <w:bCs/>
+                <w:color w:val="C00000"/>
+                <w:sz w:val="21"/>
+                <w:szCs w:val="21"/>
+              </w:rPr>
+              <w:t xml:space="preserve">→</w:t>
+            </w:r>
+            <w:r>
+              <w:tab/>
+            </w:r>
+            <w:r>
+              <w:rPr>
+                <w:sz w:val="21"/>
+                <w:szCs w:val="21"/>
+              </w:rPr>
+              <w:t xml:space="preserve">Power trade and hydropower investment (cross-border grids)</w:t>
+            </w:r>
+          </w:p>
+          <w:p>
+            <w:pPr>
+              <w:tabs>
+                <w:tab w:val="left" w:pos="260"/>
+              </w:tabs>
+              <w:spacing w:after="0" w:before="40" w:line="280"/>
+              <w:ind w:left="260" w:hanging="260"/>
+            </w:pPr>
+            <w:r>
+              <w:rPr>
+                <w:b/>
+                <w:bCs/>
+                <w:color w:val="C00000"/>
+                <w:sz w:val="21"/>
+                <w:szCs w:val="21"/>
+              </w:rPr>
+              <w:t xml:space="preserve">→</w:t>
+            </w:r>
+            <w:r>
+              <w:tab/>
+            </w:r>
+            <w:r>
+              <w:rPr>
+                <w:b/>
+                <w:bCs/>
+                <w:sz w:val="21"/>
+                <w:szCs w:val="21"/>
+              </w:rPr>
+              <w:t xml:space="preserve">Connectivity:</w:t>
+            </w:r>
+            <w:r>
+              <w:rPr>
+                <w:sz w:val="21"/>
+                <w:szCs w:val="21"/>
+              </w:rPr>
+              <w:t xml:space="preserve"> rail, roads, integrated check posts, airports</w:t>
+            </w:r>
+          </w:p>
+          <w:p>
+            <w:pPr>
+              <w:tabs>
+                <w:tab w:val="left" w:pos="260"/>
+              </w:tabs>
+              <w:spacing w:after="0" w:before="40" w:line="280"/>
+              <w:ind w:left="260" w:hanging="260"/>
+            </w:pPr>
+            <w:r>
+              <w:rPr>
+                <w:b/>
+                <w:bCs/>
+                <w:color w:val="C00000"/>
+                <w:sz w:val="21"/>
+                <w:szCs w:val="21"/>
+              </w:rPr>
+              <w:t xml:space="preserve">→</w:t>
+            </w:r>
+            <w:r>
+              <w:tab/>
+            </w:r>
+            <w:r>
+              <w:rPr>
+                <w:sz w:val="21"/>
+                <w:szCs w:val="21"/>
+              </w:rPr>
+              <w:t xml:space="preserve">Digital integration (UPI, Bhashini)</w:t>
+            </w:r>
+          </w:p>
+          <w:p>
+            <w:pPr>
+              <w:tabs>
+                <w:tab w:val="left" w:pos="260"/>
+              </w:tabs>
+              <w:spacing w:after="0" w:before="40" w:line="280"/>
+              <w:ind w:left="260" w:hanging="260"/>
+            </w:pPr>
+            <w:r>
+              <w:rPr>
+                <w:b/>
+                <w:bCs/>
+                <w:color w:val="C00000"/>
+                <w:sz w:val="21"/>
+                <w:szCs w:val="21"/>
+              </w:rPr>
+              <w:t xml:space="preserve">→</w:t>
+            </w:r>
+            <w:r>
+              <w:tab/>
+            </w:r>
+            <w:r>
+              <w:rPr>
+                <w:sz w:val="21"/>
+                <w:szCs w:val="21"/>
+              </w:rPr>
+              <w:t xml:space="preserve">Disaster cooperation (Operation Maitri-type relief, flood early warning)</w:t>
+            </w:r>
+          </w:p>
+          <w:p>
+            <w:pPr>
+              <w:tabs>
+                <w:tab w:val="left" w:pos="260"/>
+              </w:tabs>
+              <w:spacing w:after="0" w:before="40" w:line="280"/>
+              <w:ind w:left="260" w:hanging="260"/>
+            </w:pPr>
+            <w:r>
+              <w:rPr>
+                <w:b/>
+                <w:bCs/>
+                <w:color w:val="C00000"/>
+                <w:sz w:val="21"/>
+                <w:szCs w:val="21"/>
+              </w:rPr>
+              <w:t xml:space="preserve">→</w:t>
+            </w:r>
+            <w:r>
+              <w:tab/>
+            </w:r>
+            <w:r>
+              <w:rPr>
+                <w:b/>
+                <w:bCs/>
+                <w:sz w:val="21"/>
+                <w:szCs w:val="21"/>
+              </w:rPr>
+              <w:t xml:space="preserve">Agnipath:</w:t>
+            </w:r>
+            <w:r>
+              <w:rPr>
+                <w:sz w:val="21"/>
+                <w:szCs w:val="21"/>
+              </w:rPr>
+              <w:t xml:space="preserve"> recruitment options for Gorkhas</w:t>
+            </w:r>
+          </w:p>
+          <w:p>
+            <w:pPr>
+              <w:tabs>
+                <w:tab w:val="left" w:pos="260"/>
+              </w:tabs>
+              <w:spacing w:after="0" w:before="40" w:line="280"/>
+              <w:ind w:left="260" w:hanging="260"/>
+            </w:pPr>
+            <w:r>
+              <w:rPr>
+                <w:b/>
+                <w:bCs/>
+                <w:color w:val="C00000"/>
+                <w:sz w:val="21"/>
+                <w:szCs w:val="21"/>
+              </w:rPr>
+              <w:t xml:space="preserve">→</w:t>
+            </w:r>
+            <w:r>
+              <w:tab/>
+            </w:r>
+            <w:r>
+              <w:rPr>
+                <w:sz w:val="21"/>
+                <w:szCs w:val="21"/>
+              </w:rPr>
+              <w:t xml:space="preserve">Respect Nepal's sovereignty, avoid heavy-handedness</w:t>
+            </w:r>
+          </w:p>
+        </w:tc>
+      </w:tr>
+      <w:tr>
+        <w:trPr>
+          <w:cantSplit/>
+        </w:trPr>
+        <w:tc>
+          <w:tcPr>
+            <w:tcW w:type="dxa" w:w="520"/>
+            <w:tcBorders>
+              <w:top w:val="single" w:color="BFBFBF" w:sz="4"/>
+              <w:left w:val="single" w:color="BFBFBF" w:sz="4"/>
+              <w:bottom w:val="single" w:color="BFBFBF" w:sz="4"/>
+              <w:right w:val="single" w:color="BFBFBF" w:sz="4"/>
+            </w:tcBorders>
+            <w:shd w:fill="F5F7FB" w:color="auto" w:val="clear"/>
+            <w:tcMar>
+              <w:top w:type="dxa" w:w="70"/>
+              <w:left w:type="dxa" w:w="100"/>
+              <w:bottom w:type="dxa" w:w="70"/>
+              <w:right w:type="dxa" w:w="100"/>
+            </w:tcMar>
+            <w:vAlign w:val="center"/>
+          </w:tcPr>
+          <w:p>
+            <w:pPr>
+              <w:spacing w:after="0" w:before="0" w:line="300"/>
+              <w:jc w:val="center"/>
+            </w:pPr>
+            <w:r>
+              <w:rPr>
+                <w:color w:val="7F7F7F"/>
+                <w:sz w:val="21"/>
+                <w:szCs w:val="21"/>
+              </w:rPr>
+              <w:t xml:space="preserve">6</w:t>
+            </w:r>
+          </w:p>
+        </w:tc>
+        <w:tc>
+          <w:tcPr>
+            <w:tcW w:type="dxa" w:w="2200"/>
+            <w:tcBorders>
+              <w:top w:val="single" w:color="BFBFBF" w:sz="4"/>
+              <w:left w:val="single" w:color="BFBFBF" w:sz="4"/>
+              <w:bottom w:val="single" w:color="BFBFBF" w:sz="4"/>
+              <w:right w:val="single" w:color="BFBFBF" w:sz="4"/>
+            </w:tcBorders>
+            <w:shd w:fill="F5F7FB" w:color="auto" w:val="clear"/>
+            <w:tcMar>
+              <w:top w:type="dxa" w:w="70"/>
+              <w:left w:type="dxa" w:w="100"/>
+              <w:bottom w:type="dxa" w:w="70"/>
+              <w:right w:type="dxa" w:w="100"/>
+            </w:tcMar>
+            <w:vAlign w:val="center"/>
+          </w:tcPr>
+          <w:p>
+            <w:pPr>
+              <w:spacing w:after="0" w:before="0" w:line="300"/>
+            </w:pPr>
+            <w:r>
+              <w:rPr>
+                <w:b/>
+                <w:bCs/>
+                <w:color w:val="1F3864"/>
+                <w:sz w:val="21"/>
+                <w:szCs w:val="21"/>
+              </w:rPr>
+              <w:t xml:space="preserve">Conclusion</w:t>
+            </w:r>
+          </w:p>
+        </w:tc>
+        <w:tc>
+          <w:tcPr>
+            <w:tcW w:type="dxa" w:w="7986"/>
+            <w:tcBorders>
+              <w:top w:val="single" w:color="BFBFBF" w:sz="4"/>
+              <w:left w:val="single" w:color="BFBFBF" w:sz="4"/>
+              <w:bottom w:val="single" w:color="BFBFBF" w:sz="4"/>
+              <w:right w:val="single" w:color="BFBFBF" w:sz="4"/>
+            </w:tcBorders>
+            <w:shd w:fill="F5F7FB" w:color="auto" w:val="clear"/>
+            <w:tcMar>
+              <w:top w:type="dxa" w:w="70"/>
+              <w:left w:type="dxa" w:w="100"/>
+              <w:bottom w:type="dxa" w:w="70"/>
+              <w:right w:type="dxa" w:w="100"/>
+            </w:tcMar>
+            <w:vAlign w:val="center"/>
+          </w:tcPr>
+          <w:p>
+            <w:pPr>
+              <w:tabs>
+                <w:tab w:val="left" w:pos="260"/>
+              </w:tabs>
+              <w:spacing w:after="0" w:before="0" w:line="280"/>
+              <w:ind w:left="260" w:hanging="260"/>
+            </w:pPr>
+            <w:r>
+              <w:rPr>
+                <w:b/>
+                <w:bCs/>
+                <w:color w:val="C00000"/>
+                <w:sz w:val="21"/>
+                <w:szCs w:val="21"/>
+              </w:rPr>
+              <w:t xml:space="preserve">→</w:t>
+            </w:r>
+            <w:r>
+              <w:tab/>
+            </w:r>
+            <w:r>
+              <w:rPr>
+                <w:sz w:val="21"/>
+                <w:szCs w:val="21"/>
+              </w:rPr>
+              <w:t xml:space="preserve">Ties are civilisational; borders and governments cannot break them</w:t>
+            </w:r>
+          </w:p>
+          <w:p>
+            <w:pPr>
+              <w:tabs>
+                <w:tab w:val="left" w:pos="260"/>
+              </w:tabs>
+              <w:spacing w:after="0" w:before="40" w:line="280"/>
+              <w:ind w:left="260" w:hanging="260"/>
+            </w:pPr>
+            <w:r>
+              <w:rPr>
+                <w:b/>
+                <w:bCs/>
+                <w:color w:val="C00000"/>
+                <w:sz w:val="21"/>
+                <w:szCs w:val="21"/>
+              </w:rPr>
+              <w:t xml:space="preserve">→</w:t>
+            </w:r>
+            <w:r>
+              <w:tab/>
+            </w:r>
+            <w:r>
+              <w:rPr>
+                <w:sz w:val="21"/>
+                <w:szCs w:val="21"/>
+              </w:rPr>
+              <w:t xml:space="preserve">Treat Nepal as an equal partner, not a sphere of influence</w:t>
+            </w:r>
+          </w:p>
+          <w:p>
+            <w:pPr>
+              <w:tabs>
+                <w:tab w:val="left" w:pos="260"/>
+              </w:tabs>
+              <w:spacing w:after="0" w:before="40" w:line="280"/>
+              <w:ind w:left="260" w:hanging="260"/>
+            </w:pPr>
+            <w:r>
+              <w:rPr>
+                <w:b/>
+                <w:bCs/>
+                <w:color w:val="C00000"/>
+                <w:sz w:val="21"/>
+                <w:szCs w:val="21"/>
+              </w:rPr>
+              <w:t xml:space="preserve">→</w:t>
+            </w:r>
+            <w:r>
+              <w:tab/>
+            </w:r>
+            <w:r>
+              <w:rPr>
+                <w:sz w:val="21"/>
+                <w:szCs w:val="21"/>
+              </w:rPr>
+              <w:t xml:space="preserve">Strong India–Nepal ties anchor stability in the Himalayas and the region</w:t>
             </w:r>
           </w:p>
         </w:tc>

</xml_diff>

<commit_message>
Add India–Bangladesh Relations lecturette
Co-Authored-By: Claude Opus 5.5 <noreply@anthropic.com>
Claude-Session: https://claude.ai/code/session_01EyrV2JLtXrELkAF97b5fch
</commit_message>
<xml_diff>
--- a/SSB_Lecturettes.docx
+++ b/SSB_Lecturettes.docx
@@ -6933,6 +6933,1799 @@
                 <w:szCs w:val="21"/>
               </w:rPr>
               <w:t xml:space="preserve">Strong India–Nepal ties anchor stability in the Himalayas and the region</w:t>
+            </w:r>
+          </w:p>
+        </w:tc>
+      </w:tr>
+    </w:tbl>
+    <w:p>
+      <w:pPr>
+        <w:pStyle w:val="Heading1"/>
+        <w:pageBreakBefore/>
+        <w:shd w:fill="1F3864" w:color="auto" w:val="clear"/>
+        <w:spacing w:after="160" w:before="0"/>
+        <w:ind w:left="100" w:right="100"/>
+      </w:pPr>
+      <w:r>
+        <w:t xml:space="preserve">Topic 5: India–Bangladesh Relations</w:t>
+      </w:r>
+    </w:p>
+    <w:tbl>
+      <w:tblPr>
+        <w:tblW w:type="dxa" w:w="10706"/>
+        <w:tblBorders>
+          <w:top w:val="single" w:color="auto" w:sz="4"/>
+          <w:left w:val="single" w:color="auto" w:sz="4"/>
+          <w:bottom w:val="single" w:color="auto" w:sz="4"/>
+          <w:right w:val="single" w:color="auto" w:sz="4"/>
+          <w:insideH w:val="single" w:color="auto" w:sz="4"/>
+          <w:insideV w:val="single" w:color="auto" w:sz="4"/>
+        </w:tblBorders>
+      </w:tblPr>
+      <w:tblGrid>
+        <w:gridCol w:w="520"/>
+        <w:gridCol w:w="2200"/>
+        <w:gridCol w:w="7986"/>
+      </w:tblGrid>
+      <w:tr>
+        <w:trPr>
+          <w:tblHeader/>
+        </w:trPr>
+        <w:tc>
+          <w:tcPr>
+            <w:tcW w:type="dxa" w:w="520"/>
+            <w:tcBorders>
+              <w:top w:val="single" w:color="BFBFBF" w:sz="4"/>
+              <w:left w:val="single" w:color="BFBFBF" w:sz="4"/>
+              <w:bottom w:val="single" w:color="BFBFBF" w:sz="4"/>
+              <w:right w:val="single" w:color="BFBFBF" w:sz="4"/>
+            </w:tcBorders>
+            <w:shd w:fill="DCE3F0" w:color="auto" w:val="clear"/>
+            <w:tcMar>
+              <w:top w:type="dxa" w:w="70"/>
+              <w:left w:type="dxa" w:w="100"/>
+              <w:bottom w:type="dxa" w:w="70"/>
+              <w:right w:type="dxa" w:w="100"/>
+            </w:tcMar>
+            <w:vAlign w:val="center"/>
+          </w:tcPr>
+          <w:p>
+            <w:pPr>
+              <w:spacing w:after="0" w:before="0" w:line="300"/>
+              <w:jc w:val="center"/>
+            </w:pPr>
+            <w:r>
+              <w:rPr>
+                <w:b/>
+                <w:bCs/>
+                <w:sz w:val="21"/>
+                <w:szCs w:val="21"/>
+              </w:rPr>
+              <w:t xml:space="preserve">#</w:t>
+            </w:r>
+          </w:p>
+        </w:tc>
+        <w:tc>
+          <w:tcPr>
+            <w:tcW w:type="dxa" w:w="2200"/>
+            <w:tcBorders>
+              <w:top w:val="single" w:color="BFBFBF" w:sz="4"/>
+              <w:left w:val="single" w:color="BFBFBF" w:sz="4"/>
+              <w:bottom w:val="single" w:color="BFBFBF" w:sz="4"/>
+              <w:right w:val="single" w:color="BFBFBF" w:sz="4"/>
+            </w:tcBorders>
+            <w:shd w:fill="DCE3F0" w:color="auto" w:val="clear"/>
+            <w:tcMar>
+              <w:top w:type="dxa" w:w="70"/>
+              <w:left w:type="dxa" w:w="100"/>
+              <w:bottom w:type="dxa" w:w="70"/>
+              <w:right w:type="dxa" w:w="100"/>
+            </w:tcMar>
+            <w:vAlign w:val="center"/>
+          </w:tcPr>
+          <w:p>
+            <w:pPr>
+              <w:spacing w:after="0" w:before="0" w:line="300"/>
+            </w:pPr>
+            <w:r>
+              <w:rPr>
+                <w:b/>
+                <w:bCs/>
+                <w:sz w:val="21"/>
+                <w:szCs w:val="21"/>
+              </w:rPr>
+              <w:t xml:space="preserve">Stage</w:t>
+            </w:r>
+          </w:p>
+        </w:tc>
+        <w:tc>
+          <w:tcPr>
+            <w:tcW w:type="dxa" w:w="7986"/>
+            <w:tcBorders>
+              <w:top w:val="single" w:color="BFBFBF" w:sz="4"/>
+              <w:left w:val="single" w:color="BFBFBF" w:sz="4"/>
+              <w:bottom w:val="single" w:color="BFBFBF" w:sz="4"/>
+              <w:right w:val="single" w:color="BFBFBF" w:sz="4"/>
+            </w:tcBorders>
+            <w:shd w:fill="DCE3F0" w:color="auto" w:val="clear"/>
+            <w:tcMar>
+              <w:top w:type="dxa" w:w="70"/>
+              <w:left w:type="dxa" w:w="100"/>
+              <w:bottom w:type="dxa" w:w="70"/>
+              <w:right w:type="dxa" w:w="100"/>
+            </w:tcMar>
+            <w:vAlign w:val="center"/>
+          </w:tcPr>
+          <w:p>
+            <w:pPr>
+              <w:spacing w:after="0" w:before="0" w:line="300"/>
+            </w:pPr>
+            <w:r>
+              <w:rPr>
+                <w:b/>
+                <w:bCs/>
+                <w:sz w:val="21"/>
+                <w:szCs w:val="21"/>
+              </w:rPr>
+              <w:t xml:space="preserve">Flow</w:t>
+            </w:r>
+          </w:p>
+        </w:tc>
+      </w:tr>
+      <w:tr>
+        <w:trPr>
+          <w:cantSplit/>
+        </w:trPr>
+        <w:tc>
+          <w:tcPr>
+            <w:tcW w:type="dxa" w:w="520"/>
+            <w:tcBorders>
+              <w:top w:val="single" w:color="BFBFBF" w:sz="4"/>
+              <w:left w:val="single" w:color="BFBFBF" w:sz="4"/>
+              <w:bottom w:val="single" w:color="BFBFBF" w:sz="4"/>
+              <w:right w:val="single" w:color="BFBFBF" w:sz="4"/>
+            </w:tcBorders>
+            <w:tcMar>
+              <w:top w:type="dxa" w:w="70"/>
+              <w:left w:type="dxa" w:w="100"/>
+              <w:bottom w:type="dxa" w:w="70"/>
+              <w:right w:type="dxa" w:w="100"/>
+            </w:tcMar>
+            <w:vAlign w:val="center"/>
+          </w:tcPr>
+          <w:p>
+            <w:pPr>
+              <w:spacing w:after="0" w:before="0" w:line="300"/>
+              <w:jc w:val="center"/>
+            </w:pPr>
+            <w:r>
+              <w:rPr>
+                <w:color w:val="7F7F7F"/>
+                <w:sz w:val="21"/>
+                <w:szCs w:val="21"/>
+              </w:rPr>
+              <w:t xml:space="preserve">1</w:t>
+            </w:r>
+          </w:p>
+        </w:tc>
+        <w:tc>
+          <w:tcPr>
+            <w:tcW w:type="dxa" w:w="2200"/>
+            <w:tcBorders>
+              <w:top w:val="single" w:color="BFBFBF" w:sz="4"/>
+              <w:left w:val="single" w:color="BFBFBF" w:sz="4"/>
+              <w:bottom w:val="single" w:color="BFBFBF" w:sz="4"/>
+              <w:right w:val="single" w:color="BFBFBF" w:sz="4"/>
+            </w:tcBorders>
+            <w:tcMar>
+              <w:top w:type="dxa" w:w="70"/>
+              <w:left w:type="dxa" w:w="100"/>
+              <w:bottom w:type="dxa" w:w="70"/>
+              <w:right w:type="dxa" w:w="100"/>
+            </w:tcMar>
+            <w:vAlign w:val="center"/>
+          </w:tcPr>
+          <w:p>
+            <w:pPr>
+              <w:spacing w:after="0" w:before="0" w:line="300"/>
+            </w:pPr>
+            <w:r>
+              <w:rPr>
+                <w:b/>
+                <w:bCs/>
+                <w:color w:val="1F3864"/>
+                <w:sz w:val="21"/>
+                <w:szCs w:val="21"/>
+              </w:rPr>
+              <w:t xml:space="preserve">What is it</w:t>
+            </w:r>
+          </w:p>
+        </w:tc>
+        <w:tc>
+          <w:tcPr>
+            <w:tcW w:type="dxa" w:w="7986"/>
+            <w:tcBorders>
+              <w:top w:val="single" w:color="BFBFBF" w:sz="4"/>
+              <w:left w:val="single" w:color="BFBFBF" w:sz="4"/>
+              <w:bottom w:val="single" w:color="BFBFBF" w:sz="4"/>
+              <w:right w:val="single" w:color="BFBFBF" w:sz="4"/>
+            </w:tcBorders>
+            <w:tcMar>
+              <w:top w:type="dxa" w:w="70"/>
+              <w:left w:type="dxa" w:w="100"/>
+              <w:bottom w:type="dxa" w:w="70"/>
+              <w:right w:type="dxa" w:w="100"/>
+            </w:tcMar>
+            <w:vAlign w:val="center"/>
+          </w:tcPr>
+          <w:p>
+            <w:pPr>
+              <w:tabs>
+                <w:tab w:val="left" w:pos="260"/>
+              </w:tabs>
+              <w:spacing w:after="0" w:before="0" w:line="280"/>
+              <w:ind w:left="260" w:hanging="260"/>
+            </w:pPr>
+            <w:r>
+              <w:rPr>
+                <w:b/>
+                <w:bCs/>
+                <w:color w:val="C00000"/>
+                <w:sz w:val="21"/>
+                <w:szCs w:val="21"/>
+              </w:rPr>
+              <w:t xml:space="preserve">→</w:t>
+            </w:r>
+            <w:r>
+              <w:tab/>
+            </w:r>
+            <w:r>
+              <w:rPr>
+                <w:sz w:val="21"/>
+                <w:szCs w:val="21"/>
+              </w:rPr>
+              <w:t xml:space="preserve">India's closest eastern neighbour; 4,096 km border, India's longest with any neighbour</w:t>
+            </w:r>
+          </w:p>
+          <w:p>
+            <w:pPr>
+              <w:tabs>
+                <w:tab w:val="left" w:pos="260"/>
+              </w:tabs>
+              <w:spacing w:after="0" w:before="40" w:line="280"/>
+              <w:ind w:left="260" w:hanging="260"/>
+            </w:pPr>
+            <w:r>
+              <w:rPr>
+                <w:b/>
+                <w:bCs/>
+                <w:color w:val="C00000"/>
+                <w:sz w:val="21"/>
+                <w:szCs w:val="21"/>
+              </w:rPr>
+              <w:t xml:space="preserve">→</w:t>
+            </w:r>
+            <w:r>
+              <w:tab/>
+            </w:r>
+            <w:r>
+              <w:rPr>
+                <w:sz w:val="21"/>
+                <w:szCs w:val="21"/>
+              </w:rPr>
+              <w:t xml:space="preserve">Born of India's role in the 1971 Liberation War</w:t>
+            </w:r>
+          </w:p>
+          <w:p>
+            <w:pPr>
+              <w:tabs>
+                <w:tab w:val="left" w:pos="260"/>
+              </w:tabs>
+              <w:spacing w:after="0" w:before="40" w:line="280"/>
+              <w:ind w:left="260" w:hanging="260"/>
+            </w:pPr>
+            <w:r>
+              <w:rPr>
+                <w:b/>
+                <w:bCs/>
+                <w:color w:val="C00000"/>
+                <w:sz w:val="21"/>
+                <w:szCs w:val="21"/>
+              </w:rPr>
+              <w:t xml:space="preserve">→</w:t>
+            </w:r>
+            <w:r>
+              <w:tab/>
+            </w:r>
+            <w:r>
+              <w:rPr>
+                <w:sz w:val="21"/>
+                <w:szCs w:val="21"/>
+              </w:rPr>
+              <w:t xml:space="preserve">Shared language, culture and 54 common rivers</w:t>
+            </w:r>
+          </w:p>
+          <w:p>
+            <w:pPr>
+              <w:tabs>
+                <w:tab w:val="left" w:pos="260"/>
+              </w:tabs>
+              <w:spacing w:after="0" w:before="40" w:line="280"/>
+              <w:ind w:left="260" w:hanging="260"/>
+            </w:pPr>
+            <w:r>
+              <w:rPr>
+                <w:b/>
+                <w:bCs/>
+                <w:color w:val="C00000"/>
+                <w:sz w:val="21"/>
+                <w:szCs w:val="21"/>
+              </w:rPr>
+              <w:t xml:space="preserve">→</w:t>
+            </w:r>
+            <w:r>
+              <w:tab/>
+            </w:r>
+            <w:r>
+              <w:rPr>
+                <w:sz w:val="21"/>
+                <w:szCs w:val="21"/>
+              </w:rPr>
+              <w:t xml:space="preserve">Partners in BIMSTEC, BBIN and Act East</w:t>
+            </w:r>
+          </w:p>
+        </w:tc>
+      </w:tr>
+      <w:tr>
+        <w:trPr>
+          <w:cantSplit/>
+        </w:trPr>
+        <w:tc>
+          <w:tcPr>
+            <w:tcW w:type="dxa" w:w="520"/>
+            <w:tcBorders>
+              <w:top w:val="single" w:color="BFBFBF" w:sz="4"/>
+              <w:left w:val="single" w:color="BFBFBF" w:sz="4"/>
+              <w:bottom w:val="single" w:color="BFBFBF" w:sz="4"/>
+              <w:right w:val="single" w:color="BFBFBF" w:sz="4"/>
+            </w:tcBorders>
+            <w:shd w:fill="F5F7FB" w:color="auto" w:val="clear"/>
+            <w:tcMar>
+              <w:top w:type="dxa" w:w="70"/>
+              <w:left w:type="dxa" w:w="100"/>
+              <w:bottom w:type="dxa" w:w="70"/>
+              <w:right w:type="dxa" w:w="100"/>
+            </w:tcMar>
+            <w:vAlign w:val="center"/>
+          </w:tcPr>
+          <w:p>
+            <w:pPr>
+              <w:spacing w:after="0" w:before="0" w:line="300"/>
+              <w:jc w:val="center"/>
+            </w:pPr>
+            <w:r>
+              <w:rPr>
+                <w:color w:val="7F7F7F"/>
+                <w:sz w:val="21"/>
+                <w:szCs w:val="21"/>
+              </w:rPr>
+              <w:t xml:space="preserve">2</w:t>
+            </w:r>
+          </w:p>
+        </w:tc>
+        <w:tc>
+          <w:tcPr>
+            <w:tcW w:type="dxa" w:w="2200"/>
+            <w:tcBorders>
+              <w:top w:val="single" w:color="BFBFBF" w:sz="4"/>
+              <w:left w:val="single" w:color="BFBFBF" w:sz="4"/>
+              <w:bottom w:val="single" w:color="BFBFBF" w:sz="4"/>
+              <w:right w:val="single" w:color="BFBFBF" w:sz="4"/>
+            </w:tcBorders>
+            <w:shd w:fill="F5F7FB" w:color="auto" w:val="clear"/>
+            <w:tcMar>
+              <w:top w:type="dxa" w:w="70"/>
+              <w:left w:type="dxa" w:w="100"/>
+              <w:bottom w:type="dxa" w:w="70"/>
+              <w:right w:type="dxa" w:w="100"/>
+            </w:tcMar>
+            <w:vAlign w:val="center"/>
+          </w:tcPr>
+          <w:p>
+            <w:pPr>
+              <w:spacing w:after="0" w:before="0" w:line="300"/>
+            </w:pPr>
+            <w:r>
+              <w:rPr>
+                <w:b/>
+                <w:bCs/>
+                <w:color w:val="1F3864"/>
+                <w:sz w:val="21"/>
+                <w:szCs w:val="21"/>
+              </w:rPr>
+              <w:t xml:space="preserve">Why it matters</w:t>
+            </w:r>
+          </w:p>
+        </w:tc>
+        <w:tc>
+          <w:tcPr>
+            <w:tcW w:type="dxa" w:w="7986"/>
+            <w:tcBorders>
+              <w:top w:val="single" w:color="BFBFBF" w:sz="4"/>
+              <w:left w:val="single" w:color="BFBFBF" w:sz="4"/>
+              <w:bottom w:val="single" w:color="BFBFBF" w:sz="4"/>
+              <w:right w:val="single" w:color="BFBFBF" w:sz="4"/>
+            </w:tcBorders>
+            <w:shd w:fill="F5F7FB" w:color="auto" w:val="clear"/>
+            <w:tcMar>
+              <w:top w:type="dxa" w:w="70"/>
+              <w:left w:type="dxa" w:w="100"/>
+              <w:bottom w:type="dxa" w:w="70"/>
+              <w:right w:type="dxa" w:w="100"/>
+            </w:tcMar>
+            <w:vAlign w:val="center"/>
+          </w:tcPr>
+          <w:p>
+            <w:pPr>
+              <w:tabs>
+                <w:tab w:val="left" w:pos="260"/>
+              </w:tabs>
+              <w:spacing w:after="0" w:before="0" w:line="280"/>
+              <w:ind w:left="260" w:hanging="260"/>
+            </w:pPr>
+            <w:r>
+              <w:rPr>
+                <w:b/>
+                <w:bCs/>
+                <w:color w:val="C00000"/>
+                <w:sz w:val="21"/>
+                <w:szCs w:val="21"/>
+              </w:rPr>
+              <w:t xml:space="preserve">→</w:t>
+            </w:r>
+            <w:r>
+              <w:tab/>
+            </w:r>
+            <w:r>
+              <w:rPr>
+                <w:b/>
+                <w:bCs/>
+                <w:sz w:val="21"/>
+                <w:szCs w:val="21"/>
+              </w:rPr>
+              <w:t xml:space="preserve">Security:</w:t>
+            </w:r>
+            <w:r>
+              <w:rPr>
+                <w:sz w:val="21"/>
+                <w:szCs w:val="21"/>
+              </w:rPr>
+              <w:t xml:space="preserve"> Northeast insurgency, cross-border terror, illegal migration</w:t>
+            </w:r>
+          </w:p>
+          <w:p>
+            <w:pPr>
+              <w:tabs>
+                <w:tab w:val="left" w:pos="260"/>
+              </w:tabs>
+              <w:spacing w:after="0" w:before="40" w:line="280"/>
+              <w:ind w:left="260" w:hanging="260"/>
+            </w:pPr>
+            <w:r>
+              <w:rPr>
+                <w:b/>
+                <w:bCs/>
+                <w:color w:val="C00000"/>
+                <w:sz w:val="21"/>
+                <w:szCs w:val="21"/>
+              </w:rPr>
+              <w:t xml:space="preserve">→</w:t>
+            </w:r>
+            <w:r>
+              <w:tab/>
+            </w:r>
+            <w:r>
+              <w:rPr>
+                <w:b/>
+                <w:bCs/>
+                <w:sz w:val="21"/>
+                <w:szCs w:val="21"/>
+              </w:rPr>
+              <w:t xml:space="preserve">Strategic:</w:t>
+            </w:r>
+            <w:r>
+              <w:rPr>
+                <w:sz w:val="21"/>
+                <w:szCs w:val="21"/>
+              </w:rPr>
+              <w:t xml:space="preserve"> Bay of Bengal, Siliguri Corridor, China's presence in Dhaka</w:t>
+            </w:r>
+          </w:p>
+          <w:p>
+            <w:pPr>
+              <w:tabs>
+                <w:tab w:val="left" w:pos="260"/>
+              </w:tabs>
+              <w:spacing w:after="0" w:before="40" w:line="280"/>
+              <w:ind w:left="260" w:hanging="260"/>
+            </w:pPr>
+            <w:r>
+              <w:rPr>
+                <w:b/>
+                <w:bCs/>
+                <w:color w:val="C00000"/>
+                <w:sz w:val="21"/>
+                <w:szCs w:val="21"/>
+              </w:rPr>
+              <w:t xml:space="preserve">→</w:t>
+            </w:r>
+            <w:r>
+              <w:tab/>
+            </w:r>
+            <w:r>
+              <w:rPr>
+                <w:b/>
+                <w:bCs/>
+                <w:sz w:val="21"/>
+                <w:szCs w:val="21"/>
+              </w:rPr>
+              <w:t xml:space="preserve">Economic:</w:t>
+            </w:r>
+            <w:r>
+              <w:rPr>
+                <w:sz w:val="21"/>
+                <w:szCs w:val="21"/>
+              </w:rPr>
+              <w:t xml:space="preserve"> India's largest trade partner in South Asia; transit route to the Northeast</w:t>
+            </w:r>
+          </w:p>
+          <w:p>
+            <w:pPr>
+              <w:tabs>
+                <w:tab w:val="left" w:pos="260"/>
+              </w:tabs>
+              <w:spacing w:after="0" w:before="40" w:line="280"/>
+              <w:ind w:left="260" w:hanging="260"/>
+            </w:pPr>
+            <w:r>
+              <w:rPr>
+                <w:b/>
+                <w:bCs/>
+                <w:color w:val="C00000"/>
+                <w:sz w:val="21"/>
+                <w:szCs w:val="21"/>
+              </w:rPr>
+              <w:t xml:space="preserve">→</w:t>
+            </w:r>
+            <w:r>
+              <w:tab/>
+            </w:r>
+            <w:r>
+              <w:rPr>
+                <w:b/>
+                <w:bCs/>
+                <w:sz w:val="21"/>
+                <w:szCs w:val="21"/>
+              </w:rPr>
+              <w:t xml:space="preserve">Water:</w:t>
+            </w:r>
+            <w:r>
+              <w:rPr>
+                <w:sz w:val="21"/>
+                <w:szCs w:val="21"/>
+              </w:rPr>
+              <w:t xml:space="preserve"> Ganga and Teesta</w:t>
+            </w:r>
+          </w:p>
+          <w:p>
+            <w:pPr>
+              <w:tabs>
+                <w:tab w:val="left" w:pos="260"/>
+              </w:tabs>
+              <w:spacing w:after="0" w:before="40" w:line="280"/>
+              <w:ind w:left="260" w:hanging="260"/>
+            </w:pPr>
+            <w:r>
+              <w:rPr>
+                <w:b/>
+                <w:bCs/>
+                <w:color w:val="C00000"/>
+                <w:sz w:val="21"/>
+                <w:szCs w:val="21"/>
+              </w:rPr>
+              <w:t xml:space="preserve">→</w:t>
+            </w:r>
+            <w:r>
+              <w:tab/>
+            </w:r>
+            <w:r>
+              <w:rPr>
+                <w:b/>
+                <w:bCs/>
+                <w:sz w:val="21"/>
+                <w:szCs w:val="21"/>
+              </w:rPr>
+              <w:t xml:space="preserve">Connectivity:</w:t>
+            </w:r>
+            <w:r>
+              <w:rPr>
+                <w:sz w:val="21"/>
+                <w:szCs w:val="21"/>
+              </w:rPr>
+              <w:t xml:space="preserve"> rail, roads, power grid, Chittagong and Mongla ports</w:t>
+            </w:r>
+          </w:p>
+        </w:tc>
+      </w:tr>
+      <w:tr>
+        <w:trPr>
+          <w:cantSplit/>
+        </w:trPr>
+        <w:tc>
+          <w:tcPr>
+            <w:tcW w:type="dxa" w:w="520"/>
+            <w:tcBorders>
+              <w:top w:val="single" w:color="BFBFBF" w:sz="4"/>
+              <w:left w:val="single" w:color="BFBFBF" w:sz="4"/>
+              <w:bottom w:val="single" w:color="BFBFBF" w:sz="4"/>
+              <w:right w:val="single" w:color="BFBFBF" w:sz="4"/>
+            </w:tcBorders>
+            <w:tcMar>
+              <w:top w:type="dxa" w:w="70"/>
+              <w:left w:type="dxa" w:w="100"/>
+              <w:bottom w:type="dxa" w:w="70"/>
+              <w:right w:type="dxa" w:w="100"/>
+            </w:tcMar>
+            <w:vAlign w:val="center"/>
+          </w:tcPr>
+          <w:p>
+            <w:pPr>
+              <w:spacing w:after="0" w:before="0" w:line="300"/>
+              <w:jc w:val="center"/>
+            </w:pPr>
+            <w:r>
+              <w:rPr>
+                <w:color w:val="7F7F7F"/>
+                <w:sz w:val="21"/>
+                <w:szCs w:val="21"/>
+              </w:rPr>
+              <w:t xml:space="preserve">3</w:t>
+            </w:r>
+          </w:p>
+        </w:tc>
+        <w:tc>
+          <w:tcPr>
+            <w:tcW w:type="dxa" w:w="2200"/>
+            <w:tcBorders>
+              <w:top w:val="single" w:color="BFBFBF" w:sz="4"/>
+              <w:left w:val="single" w:color="BFBFBF" w:sz="4"/>
+              <w:bottom w:val="single" w:color="BFBFBF" w:sz="4"/>
+              <w:right w:val="single" w:color="BFBFBF" w:sz="4"/>
+            </w:tcBorders>
+            <w:tcMar>
+              <w:top w:type="dxa" w:w="70"/>
+              <w:left w:type="dxa" w:w="100"/>
+              <w:bottom w:type="dxa" w:w="70"/>
+              <w:right w:type="dxa" w:w="100"/>
+            </w:tcMar>
+            <w:vAlign w:val="center"/>
+          </w:tcPr>
+          <w:p>
+            <w:pPr>
+              <w:spacing w:after="0" w:before="0" w:line="300"/>
+            </w:pPr>
+            <w:r>
+              <w:rPr>
+                <w:b/>
+                <w:bCs/>
+                <w:color w:val="1F3864"/>
+                <w:sz w:val="21"/>
+                <w:szCs w:val="21"/>
+              </w:rPr>
+              <w:t xml:space="preserve">Current status (Sept 2026)</w:t>
+            </w:r>
+          </w:p>
+        </w:tc>
+        <w:tc>
+          <w:tcPr>
+            <w:tcW w:type="dxa" w:w="7986"/>
+            <w:tcBorders>
+              <w:top w:val="single" w:color="BFBFBF" w:sz="4"/>
+              <w:left w:val="single" w:color="BFBFBF" w:sz="4"/>
+              <w:bottom w:val="single" w:color="BFBFBF" w:sz="4"/>
+              <w:right w:val="single" w:color="BFBFBF" w:sz="4"/>
+            </w:tcBorders>
+            <w:tcMar>
+              <w:top w:type="dxa" w:w="70"/>
+              <w:left w:type="dxa" w:w="100"/>
+              <w:bottom w:type="dxa" w:w="70"/>
+              <w:right w:type="dxa" w:w="100"/>
+            </w:tcMar>
+            <w:vAlign w:val="center"/>
+          </w:tcPr>
+          <w:p>
+            <w:pPr>
+              <w:tabs>
+                <w:tab w:val="left" w:pos="260"/>
+              </w:tabs>
+              <w:spacing w:after="0" w:before="0" w:line="280"/>
+              <w:ind w:left="260" w:hanging="260"/>
+            </w:pPr>
+            <w:r>
+              <w:rPr>
+                <w:b/>
+                <w:bCs/>
+                <w:color w:val="C00000"/>
+                <w:sz w:val="21"/>
+                <w:szCs w:val="21"/>
+              </w:rPr>
+              <w:t xml:space="preserve">→</w:t>
+            </w:r>
+            <w:r>
+              <w:tab/>
+            </w:r>
+            <w:r>
+              <w:rPr>
+                <w:b/>
+                <w:bCs/>
+                <w:sz w:val="21"/>
+                <w:szCs w:val="21"/>
+              </w:rPr>
+              <w:t xml:space="preserve">Political change:</w:t>
+            </w:r>
+            <w:r>
+              <w:rPr>
+                <w:sz w:val="21"/>
+                <w:szCs w:val="21"/>
+              </w:rPr>
+              <w:t xml:space="preserve"> Hasina ousted (Aug 2024); elected BNP government under PM Tarique Rahman</w:t>
+            </w:r>
+          </w:p>
+          <w:p>
+            <w:pPr>
+              <w:tabs>
+                <w:tab w:val="left" w:pos="260"/>
+              </w:tabs>
+              <w:spacing w:after="0" w:before="40" w:line="280"/>
+              <w:ind w:left="260" w:hanging="260"/>
+            </w:pPr>
+            <w:r>
+              <w:rPr>
+                <w:b/>
+                <w:bCs/>
+                <w:color w:val="C00000"/>
+                <w:sz w:val="21"/>
+                <w:szCs w:val="21"/>
+              </w:rPr>
+              <w:t xml:space="preserve">→</w:t>
+            </w:r>
+            <w:r>
+              <w:tab/>
+            </w:r>
+            <w:r>
+              <w:rPr>
+                <w:b/>
+                <w:bCs/>
+                <w:sz w:val="21"/>
+                <w:szCs w:val="21"/>
+              </w:rPr>
+              <w:t xml:space="preserve">Hasina question:</w:t>
+            </w:r>
+            <w:r>
+              <w:rPr>
+                <w:sz w:val="21"/>
+                <w:szCs w:val="21"/>
+              </w:rPr>
+              <w:t xml:space="preserve"> in exile in India, sentenced to death in absentia; Dhaka demands extradition; India says the request is being examined under law</w:t>
+            </w:r>
+          </w:p>
+          <w:p>
+            <w:pPr>
+              <w:tabs>
+                <w:tab w:val="left" w:pos="260"/>
+              </w:tabs>
+              <w:spacing w:after="0" w:before="40" w:line="280"/>
+              <w:ind w:left="260" w:hanging="260"/>
+            </w:pPr>
+            <w:r>
+              <w:rPr>
+                <w:b/>
+                <w:bCs/>
+                <w:color w:val="C00000"/>
+                <w:sz w:val="21"/>
+                <w:szCs w:val="21"/>
+              </w:rPr>
+              <w:t xml:space="preserve">→</w:t>
+            </w:r>
+            <w:r>
+              <w:tab/>
+            </w:r>
+            <w:r>
+              <w:rPr>
+                <w:b/>
+                <w:bCs/>
+                <w:sz w:val="21"/>
+                <w:szCs w:val="21"/>
+              </w:rPr>
+              <w:t xml:space="preserve">Visits:</w:t>
+            </w:r>
+            <w:r>
+              <w:rPr>
+                <w:sz w:val="21"/>
+                <w:szCs w:val="21"/>
+              </w:rPr>
+              <w:t xml:space="preserve"> Rahman yet to visit India; Aug visit fell through, skipped BRICS in New Delhi; talks on a Nov 2026 visit resumed (trade, Ganga treaty on agenda)</w:t>
+            </w:r>
+          </w:p>
+          <w:p>
+            <w:pPr>
+              <w:tabs>
+                <w:tab w:val="left" w:pos="260"/>
+              </w:tabs>
+              <w:spacing w:after="0" w:before="40" w:line="280"/>
+              <w:ind w:left="260" w:hanging="260"/>
+            </w:pPr>
+            <w:r>
+              <w:rPr>
+                <w:b/>
+                <w:bCs/>
+                <w:color w:val="C00000"/>
+                <w:sz w:val="21"/>
+                <w:szCs w:val="21"/>
+              </w:rPr>
+              <w:t xml:space="preserve">→</w:t>
+            </w:r>
+            <w:r>
+              <w:tab/>
+            </w:r>
+            <w:r>
+              <w:rPr>
+                <w:b/>
+                <w:bCs/>
+                <w:sz w:val="21"/>
+                <w:szCs w:val="21"/>
+              </w:rPr>
+              <w:t xml:space="preserve">Tone:</w:t>
+            </w:r>
+            <w:r>
+              <w:rPr>
+                <w:sz w:val="21"/>
+                <w:szCs w:val="21"/>
+              </w:rPr>
+              <w:t xml:space="preserve"> MEA wants "positive, constructive and forward-looking" ties (22 Sep); Dhaka wants a "reset", calls India "just another country" (13 Sep)</w:t>
+            </w:r>
+          </w:p>
+          <w:p>
+            <w:pPr>
+              <w:tabs>
+                <w:tab w:val="left" w:pos="260"/>
+              </w:tabs>
+              <w:spacing w:after="0" w:before="40" w:line="280"/>
+              <w:ind w:left="260" w:hanging="260"/>
+            </w:pPr>
+            <w:r>
+              <w:rPr>
+                <w:b/>
+                <w:bCs/>
+                <w:color w:val="C00000"/>
+                <w:sz w:val="21"/>
+                <w:szCs w:val="21"/>
+              </w:rPr>
+              <w:t xml:space="preserve">→</w:t>
+            </w:r>
+            <w:r>
+              <w:tab/>
+            </w:r>
+            <w:r>
+              <w:rPr>
+                <w:b/>
+                <w:bCs/>
+                <w:sz w:val="21"/>
+                <w:szCs w:val="21"/>
+              </w:rPr>
+              <w:t xml:space="preserve">Water:</w:t>
+            </w:r>
+            <w:r>
+              <w:rPr>
+                <w:sz w:val="21"/>
+                <w:szCs w:val="21"/>
+              </w:rPr>
+              <w:t xml:space="preserve"> 1996 Ganga Water Treaty expires Dec 2026; Teesta still unresolved</w:t>
+            </w:r>
+          </w:p>
+          <w:p>
+            <w:pPr>
+              <w:tabs>
+                <w:tab w:val="left" w:pos="260"/>
+              </w:tabs>
+              <w:spacing w:after="0" w:before="40" w:line="280"/>
+              <w:ind w:left="260" w:hanging="260"/>
+            </w:pPr>
+            <w:r>
+              <w:rPr>
+                <w:b/>
+                <w:bCs/>
+                <w:color w:val="C00000"/>
+                <w:sz w:val="21"/>
+                <w:szCs w:val="21"/>
+              </w:rPr>
+              <w:t xml:space="preserve">→</w:t>
+            </w:r>
+            <w:r>
+              <w:tab/>
+            </w:r>
+            <w:r>
+              <w:rPr>
+                <w:b/>
+                <w:bCs/>
+                <w:sz w:val="21"/>
+                <w:szCs w:val="21"/>
+              </w:rPr>
+              <w:t xml:space="preserve">Irritants:</w:t>
+            </w:r>
+            <w:r>
+              <w:rPr>
+                <w:sz w:val="21"/>
+                <w:szCs w:val="21"/>
+              </w:rPr>
+              <w:t xml:space="preserve"> border killings and push-ins</w:t>
+            </w:r>
+          </w:p>
+        </w:tc>
+      </w:tr>
+      <w:tr>
+        <w:trPr>
+          <w:cantSplit/>
+        </w:trPr>
+        <w:tc>
+          <w:tcPr>
+            <w:tcW w:type="dxa" w:w="520"/>
+            <w:tcBorders>
+              <w:top w:val="single" w:color="BFBFBF" w:sz="4"/>
+              <w:left w:val="single" w:color="BFBFBF" w:sz="4"/>
+              <w:bottom w:val="single" w:color="BFBFBF" w:sz="4"/>
+              <w:right w:val="single" w:color="BFBFBF" w:sz="4"/>
+            </w:tcBorders>
+            <w:shd w:fill="F5F7FB" w:color="auto" w:val="clear"/>
+            <w:tcMar>
+              <w:top w:type="dxa" w:w="70"/>
+              <w:left w:type="dxa" w:w="100"/>
+              <w:bottom w:type="dxa" w:w="70"/>
+              <w:right w:type="dxa" w:w="100"/>
+            </w:tcMar>
+            <w:vAlign w:val="center"/>
+          </w:tcPr>
+          <w:p>
+            <w:pPr>
+              <w:spacing w:after="0" w:before="0" w:line="300"/>
+              <w:jc w:val="center"/>
+            </w:pPr>
+            <w:r>
+              <w:rPr>
+                <w:color w:val="7F7F7F"/>
+                <w:sz w:val="21"/>
+                <w:szCs w:val="21"/>
+              </w:rPr>
+              <w:t xml:space="preserve">4</w:t>
+            </w:r>
+          </w:p>
+        </w:tc>
+        <w:tc>
+          <w:tcPr>
+            <w:tcW w:type="dxa" w:w="2200"/>
+            <w:tcBorders>
+              <w:top w:val="single" w:color="BFBFBF" w:sz="4"/>
+              <w:left w:val="single" w:color="BFBFBF" w:sz="4"/>
+              <w:bottom w:val="single" w:color="BFBFBF" w:sz="4"/>
+              <w:right w:val="single" w:color="BFBFBF" w:sz="4"/>
+            </w:tcBorders>
+            <w:shd w:fill="F5F7FB" w:color="auto" w:val="clear"/>
+            <w:tcMar>
+              <w:top w:type="dxa" w:w="70"/>
+              <w:left w:type="dxa" w:w="100"/>
+              <w:bottom w:type="dxa" w:w="70"/>
+              <w:right w:type="dxa" w:w="100"/>
+            </w:tcMar>
+            <w:vAlign w:val="center"/>
+          </w:tcPr>
+          <w:p>
+            <w:pPr>
+              <w:spacing w:after="0" w:before="0" w:line="300"/>
+            </w:pPr>
+            <w:r>
+              <w:rPr>
+                <w:b/>
+                <w:bCs/>
+                <w:color w:val="1F3864"/>
+                <w:sz w:val="21"/>
+                <w:szCs w:val="21"/>
+              </w:rPr>
+              <w:t xml:space="preserve">Problems</w:t>
+            </w:r>
+          </w:p>
+        </w:tc>
+        <w:tc>
+          <w:tcPr>
+            <w:tcW w:type="dxa" w:w="7986"/>
+            <w:tcBorders>
+              <w:top w:val="single" w:color="BFBFBF" w:sz="4"/>
+              <w:left w:val="single" w:color="BFBFBF" w:sz="4"/>
+              <w:bottom w:val="single" w:color="BFBFBF" w:sz="4"/>
+              <w:right w:val="single" w:color="BFBFBF" w:sz="4"/>
+            </w:tcBorders>
+            <w:shd w:fill="F5F7FB" w:color="auto" w:val="clear"/>
+            <w:tcMar>
+              <w:top w:type="dxa" w:w="70"/>
+              <w:left w:type="dxa" w:w="100"/>
+              <w:bottom w:type="dxa" w:w="70"/>
+              <w:right w:type="dxa" w:w="100"/>
+            </w:tcMar>
+            <w:vAlign w:val="center"/>
+          </w:tcPr>
+          <w:p>
+            <w:pPr>
+              <w:tabs>
+                <w:tab w:val="left" w:pos="260"/>
+              </w:tabs>
+              <w:spacing w:after="0" w:before="0" w:line="280"/>
+              <w:ind w:left="260" w:hanging="260"/>
+            </w:pPr>
+            <w:r>
+              <w:rPr>
+                <w:b/>
+                <w:bCs/>
+                <w:color w:val="C00000"/>
+                <w:sz w:val="21"/>
+                <w:szCs w:val="21"/>
+              </w:rPr>
+              <w:t xml:space="preserve">→</w:t>
+            </w:r>
+            <w:r>
+              <w:tab/>
+            </w:r>
+            <w:r>
+              <w:rPr>
+                <w:sz w:val="21"/>
+                <w:szCs w:val="21"/>
+              </w:rPr>
+              <w:t xml:space="preserve">Hasina extradition</w:t>
+            </w:r>
+          </w:p>
+          <w:p>
+            <w:pPr>
+              <w:tabs>
+                <w:tab w:val="left" w:pos="260"/>
+              </w:tabs>
+              <w:spacing w:after="0" w:before="40" w:line="280"/>
+              <w:ind w:left="260" w:hanging="260"/>
+            </w:pPr>
+            <w:r>
+              <w:rPr>
+                <w:b/>
+                <w:bCs/>
+                <w:color w:val="C00000"/>
+                <w:sz w:val="21"/>
+                <w:szCs w:val="21"/>
+              </w:rPr>
+              <w:t xml:space="preserve">→</w:t>
+            </w:r>
+            <w:r>
+              <w:tab/>
+            </w:r>
+            <w:r>
+              <w:rPr>
+                <w:sz w:val="21"/>
+                <w:szCs w:val="21"/>
+              </w:rPr>
+              <w:t xml:space="preserve">Ganga Treaty expiry and Teesta deadlock</w:t>
+            </w:r>
+          </w:p>
+          <w:p>
+            <w:pPr>
+              <w:tabs>
+                <w:tab w:val="left" w:pos="260"/>
+              </w:tabs>
+              <w:spacing w:after="0" w:before="40" w:line="280"/>
+              <w:ind w:left="260" w:hanging="260"/>
+            </w:pPr>
+            <w:r>
+              <w:rPr>
+                <w:b/>
+                <w:bCs/>
+                <w:color w:val="C00000"/>
+                <w:sz w:val="21"/>
+                <w:szCs w:val="21"/>
+              </w:rPr>
+              <w:t xml:space="preserve">→</w:t>
+            </w:r>
+            <w:r>
+              <w:tab/>
+            </w:r>
+            <w:r>
+              <w:rPr>
+                <w:sz w:val="21"/>
+                <w:szCs w:val="21"/>
+              </w:rPr>
+              <w:t xml:space="preserve">Border killings, push-ins, illegal migration</w:t>
+            </w:r>
+          </w:p>
+          <w:p>
+            <w:pPr>
+              <w:tabs>
+                <w:tab w:val="left" w:pos="260"/>
+              </w:tabs>
+              <w:spacing w:after="0" w:before="40" w:line="280"/>
+              <w:ind w:left="260" w:hanging="260"/>
+            </w:pPr>
+            <w:r>
+              <w:rPr>
+                <w:b/>
+                <w:bCs/>
+                <w:color w:val="C00000"/>
+                <w:sz w:val="21"/>
+                <w:szCs w:val="21"/>
+              </w:rPr>
+              <w:t xml:space="preserve">→</w:t>
+            </w:r>
+            <w:r>
+              <w:tab/>
+            </w:r>
+            <w:r>
+              <w:rPr>
+                <w:sz w:val="21"/>
+                <w:szCs w:val="21"/>
+              </w:rPr>
+              <w:t xml:space="preserve">Safety of minorities, including Hindus</w:t>
+            </w:r>
+          </w:p>
+          <w:p>
+            <w:pPr>
+              <w:tabs>
+                <w:tab w:val="left" w:pos="260"/>
+              </w:tabs>
+              <w:spacing w:after="0" w:before="40" w:line="280"/>
+              <w:ind w:left="260" w:hanging="260"/>
+            </w:pPr>
+            <w:r>
+              <w:rPr>
+                <w:b/>
+                <w:bCs/>
+                <w:color w:val="C00000"/>
+                <w:sz w:val="21"/>
+                <w:szCs w:val="21"/>
+              </w:rPr>
+              <w:t xml:space="preserve">→</w:t>
+            </w:r>
+            <w:r>
+              <w:tab/>
+            </w:r>
+            <w:r>
+              <w:rPr>
+                <w:sz w:val="21"/>
+                <w:szCs w:val="21"/>
+              </w:rPr>
+              <w:t xml:space="preserve">Growing Chinese footprint (Teesta project, ports, defence)</w:t>
+            </w:r>
+          </w:p>
+          <w:p>
+            <w:pPr>
+              <w:tabs>
+                <w:tab w:val="left" w:pos="260"/>
+              </w:tabs>
+              <w:spacing w:after="0" w:before="40" w:line="280"/>
+              <w:ind w:left="260" w:hanging="260"/>
+            </w:pPr>
+            <w:r>
+              <w:rPr>
+                <w:b/>
+                <w:bCs/>
+                <w:color w:val="C00000"/>
+                <w:sz w:val="21"/>
+                <w:szCs w:val="21"/>
+              </w:rPr>
+              <w:t xml:space="preserve">→</w:t>
+            </w:r>
+            <w:r>
+              <w:tab/>
+            </w:r>
+            <w:r>
+              <w:rPr>
+                <w:sz w:val="21"/>
+                <w:szCs w:val="21"/>
+              </w:rPr>
+              <w:t xml:space="preserve">Anti-India sentiment in Bangladeshi politics</w:t>
+            </w:r>
+          </w:p>
+          <w:p>
+            <w:pPr>
+              <w:tabs>
+                <w:tab w:val="left" w:pos="260"/>
+              </w:tabs>
+              <w:spacing w:after="0" w:before="40" w:line="280"/>
+              <w:ind w:left="260" w:hanging="260"/>
+            </w:pPr>
+            <w:r>
+              <w:rPr>
+                <w:b/>
+                <w:bCs/>
+                <w:color w:val="C00000"/>
+                <w:sz w:val="21"/>
+                <w:szCs w:val="21"/>
+              </w:rPr>
+              <w:t xml:space="preserve">→</w:t>
+            </w:r>
+            <w:r>
+              <w:tab/>
+            </w:r>
+            <w:r>
+              <w:rPr>
+                <w:sz w:val="21"/>
+                <w:szCs w:val="21"/>
+              </w:rPr>
+              <w:t xml:space="preserve">Trade deficit and non-tariff barriers</w:t>
+            </w:r>
+          </w:p>
+          <w:p>
+            <w:pPr>
+              <w:tabs>
+                <w:tab w:val="left" w:pos="260"/>
+              </w:tabs>
+              <w:spacing w:after="0" w:before="40" w:line="280"/>
+              <w:ind w:left="260" w:hanging="260"/>
+            </w:pPr>
+            <w:r>
+              <w:rPr>
+                <w:b/>
+                <w:bCs/>
+                <w:color w:val="C00000"/>
+                <w:sz w:val="21"/>
+                <w:szCs w:val="21"/>
+              </w:rPr>
+              <w:t xml:space="preserve">→</w:t>
+            </w:r>
+            <w:r>
+              <w:tab/>
+            </w:r>
+            <w:r>
+              <w:rPr>
+                <w:sz w:val="21"/>
+                <w:szCs w:val="21"/>
+              </w:rPr>
+              <w:t xml:space="preserve">West Bengal politics complicating water deals</w:t>
+            </w:r>
+          </w:p>
+        </w:tc>
+      </w:tr>
+      <w:tr>
+        <w:trPr>
+          <w:cantSplit/>
+        </w:trPr>
+        <w:tc>
+          <w:tcPr>
+            <w:tcW w:type="dxa" w:w="520"/>
+            <w:tcBorders>
+              <w:top w:val="single" w:color="BFBFBF" w:sz="4"/>
+              <w:left w:val="single" w:color="BFBFBF" w:sz="4"/>
+              <w:bottom w:val="single" w:color="BFBFBF" w:sz="4"/>
+              <w:right w:val="single" w:color="BFBFBF" w:sz="4"/>
+            </w:tcBorders>
+            <w:tcMar>
+              <w:top w:type="dxa" w:w="70"/>
+              <w:left w:type="dxa" w:w="100"/>
+              <w:bottom w:type="dxa" w:w="70"/>
+              <w:right w:type="dxa" w:w="100"/>
+            </w:tcMar>
+            <w:vAlign w:val="center"/>
+          </w:tcPr>
+          <w:p>
+            <w:pPr>
+              <w:spacing w:after="0" w:before="0" w:line="300"/>
+              <w:jc w:val="center"/>
+            </w:pPr>
+            <w:r>
+              <w:rPr>
+                <w:color w:val="7F7F7F"/>
+                <w:sz w:val="21"/>
+                <w:szCs w:val="21"/>
+              </w:rPr>
+              <w:t xml:space="preserve">5</w:t>
+            </w:r>
+          </w:p>
+        </w:tc>
+        <w:tc>
+          <w:tcPr>
+            <w:tcW w:type="dxa" w:w="2200"/>
+            <w:tcBorders>
+              <w:top w:val="single" w:color="BFBFBF" w:sz="4"/>
+              <w:left w:val="single" w:color="BFBFBF" w:sz="4"/>
+              <w:bottom w:val="single" w:color="BFBFBF" w:sz="4"/>
+              <w:right w:val="single" w:color="BFBFBF" w:sz="4"/>
+            </w:tcBorders>
+            <w:tcMar>
+              <w:top w:type="dxa" w:w="70"/>
+              <w:left w:type="dxa" w:w="100"/>
+              <w:bottom w:type="dxa" w:w="70"/>
+              <w:right w:type="dxa" w:w="100"/>
+            </w:tcMar>
+            <w:vAlign w:val="center"/>
+          </w:tcPr>
+          <w:p>
+            <w:pPr>
+              <w:spacing w:after="0" w:before="0" w:line="300"/>
+            </w:pPr>
+            <w:r>
+              <w:rPr>
+                <w:b/>
+                <w:bCs/>
+                <w:color w:val="1F3864"/>
+                <w:sz w:val="21"/>
+                <w:szCs w:val="21"/>
+              </w:rPr>
+              <w:t xml:space="preserve">Solutions</w:t>
+            </w:r>
+          </w:p>
+        </w:tc>
+        <w:tc>
+          <w:tcPr>
+            <w:tcW w:type="dxa" w:w="7986"/>
+            <w:tcBorders>
+              <w:top w:val="single" w:color="BFBFBF" w:sz="4"/>
+              <w:left w:val="single" w:color="BFBFBF" w:sz="4"/>
+              <w:bottom w:val="single" w:color="BFBFBF" w:sz="4"/>
+              <w:right w:val="single" w:color="BFBFBF" w:sz="4"/>
+            </w:tcBorders>
+            <w:tcMar>
+              <w:top w:type="dxa" w:w="70"/>
+              <w:left w:type="dxa" w:w="100"/>
+              <w:bottom w:type="dxa" w:w="70"/>
+              <w:right w:type="dxa" w:w="100"/>
+            </w:tcMar>
+            <w:vAlign w:val="center"/>
+          </w:tcPr>
+          <w:p>
+            <w:pPr>
+              <w:tabs>
+                <w:tab w:val="left" w:pos="260"/>
+              </w:tabs>
+              <w:spacing w:after="0" w:before="0" w:line="280"/>
+              <w:ind w:left="260" w:hanging="260"/>
+            </w:pPr>
+            <w:r>
+              <w:rPr>
+                <w:b/>
+                <w:bCs/>
+                <w:color w:val="C00000"/>
+                <w:sz w:val="21"/>
+                <w:szCs w:val="21"/>
+              </w:rPr>
+              <w:t xml:space="preserve">→</w:t>
+            </w:r>
+            <w:r>
+              <w:tab/>
+            </w:r>
+            <w:r>
+              <w:rPr>
+                <w:b/>
+                <w:bCs/>
+                <w:sz w:val="21"/>
+                <w:szCs w:val="21"/>
+              </w:rPr>
+              <w:t xml:space="preserve">Water first:</w:t>
+            </w:r>
+            <w:r>
+              <w:rPr>
+                <w:sz w:val="21"/>
+                <w:szCs w:val="21"/>
+              </w:rPr>
+              <w:t xml:space="preserve"> new Ganga treaty on a technical basis; move Teesta talks forward</w:t>
+            </w:r>
+          </w:p>
+          <w:p>
+            <w:pPr>
+              <w:tabs>
+                <w:tab w:val="left" w:pos="260"/>
+              </w:tabs>
+              <w:spacing w:after="0" w:before="40" w:line="280"/>
+              <w:ind w:left="260" w:hanging="260"/>
+            </w:pPr>
+            <w:r>
+              <w:rPr>
+                <w:b/>
+                <w:bCs/>
+                <w:color w:val="C00000"/>
+                <w:sz w:val="21"/>
+                <w:szCs w:val="21"/>
+              </w:rPr>
+              <w:t xml:space="preserve">→</w:t>
+            </w:r>
+            <w:r>
+              <w:tab/>
+            </w:r>
+            <w:r>
+              <w:rPr>
+                <w:sz w:val="21"/>
+                <w:szCs w:val="21"/>
+              </w:rPr>
+              <w:t xml:space="preserve">Keep the Hasina question on a legal track, don't let it freeze ties</w:t>
+            </w:r>
+          </w:p>
+          <w:p>
+            <w:pPr>
+              <w:tabs>
+                <w:tab w:val="left" w:pos="260"/>
+              </w:tabs>
+              <w:spacing w:after="0" w:before="40" w:line="280"/>
+              <w:ind w:left="260" w:hanging="260"/>
+            </w:pPr>
+            <w:r>
+              <w:rPr>
+                <w:b/>
+                <w:bCs/>
+                <w:color w:val="C00000"/>
+                <w:sz w:val="21"/>
+                <w:szCs w:val="21"/>
+              </w:rPr>
+              <w:t xml:space="preserve">→</w:t>
+            </w:r>
+            <w:r>
+              <w:tab/>
+            </w:r>
+            <w:r>
+              <w:rPr>
+                <w:sz w:val="21"/>
+                <w:szCs w:val="21"/>
+              </w:rPr>
+              <w:t xml:space="preserve">Resume high-level visits; use existing bilateral mechanisms</w:t>
+            </w:r>
+          </w:p>
+          <w:p>
+            <w:pPr>
+              <w:tabs>
+                <w:tab w:val="left" w:pos="260"/>
+              </w:tabs>
+              <w:spacing w:after="0" w:before="40" w:line="280"/>
+              <w:ind w:left="260" w:hanging="260"/>
+            </w:pPr>
+            <w:r>
+              <w:rPr>
+                <w:b/>
+                <w:bCs/>
+                <w:color w:val="C00000"/>
+                <w:sz w:val="21"/>
+                <w:szCs w:val="21"/>
+              </w:rPr>
+              <w:t xml:space="preserve">→</w:t>
+            </w:r>
+            <w:r>
+              <w:tab/>
+            </w:r>
+            <w:r>
+              <w:rPr>
+                <w:b/>
+                <w:bCs/>
+                <w:sz w:val="21"/>
+                <w:szCs w:val="21"/>
+              </w:rPr>
+              <w:t xml:space="preserve">Border management:</w:t>
+            </w:r>
+            <w:r>
+              <w:rPr>
+                <w:sz w:val="21"/>
+                <w:szCs w:val="21"/>
+              </w:rPr>
+              <w:t xml:space="preserve"> fencing, joint patrols, non-lethal methods; zero tolerance for smuggling and terror</w:t>
+            </w:r>
+          </w:p>
+          <w:p>
+            <w:pPr>
+              <w:tabs>
+                <w:tab w:val="left" w:pos="260"/>
+              </w:tabs>
+              <w:spacing w:after="0" w:before="40" w:line="280"/>
+              <w:ind w:left="260" w:hanging="260"/>
+            </w:pPr>
+            <w:r>
+              <w:rPr>
+                <w:b/>
+                <w:bCs/>
+                <w:color w:val="C00000"/>
+                <w:sz w:val="21"/>
+                <w:szCs w:val="21"/>
+              </w:rPr>
+              <w:t xml:space="preserve">→</w:t>
+            </w:r>
+            <w:r>
+              <w:tab/>
+            </w:r>
+            <w:r>
+              <w:rPr>
+                <w:b/>
+                <w:bCs/>
+                <w:sz w:val="21"/>
+                <w:szCs w:val="21"/>
+              </w:rPr>
+              <w:t xml:space="preserve">Economic engagement:</w:t>
+            </w:r>
+            <w:r>
+              <w:rPr>
+                <w:sz w:val="21"/>
+                <w:szCs w:val="21"/>
+              </w:rPr>
+              <w:t xml:space="preserve"> trade, power (Nepal–Bangladesh–India grid), rail and port connectivity</w:t>
+            </w:r>
+          </w:p>
+          <w:p>
+            <w:pPr>
+              <w:tabs>
+                <w:tab w:val="left" w:pos="260"/>
+              </w:tabs>
+              <w:spacing w:after="0" w:before="40" w:line="280"/>
+              <w:ind w:left="260" w:hanging="260"/>
+            </w:pPr>
+            <w:r>
+              <w:rPr>
+                <w:b/>
+                <w:bCs/>
+                <w:color w:val="C00000"/>
+                <w:sz w:val="21"/>
+                <w:szCs w:val="21"/>
+              </w:rPr>
+              <w:t xml:space="preserve">→</w:t>
+            </w:r>
+            <w:r>
+              <w:tab/>
+            </w:r>
+            <w:r>
+              <w:rPr>
+                <w:b/>
+                <w:bCs/>
+                <w:sz w:val="21"/>
+                <w:szCs w:val="21"/>
+              </w:rPr>
+              <w:t xml:space="preserve">People-to-people:</w:t>
+            </w:r>
+            <w:r>
+              <w:rPr>
+                <w:sz w:val="21"/>
+                <w:szCs w:val="21"/>
+              </w:rPr>
+              <w:t xml:space="preserve"> visas, medical tourism, education, culture</w:t>
+            </w:r>
+          </w:p>
+          <w:p>
+            <w:pPr>
+              <w:tabs>
+                <w:tab w:val="left" w:pos="260"/>
+              </w:tabs>
+              <w:spacing w:after="0" w:before="40" w:line="280"/>
+              <w:ind w:left="260" w:hanging="260"/>
+            </w:pPr>
+            <w:r>
+              <w:rPr>
+                <w:b/>
+                <w:bCs/>
+                <w:color w:val="C00000"/>
+                <w:sz w:val="21"/>
+                <w:szCs w:val="21"/>
+              </w:rPr>
+              <w:t xml:space="preserve">→</w:t>
+            </w:r>
+            <w:r>
+              <w:tab/>
+            </w:r>
+            <w:r>
+              <w:rPr>
+                <w:sz w:val="21"/>
+                <w:szCs w:val="21"/>
+              </w:rPr>
+              <w:t xml:space="preserve">Raise minority safety through quiet diplomacy</w:t>
+            </w:r>
+          </w:p>
+          <w:p>
+            <w:pPr>
+              <w:tabs>
+                <w:tab w:val="left" w:pos="260"/>
+              </w:tabs>
+              <w:spacing w:after="0" w:before="40" w:line="280"/>
+              <w:ind w:left="260" w:hanging="260"/>
+            </w:pPr>
+            <w:r>
+              <w:rPr>
+                <w:b/>
+                <w:bCs/>
+                <w:color w:val="C00000"/>
+                <w:sz w:val="21"/>
+                <w:szCs w:val="21"/>
+              </w:rPr>
+              <w:t xml:space="preserve">→</w:t>
+            </w:r>
+            <w:r>
+              <w:tab/>
+            </w:r>
+            <w:r>
+              <w:rPr>
+                <w:sz w:val="21"/>
+                <w:szCs w:val="21"/>
+              </w:rPr>
+              <w:t xml:space="preserve">Deal with Dhaka as a state, not with one party or leader</w:t>
+            </w:r>
+          </w:p>
+        </w:tc>
+      </w:tr>
+      <w:tr>
+        <w:trPr>
+          <w:cantSplit/>
+        </w:trPr>
+        <w:tc>
+          <w:tcPr>
+            <w:tcW w:type="dxa" w:w="520"/>
+            <w:tcBorders>
+              <w:top w:val="single" w:color="BFBFBF" w:sz="4"/>
+              <w:left w:val="single" w:color="BFBFBF" w:sz="4"/>
+              <w:bottom w:val="single" w:color="BFBFBF" w:sz="4"/>
+              <w:right w:val="single" w:color="BFBFBF" w:sz="4"/>
+            </w:tcBorders>
+            <w:shd w:fill="F5F7FB" w:color="auto" w:val="clear"/>
+            <w:tcMar>
+              <w:top w:type="dxa" w:w="70"/>
+              <w:left w:type="dxa" w:w="100"/>
+              <w:bottom w:type="dxa" w:w="70"/>
+              <w:right w:type="dxa" w:w="100"/>
+            </w:tcMar>
+            <w:vAlign w:val="center"/>
+          </w:tcPr>
+          <w:p>
+            <w:pPr>
+              <w:spacing w:after="0" w:before="0" w:line="300"/>
+              <w:jc w:val="center"/>
+            </w:pPr>
+            <w:r>
+              <w:rPr>
+                <w:color w:val="7F7F7F"/>
+                <w:sz w:val="21"/>
+                <w:szCs w:val="21"/>
+              </w:rPr>
+              <w:t xml:space="preserve">6</w:t>
+            </w:r>
+          </w:p>
+        </w:tc>
+        <w:tc>
+          <w:tcPr>
+            <w:tcW w:type="dxa" w:w="2200"/>
+            <w:tcBorders>
+              <w:top w:val="single" w:color="BFBFBF" w:sz="4"/>
+              <w:left w:val="single" w:color="BFBFBF" w:sz="4"/>
+              <w:bottom w:val="single" w:color="BFBFBF" w:sz="4"/>
+              <w:right w:val="single" w:color="BFBFBF" w:sz="4"/>
+            </w:tcBorders>
+            <w:shd w:fill="F5F7FB" w:color="auto" w:val="clear"/>
+            <w:tcMar>
+              <w:top w:type="dxa" w:w="70"/>
+              <w:left w:type="dxa" w:w="100"/>
+              <w:bottom w:type="dxa" w:w="70"/>
+              <w:right w:type="dxa" w:w="100"/>
+            </w:tcMar>
+            <w:vAlign w:val="center"/>
+          </w:tcPr>
+          <w:p>
+            <w:pPr>
+              <w:spacing w:after="0" w:before="0" w:line="300"/>
+            </w:pPr>
+            <w:r>
+              <w:rPr>
+                <w:b/>
+                <w:bCs/>
+                <w:color w:val="1F3864"/>
+                <w:sz w:val="21"/>
+                <w:szCs w:val="21"/>
+              </w:rPr>
+              <w:t xml:space="preserve">Conclusion</w:t>
+            </w:r>
+          </w:p>
+        </w:tc>
+        <w:tc>
+          <w:tcPr>
+            <w:tcW w:type="dxa" w:w="7986"/>
+            <w:tcBorders>
+              <w:top w:val="single" w:color="BFBFBF" w:sz="4"/>
+              <w:left w:val="single" w:color="BFBFBF" w:sz="4"/>
+              <w:bottom w:val="single" w:color="BFBFBF" w:sz="4"/>
+              <w:right w:val="single" w:color="BFBFBF" w:sz="4"/>
+            </w:tcBorders>
+            <w:shd w:fill="F5F7FB" w:color="auto" w:val="clear"/>
+            <w:tcMar>
+              <w:top w:type="dxa" w:w="70"/>
+              <w:left w:type="dxa" w:w="100"/>
+              <w:bottom w:type="dxa" w:w="70"/>
+              <w:right w:type="dxa" w:w="100"/>
+            </w:tcMar>
+            <w:vAlign w:val="center"/>
+          </w:tcPr>
+          <w:p>
+            <w:pPr>
+              <w:tabs>
+                <w:tab w:val="left" w:pos="260"/>
+              </w:tabs>
+              <w:spacing w:after="0" w:before="0" w:line="280"/>
+              <w:ind w:left="260" w:hanging="260"/>
+            </w:pPr>
+            <w:r>
+              <w:rPr>
+                <w:b/>
+                <w:bCs/>
+                <w:color w:val="C00000"/>
+                <w:sz w:val="21"/>
+                <w:szCs w:val="21"/>
+              </w:rPr>
+              <w:t xml:space="preserve">→</w:t>
+            </w:r>
+            <w:r>
+              <w:tab/>
+            </w:r>
+            <w:r>
+              <w:rPr>
+                <w:sz w:val="21"/>
+                <w:szCs w:val="21"/>
+              </w:rPr>
+              <w:t xml:space="preserve">Bound by geography, history and interest</w:t>
+            </w:r>
+          </w:p>
+          <w:p>
+            <w:pPr>
+              <w:tabs>
+                <w:tab w:val="left" w:pos="260"/>
+              </w:tabs>
+              <w:spacing w:after="0" w:before="40" w:line="280"/>
+              <w:ind w:left="260" w:hanging="260"/>
+            </w:pPr>
+            <w:r>
+              <w:rPr>
+                <w:b/>
+                <w:bCs/>
+                <w:color w:val="C00000"/>
+                <w:sz w:val="21"/>
+                <w:szCs w:val="21"/>
+              </w:rPr>
+              <w:t xml:space="preserve">→</w:t>
+            </w:r>
+            <w:r>
+              <w:tab/>
+            </w:r>
+            <w:r>
+              <w:rPr>
+                <w:sz w:val="21"/>
+                <w:szCs w:val="21"/>
+              </w:rPr>
+              <w:t xml:space="preserve">The relationship must outlive governments on both sides</w:t>
+            </w:r>
+          </w:p>
+          <w:p>
+            <w:pPr>
+              <w:tabs>
+                <w:tab w:val="left" w:pos="260"/>
+              </w:tabs>
+              <w:spacing w:after="0" w:before="40" w:line="280"/>
+              <w:ind w:left="260" w:hanging="260"/>
+            </w:pPr>
+            <w:r>
+              <w:rPr>
+                <w:b/>
+                <w:bCs/>
+                <w:color w:val="C00000"/>
+                <w:sz w:val="21"/>
+                <w:szCs w:val="21"/>
+              </w:rPr>
+              <w:t xml:space="preserve">→</w:t>
+            </w:r>
+            <w:r>
+              <w:tab/>
+            </w:r>
+            <w:r>
+              <w:rPr>
+                <w:sz w:val="21"/>
+                <w:szCs w:val="21"/>
+              </w:rPr>
+              <w:t xml:space="preserve">A stable, friendly Bangladesh is vital for the Northeast, eastern security and Act East</w:t>
             </w:r>
           </w:p>
         </w:tc>

</xml_diff>

<commit_message>
Add India–Sri Lanka Relations lecturette
Co-Authored-By: Claude Opus 5.5 <noreply@anthropic.com>
Claude-Session: https://claude.ai/code/session_01EyrV2JLtXrELkAF97b5fch
</commit_message>
<xml_diff>
--- a/SSB_Lecturettes.docx
+++ b/SSB_Lecturettes.docx
@@ -8726,6 +8726,1759 @@
                 <w:szCs w:val="21"/>
               </w:rPr>
               <w:t xml:space="preserve">A stable, friendly Bangladesh is vital for the Northeast, eastern security and Act East</w:t>
+            </w:r>
+          </w:p>
+        </w:tc>
+      </w:tr>
+    </w:tbl>
+    <w:p>
+      <w:pPr>
+        <w:pStyle w:val="Heading1"/>
+        <w:pageBreakBefore/>
+        <w:shd w:fill="1F3864" w:color="auto" w:val="clear"/>
+        <w:spacing w:after="160" w:before="0"/>
+        <w:ind w:left="100" w:right="100"/>
+      </w:pPr>
+      <w:r>
+        <w:t xml:space="preserve">Topic 6: India–Sri Lanka Relations</w:t>
+      </w:r>
+    </w:p>
+    <w:tbl>
+      <w:tblPr>
+        <w:tblW w:type="dxa" w:w="10706"/>
+        <w:tblBorders>
+          <w:top w:val="single" w:color="auto" w:sz="4"/>
+          <w:left w:val="single" w:color="auto" w:sz="4"/>
+          <w:bottom w:val="single" w:color="auto" w:sz="4"/>
+          <w:right w:val="single" w:color="auto" w:sz="4"/>
+          <w:insideH w:val="single" w:color="auto" w:sz="4"/>
+          <w:insideV w:val="single" w:color="auto" w:sz="4"/>
+        </w:tblBorders>
+      </w:tblPr>
+      <w:tblGrid>
+        <w:gridCol w:w="520"/>
+        <w:gridCol w:w="2200"/>
+        <w:gridCol w:w="7986"/>
+      </w:tblGrid>
+      <w:tr>
+        <w:trPr>
+          <w:tblHeader/>
+        </w:trPr>
+        <w:tc>
+          <w:tcPr>
+            <w:tcW w:type="dxa" w:w="520"/>
+            <w:tcBorders>
+              <w:top w:val="single" w:color="BFBFBF" w:sz="4"/>
+              <w:left w:val="single" w:color="BFBFBF" w:sz="4"/>
+              <w:bottom w:val="single" w:color="BFBFBF" w:sz="4"/>
+              <w:right w:val="single" w:color="BFBFBF" w:sz="4"/>
+            </w:tcBorders>
+            <w:shd w:fill="DCE3F0" w:color="auto" w:val="clear"/>
+            <w:tcMar>
+              <w:top w:type="dxa" w:w="70"/>
+              <w:left w:type="dxa" w:w="100"/>
+              <w:bottom w:type="dxa" w:w="70"/>
+              <w:right w:type="dxa" w:w="100"/>
+            </w:tcMar>
+            <w:vAlign w:val="center"/>
+          </w:tcPr>
+          <w:p>
+            <w:pPr>
+              <w:spacing w:after="0" w:before="0" w:line="300"/>
+              <w:jc w:val="center"/>
+            </w:pPr>
+            <w:r>
+              <w:rPr>
+                <w:b/>
+                <w:bCs/>
+                <w:sz w:val="21"/>
+                <w:szCs w:val="21"/>
+              </w:rPr>
+              <w:t xml:space="preserve">#</w:t>
+            </w:r>
+          </w:p>
+        </w:tc>
+        <w:tc>
+          <w:tcPr>
+            <w:tcW w:type="dxa" w:w="2200"/>
+            <w:tcBorders>
+              <w:top w:val="single" w:color="BFBFBF" w:sz="4"/>
+              <w:left w:val="single" w:color="BFBFBF" w:sz="4"/>
+              <w:bottom w:val="single" w:color="BFBFBF" w:sz="4"/>
+              <w:right w:val="single" w:color="BFBFBF" w:sz="4"/>
+            </w:tcBorders>
+            <w:shd w:fill="DCE3F0" w:color="auto" w:val="clear"/>
+            <w:tcMar>
+              <w:top w:type="dxa" w:w="70"/>
+              <w:left w:type="dxa" w:w="100"/>
+              <w:bottom w:type="dxa" w:w="70"/>
+              <w:right w:type="dxa" w:w="100"/>
+            </w:tcMar>
+            <w:vAlign w:val="center"/>
+          </w:tcPr>
+          <w:p>
+            <w:pPr>
+              <w:spacing w:after="0" w:before="0" w:line="300"/>
+            </w:pPr>
+            <w:r>
+              <w:rPr>
+                <w:b/>
+                <w:bCs/>
+                <w:sz w:val="21"/>
+                <w:szCs w:val="21"/>
+              </w:rPr>
+              <w:t xml:space="preserve">Stage</w:t>
+            </w:r>
+          </w:p>
+        </w:tc>
+        <w:tc>
+          <w:tcPr>
+            <w:tcW w:type="dxa" w:w="7986"/>
+            <w:tcBorders>
+              <w:top w:val="single" w:color="BFBFBF" w:sz="4"/>
+              <w:left w:val="single" w:color="BFBFBF" w:sz="4"/>
+              <w:bottom w:val="single" w:color="BFBFBF" w:sz="4"/>
+              <w:right w:val="single" w:color="BFBFBF" w:sz="4"/>
+            </w:tcBorders>
+            <w:shd w:fill="DCE3F0" w:color="auto" w:val="clear"/>
+            <w:tcMar>
+              <w:top w:type="dxa" w:w="70"/>
+              <w:left w:type="dxa" w:w="100"/>
+              <w:bottom w:type="dxa" w:w="70"/>
+              <w:right w:type="dxa" w:w="100"/>
+            </w:tcMar>
+            <w:vAlign w:val="center"/>
+          </w:tcPr>
+          <w:p>
+            <w:pPr>
+              <w:spacing w:after="0" w:before="0" w:line="300"/>
+            </w:pPr>
+            <w:r>
+              <w:rPr>
+                <w:b/>
+                <w:bCs/>
+                <w:sz w:val="21"/>
+                <w:szCs w:val="21"/>
+              </w:rPr>
+              <w:t xml:space="preserve">Flow</w:t>
+            </w:r>
+          </w:p>
+        </w:tc>
+      </w:tr>
+      <w:tr>
+        <w:trPr>
+          <w:cantSplit/>
+        </w:trPr>
+        <w:tc>
+          <w:tcPr>
+            <w:tcW w:type="dxa" w:w="520"/>
+            <w:tcBorders>
+              <w:top w:val="single" w:color="BFBFBF" w:sz="4"/>
+              <w:left w:val="single" w:color="BFBFBF" w:sz="4"/>
+              <w:bottom w:val="single" w:color="BFBFBF" w:sz="4"/>
+              <w:right w:val="single" w:color="BFBFBF" w:sz="4"/>
+            </w:tcBorders>
+            <w:tcMar>
+              <w:top w:type="dxa" w:w="70"/>
+              <w:left w:type="dxa" w:w="100"/>
+              <w:bottom w:type="dxa" w:w="70"/>
+              <w:right w:type="dxa" w:w="100"/>
+            </w:tcMar>
+            <w:vAlign w:val="center"/>
+          </w:tcPr>
+          <w:p>
+            <w:pPr>
+              <w:spacing w:after="0" w:before="0" w:line="300"/>
+              <w:jc w:val="center"/>
+            </w:pPr>
+            <w:r>
+              <w:rPr>
+                <w:color w:val="7F7F7F"/>
+                <w:sz w:val="21"/>
+                <w:szCs w:val="21"/>
+              </w:rPr>
+              <w:t xml:space="preserve">1</w:t>
+            </w:r>
+          </w:p>
+        </w:tc>
+        <w:tc>
+          <w:tcPr>
+            <w:tcW w:type="dxa" w:w="2200"/>
+            <w:tcBorders>
+              <w:top w:val="single" w:color="BFBFBF" w:sz="4"/>
+              <w:left w:val="single" w:color="BFBFBF" w:sz="4"/>
+              <w:bottom w:val="single" w:color="BFBFBF" w:sz="4"/>
+              <w:right w:val="single" w:color="BFBFBF" w:sz="4"/>
+            </w:tcBorders>
+            <w:tcMar>
+              <w:top w:type="dxa" w:w="70"/>
+              <w:left w:type="dxa" w:w="100"/>
+              <w:bottom w:type="dxa" w:w="70"/>
+              <w:right w:type="dxa" w:w="100"/>
+            </w:tcMar>
+            <w:vAlign w:val="center"/>
+          </w:tcPr>
+          <w:p>
+            <w:pPr>
+              <w:spacing w:after="0" w:before="0" w:line="300"/>
+            </w:pPr>
+            <w:r>
+              <w:rPr>
+                <w:b/>
+                <w:bCs/>
+                <w:color w:val="1F3864"/>
+                <w:sz w:val="21"/>
+                <w:szCs w:val="21"/>
+              </w:rPr>
+              <w:t xml:space="preserve">What is it</w:t>
+            </w:r>
+          </w:p>
+        </w:tc>
+        <w:tc>
+          <w:tcPr>
+            <w:tcW w:type="dxa" w:w="7986"/>
+            <w:tcBorders>
+              <w:top w:val="single" w:color="BFBFBF" w:sz="4"/>
+              <w:left w:val="single" w:color="BFBFBF" w:sz="4"/>
+              <w:bottom w:val="single" w:color="BFBFBF" w:sz="4"/>
+              <w:right w:val="single" w:color="BFBFBF" w:sz="4"/>
+            </w:tcBorders>
+            <w:tcMar>
+              <w:top w:type="dxa" w:w="70"/>
+              <w:left w:type="dxa" w:w="100"/>
+              <w:bottom w:type="dxa" w:w="70"/>
+              <w:right w:type="dxa" w:w="100"/>
+            </w:tcMar>
+            <w:vAlign w:val="center"/>
+          </w:tcPr>
+          <w:p>
+            <w:pPr>
+              <w:tabs>
+                <w:tab w:val="left" w:pos="260"/>
+              </w:tabs>
+              <w:spacing w:after="0" w:before="0" w:line="280"/>
+              <w:ind w:left="260" w:hanging="260"/>
+            </w:pPr>
+            <w:r>
+              <w:rPr>
+                <w:b/>
+                <w:bCs/>
+                <w:color w:val="C00000"/>
+                <w:sz w:val="21"/>
+                <w:szCs w:val="21"/>
+              </w:rPr>
+              <w:t xml:space="preserve">→</w:t>
+            </w:r>
+            <w:r>
+              <w:tab/>
+            </w:r>
+            <w:r>
+              <w:rPr>
+                <w:sz w:val="21"/>
+                <w:szCs w:val="21"/>
+              </w:rPr>
+              <w:t xml:space="preserve">Closest maritime neighbour, 30 km away across the Palk Strait</w:t>
+            </w:r>
+          </w:p>
+          <w:p>
+            <w:pPr>
+              <w:tabs>
+                <w:tab w:val="left" w:pos="260"/>
+              </w:tabs>
+              <w:spacing w:after="0" w:before="40" w:line="280"/>
+              <w:ind w:left="260" w:hanging="260"/>
+            </w:pPr>
+            <w:r>
+              <w:rPr>
+                <w:b/>
+                <w:bCs/>
+                <w:color w:val="C00000"/>
+                <w:sz w:val="21"/>
+                <w:szCs w:val="21"/>
+              </w:rPr>
+              <w:t xml:space="preserve">→</w:t>
+            </w:r>
+            <w:r>
+              <w:tab/>
+            </w:r>
+            <w:r>
+              <w:rPr>
+                <w:sz w:val="21"/>
+                <w:szCs w:val="21"/>
+              </w:rPr>
+              <w:t xml:space="preserve">2,500 years of civilisational ties (Buddhism, Ramayana, Tamil links)</w:t>
+            </w:r>
+          </w:p>
+          <w:p>
+            <w:pPr>
+              <w:tabs>
+                <w:tab w:val="left" w:pos="260"/>
+              </w:tabs>
+              <w:spacing w:after="0" w:before="40" w:line="280"/>
+              <w:ind w:left="260" w:hanging="260"/>
+            </w:pPr>
+            <w:r>
+              <w:rPr>
+                <w:b/>
+                <w:bCs/>
+                <w:color w:val="C00000"/>
+                <w:sz w:val="21"/>
+                <w:szCs w:val="21"/>
+              </w:rPr>
+              <w:t xml:space="preserve">→</w:t>
+            </w:r>
+            <w:r>
+              <w:tab/>
+            </w:r>
+            <w:r>
+              <w:rPr>
+                <w:sz w:val="21"/>
+                <w:szCs w:val="21"/>
+              </w:rPr>
+              <w:t xml:space="preserve">Ties since 1948; 1987 Indo-Lanka Accord and IPKF a bitter chapter</w:t>
+            </w:r>
+          </w:p>
+          <w:p>
+            <w:pPr>
+              <w:tabs>
+                <w:tab w:val="left" w:pos="260"/>
+              </w:tabs>
+              <w:spacing w:after="0" w:before="40" w:line="280"/>
+              <w:ind w:left="260" w:hanging="260"/>
+            </w:pPr>
+            <w:r>
+              <w:rPr>
+                <w:b/>
+                <w:bCs/>
+                <w:color w:val="C00000"/>
+                <w:sz w:val="21"/>
+                <w:szCs w:val="21"/>
+              </w:rPr>
+              <w:t xml:space="preserve">→</w:t>
+            </w:r>
+            <w:r>
+              <w:tab/>
+            </w:r>
+            <w:r>
+              <w:rPr>
+                <w:sz w:val="21"/>
+                <w:szCs w:val="21"/>
+              </w:rPr>
+              <w:t xml:space="preserve">Core to Neighbourhood First and MAHASAGAR</w:t>
+            </w:r>
+          </w:p>
+        </w:tc>
+      </w:tr>
+      <w:tr>
+        <w:trPr>
+          <w:cantSplit/>
+        </w:trPr>
+        <w:tc>
+          <w:tcPr>
+            <w:tcW w:type="dxa" w:w="520"/>
+            <w:tcBorders>
+              <w:top w:val="single" w:color="BFBFBF" w:sz="4"/>
+              <w:left w:val="single" w:color="BFBFBF" w:sz="4"/>
+              <w:bottom w:val="single" w:color="BFBFBF" w:sz="4"/>
+              <w:right w:val="single" w:color="BFBFBF" w:sz="4"/>
+            </w:tcBorders>
+            <w:shd w:fill="F5F7FB" w:color="auto" w:val="clear"/>
+            <w:tcMar>
+              <w:top w:type="dxa" w:w="70"/>
+              <w:left w:type="dxa" w:w="100"/>
+              <w:bottom w:type="dxa" w:w="70"/>
+              <w:right w:type="dxa" w:w="100"/>
+            </w:tcMar>
+            <w:vAlign w:val="center"/>
+          </w:tcPr>
+          <w:p>
+            <w:pPr>
+              <w:spacing w:after="0" w:before="0" w:line="300"/>
+              <w:jc w:val="center"/>
+            </w:pPr>
+            <w:r>
+              <w:rPr>
+                <w:color w:val="7F7F7F"/>
+                <w:sz w:val="21"/>
+                <w:szCs w:val="21"/>
+              </w:rPr>
+              <w:t xml:space="preserve">2</w:t>
+            </w:r>
+          </w:p>
+        </w:tc>
+        <w:tc>
+          <w:tcPr>
+            <w:tcW w:type="dxa" w:w="2200"/>
+            <w:tcBorders>
+              <w:top w:val="single" w:color="BFBFBF" w:sz="4"/>
+              <w:left w:val="single" w:color="BFBFBF" w:sz="4"/>
+              <w:bottom w:val="single" w:color="BFBFBF" w:sz="4"/>
+              <w:right w:val="single" w:color="BFBFBF" w:sz="4"/>
+            </w:tcBorders>
+            <w:shd w:fill="F5F7FB" w:color="auto" w:val="clear"/>
+            <w:tcMar>
+              <w:top w:type="dxa" w:w="70"/>
+              <w:left w:type="dxa" w:w="100"/>
+              <w:bottom w:type="dxa" w:w="70"/>
+              <w:right w:type="dxa" w:w="100"/>
+            </w:tcMar>
+            <w:vAlign w:val="center"/>
+          </w:tcPr>
+          <w:p>
+            <w:pPr>
+              <w:spacing w:after="0" w:before="0" w:line="300"/>
+            </w:pPr>
+            <w:r>
+              <w:rPr>
+                <w:b/>
+                <w:bCs/>
+                <w:color w:val="1F3864"/>
+                <w:sz w:val="21"/>
+                <w:szCs w:val="21"/>
+              </w:rPr>
+              <w:t xml:space="preserve">Why it matters</w:t>
+            </w:r>
+          </w:p>
+        </w:tc>
+        <w:tc>
+          <w:tcPr>
+            <w:tcW w:type="dxa" w:w="7986"/>
+            <w:tcBorders>
+              <w:top w:val="single" w:color="BFBFBF" w:sz="4"/>
+              <w:left w:val="single" w:color="BFBFBF" w:sz="4"/>
+              <w:bottom w:val="single" w:color="BFBFBF" w:sz="4"/>
+              <w:right w:val="single" w:color="BFBFBF" w:sz="4"/>
+            </w:tcBorders>
+            <w:shd w:fill="F5F7FB" w:color="auto" w:val="clear"/>
+            <w:tcMar>
+              <w:top w:type="dxa" w:w="70"/>
+              <w:left w:type="dxa" w:w="100"/>
+              <w:bottom w:type="dxa" w:w="70"/>
+              <w:right w:type="dxa" w:w="100"/>
+            </w:tcMar>
+            <w:vAlign w:val="center"/>
+          </w:tcPr>
+          <w:p>
+            <w:pPr>
+              <w:tabs>
+                <w:tab w:val="left" w:pos="260"/>
+              </w:tabs>
+              <w:spacing w:after="0" w:before="0" w:line="280"/>
+              <w:ind w:left="260" w:hanging="260"/>
+            </w:pPr>
+            <w:r>
+              <w:rPr>
+                <w:b/>
+                <w:bCs/>
+                <w:color w:val="C00000"/>
+                <w:sz w:val="21"/>
+                <w:szCs w:val="21"/>
+              </w:rPr>
+              <w:t xml:space="preserve">→</w:t>
+            </w:r>
+            <w:r>
+              <w:tab/>
+            </w:r>
+            <w:r>
+              <w:rPr>
+                <w:b/>
+                <w:bCs/>
+                <w:sz w:val="21"/>
+                <w:szCs w:val="21"/>
+              </w:rPr>
+              <w:t xml:space="preserve">Security:</w:t>
+            </w:r>
+            <w:r>
+              <w:rPr>
+                <w:sz w:val="21"/>
+                <w:szCs w:val="21"/>
+              </w:rPr>
+              <w:t xml:space="preserve"> sits astride key Indian Ocean sea lanes; its soil must not be used against India</w:t>
+            </w:r>
+          </w:p>
+          <w:p>
+            <w:pPr>
+              <w:tabs>
+                <w:tab w:val="left" w:pos="260"/>
+              </w:tabs>
+              <w:spacing w:after="0" w:before="40" w:line="280"/>
+              <w:ind w:left="260" w:hanging="260"/>
+            </w:pPr>
+            <w:r>
+              <w:rPr>
+                <w:b/>
+                <w:bCs/>
+                <w:color w:val="C00000"/>
+                <w:sz w:val="21"/>
+                <w:szCs w:val="21"/>
+              </w:rPr>
+              <w:t xml:space="preserve">→</w:t>
+            </w:r>
+            <w:r>
+              <w:tab/>
+            </w:r>
+            <w:r>
+              <w:rPr>
+                <w:b/>
+                <w:bCs/>
+                <w:sz w:val="21"/>
+                <w:szCs w:val="21"/>
+              </w:rPr>
+              <w:t xml:space="preserve">Strategic:</w:t>
+            </w:r>
+            <w:r>
+              <w:rPr>
+                <w:sz w:val="21"/>
+                <w:szCs w:val="21"/>
+              </w:rPr>
+              <w:t xml:space="preserve"> counters China's Hambantota, ports and research vessels</w:t>
+            </w:r>
+          </w:p>
+          <w:p>
+            <w:pPr>
+              <w:tabs>
+                <w:tab w:val="left" w:pos="260"/>
+              </w:tabs>
+              <w:spacing w:after="0" w:before="40" w:line="280"/>
+              <w:ind w:left="260" w:hanging="260"/>
+            </w:pPr>
+            <w:r>
+              <w:rPr>
+                <w:b/>
+                <w:bCs/>
+                <w:color w:val="C00000"/>
+                <w:sz w:val="21"/>
+                <w:szCs w:val="21"/>
+              </w:rPr>
+              <w:t xml:space="preserve">→</w:t>
+            </w:r>
+            <w:r>
+              <w:tab/>
+            </w:r>
+            <w:r>
+              <w:rPr>
+                <w:b/>
+                <w:bCs/>
+                <w:sz w:val="21"/>
+                <w:szCs w:val="21"/>
+              </w:rPr>
+              <w:t xml:space="preserve">Economic:</w:t>
+            </w:r>
+            <w:r>
+              <w:rPr>
+                <w:sz w:val="21"/>
+                <w:szCs w:val="21"/>
+              </w:rPr>
+              <w:t xml:space="preserve"> India one of Sri Lanka's largest trade partners; key SAARC trade partner</w:t>
+            </w:r>
+          </w:p>
+          <w:p>
+            <w:pPr>
+              <w:tabs>
+                <w:tab w:val="left" w:pos="260"/>
+              </w:tabs>
+              <w:spacing w:after="0" w:before="40" w:line="280"/>
+              <w:ind w:left="260" w:hanging="260"/>
+            </w:pPr>
+            <w:r>
+              <w:rPr>
+                <w:b/>
+                <w:bCs/>
+                <w:color w:val="C00000"/>
+                <w:sz w:val="21"/>
+                <w:szCs w:val="21"/>
+              </w:rPr>
+              <w:t xml:space="preserve">→</w:t>
+            </w:r>
+            <w:r>
+              <w:tab/>
+            </w:r>
+            <w:r>
+              <w:rPr>
+                <w:b/>
+                <w:bCs/>
+                <w:sz w:val="21"/>
+                <w:szCs w:val="21"/>
+              </w:rPr>
+              <w:t xml:space="preserve">Humanitarian:</w:t>
+            </w:r>
+            <w:r>
+              <w:rPr>
+                <w:sz w:val="21"/>
+                <w:szCs w:val="21"/>
+              </w:rPr>
+              <w:t xml:space="preserve"> India as first responder (2022 crisis, Cyclone Ditwah)</w:t>
+            </w:r>
+          </w:p>
+          <w:p>
+            <w:pPr>
+              <w:tabs>
+                <w:tab w:val="left" w:pos="260"/>
+              </w:tabs>
+              <w:spacing w:after="0" w:before="40" w:line="280"/>
+              <w:ind w:left="260" w:hanging="260"/>
+            </w:pPr>
+            <w:r>
+              <w:rPr>
+                <w:b/>
+                <w:bCs/>
+                <w:color w:val="C00000"/>
+                <w:sz w:val="21"/>
+                <w:szCs w:val="21"/>
+              </w:rPr>
+              <w:t xml:space="preserve">→</w:t>
+            </w:r>
+            <w:r>
+              <w:tab/>
+            </w:r>
+            <w:r>
+              <w:rPr>
+                <w:b/>
+                <w:bCs/>
+                <w:sz w:val="21"/>
+                <w:szCs w:val="21"/>
+              </w:rPr>
+              <w:t xml:space="preserve">Tamil Nadu:</w:t>
+            </w:r>
+            <w:r>
+              <w:rPr>
+                <w:sz w:val="21"/>
+                <w:szCs w:val="21"/>
+              </w:rPr>
+              <w:t xml:space="preserve"> Tamil and fishermen interests</w:t>
+            </w:r>
+          </w:p>
+        </w:tc>
+      </w:tr>
+      <w:tr>
+        <w:trPr>
+          <w:cantSplit/>
+        </w:trPr>
+        <w:tc>
+          <w:tcPr>
+            <w:tcW w:type="dxa" w:w="520"/>
+            <w:tcBorders>
+              <w:top w:val="single" w:color="BFBFBF" w:sz="4"/>
+              <w:left w:val="single" w:color="BFBFBF" w:sz="4"/>
+              <w:bottom w:val="single" w:color="BFBFBF" w:sz="4"/>
+              <w:right w:val="single" w:color="BFBFBF" w:sz="4"/>
+            </w:tcBorders>
+            <w:tcMar>
+              <w:top w:type="dxa" w:w="70"/>
+              <w:left w:type="dxa" w:w="100"/>
+              <w:bottom w:type="dxa" w:w="70"/>
+              <w:right w:type="dxa" w:w="100"/>
+            </w:tcMar>
+            <w:vAlign w:val="center"/>
+          </w:tcPr>
+          <w:p>
+            <w:pPr>
+              <w:spacing w:after="0" w:before="0" w:line="300"/>
+              <w:jc w:val="center"/>
+            </w:pPr>
+            <w:r>
+              <w:rPr>
+                <w:color w:val="7F7F7F"/>
+                <w:sz w:val="21"/>
+                <w:szCs w:val="21"/>
+              </w:rPr>
+              <w:t xml:space="preserve">3</w:t>
+            </w:r>
+          </w:p>
+        </w:tc>
+        <w:tc>
+          <w:tcPr>
+            <w:tcW w:type="dxa" w:w="2200"/>
+            <w:tcBorders>
+              <w:top w:val="single" w:color="BFBFBF" w:sz="4"/>
+              <w:left w:val="single" w:color="BFBFBF" w:sz="4"/>
+              <w:bottom w:val="single" w:color="BFBFBF" w:sz="4"/>
+              <w:right w:val="single" w:color="BFBFBF" w:sz="4"/>
+            </w:tcBorders>
+            <w:tcMar>
+              <w:top w:type="dxa" w:w="70"/>
+              <w:left w:type="dxa" w:w="100"/>
+              <w:bottom w:type="dxa" w:w="70"/>
+              <w:right w:type="dxa" w:w="100"/>
+            </w:tcMar>
+            <w:vAlign w:val="center"/>
+          </w:tcPr>
+          <w:p>
+            <w:pPr>
+              <w:spacing w:after="0" w:before="0" w:line="300"/>
+            </w:pPr>
+            <w:r>
+              <w:rPr>
+                <w:b/>
+                <w:bCs/>
+                <w:color w:val="1F3864"/>
+                <w:sz w:val="21"/>
+                <w:szCs w:val="21"/>
+              </w:rPr>
+              <w:t xml:space="preserve">Current status (Sept 2026)</w:t>
+            </w:r>
+          </w:p>
+        </w:tc>
+        <w:tc>
+          <w:tcPr>
+            <w:tcW w:type="dxa" w:w="7986"/>
+            <w:tcBorders>
+              <w:top w:val="single" w:color="BFBFBF" w:sz="4"/>
+              <w:left w:val="single" w:color="BFBFBF" w:sz="4"/>
+              <w:bottom w:val="single" w:color="BFBFBF" w:sz="4"/>
+              <w:right w:val="single" w:color="BFBFBF" w:sz="4"/>
+            </w:tcBorders>
+            <w:tcMar>
+              <w:top w:type="dxa" w:w="70"/>
+              <w:left w:type="dxa" w:w="100"/>
+              <w:bottom w:type="dxa" w:w="70"/>
+              <w:right w:type="dxa" w:w="100"/>
+            </w:tcMar>
+            <w:vAlign w:val="center"/>
+          </w:tcPr>
+          <w:p>
+            <w:pPr>
+              <w:tabs>
+                <w:tab w:val="left" w:pos="260"/>
+              </w:tabs>
+              <w:spacing w:after="0" w:before="0" w:line="280"/>
+              <w:ind w:left="260" w:hanging="260"/>
+            </w:pPr>
+            <w:r>
+              <w:rPr>
+                <w:b/>
+                <w:bCs/>
+                <w:color w:val="C00000"/>
+                <w:sz w:val="21"/>
+                <w:szCs w:val="21"/>
+              </w:rPr>
+              <w:t xml:space="preserve">→</w:t>
+            </w:r>
+            <w:r>
+              <w:tab/>
+            </w:r>
+            <w:r>
+              <w:rPr>
+                <w:b/>
+                <w:bCs/>
+                <w:sz w:val="21"/>
+                <w:szCs w:val="21"/>
+              </w:rPr>
+              <w:t xml:space="preserve">Defence:</w:t>
+            </w:r>
+            <w:r>
+              <w:rPr>
+                <w:sz w:val="21"/>
+                <w:szCs w:val="21"/>
+              </w:rPr>
+              <w:t xml:space="preserve"> Rajnath Singh in Colombo (9 Sep 2026), first defence minister visit in about 38 years; 3 MoUs (L70 gun upgrades, NCC and defence college cooperation, youth exchanges)</w:t>
+            </w:r>
+          </w:p>
+          <w:p>
+            <w:pPr>
+              <w:tabs>
+                <w:tab w:val="left" w:pos="260"/>
+              </w:tabs>
+              <w:spacing w:after="0" w:before="40" w:line="280"/>
+              <w:ind w:left="260" w:hanging="260"/>
+            </w:pPr>
+            <w:r>
+              <w:rPr>
+                <w:b/>
+                <w:bCs/>
+                <w:color w:val="C00000"/>
+                <w:sz w:val="21"/>
+                <w:szCs w:val="21"/>
+              </w:rPr>
+              <w:t xml:space="preserve">→</w:t>
+            </w:r>
+            <w:r>
+              <w:tab/>
+            </w:r>
+            <w:r>
+              <w:rPr>
+                <w:b/>
+                <w:bCs/>
+                <w:sz w:val="21"/>
+                <w:szCs w:val="21"/>
+              </w:rPr>
+              <w:t xml:space="preserve">Assurance:</w:t>
+            </w:r>
+            <w:r>
+              <w:rPr>
+                <w:sz w:val="21"/>
+                <w:szCs w:val="21"/>
+              </w:rPr>
+              <w:t xml:space="preserve"> President Dissanayake says Sri Lankan territory will never be used against India</w:t>
+            </w:r>
+          </w:p>
+          <w:p>
+            <w:pPr>
+              <w:tabs>
+                <w:tab w:val="left" w:pos="260"/>
+              </w:tabs>
+              <w:spacing w:after="0" w:before="40" w:line="280"/>
+              <w:ind w:left="260" w:hanging="260"/>
+            </w:pPr>
+            <w:r>
+              <w:rPr>
+                <w:b/>
+                <w:bCs/>
+                <w:color w:val="C00000"/>
+                <w:sz w:val="21"/>
+                <w:szCs w:val="21"/>
+              </w:rPr>
+              <w:t xml:space="preserve">→</w:t>
+            </w:r>
+            <w:r>
+              <w:tab/>
+            </w:r>
+            <w:r>
+              <w:rPr>
+                <w:b/>
+                <w:bCs/>
+                <w:sz w:val="21"/>
+                <w:szCs w:val="21"/>
+              </w:rPr>
+              <w:t xml:space="preserve">Cyclone Ditwah:</w:t>
+            </w:r>
+            <w:r>
+              <w:rPr>
+                <w:sz w:val="21"/>
+                <w:szCs w:val="21"/>
+              </w:rPr>
+              <w:t xml:space="preserve"> $450 mn relief package (Dec 2025); rupee lines of credit of $250 mn for railways and $100 mn for livestock (Aug 2026); Indian Bailey bridges, Northern Railway restored</w:t>
+            </w:r>
+          </w:p>
+          <w:p>
+            <w:pPr>
+              <w:tabs>
+                <w:tab w:val="left" w:pos="260"/>
+              </w:tabs>
+              <w:spacing w:after="0" w:before="40" w:line="280"/>
+              <w:ind w:left="260" w:hanging="260"/>
+            </w:pPr>
+            <w:r>
+              <w:rPr>
+                <w:b/>
+                <w:bCs/>
+                <w:color w:val="C00000"/>
+                <w:sz w:val="21"/>
+                <w:szCs w:val="21"/>
+              </w:rPr>
+              <w:t xml:space="preserve">→</w:t>
+            </w:r>
+            <w:r>
+              <w:tab/>
+            </w:r>
+            <w:r>
+              <w:rPr>
+                <w:b/>
+                <w:bCs/>
+                <w:sz w:val="21"/>
+                <w:szCs w:val="21"/>
+              </w:rPr>
+              <w:t xml:space="preserve">Earlier anchor:</w:t>
+            </w:r>
+            <w:r>
+              <w:rPr>
+                <w:sz w:val="21"/>
+                <w:szCs w:val="21"/>
+              </w:rPr>
+              <w:t xml:space="preserve"> Modi's visit (Apr 2025): first defence umbrella MoU, Trincomalee energy hub with UAE, grid interconnection, over $100 mn loans turned into grants</w:t>
+            </w:r>
+          </w:p>
+          <w:p>
+            <w:pPr>
+              <w:tabs>
+                <w:tab w:val="left" w:pos="260"/>
+              </w:tabs>
+              <w:spacing w:after="0" w:before="40" w:line="280"/>
+              <w:ind w:left="260" w:hanging="260"/>
+            </w:pPr>
+            <w:r>
+              <w:rPr>
+                <w:b/>
+                <w:bCs/>
+                <w:color w:val="C00000"/>
+                <w:sz w:val="21"/>
+                <w:szCs w:val="21"/>
+              </w:rPr>
+              <w:t xml:space="preserve">→</w:t>
+            </w:r>
+            <w:r>
+              <w:tab/>
+            </w:r>
+            <w:r>
+              <w:rPr>
+                <w:b/>
+                <w:bCs/>
+                <w:sz w:val="21"/>
+                <w:szCs w:val="21"/>
+              </w:rPr>
+              <w:t xml:space="preserve">Outreach:</w:t>
+            </w:r>
+            <w:r>
+              <w:rPr>
+                <w:sz w:val="21"/>
+                <w:szCs w:val="21"/>
+              </w:rPr>
+              <w:t xml:space="preserve"> VP Radhakrishnan's visit (Apr 2026): 4,000 houses for estate workers, scholarships; Dissanayake at India AI Impact Summit (Feb 2026)</w:t>
+            </w:r>
+          </w:p>
+        </w:tc>
+      </w:tr>
+      <w:tr>
+        <w:trPr>
+          <w:cantSplit/>
+        </w:trPr>
+        <w:tc>
+          <w:tcPr>
+            <w:tcW w:type="dxa" w:w="520"/>
+            <w:tcBorders>
+              <w:top w:val="single" w:color="BFBFBF" w:sz="4"/>
+              <w:left w:val="single" w:color="BFBFBF" w:sz="4"/>
+              <w:bottom w:val="single" w:color="BFBFBF" w:sz="4"/>
+              <w:right w:val="single" w:color="BFBFBF" w:sz="4"/>
+            </w:tcBorders>
+            <w:shd w:fill="F5F7FB" w:color="auto" w:val="clear"/>
+            <w:tcMar>
+              <w:top w:type="dxa" w:w="70"/>
+              <w:left w:type="dxa" w:w="100"/>
+              <w:bottom w:type="dxa" w:w="70"/>
+              <w:right w:type="dxa" w:w="100"/>
+            </w:tcMar>
+            <w:vAlign w:val="center"/>
+          </w:tcPr>
+          <w:p>
+            <w:pPr>
+              <w:spacing w:after="0" w:before="0" w:line="300"/>
+              <w:jc w:val="center"/>
+            </w:pPr>
+            <w:r>
+              <w:rPr>
+                <w:color w:val="7F7F7F"/>
+                <w:sz w:val="21"/>
+                <w:szCs w:val="21"/>
+              </w:rPr>
+              <w:t xml:space="preserve">4</w:t>
+            </w:r>
+          </w:p>
+        </w:tc>
+        <w:tc>
+          <w:tcPr>
+            <w:tcW w:type="dxa" w:w="2200"/>
+            <w:tcBorders>
+              <w:top w:val="single" w:color="BFBFBF" w:sz="4"/>
+              <w:left w:val="single" w:color="BFBFBF" w:sz="4"/>
+              <w:bottom w:val="single" w:color="BFBFBF" w:sz="4"/>
+              <w:right w:val="single" w:color="BFBFBF" w:sz="4"/>
+            </w:tcBorders>
+            <w:shd w:fill="F5F7FB" w:color="auto" w:val="clear"/>
+            <w:tcMar>
+              <w:top w:type="dxa" w:w="70"/>
+              <w:left w:type="dxa" w:w="100"/>
+              <w:bottom w:type="dxa" w:w="70"/>
+              <w:right w:type="dxa" w:w="100"/>
+            </w:tcMar>
+            <w:vAlign w:val="center"/>
+          </w:tcPr>
+          <w:p>
+            <w:pPr>
+              <w:spacing w:after="0" w:before="0" w:line="300"/>
+            </w:pPr>
+            <w:r>
+              <w:rPr>
+                <w:b/>
+                <w:bCs/>
+                <w:color w:val="1F3864"/>
+                <w:sz w:val="21"/>
+                <w:szCs w:val="21"/>
+              </w:rPr>
+              <w:t xml:space="preserve">Problems</w:t>
+            </w:r>
+          </w:p>
+        </w:tc>
+        <w:tc>
+          <w:tcPr>
+            <w:tcW w:type="dxa" w:w="7986"/>
+            <w:tcBorders>
+              <w:top w:val="single" w:color="BFBFBF" w:sz="4"/>
+              <w:left w:val="single" w:color="BFBFBF" w:sz="4"/>
+              <w:bottom w:val="single" w:color="BFBFBF" w:sz="4"/>
+              <w:right w:val="single" w:color="BFBFBF" w:sz="4"/>
+            </w:tcBorders>
+            <w:shd w:fill="F5F7FB" w:color="auto" w:val="clear"/>
+            <w:tcMar>
+              <w:top w:type="dxa" w:w="70"/>
+              <w:left w:type="dxa" w:w="100"/>
+              <w:bottom w:type="dxa" w:w="70"/>
+              <w:right w:type="dxa" w:w="100"/>
+            </w:tcMar>
+            <w:vAlign w:val="center"/>
+          </w:tcPr>
+          <w:p>
+            <w:pPr>
+              <w:tabs>
+                <w:tab w:val="left" w:pos="260"/>
+              </w:tabs>
+              <w:spacing w:after="0" w:before="0" w:line="280"/>
+              <w:ind w:left="260" w:hanging="260"/>
+            </w:pPr>
+            <w:r>
+              <w:rPr>
+                <w:b/>
+                <w:bCs/>
+                <w:color w:val="C00000"/>
+                <w:sz w:val="21"/>
+                <w:szCs w:val="21"/>
+              </w:rPr>
+              <w:t xml:space="preserve">→</w:t>
+            </w:r>
+            <w:r>
+              <w:tab/>
+            </w:r>
+            <w:r>
+              <w:rPr>
+                <w:b/>
+                <w:bCs/>
+                <w:sz w:val="21"/>
+                <w:szCs w:val="21"/>
+              </w:rPr>
+              <w:t xml:space="preserve">Fishermen:</w:t>
+            </w:r>
+            <w:r>
+              <w:rPr>
+                <w:sz w:val="21"/>
+                <w:szCs w:val="21"/>
+              </w:rPr>
+              <w:t xml:space="preserve"> Indian trawlers in Sri Lankan waters, arrests, bottom-trawling damage</w:t>
+            </w:r>
+          </w:p>
+          <w:p>
+            <w:pPr>
+              <w:tabs>
+                <w:tab w:val="left" w:pos="260"/>
+              </w:tabs>
+              <w:spacing w:after="0" w:before="40" w:line="280"/>
+              <w:ind w:left="260" w:hanging="260"/>
+            </w:pPr>
+            <w:r>
+              <w:rPr>
+                <w:b/>
+                <w:bCs/>
+                <w:color w:val="C00000"/>
+                <w:sz w:val="21"/>
+                <w:szCs w:val="21"/>
+              </w:rPr>
+              <w:t xml:space="preserve">→</w:t>
+            </w:r>
+            <w:r>
+              <w:tab/>
+            </w:r>
+            <w:r>
+              <w:rPr>
+                <w:sz w:val="21"/>
+                <w:szCs w:val="21"/>
+              </w:rPr>
+              <w:t xml:space="preserve">Katchatheevu row in Tamil Nadu politics</w:t>
+            </w:r>
+          </w:p>
+          <w:p>
+            <w:pPr>
+              <w:tabs>
+                <w:tab w:val="left" w:pos="260"/>
+              </w:tabs>
+              <w:spacing w:after="0" w:before="40" w:line="280"/>
+              <w:ind w:left="260" w:hanging="260"/>
+            </w:pPr>
+            <w:r>
+              <w:rPr>
+                <w:b/>
+                <w:bCs/>
+                <w:color w:val="C00000"/>
+                <w:sz w:val="21"/>
+                <w:szCs w:val="21"/>
+              </w:rPr>
+              <w:t xml:space="preserve">→</w:t>
+            </w:r>
+            <w:r>
+              <w:tab/>
+            </w:r>
+            <w:r>
+              <w:rPr>
+                <w:b/>
+                <w:bCs/>
+                <w:sz w:val="21"/>
+                <w:szCs w:val="21"/>
+              </w:rPr>
+              <w:t xml:space="preserve">China's footprint:</w:t>
+            </w:r>
+            <w:r>
+              <w:rPr>
+                <w:sz w:val="21"/>
+                <w:szCs w:val="21"/>
+              </w:rPr>
+              <w:t xml:space="preserve"> Sinopec refinery at Hambantota, research vessel visits, lapsed moratorium on such ships</w:t>
+            </w:r>
+          </w:p>
+          <w:p>
+            <w:pPr>
+              <w:tabs>
+                <w:tab w:val="left" w:pos="260"/>
+              </w:tabs>
+              <w:spacing w:after="0" w:before="40" w:line="280"/>
+              <w:ind w:left="260" w:hanging="260"/>
+            </w:pPr>
+            <w:r>
+              <w:rPr>
+                <w:b/>
+                <w:bCs/>
+                <w:color w:val="C00000"/>
+                <w:sz w:val="21"/>
+                <w:szCs w:val="21"/>
+              </w:rPr>
+              <w:t xml:space="preserve">→</w:t>
+            </w:r>
+            <w:r>
+              <w:tab/>
+            </w:r>
+            <w:r>
+              <w:rPr>
+                <w:b/>
+                <w:bCs/>
+                <w:sz w:val="21"/>
+                <w:szCs w:val="21"/>
+              </w:rPr>
+              <w:t xml:space="preserve">Tamil aspirations:</w:t>
+            </w:r>
+            <w:r>
+              <w:rPr>
+                <w:sz w:val="21"/>
+                <w:szCs w:val="21"/>
+              </w:rPr>
+              <w:t xml:space="preserve"> 13th Amendment, provincial council elections</w:t>
+            </w:r>
+          </w:p>
+          <w:p>
+            <w:pPr>
+              <w:tabs>
+                <w:tab w:val="left" w:pos="260"/>
+              </w:tabs>
+              <w:spacing w:after="0" w:before="40" w:line="280"/>
+              <w:ind w:left="260" w:hanging="260"/>
+            </w:pPr>
+            <w:r>
+              <w:rPr>
+                <w:b/>
+                <w:bCs/>
+                <w:color w:val="C00000"/>
+                <w:sz w:val="21"/>
+                <w:szCs w:val="21"/>
+              </w:rPr>
+              <w:t xml:space="preserve">→</w:t>
+            </w:r>
+            <w:r>
+              <w:tab/>
+            </w:r>
+            <w:r>
+              <w:rPr>
+                <w:sz w:val="21"/>
+                <w:szCs w:val="21"/>
+              </w:rPr>
+              <w:t xml:space="preserve">Nationalist backlash against ETCA and Indian dominance</w:t>
+            </w:r>
+          </w:p>
+          <w:p>
+            <w:pPr>
+              <w:tabs>
+                <w:tab w:val="left" w:pos="260"/>
+              </w:tabs>
+              <w:spacing w:after="0" w:before="40" w:line="280"/>
+              <w:ind w:left="260" w:hanging="260"/>
+            </w:pPr>
+            <w:r>
+              <w:rPr>
+                <w:b/>
+                <w:bCs/>
+                <w:color w:val="C00000"/>
+                <w:sz w:val="21"/>
+                <w:szCs w:val="21"/>
+              </w:rPr>
+              <w:t xml:space="preserve">→</w:t>
+            </w:r>
+            <w:r>
+              <w:tab/>
+            </w:r>
+            <w:r>
+              <w:rPr>
+                <w:sz w:val="21"/>
+                <w:szCs w:val="21"/>
+              </w:rPr>
+              <w:t xml:space="preserve">Debt and economic fragility</w:t>
+            </w:r>
+          </w:p>
+          <w:p>
+            <w:pPr>
+              <w:tabs>
+                <w:tab w:val="left" w:pos="260"/>
+              </w:tabs>
+              <w:spacing w:after="0" w:before="40" w:line="280"/>
+              <w:ind w:left="260" w:hanging="260"/>
+            </w:pPr>
+            <w:r>
+              <w:rPr>
+                <w:b/>
+                <w:bCs/>
+                <w:color w:val="C00000"/>
+                <w:sz w:val="21"/>
+                <w:szCs w:val="21"/>
+              </w:rPr>
+              <w:t xml:space="preserve">→</w:t>
+            </w:r>
+            <w:r>
+              <w:tab/>
+            </w:r>
+            <w:r>
+              <w:rPr>
+                <w:sz w:val="21"/>
+                <w:szCs w:val="21"/>
+              </w:rPr>
+              <w:t xml:space="preserve">Sri Lanka balancing between India and China</w:t>
+            </w:r>
+          </w:p>
+        </w:tc>
+      </w:tr>
+      <w:tr>
+        <w:trPr>
+          <w:cantSplit/>
+        </w:trPr>
+        <w:tc>
+          <w:tcPr>
+            <w:tcW w:type="dxa" w:w="520"/>
+            <w:tcBorders>
+              <w:top w:val="single" w:color="BFBFBF" w:sz="4"/>
+              <w:left w:val="single" w:color="BFBFBF" w:sz="4"/>
+              <w:bottom w:val="single" w:color="BFBFBF" w:sz="4"/>
+              <w:right w:val="single" w:color="BFBFBF" w:sz="4"/>
+            </w:tcBorders>
+            <w:tcMar>
+              <w:top w:type="dxa" w:w="70"/>
+              <w:left w:type="dxa" w:w="100"/>
+              <w:bottom w:type="dxa" w:w="70"/>
+              <w:right w:type="dxa" w:w="100"/>
+            </w:tcMar>
+            <w:vAlign w:val="center"/>
+          </w:tcPr>
+          <w:p>
+            <w:pPr>
+              <w:spacing w:after="0" w:before="0" w:line="300"/>
+              <w:jc w:val="center"/>
+            </w:pPr>
+            <w:r>
+              <w:rPr>
+                <w:color w:val="7F7F7F"/>
+                <w:sz w:val="21"/>
+                <w:szCs w:val="21"/>
+              </w:rPr>
+              <w:t xml:space="preserve">5</w:t>
+            </w:r>
+          </w:p>
+        </w:tc>
+        <w:tc>
+          <w:tcPr>
+            <w:tcW w:type="dxa" w:w="2200"/>
+            <w:tcBorders>
+              <w:top w:val="single" w:color="BFBFBF" w:sz="4"/>
+              <w:left w:val="single" w:color="BFBFBF" w:sz="4"/>
+              <w:bottom w:val="single" w:color="BFBFBF" w:sz="4"/>
+              <w:right w:val="single" w:color="BFBFBF" w:sz="4"/>
+            </w:tcBorders>
+            <w:tcMar>
+              <w:top w:type="dxa" w:w="70"/>
+              <w:left w:type="dxa" w:w="100"/>
+              <w:bottom w:type="dxa" w:w="70"/>
+              <w:right w:type="dxa" w:w="100"/>
+            </w:tcMar>
+            <w:vAlign w:val="center"/>
+          </w:tcPr>
+          <w:p>
+            <w:pPr>
+              <w:spacing w:after="0" w:before="0" w:line="300"/>
+            </w:pPr>
+            <w:r>
+              <w:rPr>
+                <w:b/>
+                <w:bCs/>
+                <w:color w:val="1F3864"/>
+                <w:sz w:val="21"/>
+                <w:szCs w:val="21"/>
+              </w:rPr>
+              <w:t xml:space="preserve">Solutions</w:t>
+            </w:r>
+          </w:p>
+        </w:tc>
+        <w:tc>
+          <w:tcPr>
+            <w:tcW w:type="dxa" w:w="7986"/>
+            <w:tcBorders>
+              <w:top w:val="single" w:color="BFBFBF" w:sz="4"/>
+              <w:left w:val="single" w:color="BFBFBF" w:sz="4"/>
+              <w:bottom w:val="single" w:color="BFBFBF" w:sz="4"/>
+              <w:right w:val="single" w:color="BFBFBF" w:sz="4"/>
+            </w:tcBorders>
+            <w:tcMar>
+              <w:top w:type="dxa" w:w="70"/>
+              <w:left w:type="dxa" w:w="100"/>
+              <w:bottom w:type="dxa" w:w="70"/>
+              <w:right w:type="dxa" w:w="100"/>
+            </w:tcMar>
+            <w:vAlign w:val="center"/>
+          </w:tcPr>
+          <w:p>
+            <w:pPr>
+              <w:tabs>
+                <w:tab w:val="left" w:pos="260"/>
+              </w:tabs>
+              <w:spacing w:after="0" w:before="0" w:line="280"/>
+              <w:ind w:left="260" w:hanging="260"/>
+            </w:pPr>
+            <w:r>
+              <w:rPr>
+                <w:b/>
+                <w:bCs/>
+                <w:color w:val="C00000"/>
+                <w:sz w:val="21"/>
+                <w:szCs w:val="21"/>
+              </w:rPr>
+              <w:t xml:space="preserve">→</w:t>
+            </w:r>
+            <w:r>
+              <w:tab/>
+            </w:r>
+            <w:r>
+              <w:rPr>
+                <w:b/>
+                <w:bCs/>
+                <w:sz w:val="21"/>
+                <w:szCs w:val="21"/>
+              </w:rPr>
+              <w:t xml:space="preserve">Fishermen:</w:t>
+            </w:r>
+            <w:r>
+              <w:rPr>
+                <w:sz w:val="21"/>
+                <w:szCs w:val="21"/>
+              </w:rPr>
+              <w:t xml:space="preserve"> joint working group, shift to deep-sea fishing, alternative livelihoods, humane handling</w:t>
+            </w:r>
+          </w:p>
+          <w:p>
+            <w:pPr>
+              <w:tabs>
+                <w:tab w:val="left" w:pos="260"/>
+              </w:tabs>
+              <w:spacing w:after="0" w:before="40" w:line="280"/>
+              <w:ind w:left="260" w:hanging="260"/>
+            </w:pPr>
+            <w:r>
+              <w:rPr>
+                <w:b/>
+                <w:bCs/>
+                <w:color w:val="C00000"/>
+                <w:sz w:val="21"/>
+                <w:szCs w:val="21"/>
+              </w:rPr>
+              <w:t xml:space="preserve">→</w:t>
+            </w:r>
+            <w:r>
+              <w:tab/>
+            </w:r>
+            <w:r>
+              <w:rPr>
+                <w:sz w:val="21"/>
+                <w:szCs w:val="21"/>
+              </w:rPr>
+              <w:t xml:space="preserve">Hold Sri Lanka to its security commitment; monitor Chinese ship visits</w:t>
+            </w:r>
+          </w:p>
+          <w:p>
+            <w:pPr>
+              <w:tabs>
+                <w:tab w:val="left" w:pos="260"/>
+              </w:tabs>
+              <w:spacing w:after="0" w:before="40" w:line="280"/>
+              <w:ind w:left="260" w:hanging="260"/>
+            </w:pPr>
+            <w:r>
+              <w:rPr>
+                <w:b/>
+                <w:bCs/>
+                <w:color w:val="C00000"/>
+                <w:sz w:val="21"/>
+                <w:szCs w:val="21"/>
+              </w:rPr>
+              <w:t xml:space="preserve">→</w:t>
+            </w:r>
+            <w:r>
+              <w:tab/>
+            </w:r>
+            <w:r>
+              <w:rPr>
+                <w:b/>
+                <w:bCs/>
+                <w:sz w:val="21"/>
+                <w:szCs w:val="21"/>
+              </w:rPr>
+              <w:t xml:space="preserve">Deepen defence ties:</w:t>
+            </w:r>
+            <w:r>
+              <w:rPr>
+                <w:sz w:val="21"/>
+                <w:szCs w:val="21"/>
+              </w:rPr>
+              <w:t xml:space="preserve"> Mitra Shakti, SLINEX, Colombo Security Conclave, training</w:t>
+            </w:r>
+          </w:p>
+          <w:p>
+            <w:pPr>
+              <w:tabs>
+                <w:tab w:val="left" w:pos="260"/>
+              </w:tabs>
+              <w:spacing w:after="0" w:before="40" w:line="280"/>
+              <w:ind w:left="260" w:hanging="260"/>
+            </w:pPr>
+            <w:r>
+              <w:rPr>
+                <w:b/>
+                <w:bCs/>
+                <w:color w:val="C00000"/>
+                <w:sz w:val="21"/>
+                <w:szCs w:val="21"/>
+              </w:rPr>
+              <w:t xml:space="preserve">→</w:t>
+            </w:r>
+            <w:r>
+              <w:tab/>
+            </w:r>
+            <w:r>
+              <w:rPr>
+                <w:b/>
+                <w:bCs/>
+                <w:sz w:val="21"/>
+                <w:szCs w:val="21"/>
+              </w:rPr>
+              <w:t xml:space="preserve">Economic anchors:</w:t>
+            </w:r>
+            <w:r>
+              <w:rPr>
+                <w:sz w:val="21"/>
+                <w:szCs w:val="21"/>
+              </w:rPr>
+              <w:t xml:space="preserve"> Trincomalee hub, grid link, power trade, ports, UPI, development grants</w:t>
+            </w:r>
+          </w:p>
+          <w:p>
+            <w:pPr>
+              <w:tabs>
+                <w:tab w:val="left" w:pos="260"/>
+              </w:tabs>
+              <w:spacing w:after="0" w:before="40" w:line="280"/>
+              <w:ind w:left="260" w:hanging="260"/>
+            </w:pPr>
+            <w:r>
+              <w:rPr>
+                <w:b/>
+                <w:bCs/>
+                <w:color w:val="C00000"/>
+                <w:sz w:val="21"/>
+                <w:szCs w:val="21"/>
+              </w:rPr>
+              <w:t xml:space="preserve">→</w:t>
+            </w:r>
+            <w:r>
+              <w:tab/>
+            </w:r>
+            <w:r>
+              <w:rPr>
+                <w:sz w:val="21"/>
+                <w:szCs w:val="21"/>
+              </w:rPr>
+              <w:t xml:space="preserve">Debt support and tourism</w:t>
+            </w:r>
+          </w:p>
+          <w:p>
+            <w:pPr>
+              <w:tabs>
+                <w:tab w:val="left" w:pos="260"/>
+              </w:tabs>
+              <w:spacing w:after="0" w:before="40" w:line="280"/>
+              <w:ind w:left="260" w:hanging="260"/>
+            </w:pPr>
+            <w:r>
+              <w:rPr>
+                <w:b/>
+                <w:bCs/>
+                <w:color w:val="C00000"/>
+                <w:sz w:val="21"/>
+                <w:szCs w:val="21"/>
+              </w:rPr>
+              <w:t xml:space="preserve">→</w:t>
+            </w:r>
+            <w:r>
+              <w:tab/>
+            </w:r>
+            <w:r>
+              <w:rPr>
+                <w:b/>
+                <w:bCs/>
+                <w:sz w:val="21"/>
+                <w:szCs w:val="21"/>
+              </w:rPr>
+              <w:t xml:space="preserve">Tamil issue:</w:t>
+            </w:r>
+            <w:r>
+              <w:rPr>
+                <w:sz w:val="21"/>
+                <w:szCs w:val="21"/>
+              </w:rPr>
+              <w:t xml:space="preserve"> quietly encourage devolution and provincial elections</w:t>
+            </w:r>
+          </w:p>
+          <w:p>
+            <w:pPr>
+              <w:tabs>
+                <w:tab w:val="left" w:pos="260"/>
+              </w:tabs>
+              <w:spacing w:after="0" w:before="40" w:line="280"/>
+              <w:ind w:left="260" w:hanging="260"/>
+            </w:pPr>
+            <w:r>
+              <w:rPr>
+                <w:b/>
+                <w:bCs/>
+                <w:color w:val="C00000"/>
+                <w:sz w:val="21"/>
+                <w:szCs w:val="21"/>
+              </w:rPr>
+              <w:t xml:space="preserve">→</w:t>
+            </w:r>
+            <w:r>
+              <w:tab/>
+            </w:r>
+            <w:r>
+              <w:rPr>
+                <w:sz w:val="21"/>
+                <w:szCs w:val="21"/>
+              </w:rPr>
+              <w:t xml:space="preserve">Handle Katchatheevu sensitively, no public brinkmanship</w:t>
+            </w:r>
+          </w:p>
+          <w:p>
+            <w:pPr>
+              <w:tabs>
+                <w:tab w:val="left" w:pos="260"/>
+              </w:tabs>
+              <w:spacing w:after="0" w:before="40" w:line="280"/>
+              <w:ind w:left="260" w:hanging="260"/>
+            </w:pPr>
+            <w:r>
+              <w:rPr>
+                <w:b/>
+                <w:bCs/>
+                <w:color w:val="C00000"/>
+                <w:sz w:val="21"/>
+                <w:szCs w:val="21"/>
+              </w:rPr>
+              <w:t xml:space="preserve">→</w:t>
+            </w:r>
+            <w:r>
+              <w:tab/>
+            </w:r>
+            <w:r>
+              <w:rPr>
+                <w:sz w:val="21"/>
+                <w:szCs w:val="21"/>
+              </w:rPr>
+              <w:t xml:space="preserve">Respect Sri Lanka's sovereignty</w:t>
+            </w:r>
+          </w:p>
+        </w:tc>
+      </w:tr>
+      <w:tr>
+        <w:trPr>
+          <w:cantSplit/>
+        </w:trPr>
+        <w:tc>
+          <w:tcPr>
+            <w:tcW w:type="dxa" w:w="520"/>
+            <w:tcBorders>
+              <w:top w:val="single" w:color="BFBFBF" w:sz="4"/>
+              <w:left w:val="single" w:color="BFBFBF" w:sz="4"/>
+              <w:bottom w:val="single" w:color="BFBFBF" w:sz="4"/>
+              <w:right w:val="single" w:color="BFBFBF" w:sz="4"/>
+            </w:tcBorders>
+            <w:shd w:fill="F5F7FB" w:color="auto" w:val="clear"/>
+            <w:tcMar>
+              <w:top w:type="dxa" w:w="70"/>
+              <w:left w:type="dxa" w:w="100"/>
+              <w:bottom w:type="dxa" w:w="70"/>
+              <w:right w:type="dxa" w:w="100"/>
+            </w:tcMar>
+            <w:vAlign w:val="center"/>
+          </w:tcPr>
+          <w:p>
+            <w:pPr>
+              <w:spacing w:after="0" w:before="0" w:line="300"/>
+              <w:jc w:val="center"/>
+            </w:pPr>
+            <w:r>
+              <w:rPr>
+                <w:color w:val="7F7F7F"/>
+                <w:sz w:val="21"/>
+                <w:szCs w:val="21"/>
+              </w:rPr>
+              <w:t xml:space="preserve">6</w:t>
+            </w:r>
+          </w:p>
+        </w:tc>
+        <w:tc>
+          <w:tcPr>
+            <w:tcW w:type="dxa" w:w="2200"/>
+            <w:tcBorders>
+              <w:top w:val="single" w:color="BFBFBF" w:sz="4"/>
+              <w:left w:val="single" w:color="BFBFBF" w:sz="4"/>
+              <w:bottom w:val="single" w:color="BFBFBF" w:sz="4"/>
+              <w:right w:val="single" w:color="BFBFBF" w:sz="4"/>
+            </w:tcBorders>
+            <w:shd w:fill="F5F7FB" w:color="auto" w:val="clear"/>
+            <w:tcMar>
+              <w:top w:type="dxa" w:w="70"/>
+              <w:left w:type="dxa" w:w="100"/>
+              <w:bottom w:type="dxa" w:w="70"/>
+              <w:right w:type="dxa" w:w="100"/>
+            </w:tcMar>
+            <w:vAlign w:val="center"/>
+          </w:tcPr>
+          <w:p>
+            <w:pPr>
+              <w:spacing w:after="0" w:before="0" w:line="300"/>
+            </w:pPr>
+            <w:r>
+              <w:rPr>
+                <w:b/>
+                <w:bCs/>
+                <w:color w:val="1F3864"/>
+                <w:sz w:val="21"/>
+                <w:szCs w:val="21"/>
+              </w:rPr>
+              <w:t xml:space="preserve">Conclusion</w:t>
+            </w:r>
+          </w:p>
+        </w:tc>
+        <w:tc>
+          <w:tcPr>
+            <w:tcW w:type="dxa" w:w="7986"/>
+            <w:tcBorders>
+              <w:top w:val="single" w:color="BFBFBF" w:sz="4"/>
+              <w:left w:val="single" w:color="BFBFBF" w:sz="4"/>
+              <w:bottom w:val="single" w:color="BFBFBF" w:sz="4"/>
+              <w:right w:val="single" w:color="BFBFBF" w:sz="4"/>
+            </w:tcBorders>
+            <w:shd w:fill="F5F7FB" w:color="auto" w:val="clear"/>
+            <w:tcMar>
+              <w:top w:type="dxa" w:w="70"/>
+              <w:left w:type="dxa" w:w="100"/>
+              <w:bottom w:type="dxa" w:w="70"/>
+              <w:right w:type="dxa" w:w="100"/>
+            </w:tcMar>
+            <w:vAlign w:val="center"/>
+          </w:tcPr>
+          <w:p>
+            <w:pPr>
+              <w:tabs>
+                <w:tab w:val="left" w:pos="260"/>
+              </w:tabs>
+              <w:spacing w:after="0" w:before="0" w:line="280"/>
+              <w:ind w:left="260" w:hanging="260"/>
+            </w:pPr>
+            <w:r>
+              <w:rPr>
+                <w:b/>
+                <w:bCs/>
+                <w:color w:val="C00000"/>
+                <w:sz w:val="21"/>
+                <w:szCs w:val="21"/>
+              </w:rPr>
+              <w:t xml:space="preserve">→</w:t>
+            </w:r>
+            <w:r>
+              <w:tab/>
+            </w:r>
+            <w:r>
+              <w:rPr>
+                <w:sz w:val="21"/>
+                <w:szCs w:val="21"/>
+              </w:rPr>
+              <w:t xml:space="preserve">Civilisational twins with interlinked security</w:t>
+            </w:r>
+          </w:p>
+          <w:p>
+            <w:pPr>
+              <w:tabs>
+                <w:tab w:val="left" w:pos="260"/>
+              </w:tabs>
+              <w:spacing w:after="0" w:before="40" w:line="280"/>
+              <w:ind w:left="260" w:hanging="260"/>
+            </w:pPr>
+            <w:r>
+              <w:rPr>
+                <w:b/>
+                <w:bCs/>
+                <w:color w:val="C00000"/>
+                <w:sz w:val="21"/>
+                <w:szCs w:val="21"/>
+              </w:rPr>
+              <w:t xml:space="preserve">→</w:t>
+            </w:r>
+            <w:r>
+              <w:tab/>
+            </w:r>
+            <w:r>
+              <w:rPr>
+                <w:sz w:val="21"/>
+                <w:szCs w:val="21"/>
+              </w:rPr>
+              <w:t xml:space="preserve">India must be a trusted, non-transactional partner, not a creditor power</w:t>
+            </w:r>
+          </w:p>
+          <w:p>
+            <w:pPr>
+              <w:tabs>
+                <w:tab w:val="left" w:pos="260"/>
+              </w:tabs>
+              <w:spacing w:after="0" w:before="40" w:line="280"/>
+              <w:ind w:left="260" w:hanging="260"/>
+            </w:pPr>
+            <w:r>
+              <w:rPr>
+                <w:b/>
+                <w:bCs/>
+                <w:color w:val="C00000"/>
+                <w:sz w:val="21"/>
+                <w:szCs w:val="21"/>
+              </w:rPr>
+              <w:t xml:space="preserve">→</w:t>
+            </w:r>
+            <w:r>
+              <w:tab/>
+            </w:r>
+            <w:r>
+              <w:rPr>
+                <w:sz w:val="21"/>
+                <w:szCs w:val="21"/>
+              </w:rPr>
+              <w:t xml:space="preserve">A friendly, stable Sri Lanka secures India's southern flank and the Indian Ocean Region</w:t>
             </w:r>
           </w:p>
         </w:tc>

</xml_diff>

<commit_message>
Add India–Bhutan Relations lecturette
Co-Authored-By: Claude Opus 5.5 <noreply@anthropic.com>
Claude-Session: https://claude.ai/code/session_01EyrV2JLtXrELkAF97b5fch
</commit_message>
<xml_diff>
--- a/SSB_Lecturettes.docx
+++ b/SSB_Lecturettes.docx
@@ -10479,6 +10479,1714 @@
                 <w:szCs w:val="21"/>
               </w:rPr>
               <w:t xml:space="preserve">A friendly, stable Sri Lanka secures India's southern flank and the Indian Ocean Region</w:t>
+            </w:r>
+          </w:p>
+        </w:tc>
+      </w:tr>
+    </w:tbl>
+    <w:p>
+      <w:pPr>
+        <w:pStyle w:val="Heading1"/>
+        <w:pageBreakBefore/>
+        <w:shd w:fill="1F3864" w:color="auto" w:val="clear"/>
+        <w:spacing w:after="160" w:before="0"/>
+        <w:ind w:left="100" w:right="100"/>
+      </w:pPr>
+      <w:r>
+        <w:t xml:space="preserve">Topic 7: India–Bhutan Relations</w:t>
+      </w:r>
+    </w:p>
+    <w:tbl>
+      <w:tblPr>
+        <w:tblW w:type="dxa" w:w="10706"/>
+        <w:tblBorders>
+          <w:top w:val="single" w:color="auto" w:sz="4"/>
+          <w:left w:val="single" w:color="auto" w:sz="4"/>
+          <w:bottom w:val="single" w:color="auto" w:sz="4"/>
+          <w:right w:val="single" w:color="auto" w:sz="4"/>
+          <w:insideH w:val="single" w:color="auto" w:sz="4"/>
+          <w:insideV w:val="single" w:color="auto" w:sz="4"/>
+        </w:tblBorders>
+      </w:tblPr>
+      <w:tblGrid>
+        <w:gridCol w:w="520"/>
+        <w:gridCol w:w="2200"/>
+        <w:gridCol w:w="7986"/>
+      </w:tblGrid>
+      <w:tr>
+        <w:trPr>
+          <w:tblHeader/>
+        </w:trPr>
+        <w:tc>
+          <w:tcPr>
+            <w:tcW w:type="dxa" w:w="520"/>
+            <w:tcBorders>
+              <w:top w:val="single" w:color="BFBFBF" w:sz="4"/>
+              <w:left w:val="single" w:color="BFBFBF" w:sz="4"/>
+              <w:bottom w:val="single" w:color="BFBFBF" w:sz="4"/>
+              <w:right w:val="single" w:color="BFBFBF" w:sz="4"/>
+            </w:tcBorders>
+            <w:shd w:fill="DCE3F0" w:color="auto" w:val="clear"/>
+            <w:tcMar>
+              <w:top w:type="dxa" w:w="70"/>
+              <w:left w:type="dxa" w:w="100"/>
+              <w:bottom w:type="dxa" w:w="70"/>
+              <w:right w:type="dxa" w:w="100"/>
+            </w:tcMar>
+            <w:vAlign w:val="center"/>
+          </w:tcPr>
+          <w:p>
+            <w:pPr>
+              <w:spacing w:after="0" w:before="0" w:line="300"/>
+              <w:jc w:val="center"/>
+            </w:pPr>
+            <w:r>
+              <w:rPr>
+                <w:b/>
+                <w:bCs/>
+                <w:sz w:val="21"/>
+                <w:szCs w:val="21"/>
+              </w:rPr>
+              <w:t xml:space="preserve">#</w:t>
+            </w:r>
+          </w:p>
+        </w:tc>
+        <w:tc>
+          <w:tcPr>
+            <w:tcW w:type="dxa" w:w="2200"/>
+            <w:tcBorders>
+              <w:top w:val="single" w:color="BFBFBF" w:sz="4"/>
+              <w:left w:val="single" w:color="BFBFBF" w:sz="4"/>
+              <w:bottom w:val="single" w:color="BFBFBF" w:sz="4"/>
+              <w:right w:val="single" w:color="BFBFBF" w:sz="4"/>
+            </w:tcBorders>
+            <w:shd w:fill="DCE3F0" w:color="auto" w:val="clear"/>
+            <w:tcMar>
+              <w:top w:type="dxa" w:w="70"/>
+              <w:left w:type="dxa" w:w="100"/>
+              <w:bottom w:type="dxa" w:w="70"/>
+              <w:right w:type="dxa" w:w="100"/>
+            </w:tcMar>
+            <w:vAlign w:val="center"/>
+          </w:tcPr>
+          <w:p>
+            <w:pPr>
+              <w:spacing w:after="0" w:before="0" w:line="300"/>
+            </w:pPr>
+            <w:r>
+              <w:rPr>
+                <w:b/>
+                <w:bCs/>
+                <w:sz w:val="21"/>
+                <w:szCs w:val="21"/>
+              </w:rPr>
+              <w:t xml:space="preserve">Stage</w:t>
+            </w:r>
+          </w:p>
+        </w:tc>
+        <w:tc>
+          <w:tcPr>
+            <w:tcW w:type="dxa" w:w="7986"/>
+            <w:tcBorders>
+              <w:top w:val="single" w:color="BFBFBF" w:sz="4"/>
+              <w:left w:val="single" w:color="BFBFBF" w:sz="4"/>
+              <w:bottom w:val="single" w:color="BFBFBF" w:sz="4"/>
+              <w:right w:val="single" w:color="BFBFBF" w:sz="4"/>
+            </w:tcBorders>
+            <w:shd w:fill="DCE3F0" w:color="auto" w:val="clear"/>
+            <w:tcMar>
+              <w:top w:type="dxa" w:w="70"/>
+              <w:left w:type="dxa" w:w="100"/>
+              <w:bottom w:type="dxa" w:w="70"/>
+              <w:right w:type="dxa" w:w="100"/>
+            </w:tcMar>
+            <w:vAlign w:val="center"/>
+          </w:tcPr>
+          <w:p>
+            <w:pPr>
+              <w:spacing w:after="0" w:before="0" w:line="300"/>
+            </w:pPr>
+            <w:r>
+              <w:rPr>
+                <w:b/>
+                <w:bCs/>
+                <w:sz w:val="21"/>
+                <w:szCs w:val="21"/>
+              </w:rPr>
+              <w:t xml:space="preserve">Flow</w:t>
+            </w:r>
+          </w:p>
+        </w:tc>
+      </w:tr>
+      <w:tr>
+        <w:trPr>
+          <w:cantSplit/>
+        </w:trPr>
+        <w:tc>
+          <w:tcPr>
+            <w:tcW w:type="dxa" w:w="520"/>
+            <w:tcBorders>
+              <w:top w:val="single" w:color="BFBFBF" w:sz="4"/>
+              <w:left w:val="single" w:color="BFBFBF" w:sz="4"/>
+              <w:bottom w:val="single" w:color="BFBFBF" w:sz="4"/>
+              <w:right w:val="single" w:color="BFBFBF" w:sz="4"/>
+            </w:tcBorders>
+            <w:tcMar>
+              <w:top w:type="dxa" w:w="70"/>
+              <w:left w:type="dxa" w:w="100"/>
+              <w:bottom w:type="dxa" w:w="70"/>
+              <w:right w:type="dxa" w:w="100"/>
+            </w:tcMar>
+            <w:vAlign w:val="center"/>
+          </w:tcPr>
+          <w:p>
+            <w:pPr>
+              <w:spacing w:after="0" w:before="0" w:line="300"/>
+              <w:jc w:val="center"/>
+            </w:pPr>
+            <w:r>
+              <w:rPr>
+                <w:color w:val="7F7F7F"/>
+                <w:sz w:val="21"/>
+                <w:szCs w:val="21"/>
+              </w:rPr>
+              <w:t xml:space="preserve">1</w:t>
+            </w:r>
+          </w:p>
+        </w:tc>
+        <w:tc>
+          <w:tcPr>
+            <w:tcW w:type="dxa" w:w="2200"/>
+            <w:tcBorders>
+              <w:top w:val="single" w:color="BFBFBF" w:sz="4"/>
+              <w:left w:val="single" w:color="BFBFBF" w:sz="4"/>
+              <w:bottom w:val="single" w:color="BFBFBF" w:sz="4"/>
+              <w:right w:val="single" w:color="BFBFBF" w:sz="4"/>
+            </w:tcBorders>
+            <w:tcMar>
+              <w:top w:type="dxa" w:w="70"/>
+              <w:left w:type="dxa" w:w="100"/>
+              <w:bottom w:type="dxa" w:w="70"/>
+              <w:right w:type="dxa" w:w="100"/>
+            </w:tcMar>
+            <w:vAlign w:val="center"/>
+          </w:tcPr>
+          <w:p>
+            <w:pPr>
+              <w:spacing w:after="0" w:before="0" w:line="300"/>
+            </w:pPr>
+            <w:r>
+              <w:rPr>
+                <w:b/>
+                <w:bCs/>
+                <w:color w:val="1F3864"/>
+                <w:sz w:val="21"/>
+                <w:szCs w:val="21"/>
+              </w:rPr>
+              <w:t xml:space="preserve">What is it</w:t>
+            </w:r>
+          </w:p>
+        </w:tc>
+        <w:tc>
+          <w:tcPr>
+            <w:tcW w:type="dxa" w:w="7986"/>
+            <w:tcBorders>
+              <w:top w:val="single" w:color="BFBFBF" w:sz="4"/>
+              <w:left w:val="single" w:color="BFBFBF" w:sz="4"/>
+              <w:bottom w:val="single" w:color="BFBFBF" w:sz="4"/>
+              <w:right w:val="single" w:color="BFBFBF" w:sz="4"/>
+            </w:tcBorders>
+            <w:tcMar>
+              <w:top w:type="dxa" w:w="70"/>
+              <w:left w:type="dxa" w:w="100"/>
+              <w:bottom w:type="dxa" w:w="70"/>
+              <w:right w:type="dxa" w:w="100"/>
+            </w:tcMar>
+            <w:vAlign w:val="center"/>
+          </w:tcPr>
+          <w:p>
+            <w:pPr>
+              <w:tabs>
+                <w:tab w:val="left" w:pos="260"/>
+              </w:tabs>
+              <w:spacing w:after="0" w:before="0" w:line="280"/>
+              <w:ind w:left="260" w:hanging="260"/>
+            </w:pPr>
+            <w:r>
+              <w:rPr>
+                <w:b/>
+                <w:bCs/>
+                <w:color w:val="C00000"/>
+                <w:sz w:val="21"/>
+                <w:szCs w:val="21"/>
+              </w:rPr>
+              <w:t xml:space="preserve">→</w:t>
+            </w:r>
+            <w:r>
+              <w:tab/>
+            </w:r>
+            <w:r>
+              <w:rPr>
+                <w:sz w:val="21"/>
+                <w:szCs w:val="21"/>
+              </w:rPr>
+              <w:t xml:space="preserve">Closest and most trusted Himalayan friend; 699 km largely peaceful border</w:t>
+            </w:r>
+          </w:p>
+          <w:p>
+            <w:pPr>
+              <w:tabs>
+                <w:tab w:val="left" w:pos="260"/>
+              </w:tabs>
+              <w:spacing w:after="0" w:before="40" w:line="280"/>
+              <w:ind w:left="260" w:hanging="260"/>
+            </w:pPr>
+            <w:r>
+              <w:rPr>
+                <w:b/>
+                <w:bCs/>
+                <w:color w:val="C00000"/>
+                <w:sz w:val="21"/>
+                <w:szCs w:val="21"/>
+              </w:rPr>
+              <w:t xml:space="preserve">→</w:t>
+            </w:r>
+            <w:r>
+              <w:tab/>
+            </w:r>
+            <w:r>
+              <w:rPr>
+                <w:sz w:val="21"/>
+                <w:szCs w:val="21"/>
+              </w:rPr>
+              <w:t xml:space="preserve">1949 treaty, revised in 2007 to give Bhutan full say in foreign policy</w:t>
+            </w:r>
+          </w:p>
+          <w:p>
+            <w:pPr>
+              <w:tabs>
+                <w:tab w:val="left" w:pos="260"/>
+              </w:tabs>
+              <w:spacing w:after="0" w:before="40" w:line="280"/>
+              <w:ind w:left="260" w:hanging="260"/>
+            </w:pPr>
+            <w:r>
+              <w:rPr>
+                <w:b/>
+                <w:bCs/>
+                <w:color w:val="C00000"/>
+                <w:sz w:val="21"/>
+                <w:szCs w:val="21"/>
+              </w:rPr>
+              <w:t xml:space="preserve">→</w:t>
+            </w:r>
+            <w:r>
+              <w:tab/>
+            </w:r>
+            <w:r>
+              <w:rPr>
+                <w:sz w:val="21"/>
+                <w:szCs w:val="21"/>
+              </w:rPr>
+              <w:t xml:space="preserve">Foundations laid by the Third King and Nehru; diplomatic relations since 1968</w:t>
+            </w:r>
+          </w:p>
+          <w:p>
+            <w:pPr>
+              <w:tabs>
+                <w:tab w:val="left" w:pos="260"/>
+              </w:tabs>
+              <w:spacing w:after="0" w:before="40" w:line="280"/>
+              <w:ind w:left="260" w:hanging="260"/>
+            </w:pPr>
+            <w:r>
+              <w:rPr>
+                <w:b/>
+                <w:bCs/>
+                <w:color w:val="C00000"/>
+                <w:sz w:val="21"/>
+                <w:szCs w:val="21"/>
+              </w:rPr>
+              <w:t xml:space="preserve">→</w:t>
+            </w:r>
+            <w:r>
+              <w:tab/>
+            </w:r>
+            <w:r>
+              <w:rPr>
+                <w:sz w:val="21"/>
+                <w:szCs w:val="21"/>
+              </w:rPr>
+              <w:t xml:space="preserve">India Bhutan's main development partner since its first Five Year Plan (1961)</w:t>
+            </w:r>
+          </w:p>
+        </w:tc>
+      </w:tr>
+      <w:tr>
+        <w:trPr>
+          <w:cantSplit/>
+        </w:trPr>
+        <w:tc>
+          <w:tcPr>
+            <w:tcW w:type="dxa" w:w="520"/>
+            <w:tcBorders>
+              <w:top w:val="single" w:color="BFBFBF" w:sz="4"/>
+              <w:left w:val="single" w:color="BFBFBF" w:sz="4"/>
+              <w:bottom w:val="single" w:color="BFBFBF" w:sz="4"/>
+              <w:right w:val="single" w:color="BFBFBF" w:sz="4"/>
+            </w:tcBorders>
+            <w:shd w:fill="F5F7FB" w:color="auto" w:val="clear"/>
+            <w:tcMar>
+              <w:top w:type="dxa" w:w="70"/>
+              <w:left w:type="dxa" w:w="100"/>
+              <w:bottom w:type="dxa" w:w="70"/>
+              <w:right w:type="dxa" w:w="100"/>
+            </w:tcMar>
+            <w:vAlign w:val="center"/>
+          </w:tcPr>
+          <w:p>
+            <w:pPr>
+              <w:spacing w:after="0" w:before="0" w:line="300"/>
+              <w:jc w:val="center"/>
+            </w:pPr>
+            <w:r>
+              <w:rPr>
+                <w:color w:val="7F7F7F"/>
+                <w:sz w:val="21"/>
+                <w:szCs w:val="21"/>
+              </w:rPr>
+              <w:t xml:space="preserve">2</w:t>
+            </w:r>
+          </w:p>
+        </w:tc>
+        <w:tc>
+          <w:tcPr>
+            <w:tcW w:type="dxa" w:w="2200"/>
+            <w:tcBorders>
+              <w:top w:val="single" w:color="BFBFBF" w:sz="4"/>
+              <w:left w:val="single" w:color="BFBFBF" w:sz="4"/>
+              <w:bottom w:val="single" w:color="BFBFBF" w:sz="4"/>
+              <w:right w:val="single" w:color="BFBFBF" w:sz="4"/>
+            </w:tcBorders>
+            <w:shd w:fill="F5F7FB" w:color="auto" w:val="clear"/>
+            <w:tcMar>
+              <w:top w:type="dxa" w:w="70"/>
+              <w:left w:type="dxa" w:w="100"/>
+              <w:bottom w:type="dxa" w:w="70"/>
+              <w:right w:type="dxa" w:w="100"/>
+            </w:tcMar>
+            <w:vAlign w:val="center"/>
+          </w:tcPr>
+          <w:p>
+            <w:pPr>
+              <w:spacing w:after="0" w:before="0" w:line="300"/>
+            </w:pPr>
+            <w:r>
+              <w:rPr>
+                <w:b/>
+                <w:bCs/>
+                <w:color w:val="1F3864"/>
+                <w:sz w:val="21"/>
+                <w:szCs w:val="21"/>
+              </w:rPr>
+              <w:t xml:space="preserve">Why it matters</w:t>
+            </w:r>
+          </w:p>
+        </w:tc>
+        <w:tc>
+          <w:tcPr>
+            <w:tcW w:type="dxa" w:w="7986"/>
+            <w:tcBorders>
+              <w:top w:val="single" w:color="BFBFBF" w:sz="4"/>
+              <w:left w:val="single" w:color="BFBFBF" w:sz="4"/>
+              <w:bottom w:val="single" w:color="BFBFBF" w:sz="4"/>
+              <w:right w:val="single" w:color="BFBFBF" w:sz="4"/>
+            </w:tcBorders>
+            <w:shd w:fill="F5F7FB" w:color="auto" w:val="clear"/>
+            <w:tcMar>
+              <w:top w:type="dxa" w:w="70"/>
+              <w:left w:type="dxa" w:w="100"/>
+              <w:bottom w:type="dxa" w:w="70"/>
+              <w:right w:type="dxa" w:w="100"/>
+            </w:tcMar>
+            <w:vAlign w:val="center"/>
+          </w:tcPr>
+          <w:p>
+            <w:pPr>
+              <w:tabs>
+                <w:tab w:val="left" w:pos="260"/>
+              </w:tabs>
+              <w:spacing w:after="0" w:before="0" w:line="280"/>
+              <w:ind w:left="260" w:hanging="260"/>
+            </w:pPr>
+            <w:r>
+              <w:rPr>
+                <w:b/>
+                <w:bCs/>
+                <w:color w:val="C00000"/>
+                <w:sz w:val="21"/>
+                <w:szCs w:val="21"/>
+              </w:rPr>
+              <w:t xml:space="preserve">→</w:t>
+            </w:r>
+            <w:r>
+              <w:tab/>
+            </w:r>
+            <w:r>
+              <w:rPr>
+                <w:b/>
+                <w:bCs/>
+                <w:sz w:val="21"/>
+                <w:szCs w:val="21"/>
+              </w:rPr>
+              <w:t xml:space="preserve">Security:</w:t>
+            </w:r>
+            <w:r>
+              <w:rPr>
+                <w:sz w:val="21"/>
+                <w:szCs w:val="21"/>
+              </w:rPr>
+              <w:t xml:space="preserve"> Doklam and the Siliguri Corridor ("Chicken's Neck") near the Bhutan–China border</w:t>
+            </w:r>
+          </w:p>
+          <w:p>
+            <w:pPr>
+              <w:tabs>
+                <w:tab w:val="left" w:pos="260"/>
+              </w:tabs>
+              <w:spacing w:after="0" w:before="40" w:line="280"/>
+              <w:ind w:left="260" w:hanging="260"/>
+            </w:pPr>
+            <w:r>
+              <w:rPr>
+                <w:b/>
+                <w:bCs/>
+                <w:color w:val="C00000"/>
+                <w:sz w:val="21"/>
+                <w:szCs w:val="21"/>
+              </w:rPr>
+              <w:t xml:space="preserve">→</w:t>
+            </w:r>
+            <w:r>
+              <w:tab/>
+            </w:r>
+            <w:r>
+              <w:rPr>
+                <w:b/>
+                <w:bCs/>
+                <w:sz w:val="21"/>
+                <w:szCs w:val="21"/>
+              </w:rPr>
+              <w:t xml:space="preserve">Strategic:</w:t>
+            </w:r>
+            <w:r>
+              <w:rPr>
+                <w:sz w:val="21"/>
+                <w:szCs w:val="21"/>
+              </w:rPr>
+              <w:t xml:space="preserve"> stable buffer against China, which has no diplomatic ties with Bhutan</w:t>
+            </w:r>
+          </w:p>
+          <w:p>
+            <w:pPr>
+              <w:tabs>
+                <w:tab w:val="left" w:pos="260"/>
+              </w:tabs>
+              <w:spacing w:after="0" w:before="40" w:line="280"/>
+              <w:ind w:left="260" w:hanging="260"/>
+            </w:pPr>
+            <w:r>
+              <w:rPr>
+                <w:b/>
+                <w:bCs/>
+                <w:color w:val="C00000"/>
+                <w:sz w:val="21"/>
+                <w:szCs w:val="21"/>
+              </w:rPr>
+              <w:t xml:space="preserve">→</w:t>
+            </w:r>
+            <w:r>
+              <w:tab/>
+            </w:r>
+            <w:r>
+              <w:rPr>
+                <w:b/>
+                <w:bCs/>
+                <w:sz w:val="21"/>
+                <w:szCs w:val="21"/>
+              </w:rPr>
+              <w:t xml:space="preserve">Economic:</w:t>
+            </w:r>
+            <w:r>
+              <w:rPr>
+                <w:sz w:val="21"/>
+                <w:szCs w:val="21"/>
+              </w:rPr>
+              <w:t xml:space="preserve"> India is Bhutan's top trade partner</w:t>
+            </w:r>
+          </w:p>
+          <w:p>
+            <w:pPr>
+              <w:tabs>
+                <w:tab w:val="left" w:pos="260"/>
+              </w:tabs>
+              <w:spacing w:after="0" w:before="40" w:line="280"/>
+              <w:ind w:left="260" w:hanging="260"/>
+            </w:pPr>
+            <w:r>
+              <w:rPr>
+                <w:b/>
+                <w:bCs/>
+                <w:color w:val="C00000"/>
+                <w:sz w:val="21"/>
+                <w:szCs w:val="21"/>
+              </w:rPr>
+              <w:t xml:space="preserve">→</w:t>
+            </w:r>
+            <w:r>
+              <w:tab/>
+            </w:r>
+            <w:r>
+              <w:rPr>
+                <w:b/>
+                <w:bCs/>
+                <w:sz w:val="21"/>
+                <w:szCs w:val="21"/>
+              </w:rPr>
+              <w:t xml:space="preserve">Energy:</w:t>
+            </w:r>
+            <w:r>
+              <w:rPr>
+                <w:sz w:val="21"/>
+                <w:szCs w:val="21"/>
+              </w:rPr>
+              <w:t xml:space="preserve"> Bhutanese hydropower feeds India's grid</w:t>
+            </w:r>
+          </w:p>
+          <w:p>
+            <w:pPr>
+              <w:tabs>
+                <w:tab w:val="left" w:pos="260"/>
+              </w:tabs>
+              <w:spacing w:after="0" w:before="40" w:line="280"/>
+              <w:ind w:left="260" w:hanging="260"/>
+            </w:pPr>
+            <w:r>
+              <w:rPr>
+                <w:b/>
+                <w:bCs/>
+                <w:color w:val="C00000"/>
+                <w:sz w:val="21"/>
+                <w:szCs w:val="21"/>
+              </w:rPr>
+              <w:t xml:space="preserve">→</w:t>
+            </w:r>
+            <w:r>
+              <w:tab/>
+            </w:r>
+            <w:r>
+              <w:rPr>
+                <w:b/>
+                <w:bCs/>
+                <w:sz w:val="21"/>
+                <w:szCs w:val="21"/>
+              </w:rPr>
+              <w:t xml:space="preserve">People:</w:t>
+            </w:r>
+            <w:r>
+              <w:rPr>
+                <w:sz w:val="21"/>
+                <w:szCs w:val="21"/>
+              </w:rPr>
+              <w:t xml:space="preserve"> about 50,000 Indians work in Bhutan</w:t>
+            </w:r>
+          </w:p>
+        </w:tc>
+      </w:tr>
+      <w:tr>
+        <w:trPr>
+          <w:cantSplit/>
+        </w:trPr>
+        <w:tc>
+          <w:tcPr>
+            <w:tcW w:type="dxa" w:w="520"/>
+            <w:tcBorders>
+              <w:top w:val="single" w:color="BFBFBF" w:sz="4"/>
+              <w:left w:val="single" w:color="BFBFBF" w:sz="4"/>
+              <w:bottom w:val="single" w:color="BFBFBF" w:sz="4"/>
+              <w:right w:val="single" w:color="BFBFBF" w:sz="4"/>
+            </w:tcBorders>
+            <w:tcMar>
+              <w:top w:type="dxa" w:w="70"/>
+              <w:left w:type="dxa" w:w="100"/>
+              <w:bottom w:type="dxa" w:w="70"/>
+              <w:right w:type="dxa" w:w="100"/>
+            </w:tcMar>
+            <w:vAlign w:val="center"/>
+          </w:tcPr>
+          <w:p>
+            <w:pPr>
+              <w:spacing w:after="0" w:before="0" w:line="300"/>
+              <w:jc w:val="center"/>
+            </w:pPr>
+            <w:r>
+              <w:rPr>
+                <w:color w:val="7F7F7F"/>
+                <w:sz w:val="21"/>
+                <w:szCs w:val="21"/>
+              </w:rPr>
+              <w:t xml:space="preserve">3</w:t>
+            </w:r>
+          </w:p>
+        </w:tc>
+        <w:tc>
+          <w:tcPr>
+            <w:tcW w:type="dxa" w:w="2200"/>
+            <w:tcBorders>
+              <w:top w:val="single" w:color="BFBFBF" w:sz="4"/>
+              <w:left w:val="single" w:color="BFBFBF" w:sz="4"/>
+              <w:bottom w:val="single" w:color="BFBFBF" w:sz="4"/>
+              <w:right w:val="single" w:color="BFBFBF" w:sz="4"/>
+            </w:tcBorders>
+            <w:tcMar>
+              <w:top w:type="dxa" w:w="70"/>
+              <w:left w:type="dxa" w:w="100"/>
+              <w:bottom w:type="dxa" w:w="70"/>
+              <w:right w:type="dxa" w:w="100"/>
+            </w:tcMar>
+            <w:vAlign w:val="center"/>
+          </w:tcPr>
+          <w:p>
+            <w:pPr>
+              <w:spacing w:after="0" w:before="0" w:line="300"/>
+            </w:pPr>
+            <w:r>
+              <w:rPr>
+                <w:b/>
+                <w:bCs/>
+                <w:color w:val="1F3864"/>
+                <w:sz w:val="21"/>
+                <w:szCs w:val="21"/>
+              </w:rPr>
+              <w:t xml:space="preserve">Current status (Sept 2026)</w:t>
+            </w:r>
+          </w:p>
+        </w:tc>
+        <w:tc>
+          <w:tcPr>
+            <w:tcW w:type="dxa" w:w="7986"/>
+            <w:tcBorders>
+              <w:top w:val="single" w:color="BFBFBF" w:sz="4"/>
+              <w:left w:val="single" w:color="BFBFBF" w:sz="4"/>
+              <w:bottom w:val="single" w:color="BFBFBF" w:sz="4"/>
+              <w:right w:val="single" w:color="BFBFBF" w:sz="4"/>
+            </w:tcBorders>
+            <w:tcMar>
+              <w:top w:type="dxa" w:w="70"/>
+              <w:left w:type="dxa" w:w="100"/>
+              <w:bottom w:type="dxa" w:w="70"/>
+              <w:right w:type="dxa" w:w="100"/>
+            </w:tcMar>
+            <w:vAlign w:val="center"/>
+          </w:tcPr>
+          <w:p>
+            <w:pPr>
+              <w:tabs>
+                <w:tab w:val="left" w:pos="260"/>
+              </w:tabs>
+              <w:spacing w:after="0" w:before="0" w:line="280"/>
+              <w:ind w:left="260" w:hanging="260"/>
+            </w:pPr>
+            <w:r>
+              <w:rPr>
+                <w:b/>
+                <w:bCs/>
+                <w:color w:val="C00000"/>
+                <w:sz w:val="21"/>
+                <w:szCs w:val="21"/>
+              </w:rPr>
+              <w:t xml:space="preserve">→</w:t>
+            </w:r>
+            <w:r>
+              <w:tab/>
+            </w:r>
+            <w:r>
+              <w:rPr>
+                <w:b/>
+                <w:bCs/>
+                <w:sz w:val="21"/>
+                <w:szCs w:val="21"/>
+              </w:rPr>
+              <w:t xml:space="preserve">Visit:</w:t>
+            </w:r>
+            <w:r>
+              <w:rPr>
+                <w:sz w:val="21"/>
+                <w:szCs w:val="21"/>
+              </w:rPr>
+              <w:t xml:space="preserve"> Jaishankar in Bhutan (16–18 Sep 2026), met the King, PM Tshering Tobgay and FM D N Dhungyel</w:t>
+            </w:r>
+          </w:p>
+          <w:p>
+            <w:pPr>
+              <w:tabs>
+                <w:tab w:val="left" w:pos="260"/>
+              </w:tabs>
+              <w:spacing w:after="0" w:before="40" w:line="280"/>
+              <w:ind w:left="260" w:hanging="260"/>
+            </w:pPr>
+            <w:r>
+              <w:rPr>
+                <w:b/>
+                <w:bCs/>
+                <w:color w:val="C00000"/>
+                <w:sz w:val="21"/>
+                <w:szCs w:val="21"/>
+              </w:rPr>
+              <w:t xml:space="preserve">→</w:t>
+            </w:r>
+            <w:r>
+              <w:tab/>
+            </w:r>
+            <w:r>
+              <w:rPr>
+                <w:b/>
+                <w:bCs/>
+                <w:sz w:val="21"/>
+                <w:szCs w:val="21"/>
+              </w:rPr>
+              <w:t xml:space="preserve">Projects:</w:t>
+            </w:r>
+            <w:r>
+              <w:rPr>
+                <w:sz w:val="21"/>
+                <w:szCs w:val="21"/>
+              </w:rPr>
+              <w:t xml:space="preserve"> 54 EVs handed over, UPI for Bhutanese in India, 65-bed mother-and-child hospital in Mongar, 43 Jersey cows for Bumthang</w:t>
+            </w:r>
+          </w:p>
+          <w:p>
+            <w:pPr>
+              <w:tabs>
+                <w:tab w:val="left" w:pos="260"/>
+              </w:tabs>
+              <w:spacing w:after="0" w:before="40" w:line="280"/>
+              <w:ind w:left="260" w:hanging="260"/>
+            </w:pPr>
+            <w:r>
+              <w:rPr>
+                <w:b/>
+                <w:bCs/>
+                <w:color w:val="C00000"/>
+                <w:sz w:val="21"/>
+                <w:szCs w:val="21"/>
+              </w:rPr>
+              <w:t xml:space="preserve">→</w:t>
+            </w:r>
+            <w:r>
+              <w:tab/>
+            </w:r>
+            <w:r>
+              <w:rPr>
+                <w:b/>
+                <w:bCs/>
+                <w:sz w:val="21"/>
+                <w:szCs w:val="21"/>
+              </w:rPr>
+              <w:t xml:space="preserve">Energy:</w:t>
+            </w:r>
+            <w:r>
+              <w:rPr>
+                <w:sz w:val="21"/>
+                <w:szCs w:val="21"/>
+              </w:rPr>
+              <w:t xml:space="preserve"> ₹4,000 crore concessional credit line; Punatsangchhu-II (1,020 MW) exporting since 2025, Punatsangchhu-I (1,200 MW) in progress; solar and green hydrogen</w:t>
+            </w:r>
+          </w:p>
+          <w:p>
+            <w:pPr>
+              <w:tabs>
+                <w:tab w:val="left" w:pos="260"/>
+              </w:tabs>
+              <w:spacing w:after="0" w:before="40" w:line="280"/>
+              <w:ind w:left="260" w:hanging="260"/>
+            </w:pPr>
+            <w:r>
+              <w:rPr>
+                <w:b/>
+                <w:bCs/>
+                <w:color w:val="C00000"/>
+                <w:sz w:val="21"/>
+                <w:szCs w:val="21"/>
+              </w:rPr>
+              <w:t xml:space="preserve">→</w:t>
+            </w:r>
+            <w:r>
+              <w:tab/>
+            </w:r>
+            <w:r>
+              <w:rPr>
+                <w:b/>
+                <w:bCs/>
+                <w:sz w:val="21"/>
+                <w:szCs w:val="21"/>
+              </w:rPr>
+              <w:t xml:space="preserve">Connectivity:</w:t>
+            </w:r>
+            <w:r>
+              <w:rPr>
+                <w:sz w:val="21"/>
+                <w:szCs w:val="21"/>
+              </w:rPr>
+              <w:t xml:space="preserve"> Samrang, tenth land customs station (Aug 2026); India funding first rail links, Kokrajhar–Gelephu and Banarhat–Samtse</w:t>
+            </w:r>
+          </w:p>
+          <w:p>
+            <w:pPr>
+              <w:tabs>
+                <w:tab w:val="left" w:pos="260"/>
+              </w:tabs>
+              <w:spacing w:after="0" w:before="40" w:line="280"/>
+              <w:ind w:left="260" w:hanging="260"/>
+            </w:pPr>
+            <w:r>
+              <w:rPr>
+                <w:b/>
+                <w:bCs/>
+                <w:color w:val="C00000"/>
+                <w:sz w:val="21"/>
+                <w:szCs w:val="21"/>
+              </w:rPr>
+              <w:t xml:space="preserve">→</w:t>
+            </w:r>
+            <w:r>
+              <w:tab/>
+            </w:r>
+            <w:r>
+              <w:rPr>
+                <w:b/>
+                <w:bCs/>
+                <w:sz w:val="21"/>
+                <w:szCs w:val="21"/>
+              </w:rPr>
+              <w:t xml:space="preserve">Gelephu Mindfulness City:</w:t>
+            </w:r>
+            <w:r>
+              <w:rPr>
+                <w:sz w:val="21"/>
+                <w:szCs w:val="21"/>
+              </w:rPr>
+              <w:t xml:space="preserve"> India backs the King's special region on the Assam border; Joint Working Group engaged</w:t>
+            </w:r>
+          </w:p>
+          <w:p>
+            <w:pPr>
+              <w:tabs>
+                <w:tab w:val="left" w:pos="260"/>
+              </w:tabs>
+              <w:spacing w:after="0" w:before="40" w:line="280"/>
+              <w:ind w:left="260" w:hanging="260"/>
+            </w:pPr>
+            <w:r>
+              <w:rPr>
+                <w:b/>
+                <w:bCs/>
+                <w:color w:val="C00000"/>
+                <w:sz w:val="21"/>
+                <w:szCs w:val="21"/>
+              </w:rPr>
+              <w:t xml:space="preserve">→</w:t>
+            </w:r>
+            <w:r>
+              <w:tab/>
+            </w:r>
+            <w:r>
+              <w:rPr>
+                <w:b/>
+                <w:bCs/>
+                <w:sz w:val="21"/>
+                <w:szCs w:val="21"/>
+              </w:rPr>
+              <w:t xml:space="preserve">Trade:</w:t>
+            </w:r>
+            <w:r>
+              <w:rPr>
+                <w:sz w:val="21"/>
+                <w:szCs w:val="21"/>
+              </w:rPr>
+              <w:t xml:space="preserve"> Agreement on Trade, Commerce and Transit valid only till 2026</w:t>
+            </w:r>
+          </w:p>
+        </w:tc>
+      </w:tr>
+      <w:tr>
+        <w:trPr>
+          <w:cantSplit/>
+        </w:trPr>
+        <w:tc>
+          <w:tcPr>
+            <w:tcW w:type="dxa" w:w="520"/>
+            <w:tcBorders>
+              <w:top w:val="single" w:color="BFBFBF" w:sz="4"/>
+              <w:left w:val="single" w:color="BFBFBF" w:sz="4"/>
+              <w:bottom w:val="single" w:color="BFBFBF" w:sz="4"/>
+              <w:right w:val="single" w:color="BFBFBF" w:sz="4"/>
+            </w:tcBorders>
+            <w:shd w:fill="F5F7FB" w:color="auto" w:val="clear"/>
+            <w:tcMar>
+              <w:top w:type="dxa" w:w="70"/>
+              <w:left w:type="dxa" w:w="100"/>
+              <w:bottom w:type="dxa" w:w="70"/>
+              <w:right w:type="dxa" w:w="100"/>
+            </w:tcMar>
+            <w:vAlign w:val="center"/>
+          </w:tcPr>
+          <w:p>
+            <w:pPr>
+              <w:spacing w:after="0" w:before="0" w:line="300"/>
+              <w:jc w:val="center"/>
+            </w:pPr>
+            <w:r>
+              <w:rPr>
+                <w:color w:val="7F7F7F"/>
+                <w:sz w:val="21"/>
+                <w:szCs w:val="21"/>
+              </w:rPr>
+              <w:t xml:space="preserve">4</w:t>
+            </w:r>
+          </w:p>
+        </w:tc>
+        <w:tc>
+          <w:tcPr>
+            <w:tcW w:type="dxa" w:w="2200"/>
+            <w:tcBorders>
+              <w:top w:val="single" w:color="BFBFBF" w:sz="4"/>
+              <w:left w:val="single" w:color="BFBFBF" w:sz="4"/>
+              <w:bottom w:val="single" w:color="BFBFBF" w:sz="4"/>
+              <w:right w:val="single" w:color="BFBFBF" w:sz="4"/>
+            </w:tcBorders>
+            <w:shd w:fill="F5F7FB" w:color="auto" w:val="clear"/>
+            <w:tcMar>
+              <w:top w:type="dxa" w:w="70"/>
+              <w:left w:type="dxa" w:w="100"/>
+              <w:bottom w:type="dxa" w:w="70"/>
+              <w:right w:type="dxa" w:w="100"/>
+            </w:tcMar>
+            <w:vAlign w:val="center"/>
+          </w:tcPr>
+          <w:p>
+            <w:pPr>
+              <w:spacing w:after="0" w:before="0" w:line="300"/>
+            </w:pPr>
+            <w:r>
+              <w:rPr>
+                <w:b/>
+                <w:bCs/>
+                <w:color w:val="1F3864"/>
+                <w:sz w:val="21"/>
+                <w:szCs w:val="21"/>
+              </w:rPr>
+              <w:t xml:space="preserve">Problems</w:t>
+            </w:r>
+          </w:p>
+        </w:tc>
+        <w:tc>
+          <w:tcPr>
+            <w:tcW w:type="dxa" w:w="7986"/>
+            <w:tcBorders>
+              <w:top w:val="single" w:color="BFBFBF" w:sz="4"/>
+              <w:left w:val="single" w:color="BFBFBF" w:sz="4"/>
+              <w:bottom w:val="single" w:color="BFBFBF" w:sz="4"/>
+              <w:right w:val="single" w:color="BFBFBF" w:sz="4"/>
+            </w:tcBorders>
+            <w:shd w:fill="F5F7FB" w:color="auto" w:val="clear"/>
+            <w:tcMar>
+              <w:top w:type="dxa" w:w="70"/>
+              <w:left w:type="dxa" w:w="100"/>
+              <w:bottom w:type="dxa" w:w="70"/>
+              <w:right w:type="dxa" w:w="100"/>
+            </w:tcMar>
+            <w:vAlign w:val="center"/>
+          </w:tcPr>
+          <w:p>
+            <w:pPr>
+              <w:tabs>
+                <w:tab w:val="left" w:pos="260"/>
+              </w:tabs>
+              <w:spacing w:after="0" w:before="0" w:line="280"/>
+              <w:ind w:left="260" w:hanging="260"/>
+            </w:pPr>
+            <w:r>
+              <w:rPr>
+                <w:b/>
+                <w:bCs/>
+                <w:color w:val="C00000"/>
+                <w:sz w:val="21"/>
+                <w:szCs w:val="21"/>
+              </w:rPr>
+              <w:t xml:space="preserve">→</w:t>
+            </w:r>
+            <w:r>
+              <w:tab/>
+            </w:r>
+            <w:r>
+              <w:rPr>
+                <w:sz w:val="21"/>
+                <w:szCs w:val="21"/>
+              </w:rPr>
+              <w:t xml:space="preserve">China–Bhutan boundary talks (25 rounds); Chinese interest in Doklam near the Chicken's Neck</w:t>
+            </w:r>
+          </w:p>
+          <w:p>
+            <w:pPr>
+              <w:tabs>
+                <w:tab w:val="left" w:pos="260"/>
+              </w:tabs>
+              <w:spacing w:after="0" w:before="40" w:line="280"/>
+              <w:ind w:left="260" w:hanging="260"/>
+            </w:pPr>
+            <w:r>
+              <w:rPr>
+                <w:b/>
+                <w:bCs/>
+                <w:color w:val="C00000"/>
+                <w:sz w:val="21"/>
+                <w:szCs w:val="21"/>
+              </w:rPr>
+              <w:t xml:space="preserve">→</w:t>
+            </w:r>
+            <w:r>
+              <w:tab/>
+            </w:r>
+            <w:r>
+              <w:rPr>
+                <w:sz w:val="21"/>
+                <w:szCs w:val="21"/>
+              </w:rPr>
+              <w:t xml:space="preserve">Bhutan's trade deficit; non-tariff barriers on its exports</w:t>
+            </w:r>
+          </w:p>
+          <w:p>
+            <w:pPr>
+              <w:tabs>
+                <w:tab w:val="left" w:pos="260"/>
+              </w:tabs>
+              <w:spacing w:after="0" w:before="40" w:line="280"/>
+              <w:ind w:left="260" w:hanging="260"/>
+            </w:pPr>
+            <w:r>
+              <w:rPr>
+                <w:b/>
+                <w:bCs/>
+                <w:color w:val="C00000"/>
+                <w:sz w:val="21"/>
+                <w:szCs w:val="21"/>
+              </w:rPr>
+              <w:t xml:space="preserve">→</w:t>
+            </w:r>
+            <w:r>
+              <w:tab/>
+            </w:r>
+            <w:r>
+              <w:rPr>
+                <w:sz w:val="21"/>
+                <w:szCs w:val="21"/>
+              </w:rPr>
+              <w:t xml:space="preserve">Bhutan wants to diversify beyond hydropower</w:t>
+            </w:r>
+          </w:p>
+          <w:p>
+            <w:pPr>
+              <w:tabs>
+                <w:tab w:val="left" w:pos="260"/>
+              </w:tabs>
+              <w:spacing w:after="0" w:before="40" w:line="280"/>
+              <w:ind w:left="260" w:hanging="260"/>
+            </w:pPr>
+            <w:r>
+              <w:rPr>
+                <w:b/>
+                <w:bCs/>
+                <w:color w:val="C00000"/>
+                <w:sz w:val="21"/>
+                <w:szCs w:val="21"/>
+              </w:rPr>
+              <w:t xml:space="preserve">→</w:t>
+            </w:r>
+            <w:r>
+              <w:tab/>
+            </w:r>
+            <w:r>
+              <w:rPr>
+                <w:sz w:val="21"/>
+                <w:szCs w:val="21"/>
+              </w:rPr>
+              <w:t xml:space="preserve">Debt and cost overruns on hydro projects</w:t>
+            </w:r>
+          </w:p>
+          <w:p>
+            <w:pPr>
+              <w:tabs>
+                <w:tab w:val="left" w:pos="260"/>
+              </w:tabs>
+              <w:spacing w:after="0" w:before="40" w:line="280"/>
+              <w:ind w:left="260" w:hanging="260"/>
+            </w:pPr>
+            <w:r>
+              <w:rPr>
+                <w:b/>
+                <w:bCs/>
+                <w:color w:val="C00000"/>
+                <w:sz w:val="21"/>
+                <w:szCs w:val="21"/>
+              </w:rPr>
+              <w:t xml:space="preserve">→</w:t>
+            </w:r>
+            <w:r>
+              <w:tab/>
+            </w:r>
+            <w:r>
+              <w:rPr>
+                <w:sz w:val="21"/>
+                <w:szCs w:val="21"/>
+              </w:rPr>
+              <w:t xml:space="preserve">Environmental and Gross National Happiness concerns over big infrastructure</w:t>
+            </w:r>
+          </w:p>
+          <w:p>
+            <w:pPr>
+              <w:tabs>
+                <w:tab w:val="left" w:pos="260"/>
+              </w:tabs>
+              <w:spacing w:after="0" w:before="40" w:line="280"/>
+              <w:ind w:left="260" w:hanging="260"/>
+            </w:pPr>
+            <w:r>
+              <w:rPr>
+                <w:b/>
+                <w:bCs/>
+                <w:color w:val="C00000"/>
+                <w:sz w:val="21"/>
+                <w:szCs w:val="21"/>
+              </w:rPr>
+              <w:t xml:space="preserve">→</w:t>
+            </w:r>
+            <w:r>
+              <w:tab/>
+            </w:r>
+            <w:r>
+              <w:rPr>
+                <w:sz w:val="21"/>
+                <w:szCs w:val="21"/>
+              </w:rPr>
+              <w:t xml:space="preserve">Chinese offers of formal diplomatic ties</w:t>
+            </w:r>
+          </w:p>
+          <w:p>
+            <w:pPr>
+              <w:tabs>
+                <w:tab w:val="left" w:pos="260"/>
+              </w:tabs>
+              <w:spacing w:after="0" w:before="40" w:line="280"/>
+              <w:ind w:left="260" w:hanging="260"/>
+            </w:pPr>
+            <w:r>
+              <w:rPr>
+                <w:b/>
+                <w:bCs/>
+                <w:color w:val="C00000"/>
+                <w:sz w:val="21"/>
+                <w:szCs w:val="21"/>
+              </w:rPr>
+              <w:t xml:space="preserve">→</w:t>
+            </w:r>
+            <w:r>
+              <w:tab/>
+            </w:r>
+            <w:r>
+              <w:rPr>
+                <w:sz w:val="21"/>
+                <w:szCs w:val="21"/>
+              </w:rPr>
+              <w:t xml:space="preserve">Youth unemployment and migration from Bhutan</w:t>
+            </w:r>
+          </w:p>
+        </w:tc>
+      </w:tr>
+      <w:tr>
+        <w:trPr>
+          <w:cantSplit/>
+        </w:trPr>
+        <w:tc>
+          <w:tcPr>
+            <w:tcW w:type="dxa" w:w="520"/>
+            <w:tcBorders>
+              <w:top w:val="single" w:color="BFBFBF" w:sz="4"/>
+              <w:left w:val="single" w:color="BFBFBF" w:sz="4"/>
+              <w:bottom w:val="single" w:color="BFBFBF" w:sz="4"/>
+              <w:right w:val="single" w:color="BFBFBF" w:sz="4"/>
+            </w:tcBorders>
+            <w:tcMar>
+              <w:top w:type="dxa" w:w="70"/>
+              <w:left w:type="dxa" w:w="100"/>
+              <w:bottom w:type="dxa" w:w="70"/>
+              <w:right w:type="dxa" w:w="100"/>
+            </w:tcMar>
+            <w:vAlign w:val="center"/>
+          </w:tcPr>
+          <w:p>
+            <w:pPr>
+              <w:spacing w:after="0" w:before="0" w:line="300"/>
+              <w:jc w:val="center"/>
+            </w:pPr>
+            <w:r>
+              <w:rPr>
+                <w:color w:val="7F7F7F"/>
+                <w:sz w:val="21"/>
+                <w:szCs w:val="21"/>
+              </w:rPr>
+              <w:t xml:space="preserve">5</w:t>
+            </w:r>
+          </w:p>
+        </w:tc>
+        <w:tc>
+          <w:tcPr>
+            <w:tcW w:type="dxa" w:w="2200"/>
+            <w:tcBorders>
+              <w:top w:val="single" w:color="BFBFBF" w:sz="4"/>
+              <w:left w:val="single" w:color="BFBFBF" w:sz="4"/>
+              <w:bottom w:val="single" w:color="BFBFBF" w:sz="4"/>
+              <w:right w:val="single" w:color="BFBFBF" w:sz="4"/>
+            </w:tcBorders>
+            <w:tcMar>
+              <w:top w:type="dxa" w:w="70"/>
+              <w:left w:type="dxa" w:w="100"/>
+              <w:bottom w:type="dxa" w:w="70"/>
+              <w:right w:type="dxa" w:w="100"/>
+            </w:tcMar>
+            <w:vAlign w:val="center"/>
+          </w:tcPr>
+          <w:p>
+            <w:pPr>
+              <w:spacing w:after="0" w:before="0" w:line="300"/>
+            </w:pPr>
+            <w:r>
+              <w:rPr>
+                <w:b/>
+                <w:bCs/>
+                <w:color w:val="1F3864"/>
+                <w:sz w:val="21"/>
+                <w:szCs w:val="21"/>
+              </w:rPr>
+              <w:t xml:space="preserve">Solutions</w:t>
+            </w:r>
+          </w:p>
+        </w:tc>
+        <w:tc>
+          <w:tcPr>
+            <w:tcW w:type="dxa" w:w="7986"/>
+            <w:tcBorders>
+              <w:top w:val="single" w:color="BFBFBF" w:sz="4"/>
+              <w:left w:val="single" w:color="BFBFBF" w:sz="4"/>
+              <w:bottom w:val="single" w:color="BFBFBF" w:sz="4"/>
+              <w:right w:val="single" w:color="BFBFBF" w:sz="4"/>
+            </w:tcBorders>
+            <w:tcMar>
+              <w:top w:type="dxa" w:w="70"/>
+              <w:left w:type="dxa" w:w="100"/>
+              <w:bottom w:type="dxa" w:w="70"/>
+              <w:right w:type="dxa" w:w="100"/>
+            </w:tcMar>
+            <w:vAlign w:val="center"/>
+          </w:tcPr>
+          <w:p>
+            <w:pPr>
+              <w:tabs>
+                <w:tab w:val="left" w:pos="260"/>
+              </w:tabs>
+              <w:spacing w:after="0" w:before="0" w:line="280"/>
+              <w:ind w:left="260" w:hanging="260"/>
+            </w:pPr>
+            <w:r>
+              <w:rPr>
+                <w:b/>
+                <w:bCs/>
+                <w:color w:val="C00000"/>
+                <w:sz w:val="21"/>
+                <w:szCs w:val="21"/>
+              </w:rPr>
+              <w:t xml:space="preserve">→</w:t>
+            </w:r>
+            <w:r>
+              <w:tab/>
+            </w:r>
+            <w:r>
+              <w:rPr>
+                <w:sz w:val="21"/>
+                <w:szCs w:val="21"/>
+              </w:rPr>
+              <w:t xml:space="preserve">Align Indian and Bhutanese security interests on any China boundary deal; Doklam to be settled trilaterally</w:t>
+            </w:r>
+          </w:p>
+          <w:p>
+            <w:pPr>
+              <w:tabs>
+                <w:tab w:val="left" w:pos="260"/>
+              </w:tabs>
+              <w:spacing w:after="0" w:before="40" w:line="280"/>
+              <w:ind w:left="260" w:hanging="260"/>
+            </w:pPr>
+            <w:r>
+              <w:rPr>
+                <w:b/>
+                <w:bCs/>
+                <w:color w:val="C00000"/>
+                <w:sz w:val="21"/>
+                <w:szCs w:val="21"/>
+              </w:rPr>
+              <w:t xml:space="preserve">→</w:t>
+            </w:r>
+            <w:r>
+              <w:tab/>
+            </w:r>
+            <w:r>
+              <w:rPr>
+                <w:sz w:val="21"/>
+                <w:szCs w:val="21"/>
+              </w:rPr>
+              <w:t xml:space="preserve">Renew the trade, commerce and transit agreement on liberal terms</w:t>
+            </w:r>
+          </w:p>
+          <w:p>
+            <w:pPr>
+              <w:tabs>
+                <w:tab w:val="left" w:pos="260"/>
+              </w:tabs>
+              <w:spacing w:after="0" w:before="40" w:line="280"/>
+              <w:ind w:left="260" w:hanging="260"/>
+            </w:pPr>
+            <w:r>
+              <w:rPr>
+                <w:b/>
+                <w:bCs/>
+                <w:color w:val="C00000"/>
+                <w:sz w:val="21"/>
+                <w:szCs w:val="21"/>
+              </w:rPr>
+              <w:t xml:space="preserve">→</w:t>
+            </w:r>
+            <w:r>
+              <w:tab/>
+            </w:r>
+            <w:r>
+              <w:rPr>
+                <w:sz w:val="21"/>
+                <w:szCs w:val="21"/>
+              </w:rPr>
+              <w:t xml:space="preserve">More market access, integrated check posts and rail links</w:t>
+            </w:r>
+          </w:p>
+          <w:p>
+            <w:pPr>
+              <w:tabs>
+                <w:tab w:val="left" w:pos="260"/>
+              </w:tabs>
+              <w:spacing w:after="0" w:before="40" w:line="280"/>
+              <w:ind w:left="260" w:hanging="260"/>
+            </w:pPr>
+            <w:r>
+              <w:rPr>
+                <w:b/>
+                <w:bCs/>
+                <w:color w:val="C00000"/>
+                <w:sz w:val="21"/>
+                <w:szCs w:val="21"/>
+              </w:rPr>
+              <w:t xml:space="preserve">→</w:t>
+            </w:r>
+            <w:r>
+              <w:tab/>
+            </w:r>
+            <w:r>
+              <w:rPr>
+                <w:sz w:val="21"/>
+                <w:szCs w:val="21"/>
+              </w:rPr>
+              <w:t xml:space="preserve">Back Gelephu Mindfulness City as a non-hydro growth engine</w:t>
+            </w:r>
+          </w:p>
+          <w:p>
+            <w:pPr>
+              <w:tabs>
+                <w:tab w:val="left" w:pos="260"/>
+              </w:tabs>
+              <w:spacing w:after="0" w:before="40" w:line="280"/>
+              <w:ind w:left="260" w:hanging="260"/>
+            </w:pPr>
+            <w:r>
+              <w:rPr>
+                <w:b/>
+                <w:bCs/>
+                <w:color w:val="C00000"/>
+                <w:sz w:val="21"/>
+                <w:szCs w:val="21"/>
+              </w:rPr>
+              <w:t xml:space="preserve">→</w:t>
+            </w:r>
+            <w:r>
+              <w:tab/>
+            </w:r>
+            <w:r>
+              <w:rPr>
+                <w:b/>
+                <w:bCs/>
+                <w:sz w:val="21"/>
+                <w:szCs w:val="21"/>
+              </w:rPr>
+              <w:t xml:space="preserve">Wider energy partnership:</w:t>
+            </w:r>
+            <w:r>
+              <w:rPr>
+                <w:sz w:val="21"/>
+                <w:szCs w:val="21"/>
+              </w:rPr>
+              <w:t xml:space="preserve"> solar, green hydrogen, grid integration, fair tariffs</w:t>
+            </w:r>
+          </w:p>
+          <w:p>
+            <w:pPr>
+              <w:tabs>
+                <w:tab w:val="left" w:pos="260"/>
+              </w:tabs>
+              <w:spacing w:after="0" w:before="40" w:line="280"/>
+              <w:ind w:left="260" w:hanging="260"/>
+            </w:pPr>
+            <w:r>
+              <w:rPr>
+                <w:b/>
+                <w:bCs/>
+                <w:color w:val="C00000"/>
+                <w:sz w:val="21"/>
+                <w:szCs w:val="21"/>
+              </w:rPr>
+              <w:t xml:space="preserve">→</w:t>
+            </w:r>
+            <w:r>
+              <w:tab/>
+            </w:r>
+            <w:r>
+              <w:rPr>
+                <w:sz w:val="21"/>
+                <w:szCs w:val="21"/>
+              </w:rPr>
+              <w:t xml:space="preserve">Digital integration (UPI, RuPay); scholarships (ICCR, Nalanda)</w:t>
+            </w:r>
+          </w:p>
+          <w:p>
+            <w:pPr>
+              <w:tabs>
+                <w:tab w:val="left" w:pos="260"/>
+              </w:tabs>
+              <w:spacing w:after="0" w:before="40" w:line="280"/>
+              <w:ind w:left="260" w:hanging="260"/>
+            </w:pPr>
+            <w:r>
+              <w:rPr>
+                <w:b/>
+                <w:bCs/>
+                <w:color w:val="C00000"/>
+                <w:sz w:val="21"/>
+                <w:szCs w:val="21"/>
+              </w:rPr>
+              <w:t xml:space="preserve">→</w:t>
+            </w:r>
+            <w:r>
+              <w:tab/>
+            </w:r>
+            <w:r>
+              <w:rPr>
+                <w:sz w:val="21"/>
+                <w:szCs w:val="21"/>
+              </w:rPr>
+              <w:t xml:space="preserve">Treat Bhutan as an equal; respect its sovereignty and choices</w:t>
+            </w:r>
+          </w:p>
+        </w:tc>
+      </w:tr>
+      <w:tr>
+        <w:trPr>
+          <w:cantSplit/>
+        </w:trPr>
+        <w:tc>
+          <w:tcPr>
+            <w:tcW w:type="dxa" w:w="520"/>
+            <w:tcBorders>
+              <w:top w:val="single" w:color="BFBFBF" w:sz="4"/>
+              <w:left w:val="single" w:color="BFBFBF" w:sz="4"/>
+              <w:bottom w:val="single" w:color="BFBFBF" w:sz="4"/>
+              <w:right w:val="single" w:color="BFBFBF" w:sz="4"/>
+            </w:tcBorders>
+            <w:shd w:fill="F5F7FB" w:color="auto" w:val="clear"/>
+            <w:tcMar>
+              <w:top w:type="dxa" w:w="70"/>
+              <w:left w:type="dxa" w:w="100"/>
+              <w:bottom w:type="dxa" w:w="70"/>
+              <w:right w:type="dxa" w:w="100"/>
+            </w:tcMar>
+            <w:vAlign w:val="center"/>
+          </w:tcPr>
+          <w:p>
+            <w:pPr>
+              <w:spacing w:after="0" w:before="0" w:line="300"/>
+              <w:jc w:val="center"/>
+            </w:pPr>
+            <w:r>
+              <w:rPr>
+                <w:color w:val="7F7F7F"/>
+                <w:sz w:val="21"/>
+                <w:szCs w:val="21"/>
+              </w:rPr>
+              <w:t xml:space="preserve">6</w:t>
+            </w:r>
+          </w:p>
+        </w:tc>
+        <w:tc>
+          <w:tcPr>
+            <w:tcW w:type="dxa" w:w="2200"/>
+            <w:tcBorders>
+              <w:top w:val="single" w:color="BFBFBF" w:sz="4"/>
+              <w:left w:val="single" w:color="BFBFBF" w:sz="4"/>
+              <w:bottom w:val="single" w:color="BFBFBF" w:sz="4"/>
+              <w:right w:val="single" w:color="BFBFBF" w:sz="4"/>
+            </w:tcBorders>
+            <w:shd w:fill="F5F7FB" w:color="auto" w:val="clear"/>
+            <w:tcMar>
+              <w:top w:type="dxa" w:w="70"/>
+              <w:left w:type="dxa" w:w="100"/>
+              <w:bottom w:type="dxa" w:w="70"/>
+              <w:right w:type="dxa" w:w="100"/>
+            </w:tcMar>
+            <w:vAlign w:val="center"/>
+          </w:tcPr>
+          <w:p>
+            <w:pPr>
+              <w:spacing w:after="0" w:before="0" w:line="300"/>
+            </w:pPr>
+            <w:r>
+              <w:rPr>
+                <w:b/>
+                <w:bCs/>
+                <w:color w:val="1F3864"/>
+                <w:sz w:val="21"/>
+                <w:szCs w:val="21"/>
+              </w:rPr>
+              <w:t xml:space="preserve">Conclusion</w:t>
+            </w:r>
+          </w:p>
+        </w:tc>
+        <w:tc>
+          <w:tcPr>
+            <w:tcW w:type="dxa" w:w="7986"/>
+            <w:tcBorders>
+              <w:top w:val="single" w:color="BFBFBF" w:sz="4"/>
+              <w:left w:val="single" w:color="BFBFBF" w:sz="4"/>
+              <w:bottom w:val="single" w:color="BFBFBF" w:sz="4"/>
+              <w:right w:val="single" w:color="BFBFBF" w:sz="4"/>
+            </w:tcBorders>
+            <w:shd w:fill="F5F7FB" w:color="auto" w:val="clear"/>
+            <w:tcMar>
+              <w:top w:type="dxa" w:w="70"/>
+              <w:left w:type="dxa" w:w="100"/>
+              <w:bottom w:type="dxa" w:w="70"/>
+              <w:right w:type="dxa" w:w="100"/>
+            </w:tcMar>
+            <w:vAlign w:val="center"/>
+          </w:tcPr>
+          <w:p>
+            <w:pPr>
+              <w:tabs>
+                <w:tab w:val="left" w:pos="260"/>
+              </w:tabs>
+              <w:spacing w:after="0" w:before="0" w:line="280"/>
+              <w:ind w:left="260" w:hanging="260"/>
+            </w:pPr>
+            <w:r>
+              <w:rPr>
+                <w:b/>
+                <w:bCs/>
+                <w:color w:val="C00000"/>
+                <w:sz w:val="21"/>
+                <w:szCs w:val="21"/>
+              </w:rPr>
+              <w:t xml:space="preserve">→</w:t>
+            </w:r>
+            <w:r>
+              <w:tab/>
+            </w:r>
+            <w:r>
+              <w:rPr>
+                <w:sz w:val="21"/>
+                <w:szCs w:val="21"/>
+              </w:rPr>
+              <w:t xml:space="preserve">A model of friendship between a large and a small neighbour</w:t>
+            </w:r>
+          </w:p>
+          <w:p>
+            <w:pPr>
+              <w:tabs>
+                <w:tab w:val="left" w:pos="260"/>
+              </w:tabs>
+              <w:spacing w:after="0" w:before="40" w:line="280"/>
+              <w:ind w:left="260" w:hanging="260"/>
+            </w:pPr>
+            <w:r>
+              <w:rPr>
+                <w:b/>
+                <w:bCs/>
+                <w:color w:val="C00000"/>
+                <w:sz w:val="21"/>
+                <w:szCs w:val="21"/>
+              </w:rPr>
+              <w:t xml:space="preserve">→</w:t>
+            </w:r>
+            <w:r>
+              <w:tab/>
+            </w:r>
+            <w:r>
+              <w:rPr>
+                <w:sz w:val="21"/>
+                <w:szCs w:val="21"/>
+              </w:rPr>
+              <w:t xml:space="preserve">Trust, not treaties, holds the relationship together</w:t>
+            </w:r>
+          </w:p>
+          <w:p>
+            <w:pPr>
+              <w:tabs>
+                <w:tab w:val="left" w:pos="260"/>
+              </w:tabs>
+              <w:spacing w:after="0" w:before="40" w:line="280"/>
+              <w:ind w:left="260" w:hanging="260"/>
+            </w:pPr>
+            <w:r>
+              <w:rPr>
+                <w:b/>
+                <w:bCs/>
+                <w:color w:val="C00000"/>
+                <w:sz w:val="21"/>
+                <w:szCs w:val="21"/>
+              </w:rPr>
+              <w:t xml:space="preserve">→</w:t>
+            </w:r>
+            <w:r>
+              <w:tab/>
+            </w:r>
+            <w:r>
+              <w:rPr>
+                <w:sz w:val="21"/>
+                <w:szCs w:val="21"/>
+              </w:rPr>
+              <w:t xml:space="preserve">A secure, prosperous Bhutan is vital for India's Northeast and Himalayan security</w:t>
             </w:r>
           </w:p>
         </w:tc>

</xml_diff>

<commit_message>
Add India–Maldives Relations lecturette
Co-Authored-By: Claude Opus 5.5 <noreply@anthropic.com>
Claude-Session: https://claude.ai/code/session_01EyrV2JLtXrELkAF97b5fch
</commit_message>
<xml_diff>
--- a/SSB_Lecturettes.docx
+++ b/SSB_Lecturettes.docx
@@ -12187,6 +12187,1714 @@
                 <w:szCs w:val="21"/>
               </w:rPr>
               <w:t xml:space="preserve">A secure, prosperous Bhutan is vital for India's Northeast and Himalayan security</w:t>
+            </w:r>
+          </w:p>
+        </w:tc>
+      </w:tr>
+    </w:tbl>
+    <w:p>
+      <w:pPr>
+        <w:pStyle w:val="Heading1"/>
+        <w:pageBreakBefore/>
+        <w:shd w:fill="1F3864" w:color="auto" w:val="clear"/>
+        <w:spacing w:after="160" w:before="0"/>
+        <w:ind w:left="100" w:right="100"/>
+      </w:pPr>
+      <w:r>
+        <w:t xml:space="preserve">Topic 8: India–Maldives Relations</w:t>
+      </w:r>
+    </w:p>
+    <w:tbl>
+      <w:tblPr>
+        <w:tblW w:type="dxa" w:w="10706"/>
+        <w:tblBorders>
+          <w:top w:val="single" w:color="auto" w:sz="4"/>
+          <w:left w:val="single" w:color="auto" w:sz="4"/>
+          <w:bottom w:val="single" w:color="auto" w:sz="4"/>
+          <w:right w:val="single" w:color="auto" w:sz="4"/>
+          <w:insideH w:val="single" w:color="auto" w:sz="4"/>
+          <w:insideV w:val="single" w:color="auto" w:sz="4"/>
+        </w:tblBorders>
+      </w:tblPr>
+      <w:tblGrid>
+        <w:gridCol w:w="520"/>
+        <w:gridCol w:w="2200"/>
+        <w:gridCol w:w="7986"/>
+      </w:tblGrid>
+      <w:tr>
+        <w:trPr>
+          <w:tblHeader/>
+        </w:trPr>
+        <w:tc>
+          <w:tcPr>
+            <w:tcW w:type="dxa" w:w="520"/>
+            <w:tcBorders>
+              <w:top w:val="single" w:color="BFBFBF" w:sz="4"/>
+              <w:left w:val="single" w:color="BFBFBF" w:sz="4"/>
+              <w:bottom w:val="single" w:color="BFBFBF" w:sz="4"/>
+              <w:right w:val="single" w:color="BFBFBF" w:sz="4"/>
+            </w:tcBorders>
+            <w:shd w:fill="DCE3F0" w:color="auto" w:val="clear"/>
+            <w:tcMar>
+              <w:top w:type="dxa" w:w="70"/>
+              <w:left w:type="dxa" w:w="100"/>
+              <w:bottom w:type="dxa" w:w="70"/>
+              <w:right w:type="dxa" w:w="100"/>
+            </w:tcMar>
+            <w:vAlign w:val="center"/>
+          </w:tcPr>
+          <w:p>
+            <w:pPr>
+              <w:spacing w:after="0" w:before="0" w:line="300"/>
+              <w:jc w:val="center"/>
+            </w:pPr>
+            <w:r>
+              <w:rPr>
+                <w:b/>
+                <w:bCs/>
+                <w:sz w:val="21"/>
+                <w:szCs w:val="21"/>
+              </w:rPr>
+              <w:t xml:space="preserve">#</w:t>
+            </w:r>
+          </w:p>
+        </w:tc>
+        <w:tc>
+          <w:tcPr>
+            <w:tcW w:type="dxa" w:w="2200"/>
+            <w:tcBorders>
+              <w:top w:val="single" w:color="BFBFBF" w:sz="4"/>
+              <w:left w:val="single" w:color="BFBFBF" w:sz="4"/>
+              <w:bottom w:val="single" w:color="BFBFBF" w:sz="4"/>
+              <w:right w:val="single" w:color="BFBFBF" w:sz="4"/>
+            </w:tcBorders>
+            <w:shd w:fill="DCE3F0" w:color="auto" w:val="clear"/>
+            <w:tcMar>
+              <w:top w:type="dxa" w:w="70"/>
+              <w:left w:type="dxa" w:w="100"/>
+              <w:bottom w:type="dxa" w:w="70"/>
+              <w:right w:type="dxa" w:w="100"/>
+            </w:tcMar>
+            <w:vAlign w:val="center"/>
+          </w:tcPr>
+          <w:p>
+            <w:pPr>
+              <w:spacing w:after="0" w:before="0" w:line="300"/>
+            </w:pPr>
+            <w:r>
+              <w:rPr>
+                <w:b/>
+                <w:bCs/>
+                <w:sz w:val="21"/>
+                <w:szCs w:val="21"/>
+              </w:rPr>
+              <w:t xml:space="preserve">Stage</w:t>
+            </w:r>
+          </w:p>
+        </w:tc>
+        <w:tc>
+          <w:tcPr>
+            <w:tcW w:type="dxa" w:w="7986"/>
+            <w:tcBorders>
+              <w:top w:val="single" w:color="BFBFBF" w:sz="4"/>
+              <w:left w:val="single" w:color="BFBFBF" w:sz="4"/>
+              <w:bottom w:val="single" w:color="BFBFBF" w:sz="4"/>
+              <w:right w:val="single" w:color="BFBFBF" w:sz="4"/>
+            </w:tcBorders>
+            <w:shd w:fill="DCE3F0" w:color="auto" w:val="clear"/>
+            <w:tcMar>
+              <w:top w:type="dxa" w:w="70"/>
+              <w:left w:type="dxa" w:w="100"/>
+              <w:bottom w:type="dxa" w:w="70"/>
+              <w:right w:type="dxa" w:w="100"/>
+            </w:tcMar>
+            <w:vAlign w:val="center"/>
+          </w:tcPr>
+          <w:p>
+            <w:pPr>
+              <w:spacing w:after="0" w:before="0" w:line="300"/>
+            </w:pPr>
+            <w:r>
+              <w:rPr>
+                <w:b/>
+                <w:bCs/>
+                <w:sz w:val="21"/>
+                <w:szCs w:val="21"/>
+              </w:rPr>
+              <w:t xml:space="preserve">Flow</w:t>
+            </w:r>
+          </w:p>
+        </w:tc>
+      </w:tr>
+      <w:tr>
+        <w:trPr>
+          <w:cantSplit/>
+        </w:trPr>
+        <w:tc>
+          <w:tcPr>
+            <w:tcW w:type="dxa" w:w="520"/>
+            <w:tcBorders>
+              <w:top w:val="single" w:color="BFBFBF" w:sz="4"/>
+              <w:left w:val="single" w:color="BFBFBF" w:sz="4"/>
+              <w:bottom w:val="single" w:color="BFBFBF" w:sz="4"/>
+              <w:right w:val="single" w:color="BFBFBF" w:sz="4"/>
+            </w:tcBorders>
+            <w:tcMar>
+              <w:top w:type="dxa" w:w="70"/>
+              <w:left w:type="dxa" w:w="100"/>
+              <w:bottom w:type="dxa" w:w="70"/>
+              <w:right w:type="dxa" w:w="100"/>
+            </w:tcMar>
+            <w:vAlign w:val="center"/>
+          </w:tcPr>
+          <w:p>
+            <w:pPr>
+              <w:spacing w:after="0" w:before="0" w:line="300"/>
+              <w:jc w:val="center"/>
+            </w:pPr>
+            <w:r>
+              <w:rPr>
+                <w:color w:val="7F7F7F"/>
+                <w:sz w:val="21"/>
+                <w:szCs w:val="21"/>
+              </w:rPr>
+              <w:t xml:space="preserve">1</w:t>
+            </w:r>
+          </w:p>
+        </w:tc>
+        <w:tc>
+          <w:tcPr>
+            <w:tcW w:type="dxa" w:w="2200"/>
+            <w:tcBorders>
+              <w:top w:val="single" w:color="BFBFBF" w:sz="4"/>
+              <w:left w:val="single" w:color="BFBFBF" w:sz="4"/>
+              <w:bottom w:val="single" w:color="BFBFBF" w:sz="4"/>
+              <w:right w:val="single" w:color="BFBFBF" w:sz="4"/>
+            </w:tcBorders>
+            <w:tcMar>
+              <w:top w:type="dxa" w:w="70"/>
+              <w:left w:type="dxa" w:w="100"/>
+              <w:bottom w:type="dxa" w:w="70"/>
+              <w:right w:type="dxa" w:w="100"/>
+            </w:tcMar>
+            <w:vAlign w:val="center"/>
+          </w:tcPr>
+          <w:p>
+            <w:pPr>
+              <w:spacing w:after="0" w:before="0" w:line="300"/>
+            </w:pPr>
+            <w:r>
+              <w:rPr>
+                <w:b/>
+                <w:bCs/>
+                <w:color w:val="1F3864"/>
+                <w:sz w:val="21"/>
+                <w:szCs w:val="21"/>
+              </w:rPr>
+              <w:t xml:space="preserve">What is it</w:t>
+            </w:r>
+          </w:p>
+        </w:tc>
+        <w:tc>
+          <w:tcPr>
+            <w:tcW w:type="dxa" w:w="7986"/>
+            <w:tcBorders>
+              <w:top w:val="single" w:color="BFBFBF" w:sz="4"/>
+              <w:left w:val="single" w:color="BFBFBF" w:sz="4"/>
+              <w:bottom w:val="single" w:color="BFBFBF" w:sz="4"/>
+              <w:right w:val="single" w:color="BFBFBF" w:sz="4"/>
+            </w:tcBorders>
+            <w:tcMar>
+              <w:top w:type="dxa" w:w="70"/>
+              <w:left w:type="dxa" w:w="100"/>
+              <w:bottom w:type="dxa" w:w="70"/>
+              <w:right w:type="dxa" w:w="100"/>
+            </w:tcMar>
+            <w:vAlign w:val="center"/>
+          </w:tcPr>
+          <w:p>
+            <w:pPr>
+              <w:tabs>
+                <w:tab w:val="left" w:pos="260"/>
+              </w:tabs>
+              <w:spacing w:after="0" w:before="0" w:line="280"/>
+              <w:ind w:left="260" w:hanging="260"/>
+            </w:pPr>
+            <w:r>
+              <w:rPr>
+                <w:b/>
+                <w:bCs/>
+                <w:color w:val="C00000"/>
+                <w:sz w:val="21"/>
+                <w:szCs w:val="21"/>
+              </w:rPr>
+              <w:t xml:space="preserve">→</w:t>
+            </w:r>
+            <w:r>
+              <w:tab/>
+            </w:r>
+            <w:r>
+              <w:rPr>
+                <w:sz w:val="21"/>
+                <w:szCs w:val="21"/>
+              </w:rPr>
+              <w:t xml:space="preserve">Island neighbour barely 70 nautical miles from India's west coast</w:t>
+            </w:r>
+          </w:p>
+          <w:p>
+            <w:pPr>
+              <w:tabs>
+                <w:tab w:val="left" w:pos="260"/>
+              </w:tabs>
+              <w:spacing w:after="0" w:before="40" w:line="280"/>
+              <w:ind w:left="260" w:hanging="260"/>
+            </w:pPr>
+            <w:r>
+              <w:rPr>
+                <w:b/>
+                <w:bCs/>
+                <w:color w:val="C00000"/>
+                <w:sz w:val="21"/>
+                <w:szCs w:val="21"/>
+              </w:rPr>
+              <w:t xml:space="preserve">→</w:t>
+            </w:r>
+            <w:r>
+              <w:tab/>
+            </w:r>
+            <w:r>
+              <w:rPr>
+                <w:sz w:val="21"/>
+                <w:szCs w:val="21"/>
+              </w:rPr>
+              <w:t xml:space="preserve">India among the first to recognise Maldives (1965)</w:t>
+            </w:r>
+          </w:p>
+          <w:p>
+            <w:pPr>
+              <w:tabs>
+                <w:tab w:val="left" w:pos="260"/>
+              </w:tabs>
+              <w:spacing w:after="0" w:before="40" w:line="280"/>
+              <w:ind w:left="260" w:hanging="260"/>
+            </w:pPr>
+            <w:r>
+              <w:rPr>
+                <w:b/>
+                <w:bCs/>
+                <w:color w:val="C00000"/>
+                <w:sz w:val="21"/>
+                <w:szCs w:val="21"/>
+              </w:rPr>
+              <w:t xml:space="preserve">→</w:t>
+            </w:r>
+            <w:r>
+              <w:tab/>
+            </w:r>
+            <w:r>
+              <w:rPr>
+                <w:sz w:val="21"/>
+                <w:szCs w:val="21"/>
+              </w:rPr>
+              <w:t xml:space="preserve">Shared ethnic, linguistic, cultural and commercial links</w:t>
+            </w:r>
+          </w:p>
+          <w:p>
+            <w:pPr>
+              <w:tabs>
+                <w:tab w:val="left" w:pos="260"/>
+              </w:tabs>
+              <w:spacing w:after="0" w:before="40" w:line="280"/>
+              <w:ind w:left="260" w:hanging="260"/>
+            </w:pPr>
+            <w:r>
+              <w:rPr>
+                <w:b/>
+                <w:bCs/>
+                <w:color w:val="C00000"/>
+                <w:sz w:val="21"/>
+                <w:szCs w:val="21"/>
+              </w:rPr>
+              <w:t xml:space="preserve">→</w:t>
+            </w:r>
+            <w:r>
+              <w:tab/>
+            </w:r>
+            <w:r>
+              <w:rPr>
+                <w:sz w:val="21"/>
+                <w:szCs w:val="21"/>
+              </w:rPr>
+              <w:t xml:space="preserve">Core to Neighbourhood First and MAHASAGAR; partner in the Colombo Security Conclave</w:t>
+            </w:r>
+          </w:p>
+          <w:p>
+            <w:pPr>
+              <w:tabs>
+                <w:tab w:val="left" w:pos="260"/>
+              </w:tabs>
+              <w:spacing w:after="0" w:before="40" w:line="280"/>
+              <w:ind w:left="260" w:hanging="260"/>
+            </w:pPr>
+            <w:r>
+              <w:rPr>
+                <w:b/>
+                <w:bCs/>
+                <w:color w:val="C00000"/>
+                <w:sz w:val="21"/>
+                <w:szCs w:val="21"/>
+              </w:rPr>
+              <w:t xml:space="preserve">→</w:t>
+            </w:r>
+            <w:r>
+              <w:tab/>
+            </w:r>
+            <w:r>
+              <w:rPr>
+                <w:sz w:val="21"/>
+                <w:szCs w:val="21"/>
+              </w:rPr>
+              <w:t xml:space="preserve">60 years of diplomatic ties (2025–26)</w:t>
+            </w:r>
+          </w:p>
+        </w:tc>
+      </w:tr>
+      <w:tr>
+        <w:trPr>
+          <w:cantSplit/>
+        </w:trPr>
+        <w:tc>
+          <w:tcPr>
+            <w:tcW w:type="dxa" w:w="520"/>
+            <w:tcBorders>
+              <w:top w:val="single" w:color="BFBFBF" w:sz="4"/>
+              <w:left w:val="single" w:color="BFBFBF" w:sz="4"/>
+              <w:bottom w:val="single" w:color="BFBFBF" w:sz="4"/>
+              <w:right w:val="single" w:color="BFBFBF" w:sz="4"/>
+            </w:tcBorders>
+            <w:shd w:fill="F5F7FB" w:color="auto" w:val="clear"/>
+            <w:tcMar>
+              <w:top w:type="dxa" w:w="70"/>
+              <w:left w:type="dxa" w:w="100"/>
+              <w:bottom w:type="dxa" w:w="70"/>
+              <w:right w:type="dxa" w:w="100"/>
+            </w:tcMar>
+            <w:vAlign w:val="center"/>
+          </w:tcPr>
+          <w:p>
+            <w:pPr>
+              <w:spacing w:after="0" w:before="0" w:line="300"/>
+              <w:jc w:val="center"/>
+            </w:pPr>
+            <w:r>
+              <w:rPr>
+                <w:color w:val="7F7F7F"/>
+                <w:sz w:val="21"/>
+                <w:szCs w:val="21"/>
+              </w:rPr>
+              <w:t xml:space="preserve">2</w:t>
+            </w:r>
+          </w:p>
+        </w:tc>
+        <w:tc>
+          <w:tcPr>
+            <w:tcW w:type="dxa" w:w="2200"/>
+            <w:tcBorders>
+              <w:top w:val="single" w:color="BFBFBF" w:sz="4"/>
+              <w:left w:val="single" w:color="BFBFBF" w:sz="4"/>
+              <w:bottom w:val="single" w:color="BFBFBF" w:sz="4"/>
+              <w:right w:val="single" w:color="BFBFBF" w:sz="4"/>
+            </w:tcBorders>
+            <w:shd w:fill="F5F7FB" w:color="auto" w:val="clear"/>
+            <w:tcMar>
+              <w:top w:type="dxa" w:w="70"/>
+              <w:left w:type="dxa" w:w="100"/>
+              <w:bottom w:type="dxa" w:w="70"/>
+              <w:right w:type="dxa" w:w="100"/>
+            </w:tcMar>
+            <w:vAlign w:val="center"/>
+          </w:tcPr>
+          <w:p>
+            <w:pPr>
+              <w:spacing w:after="0" w:before="0" w:line="300"/>
+            </w:pPr>
+            <w:r>
+              <w:rPr>
+                <w:b/>
+                <w:bCs/>
+                <w:color w:val="1F3864"/>
+                <w:sz w:val="21"/>
+                <w:szCs w:val="21"/>
+              </w:rPr>
+              <w:t xml:space="preserve">Why it matters</w:t>
+            </w:r>
+          </w:p>
+        </w:tc>
+        <w:tc>
+          <w:tcPr>
+            <w:tcW w:type="dxa" w:w="7986"/>
+            <w:tcBorders>
+              <w:top w:val="single" w:color="BFBFBF" w:sz="4"/>
+              <w:left w:val="single" w:color="BFBFBF" w:sz="4"/>
+              <w:bottom w:val="single" w:color="BFBFBF" w:sz="4"/>
+              <w:right w:val="single" w:color="BFBFBF" w:sz="4"/>
+            </w:tcBorders>
+            <w:shd w:fill="F5F7FB" w:color="auto" w:val="clear"/>
+            <w:tcMar>
+              <w:top w:type="dxa" w:w="70"/>
+              <w:left w:type="dxa" w:w="100"/>
+              <w:bottom w:type="dxa" w:w="70"/>
+              <w:right w:type="dxa" w:w="100"/>
+            </w:tcMar>
+            <w:vAlign w:val="center"/>
+          </w:tcPr>
+          <w:p>
+            <w:pPr>
+              <w:tabs>
+                <w:tab w:val="left" w:pos="260"/>
+              </w:tabs>
+              <w:spacing w:after="0" w:before="0" w:line="280"/>
+              <w:ind w:left="260" w:hanging="260"/>
+            </w:pPr>
+            <w:r>
+              <w:rPr>
+                <w:b/>
+                <w:bCs/>
+                <w:color w:val="C00000"/>
+                <w:sz w:val="21"/>
+                <w:szCs w:val="21"/>
+              </w:rPr>
+              <w:t xml:space="preserve">→</w:t>
+            </w:r>
+            <w:r>
+              <w:tab/>
+            </w:r>
+            <w:r>
+              <w:rPr>
+                <w:b/>
+                <w:bCs/>
+                <w:sz w:val="21"/>
+                <w:szCs w:val="21"/>
+              </w:rPr>
+              <w:t xml:space="preserve">Security:</w:t>
+            </w:r>
+            <w:r>
+              <w:rPr>
+                <w:sz w:val="21"/>
+                <w:szCs w:val="21"/>
+              </w:rPr>
+              <w:t xml:space="preserve"> sits on key Indian Ocean sea lanes; a hostile presence there threatens India</w:t>
+            </w:r>
+          </w:p>
+          <w:p>
+            <w:pPr>
+              <w:tabs>
+                <w:tab w:val="left" w:pos="260"/>
+              </w:tabs>
+              <w:spacing w:after="0" w:before="40" w:line="280"/>
+              <w:ind w:left="260" w:hanging="260"/>
+            </w:pPr>
+            <w:r>
+              <w:rPr>
+                <w:b/>
+                <w:bCs/>
+                <w:color w:val="C00000"/>
+                <w:sz w:val="21"/>
+                <w:szCs w:val="21"/>
+              </w:rPr>
+              <w:t xml:space="preserve">→</w:t>
+            </w:r>
+            <w:r>
+              <w:tab/>
+            </w:r>
+            <w:r>
+              <w:rPr>
+                <w:b/>
+                <w:bCs/>
+                <w:sz w:val="21"/>
+                <w:szCs w:val="21"/>
+              </w:rPr>
+              <w:t xml:space="preserve">Strategic:</w:t>
+            </w:r>
+            <w:r>
+              <w:rPr>
+                <w:sz w:val="21"/>
+                <w:szCs w:val="21"/>
+              </w:rPr>
+              <w:t xml:space="preserve"> counters China's footprint in the Indian Ocean Region</w:t>
+            </w:r>
+          </w:p>
+          <w:p>
+            <w:pPr>
+              <w:tabs>
+                <w:tab w:val="left" w:pos="260"/>
+              </w:tabs>
+              <w:spacing w:after="0" w:before="40" w:line="280"/>
+              <w:ind w:left="260" w:hanging="260"/>
+            </w:pPr>
+            <w:r>
+              <w:rPr>
+                <w:b/>
+                <w:bCs/>
+                <w:color w:val="C00000"/>
+                <w:sz w:val="21"/>
+                <w:szCs w:val="21"/>
+              </w:rPr>
+              <w:t xml:space="preserve">→</w:t>
+            </w:r>
+            <w:r>
+              <w:tab/>
+            </w:r>
+            <w:r>
+              <w:rPr>
+                <w:b/>
+                <w:bCs/>
+                <w:sz w:val="21"/>
+                <w:szCs w:val="21"/>
+              </w:rPr>
+              <w:t xml:space="preserve">Economic:</w:t>
+            </w:r>
+            <w:r>
+              <w:rPr>
+                <w:sz w:val="21"/>
+                <w:szCs w:val="21"/>
+              </w:rPr>
+              <w:t xml:space="preserve"> tourism, trade, India as an economic lifeline</w:t>
+            </w:r>
+          </w:p>
+          <w:p>
+            <w:pPr>
+              <w:tabs>
+                <w:tab w:val="left" w:pos="260"/>
+              </w:tabs>
+              <w:spacing w:after="0" w:before="40" w:line="280"/>
+              <w:ind w:left="260" w:hanging="260"/>
+            </w:pPr>
+            <w:r>
+              <w:rPr>
+                <w:b/>
+                <w:bCs/>
+                <w:color w:val="C00000"/>
+                <w:sz w:val="21"/>
+                <w:szCs w:val="21"/>
+              </w:rPr>
+              <w:t xml:space="preserve">→</w:t>
+            </w:r>
+            <w:r>
+              <w:tab/>
+            </w:r>
+            <w:r>
+              <w:rPr>
+                <w:b/>
+                <w:bCs/>
+                <w:sz w:val="21"/>
+                <w:szCs w:val="21"/>
+              </w:rPr>
+              <w:t xml:space="preserve">Maritime:</w:t>
+            </w:r>
+            <w:r>
+              <w:rPr>
+                <w:sz w:val="21"/>
+                <w:szCs w:val="21"/>
+              </w:rPr>
+              <w:t xml:space="preserve"> surveillance, anti-piracy, EEZ protection</w:t>
+            </w:r>
+          </w:p>
+          <w:p>
+            <w:pPr>
+              <w:tabs>
+                <w:tab w:val="left" w:pos="260"/>
+              </w:tabs>
+              <w:spacing w:after="0" w:before="40" w:line="280"/>
+              <w:ind w:left="260" w:hanging="260"/>
+            </w:pPr>
+            <w:r>
+              <w:rPr>
+                <w:b/>
+                <w:bCs/>
+                <w:color w:val="C00000"/>
+                <w:sz w:val="21"/>
+                <w:szCs w:val="21"/>
+              </w:rPr>
+              <w:t xml:space="preserve">→</w:t>
+            </w:r>
+            <w:r>
+              <w:tab/>
+            </w:r>
+            <w:r>
+              <w:rPr>
+                <w:b/>
+                <w:bCs/>
+                <w:sz w:val="21"/>
+                <w:szCs w:val="21"/>
+              </w:rPr>
+              <w:t xml:space="preserve">Humanitarian:</w:t>
+            </w:r>
+            <w:r>
+              <w:rPr>
+                <w:sz w:val="21"/>
+                <w:szCs w:val="21"/>
+              </w:rPr>
+              <w:t xml:space="preserve"> India as first responder (2004 tsunami, 2014 water crisis, Covid)</w:t>
+            </w:r>
+          </w:p>
+        </w:tc>
+      </w:tr>
+      <w:tr>
+        <w:trPr>
+          <w:cantSplit/>
+        </w:trPr>
+        <w:tc>
+          <w:tcPr>
+            <w:tcW w:type="dxa" w:w="520"/>
+            <w:tcBorders>
+              <w:top w:val="single" w:color="BFBFBF" w:sz="4"/>
+              <w:left w:val="single" w:color="BFBFBF" w:sz="4"/>
+              <w:bottom w:val="single" w:color="BFBFBF" w:sz="4"/>
+              <w:right w:val="single" w:color="BFBFBF" w:sz="4"/>
+            </w:tcBorders>
+            <w:tcMar>
+              <w:top w:type="dxa" w:w="70"/>
+              <w:left w:type="dxa" w:w="100"/>
+              <w:bottom w:type="dxa" w:w="70"/>
+              <w:right w:type="dxa" w:w="100"/>
+            </w:tcMar>
+            <w:vAlign w:val="center"/>
+          </w:tcPr>
+          <w:p>
+            <w:pPr>
+              <w:spacing w:after="0" w:before="0" w:line="300"/>
+              <w:jc w:val="center"/>
+            </w:pPr>
+            <w:r>
+              <w:rPr>
+                <w:color w:val="7F7F7F"/>
+                <w:sz w:val="21"/>
+                <w:szCs w:val="21"/>
+              </w:rPr>
+              <w:t xml:space="preserve">3</w:t>
+            </w:r>
+          </w:p>
+        </w:tc>
+        <w:tc>
+          <w:tcPr>
+            <w:tcW w:type="dxa" w:w="2200"/>
+            <w:tcBorders>
+              <w:top w:val="single" w:color="BFBFBF" w:sz="4"/>
+              <w:left w:val="single" w:color="BFBFBF" w:sz="4"/>
+              <w:bottom w:val="single" w:color="BFBFBF" w:sz="4"/>
+              <w:right w:val="single" w:color="BFBFBF" w:sz="4"/>
+            </w:tcBorders>
+            <w:tcMar>
+              <w:top w:type="dxa" w:w="70"/>
+              <w:left w:type="dxa" w:w="100"/>
+              <w:bottom w:type="dxa" w:w="70"/>
+              <w:right w:type="dxa" w:w="100"/>
+            </w:tcMar>
+            <w:vAlign w:val="center"/>
+          </w:tcPr>
+          <w:p>
+            <w:pPr>
+              <w:spacing w:after="0" w:before="0" w:line="300"/>
+            </w:pPr>
+            <w:r>
+              <w:rPr>
+                <w:b/>
+                <w:bCs/>
+                <w:color w:val="1F3864"/>
+                <w:sz w:val="21"/>
+                <w:szCs w:val="21"/>
+              </w:rPr>
+              <w:t xml:space="preserve">Current status (Sept 2026)</w:t>
+            </w:r>
+          </w:p>
+        </w:tc>
+        <w:tc>
+          <w:tcPr>
+            <w:tcW w:type="dxa" w:w="7986"/>
+            <w:tcBorders>
+              <w:top w:val="single" w:color="BFBFBF" w:sz="4"/>
+              <w:left w:val="single" w:color="BFBFBF" w:sz="4"/>
+              <w:bottom w:val="single" w:color="BFBFBF" w:sz="4"/>
+              <w:right w:val="single" w:color="BFBFBF" w:sz="4"/>
+            </w:tcBorders>
+            <w:tcMar>
+              <w:top w:type="dxa" w:w="70"/>
+              <w:left w:type="dxa" w:w="100"/>
+              <w:bottom w:type="dxa" w:w="70"/>
+              <w:right w:type="dxa" w:w="100"/>
+            </w:tcMar>
+            <w:vAlign w:val="center"/>
+          </w:tcPr>
+          <w:p>
+            <w:pPr>
+              <w:tabs>
+                <w:tab w:val="left" w:pos="260"/>
+              </w:tabs>
+              <w:spacing w:after="0" w:before="0" w:line="280"/>
+              <w:ind w:left="260" w:hanging="260"/>
+            </w:pPr>
+            <w:r>
+              <w:rPr>
+                <w:b/>
+                <w:bCs/>
+                <w:color w:val="C00000"/>
+                <w:sz w:val="21"/>
+                <w:szCs w:val="21"/>
+              </w:rPr>
+              <w:t xml:space="preserve">→</w:t>
+            </w:r>
+            <w:r>
+              <w:tab/>
+            </w:r>
+            <w:r>
+              <w:rPr>
+                <w:b/>
+                <w:bCs/>
+                <w:sz w:val="21"/>
+                <w:szCs w:val="21"/>
+              </w:rPr>
+              <w:t xml:space="preserve">From "India Out" to reset:</w:t>
+            </w:r>
+            <w:r>
+              <w:rPr>
+                <w:sz w:val="21"/>
+                <w:szCs w:val="21"/>
+              </w:rPr>
+              <w:t xml:space="preserve"> Muizzu won on "India Out" (2023); Indian military personnel replaced by technicians; 2024 Economic and Maritime Security Partnership vision</w:t>
+            </w:r>
+          </w:p>
+          <w:p>
+            <w:pPr>
+              <w:tabs>
+                <w:tab w:val="left" w:pos="260"/>
+              </w:tabs>
+              <w:spacing w:after="0" w:before="40" w:line="280"/>
+              <w:ind w:left="260" w:hanging="260"/>
+            </w:pPr>
+            <w:r>
+              <w:rPr>
+                <w:b/>
+                <w:bCs/>
+                <w:color w:val="C00000"/>
+                <w:sz w:val="21"/>
+                <w:szCs w:val="21"/>
+              </w:rPr>
+              <w:t xml:space="preserve">→</w:t>
+            </w:r>
+            <w:r>
+              <w:tab/>
+            </w:r>
+            <w:r>
+              <w:rPr>
+                <w:b/>
+                <w:bCs/>
+                <w:sz w:val="21"/>
+                <w:szCs w:val="21"/>
+              </w:rPr>
+              <w:t xml:space="preserve">Financial support:</w:t>
+            </w:r>
+            <w:r>
+              <w:rPr>
+                <w:sz w:val="21"/>
+                <w:szCs w:val="21"/>
+              </w:rPr>
+              <w:t xml:space="preserve"> currency swaps ($400 mn and ₹3,000 crore, 2024), T-bill rollovers, ₹4,850 crore credit line, 40% cut in annual debt repayments</w:t>
+            </w:r>
+          </w:p>
+          <w:p>
+            <w:pPr>
+              <w:tabs>
+                <w:tab w:val="left" w:pos="260"/>
+              </w:tabs>
+              <w:spacing w:after="0" w:before="40" w:line="280"/>
+              <w:ind w:left="260" w:hanging="260"/>
+            </w:pPr>
+            <w:r>
+              <w:rPr>
+                <w:b/>
+                <w:bCs/>
+                <w:color w:val="C00000"/>
+                <w:sz w:val="21"/>
+                <w:szCs w:val="21"/>
+              </w:rPr>
+              <w:t xml:space="preserve">→</w:t>
+            </w:r>
+            <w:r>
+              <w:tab/>
+            </w:r>
+            <w:r>
+              <w:rPr>
+                <w:b/>
+                <w:bCs/>
+                <w:sz w:val="21"/>
+                <w:szCs w:val="21"/>
+              </w:rPr>
+              <w:t xml:space="preserve">FTA:</w:t>
+            </w:r>
+            <w:r>
+              <w:rPr>
+                <w:sz w:val="21"/>
+                <w:szCs w:val="21"/>
+              </w:rPr>
+              <w:t xml:space="preserve"> FM Iruthisham Adam hopes to sign an India FTA by end-2026; BIT talks under way</w:t>
+            </w:r>
+          </w:p>
+          <w:p>
+            <w:pPr>
+              <w:tabs>
+                <w:tab w:val="left" w:pos="260"/>
+              </w:tabs>
+              <w:spacing w:after="0" w:before="40" w:line="280"/>
+              <w:ind w:left="260" w:hanging="260"/>
+            </w:pPr>
+            <w:r>
+              <w:rPr>
+                <w:b/>
+                <w:bCs/>
+                <w:color w:val="C00000"/>
+                <w:sz w:val="21"/>
+                <w:szCs w:val="21"/>
+              </w:rPr>
+              <w:t xml:space="preserve">→</w:t>
+            </w:r>
+            <w:r>
+              <w:tab/>
+            </w:r>
+            <w:r>
+              <w:rPr>
+                <w:b/>
+                <w:bCs/>
+                <w:sz w:val="21"/>
+                <w:szCs w:val="21"/>
+              </w:rPr>
+              <w:t xml:space="preserve">Dollar crisis:</w:t>
+            </w:r>
+            <w:r>
+              <w:rPr>
+                <w:sz w:val="21"/>
+                <w:szCs w:val="21"/>
+              </w:rPr>
+              <w:t xml:space="preserve"> about $1.7 bn external debt service due in 2026; $400 mn swap settled (Apr); India reportedly declined to roll over $150 mn budget support; final $50 mn instalment repaid (17 Sep)</w:t>
+            </w:r>
+          </w:p>
+          <w:p>
+            <w:pPr>
+              <w:tabs>
+                <w:tab w:val="left" w:pos="260"/>
+              </w:tabs>
+              <w:spacing w:after="0" w:before="40" w:line="280"/>
+              <w:ind w:left="260" w:hanging="260"/>
+            </w:pPr>
+            <w:r>
+              <w:rPr>
+                <w:b/>
+                <w:bCs/>
+                <w:color w:val="C00000"/>
+                <w:sz w:val="21"/>
+                <w:szCs w:val="21"/>
+              </w:rPr>
+              <w:t xml:space="preserve">→</w:t>
+            </w:r>
+            <w:r>
+              <w:tab/>
+            </w:r>
+            <w:r>
+              <w:rPr>
+                <w:b/>
+                <w:bCs/>
+                <w:sz w:val="21"/>
+                <w:szCs w:val="21"/>
+              </w:rPr>
+              <w:t xml:space="preserve">Projects:</w:t>
+            </w:r>
+            <w:r>
+              <w:rPr>
+                <w:sz w:val="21"/>
+                <w:szCs w:val="21"/>
+              </w:rPr>
+              <w:t xml:space="preserve"> Hanimaadhoo airport, social housing, 60+ community projects, Greater Malé Connectivity Project bridge (due Sept 2026)</w:t>
+            </w:r>
+          </w:p>
+        </w:tc>
+      </w:tr>
+      <w:tr>
+        <w:trPr>
+          <w:cantSplit/>
+        </w:trPr>
+        <w:tc>
+          <w:tcPr>
+            <w:tcW w:type="dxa" w:w="520"/>
+            <w:tcBorders>
+              <w:top w:val="single" w:color="BFBFBF" w:sz="4"/>
+              <w:left w:val="single" w:color="BFBFBF" w:sz="4"/>
+              <w:bottom w:val="single" w:color="BFBFBF" w:sz="4"/>
+              <w:right w:val="single" w:color="BFBFBF" w:sz="4"/>
+            </w:tcBorders>
+            <w:shd w:fill="F5F7FB" w:color="auto" w:val="clear"/>
+            <w:tcMar>
+              <w:top w:type="dxa" w:w="70"/>
+              <w:left w:type="dxa" w:w="100"/>
+              <w:bottom w:type="dxa" w:w="70"/>
+              <w:right w:type="dxa" w:w="100"/>
+            </w:tcMar>
+            <w:vAlign w:val="center"/>
+          </w:tcPr>
+          <w:p>
+            <w:pPr>
+              <w:spacing w:after="0" w:before="0" w:line="300"/>
+              <w:jc w:val="center"/>
+            </w:pPr>
+            <w:r>
+              <w:rPr>
+                <w:color w:val="7F7F7F"/>
+                <w:sz w:val="21"/>
+                <w:szCs w:val="21"/>
+              </w:rPr>
+              <w:t xml:space="preserve">4</w:t>
+            </w:r>
+          </w:p>
+        </w:tc>
+        <w:tc>
+          <w:tcPr>
+            <w:tcW w:type="dxa" w:w="2200"/>
+            <w:tcBorders>
+              <w:top w:val="single" w:color="BFBFBF" w:sz="4"/>
+              <w:left w:val="single" w:color="BFBFBF" w:sz="4"/>
+              <w:bottom w:val="single" w:color="BFBFBF" w:sz="4"/>
+              <w:right w:val="single" w:color="BFBFBF" w:sz="4"/>
+            </w:tcBorders>
+            <w:shd w:fill="F5F7FB" w:color="auto" w:val="clear"/>
+            <w:tcMar>
+              <w:top w:type="dxa" w:w="70"/>
+              <w:left w:type="dxa" w:w="100"/>
+              <w:bottom w:type="dxa" w:w="70"/>
+              <w:right w:type="dxa" w:w="100"/>
+            </w:tcMar>
+            <w:vAlign w:val="center"/>
+          </w:tcPr>
+          <w:p>
+            <w:pPr>
+              <w:spacing w:after="0" w:before="0" w:line="300"/>
+            </w:pPr>
+            <w:r>
+              <w:rPr>
+                <w:b/>
+                <w:bCs/>
+                <w:color w:val="1F3864"/>
+                <w:sz w:val="21"/>
+                <w:szCs w:val="21"/>
+              </w:rPr>
+              <w:t xml:space="preserve">Problems</w:t>
+            </w:r>
+          </w:p>
+        </w:tc>
+        <w:tc>
+          <w:tcPr>
+            <w:tcW w:type="dxa" w:w="7986"/>
+            <w:tcBorders>
+              <w:top w:val="single" w:color="BFBFBF" w:sz="4"/>
+              <w:left w:val="single" w:color="BFBFBF" w:sz="4"/>
+              <w:bottom w:val="single" w:color="BFBFBF" w:sz="4"/>
+              <w:right w:val="single" w:color="BFBFBF" w:sz="4"/>
+            </w:tcBorders>
+            <w:shd w:fill="F5F7FB" w:color="auto" w:val="clear"/>
+            <w:tcMar>
+              <w:top w:type="dxa" w:w="70"/>
+              <w:left w:type="dxa" w:w="100"/>
+              <w:bottom w:type="dxa" w:w="70"/>
+              <w:right w:type="dxa" w:w="100"/>
+            </w:tcMar>
+            <w:vAlign w:val="center"/>
+          </w:tcPr>
+          <w:p>
+            <w:pPr>
+              <w:tabs>
+                <w:tab w:val="left" w:pos="260"/>
+              </w:tabs>
+              <w:spacing w:after="0" w:before="0" w:line="280"/>
+              <w:ind w:left="260" w:hanging="260"/>
+            </w:pPr>
+            <w:r>
+              <w:rPr>
+                <w:b/>
+                <w:bCs/>
+                <w:color w:val="C00000"/>
+                <w:sz w:val="21"/>
+                <w:szCs w:val="21"/>
+              </w:rPr>
+              <w:t xml:space="preserve">→</w:t>
+            </w:r>
+            <w:r>
+              <w:tab/>
+            </w:r>
+            <w:r>
+              <w:rPr>
+                <w:sz w:val="21"/>
+                <w:szCs w:val="21"/>
+              </w:rPr>
+              <w:t xml:space="preserve">Debt and dollar shortage (about $1.7 bn due in 2026), ratings downgrades</w:t>
+            </w:r>
+          </w:p>
+          <w:p>
+            <w:pPr>
+              <w:tabs>
+                <w:tab w:val="left" w:pos="260"/>
+              </w:tabs>
+              <w:spacing w:after="0" w:before="40" w:line="280"/>
+              <w:ind w:left="260" w:hanging="260"/>
+            </w:pPr>
+            <w:r>
+              <w:rPr>
+                <w:b/>
+                <w:bCs/>
+                <w:color w:val="C00000"/>
+                <w:sz w:val="21"/>
+                <w:szCs w:val="21"/>
+              </w:rPr>
+              <w:t xml:space="preserve">→</w:t>
+            </w:r>
+            <w:r>
+              <w:tab/>
+            </w:r>
+            <w:r>
+              <w:rPr>
+                <w:b/>
+                <w:bCs/>
+                <w:sz w:val="21"/>
+                <w:szCs w:val="21"/>
+              </w:rPr>
+              <w:t xml:space="preserve">China's role:</w:t>
+            </w:r>
+            <w:r>
+              <w:rPr>
+                <w:sz w:val="21"/>
+                <w:szCs w:val="21"/>
+              </w:rPr>
+              <w:t xml:space="preserve"> debt, China–Maldives FTA, research and tourism presence</w:t>
+            </w:r>
+          </w:p>
+          <w:p>
+            <w:pPr>
+              <w:tabs>
+                <w:tab w:val="left" w:pos="260"/>
+              </w:tabs>
+              <w:spacing w:after="0" w:before="40" w:line="280"/>
+              <w:ind w:left="260" w:hanging="260"/>
+            </w:pPr>
+            <w:r>
+              <w:rPr>
+                <w:b/>
+                <w:bCs/>
+                <w:color w:val="C00000"/>
+                <w:sz w:val="21"/>
+                <w:szCs w:val="21"/>
+              </w:rPr>
+              <w:t xml:space="preserve">→</w:t>
+            </w:r>
+            <w:r>
+              <w:tab/>
+            </w:r>
+            <w:r>
+              <w:rPr>
+                <w:sz w:val="21"/>
+                <w:szCs w:val="21"/>
+              </w:rPr>
+              <w:t xml:space="preserve">Sensitivity over Indian military presence; "India Out" nationalism</w:t>
+            </w:r>
+          </w:p>
+          <w:p>
+            <w:pPr>
+              <w:tabs>
+                <w:tab w:val="left" w:pos="260"/>
+              </w:tabs>
+              <w:spacing w:after="0" w:before="40" w:line="280"/>
+              <w:ind w:left="260" w:hanging="260"/>
+            </w:pPr>
+            <w:r>
+              <w:rPr>
+                <w:b/>
+                <w:bCs/>
+                <w:color w:val="C00000"/>
+                <w:sz w:val="21"/>
+                <w:szCs w:val="21"/>
+              </w:rPr>
+              <w:t xml:space="preserve">→</w:t>
+            </w:r>
+            <w:r>
+              <w:tab/>
+            </w:r>
+            <w:r>
+              <w:rPr>
+                <w:sz w:val="21"/>
+                <w:szCs w:val="21"/>
+              </w:rPr>
+              <w:t xml:space="preserve">Maldivian politics, including Nasheed-led opposition</w:t>
+            </w:r>
+          </w:p>
+          <w:p>
+            <w:pPr>
+              <w:tabs>
+                <w:tab w:val="left" w:pos="260"/>
+              </w:tabs>
+              <w:spacing w:after="0" w:before="40" w:line="280"/>
+              <w:ind w:left="260" w:hanging="260"/>
+            </w:pPr>
+            <w:r>
+              <w:rPr>
+                <w:b/>
+                <w:bCs/>
+                <w:color w:val="C00000"/>
+                <w:sz w:val="21"/>
+                <w:szCs w:val="21"/>
+              </w:rPr>
+              <w:t xml:space="preserve">→</w:t>
+            </w:r>
+            <w:r>
+              <w:tab/>
+            </w:r>
+            <w:r>
+              <w:rPr>
+                <w:sz w:val="21"/>
+                <w:szCs w:val="21"/>
+              </w:rPr>
+              <w:t xml:space="preserve">Falling Indian tourist share</w:t>
+            </w:r>
+          </w:p>
+          <w:p>
+            <w:pPr>
+              <w:tabs>
+                <w:tab w:val="left" w:pos="260"/>
+              </w:tabs>
+              <w:spacing w:after="0" w:before="40" w:line="280"/>
+              <w:ind w:left="260" w:hanging="260"/>
+            </w:pPr>
+            <w:r>
+              <w:rPr>
+                <w:b/>
+                <w:bCs/>
+                <w:color w:val="C00000"/>
+                <w:sz w:val="21"/>
+                <w:szCs w:val="21"/>
+              </w:rPr>
+              <w:t xml:space="preserve">→</w:t>
+            </w:r>
+            <w:r>
+              <w:tab/>
+            </w:r>
+            <w:r>
+              <w:rPr>
+                <w:sz w:val="21"/>
+                <w:szCs w:val="21"/>
+              </w:rPr>
+              <w:t xml:space="preserve">Maldives balancing India and China</w:t>
+            </w:r>
+          </w:p>
+          <w:p>
+            <w:pPr>
+              <w:tabs>
+                <w:tab w:val="left" w:pos="260"/>
+              </w:tabs>
+              <w:spacing w:after="0" w:before="40" w:line="280"/>
+              <w:ind w:left="260" w:hanging="260"/>
+            </w:pPr>
+            <w:r>
+              <w:rPr>
+                <w:b/>
+                <w:bCs/>
+                <w:color w:val="C00000"/>
+                <w:sz w:val="21"/>
+                <w:szCs w:val="21"/>
+              </w:rPr>
+              <w:t xml:space="preserve">→</w:t>
+            </w:r>
+            <w:r>
+              <w:tab/>
+            </w:r>
+            <w:r>
+              <w:rPr>
+                <w:sz w:val="21"/>
+                <w:szCs w:val="21"/>
+              </w:rPr>
+              <w:t xml:space="preserve">West Asia conflict hitting fuel and supply chains</w:t>
+            </w:r>
+          </w:p>
+        </w:tc>
+      </w:tr>
+      <w:tr>
+        <w:trPr>
+          <w:cantSplit/>
+        </w:trPr>
+        <w:tc>
+          <w:tcPr>
+            <w:tcW w:type="dxa" w:w="520"/>
+            <w:tcBorders>
+              <w:top w:val="single" w:color="BFBFBF" w:sz="4"/>
+              <w:left w:val="single" w:color="BFBFBF" w:sz="4"/>
+              <w:bottom w:val="single" w:color="BFBFBF" w:sz="4"/>
+              <w:right w:val="single" w:color="BFBFBF" w:sz="4"/>
+            </w:tcBorders>
+            <w:tcMar>
+              <w:top w:type="dxa" w:w="70"/>
+              <w:left w:type="dxa" w:w="100"/>
+              <w:bottom w:type="dxa" w:w="70"/>
+              <w:right w:type="dxa" w:w="100"/>
+            </w:tcMar>
+            <w:vAlign w:val="center"/>
+          </w:tcPr>
+          <w:p>
+            <w:pPr>
+              <w:spacing w:after="0" w:before="0" w:line="300"/>
+              <w:jc w:val="center"/>
+            </w:pPr>
+            <w:r>
+              <w:rPr>
+                <w:color w:val="7F7F7F"/>
+                <w:sz w:val="21"/>
+                <w:szCs w:val="21"/>
+              </w:rPr>
+              <w:t xml:space="preserve">5</w:t>
+            </w:r>
+          </w:p>
+        </w:tc>
+        <w:tc>
+          <w:tcPr>
+            <w:tcW w:type="dxa" w:w="2200"/>
+            <w:tcBorders>
+              <w:top w:val="single" w:color="BFBFBF" w:sz="4"/>
+              <w:left w:val="single" w:color="BFBFBF" w:sz="4"/>
+              <w:bottom w:val="single" w:color="BFBFBF" w:sz="4"/>
+              <w:right w:val="single" w:color="BFBFBF" w:sz="4"/>
+            </w:tcBorders>
+            <w:tcMar>
+              <w:top w:type="dxa" w:w="70"/>
+              <w:left w:type="dxa" w:w="100"/>
+              <w:bottom w:type="dxa" w:w="70"/>
+              <w:right w:type="dxa" w:w="100"/>
+            </w:tcMar>
+            <w:vAlign w:val="center"/>
+          </w:tcPr>
+          <w:p>
+            <w:pPr>
+              <w:spacing w:after="0" w:before="0" w:line="300"/>
+            </w:pPr>
+            <w:r>
+              <w:rPr>
+                <w:b/>
+                <w:bCs/>
+                <w:color w:val="1F3864"/>
+                <w:sz w:val="21"/>
+                <w:szCs w:val="21"/>
+              </w:rPr>
+              <w:t xml:space="preserve">Solutions</w:t>
+            </w:r>
+          </w:p>
+        </w:tc>
+        <w:tc>
+          <w:tcPr>
+            <w:tcW w:type="dxa" w:w="7986"/>
+            <w:tcBorders>
+              <w:top w:val="single" w:color="BFBFBF" w:sz="4"/>
+              <w:left w:val="single" w:color="BFBFBF" w:sz="4"/>
+              <w:bottom w:val="single" w:color="BFBFBF" w:sz="4"/>
+              <w:right w:val="single" w:color="BFBFBF" w:sz="4"/>
+            </w:tcBorders>
+            <w:tcMar>
+              <w:top w:type="dxa" w:w="70"/>
+              <w:left w:type="dxa" w:w="100"/>
+              <w:bottom w:type="dxa" w:w="70"/>
+              <w:right w:type="dxa" w:w="100"/>
+            </w:tcMar>
+            <w:vAlign w:val="center"/>
+          </w:tcPr>
+          <w:p>
+            <w:pPr>
+              <w:tabs>
+                <w:tab w:val="left" w:pos="260"/>
+              </w:tabs>
+              <w:spacing w:after="0" w:before="0" w:line="280"/>
+              <w:ind w:left="260" w:hanging="260"/>
+            </w:pPr>
+            <w:r>
+              <w:rPr>
+                <w:b/>
+                <w:bCs/>
+                <w:color w:val="C00000"/>
+                <w:sz w:val="21"/>
+                <w:szCs w:val="21"/>
+              </w:rPr>
+              <w:t xml:space="preserve">→</w:t>
+            </w:r>
+            <w:r>
+              <w:tab/>
+            </w:r>
+            <w:r>
+              <w:rPr>
+                <w:sz w:val="21"/>
+                <w:szCs w:val="21"/>
+              </w:rPr>
+              <w:t xml:space="preserve">Economic lifeline with strategic ends: swaps, credit lines, fair debt relief</w:t>
+            </w:r>
+          </w:p>
+          <w:p>
+            <w:pPr>
+              <w:tabs>
+                <w:tab w:val="left" w:pos="260"/>
+              </w:tabs>
+              <w:spacing w:after="0" w:before="40" w:line="280"/>
+              <w:ind w:left="260" w:hanging="260"/>
+            </w:pPr>
+            <w:r>
+              <w:rPr>
+                <w:b/>
+                <w:bCs/>
+                <w:color w:val="C00000"/>
+                <w:sz w:val="21"/>
+                <w:szCs w:val="21"/>
+              </w:rPr>
+              <w:t xml:space="preserve">→</w:t>
+            </w:r>
+            <w:r>
+              <w:tab/>
+            </w:r>
+            <w:r>
+              <w:rPr>
+                <w:sz w:val="21"/>
+                <w:szCs w:val="21"/>
+              </w:rPr>
+              <w:t xml:space="preserve">Conclude the FTA and BIT on mutually beneficial terms</w:t>
+            </w:r>
+          </w:p>
+          <w:p>
+            <w:pPr>
+              <w:tabs>
+                <w:tab w:val="left" w:pos="260"/>
+              </w:tabs>
+              <w:spacing w:after="0" w:before="40" w:line="280"/>
+              <w:ind w:left="260" w:hanging="260"/>
+            </w:pPr>
+            <w:r>
+              <w:rPr>
+                <w:b/>
+                <w:bCs/>
+                <w:color w:val="C00000"/>
+                <w:sz w:val="21"/>
+                <w:szCs w:val="21"/>
+              </w:rPr>
+              <w:t xml:space="preserve">→</w:t>
+            </w:r>
+            <w:r>
+              <w:tab/>
+            </w:r>
+            <w:r>
+              <w:rPr>
+                <w:sz w:val="21"/>
+                <w:szCs w:val="21"/>
+              </w:rPr>
+              <w:t xml:space="preserve">Visible development projects (airports, housing, bridge, harbours)</w:t>
+            </w:r>
+          </w:p>
+          <w:p>
+            <w:pPr>
+              <w:tabs>
+                <w:tab w:val="left" w:pos="260"/>
+              </w:tabs>
+              <w:spacing w:after="0" w:before="40" w:line="280"/>
+              <w:ind w:left="260" w:hanging="260"/>
+            </w:pPr>
+            <w:r>
+              <w:rPr>
+                <w:b/>
+                <w:bCs/>
+                <w:color w:val="C00000"/>
+                <w:sz w:val="21"/>
+                <w:szCs w:val="21"/>
+              </w:rPr>
+              <w:t xml:space="preserve">→</w:t>
+            </w:r>
+            <w:r>
+              <w:tab/>
+            </w:r>
+            <w:r>
+              <w:rPr>
+                <w:sz w:val="21"/>
+                <w:szCs w:val="21"/>
+              </w:rPr>
+              <w:t xml:space="preserve">Defence and maritime cooperation framed as capacity building, not presence</w:t>
+            </w:r>
+          </w:p>
+          <w:p>
+            <w:pPr>
+              <w:tabs>
+                <w:tab w:val="left" w:pos="260"/>
+              </w:tabs>
+              <w:spacing w:after="0" w:before="40" w:line="280"/>
+              <w:ind w:left="260" w:hanging="260"/>
+            </w:pPr>
+            <w:r>
+              <w:rPr>
+                <w:b/>
+                <w:bCs/>
+                <w:color w:val="C00000"/>
+                <w:sz w:val="21"/>
+                <w:szCs w:val="21"/>
+              </w:rPr>
+              <w:t xml:space="preserve">→</w:t>
+            </w:r>
+            <w:r>
+              <w:tab/>
+            </w:r>
+            <w:r>
+              <w:rPr>
+                <w:sz w:val="21"/>
+                <w:szCs w:val="21"/>
+              </w:rPr>
+              <w:t xml:space="preserve">Colombo Security Conclave and joint EEZ surveillance</w:t>
+            </w:r>
+          </w:p>
+          <w:p>
+            <w:pPr>
+              <w:tabs>
+                <w:tab w:val="left" w:pos="260"/>
+              </w:tabs>
+              <w:spacing w:after="0" w:before="40" w:line="280"/>
+              <w:ind w:left="260" w:hanging="260"/>
+            </w:pPr>
+            <w:r>
+              <w:rPr>
+                <w:b/>
+                <w:bCs/>
+                <w:color w:val="C00000"/>
+                <w:sz w:val="21"/>
+                <w:szCs w:val="21"/>
+              </w:rPr>
+              <w:t xml:space="preserve">→</w:t>
+            </w:r>
+            <w:r>
+              <w:tab/>
+            </w:r>
+            <w:r>
+              <w:rPr>
+                <w:sz w:val="21"/>
+                <w:szCs w:val="21"/>
+              </w:rPr>
+              <w:t xml:space="preserve">Tourism and people-to-people ties (UPI, RuPay, direct flights, promoting Indian tourism)</w:t>
+            </w:r>
+          </w:p>
+          <w:p>
+            <w:pPr>
+              <w:tabs>
+                <w:tab w:val="left" w:pos="260"/>
+              </w:tabs>
+              <w:spacing w:after="0" w:before="40" w:line="280"/>
+              <w:ind w:left="260" w:hanging="260"/>
+            </w:pPr>
+            <w:r>
+              <w:rPr>
+                <w:b/>
+                <w:bCs/>
+                <w:color w:val="C00000"/>
+                <w:sz w:val="21"/>
+                <w:szCs w:val="21"/>
+              </w:rPr>
+              <w:t xml:space="preserve">→</w:t>
+            </w:r>
+            <w:r>
+              <w:tab/>
+            </w:r>
+            <w:r>
+              <w:rPr>
+                <w:sz w:val="21"/>
+                <w:szCs w:val="21"/>
+              </w:rPr>
+              <w:t xml:space="preserve">Engage the whole political spectrum in Malé, since "India Out" can win elections</w:t>
+            </w:r>
+          </w:p>
+        </w:tc>
+      </w:tr>
+      <w:tr>
+        <w:trPr>
+          <w:cantSplit/>
+        </w:trPr>
+        <w:tc>
+          <w:tcPr>
+            <w:tcW w:type="dxa" w:w="520"/>
+            <w:tcBorders>
+              <w:top w:val="single" w:color="BFBFBF" w:sz="4"/>
+              <w:left w:val="single" w:color="BFBFBF" w:sz="4"/>
+              <w:bottom w:val="single" w:color="BFBFBF" w:sz="4"/>
+              <w:right w:val="single" w:color="BFBFBF" w:sz="4"/>
+            </w:tcBorders>
+            <w:shd w:fill="F5F7FB" w:color="auto" w:val="clear"/>
+            <w:tcMar>
+              <w:top w:type="dxa" w:w="70"/>
+              <w:left w:type="dxa" w:w="100"/>
+              <w:bottom w:type="dxa" w:w="70"/>
+              <w:right w:type="dxa" w:w="100"/>
+            </w:tcMar>
+            <w:vAlign w:val="center"/>
+          </w:tcPr>
+          <w:p>
+            <w:pPr>
+              <w:spacing w:after="0" w:before="0" w:line="300"/>
+              <w:jc w:val="center"/>
+            </w:pPr>
+            <w:r>
+              <w:rPr>
+                <w:color w:val="7F7F7F"/>
+                <w:sz w:val="21"/>
+                <w:szCs w:val="21"/>
+              </w:rPr>
+              <w:t xml:space="preserve">6</w:t>
+            </w:r>
+          </w:p>
+        </w:tc>
+        <w:tc>
+          <w:tcPr>
+            <w:tcW w:type="dxa" w:w="2200"/>
+            <w:tcBorders>
+              <w:top w:val="single" w:color="BFBFBF" w:sz="4"/>
+              <w:left w:val="single" w:color="BFBFBF" w:sz="4"/>
+              <w:bottom w:val="single" w:color="BFBFBF" w:sz="4"/>
+              <w:right w:val="single" w:color="BFBFBF" w:sz="4"/>
+            </w:tcBorders>
+            <w:shd w:fill="F5F7FB" w:color="auto" w:val="clear"/>
+            <w:tcMar>
+              <w:top w:type="dxa" w:w="70"/>
+              <w:left w:type="dxa" w:w="100"/>
+              <w:bottom w:type="dxa" w:w="70"/>
+              <w:right w:type="dxa" w:w="100"/>
+            </w:tcMar>
+            <w:vAlign w:val="center"/>
+          </w:tcPr>
+          <w:p>
+            <w:pPr>
+              <w:spacing w:after="0" w:before="0" w:line="300"/>
+            </w:pPr>
+            <w:r>
+              <w:rPr>
+                <w:b/>
+                <w:bCs/>
+                <w:color w:val="1F3864"/>
+                <w:sz w:val="21"/>
+                <w:szCs w:val="21"/>
+              </w:rPr>
+              <w:t xml:space="preserve">Conclusion</w:t>
+            </w:r>
+          </w:p>
+        </w:tc>
+        <w:tc>
+          <w:tcPr>
+            <w:tcW w:type="dxa" w:w="7986"/>
+            <w:tcBorders>
+              <w:top w:val="single" w:color="BFBFBF" w:sz="4"/>
+              <w:left w:val="single" w:color="BFBFBF" w:sz="4"/>
+              <w:bottom w:val="single" w:color="BFBFBF" w:sz="4"/>
+              <w:right w:val="single" w:color="BFBFBF" w:sz="4"/>
+            </w:tcBorders>
+            <w:shd w:fill="F5F7FB" w:color="auto" w:val="clear"/>
+            <w:tcMar>
+              <w:top w:type="dxa" w:w="70"/>
+              <w:left w:type="dxa" w:w="100"/>
+              <w:bottom w:type="dxa" w:w="70"/>
+              <w:right w:type="dxa" w:w="100"/>
+            </w:tcMar>
+            <w:vAlign w:val="center"/>
+          </w:tcPr>
+          <w:p>
+            <w:pPr>
+              <w:tabs>
+                <w:tab w:val="left" w:pos="260"/>
+              </w:tabs>
+              <w:spacing w:after="0" w:before="0" w:line="280"/>
+              <w:ind w:left="260" w:hanging="260"/>
+            </w:pPr>
+            <w:r>
+              <w:rPr>
+                <w:b/>
+                <w:bCs/>
+                <w:color w:val="C00000"/>
+                <w:sz w:val="21"/>
+                <w:szCs w:val="21"/>
+              </w:rPr>
+              <w:t xml:space="preserve">→</w:t>
+            </w:r>
+            <w:r>
+              <w:tab/>
+            </w:r>
+            <w:r>
+              <w:rPr>
+                <w:sz w:val="21"/>
+                <w:szCs w:val="21"/>
+              </w:rPr>
+              <w:t xml:space="preserve">A vital partner for Indian Ocean security</w:t>
+            </w:r>
+          </w:p>
+          <w:p>
+            <w:pPr>
+              <w:tabs>
+                <w:tab w:val="left" w:pos="260"/>
+              </w:tabs>
+              <w:spacing w:after="0" w:before="40" w:line="280"/>
+              <w:ind w:left="260" w:hanging="260"/>
+            </w:pPr>
+            <w:r>
+              <w:rPr>
+                <w:b/>
+                <w:bCs/>
+                <w:color w:val="C00000"/>
+                <w:sz w:val="21"/>
+                <w:szCs w:val="21"/>
+              </w:rPr>
+              <w:t xml:space="preserve">→</w:t>
+            </w:r>
+            <w:r>
+              <w:tab/>
+            </w:r>
+            <w:r>
+              <w:rPr>
+                <w:b/>
+                <w:bCs/>
+                <w:sz w:val="21"/>
+                <w:szCs w:val="21"/>
+              </w:rPr>
+              <w:t xml:space="preserve">India's strength:</w:t>
+            </w:r>
+            <w:r>
+              <w:rPr>
+                <w:sz w:val="21"/>
+                <w:szCs w:val="21"/>
+              </w:rPr>
+              <w:t xml:space="preserve"> a reliable, non-intrusive partner and first responder in a crisis</w:t>
+            </w:r>
+          </w:p>
+          <w:p>
+            <w:pPr>
+              <w:tabs>
+                <w:tab w:val="left" w:pos="260"/>
+              </w:tabs>
+              <w:spacing w:after="0" w:before="40" w:line="280"/>
+              <w:ind w:left="260" w:hanging="260"/>
+            </w:pPr>
+            <w:r>
+              <w:rPr>
+                <w:b/>
+                <w:bCs/>
+                <w:color w:val="C00000"/>
+                <w:sz w:val="21"/>
+                <w:szCs w:val="21"/>
+              </w:rPr>
+              <w:t xml:space="preserve">→</w:t>
+            </w:r>
+            <w:r>
+              <w:tab/>
+            </w:r>
+            <w:r>
+              <w:rPr>
+                <w:sz w:val="21"/>
+                <w:szCs w:val="21"/>
+              </w:rPr>
+              <w:t xml:space="preserve">A stable, solvent Maldives serves India better than a debt-trapped one</w:t>
             </w:r>
           </w:p>
         </w:tc>

</xml_diff>

<commit_message>
Add India–Myanmar Relations lecturette
Co-Authored-By: Claude Opus 5.5 <noreply@anthropic.com>
Claude-Session: https://claude.ai/code/session_01EyrV2JLtXrELkAF97b5fch
</commit_message>
<xml_diff>
--- a/SSB_Lecturettes.docx
+++ b/SSB_Lecturettes.docx
@@ -13895,6 +13895,1819 @@
                 <w:szCs w:val="21"/>
               </w:rPr>
               <w:t xml:space="preserve">A stable, solvent Maldives serves India better than a debt-trapped one</w:t>
+            </w:r>
+          </w:p>
+        </w:tc>
+      </w:tr>
+    </w:tbl>
+    <w:p>
+      <w:pPr>
+        <w:pStyle w:val="Heading1"/>
+        <w:pageBreakBefore/>
+        <w:shd w:fill="1F3864" w:color="auto" w:val="clear"/>
+        <w:spacing w:after="160" w:before="0"/>
+        <w:ind w:left="100" w:right="100"/>
+      </w:pPr>
+      <w:r>
+        <w:t xml:space="preserve">Topic 9: India–Myanmar Relations</w:t>
+      </w:r>
+    </w:p>
+    <w:tbl>
+      <w:tblPr>
+        <w:tblW w:type="dxa" w:w="10706"/>
+        <w:tblBorders>
+          <w:top w:val="single" w:color="auto" w:sz="4"/>
+          <w:left w:val="single" w:color="auto" w:sz="4"/>
+          <w:bottom w:val="single" w:color="auto" w:sz="4"/>
+          <w:right w:val="single" w:color="auto" w:sz="4"/>
+          <w:insideH w:val="single" w:color="auto" w:sz="4"/>
+          <w:insideV w:val="single" w:color="auto" w:sz="4"/>
+        </w:tblBorders>
+      </w:tblPr>
+      <w:tblGrid>
+        <w:gridCol w:w="520"/>
+        <w:gridCol w:w="2200"/>
+        <w:gridCol w:w="7986"/>
+      </w:tblGrid>
+      <w:tr>
+        <w:trPr>
+          <w:tblHeader/>
+        </w:trPr>
+        <w:tc>
+          <w:tcPr>
+            <w:tcW w:type="dxa" w:w="520"/>
+            <w:tcBorders>
+              <w:top w:val="single" w:color="BFBFBF" w:sz="4"/>
+              <w:left w:val="single" w:color="BFBFBF" w:sz="4"/>
+              <w:bottom w:val="single" w:color="BFBFBF" w:sz="4"/>
+              <w:right w:val="single" w:color="BFBFBF" w:sz="4"/>
+            </w:tcBorders>
+            <w:shd w:fill="DCE3F0" w:color="auto" w:val="clear"/>
+            <w:tcMar>
+              <w:top w:type="dxa" w:w="70"/>
+              <w:left w:type="dxa" w:w="100"/>
+              <w:bottom w:type="dxa" w:w="70"/>
+              <w:right w:type="dxa" w:w="100"/>
+            </w:tcMar>
+            <w:vAlign w:val="center"/>
+          </w:tcPr>
+          <w:p>
+            <w:pPr>
+              <w:spacing w:after="0" w:before="0" w:line="300"/>
+              <w:jc w:val="center"/>
+            </w:pPr>
+            <w:r>
+              <w:rPr>
+                <w:b/>
+                <w:bCs/>
+                <w:sz w:val="21"/>
+                <w:szCs w:val="21"/>
+              </w:rPr>
+              <w:t xml:space="preserve">#</w:t>
+            </w:r>
+          </w:p>
+        </w:tc>
+        <w:tc>
+          <w:tcPr>
+            <w:tcW w:type="dxa" w:w="2200"/>
+            <w:tcBorders>
+              <w:top w:val="single" w:color="BFBFBF" w:sz="4"/>
+              <w:left w:val="single" w:color="BFBFBF" w:sz="4"/>
+              <w:bottom w:val="single" w:color="BFBFBF" w:sz="4"/>
+              <w:right w:val="single" w:color="BFBFBF" w:sz="4"/>
+            </w:tcBorders>
+            <w:shd w:fill="DCE3F0" w:color="auto" w:val="clear"/>
+            <w:tcMar>
+              <w:top w:type="dxa" w:w="70"/>
+              <w:left w:type="dxa" w:w="100"/>
+              <w:bottom w:type="dxa" w:w="70"/>
+              <w:right w:type="dxa" w:w="100"/>
+            </w:tcMar>
+            <w:vAlign w:val="center"/>
+          </w:tcPr>
+          <w:p>
+            <w:pPr>
+              <w:spacing w:after="0" w:before="0" w:line="300"/>
+            </w:pPr>
+            <w:r>
+              <w:rPr>
+                <w:b/>
+                <w:bCs/>
+                <w:sz w:val="21"/>
+                <w:szCs w:val="21"/>
+              </w:rPr>
+              <w:t xml:space="preserve">Stage</w:t>
+            </w:r>
+          </w:p>
+        </w:tc>
+        <w:tc>
+          <w:tcPr>
+            <w:tcW w:type="dxa" w:w="7986"/>
+            <w:tcBorders>
+              <w:top w:val="single" w:color="BFBFBF" w:sz="4"/>
+              <w:left w:val="single" w:color="BFBFBF" w:sz="4"/>
+              <w:bottom w:val="single" w:color="BFBFBF" w:sz="4"/>
+              <w:right w:val="single" w:color="BFBFBF" w:sz="4"/>
+            </w:tcBorders>
+            <w:shd w:fill="DCE3F0" w:color="auto" w:val="clear"/>
+            <w:tcMar>
+              <w:top w:type="dxa" w:w="70"/>
+              <w:left w:type="dxa" w:w="100"/>
+              <w:bottom w:type="dxa" w:w="70"/>
+              <w:right w:type="dxa" w:w="100"/>
+            </w:tcMar>
+            <w:vAlign w:val="center"/>
+          </w:tcPr>
+          <w:p>
+            <w:pPr>
+              <w:spacing w:after="0" w:before="0" w:line="300"/>
+            </w:pPr>
+            <w:r>
+              <w:rPr>
+                <w:b/>
+                <w:bCs/>
+                <w:sz w:val="21"/>
+                <w:szCs w:val="21"/>
+              </w:rPr>
+              <w:t xml:space="preserve">Flow</w:t>
+            </w:r>
+          </w:p>
+        </w:tc>
+      </w:tr>
+      <w:tr>
+        <w:trPr>
+          <w:cantSplit/>
+        </w:trPr>
+        <w:tc>
+          <w:tcPr>
+            <w:tcW w:type="dxa" w:w="520"/>
+            <w:tcBorders>
+              <w:top w:val="single" w:color="BFBFBF" w:sz="4"/>
+              <w:left w:val="single" w:color="BFBFBF" w:sz="4"/>
+              <w:bottom w:val="single" w:color="BFBFBF" w:sz="4"/>
+              <w:right w:val="single" w:color="BFBFBF" w:sz="4"/>
+            </w:tcBorders>
+            <w:tcMar>
+              <w:top w:type="dxa" w:w="70"/>
+              <w:left w:type="dxa" w:w="100"/>
+              <w:bottom w:type="dxa" w:w="70"/>
+              <w:right w:type="dxa" w:w="100"/>
+            </w:tcMar>
+            <w:vAlign w:val="center"/>
+          </w:tcPr>
+          <w:p>
+            <w:pPr>
+              <w:spacing w:after="0" w:before="0" w:line="300"/>
+              <w:jc w:val="center"/>
+            </w:pPr>
+            <w:r>
+              <w:rPr>
+                <w:color w:val="7F7F7F"/>
+                <w:sz w:val="21"/>
+                <w:szCs w:val="21"/>
+              </w:rPr>
+              <w:t xml:space="preserve">1</w:t>
+            </w:r>
+          </w:p>
+        </w:tc>
+        <w:tc>
+          <w:tcPr>
+            <w:tcW w:type="dxa" w:w="2200"/>
+            <w:tcBorders>
+              <w:top w:val="single" w:color="BFBFBF" w:sz="4"/>
+              <w:left w:val="single" w:color="BFBFBF" w:sz="4"/>
+              <w:bottom w:val="single" w:color="BFBFBF" w:sz="4"/>
+              <w:right w:val="single" w:color="BFBFBF" w:sz="4"/>
+            </w:tcBorders>
+            <w:tcMar>
+              <w:top w:type="dxa" w:w="70"/>
+              <w:left w:type="dxa" w:w="100"/>
+              <w:bottom w:type="dxa" w:w="70"/>
+              <w:right w:type="dxa" w:w="100"/>
+            </w:tcMar>
+            <w:vAlign w:val="center"/>
+          </w:tcPr>
+          <w:p>
+            <w:pPr>
+              <w:spacing w:after="0" w:before="0" w:line="300"/>
+            </w:pPr>
+            <w:r>
+              <w:rPr>
+                <w:b/>
+                <w:bCs/>
+                <w:color w:val="1F3864"/>
+                <w:sz w:val="21"/>
+                <w:szCs w:val="21"/>
+              </w:rPr>
+              <w:t xml:space="preserve">What is it</w:t>
+            </w:r>
+          </w:p>
+        </w:tc>
+        <w:tc>
+          <w:tcPr>
+            <w:tcW w:type="dxa" w:w="7986"/>
+            <w:tcBorders>
+              <w:top w:val="single" w:color="BFBFBF" w:sz="4"/>
+              <w:left w:val="single" w:color="BFBFBF" w:sz="4"/>
+              <w:bottom w:val="single" w:color="BFBFBF" w:sz="4"/>
+              <w:right w:val="single" w:color="BFBFBF" w:sz="4"/>
+            </w:tcBorders>
+            <w:tcMar>
+              <w:top w:type="dxa" w:w="70"/>
+              <w:left w:type="dxa" w:w="100"/>
+              <w:bottom w:type="dxa" w:w="70"/>
+              <w:right w:type="dxa" w:w="100"/>
+            </w:tcMar>
+            <w:vAlign w:val="center"/>
+          </w:tcPr>
+          <w:p>
+            <w:pPr>
+              <w:tabs>
+                <w:tab w:val="left" w:pos="260"/>
+              </w:tabs>
+              <w:spacing w:after="0" w:before="0" w:line="280"/>
+              <w:ind w:left="260" w:hanging="260"/>
+            </w:pPr>
+            <w:r>
+              <w:rPr>
+                <w:b/>
+                <w:bCs/>
+                <w:color w:val="C00000"/>
+                <w:sz w:val="21"/>
+                <w:szCs w:val="21"/>
+              </w:rPr>
+              <w:t xml:space="preserve">→</w:t>
+            </w:r>
+            <w:r>
+              <w:tab/>
+            </w:r>
+            <w:r>
+              <w:rPr>
+                <w:sz w:val="21"/>
+                <w:szCs w:val="21"/>
+              </w:rPr>
+              <w:t xml:space="preserve">Gateway to Southeast Asia; 1,643 km land border (Arunachal Pradesh, Nagaland, Manipur, Mizoram) plus a Bay of Bengal maritime boundary</w:t>
+            </w:r>
+          </w:p>
+          <w:p>
+            <w:pPr>
+              <w:tabs>
+                <w:tab w:val="left" w:pos="260"/>
+              </w:tabs>
+              <w:spacing w:after="0" w:before="40" w:line="280"/>
+              <w:ind w:left="260" w:hanging="260"/>
+            </w:pPr>
+            <w:r>
+              <w:rPr>
+                <w:b/>
+                <w:bCs/>
+                <w:color w:val="C00000"/>
+                <w:sz w:val="21"/>
+                <w:szCs w:val="21"/>
+              </w:rPr>
+              <w:t xml:space="preserve">→</w:t>
+            </w:r>
+            <w:r>
+              <w:tab/>
+            </w:r>
+            <w:r>
+              <w:rPr>
+                <w:sz w:val="21"/>
+                <w:szCs w:val="21"/>
+              </w:rPr>
+              <w:t xml:space="preserve">Ancient Buddhist and trade links; once part of British India</w:t>
+            </w:r>
+          </w:p>
+          <w:p>
+            <w:pPr>
+              <w:tabs>
+                <w:tab w:val="left" w:pos="260"/>
+              </w:tabs>
+              <w:spacing w:after="0" w:before="40" w:line="280"/>
+              <w:ind w:left="260" w:hanging="260"/>
+            </w:pPr>
+            <w:r>
+              <w:rPr>
+                <w:b/>
+                <w:bCs/>
+                <w:color w:val="C00000"/>
+                <w:sz w:val="21"/>
+                <w:szCs w:val="21"/>
+              </w:rPr>
+              <w:t xml:space="preserve">→</w:t>
+            </w:r>
+            <w:r>
+              <w:tab/>
+            </w:r>
+            <w:r>
+              <w:rPr>
+                <w:sz w:val="21"/>
+                <w:szCs w:val="21"/>
+              </w:rPr>
+              <w:t xml:space="preserve">Core to Act East, Neighbourhood First and MAHASAGAR</w:t>
+            </w:r>
+          </w:p>
+          <w:p>
+            <w:pPr>
+              <w:tabs>
+                <w:tab w:val="left" w:pos="260"/>
+              </w:tabs>
+              <w:spacing w:after="0" w:before="40" w:line="280"/>
+              <w:ind w:left="260" w:hanging="260"/>
+            </w:pPr>
+            <w:r>
+              <w:rPr>
+                <w:b/>
+                <w:bCs/>
+                <w:color w:val="C00000"/>
+                <w:sz w:val="21"/>
+                <w:szCs w:val="21"/>
+              </w:rPr>
+              <w:t xml:space="preserve">→</w:t>
+            </w:r>
+            <w:r>
+              <w:tab/>
+            </w:r>
+            <w:r>
+              <w:rPr>
+                <w:sz w:val="21"/>
+                <w:szCs w:val="21"/>
+              </w:rPr>
+              <w:t xml:space="preserve">India engages whoever holds power in Naypyidaw</w:t>
+            </w:r>
+          </w:p>
+        </w:tc>
+      </w:tr>
+      <w:tr>
+        <w:trPr>
+          <w:cantSplit/>
+        </w:trPr>
+        <w:tc>
+          <w:tcPr>
+            <w:tcW w:type="dxa" w:w="520"/>
+            <w:tcBorders>
+              <w:top w:val="single" w:color="BFBFBF" w:sz="4"/>
+              <w:left w:val="single" w:color="BFBFBF" w:sz="4"/>
+              <w:bottom w:val="single" w:color="BFBFBF" w:sz="4"/>
+              <w:right w:val="single" w:color="BFBFBF" w:sz="4"/>
+            </w:tcBorders>
+            <w:shd w:fill="F5F7FB" w:color="auto" w:val="clear"/>
+            <w:tcMar>
+              <w:top w:type="dxa" w:w="70"/>
+              <w:left w:type="dxa" w:w="100"/>
+              <w:bottom w:type="dxa" w:w="70"/>
+              <w:right w:type="dxa" w:w="100"/>
+            </w:tcMar>
+            <w:vAlign w:val="center"/>
+          </w:tcPr>
+          <w:p>
+            <w:pPr>
+              <w:spacing w:after="0" w:before="0" w:line="300"/>
+              <w:jc w:val="center"/>
+            </w:pPr>
+            <w:r>
+              <w:rPr>
+                <w:color w:val="7F7F7F"/>
+                <w:sz w:val="21"/>
+                <w:szCs w:val="21"/>
+              </w:rPr>
+              <w:t xml:space="preserve">2</w:t>
+            </w:r>
+          </w:p>
+        </w:tc>
+        <w:tc>
+          <w:tcPr>
+            <w:tcW w:type="dxa" w:w="2200"/>
+            <w:tcBorders>
+              <w:top w:val="single" w:color="BFBFBF" w:sz="4"/>
+              <w:left w:val="single" w:color="BFBFBF" w:sz="4"/>
+              <w:bottom w:val="single" w:color="BFBFBF" w:sz="4"/>
+              <w:right w:val="single" w:color="BFBFBF" w:sz="4"/>
+            </w:tcBorders>
+            <w:shd w:fill="F5F7FB" w:color="auto" w:val="clear"/>
+            <w:tcMar>
+              <w:top w:type="dxa" w:w="70"/>
+              <w:left w:type="dxa" w:w="100"/>
+              <w:bottom w:type="dxa" w:w="70"/>
+              <w:right w:type="dxa" w:w="100"/>
+            </w:tcMar>
+            <w:vAlign w:val="center"/>
+          </w:tcPr>
+          <w:p>
+            <w:pPr>
+              <w:spacing w:after="0" w:before="0" w:line="300"/>
+            </w:pPr>
+            <w:r>
+              <w:rPr>
+                <w:b/>
+                <w:bCs/>
+                <w:color w:val="1F3864"/>
+                <w:sz w:val="21"/>
+                <w:szCs w:val="21"/>
+              </w:rPr>
+              <w:t xml:space="preserve">Why it matters</w:t>
+            </w:r>
+          </w:p>
+        </w:tc>
+        <w:tc>
+          <w:tcPr>
+            <w:tcW w:type="dxa" w:w="7986"/>
+            <w:tcBorders>
+              <w:top w:val="single" w:color="BFBFBF" w:sz="4"/>
+              <w:left w:val="single" w:color="BFBFBF" w:sz="4"/>
+              <w:bottom w:val="single" w:color="BFBFBF" w:sz="4"/>
+              <w:right w:val="single" w:color="BFBFBF" w:sz="4"/>
+            </w:tcBorders>
+            <w:shd w:fill="F5F7FB" w:color="auto" w:val="clear"/>
+            <w:tcMar>
+              <w:top w:type="dxa" w:w="70"/>
+              <w:left w:type="dxa" w:w="100"/>
+              <w:bottom w:type="dxa" w:w="70"/>
+              <w:right w:type="dxa" w:w="100"/>
+            </w:tcMar>
+            <w:vAlign w:val="center"/>
+          </w:tcPr>
+          <w:p>
+            <w:pPr>
+              <w:tabs>
+                <w:tab w:val="left" w:pos="260"/>
+              </w:tabs>
+              <w:spacing w:after="0" w:before="0" w:line="280"/>
+              <w:ind w:left="260" w:hanging="260"/>
+            </w:pPr>
+            <w:r>
+              <w:rPr>
+                <w:b/>
+                <w:bCs/>
+                <w:color w:val="C00000"/>
+                <w:sz w:val="21"/>
+                <w:szCs w:val="21"/>
+              </w:rPr>
+              <w:t xml:space="preserve">→</w:t>
+            </w:r>
+            <w:r>
+              <w:tab/>
+            </w:r>
+            <w:r>
+              <w:rPr>
+                <w:b/>
+                <w:bCs/>
+                <w:sz w:val="21"/>
+                <w:szCs w:val="21"/>
+              </w:rPr>
+              <w:t xml:space="preserve">Security:</w:t>
+            </w:r>
+            <w:r>
+              <w:rPr>
+                <w:sz w:val="21"/>
+                <w:szCs w:val="21"/>
+              </w:rPr>
+              <w:t xml:space="preserve"> Northeast insurgent camps (NSCN-K, ULFA), narcotics and arms smuggling</w:t>
+            </w:r>
+          </w:p>
+          <w:p>
+            <w:pPr>
+              <w:tabs>
+                <w:tab w:val="left" w:pos="260"/>
+              </w:tabs>
+              <w:spacing w:after="0" w:before="40" w:line="280"/>
+              <w:ind w:left="260" w:hanging="260"/>
+            </w:pPr>
+            <w:r>
+              <w:rPr>
+                <w:b/>
+                <w:bCs/>
+                <w:color w:val="C00000"/>
+                <w:sz w:val="21"/>
+                <w:szCs w:val="21"/>
+              </w:rPr>
+              <w:t xml:space="preserve">→</w:t>
+            </w:r>
+            <w:r>
+              <w:tab/>
+            </w:r>
+            <w:r>
+              <w:rPr>
+                <w:b/>
+                <w:bCs/>
+                <w:sz w:val="21"/>
+                <w:szCs w:val="21"/>
+              </w:rPr>
+              <w:t xml:space="preserve">Connectivity:</w:t>
+            </w:r>
+            <w:r>
+              <w:rPr>
+                <w:sz w:val="21"/>
+                <w:szCs w:val="21"/>
+              </w:rPr>
+              <w:t xml:space="preserve"> only land bridge to ASEAN (IMT Trilateral Highway, Kaladan project)</w:t>
+            </w:r>
+          </w:p>
+          <w:p>
+            <w:pPr>
+              <w:tabs>
+                <w:tab w:val="left" w:pos="260"/>
+              </w:tabs>
+              <w:spacing w:after="0" w:before="40" w:line="280"/>
+              <w:ind w:left="260" w:hanging="260"/>
+            </w:pPr>
+            <w:r>
+              <w:rPr>
+                <w:b/>
+                <w:bCs/>
+                <w:color w:val="C00000"/>
+                <w:sz w:val="21"/>
+                <w:szCs w:val="21"/>
+              </w:rPr>
+              <w:t xml:space="preserve">→</w:t>
+            </w:r>
+            <w:r>
+              <w:tab/>
+            </w:r>
+            <w:r>
+              <w:rPr>
+                <w:b/>
+                <w:bCs/>
+                <w:sz w:val="21"/>
+                <w:szCs w:val="21"/>
+              </w:rPr>
+              <w:t xml:space="preserve">Strategic:</w:t>
+            </w:r>
+            <w:r>
+              <w:rPr>
+                <w:sz w:val="21"/>
+                <w:szCs w:val="21"/>
+              </w:rPr>
+              <w:t xml:space="preserve"> counters China's Kyaukphyu and CMEC presence</w:t>
+            </w:r>
+          </w:p>
+          <w:p>
+            <w:pPr>
+              <w:tabs>
+                <w:tab w:val="left" w:pos="260"/>
+              </w:tabs>
+              <w:spacing w:after="0" w:before="40" w:line="280"/>
+              <w:ind w:left="260" w:hanging="260"/>
+            </w:pPr>
+            <w:r>
+              <w:rPr>
+                <w:b/>
+                <w:bCs/>
+                <w:color w:val="C00000"/>
+                <w:sz w:val="21"/>
+                <w:szCs w:val="21"/>
+              </w:rPr>
+              <w:t xml:space="preserve">→</w:t>
+            </w:r>
+            <w:r>
+              <w:tab/>
+            </w:r>
+            <w:r>
+              <w:rPr>
+                <w:b/>
+                <w:bCs/>
+                <w:sz w:val="21"/>
+                <w:szCs w:val="21"/>
+              </w:rPr>
+              <w:t xml:space="preserve">Economic:</w:t>
+            </w:r>
+            <w:r>
+              <w:rPr>
+                <w:sz w:val="21"/>
+                <w:szCs w:val="21"/>
+              </w:rPr>
+              <w:t xml:space="preserve"> energy, critical minerals, trade</w:t>
+            </w:r>
+          </w:p>
+          <w:p>
+            <w:pPr>
+              <w:tabs>
+                <w:tab w:val="left" w:pos="260"/>
+              </w:tabs>
+              <w:spacing w:after="0" w:before="40" w:line="280"/>
+              <w:ind w:left="260" w:hanging="260"/>
+            </w:pPr>
+            <w:r>
+              <w:rPr>
+                <w:b/>
+                <w:bCs/>
+                <w:color w:val="C00000"/>
+                <w:sz w:val="21"/>
+                <w:szCs w:val="21"/>
+              </w:rPr>
+              <w:t xml:space="preserve">→</w:t>
+            </w:r>
+            <w:r>
+              <w:tab/>
+            </w:r>
+            <w:r>
+              <w:rPr>
+                <w:b/>
+                <w:bCs/>
+                <w:sz w:val="21"/>
+                <w:szCs w:val="21"/>
+              </w:rPr>
+              <w:t xml:space="preserve">Humanitarian:</w:t>
+            </w:r>
+            <w:r>
+              <w:rPr>
+                <w:sz w:val="21"/>
+                <w:szCs w:val="21"/>
+              </w:rPr>
+              <w:t xml:space="preserve"> refugees from the post-2021 conflict</w:t>
+            </w:r>
+          </w:p>
+        </w:tc>
+      </w:tr>
+      <w:tr>
+        <w:trPr>
+          <w:cantSplit/>
+        </w:trPr>
+        <w:tc>
+          <w:tcPr>
+            <w:tcW w:type="dxa" w:w="520"/>
+            <w:tcBorders>
+              <w:top w:val="single" w:color="BFBFBF" w:sz="4"/>
+              <w:left w:val="single" w:color="BFBFBF" w:sz="4"/>
+              <w:bottom w:val="single" w:color="BFBFBF" w:sz="4"/>
+              <w:right w:val="single" w:color="BFBFBF" w:sz="4"/>
+            </w:tcBorders>
+            <w:tcMar>
+              <w:top w:type="dxa" w:w="70"/>
+              <w:left w:type="dxa" w:w="100"/>
+              <w:bottom w:type="dxa" w:w="70"/>
+              <w:right w:type="dxa" w:w="100"/>
+            </w:tcMar>
+            <w:vAlign w:val="center"/>
+          </w:tcPr>
+          <w:p>
+            <w:pPr>
+              <w:spacing w:after="0" w:before="0" w:line="300"/>
+              <w:jc w:val="center"/>
+            </w:pPr>
+            <w:r>
+              <w:rPr>
+                <w:color w:val="7F7F7F"/>
+                <w:sz w:val="21"/>
+                <w:szCs w:val="21"/>
+              </w:rPr>
+              <w:t xml:space="preserve">3</w:t>
+            </w:r>
+          </w:p>
+        </w:tc>
+        <w:tc>
+          <w:tcPr>
+            <w:tcW w:type="dxa" w:w="2200"/>
+            <w:tcBorders>
+              <w:top w:val="single" w:color="BFBFBF" w:sz="4"/>
+              <w:left w:val="single" w:color="BFBFBF" w:sz="4"/>
+              <w:bottom w:val="single" w:color="BFBFBF" w:sz="4"/>
+              <w:right w:val="single" w:color="BFBFBF" w:sz="4"/>
+            </w:tcBorders>
+            <w:tcMar>
+              <w:top w:type="dxa" w:w="70"/>
+              <w:left w:type="dxa" w:w="100"/>
+              <w:bottom w:type="dxa" w:w="70"/>
+              <w:right w:type="dxa" w:w="100"/>
+            </w:tcMar>
+            <w:vAlign w:val="center"/>
+          </w:tcPr>
+          <w:p>
+            <w:pPr>
+              <w:spacing w:after="0" w:before="0" w:line="300"/>
+            </w:pPr>
+            <w:r>
+              <w:rPr>
+                <w:b/>
+                <w:bCs/>
+                <w:color w:val="1F3864"/>
+                <w:sz w:val="21"/>
+                <w:szCs w:val="21"/>
+              </w:rPr>
+              <w:t xml:space="preserve">Current status (Oct 2026)</w:t>
+            </w:r>
+          </w:p>
+        </w:tc>
+        <w:tc>
+          <w:tcPr>
+            <w:tcW w:type="dxa" w:w="7986"/>
+            <w:tcBorders>
+              <w:top w:val="single" w:color="BFBFBF" w:sz="4"/>
+              <w:left w:val="single" w:color="BFBFBF" w:sz="4"/>
+              <w:bottom w:val="single" w:color="BFBFBF" w:sz="4"/>
+              <w:right w:val="single" w:color="BFBFBF" w:sz="4"/>
+            </w:tcBorders>
+            <w:tcMar>
+              <w:top w:type="dxa" w:w="70"/>
+              <w:left w:type="dxa" w:w="100"/>
+              <w:bottom w:type="dxa" w:w="70"/>
+              <w:right w:type="dxa" w:w="100"/>
+            </w:tcMar>
+            <w:vAlign w:val="center"/>
+          </w:tcPr>
+          <w:p>
+            <w:pPr>
+              <w:tabs>
+                <w:tab w:val="left" w:pos="260"/>
+              </w:tabs>
+              <w:spacing w:after="0" w:before="0" w:line="280"/>
+              <w:ind w:left="260" w:hanging="260"/>
+            </w:pPr>
+            <w:r>
+              <w:rPr>
+                <w:b/>
+                <w:bCs/>
+                <w:color w:val="C00000"/>
+                <w:sz w:val="21"/>
+                <w:szCs w:val="21"/>
+              </w:rPr>
+              <w:t xml:space="preserve">→</w:t>
+            </w:r>
+            <w:r>
+              <w:tab/>
+            </w:r>
+            <w:r>
+              <w:rPr>
+                <w:b/>
+                <w:bCs/>
+                <w:sz w:val="21"/>
+                <w:szCs w:val="21"/>
+              </w:rPr>
+              <w:t xml:space="preserve">Political change:</w:t>
+            </w:r>
+            <w:r>
+              <w:rPr>
+                <w:sz w:val="21"/>
+                <w:szCs w:val="21"/>
+              </w:rPr>
+              <w:t xml:space="preserve"> contested elections (Dec 2025–Jan 2026), opposition excluded; Min Aung Hlaing now President of a military-backed government</w:t>
+            </w:r>
+          </w:p>
+          <w:p>
+            <w:pPr>
+              <w:tabs>
+                <w:tab w:val="left" w:pos="260"/>
+              </w:tabs>
+              <w:spacing w:after="0" w:before="40" w:line="280"/>
+              <w:ind w:left="260" w:hanging="260"/>
+            </w:pPr>
+            <w:r>
+              <w:rPr>
+                <w:b/>
+                <w:bCs/>
+                <w:color w:val="C00000"/>
+                <w:sz w:val="21"/>
+                <w:szCs w:val="21"/>
+              </w:rPr>
+              <w:t xml:space="preserve">→</w:t>
+            </w:r>
+            <w:r>
+              <w:tab/>
+            </w:r>
+            <w:r>
+              <w:rPr>
+                <w:b/>
+                <w:bCs/>
+                <w:sz w:val="21"/>
+                <w:szCs w:val="21"/>
+              </w:rPr>
+              <w:t xml:space="preserve">State visit:</w:t>
+            </w:r>
+            <w:r>
+              <w:rPr>
+                <w:sz w:val="21"/>
+                <w:szCs w:val="21"/>
+              </w:rPr>
+              <w:t xml:space="preserve"> chose India, not China, for his first foreign visit as President (mid-2026); met Modi and NSA Doval</w:t>
+            </w:r>
+          </w:p>
+          <w:p>
+            <w:pPr>
+              <w:tabs>
+                <w:tab w:val="left" w:pos="260"/>
+              </w:tabs>
+              <w:spacing w:after="0" w:before="40" w:line="280"/>
+              <w:ind w:left="260" w:hanging="260"/>
+            </w:pPr>
+            <w:r>
+              <w:rPr>
+                <w:b/>
+                <w:bCs/>
+                <w:color w:val="C00000"/>
+                <w:sz w:val="21"/>
+                <w:szCs w:val="21"/>
+              </w:rPr>
+              <w:t xml:space="preserve">→</w:t>
+            </w:r>
+            <w:r>
+              <w:tab/>
+            </w:r>
+            <w:r>
+              <w:rPr>
+                <w:b/>
+                <w:bCs/>
+                <w:sz w:val="21"/>
+                <w:szCs w:val="21"/>
+              </w:rPr>
+              <w:t xml:space="preserve">Assurance:</w:t>
+            </w:r>
+            <w:r>
+              <w:rPr>
+                <w:sz w:val="21"/>
+                <w:szCs w:val="21"/>
+              </w:rPr>
+              <w:t xml:space="preserve"> Myanmar soil not to be used by anti-India groups (NSCN-K, ULFA)</w:t>
+            </w:r>
+          </w:p>
+          <w:p>
+            <w:pPr>
+              <w:tabs>
+                <w:tab w:val="left" w:pos="260"/>
+              </w:tabs>
+              <w:spacing w:after="0" w:before="40" w:line="280"/>
+              <w:ind w:left="260" w:hanging="260"/>
+            </w:pPr>
+            <w:r>
+              <w:rPr>
+                <w:b/>
+                <w:bCs/>
+                <w:color w:val="C00000"/>
+                <w:sz w:val="21"/>
+                <w:szCs w:val="21"/>
+              </w:rPr>
+              <w:t xml:space="preserve">→</w:t>
+            </w:r>
+            <w:r>
+              <w:tab/>
+            </w:r>
+            <w:r>
+              <w:rPr>
+                <w:sz w:val="21"/>
+                <w:szCs w:val="21"/>
+              </w:rPr>
+              <w:t xml:space="preserve">Recommitted to Kaladan, IMT Trilateral Highway and rupee–kyat trade</w:t>
+            </w:r>
+          </w:p>
+          <w:p>
+            <w:pPr>
+              <w:tabs>
+                <w:tab w:val="left" w:pos="260"/>
+              </w:tabs>
+              <w:spacing w:after="0" w:before="40" w:line="280"/>
+              <w:ind w:left="260" w:hanging="260"/>
+            </w:pPr>
+            <w:r>
+              <w:rPr>
+                <w:b/>
+                <w:bCs/>
+                <w:color w:val="C00000"/>
+                <w:sz w:val="21"/>
+                <w:szCs w:val="21"/>
+              </w:rPr>
+              <w:t xml:space="preserve">→</w:t>
+            </w:r>
+            <w:r>
+              <w:tab/>
+            </w:r>
+            <w:r>
+              <w:rPr>
+                <w:b/>
+                <w:bCs/>
+                <w:sz w:val="21"/>
+                <w:szCs w:val="21"/>
+              </w:rPr>
+              <w:t xml:space="preserve">Trade:</w:t>
+            </w:r>
+            <w:r>
+              <w:rPr>
+                <w:sz w:val="21"/>
+                <w:szCs w:val="21"/>
+              </w:rPr>
+              <w:t xml:space="preserve"> $1.95 bn in FY 2025–26, up about 24%; India Myanmar's fourth largest trade partner</w:t>
+            </w:r>
+          </w:p>
+          <w:p>
+            <w:pPr>
+              <w:tabs>
+                <w:tab w:val="left" w:pos="260"/>
+              </w:tabs>
+              <w:spacing w:after="0" w:before="40" w:line="280"/>
+              <w:ind w:left="260" w:hanging="260"/>
+            </w:pPr>
+            <w:r>
+              <w:rPr>
+                <w:b/>
+                <w:bCs/>
+                <w:color w:val="C00000"/>
+                <w:sz w:val="21"/>
+                <w:szCs w:val="21"/>
+              </w:rPr>
+              <w:t xml:space="preserve">→</w:t>
+            </w:r>
+            <w:r>
+              <w:tab/>
+            </w:r>
+            <w:r>
+              <w:rPr>
+                <w:b/>
+                <w:bCs/>
+                <w:sz w:val="21"/>
+                <w:szCs w:val="21"/>
+              </w:rPr>
+              <w:t xml:space="preserve">Defence and parliament:</w:t>
+            </w:r>
+            <w:r>
+              <w:rPr>
+                <w:sz w:val="21"/>
+                <w:szCs w:val="21"/>
+              </w:rPr>
+              <w:t xml:space="preserve"> Navy chief Adm Dinesh Tripathi's visit (May 2026); Myanmar MPs trained in India (Sept); tri-services goodwill delegation to Naypyidaw (29 Sep–1 Oct)</w:t>
+            </w:r>
+          </w:p>
+          <w:p>
+            <w:pPr>
+              <w:tabs>
+                <w:tab w:val="left" w:pos="260"/>
+              </w:tabs>
+              <w:spacing w:after="0" w:before="40" w:line="280"/>
+              <w:ind w:left="260" w:hanging="260"/>
+            </w:pPr>
+            <w:r>
+              <w:rPr>
+                <w:b/>
+                <w:bCs/>
+                <w:color w:val="C00000"/>
+                <w:sz w:val="21"/>
+                <w:szCs w:val="21"/>
+              </w:rPr>
+              <w:t xml:space="preserve">→</w:t>
+            </w:r>
+            <w:r>
+              <w:tab/>
+            </w:r>
+            <w:r>
+              <w:rPr>
+                <w:b/>
+                <w:bCs/>
+                <w:sz w:val="21"/>
+                <w:szCs w:val="21"/>
+              </w:rPr>
+              <w:t xml:space="preserve">Border:</w:t>
+            </w:r>
+            <w:r>
+              <w:rPr>
+                <w:sz w:val="21"/>
+                <w:szCs w:val="21"/>
+              </w:rPr>
+              <w:t xml:space="preserve"> Free Movement Regime cut to 10 km; QR-coded 7-day passes; two of three friendship gates in Manipur and Arunachal closed; fencing begun amid Kuki-Zo and Mizo protests</w:t>
+            </w:r>
+          </w:p>
+        </w:tc>
+      </w:tr>
+      <w:tr>
+        <w:trPr>
+          <w:cantSplit/>
+        </w:trPr>
+        <w:tc>
+          <w:tcPr>
+            <w:tcW w:type="dxa" w:w="520"/>
+            <w:tcBorders>
+              <w:top w:val="single" w:color="BFBFBF" w:sz="4"/>
+              <w:left w:val="single" w:color="BFBFBF" w:sz="4"/>
+              <w:bottom w:val="single" w:color="BFBFBF" w:sz="4"/>
+              <w:right w:val="single" w:color="BFBFBF" w:sz="4"/>
+            </w:tcBorders>
+            <w:shd w:fill="F5F7FB" w:color="auto" w:val="clear"/>
+            <w:tcMar>
+              <w:top w:type="dxa" w:w="70"/>
+              <w:left w:type="dxa" w:w="100"/>
+              <w:bottom w:type="dxa" w:w="70"/>
+              <w:right w:type="dxa" w:w="100"/>
+            </w:tcMar>
+            <w:vAlign w:val="center"/>
+          </w:tcPr>
+          <w:p>
+            <w:pPr>
+              <w:spacing w:after="0" w:before="0" w:line="300"/>
+              <w:jc w:val="center"/>
+            </w:pPr>
+            <w:r>
+              <w:rPr>
+                <w:color w:val="7F7F7F"/>
+                <w:sz w:val="21"/>
+                <w:szCs w:val="21"/>
+              </w:rPr>
+              <w:t xml:space="preserve">4</w:t>
+            </w:r>
+          </w:p>
+        </w:tc>
+        <w:tc>
+          <w:tcPr>
+            <w:tcW w:type="dxa" w:w="2200"/>
+            <w:tcBorders>
+              <w:top w:val="single" w:color="BFBFBF" w:sz="4"/>
+              <w:left w:val="single" w:color="BFBFBF" w:sz="4"/>
+              <w:bottom w:val="single" w:color="BFBFBF" w:sz="4"/>
+              <w:right w:val="single" w:color="BFBFBF" w:sz="4"/>
+            </w:tcBorders>
+            <w:shd w:fill="F5F7FB" w:color="auto" w:val="clear"/>
+            <w:tcMar>
+              <w:top w:type="dxa" w:w="70"/>
+              <w:left w:type="dxa" w:w="100"/>
+              <w:bottom w:type="dxa" w:w="70"/>
+              <w:right w:type="dxa" w:w="100"/>
+            </w:tcMar>
+            <w:vAlign w:val="center"/>
+          </w:tcPr>
+          <w:p>
+            <w:pPr>
+              <w:spacing w:after="0" w:before="0" w:line="300"/>
+            </w:pPr>
+            <w:r>
+              <w:rPr>
+                <w:b/>
+                <w:bCs/>
+                <w:color w:val="1F3864"/>
+                <w:sz w:val="21"/>
+                <w:szCs w:val="21"/>
+              </w:rPr>
+              <w:t xml:space="preserve">Problems</w:t>
+            </w:r>
+          </w:p>
+        </w:tc>
+        <w:tc>
+          <w:tcPr>
+            <w:tcW w:type="dxa" w:w="7986"/>
+            <w:tcBorders>
+              <w:top w:val="single" w:color="BFBFBF" w:sz="4"/>
+              <w:left w:val="single" w:color="BFBFBF" w:sz="4"/>
+              <w:bottom w:val="single" w:color="BFBFBF" w:sz="4"/>
+              <w:right w:val="single" w:color="BFBFBF" w:sz="4"/>
+            </w:tcBorders>
+            <w:shd w:fill="F5F7FB" w:color="auto" w:val="clear"/>
+            <w:tcMar>
+              <w:top w:type="dxa" w:w="70"/>
+              <w:left w:type="dxa" w:w="100"/>
+              <w:bottom w:type="dxa" w:w="70"/>
+              <w:right w:type="dxa" w:w="100"/>
+            </w:tcMar>
+            <w:vAlign w:val="center"/>
+          </w:tcPr>
+          <w:p>
+            <w:pPr>
+              <w:tabs>
+                <w:tab w:val="left" w:pos="260"/>
+              </w:tabs>
+              <w:spacing w:after="0" w:before="0" w:line="280"/>
+              <w:ind w:left="260" w:hanging="260"/>
+            </w:pPr>
+            <w:r>
+              <w:rPr>
+                <w:b/>
+                <w:bCs/>
+                <w:color w:val="C00000"/>
+                <w:sz w:val="21"/>
+                <w:szCs w:val="21"/>
+              </w:rPr>
+              <w:t xml:space="preserve">→</w:t>
+            </w:r>
+            <w:r>
+              <w:tab/>
+            </w:r>
+            <w:r>
+              <w:rPr>
+                <w:b/>
+                <w:bCs/>
+                <w:sz w:val="21"/>
+                <w:szCs w:val="21"/>
+              </w:rPr>
+              <w:t xml:space="preserve">Civil war:</w:t>
+            </w:r>
+            <w:r>
+              <w:rPr>
+                <w:sz w:val="21"/>
+                <w:szCs w:val="21"/>
+              </w:rPr>
+              <w:t xml:space="preserve"> Arakan Army controls most of Rakhine, threatening Kaladan and Sittwe port</w:t>
+            </w:r>
+          </w:p>
+          <w:p>
+            <w:pPr>
+              <w:tabs>
+                <w:tab w:val="left" w:pos="260"/>
+              </w:tabs>
+              <w:spacing w:after="0" w:before="40" w:line="280"/>
+              <w:ind w:left="260" w:hanging="260"/>
+            </w:pPr>
+            <w:r>
+              <w:rPr>
+                <w:b/>
+                <w:bCs/>
+                <w:color w:val="C00000"/>
+                <w:sz w:val="21"/>
+                <w:szCs w:val="21"/>
+              </w:rPr>
+              <w:t xml:space="preserve">→</w:t>
+            </w:r>
+            <w:r>
+              <w:tab/>
+            </w:r>
+            <w:r>
+              <w:rPr>
+                <w:sz w:val="21"/>
+                <w:szCs w:val="21"/>
+              </w:rPr>
+              <w:t xml:space="preserve">Insurgents, arms and narcotics (Golden Triangle)</w:t>
+            </w:r>
+          </w:p>
+          <w:p>
+            <w:pPr>
+              <w:tabs>
+                <w:tab w:val="left" w:pos="260"/>
+              </w:tabs>
+              <w:spacing w:after="0" w:before="40" w:line="280"/>
+              <w:ind w:left="260" w:hanging="260"/>
+            </w:pPr>
+            <w:r>
+              <w:rPr>
+                <w:b/>
+                <w:bCs/>
+                <w:color w:val="C00000"/>
+                <w:sz w:val="21"/>
+                <w:szCs w:val="21"/>
+              </w:rPr>
+              <w:t xml:space="preserve">→</w:t>
+            </w:r>
+            <w:r>
+              <w:tab/>
+            </w:r>
+            <w:r>
+              <w:rPr>
+                <w:sz w:val="21"/>
+                <w:szCs w:val="21"/>
+              </w:rPr>
+              <w:t xml:space="preserve">Refugee inflows into Mizoram and Manipur</w:t>
+            </w:r>
+          </w:p>
+          <w:p>
+            <w:pPr>
+              <w:tabs>
+                <w:tab w:val="left" w:pos="260"/>
+              </w:tabs>
+              <w:spacing w:after="0" w:before="40" w:line="280"/>
+              <w:ind w:left="260" w:hanging="260"/>
+            </w:pPr>
+            <w:r>
+              <w:rPr>
+                <w:b/>
+                <w:bCs/>
+                <w:color w:val="C00000"/>
+                <w:sz w:val="21"/>
+                <w:szCs w:val="21"/>
+              </w:rPr>
+              <w:t xml:space="preserve">→</w:t>
+            </w:r>
+            <w:r>
+              <w:tab/>
+            </w:r>
+            <w:r>
+              <w:rPr>
+                <w:sz w:val="21"/>
+                <w:szCs w:val="21"/>
+              </w:rPr>
+              <w:t xml:space="preserve">Ethnic ties and anger over fencing and FMR curbs</w:t>
+            </w:r>
+          </w:p>
+          <w:p>
+            <w:pPr>
+              <w:tabs>
+                <w:tab w:val="left" w:pos="260"/>
+              </w:tabs>
+              <w:spacing w:after="0" w:before="40" w:line="280"/>
+              <w:ind w:left="260" w:hanging="260"/>
+            </w:pPr>
+            <w:r>
+              <w:rPr>
+                <w:b/>
+                <w:bCs/>
+                <w:color w:val="C00000"/>
+                <w:sz w:val="21"/>
+                <w:szCs w:val="21"/>
+              </w:rPr>
+              <w:t xml:space="preserve">→</w:t>
+            </w:r>
+            <w:r>
+              <w:tab/>
+            </w:r>
+            <w:r>
+              <w:rPr>
+                <w:sz w:val="21"/>
+                <w:szCs w:val="21"/>
+              </w:rPr>
+              <w:t xml:space="preserve">Delays in Kaladan and the IMT Highway</w:t>
+            </w:r>
+          </w:p>
+          <w:p>
+            <w:pPr>
+              <w:tabs>
+                <w:tab w:val="left" w:pos="260"/>
+              </w:tabs>
+              <w:spacing w:after="0" w:before="40" w:line="280"/>
+              <w:ind w:left="260" w:hanging="260"/>
+            </w:pPr>
+            <w:r>
+              <w:rPr>
+                <w:b/>
+                <w:bCs/>
+                <w:color w:val="C00000"/>
+                <w:sz w:val="21"/>
+                <w:szCs w:val="21"/>
+              </w:rPr>
+              <w:t xml:space="preserve">→</w:t>
+            </w:r>
+            <w:r>
+              <w:tab/>
+            </w:r>
+            <w:r>
+              <w:rPr>
+                <w:sz w:val="21"/>
+                <w:szCs w:val="21"/>
+              </w:rPr>
+              <w:t xml:space="preserve">China's heavy stakes (Kyaukphyu, pipelines, arms)</w:t>
+            </w:r>
+          </w:p>
+          <w:p>
+            <w:pPr>
+              <w:tabs>
+                <w:tab w:val="left" w:pos="260"/>
+              </w:tabs>
+              <w:spacing w:after="0" w:before="40" w:line="280"/>
+              <w:ind w:left="260" w:hanging="260"/>
+            </w:pPr>
+            <w:r>
+              <w:rPr>
+                <w:b/>
+                <w:bCs/>
+                <w:color w:val="C00000"/>
+                <w:sz w:val="21"/>
+                <w:szCs w:val="21"/>
+              </w:rPr>
+              <w:t xml:space="preserve">→</w:t>
+            </w:r>
+            <w:r>
+              <w:tab/>
+            </w:r>
+            <w:r>
+              <w:rPr>
+                <w:b/>
+                <w:bCs/>
+                <w:sz w:val="21"/>
+                <w:szCs w:val="21"/>
+              </w:rPr>
+              <w:t xml:space="preserve">Legitimacy:</w:t>
+            </w:r>
+            <w:r>
+              <w:rPr>
+                <w:sz w:val="21"/>
+                <w:szCs w:val="21"/>
+              </w:rPr>
+              <w:t xml:space="preserve"> questioned election, Western sanctions pressure</w:t>
+            </w:r>
+          </w:p>
+          <w:p>
+            <w:pPr>
+              <w:tabs>
+                <w:tab w:val="left" w:pos="260"/>
+              </w:tabs>
+              <w:spacing w:after="0" w:before="40" w:line="280"/>
+              <w:ind w:left="260" w:hanging="260"/>
+            </w:pPr>
+            <w:r>
+              <w:rPr>
+                <w:b/>
+                <w:bCs/>
+                <w:color w:val="C00000"/>
+                <w:sz w:val="21"/>
+                <w:szCs w:val="21"/>
+              </w:rPr>
+              <w:t xml:space="preserve">→</w:t>
+            </w:r>
+            <w:r>
+              <w:tab/>
+            </w:r>
+            <w:r>
+              <w:rPr>
+                <w:sz w:val="21"/>
+                <w:szCs w:val="21"/>
+              </w:rPr>
+              <w:t xml:space="preserve">Rohingya issue</w:t>
+            </w:r>
+          </w:p>
+        </w:tc>
+      </w:tr>
+      <w:tr>
+        <w:trPr>
+          <w:cantSplit/>
+        </w:trPr>
+        <w:tc>
+          <w:tcPr>
+            <w:tcW w:type="dxa" w:w="520"/>
+            <w:tcBorders>
+              <w:top w:val="single" w:color="BFBFBF" w:sz="4"/>
+              <w:left w:val="single" w:color="BFBFBF" w:sz="4"/>
+              <w:bottom w:val="single" w:color="BFBFBF" w:sz="4"/>
+              <w:right w:val="single" w:color="BFBFBF" w:sz="4"/>
+            </w:tcBorders>
+            <w:tcMar>
+              <w:top w:type="dxa" w:w="70"/>
+              <w:left w:type="dxa" w:w="100"/>
+              <w:bottom w:type="dxa" w:w="70"/>
+              <w:right w:type="dxa" w:w="100"/>
+            </w:tcMar>
+            <w:vAlign w:val="center"/>
+          </w:tcPr>
+          <w:p>
+            <w:pPr>
+              <w:spacing w:after="0" w:before="0" w:line="300"/>
+              <w:jc w:val="center"/>
+            </w:pPr>
+            <w:r>
+              <w:rPr>
+                <w:color w:val="7F7F7F"/>
+                <w:sz w:val="21"/>
+                <w:szCs w:val="21"/>
+              </w:rPr>
+              <w:t xml:space="preserve">5</w:t>
+            </w:r>
+          </w:p>
+        </w:tc>
+        <w:tc>
+          <w:tcPr>
+            <w:tcW w:type="dxa" w:w="2200"/>
+            <w:tcBorders>
+              <w:top w:val="single" w:color="BFBFBF" w:sz="4"/>
+              <w:left w:val="single" w:color="BFBFBF" w:sz="4"/>
+              <w:bottom w:val="single" w:color="BFBFBF" w:sz="4"/>
+              <w:right w:val="single" w:color="BFBFBF" w:sz="4"/>
+            </w:tcBorders>
+            <w:tcMar>
+              <w:top w:type="dxa" w:w="70"/>
+              <w:left w:type="dxa" w:w="100"/>
+              <w:bottom w:type="dxa" w:w="70"/>
+              <w:right w:type="dxa" w:w="100"/>
+            </w:tcMar>
+            <w:vAlign w:val="center"/>
+          </w:tcPr>
+          <w:p>
+            <w:pPr>
+              <w:spacing w:after="0" w:before="0" w:line="300"/>
+            </w:pPr>
+            <w:r>
+              <w:rPr>
+                <w:b/>
+                <w:bCs/>
+                <w:color w:val="1F3864"/>
+                <w:sz w:val="21"/>
+                <w:szCs w:val="21"/>
+              </w:rPr>
+              <w:t xml:space="preserve">Solutions</w:t>
+            </w:r>
+          </w:p>
+        </w:tc>
+        <w:tc>
+          <w:tcPr>
+            <w:tcW w:type="dxa" w:w="7986"/>
+            <w:tcBorders>
+              <w:top w:val="single" w:color="BFBFBF" w:sz="4"/>
+              <w:left w:val="single" w:color="BFBFBF" w:sz="4"/>
+              <w:bottom w:val="single" w:color="BFBFBF" w:sz="4"/>
+              <w:right w:val="single" w:color="BFBFBF" w:sz="4"/>
+            </w:tcBorders>
+            <w:tcMar>
+              <w:top w:type="dxa" w:w="70"/>
+              <w:left w:type="dxa" w:w="100"/>
+              <w:bottom w:type="dxa" w:w="70"/>
+              <w:right w:type="dxa" w:w="100"/>
+            </w:tcMar>
+            <w:vAlign w:val="center"/>
+          </w:tcPr>
+          <w:p>
+            <w:pPr>
+              <w:tabs>
+                <w:tab w:val="left" w:pos="260"/>
+              </w:tabs>
+              <w:spacing w:after="0" w:before="0" w:line="280"/>
+              <w:ind w:left="260" w:hanging="260"/>
+            </w:pPr>
+            <w:r>
+              <w:rPr>
+                <w:b/>
+                <w:bCs/>
+                <w:color w:val="C00000"/>
+                <w:sz w:val="21"/>
+                <w:szCs w:val="21"/>
+              </w:rPr>
+              <w:t xml:space="preserve">→</w:t>
+            </w:r>
+            <w:r>
+              <w:tab/>
+            </w:r>
+            <w:r>
+              <w:rPr>
+                <w:sz w:val="21"/>
+                <w:szCs w:val="21"/>
+              </w:rPr>
+              <w:t xml:space="preserve">Pragmatic, non-ideological engagement with firm assurances against anti-India groups</w:t>
+            </w:r>
+          </w:p>
+          <w:p>
+            <w:pPr>
+              <w:tabs>
+                <w:tab w:val="left" w:pos="260"/>
+              </w:tabs>
+              <w:spacing w:after="0" w:before="40" w:line="280"/>
+              <w:ind w:left="260" w:hanging="260"/>
+            </w:pPr>
+            <w:r>
+              <w:rPr>
+                <w:b/>
+                <w:bCs/>
+                <w:color w:val="C00000"/>
+                <w:sz w:val="21"/>
+                <w:szCs w:val="21"/>
+              </w:rPr>
+              <w:t xml:space="preserve">→</w:t>
+            </w:r>
+            <w:r>
+              <w:tab/>
+            </w:r>
+            <w:r>
+              <w:rPr>
+                <w:sz w:val="21"/>
+                <w:szCs w:val="21"/>
+              </w:rPr>
+              <w:t xml:space="preserve">Fast-track Kaladan and the IMT Highway with security for the works; run Sittwe port</w:t>
+            </w:r>
+          </w:p>
+          <w:p>
+            <w:pPr>
+              <w:tabs>
+                <w:tab w:val="left" w:pos="260"/>
+              </w:tabs>
+              <w:spacing w:after="0" w:before="40" w:line="280"/>
+              <w:ind w:left="260" w:hanging="260"/>
+            </w:pPr>
+            <w:r>
+              <w:rPr>
+                <w:b/>
+                <w:bCs/>
+                <w:color w:val="C00000"/>
+                <w:sz w:val="21"/>
+                <w:szCs w:val="21"/>
+              </w:rPr>
+              <w:t xml:space="preserve">→</w:t>
+            </w:r>
+            <w:r>
+              <w:tab/>
+            </w:r>
+            <w:r>
+              <w:rPr>
+                <w:sz w:val="21"/>
+                <w:szCs w:val="21"/>
+              </w:rPr>
+              <w:t xml:space="preserve">Quietly engage all stakeholders, including ethnic armed groups near the border</w:t>
+            </w:r>
+          </w:p>
+          <w:p>
+            <w:pPr>
+              <w:tabs>
+                <w:tab w:val="left" w:pos="260"/>
+              </w:tabs>
+              <w:spacing w:after="0" w:before="40" w:line="280"/>
+              <w:ind w:left="260" w:hanging="260"/>
+            </w:pPr>
+            <w:r>
+              <w:rPr>
+                <w:b/>
+                <w:bCs/>
+                <w:color w:val="C00000"/>
+                <w:sz w:val="21"/>
+                <w:szCs w:val="21"/>
+              </w:rPr>
+              <w:t xml:space="preserve">→</w:t>
+            </w:r>
+            <w:r>
+              <w:tab/>
+            </w:r>
+            <w:r>
+              <w:rPr>
+                <w:b/>
+                <w:bCs/>
+                <w:sz w:val="21"/>
+                <w:szCs w:val="21"/>
+              </w:rPr>
+              <w:t xml:space="preserve">Smart border management:</w:t>
+            </w:r>
+            <w:r>
+              <w:rPr>
+                <w:sz w:val="21"/>
+                <w:szCs w:val="21"/>
+              </w:rPr>
+              <w:t xml:space="preserve"> tech fencing, biometric passes, space for local families and trade</w:t>
+            </w:r>
+          </w:p>
+          <w:p>
+            <w:pPr>
+              <w:tabs>
+                <w:tab w:val="left" w:pos="260"/>
+              </w:tabs>
+              <w:spacing w:after="0" w:before="40" w:line="280"/>
+              <w:ind w:left="260" w:hanging="260"/>
+            </w:pPr>
+            <w:r>
+              <w:rPr>
+                <w:b/>
+                <w:bCs/>
+                <w:color w:val="C00000"/>
+                <w:sz w:val="21"/>
+                <w:szCs w:val="21"/>
+              </w:rPr>
+              <w:t xml:space="preserve">→</w:t>
+            </w:r>
+            <w:r>
+              <w:tab/>
+            </w:r>
+            <w:r>
+              <w:rPr>
+                <w:sz w:val="21"/>
+                <w:szCs w:val="21"/>
+              </w:rPr>
+              <w:t xml:space="preserve">Border haats, rupee–kyat trade, critical minerals, energy</w:t>
+            </w:r>
+          </w:p>
+          <w:p>
+            <w:pPr>
+              <w:tabs>
+                <w:tab w:val="left" w:pos="260"/>
+              </w:tabs>
+              <w:spacing w:after="0" w:before="40" w:line="280"/>
+              <w:ind w:left="260" w:hanging="260"/>
+            </w:pPr>
+            <w:r>
+              <w:rPr>
+                <w:b/>
+                <w:bCs/>
+                <w:color w:val="C00000"/>
+                <w:sz w:val="21"/>
+                <w:szCs w:val="21"/>
+              </w:rPr>
+              <w:t xml:space="preserve">→</w:t>
+            </w:r>
+            <w:r>
+              <w:tab/>
+            </w:r>
+            <w:r>
+              <w:rPr>
+                <w:sz w:val="21"/>
+                <w:szCs w:val="21"/>
+              </w:rPr>
+              <w:t xml:space="preserve">Humanitarian aid and capacity building (PRIDE, scholarships)</w:t>
+            </w:r>
+          </w:p>
+          <w:p>
+            <w:pPr>
+              <w:tabs>
+                <w:tab w:val="left" w:pos="260"/>
+              </w:tabs>
+              <w:spacing w:after="0" w:before="40" w:line="280"/>
+              <w:ind w:left="260" w:hanging="260"/>
+            </w:pPr>
+            <w:r>
+              <w:rPr>
+                <w:b/>
+                <w:bCs/>
+                <w:color w:val="C00000"/>
+                <w:sz w:val="21"/>
+                <w:szCs w:val="21"/>
+              </w:rPr>
+              <w:t xml:space="preserve">→</w:t>
+            </w:r>
+            <w:r>
+              <w:tab/>
+            </w:r>
+            <w:r>
+              <w:rPr>
+                <w:sz w:val="21"/>
+                <w:szCs w:val="21"/>
+              </w:rPr>
+              <w:t xml:space="preserve">Push for a political settlement and democracy through ASEAN</w:t>
+            </w:r>
+          </w:p>
+          <w:p>
+            <w:pPr>
+              <w:tabs>
+                <w:tab w:val="left" w:pos="260"/>
+              </w:tabs>
+              <w:spacing w:after="0" w:before="40" w:line="280"/>
+              <w:ind w:left="260" w:hanging="260"/>
+            </w:pPr>
+            <w:r>
+              <w:rPr>
+                <w:b/>
+                <w:bCs/>
+                <w:color w:val="C00000"/>
+                <w:sz w:val="21"/>
+                <w:szCs w:val="21"/>
+              </w:rPr>
+              <w:t xml:space="preserve">→</w:t>
+            </w:r>
+            <w:r>
+              <w:tab/>
+            </w:r>
+            <w:r>
+              <w:rPr>
+                <w:sz w:val="21"/>
+                <w:szCs w:val="21"/>
+              </w:rPr>
+              <w:t xml:space="preserve">Counter China by delivering projects, not rhetoric</w:t>
+            </w:r>
+          </w:p>
+        </w:tc>
+      </w:tr>
+      <w:tr>
+        <w:trPr>
+          <w:cantSplit/>
+        </w:trPr>
+        <w:tc>
+          <w:tcPr>
+            <w:tcW w:type="dxa" w:w="520"/>
+            <w:tcBorders>
+              <w:top w:val="single" w:color="BFBFBF" w:sz="4"/>
+              <w:left w:val="single" w:color="BFBFBF" w:sz="4"/>
+              <w:bottom w:val="single" w:color="BFBFBF" w:sz="4"/>
+              <w:right w:val="single" w:color="BFBFBF" w:sz="4"/>
+            </w:tcBorders>
+            <w:shd w:fill="F5F7FB" w:color="auto" w:val="clear"/>
+            <w:tcMar>
+              <w:top w:type="dxa" w:w="70"/>
+              <w:left w:type="dxa" w:w="100"/>
+              <w:bottom w:type="dxa" w:w="70"/>
+              <w:right w:type="dxa" w:w="100"/>
+            </w:tcMar>
+            <w:vAlign w:val="center"/>
+          </w:tcPr>
+          <w:p>
+            <w:pPr>
+              <w:spacing w:after="0" w:before="0" w:line="300"/>
+              <w:jc w:val="center"/>
+            </w:pPr>
+            <w:r>
+              <w:rPr>
+                <w:color w:val="7F7F7F"/>
+                <w:sz w:val="21"/>
+                <w:szCs w:val="21"/>
+              </w:rPr>
+              <w:t xml:space="preserve">6</w:t>
+            </w:r>
+          </w:p>
+        </w:tc>
+        <w:tc>
+          <w:tcPr>
+            <w:tcW w:type="dxa" w:w="2200"/>
+            <w:tcBorders>
+              <w:top w:val="single" w:color="BFBFBF" w:sz="4"/>
+              <w:left w:val="single" w:color="BFBFBF" w:sz="4"/>
+              <w:bottom w:val="single" w:color="BFBFBF" w:sz="4"/>
+              <w:right w:val="single" w:color="BFBFBF" w:sz="4"/>
+            </w:tcBorders>
+            <w:shd w:fill="F5F7FB" w:color="auto" w:val="clear"/>
+            <w:tcMar>
+              <w:top w:type="dxa" w:w="70"/>
+              <w:left w:type="dxa" w:w="100"/>
+              <w:bottom w:type="dxa" w:w="70"/>
+              <w:right w:type="dxa" w:w="100"/>
+            </w:tcMar>
+            <w:vAlign w:val="center"/>
+          </w:tcPr>
+          <w:p>
+            <w:pPr>
+              <w:spacing w:after="0" w:before="0" w:line="300"/>
+            </w:pPr>
+            <w:r>
+              <w:rPr>
+                <w:b/>
+                <w:bCs/>
+                <w:color w:val="1F3864"/>
+                <w:sz w:val="21"/>
+                <w:szCs w:val="21"/>
+              </w:rPr>
+              <w:t xml:space="preserve">Conclusion</w:t>
+            </w:r>
+          </w:p>
+        </w:tc>
+        <w:tc>
+          <w:tcPr>
+            <w:tcW w:type="dxa" w:w="7986"/>
+            <w:tcBorders>
+              <w:top w:val="single" w:color="BFBFBF" w:sz="4"/>
+              <w:left w:val="single" w:color="BFBFBF" w:sz="4"/>
+              <w:bottom w:val="single" w:color="BFBFBF" w:sz="4"/>
+              <w:right w:val="single" w:color="BFBFBF" w:sz="4"/>
+            </w:tcBorders>
+            <w:shd w:fill="F5F7FB" w:color="auto" w:val="clear"/>
+            <w:tcMar>
+              <w:top w:type="dxa" w:w="70"/>
+              <w:left w:type="dxa" w:w="100"/>
+              <w:bottom w:type="dxa" w:w="70"/>
+              <w:right w:type="dxa" w:w="100"/>
+            </w:tcMar>
+            <w:vAlign w:val="center"/>
+          </w:tcPr>
+          <w:p>
+            <w:pPr>
+              <w:tabs>
+                <w:tab w:val="left" w:pos="260"/>
+              </w:tabs>
+              <w:spacing w:after="0" w:before="0" w:line="280"/>
+              <w:ind w:left="260" w:hanging="260"/>
+            </w:pPr>
+            <w:r>
+              <w:rPr>
+                <w:b/>
+                <w:bCs/>
+                <w:color w:val="C00000"/>
+                <w:sz w:val="21"/>
+                <w:szCs w:val="21"/>
+              </w:rPr>
+              <w:t xml:space="preserve">→</w:t>
+            </w:r>
+            <w:r>
+              <w:tab/>
+            </w:r>
+            <w:r>
+              <w:rPr>
+                <w:sz w:val="21"/>
+                <w:szCs w:val="21"/>
+              </w:rPr>
+              <w:t xml:space="preserve">Myanmar is the keystone of India's Act East</w:t>
+            </w:r>
+          </w:p>
+          <w:p>
+            <w:pPr>
+              <w:tabs>
+                <w:tab w:val="left" w:pos="260"/>
+              </w:tabs>
+              <w:spacing w:after="0" w:before="40" w:line="280"/>
+              <w:ind w:left="260" w:hanging="260"/>
+            </w:pPr>
+            <w:r>
+              <w:rPr>
+                <w:b/>
+                <w:bCs/>
+                <w:color w:val="C00000"/>
+                <w:sz w:val="21"/>
+                <w:szCs w:val="21"/>
+              </w:rPr>
+              <w:t xml:space="preserve">→</w:t>
+            </w:r>
+            <w:r>
+              <w:tab/>
+            </w:r>
+            <w:r>
+              <w:rPr>
+                <w:sz w:val="21"/>
+                <w:szCs w:val="21"/>
+              </w:rPr>
+              <w:t xml:space="preserve">India's interest is a stable, united and friendly Myanmar</w:t>
+            </w:r>
+          </w:p>
+          <w:p>
+            <w:pPr>
+              <w:tabs>
+                <w:tab w:val="left" w:pos="260"/>
+              </w:tabs>
+              <w:spacing w:after="0" w:before="40" w:line="280"/>
+              <w:ind w:left="260" w:hanging="260"/>
+            </w:pPr>
+            <w:r>
+              <w:rPr>
+                <w:b/>
+                <w:bCs/>
+                <w:color w:val="C00000"/>
+                <w:sz w:val="21"/>
+                <w:szCs w:val="21"/>
+              </w:rPr>
+              <w:t xml:space="preserve">→</w:t>
+            </w:r>
+            <w:r>
+              <w:tab/>
+            </w:r>
+            <w:r>
+              <w:rPr>
+                <w:sz w:val="21"/>
+                <w:szCs w:val="21"/>
+              </w:rPr>
+              <w:t xml:space="preserve">Balance security, connectivity and democratic values with patience</w:t>
             </w:r>
           </w:p>
         </w:tc>

</xml_diff>

<commit_message>
Add India–USA Relations lecturette
Co-Authored-By: Claude Opus 5.5 <noreply@anthropic.com>
Claude-Session: https://claude.ai/code/session_01EyrV2JLtXrELkAF97b5fch
</commit_message>
<xml_diff>
--- a/SSB_Lecturettes.docx
+++ b/SSB_Lecturettes.docx
@@ -15708,6 +15708,1873 @@
                 <w:szCs w:val="21"/>
               </w:rPr>
               <w:t xml:space="preserve">Balance security, connectivity and democratic values with patience</w:t>
+            </w:r>
+          </w:p>
+        </w:tc>
+      </w:tr>
+    </w:tbl>
+    <w:p>
+      <w:pPr>
+        <w:pStyle w:val="Heading1"/>
+        <w:pageBreakBefore/>
+        <w:shd w:fill="1F3864" w:color="auto" w:val="clear"/>
+        <w:spacing w:after="160" w:before="0"/>
+        <w:ind w:left="100" w:right="100"/>
+      </w:pPr>
+      <w:r>
+        <w:t xml:space="preserve">Topic 10: India–USA Relations</w:t>
+      </w:r>
+    </w:p>
+    <w:tbl>
+      <w:tblPr>
+        <w:tblW w:type="dxa" w:w="10706"/>
+        <w:tblBorders>
+          <w:top w:val="single" w:color="auto" w:sz="4"/>
+          <w:left w:val="single" w:color="auto" w:sz="4"/>
+          <w:bottom w:val="single" w:color="auto" w:sz="4"/>
+          <w:right w:val="single" w:color="auto" w:sz="4"/>
+          <w:insideH w:val="single" w:color="auto" w:sz="4"/>
+          <w:insideV w:val="single" w:color="auto" w:sz="4"/>
+        </w:tblBorders>
+      </w:tblPr>
+      <w:tblGrid>
+        <w:gridCol w:w="520"/>
+        <w:gridCol w:w="2200"/>
+        <w:gridCol w:w="7986"/>
+      </w:tblGrid>
+      <w:tr>
+        <w:trPr>
+          <w:tblHeader/>
+        </w:trPr>
+        <w:tc>
+          <w:tcPr>
+            <w:tcW w:type="dxa" w:w="520"/>
+            <w:tcBorders>
+              <w:top w:val="single" w:color="BFBFBF" w:sz="4"/>
+              <w:left w:val="single" w:color="BFBFBF" w:sz="4"/>
+              <w:bottom w:val="single" w:color="BFBFBF" w:sz="4"/>
+              <w:right w:val="single" w:color="BFBFBF" w:sz="4"/>
+            </w:tcBorders>
+            <w:shd w:fill="DCE3F0" w:color="auto" w:val="clear"/>
+            <w:tcMar>
+              <w:top w:type="dxa" w:w="70"/>
+              <w:left w:type="dxa" w:w="100"/>
+              <w:bottom w:type="dxa" w:w="70"/>
+              <w:right w:type="dxa" w:w="100"/>
+            </w:tcMar>
+            <w:vAlign w:val="center"/>
+          </w:tcPr>
+          <w:p>
+            <w:pPr>
+              <w:spacing w:after="0" w:before="0" w:line="300"/>
+              <w:jc w:val="center"/>
+            </w:pPr>
+            <w:r>
+              <w:rPr>
+                <w:b/>
+                <w:bCs/>
+                <w:sz w:val="21"/>
+                <w:szCs w:val="21"/>
+              </w:rPr>
+              <w:t xml:space="preserve">#</w:t>
+            </w:r>
+          </w:p>
+        </w:tc>
+        <w:tc>
+          <w:tcPr>
+            <w:tcW w:type="dxa" w:w="2200"/>
+            <w:tcBorders>
+              <w:top w:val="single" w:color="BFBFBF" w:sz="4"/>
+              <w:left w:val="single" w:color="BFBFBF" w:sz="4"/>
+              <w:bottom w:val="single" w:color="BFBFBF" w:sz="4"/>
+              <w:right w:val="single" w:color="BFBFBF" w:sz="4"/>
+            </w:tcBorders>
+            <w:shd w:fill="DCE3F0" w:color="auto" w:val="clear"/>
+            <w:tcMar>
+              <w:top w:type="dxa" w:w="70"/>
+              <w:left w:type="dxa" w:w="100"/>
+              <w:bottom w:type="dxa" w:w="70"/>
+              <w:right w:type="dxa" w:w="100"/>
+            </w:tcMar>
+            <w:vAlign w:val="center"/>
+          </w:tcPr>
+          <w:p>
+            <w:pPr>
+              <w:spacing w:after="0" w:before="0" w:line="300"/>
+            </w:pPr>
+            <w:r>
+              <w:rPr>
+                <w:b/>
+                <w:bCs/>
+                <w:sz w:val="21"/>
+                <w:szCs w:val="21"/>
+              </w:rPr>
+              <w:t xml:space="preserve">Stage</w:t>
+            </w:r>
+          </w:p>
+        </w:tc>
+        <w:tc>
+          <w:tcPr>
+            <w:tcW w:type="dxa" w:w="7986"/>
+            <w:tcBorders>
+              <w:top w:val="single" w:color="BFBFBF" w:sz="4"/>
+              <w:left w:val="single" w:color="BFBFBF" w:sz="4"/>
+              <w:bottom w:val="single" w:color="BFBFBF" w:sz="4"/>
+              <w:right w:val="single" w:color="BFBFBF" w:sz="4"/>
+            </w:tcBorders>
+            <w:shd w:fill="DCE3F0" w:color="auto" w:val="clear"/>
+            <w:tcMar>
+              <w:top w:type="dxa" w:w="70"/>
+              <w:left w:type="dxa" w:w="100"/>
+              <w:bottom w:type="dxa" w:w="70"/>
+              <w:right w:type="dxa" w:w="100"/>
+            </w:tcMar>
+            <w:vAlign w:val="center"/>
+          </w:tcPr>
+          <w:p>
+            <w:pPr>
+              <w:spacing w:after="0" w:before="0" w:line="300"/>
+            </w:pPr>
+            <w:r>
+              <w:rPr>
+                <w:b/>
+                <w:bCs/>
+                <w:sz w:val="21"/>
+                <w:szCs w:val="21"/>
+              </w:rPr>
+              <w:t xml:space="preserve">Flow</w:t>
+            </w:r>
+          </w:p>
+        </w:tc>
+      </w:tr>
+      <w:tr>
+        <w:trPr>
+          <w:cantSplit/>
+        </w:trPr>
+        <w:tc>
+          <w:tcPr>
+            <w:tcW w:type="dxa" w:w="520"/>
+            <w:tcBorders>
+              <w:top w:val="single" w:color="BFBFBF" w:sz="4"/>
+              <w:left w:val="single" w:color="BFBFBF" w:sz="4"/>
+              <w:bottom w:val="single" w:color="BFBFBF" w:sz="4"/>
+              <w:right w:val="single" w:color="BFBFBF" w:sz="4"/>
+            </w:tcBorders>
+            <w:tcMar>
+              <w:top w:type="dxa" w:w="70"/>
+              <w:left w:type="dxa" w:w="100"/>
+              <w:bottom w:type="dxa" w:w="70"/>
+              <w:right w:type="dxa" w:w="100"/>
+            </w:tcMar>
+            <w:vAlign w:val="center"/>
+          </w:tcPr>
+          <w:p>
+            <w:pPr>
+              <w:spacing w:after="0" w:before="0" w:line="300"/>
+              <w:jc w:val="center"/>
+            </w:pPr>
+            <w:r>
+              <w:rPr>
+                <w:color w:val="7F7F7F"/>
+                <w:sz w:val="21"/>
+                <w:szCs w:val="21"/>
+              </w:rPr>
+              <w:t xml:space="preserve">1</w:t>
+            </w:r>
+          </w:p>
+        </w:tc>
+        <w:tc>
+          <w:tcPr>
+            <w:tcW w:type="dxa" w:w="2200"/>
+            <w:tcBorders>
+              <w:top w:val="single" w:color="BFBFBF" w:sz="4"/>
+              <w:left w:val="single" w:color="BFBFBF" w:sz="4"/>
+              <w:bottom w:val="single" w:color="BFBFBF" w:sz="4"/>
+              <w:right w:val="single" w:color="BFBFBF" w:sz="4"/>
+            </w:tcBorders>
+            <w:tcMar>
+              <w:top w:type="dxa" w:w="70"/>
+              <w:left w:type="dxa" w:w="100"/>
+              <w:bottom w:type="dxa" w:w="70"/>
+              <w:right w:type="dxa" w:w="100"/>
+            </w:tcMar>
+            <w:vAlign w:val="center"/>
+          </w:tcPr>
+          <w:p>
+            <w:pPr>
+              <w:spacing w:after="0" w:before="0" w:line="300"/>
+            </w:pPr>
+            <w:r>
+              <w:rPr>
+                <w:b/>
+                <w:bCs/>
+                <w:color w:val="1F3864"/>
+                <w:sz w:val="21"/>
+                <w:szCs w:val="21"/>
+              </w:rPr>
+              <w:t xml:space="preserve">What is it</w:t>
+            </w:r>
+          </w:p>
+        </w:tc>
+        <w:tc>
+          <w:tcPr>
+            <w:tcW w:type="dxa" w:w="7986"/>
+            <w:tcBorders>
+              <w:top w:val="single" w:color="BFBFBF" w:sz="4"/>
+              <w:left w:val="single" w:color="BFBFBF" w:sz="4"/>
+              <w:bottom w:val="single" w:color="BFBFBF" w:sz="4"/>
+              <w:right w:val="single" w:color="BFBFBF" w:sz="4"/>
+            </w:tcBorders>
+            <w:tcMar>
+              <w:top w:type="dxa" w:w="70"/>
+              <w:left w:type="dxa" w:w="100"/>
+              <w:bottom w:type="dxa" w:w="70"/>
+              <w:right w:type="dxa" w:w="100"/>
+            </w:tcMar>
+            <w:vAlign w:val="center"/>
+          </w:tcPr>
+          <w:p>
+            <w:pPr>
+              <w:tabs>
+                <w:tab w:val="left" w:pos="260"/>
+              </w:tabs>
+              <w:spacing w:after="0" w:before="0" w:line="280"/>
+              <w:ind w:left="260" w:hanging="260"/>
+            </w:pPr>
+            <w:r>
+              <w:rPr>
+                <w:b/>
+                <w:bCs/>
+                <w:color w:val="C00000"/>
+                <w:sz w:val="21"/>
+                <w:szCs w:val="21"/>
+              </w:rPr>
+              <w:t xml:space="preserve">→</w:t>
+            </w:r>
+            <w:r>
+              <w:tab/>
+            </w:r>
+            <w:r>
+              <w:rPr>
+                <w:sz w:val="21"/>
+                <w:szCs w:val="21"/>
+              </w:rPr>
+              <w:t xml:space="preserve">World's largest and oldest democracies; a "comprehensive global strategic partnership"</w:t>
+            </w:r>
+          </w:p>
+          <w:p>
+            <w:pPr>
+              <w:tabs>
+                <w:tab w:val="left" w:pos="260"/>
+              </w:tabs>
+              <w:spacing w:after="0" w:before="40" w:line="280"/>
+              <w:ind w:left="260" w:hanging="260"/>
+            </w:pPr>
+            <w:r>
+              <w:rPr>
+                <w:b/>
+                <w:bCs/>
+                <w:color w:val="C00000"/>
+                <w:sz w:val="21"/>
+                <w:szCs w:val="21"/>
+              </w:rPr>
+              <w:t xml:space="preserve">→</w:t>
+            </w:r>
+            <w:r>
+              <w:tab/>
+            </w:r>
+            <w:r>
+              <w:rPr>
+                <w:b/>
+                <w:bCs/>
+                <w:sz w:val="21"/>
+                <w:szCs w:val="21"/>
+              </w:rPr>
+              <w:t xml:space="preserve">Journey:</w:t>
+            </w:r>
+            <w:r>
+              <w:rPr>
+                <w:sz w:val="21"/>
+                <w:szCs w:val="21"/>
+              </w:rPr>
+              <w:t xml:space="preserve"> Cold War estrangement, 1998 nuclear tests and sanctions, 2005 civil nuclear deal</w:t>
+            </w:r>
+          </w:p>
+          <w:p>
+            <w:pPr>
+              <w:tabs>
+                <w:tab w:val="left" w:pos="260"/>
+              </w:tabs>
+              <w:spacing w:after="0" w:before="40" w:line="280"/>
+              <w:ind w:left="260" w:hanging="260"/>
+            </w:pPr>
+            <w:r>
+              <w:rPr>
+                <w:b/>
+                <w:bCs/>
+                <w:color w:val="C00000"/>
+                <w:sz w:val="21"/>
+                <w:szCs w:val="21"/>
+              </w:rPr>
+              <w:t xml:space="preserve">→</w:t>
+            </w:r>
+            <w:r>
+              <w:tab/>
+            </w:r>
+            <w:r>
+              <w:rPr>
+                <w:sz w:val="21"/>
+                <w:szCs w:val="21"/>
+              </w:rPr>
+              <w:t xml:space="preserve">Quad, defence foundational agreements, iCET/TRUST tech cooperation</w:t>
+            </w:r>
+          </w:p>
+          <w:p>
+            <w:pPr>
+              <w:tabs>
+                <w:tab w:val="left" w:pos="260"/>
+              </w:tabs>
+              <w:spacing w:after="0" w:before="40" w:line="280"/>
+              <w:ind w:left="260" w:hanging="260"/>
+            </w:pPr>
+            <w:r>
+              <w:rPr>
+                <w:b/>
+                <w:bCs/>
+                <w:color w:val="C00000"/>
+                <w:sz w:val="21"/>
+                <w:szCs w:val="21"/>
+              </w:rPr>
+              <w:t xml:space="preserve">→</w:t>
+            </w:r>
+            <w:r>
+              <w:tab/>
+            </w:r>
+            <w:r>
+              <w:rPr>
+                <w:b/>
+                <w:bCs/>
+                <w:sz w:val="21"/>
+                <w:szCs w:val="21"/>
+              </w:rPr>
+              <w:t xml:space="preserve">"Mission 500":</w:t>
+            </w:r>
+            <w:r>
+              <w:rPr>
+                <w:sz w:val="21"/>
+                <w:szCs w:val="21"/>
+              </w:rPr>
+              <w:t xml:space="preserve"> $500 bn trade target by 2030</w:t>
+            </w:r>
+          </w:p>
+        </w:tc>
+      </w:tr>
+      <w:tr>
+        <w:trPr>
+          <w:cantSplit/>
+        </w:trPr>
+        <w:tc>
+          <w:tcPr>
+            <w:tcW w:type="dxa" w:w="520"/>
+            <w:tcBorders>
+              <w:top w:val="single" w:color="BFBFBF" w:sz="4"/>
+              <w:left w:val="single" w:color="BFBFBF" w:sz="4"/>
+              <w:bottom w:val="single" w:color="BFBFBF" w:sz="4"/>
+              <w:right w:val="single" w:color="BFBFBF" w:sz="4"/>
+            </w:tcBorders>
+            <w:shd w:fill="F5F7FB" w:color="auto" w:val="clear"/>
+            <w:tcMar>
+              <w:top w:type="dxa" w:w="70"/>
+              <w:left w:type="dxa" w:w="100"/>
+              <w:bottom w:type="dxa" w:w="70"/>
+              <w:right w:type="dxa" w:w="100"/>
+            </w:tcMar>
+            <w:vAlign w:val="center"/>
+          </w:tcPr>
+          <w:p>
+            <w:pPr>
+              <w:spacing w:after="0" w:before="0" w:line="300"/>
+              <w:jc w:val="center"/>
+            </w:pPr>
+            <w:r>
+              <w:rPr>
+                <w:color w:val="7F7F7F"/>
+                <w:sz w:val="21"/>
+                <w:szCs w:val="21"/>
+              </w:rPr>
+              <w:t xml:space="preserve">2</w:t>
+            </w:r>
+          </w:p>
+        </w:tc>
+        <w:tc>
+          <w:tcPr>
+            <w:tcW w:type="dxa" w:w="2200"/>
+            <w:tcBorders>
+              <w:top w:val="single" w:color="BFBFBF" w:sz="4"/>
+              <w:left w:val="single" w:color="BFBFBF" w:sz="4"/>
+              <w:bottom w:val="single" w:color="BFBFBF" w:sz="4"/>
+              <w:right w:val="single" w:color="BFBFBF" w:sz="4"/>
+            </w:tcBorders>
+            <w:shd w:fill="F5F7FB" w:color="auto" w:val="clear"/>
+            <w:tcMar>
+              <w:top w:type="dxa" w:w="70"/>
+              <w:left w:type="dxa" w:w="100"/>
+              <w:bottom w:type="dxa" w:w="70"/>
+              <w:right w:type="dxa" w:w="100"/>
+            </w:tcMar>
+            <w:vAlign w:val="center"/>
+          </w:tcPr>
+          <w:p>
+            <w:pPr>
+              <w:spacing w:after="0" w:before="0" w:line="300"/>
+            </w:pPr>
+            <w:r>
+              <w:rPr>
+                <w:b/>
+                <w:bCs/>
+                <w:color w:val="1F3864"/>
+                <w:sz w:val="21"/>
+                <w:szCs w:val="21"/>
+              </w:rPr>
+              <w:t xml:space="preserve">Why it matters</w:t>
+            </w:r>
+          </w:p>
+        </w:tc>
+        <w:tc>
+          <w:tcPr>
+            <w:tcW w:type="dxa" w:w="7986"/>
+            <w:tcBorders>
+              <w:top w:val="single" w:color="BFBFBF" w:sz="4"/>
+              <w:left w:val="single" w:color="BFBFBF" w:sz="4"/>
+              <w:bottom w:val="single" w:color="BFBFBF" w:sz="4"/>
+              <w:right w:val="single" w:color="BFBFBF" w:sz="4"/>
+            </w:tcBorders>
+            <w:shd w:fill="F5F7FB" w:color="auto" w:val="clear"/>
+            <w:tcMar>
+              <w:top w:type="dxa" w:w="70"/>
+              <w:left w:type="dxa" w:w="100"/>
+              <w:bottom w:type="dxa" w:w="70"/>
+              <w:right w:type="dxa" w:w="100"/>
+            </w:tcMar>
+            <w:vAlign w:val="center"/>
+          </w:tcPr>
+          <w:p>
+            <w:pPr>
+              <w:tabs>
+                <w:tab w:val="left" w:pos="260"/>
+              </w:tabs>
+              <w:spacing w:after="0" w:before="0" w:line="280"/>
+              <w:ind w:left="260" w:hanging="260"/>
+            </w:pPr>
+            <w:r>
+              <w:rPr>
+                <w:b/>
+                <w:bCs/>
+                <w:color w:val="C00000"/>
+                <w:sz w:val="21"/>
+                <w:szCs w:val="21"/>
+              </w:rPr>
+              <w:t xml:space="preserve">→</w:t>
+            </w:r>
+            <w:r>
+              <w:tab/>
+            </w:r>
+            <w:r>
+              <w:rPr>
+                <w:b/>
+                <w:bCs/>
+                <w:sz w:val="21"/>
+                <w:szCs w:val="21"/>
+              </w:rPr>
+              <w:t xml:space="preserve">Strategic:</w:t>
+            </w:r>
+            <w:r>
+              <w:rPr>
+                <w:sz w:val="21"/>
+                <w:szCs w:val="21"/>
+              </w:rPr>
+              <w:t xml:space="preserve"> Indo-Pacific balance and China</w:t>
+            </w:r>
+          </w:p>
+          <w:p>
+            <w:pPr>
+              <w:tabs>
+                <w:tab w:val="left" w:pos="260"/>
+              </w:tabs>
+              <w:spacing w:after="0" w:before="40" w:line="280"/>
+              <w:ind w:left="260" w:hanging="260"/>
+            </w:pPr>
+            <w:r>
+              <w:rPr>
+                <w:b/>
+                <w:bCs/>
+                <w:color w:val="C00000"/>
+                <w:sz w:val="21"/>
+                <w:szCs w:val="21"/>
+              </w:rPr>
+              <w:t xml:space="preserve">→</w:t>
+            </w:r>
+            <w:r>
+              <w:tab/>
+            </w:r>
+            <w:r>
+              <w:rPr>
+                <w:b/>
+                <w:bCs/>
+                <w:sz w:val="21"/>
+                <w:szCs w:val="21"/>
+              </w:rPr>
+              <w:t xml:space="preserve">Economic:</w:t>
+            </w:r>
+            <w:r>
+              <w:rPr>
+                <w:sz w:val="21"/>
+                <w:szCs w:val="21"/>
+              </w:rPr>
+              <w:t xml:space="preserve"> US is India's largest export market</w:t>
+            </w:r>
+          </w:p>
+          <w:p>
+            <w:pPr>
+              <w:tabs>
+                <w:tab w:val="left" w:pos="260"/>
+              </w:tabs>
+              <w:spacing w:after="0" w:before="40" w:line="280"/>
+              <w:ind w:left="260" w:hanging="260"/>
+            </w:pPr>
+            <w:r>
+              <w:rPr>
+                <w:b/>
+                <w:bCs/>
+                <w:color w:val="C00000"/>
+                <w:sz w:val="21"/>
+                <w:szCs w:val="21"/>
+              </w:rPr>
+              <w:t xml:space="preserve">→</w:t>
+            </w:r>
+            <w:r>
+              <w:tab/>
+            </w:r>
+            <w:r>
+              <w:rPr>
+                <w:b/>
+                <w:bCs/>
+                <w:sz w:val="21"/>
+                <w:szCs w:val="21"/>
+              </w:rPr>
+              <w:t xml:space="preserve">Technology:</w:t>
+            </w:r>
+            <w:r>
+              <w:rPr>
+                <w:sz w:val="21"/>
+                <w:szCs w:val="21"/>
+              </w:rPr>
+              <w:t xml:space="preserve"> AI, semiconductors, space, critical minerals</w:t>
+            </w:r>
+          </w:p>
+          <w:p>
+            <w:pPr>
+              <w:tabs>
+                <w:tab w:val="left" w:pos="260"/>
+              </w:tabs>
+              <w:spacing w:after="0" w:before="40" w:line="280"/>
+              <w:ind w:left="260" w:hanging="260"/>
+            </w:pPr>
+            <w:r>
+              <w:rPr>
+                <w:b/>
+                <w:bCs/>
+                <w:color w:val="C00000"/>
+                <w:sz w:val="21"/>
+                <w:szCs w:val="21"/>
+              </w:rPr>
+              <w:t xml:space="preserve">→</w:t>
+            </w:r>
+            <w:r>
+              <w:tab/>
+            </w:r>
+            <w:r>
+              <w:rPr>
+                <w:b/>
+                <w:bCs/>
+                <w:sz w:val="21"/>
+                <w:szCs w:val="21"/>
+              </w:rPr>
+              <w:t xml:space="preserve">Defence:</w:t>
+            </w:r>
+            <w:r>
+              <w:rPr>
+                <w:sz w:val="21"/>
+                <w:szCs w:val="21"/>
+              </w:rPr>
+              <w:t xml:space="preserve"> joint exercises and platforms</w:t>
+            </w:r>
+          </w:p>
+          <w:p>
+            <w:pPr>
+              <w:tabs>
+                <w:tab w:val="left" w:pos="260"/>
+              </w:tabs>
+              <w:spacing w:after="0" w:before="40" w:line="280"/>
+              <w:ind w:left="260" w:hanging="260"/>
+            </w:pPr>
+            <w:r>
+              <w:rPr>
+                <w:b/>
+                <w:bCs/>
+                <w:color w:val="C00000"/>
+                <w:sz w:val="21"/>
+                <w:szCs w:val="21"/>
+              </w:rPr>
+              <w:t xml:space="preserve">→</w:t>
+            </w:r>
+            <w:r>
+              <w:tab/>
+            </w:r>
+            <w:r>
+              <w:rPr>
+                <w:b/>
+                <w:bCs/>
+                <w:sz w:val="21"/>
+                <w:szCs w:val="21"/>
+              </w:rPr>
+              <w:t xml:space="preserve">People:</w:t>
+            </w:r>
+            <w:r>
+              <w:rPr>
+                <w:sz w:val="21"/>
+                <w:szCs w:val="21"/>
+              </w:rPr>
+              <w:t xml:space="preserve"> large Indian diaspora and students</w:t>
+            </w:r>
+          </w:p>
+          <w:p>
+            <w:pPr>
+              <w:tabs>
+                <w:tab w:val="left" w:pos="260"/>
+              </w:tabs>
+              <w:spacing w:after="0" w:before="40" w:line="280"/>
+              <w:ind w:left="260" w:hanging="260"/>
+            </w:pPr>
+            <w:r>
+              <w:rPr>
+                <w:b/>
+                <w:bCs/>
+                <w:color w:val="C00000"/>
+                <w:sz w:val="21"/>
+                <w:szCs w:val="21"/>
+              </w:rPr>
+              <w:t xml:space="preserve">→</w:t>
+            </w:r>
+            <w:r>
+              <w:tab/>
+            </w:r>
+            <w:r>
+              <w:rPr>
+                <w:b/>
+                <w:bCs/>
+                <w:sz w:val="21"/>
+                <w:szCs w:val="21"/>
+              </w:rPr>
+              <w:t xml:space="preserve">Global:</w:t>
+            </w:r>
+            <w:r>
+              <w:rPr>
+                <w:sz w:val="21"/>
+                <w:szCs w:val="21"/>
+              </w:rPr>
+              <w:t xml:space="preserve"> energy, supply chains, rules-based order</w:t>
+            </w:r>
+          </w:p>
+        </w:tc>
+      </w:tr>
+      <w:tr>
+        <w:trPr>
+          <w:cantSplit/>
+        </w:trPr>
+        <w:tc>
+          <w:tcPr>
+            <w:tcW w:type="dxa" w:w="520"/>
+            <w:tcBorders>
+              <w:top w:val="single" w:color="BFBFBF" w:sz="4"/>
+              <w:left w:val="single" w:color="BFBFBF" w:sz="4"/>
+              <w:bottom w:val="single" w:color="BFBFBF" w:sz="4"/>
+              <w:right w:val="single" w:color="BFBFBF" w:sz="4"/>
+            </w:tcBorders>
+            <w:tcMar>
+              <w:top w:type="dxa" w:w="70"/>
+              <w:left w:type="dxa" w:w="100"/>
+              <w:bottom w:type="dxa" w:w="70"/>
+              <w:right w:type="dxa" w:w="100"/>
+            </w:tcMar>
+            <w:vAlign w:val="center"/>
+          </w:tcPr>
+          <w:p>
+            <w:pPr>
+              <w:spacing w:after="0" w:before="0" w:line="300"/>
+              <w:jc w:val="center"/>
+            </w:pPr>
+            <w:r>
+              <w:rPr>
+                <w:color w:val="7F7F7F"/>
+                <w:sz w:val="21"/>
+                <w:szCs w:val="21"/>
+              </w:rPr>
+              <w:t xml:space="preserve">3</w:t>
+            </w:r>
+          </w:p>
+        </w:tc>
+        <w:tc>
+          <w:tcPr>
+            <w:tcW w:type="dxa" w:w="2200"/>
+            <w:tcBorders>
+              <w:top w:val="single" w:color="BFBFBF" w:sz="4"/>
+              <w:left w:val="single" w:color="BFBFBF" w:sz="4"/>
+              <w:bottom w:val="single" w:color="BFBFBF" w:sz="4"/>
+              <w:right w:val="single" w:color="BFBFBF" w:sz="4"/>
+            </w:tcBorders>
+            <w:tcMar>
+              <w:top w:type="dxa" w:w="70"/>
+              <w:left w:type="dxa" w:w="100"/>
+              <w:bottom w:type="dxa" w:w="70"/>
+              <w:right w:type="dxa" w:w="100"/>
+            </w:tcMar>
+            <w:vAlign w:val="center"/>
+          </w:tcPr>
+          <w:p>
+            <w:pPr>
+              <w:spacing w:after="0" w:before="0" w:line="300"/>
+            </w:pPr>
+            <w:r>
+              <w:rPr>
+                <w:b/>
+                <w:bCs/>
+                <w:color w:val="1F3864"/>
+                <w:sz w:val="21"/>
+                <w:szCs w:val="21"/>
+              </w:rPr>
+              <w:t xml:space="preserve">Current status (Oct 2026)</w:t>
+            </w:r>
+          </w:p>
+        </w:tc>
+        <w:tc>
+          <w:tcPr>
+            <w:tcW w:type="dxa" w:w="7986"/>
+            <w:tcBorders>
+              <w:top w:val="single" w:color="BFBFBF" w:sz="4"/>
+              <w:left w:val="single" w:color="BFBFBF" w:sz="4"/>
+              <w:bottom w:val="single" w:color="BFBFBF" w:sz="4"/>
+              <w:right w:val="single" w:color="BFBFBF" w:sz="4"/>
+            </w:tcBorders>
+            <w:tcMar>
+              <w:top w:type="dxa" w:w="70"/>
+              <w:left w:type="dxa" w:w="100"/>
+              <w:bottom w:type="dxa" w:w="70"/>
+              <w:right w:type="dxa" w:w="100"/>
+            </w:tcMar>
+            <w:vAlign w:val="center"/>
+          </w:tcPr>
+          <w:p>
+            <w:pPr>
+              <w:tabs>
+                <w:tab w:val="left" w:pos="260"/>
+              </w:tabs>
+              <w:spacing w:after="0" w:before="0" w:line="280"/>
+              <w:ind w:left="260" w:hanging="260"/>
+            </w:pPr>
+            <w:r>
+              <w:rPr>
+                <w:b/>
+                <w:bCs/>
+                <w:color w:val="C00000"/>
+                <w:sz w:val="21"/>
+                <w:szCs w:val="21"/>
+              </w:rPr>
+              <w:t xml:space="preserve">→</w:t>
+            </w:r>
+            <w:r>
+              <w:tab/>
+            </w:r>
+            <w:r>
+              <w:rPr>
+                <w:b/>
+                <w:bCs/>
+                <w:sz w:val="21"/>
+                <w:szCs w:val="21"/>
+              </w:rPr>
+              <w:t xml:space="preserve">Crisis:</w:t>
+            </w:r>
+            <w:r>
+              <w:rPr>
+                <w:sz w:val="21"/>
+                <w:szCs w:val="21"/>
+              </w:rPr>
+              <w:t xml:space="preserve"> 2025–26 tariff crisis (steep tariff plus a Russian-oil penalty), ties at a low of decades</w:t>
+            </w:r>
+          </w:p>
+          <w:p>
+            <w:pPr>
+              <w:tabs>
+                <w:tab w:val="left" w:pos="260"/>
+              </w:tabs>
+              <w:spacing w:after="0" w:before="40" w:line="280"/>
+              <w:ind w:left="260" w:hanging="260"/>
+            </w:pPr>
+            <w:r>
+              <w:rPr>
+                <w:b/>
+                <w:bCs/>
+                <w:color w:val="C00000"/>
+                <w:sz w:val="21"/>
+                <w:szCs w:val="21"/>
+              </w:rPr>
+              <w:t xml:space="preserve">→</w:t>
+            </w:r>
+            <w:r>
+              <w:tab/>
+            </w:r>
+            <w:r>
+              <w:rPr>
+                <w:b/>
+                <w:bCs/>
+                <w:sz w:val="21"/>
+                <w:szCs w:val="21"/>
+              </w:rPr>
+              <w:t xml:space="preserve">Reset:</w:t>
+            </w:r>
+            <w:r>
+              <w:rPr>
+                <w:sz w:val="21"/>
+                <w:szCs w:val="21"/>
+              </w:rPr>
+              <w:t xml:space="preserve"> Trump–Modi deal cut US tariff to 18% from 25% (2 Feb 2026); joint statement (6 Feb); India confirmed only the 18% rate</w:t>
+            </w:r>
+          </w:p>
+          <w:p>
+            <w:pPr>
+              <w:tabs>
+                <w:tab w:val="left" w:pos="260"/>
+              </w:tabs>
+              <w:spacing w:after="0" w:before="40" w:line="280"/>
+              <w:ind w:left="260" w:hanging="260"/>
+            </w:pPr>
+            <w:r>
+              <w:rPr>
+                <w:b/>
+                <w:bCs/>
+                <w:color w:val="C00000"/>
+                <w:sz w:val="21"/>
+                <w:szCs w:val="21"/>
+              </w:rPr>
+              <w:t xml:space="preserve">→</w:t>
+            </w:r>
+            <w:r>
+              <w:tab/>
+            </w:r>
+            <w:r>
+              <w:rPr>
+                <w:b/>
+                <w:bCs/>
+                <w:sz w:val="21"/>
+                <w:szCs w:val="21"/>
+              </w:rPr>
+              <w:t xml:space="preserve">Engagement:</w:t>
+            </w:r>
+            <w:r>
+              <w:rPr>
+                <w:sz w:val="21"/>
+                <w:szCs w:val="21"/>
+              </w:rPr>
+              <w:t xml:space="preserve"> Rubio in India (May); Modi–Trump at G7 in France (Jun), first meeting in 16 months; Rubio–Jaishankar at UNGA (Sep)</w:t>
+            </w:r>
+          </w:p>
+          <w:p>
+            <w:pPr>
+              <w:tabs>
+                <w:tab w:val="left" w:pos="260"/>
+              </w:tabs>
+              <w:spacing w:after="0" w:before="40" w:line="280"/>
+              <w:ind w:left="260" w:hanging="260"/>
+            </w:pPr>
+            <w:r>
+              <w:rPr>
+                <w:b/>
+                <w:bCs/>
+                <w:color w:val="C00000"/>
+                <w:sz w:val="21"/>
+                <w:szCs w:val="21"/>
+              </w:rPr>
+              <w:t xml:space="preserve">→</w:t>
+            </w:r>
+            <w:r>
+              <w:tab/>
+            </w:r>
+            <w:r>
+              <w:rPr>
+                <w:b/>
+                <w:bCs/>
+                <w:sz w:val="21"/>
+                <w:szCs w:val="21"/>
+              </w:rPr>
+              <w:t xml:space="preserve">Pax Silica:</w:t>
+            </w:r>
+            <w:r>
+              <w:rPr>
+                <w:sz w:val="21"/>
+                <w:szCs w:val="21"/>
+              </w:rPr>
+              <w:t xml:space="preserve"> India first non-US ally in the US-led supply chain coalition</w:t>
+            </w:r>
+          </w:p>
+          <w:p>
+            <w:pPr>
+              <w:tabs>
+                <w:tab w:val="left" w:pos="260"/>
+              </w:tabs>
+              <w:spacing w:after="0" w:before="40" w:line="280"/>
+              <w:ind w:left="260" w:hanging="260"/>
+            </w:pPr>
+            <w:r>
+              <w:rPr>
+                <w:b/>
+                <w:bCs/>
+                <w:color w:val="C00000"/>
+                <w:sz w:val="21"/>
+                <w:szCs w:val="21"/>
+              </w:rPr>
+              <w:t xml:space="preserve">→</w:t>
+            </w:r>
+            <w:r>
+              <w:tab/>
+            </w:r>
+            <w:r>
+              <w:rPr>
+                <w:b/>
+                <w:bCs/>
+                <w:sz w:val="21"/>
+                <w:szCs w:val="21"/>
+              </w:rPr>
+              <w:t xml:space="preserve">Trade deal:</w:t>
+            </w:r>
+            <w:r>
+              <w:rPr>
+                <w:sz w:val="21"/>
+                <w:szCs w:val="21"/>
+              </w:rPr>
+              <w:t xml:space="preserve"> over 90% done, "very close" (US official, 26 Sep)</w:t>
+            </w:r>
+          </w:p>
+          <w:p>
+            <w:pPr>
+              <w:tabs>
+                <w:tab w:val="left" w:pos="260"/>
+              </w:tabs>
+              <w:spacing w:after="0" w:before="40" w:line="280"/>
+              <w:ind w:left="260" w:hanging="260"/>
+            </w:pPr>
+            <w:r>
+              <w:rPr>
+                <w:b/>
+                <w:bCs/>
+                <w:color w:val="C00000"/>
+                <w:sz w:val="21"/>
+                <w:szCs w:val="21"/>
+              </w:rPr>
+              <w:t xml:space="preserve">→</w:t>
+            </w:r>
+            <w:r>
+              <w:tab/>
+            </w:r>
+            <w:r>
+              <w:rPr>
+                <w:b/>
+                <w:bCs/>
+                <w:sz w:val="21"/>
+                <w:szCs w:val="21"/>
+              </w:rPr>
+              <w:t xml:space="preserve">Strains:</w:t>
+            </w:r>
+            <w:r>
+              <w:rPr>
+                <w:sz w:val="21"/>
+                <w:szCs w:val="21"/>
+              </w:rPr>
+              <w:t xml:space="preserve"> US ties with Pakistan's Field Marshal Asim Munir; Russian oil; House cleared Russia sanctions bill on top energy buyers (Sep)</w:t>
+            </w:r>
+          </w:p>
+          <w:p>
+            <w:pPr>
+              <w:tabs>
+                <w:tab w:val="left" w:pos="260"/>
+              </w:tabs>
+              <w:spacing w:after="0" w:before="40" w:line="280"/>
+              <w:ind w:left="260" w:hanging="260"/>
+            </w:pPr>
+            <w:r>
+              <w:rPr>
+                <w:b/>
+                <w:bCs/>
+                <w:color w:val="C00000"/>
+                <w:sz w:val="21"/>
+                <w:szCs w:val="21"/>
+              </w:rPr>
+              <w:t xml:space="preserve">→</w:t>
+            </w:r>
+            <w:r>
+              <w:tab/>
+            </w:r>
+            <w:r>
+              <w:rPr>
+                <w:b/>
+                <w:bCs/>
+                <w:sz w:val="21"/>
+                <w:szCs w:val="21"/>
+              </w:rPr>
+              <w:t xml:space="preserve">Iran war:</w:t>
+            </w:r>
+            <w:r>
+              <w:rPr>
+                <w:sz w:val="21"/>
+                <w:szCs w:val="21"/>
+              </w:rPr>
+              <w:t xml:space="preserve"> Indians killed in the Strait of Hormuz, Chabahar hit; India stayed muted</w:t>
+            </w:r>
+          </w:p>
+          <w:p>
+            <w:pPr>
+              <w:tabs>
+                <w:tab w:val="left" w:pos="260"/>
+              </w:tabs>
+              <w:spacing w:after="0" w:before="40" w:line="280"/>
+              <w:ind w:left="260" w:hanging="260"/>
+            </w:pPr>
+            <w:r>
+              <w:rPr>
+                <w:b/>
+                <w:bCs/>
+                <w:color w:val="C00000"/>
+                <w:sz w:val="21"/>
+                <w:szCs w:val="21"/>
+              </w:rPr>
+              <w:t xml:space="preserve">→</w:t>
+            </w:r>
+            <w:r>
+              <w:tab/>
+            </w:r>
+            <w:r>
+              <w:rPr>
+                <w:b/>
+                <w:bCs/>
+                <w:sz w:val="21"/>
+                <w:szCs w:val="21"/>
+              </w:rPr>
+              <w:t xml:space="preserve">Quad:</w:t>
+            </w:r>
+            <w:r>
+              <w:rPr>
+                <w:sz w:val="21"/>
+                <w:szCs w:val="21"/>
+              </w:rPr>
+              <w:t xml:space="preserve"> Sherpas met in New Delhi (3 Sep); Trump's visit for the summit still pending</w:t>
+            </w:r>
+          </w:p>
+        </w:tc>
+      </w:tr>
+      <w:tr>
+        <w:trPr>
+          <w:cantSplit/>
+        </w:trPr>
+        <w:tc>
+          <w:tcPr>
+            <w:tcW w:type="dxa" w:w="520"/>
+            <w:tcBorders>
+              <w:top w:val="single" w:color="BFBFBF" w:sz="4"/>
+              <w:left w:val="single" w:color="BFBFBF" w:sz="4"/>
+              <w:bottom w:val="single" w:color="BFBFBF" w:sz="4"/>
+              <w:right w:val="single" w:color="BFBFBF" w:sz="4"/>
+            </w:tcBorders>
+            <w:shd w:fill="F5F7FB" w:color="auto" w:val="clear"/>
+            <w:tcMar>
+              <w:top w:type="dxa" w:w="70"/>
+              <w:left w:type="dxa" w:w="100"/>
+              <w:bottom w:type="dxa" w:w="70"/>
+              <w:right w:type="dxa" w:w="100"/>
+            </w:tcMar>
+            <w:vAlign w:val="center"/>
+          </w:tcPr>
+          <w:p>
+            <w:pPr>
+              <w:spacing w:after="0" w:before="0" w:line="300"/>
+              <w:jc w:val="center"/>
+            </w:pPr>
+            <w:r>
+              <w:rPr>
+                <w:color w:val="7F7F7F"/>
+                <w:sz w:val="21"/>
+                <w:szCs w:val="21"/>
+              </w:rPr>
+              <w:t xml:space="preserve">4</w:t>
+            </w:r>
+          </w:p>
+        </w:tc>
+        <w:tc>
+          <w:tcPr>
+            <w:tcW w:type="dxa" w:w="2200"/>
+            <w:tcBorders>
+              <w:top w:val="single" w:color="BFBFBF" w:sz="4"/>
+              <w:left w:val="single" w:color="BFBFBF" w:sz="4"/>
+              <w:bottom w:val="single" w:color="BFBFBF" w:sz="4"/>
+              <w:right w:val="single" w:color="BFBFBF" w:sz="4"/>
+            </w:tcBorders>
+            <w:shd w:fill="F5F7FB" w:color="auto" w:val="clear"/>
+            <w:tcMar>
+              <w:top w:type="dxa" w:w="70"/>
+              <w:left w:type="dxa" w:w="100"/>
+              <w:bottom w:type="dxa" w:w="70"/>
+              <w:right w:type="dxa" w:w="100"/>
+            </w:tcMar>
+            <w:vAlign w:val="center"/>
+          </w:tcPr>
+          <w:p>
+            <w:pPr>
+              <w:spacing w:after="0" w:before="0" w:line="300"/>
+            </w:pPr>
+            <w:r>
+              <w:rPr>
+                <w:b/>
+                <w:bCs/>
+                <w:color w:val="1F3864"/>
+                <w:sz w:val="21"/>
+                <w:szCs w:val="21"/>
+              </w:rPr>
+              <w:t xml:space="preserve">Problems</w:t>
+            </w:r>
+          </w:p>
+        </w:tc>
+        <w:tc>
+          <w:tcPr>
+            <w:tcW w:type="dxa" w:w="7986"/>
+            <w:tcBorders>
+              <w:top w:val="single" w:color="BFBFBF" w:sz="4"/>
+              <w:left w:val="single" w:color="BFBFBF" w:sz="4"/>
+              <w:bottom w:val="single" w:color="BFBFBF" w:sz="4"/>
+              <w:right w:val="single" w:color="BFBFBF" w:sz="4"/>
+            </w:tcBorders>
+            <w:shd w:fill="F5F7FB" w:color="auto" w:val="clear"/>
+            <w:tcMar>
+              <w:top w:type="dxa" w:w="70"/>
+              <w:left w:type="dxa" w:w="100"/>
+              <w:bottom w:type="dxa" w:w="70"/>
+              <w:right w:type="dxa" w:w="100"/>
+            </w:tcMar>
+            <w:vAlign w:val="center"/>
+          </w:tcPr>
+          <w:p>
+            <w:pPr>
+              <w:tabs>
+                <w:tab w:val="left" w:pos="260"/>
+              </w:tabs>
+              <w:spacing w:after="0" w:before="0" w:line="280"/>
+              <w:ind w:left="260" w:hanging="260"/>
+            </w:pPr>
+            <w:r>
+              <w:rPr>
+                <w:b/>
+                <w:bCs/>
+                <w:color w:val="C00000"/>
+                <w:sz w:val="21"/>
+                <w:szCs w:val="21"/>
+              </w:rPr>
+              <w:t xml:space="preserve">→</w:t>
+            </w:r>
+            <w:r>
+              <w:tab/>
+            </w:r>
+            <w:r>
+              <w:rPr>
+                <w:sz w:val="21"/>
+                <w:szCs w:val="21"/>
+              </w:rPr>
+              <w:t xml:space="preserve">Tariffs and trade deal terms (agriculture, dairy, digital trade)</w:t>
+            </w:r>
+          </w:p>
+          <w:p>
+            <w:pPr>
+              <w:tabs>
+                <w:tab w:val="left" w:pos="260"/>
+              </w:tabs>
+              <w:spacing w:after="0" w:before="40" w:line="280"/>
+              <w:ind w:left="260" w:hanging="260"/>
+            </w:pPr>
+            <w:r>
+              <w:rPr>
+                <w:b/>
+                <w:bCs/>
+                <w:color w:val="C00000"/>
+                <w:sz w:val="21"/>
+                <w:szCs w:val="21"/>
+              </w:rPr>
+              <w:t xml:space="preserve">→</w:t>
+            </w:r>
+            <w:r>
+              <w:tab/>
+            </w:r>
+            <w:r>
+              <w:rPr>
+                <w:sz w:val="21"/>
+                <w:szCs w:val="21"/>
+              </w:rPr>
+              <w:t xml:space="preserve">Russian oil, S-400 and sanctions exposure</w:t>
+            </w:r>
+          </w:p>
+          <w:p>
+            <w:pPr>
+              <w:tabs>
+                <w:tab w:val="left" w:pos="260"/>
+              </w:tabs>
+              <w:spacing w:after="0" w:before="40" w:line="280"/>
+              <w:ind w:left="260" w:hanging="260"/>
+            </w:pPr>
+            <w:r>
+              <w:rPr>
+                <w:b/>
+                <w:bCs/>
+                <w:color w:val="C00000"/>
+                <w:sz w:val="21"/>
+                <w:szCs w:val="21"/>
+              </w:rPr>
+              <w:t xml:space="preserve">→</w:t>
+            </w:r>
+            <w:r>
+              <w:tab/>
+            </w:r>
+            <w:r>
+              <w:rPr>
+                <w:sz w:val="21"/>
+                <w:szCs w:val="21"/>
+              </w:rPr>
+              <w:t xml:space="preserve">Trump's claim of mediating India–Pakistan (2025), rejected by India; US–Pakistan warmth</w:t>
+            </w:r>
+          </w:p>
+          <w:p>
+            <w:pPr>
+              <w:tabs>
+                <w:tab w:val="left" w:pos="260"/>
+              </w:tabs>
+              <w:spacing w:after="0" w:before="40" w:line="280"/>
+              <w:ind w:left="260" w:hanging="260"/>
+            </w:pPr>
+            <w:r>
+              <w:rPr>
+                <w:b/>
+                <w:bCs/>
+                <w:color w:val="C00000"/>
+                <w:sz w:val="21"/>
+                <w:szCs w:val="21"/>
+              </w:rPr>
+              <w:t xml:space="preserve">→</w:t>
+            </w:r>
+            <w:r>
+              <w:tab/>
+            </w:r>
+            <w:r>
+              <w:rPr>
+                <w:sz w:val="21"/>
+                <w:szCs w:val="21"/>
+              </w:rPr>
+              <w:t xml:space="preserve">H-1B, visa, student and immigration curbs</w:t>
+            </w:r>
+          </w:p>
+          <w:p>
+            <w:pPr>
+              <w:tabs>
+                <w:tab w:val="left" w:pos="260"/>
+              </w:tabs>
+              <w:spacing w:after="0" w:before="40" w:line="280"/>
+              <w:ind w:left="260" w:hanging="260"/>
+            </w:pPr>
+            <w:r>
+              <w:rPr>
+                <w:b/>
+                <w:bCs/>
+                <w:color w:val="C00000"/>
+                <w:sz w:val="21"/>
+                <w:szCs w:val="21"/>
+              </w:rPr>
+              <w:t xml:space="preserve">→</w:t>
+            </w:r>
+            <w:r>
+              <w:tab/>
+            </w:r>
+            <w:r>
+              <w:rPr>
+                <w:sz w:val="21"/>
+                <w:szCs w:val="21"/>
+              </w:rPr>
+              <w:t xml:space="preserve">Transactional US approach; doubts over support in a China border crisis</w:t>
+            </w:r>
+          </w:p>
+          <w:p>
+            <w:pPr>
+              <w:tabs>
+                <w:tab w:val="left" w:pos="260"/>
+              </w:tabs>
+              <w:spacing w:after="0" w:before="40" w:line="280"/>
+              <w:ind w:left="260" w:hanging="260"/>
+            </w:pPr>
+            <w:r>
+              <w:rPr>
+                <w:b/>
+                <w:bCs/>
+                <w:color w:val="C00000"/>
+                <w:sz w:val="21"/>
+                <w:szCs w:val="21"/>
+              </w:rPr>
+              <w:t xml:space="preserve">→</w:t>
+            </w:r>
+            <w:r>
+              <w:tab/>
+            </w:r>
+            <w:r>
+              <w:rPr>
+                <w:b/>
+                <w:bCs/>
+                <w:sz w:val="21"/>
+                <w:szCs w:val="21"/>
+              </w:rPr>
+              <w:t xml:space="preserve">Iran war:</w:t>
+            </w:r>
+            <w:r>
+              <w:rPr>
+                <w:sz w:val="21"/>
+                <w:szCs w:val="21"/>
+              </w:rPr>
+              <w:t xml:space="preserve"> Chabahar, Hormuz, energy costs</w:t>
+            </w:r>
+          </w:p>
+          <w:p>
+            <w:pPr>
+              <w:tabs>
+                <w:tab w:val="left" w:pos="260"/>
+              </w:tabs>
+              <w:spacing w:after="0" w:before="40" w:line="280"/>
+              <w:ind w:left="260" w:hanging="260"/>
+            </w:pPr>
+            <w:r>
+              <w:rPr>
+                <w:b/>
+                <w:bCs/>
+                <w:color w:val="C00000"/>
+                <w:sz w:val="21"/>
+                <w:szCs w:val="21"/>
+              </w:rPr>
+              <w:t xml:space="preserve">→</w:t>
+            </w:r>
+            <w:r>
+              <w:tab/>
+            </w:r>
+            <w:r>
+              <w:rPr>
+                <w:sz w:val="21"/>
+                <w:szCs w:val="21"/>
+              </w:rPr>
+              <w:t xml:space="preserve">Technology and human rights criticism</w:t>
+            </w:r>
+          </w:p>
+        </w:tc>
+      </w:tr>
+      <w:tr>
+        <w:trPr>
+          <w:cantSplit/>
+        </w:trPr>
+        <w:tc>
+          <w:tcPr>
+            <w:tcW w:type="dxa" w:w="520"/>
+            <w:tcBorders>
+              <w:top w:val="single" w:color="BFBFBF" w:sz="4"/>
+              <w:left w:val="single" w:color="BFBFBF" w:sz="4"/>
+              <w:bottom w:val="single" w:color="BFBFBF" w:sz="4"/>
+              <w:right w:val="single" w:color="BFBFBF" w:sz="4"/>
+            </w:tcBorders>
+            <w:tcMar>
+              <w:top w:type="dxa" w:w="70"/>
+              <w:left w:type="dxa" w:w="100"/>
+              <w:bottom w:type="dxa" w:w="70"/>
+              <w:right w:type="dxa" w:w="100"/>
+            </w:tcMar>
+            <w:vAlign w:val="center"/>
+          </w:tcPr>
+          <w:p>
+            <w:pPr>
+              <w:spacing w:after="0" w:before="0" w:line="300"/>
+              <w:jc w:val="center"/>
+            </w:pPr>
+            <w:r>
+              <w:rPr>
+                <w:color w:val="7F7F7F"/>
+                <w:sz w:val="21"/>
+                <w:szCs w:val="21"/>
+              </w:rPr>
+              <w:t xml:space="preserve">5</w:t>
+            </w:r>
+          </w:p>
+        </w:tc>
+        <w:tc>
+          <w:tcPr>
+            <w:tcW w:type="dxa" w:w="2200"/>
+            <w:tcBorders>
+              <w:top w:val="single" w:color="BFBFBF" w:sz="4"/>
+              <w:left w:val="single" w:color="BFBFBF" w:sz="4"/>
+              <w:bottom w:val="single" w:color="BFBFBF" w:sz="4"/>
+              <w:right w:val="single" w:color="BFBFBF" w:sz="4"/>
+            </w:tcBorders>
+            <w:tcMar>
+              <w:top w:type="dxa" w:w="70"/>
+              <w:left w:type="dxa" w:w="100"/>
+              <w:bottom w:type="dxa" w:w="70"/>
+              <w:right w:type="dxa" w:w="100"/>
+            </w:tcMar>
+            <w:vAlign w:val="center"/>
+          </w:tcPr>
+          <w:p>
+            <w:pPr>
+              <w:spacing w:after="0" w:before="0" w:line="300"/>
+            </w:pPr>
+            <w:r>
+              <w:rPr>
+                <w:b/>
+                <w:bCs/>
+                <w:color w:val="1F3864"/>
+                <w:sz w:val="21"/>
+                <w:szCs w:val="21"/>
+              </w:rPr>
+              <w:t xml:space="preserve">Solutions</w:t>
+            </w:r>
+          </w:p>
+        </w:tc>
+        <w:tc>
+          <w:tcPr>
+            <w:tcW w:type="dxa" w:w="7986"/>
+            <w:tcBorders>
+              <w:top w:val="single" w:color="BFBFBF" w:sz="4"/>
+              <w:left w:val="single" w:color="BFBFBF" w:sz="4"/>
+              <w:bottom w:val="single" w:color="BFBFBF" w:sz="4"/>
+              <w:right w:val="single" w:color="BFBFBF" w:sz="4"/>
+            </w:tcBorders>
+            <w:tcMar>
+              <w:top w:type="dxa" w:w="70"/>
+              <w:left w:type="dxa" w:w="100"/>
+              <w:bottom w:type="dxa" w:w="70"/>
+              <w:right w:type="dxa" w:w="100"/>
+            </w:tcMar>
+            <w:vAlign w:val="center"/>
+          </w:tcPr>
+          <w:p>
+            <w:pPr>
+              <w:tabs>
+                <w:tab w:val="left" w:pos="260"/>
+              </w:tabs>
+              <w:spacing w:after="0" w:before="0" w:line="280"/>
+              <w:ind w:left="260" w:hanging="260"/>
+            </w:pPr>
+            <w:r>
+              <w:rPr>
+                <w:b/>
+                <w:bCs/>
+                <w:color w:val="C00000"/>
+                <w:sz w:val="21"/>
+                <w:szCs w:val="21"/>
+              </w:rPr>
+              <w:t xml:space="preserve">→</w:t>
+            </w:r>
+            <w:r>
+              <w:tab/>
+            </w:r>
+            <w:r>
+              <w:rPr>
+                <w:sz w:val="21"/>
+                <w:szCs w:val="21"/>
+              </w:rPr>
+              <w:t xml:space="preserve">Balanced trade deal that protects farmers and small industry</w:t>
+            </w:r>
+          </w:p>
+          <w:p>
+            <w:pPr>
+              <w:tabs>
+                <w:tab w:val="left" w:pos="260"/>
+              </w:tabs>
+              <w:spacing w:after="0" w:before="40" w:line="280"/>
+              <w:ind w:left="260" w:hanging="260"/>
+            </w:pPr>
+            <w:r>
+              <w:rPr>
+                <w:b/>
+                <w:bCs/>
+                <w:color w:val="C00000"/>
+                <w:sz w:val="21"/>
+                <w:szCs w:val="21"/>
+              </w:rPr>
+              <w:t xml:space="preserve">→</w:t>
+            </w:r>
+            <w:r>
+              <w:tab/>
+            </w:r>
+            <w:r>
+              <w:rPr>
+                <w:b/>
+                <w:bCs/>
+                <w:sz w:val="21"/>
+                <w:szCs w:val="21"/>
+              </w:rPr>
+              <w:t xml:space="preserve">Strategic autonomy:</w:t>
+            </w:r>
+            <w:r>
+              <w:rPr>
+                <w:sz w:val="21"/>
+                <w:szCs w:val="21"/>
+              </w:rPr>
+              <w:t xml:space="preserve"> diversify energy and defence sources; buy from the US where it suits India</w:t>
+            </w:r>
+          </w:p>
+          <w:p>
+            <w:pPr>
+              <w:tabs>
+                <w:tab w:val="left" w:pos="260"/>
+              </w:tabs>
+              <w:spacing w:after="0" w:before="40" w:line="280"/>
+              <w:ind w:left="260" w:hanging="260"/>
+            </w:pPr>
+            <w:r>
+              <w:rPr>
+                <w:b/>
+                <w:bCs/>
+                <w:color w:val="C00000"/>
+                <w:sz w:val="21"/>
+                <w:szCs w:val="21"/>
+              </w:rPr>
+              <w:t xml:space="preserve">→</w:t>
+            </w:r>
+            <w:r>
+              <w:tab/>
+            </w:r>
+            <w:r>
+              <w:rPr>
+                <w:sz w:val="21"/>
+                <w:szCs w:val="21"/>
+              </w:rPr>
+              <w:t xml:space="preserve">Keep defence and tech cooperation on track (co-production, iCET/TRUST, Pax Silica)</w:t>
+            </w:r>
+          </w:p>
+          <w:p>
+            <w:pPr>
+              <w:tabs>
+                <w:tab w:val="left" w:pos="260"/>
+              </w:tabs>
+              <w:spacing w:after="0" w:before="40" w:line="280"/>
+              <w:ind w:left="260" w:hanging="260"/>
+            </w:pPr>
+            <w:r>
+              <w:rPr>
+                <w:b/>
+                <w:bCs/>
+                <w:color w:val="C00000"/>
+                <w:sz w:val="21"/>
+                <w:szCs w:val="21"/>
+              </w:rPr>
+              <w:t xml:space="preserve">→</w:t>
+            </w:r>
+            <w:r>
+              <w:tab/>
+            </w:r>
+            <w:r>
+              <w:rPr>
+                <w:sz w:val="21"/>
+                <w:szCs w:val="21"/>
+              </w:rPr>
+              <w:t xml:space="preserve">Use the Quad for the Indo-Pacific agenda, including a summit in India</w:t>
+            </w:r>
+          </w:p>
+          <w:p>
+            <w:pPr>
+              <w:tabs>
+                <w:tab w:val="left" w:pos="260"/>
+              </w:tabs>
+              <w:spacing w:after="0" w:before="40" w:line="280"/>
+              <w:ind w:left="260" w:hanging="260"/>
+            </w:pPr>
+            <w:r>
+              <w:rPr>
+                <w:b/>
+                <w:bCs/>
+                <w:color w:val="C00000"/>
+                <w:sz w:val="21"/>
+                <w:szCs w:val="21"/>
+              </w:rPr>
+              <w:t xml:space="preserve">→</w:t>
+            </w:r>
+            <w:r>
+              <w:tab/>
+            </w:r>
+            <w:r>
+              <w:rPr>
+                <w:b/>
+                <w:bCs/>
+                <w:sz w:val="21"/>
+                <w:szCs w:val="21"/>
+              </w:rPr>
+              <w:t xml:space="preserve">Firm on terrorism:</w:t>
+            </w:r>
+            <w:r>
+              <w:rPr>
+                <w:sz w:val="21"/>
+                <w:szCs w:val="21"/>
+              </w:rPr>
+              <w:t xml:space="preserve"> seek US support against Pakistan-based groups</w:t>
+            </w:r>
+          </w:p>
+          <w:p>
+            <w:pPr>
+              <w:tabs>
+                <w:tab w:val="left" w:pos="260"/>
+              </w:tabs>
+              <w:spacing w:after="0" w:before="40" w:line="280"/>
+              <w:ind w:left="260" w:hanging="260"/>
+            </w:pPr>
+            <w:r>
+              <w:rPr>
+                <w:b/>
+                <w:bCs/>
+                <w:color w:val="C00000"/>
+                <w:sz w:val="21"/>
+                <w:szCs w:val="21"/>
+              </w:rPr>
+              <w:t xml:space="preserve">→</w:t>
+            </w:r>
+            <w:r>
+              <w:tab/>
+            </w:r>
+            <w:r>
+              <w:rPr>
+                <w:sz w:val="21"/>
+                <w:szCs w:val="21"/>
+              </w:rPr>
+              <w:t xml:space="preserve">Strengthen diaspora and student ties; engage Congress across parties</w:t>
+            </w:r>
+          </w:p>
+          <w:p>
+            <w:pPr>
+              <w:tabs>
+                <w:tab w:val="left" w:pos="260"/>
+              </w:tabs>
+              <w:spacing w:after="0" w:before="40" w:line="280"/>
+              <w:ind w:left="260" w:hanging="260"/>
+            </w:pPr>
+            <w:r>
+              <w:rPr>
+                <w:b/>
+                <w:bCs/>
+                <w:color w:val="C00000"/>
+                <w:sz w:val="21"/>
+                <w:szCs w:val="21"/>
+              </w:rPr>
+              <w:t xml:space="preserve">→</w:t>
+            </w:r>
+            <w:r>
+              <w:tab/>
+            </w:r>
+            <w:r>
+              <w:rPr>
+                <w:sz w:val="21"/>
+                <w:szCs w:val="21"/>
+              </w:rPr>
+              <w:t xml:space="preserve">Rely on no single partner</w:t>
+            </w:r>
+          </w:p>
+        </w:tc>
+      </w:tr>
+      <w:tr>
+        <w:trPr>
+          <w:cantSplit/>
+        </w:trPr>
+        <w:tc>
+          <w:tcPr>
+            <w:tcW w:type="dxa" w:w="520"/>
+            <w:tcBorders>
+              <w:top w:val="single" w:color="BFBFBF" w:sz="4"/>
+              <w:left w:val="single" w:color="BFBFBF" w:sz="4"/>
+              <w:bottom w:val="single" w:color="BFBFBF" w:sz="4"/>
+              <w:right w:val="single" w:color="BFBFBF" w:sz="4"/>
+            </w:tcBorders>
+            <w:shd w:fill="F5F7FB" w:color="auto" w:val="clear"/>
+            <w:tcMar>
+              <w:top w:type="dxa" w:w="70"/>
+              <w:left w:type="dxa" w:w="100"/>
+              <w:bottom w:type="dxa" w:w="70"/>
+              <w:right w:type="dxa" w:w="100"/>
+            </w:tcMar>
+            <w:vAlign w:val="center"/>
+          </w:tcPr>
+          <w:p>
+            <w:pPr>
+              <w:spacing w:after="0" w:before="0" w:line="300"/>
+              <w:jc w:val="center"/>
+            </w:pPr>
+            <w:r>
+              <w:rPr>
+                <w:color w:val="7F7F7F"/>
+                <w:sz w:val="21"/>
+                <w:szCs w:val="21"/>
+              </w:rPr>
+              <w:t xml:space="preserve">6</w:t>
+            </w:r>
+          </w:p>
+        </w:tc>
+        <w:tc>
+          <w:tcPr>
+            <w:tcW w:type="dxa" w:w="2200"/>
+            <w:tcBorders>
+              <w:top w:val="single" w:color="BFBFBF" w:sz="4"/>
+              <w:left w:val="single" w:color="BFBFBF" w:sz="4"/>
+              <w:bottom w:val="single" w:color="BFBFBF" w:sz="4"/>
+              <w:right w:val="single" w:color="BFBFBF" w:sz="4"/>
+            </w:tcBorders>
+            <w:shd w:fill="F5F7FB" w:color="auto" w:val="clear"/>
+            <w:tcMar>
+              <w:top w:type="dxa" w:w="70"/>
+              <w:left w:type="dxa" w:w="100"/>
+              <w:bottom w:type="dxa" w:w="70"/>
+              <w:right w:type="dxa" w:w="100"/>
+            </w:tcMar>
+            <w:vAlign w:val="center"/>
+          </w:tcPr>
+          <w:p>
+            <w:pPr>
+              <w:spacing w:after="0" w:before="0" w:line="300"/>
+            </w:pPr>
+            <w:r>
+              <w:rPr>
+                <w:b/>
+                <w:bCs/>
+                <w:color w:val="1F3864"/>
+                <w:sz w:val="21"/>
+                <w:szCs w:val="21"/>
+              </w:rPr>
+              <w:t xml:space="preserve">Conclusion</w:t>
+            </w:r>
+          </w:p>
+        </w:tc>
+        <w:tc>
+          <w:tcPr>
+            <w:tcW w:type="dxa" w:w="7986"/>
+            <w:tcBorders>
+              <w:top w:val="single" w:color="BFBFBF" w:sz="4"/>
+              <w:left w:val="single" w:color="BFBFBF" w:sz="4"/>
+              <w:bottom w:val="single" w:color="BFBFBF" w:sz="4"/>
+              <w:right w:val="single" w:color="BFBFBF" w:sz="4"/>
+            </w:tcBorders>
+            <w:shd w:fill="F5F7FB" w:color="auto" w:val="clear"/>
+            <w:tcMar>
+              <w:top w:type="dxa" w:w="70"/>
+              <w:left w:type="dxa" w:w="100"/>
+              <w:bottom w:type="dxa" w:w="70"/>
+              <w:right w:type="dxa" w:w="100"/>
+            </w:tcMar>
+            <w:vAlign w:val="center"/>
+          </w:tcPr>
+          <w:p>
+            <w:pPr>
+              <w:tabs>
+                <w:tab w:val="left" w:pos="260"/>
+              </w:tabs>
+              <w:spacing w:after="0" w:before="0" w:line="280"/>
+              <w:ind w:left="260" w:hanging="260"/>
+            </w:pPr>
+            <w:r>
+              <w:rPr>
+                <w:b/>
+                <w:bCs/>
+                <w:color w:val="C00000"/>
+                <w:sz w:val="21"/>
+                <w:szCs w:val="21"/>
+              </w:rPr>
+              <w:t xml:space="preserve">→</w:t>
+            </w:r>
+            <w:r>
+              <w:tab/>
+            </w:r>
+            <w:r>
+              <w:rPr>
+                <w:b/>
+                <w:bCs/>
+                <w:sz w:val="21"/>
+                <w:szCs w:val="21"/>
+              </w:rPr>
+              <w:t xml:space="preserve">Natural partners:</w:t>
+            </w:r>
+            <w:r>
+              <w:rPr>
+                <w:sz w:val="21"/>
+                <w:szCs w:val="21"/>
+              </w:rPr>
+              <w:t xml:space="preserve"> shared democratic values and a shared China concern</w:t>
+            </w:r>
+          </w:p>
+          <w:p>
+            <w:pPr>
+              <w:tabs>
+                <w:tab w:val="left" w:pos="260"/>
+              </w:tabs>
+              <w:spacing w:after="0" w:before="40" w:line="280"/>
+              <w:ind w:left="260" w:hanging="260"/>
+            </w:pPr>
+            <w:r>
+              <w:rPr>
+                <w:b/>
+                <w:bCs/>
+                <w:color w:val="C00000"/>
+                <w:sz w:val="21"/>
+                <w:szCs w:val="21"/>
+              </w:rPr>
+              <w:t xml:space="preserve">→</w:t>
+            </w:r>
+            <w:r>
+              <w:tab/>
+            </w:r>
+            <w:r>
+              <w:rPr>
+                <w:sz w:val="21"/>
+                <w:szCs w:val="21"/>
+              </w:rPr>
+              <w:t xml:space="preserve">The relationship is bigger than any one leader or tariff</w:t>
+            </w:r>
+          </w:p>
+          <w:p>
+            <w:pPr>
+              <w:tabs>
+                <w:tab w:val="left" w:pos="260"/>
+              </w:tabs>
+              <w:spacing w:after="0" w:before="40" w:line="280"/>
+              <w:ind w:left="260" w:hanging="260"/>
+            </w:pPr>
+            <w:r>
+              <w:rPr>
+                <w:b/>
+                <w:bCs/>
+                <w:color w:val="C00000"/>
+                <w:sz w:val="21"/>
+                <w:szCs w:val="21"/>
+              </w:rPr>
+              <w:t xml:space="preserve">→</w:t>
+            </w:r>
+            <w:r>
+              <w:tab/>
+            </w:r>
+            <w:r>
+              <w:rPr>
+                <w:sz w:val="21"/>
+                <w:szCs w:val="21"/>
+              </w:rPr>
+              <w:t xml:space="preserve">India engages with confidence, guided by national interest, not pressure</w:t>
             </w:r>
           </w:p>
         </w:tc>

</xml_diff>

<commit_message>
Add India–Russia Relations lecturette
Co-Authored-By: Claude Opus 5.5 <noreply@anthropic.com>
Claude-Session: https://claude.ai/code/session_01EyrV2JLtXrELkAF97b5fch
</commit_message>
<xml_diff>
--- a/SSB_Lecturettes.docx
+++ b/SSB_Lecturettes.docx
@@ -17575,6 +17575,1911 @@
                 <w:szCs w:val="21"/>
               </w:rPr>
               <w:t xml:space="preserve">India engages with confidence, guided by national interest, not pressure</w:t>
+            </w:r>
+          </w:p>
+        </w:tc>
+      </w:tr>
+    </w:tbl>
+    <w:p>
+      <w:pPr>
+        <w:pStyle w:val="Heading1"/>
+        <w:pageBreakBefore/>
+        <w:shd w:fill="1F3864" w:color="auto" w:val="clear"/>
+        <w:spacing w:after="160" w:before="0"/>
+        <w:ind w:left="100" w:right="100"/>
+      </w:pPr>
+      <w:r>
+        <w:t xml:space="preserve">Topic 11: India–Russia Relations</w:t>
+      </w:r>
+    </w:p>
+    <w:tbl>
+      <w:tblPr>
+        <w:tblW w:type="dxa" w:w="10706"/>
+        <w:tblBorders>
+          <w:top w:val="single" w:color="auto" w:sz="4"/>
+          <w:left w:val="single" w:color="auto" w:sz="4"/>
+          <w:bottom w:val="single" w:color="auto" w:sz="4"/>
+          <w:right w:val="single" w:color="auto" w:sz="4"/>
+          <w:insideH w:val="single" w:color="auto" w:sz="4"/>
+          <w:insideV w:val="single" w:color="auto" w:sz="4"/>
+        </w:tblBorders>
+      </w:tblPr>
+      <w:tblGrid>
+        <w:gridCol w:w="520"/>
+        <w:gridCol w:w="2200"/>
+        <w:gridCol w:w="7986"/>
+      </w:tblGrid>
+      <w:tr>
+        <w:trPr>
+          <w:tblHeader/>
+        </w:trPr>
+        <w:tc>
+          <w:tcPr>
+            <w:tcW w:type="dxa" w:w="520"/>
+            <w:tcBorders>
+              <w:top w:val="single" w:color="BFBFBF" w:sz="4"/>
+              <w:left w:val="single" w:color="BFBFBF" w:sz="4"/>
+              <w:bottom w:val="single" w:color="BFBFBF" w:sz="4"/>
+              <w:right w:val="single" w:color="BFBFBF" w:sz="4"/>
+            </w:tcBorders>
+            <w:shd w:fill="DCE3F0" w:color="auto" w:val="clear"/>
+            <w:tcMar>
+              <w:top w:type="dxa" w:w="70"/>
+              <w:left w:type="dxa" w:w="100"/>
+              <w:bottom w:type="dxa" w:w="70"/>
+              <w:right w:type="dxa" w:w="100"/>
+            </w:tcMar>
+            <w:vAlign w:val="center"/>
+          </w:tcPr>
+          <w:p>
+            <w:pPr>
+              <w:spacing w:after="0" w:before="0" w:line="300"/>
+              <w:jc w:val="center"/>
+            </w:pPr>
+            <w:r>
+              <w:rPr>
+                <w:b/>
+                <w:bCs/>
+                <w:sz w:val="21"/>
+                <w:szCs w:val="21"/>
+              </w:rPr>
+              <w:t xml:space="preserve">#</w:t>
+            </w:r>
+          </w:p>
+        </w:tc>
+        <w:tc>
+          <w:tcPr>
+            <w:tcW w:type="dxa" w:w="2200"/>
+            <w:tcBorders>
+              <w:top w:val="single" w:color="BFBFBF" w:sz="4"/>
+              <w:left w:val="single" w:color="BFBFBF" w:sz="4"/>
+              <w:bottom w:val="single" w:color="BFBFBF" w:sz="4"/>
+              <w:right w:val="single" w:color="BFBFBF" w:sz="4"/>
+            </w:tcBorders>
+            <w:shd w:fill="DCE3F0" w:color="auto" w:val="clear"/>
+            <w:tcMar>
+              <w:top w:type="dxa" w:w="70"/>
+              <w:left w:type="dxa" w:w="100"/>
+              <w:bottom w:type="dxa" w:w="70"/>
+              <w:right w:type="dxa" w:w="100"/>
+            </w:tcMar>
+            <w:vAlign w:val="center"/>
+          </w:tcPr>
+          <w:p>
+            <w:pPr>
+              <w:spacing w:after="0" w:before="0" w:line="300"/>
+            </w:pPr>
+            <w:r>
+              <w:rPr>
+                <w:b/>
+                <w:bCs/>
+                <w:sz w:val="21"/>
+                <w:szCs w:val="21"/>
+              </w:rPr>
+              <w:t xml:space="preserve">Stage</w:t>
+            </w:r>
+          </w:p>
+        </w:tc>
+        <w:tc>
+          <w:tcPr>
+            <w:tcW w:type="dxa" w:w="7986"/>
+            <w:tcBorders>
+              <w:top w:val="single" w:color="BFBFBF" w:sz="4"/>
+              <w:left w:val="single" w:color="BFBFBF" w:sz="4"/>
+              <w:bottom w:val="single" w:color="BFBFBF" w:sz="4"/>
+              <w:right w:val="single" w:color="BFBFBF" w:sz="4"/>
+            </w:tcBorders>
+            <w:shd w:fill="DCE3F0" w:color="auto" w:val="clear"/>
+            <w:tcMar>
+              <w:top w:type="dxa" w:w="70"/>
+              <w:left w:type="dxa" w:w="100"/>
+              <w:bottom w:type="dxa" w:w="70"/>
+              <w:right w:type="dxa" w:w="100"/>
+            </w:tcMar>
+            <w:vAlign w:val="center"/>
+          </w:tcPr>
+          <w:p>
+            <w:pPr>
+              <w:spacing w:after="0" w:before="0" w:line="300"/>
+            </w:pPr>
+            <w:r>
+              <w:rPr>
+                <w:b/>
+                <w:bCs/>
+                <w:sz w:val="21"/>
+                <w:szCs w:val="21"/>
+              </w:rPr>
+              <w:t xml:space="preserve">Flow</w:t>
+            </w:r>
+          </w:p>
+        </w:tc>
+      </w:tr>
+      <w:tr>
+        <w:trPr>
+          <w:cantSplit/>
+        </w:trPr>
+        <w:tc>
+          <w:tcPr>
+            <w:tcW w:type="dxa" w:w="520"/>
+            <w:tcBorders>
+              <w:top w:val="single" w:color="BFBFBF" w:sz="4"/>
+              <w:left w:val="single" w:color="BFBFBF" w:sz="4"/>
+              <w:bottom w:val="single" w:color="BFBFBF" w:sz="4"/>
+              <w:right w:val="single" w:color="BFBFBF" w:sz="4"/>
+            </w:tcBorders>
+            <w:tcMar>
+              <w:top w:type="dxa" w:w="70"/>
+              <w:left w:type="dxa" w:w="100"/>
+              <w:bottom w:type="dxa" w:w="70"/>
+              <w:right w:type="dxa" w:w="100"/>
+            </w:tcMar>
+            <w:vAlign w:val="center"/>
+          </w:tcPr>
+          <w:p>
+            <w:pPr>
+              <w:spacing w:after="0" w:before="0" w:line="300"/>
+              <w:jc w:val="center"/>
+            </w:pPr>
+            <w:r>
+              <w:rPr>
+                <w:color w:val="7F7F7F"/>
+                <w:sz w:val="21"/>
+                <w:szCs w:val="21"/>
+              </w:rPr>
+              <w:t xml:space="preserve">1</w:t>
+            </w:r>
+          </w:p>
+        </w:tc>
+        <w:tc>
+          <w:tcPr>
+            <w:tcW w:type="dxa" w:w="2200"/>
+            <w:tcBorders>
+              <w:top w:val="single" w:color="BFBFBF" w:sz="4"/>
+              <w:left w:val="single" w:color="BFBFBF" w:sz="4"/>
+              <w:bottom w:val="single" w:color="BFBFBF" w:sz="4"/>
+              <w:right w:val="single" w:color="BFBFBF" w:sz="4"/>
+            </w:tcBorders>
+            <w:tcMar>
+              <w:top w:type="dxa" w:w="70"/>
+              <w:left w:type="dxa" w:w="100"/>
+              <w:bottom w:type="dxa" w:w="70"/>
+              <w:right w:type="dxa" w:w="100"/>
+            </w:tcMar>
+            <w:vAlign w:val="center"/>
+          </w:tcPr>
+          <w:p>
+            <w:pPr>
+              <w:spacing w:after="0" w:before="0" w:line="300"/>
+            </w:pPr>
+            <w:r>
+              <w:rPr>
+                <w:b/>
+                <w:bCs/>
+                <w:color w:val="1F3864"/>
+                <w:sz w:val="21"/>
+                <w:szCs w:val="21"/>
+              </w:rPr>
+              <w:t xml:space="preserve">What is it</w:t>
+            </w:r>
+          </w:p>
+        </w:tc>
+        <w:tc>
+          <w:tcPr>
+            <w:tcW w:type="dxa" w:w="7986"/>
+            <w:tcBorders>
+              <w:top w:val="single" w:color="BFBFBF" w:sz="4"/>
+              <w:left w:val="single" w:color="BFBFBF" w:sz="4"/>
+              <w:bottom w:val="single" w:color="BFBFBF" w:sz="4"/>
+              <w:right w:val="single" w:color="BFBFBF" w:sz="4"/>
+            </w:tcBorders>
+            <w:tcMar>
+              <w:top w:type="dxa" w:w="70"/>
+              <w:left w:type="dxa" w:w="100"/>
+              <w:bottom w:type="dxa" w:w="70"/>
+              <w:right w:type="dxa" w:w="100"/>
+            </w:tcMar>
+            <w:vAlign w:val="center"/>
+          </w:tcPr>
+          <w:p>
+            <w:pPr>
+              <w:tabs>
+                <w:tab w:val="left" w:pos="260"/>
+              </w:tabs>
+              <w:spacing w:after="0" w:before="0" w:line="280"/>
+              <w:ind w:left="260" w:hanging="260"/>
+            </w:pPr>
+            <w:r>
+              <w:rPr>
+                <w:b/>
+                <w:bCs/>
+                <w:color w:val="C00000"/>
+                <w:sz w:val="21"/>
+                <w:szCs w:val="21"/>
+              </w:rPr>
+              <w:t xml:space="preserve">→</w:t>
+            </w:r>
+            <w:r>
+              <w:tab/>
+            </w:r>
+            <w:r>
+              <w:rPr>
+                <w:sz w:val="21"/>
+                <w:szCs w:val="21"/>
+              </w:rPr>
+              <w:t xml:space="preserve">India's oldest strategic partnership; "special and privileged strategic partnership" since 2010</w:t>
+            </w:r>
+          </w:p>
+          <w:p>
+            <w:pPr>
+              <w:tabs>
+                <w:tab w:val="left" w:pos="260"/>
+              </w:tabs>
+              <w:spacing w:after="0" w:before="40" w:line="280"/>
+              <w:ind w:left="260" w:hanging="260"/>
+            </w:pPr>
+            <w:r>
+              <w:rPr>
+                <w:b/>
+                <w:bCs/>
+                <w:color w:val="C00000"/>
+                <w:sz w:val="21"/>
+                <w:szCs w:val="21"/>
+              </w:rPr>
+              <w:t xml:space="preserve">→</w:t>
+            </w:r>
+            <w:r>
+              <w:tab/>
+            </w:r>
+            <w:r>
+              <w:rPr>
+                <w:b/>
+                <w:bCs/>
+                <w:sz w:val="21"/>
+                <w:szCs w:val="21"/>
+              </w:rPr>
+              <w:t xml:space="preserve">Roots:</w:t>
+            </w:r>
+            <w:r>
+              <w:rPr>
+                <w:sz w:val="21"/>
+                <w:szCs w:val="21"/>
+              </w:rPr>
+              <w:t xml:space="preserve"> 1971 Treaty of Peace, Friendship and Cooperation; Soviet support at the UN</w:t>
+            </w:r>
+          </w:p>
+          <w:p>
+            <w:pPr>
+              <w:tabs>
+                <w:tab w:val="left" w:pos="260"/>
+              </w:tabs>
+              <w:spacing w:after="0" w:before="40" w:line="280"/>
+              <w:ind w:left="260" w:hanging="260"/>
+            </w:pPr>
+            <w:r>
+              <w:rPr>
+                <w:b/>
+                <w:bCs/>
+                <w:color w:val="C00000"/>
+                <w:sz w:val="21"/>
+                <w:szCs w:val="21"/>
+              </w:rPr>
+              <w:t xml:space="preserve">→</w:t>
+            </w:r>
+            <w:r>
+              <w:tab/>
+            </w:r>
+            <w:r>
+              <w:rPr>
+                <w:b/>
+                <w:bCs/>
+                <w:sz w:val="21"/>
+                <w:szCs w:val="21"/>
+              </w:rPr>
+              <w:t xml:space="preserve">Pillars:</w:t>
+            </w:r>
+            <w:r>
+              <w:rPr>
+                <w:sz w:val="21"/>
+                <w:szCs w:val="21"/>
+              </w:rPr>
+              <w:t xml:space="preserve"> defence, energy, nuclear power, space, trade, diplomatic support</w:t>
+            </w:r>
+          </w:p>
+          <w:p>
+            <w:pPr>
+              <w:tabs>
+                <w:tab w:val="left" w:pos="260"/>
+              </w:tabs>
+              <w:spacing w:after="0" w:before="40" w:line="280"/>
+              <w:ind w:left="260" w:hanging="260"/>
+            </w:pPr>
+            <w:r>
+              <w:rPr>
+                <w:b/>
+                <w:bCs/>
+                <w:color w:val="C00000"/>
+                <w:sz w:val="21"/>
+                <w:szCs w:val="21"/>
+              </w:rPr>
+              <w:t xml:space="preserve">→</w:t>
+            </w:r>
+            <w:r>
+              <w:tab/>
+            </w:r>
+            <w:r>
+              <w:rPr>
+                <w:sz w:val="21"/>
+                <w:szCs w:val="21"/>
+              </w:rPr>
+              <w:t xml:space="preserve">80 years of diplomatic ties in 2027</w:t>
+            </w:r>
+          </w:p>
+        </w:tc>
+      </w:tr>
+      <w:tr>
+        <w:trPr>
+          <w:cantSplit/>
+        </w:trPr>
+        <w:tc>
+          <w:tcPr>
+            <w:tcW w:type="dxa" w:w="520"/>
+            <w:tcBorders>
+              <w:top w:val="single" w:color="BFBFBF" w:sz="4"/>
+              <w:left w:val="single" w:color="BFBFBF" w:sz="4"/>
+              <w:bottom w:val="single" w:color="BFBFBF" w:sz="4"/>
+              <w:right w:val="single" w:color="BFBFBF" w:sz="4"/>
+            </w:tcBorders>
+            <w:shd w:fill="F5F7FB" w:color="auto" w:val="clear"/>
+            <w:tcMar>
+              <w:top w:type="dxa" w:w="70"/>
+              <w:left w:type="dxa" w:w="100"/>
+              <w:bottom w:type="dxa" w:w="70"/>
+              <w:right w:type="dxa" w:w="100"/>
+            </w:tcMar>
+            <w:vAlign w:val="center"/>
+          </w:tcPr>
+          <w:p>
+            <w:pPr>
+              <w:spacing w:after="0" w:before="0" w:line="300"/>
+              <w:jc w:val="center"/>
+            </w:pPr>
+            <w:r>
+              <w:rPr>
+                <w:color w:val="7F7F7F"/>
+                <w:sz w:val="21"/>
+                <w:szCs w:val="21"/>
+              </w:rPr>
+              <w:t xml:space="preserve">2</w:t>
+            </w:r>
+          </w:p>
+        </w:tc>
+        <w:tc>
+          <w:tcPr>
+            <w:tcW w:type="dxa" w:w="2200"/>
+            <w:tcBorders>
+              <w:top w:val="single" w:color="BFBFBF" w:sz="4"/>
+              <w:left w:val="single" w:color="BFBFBF" w:sz="4"/>
+              <w:bottom w:val="single" w:color="BFBFBF" w:sz="4"/>
+              <w:right w:val="single" w:color="BFBFBF" w:sz="4"/>
+            </w:tcBorders>
+            <w:shd w:fill="F5F7FB" w:color="auto" w:val="clear"/>
+            <w:tcMar>
+              <w:top w:type="dxa" w:w="70"/>
+              <w:left w:type="dxa" w:w="100"/>
+              <w:bottom w:type="dxa" w:w="70"/>
+              <w:right w:type="dxa" w:w="100"/>
+            </w:tcMar>
+            <w:vAlign w:val="center"/>
+          </w:tcPr>
+          <w:p>
+            <w:pPr>
+              <w:spacing w:after="0" w:before="0" w:line="300"/>
+            </w:pPr>
+            <w:r>
+              <w:rPr>
+                <w:b/>
+                <w:bCs/>
+                <w:color w:val="1F3864"/>
+                <w:sz w:val="21"/>
+                <w:szCs w:val="21"/>
+              </w:rPr>
+              <w:t xml:space="preserve">Why it matters</w:t>
+            </w:r>
+          </w:p>
+        </w:tc>
+        <w:tc>
+          <w:tcPr>
+            <w:tcW w:type="dxa" w:w="7986"/>
+            <w:tcBorders>
+              <w:top w:val="single" w:color="BFBFBF" w:sz="4"/>
+              <w:left w:val="single" w:color="BFBFBF" w:sz="4"/>
+              <w:bottom w:val="single" w:color="BFBFBF" w:sz="4"/>
+              <w:right w:val="single" w:color="BFBFBF" w:sz="4"/>
+            </w:tcBorders>
+            <w:shd w:fill="F5F7FB" w:color="auto" w:val="clear"/>
+            <w:tcMar>
+              <w:top w:type="dxa" w:w="70"/>
+              <w:left w:type="dxa" w:w="100"/>
+              <w:bottom w:type="dxa" w:w="70"/>
+              <w:right w:type="dxa" w:w="100"/>
+            </w:tcMar>
+            <w:vAlign w:val="center"/>
+          </w:tcPr>
+          <w:p>
+            <w:pPr>
+              <w:tabs>
+                <w:tab w:val="left" w:pos="260"/>
+              </w:tabs>
+              <w:spacing w:after="0" w:before="0" w:line="280"/>
+              <w:ind w:left="260" w:hanging="260"/>
+            </w:pPr>
+            <w:r>
+              <w:rPr>
+                <w:b/>
+                <w:bCs/>
+                <w:color w:val="C00000"/>
+                <w:sz w:val="21"/>
+                <w:szCs w:val="21"/>
+              </w:rPr>
+              <w:t xml:space="preserve">→</w:t>
+            </w:r>
+            <w:r>
+              <w:tab/>
+            </w:r>
+            <w:r>
+              <w:rPr>
+                <w:b/>
+                <w:bCs/>
+                <w:sz w:val="21"/>
+                <w:szCs w:val="21"/>
+              </w:rPr>
+              <w:t xml:space="preserve">Defence:</w:t>
+            </w:r>
+            <w:r>
+              <w:rPr>
+                <w:sz w:val="21"/>
+                <w:szCs w:val="21"/>
+              </w:rPr>
+              <w:t xml:space="preserve"> large share of Russian-origin systems (S-400, Su-30MKI, T-90, BrahMos co-development)</w:t>
+            </w:r>
+          </w:p>
+          <w:p>
+            <w:pPr>
+              <w:tabs>
+                <w:tab w:val="left" w:pos="260"/>
+              </w:tabs>
+              <w:spacing w:after="0" w:before="40" w:line="280"/>
+              <w:ind w:left="260" w:hanging="260"/>
+            </w:pPr>
+            <w:r>
+              <w:rPr>
+                <w:b/>
+                <w:bCs/>
+                <w:color w:val="C00000"/>
+                <w:sz w:val="21"/>
+                <w:szCs w:val="21"/>
+              </w:rPr>
+              <w:t xml:space="preserve">→</w:t>
+            </w:r>
+            <w:r>
+              <w:tab/>
+            </w:r>
+            <w:r>
+              <w:rPr>
+                <w:b/>
+                <w:bCs/>
+                <w:sz w:val="21"/>
+                <w:szCs w:val="21"/>
+              </w:rPr>
+              <w:t xml:space="preserve">Energy:</w:t>
+            </w:r>
+            <w:r>
+              <w:rPr>
+                <w:sz w:val="21"/>
+                <w:szCs w:val="21"/>
+              </w:rPr>
+              <w:t xml:space="preserve"> discounted crude; Kudankulam nuclear plant</w:t>
+            </w:r>
+          </w:p>
+          <w:p>
+            <w:pPr>
+              <w:tabs>
+                <w:tab w:val="left" w:pos="260"/>
+              </w:tabs>
+              <w:spacing w:after="0" w:before="40" w:line="280"/>
+              <w:ind w:left="260" w:hanging="260"/>
+            </w:pPr>
+            <w:r>
+              <w:rPr>
+                <w:b/>
+                <w:bCs/>
+                <w:color w:val="C00000"/>
+                <w:sz w:val="21"/>
+                <w:szCs w:val="21"/>
+              </w:rPr>
+              <w:t xml:space="preserve">→</w:t>
+            </w:r>
+            <w:r>
+              <w:tab/>
+            </w:r>
+            <w:r>
+              <w:rPr>
+                <w:b/>
+                <w:bCs/>
+                <w:sz w:val="21"/>
+                <w:szCs w:val="21"/>
+              </w:rPr>
+              <w:t xml:space="preserve">Strategic:</w:t>
+            </w:r>
+            <w:r>
+              <w:rPr>
+                <w:sz w:val="21"/>
+                <w:szCs w:val="21"/>
+              </w:rPr>
+              <w:t xml:space="preserve"> autonomy between the US and China; anchors BRICS and SCO</w:t>
+            </w:r>
+          </w:p>
+          <w:p>
+            <w:pPr>
+              <w:tabs>
+                <w:tab w:val="left" w:pos="260"/>
+              </w:tabs>
+              <w:spacing w:after="0" w:before="40" w:line="280"/>
+              <w:ind w:left="260" w:hanging="260"/>
+            </w:pPr>
+            <w:r>
+              <w:rPr>
+                <w:b/>
+                <w:bCs/>
+                <w:color w:val="C00000"/>
+                <w:sz w:val="21"/>
+                <w:szCs w:val="21"/>
+              </w:rPr>
+              <w:t xml:space="preserve">→</w:t>
+            </w:r>
+            <w:r>
+              <w:tab/>
+            </w:r>
+            <w:r>
+              <w:rPr>
+                <w:b/>
+                <w:bCs/>
+                <w:sz w:val="21"/>
+                <w:szCs w:val="21"/>
+              </w:rPr>
+              <w:t xml:space="preserve">Diplomatic:</w:t>
+            </w:r>
+            <w:r>
+              <w:rPr>
+                <w:sz w:val="21"/>
+                <w:szCs w:val="21"/>
+              </w:rPr>
+              <w:t xml:space="preserve"> time-tested partner on the UN Security Council</w:t>
+            </w:r>
+          </w:p>
+          <w:p>
+            <w:pPr>
+              <w:tabs>
+                <w:tab w:val="left" w:pos="260"/>
+              </w:tabs>
+              <w:spacing w:after="0" w:before="40" w:line="280"/>
+              <w:ind w:left="260" w:hanging="260"/>
+            </w:pPr>
+            <w:r>
+              <w:rPr>
+                <w:b/>
+                <w:bCs/>
+                <w:color w:val="C00000"/>
+                <w:sz w:val="21"/>
+                <w:szCs w:val="21"/>
+              </w:rPr>
+              <w:t xml:space="preserve">→</w:t>
+            </w:r>
+            <w:r>
+              <w:tab/>
+            </w:r>
+            <w:r>
+              <w:rPr>
+                <w:b/>
+                <w:bCs/>
+                <w:sz w:val="21"/>
+                <w:szCs w:val="21"/>
+              </w:rPr>
+              <w:t xml:space="preserve">Economic:</w:t>
+            </w:r>
+            <w:r>
+              <w:rPr>
+                <w:sz w:val="21"/>
+                <w:szCs w:val="21"/>
+              </w:rPr>
+              <w:t xml:space="preserve"> fertilisers, critical minerals, Arctic and INSTC connectivity</w:t>
+            </w:r>
+          </w:p>
+        </w:tc>
+      </w:tr>
+      <w:tr>
+        <w:trPr>
+          <w:cantSplit/>
+        </w:trPr>
+        <w:tc>
+          <w:tcPr>
+            <w:tcW w:type="dxa" w:w="520"/>
+            <w:tcBorders>
+              <w:top w:val="single" w:color="BFBFBF" w:sz="4"/>
+              <w:left w:val="single" w:color="BFBFBF" w:sz="4"/>
+              <w:bottom w:val="single" w:color="BFBFBF" w:sz="4"/>
+              <w:right w:val="single" w:color="BFBFBF" w:sz="4"/>
+            </w:tcBorders>
+            <w:tcMar>
+              <w:top w:type="dxa" w:w="70"/>
+              <w:left w:type="dxa" w:w="100"/>
+              <w:bottom w:type="dxa" w:w="70"/>
+              <w:right w:type="dxa" w:w="100"/>
+            </w:tcMar>
+            <w:vAlign w:val="center"/>
+          </w:tcPr>
+          <w:p>
+            <w:pPr>
+              <w:spacing w:after="0" w:before="0" w:line="300"/>
+              <w:jc w:val="center"/>
+            </w:pPr>
+            <w:r>
+              <w:rPr>
+                <w:color w:val="7F7F7F"/>
+                <w:sz w:val="21"/>
+                <w:szCs w:val="21"/>
+              </w:rPr>
+              <w:t xml:space="preserve">3</w:t>
+            </w:r>
+          </w:p>
+        </w:tc>
+        <w:tc>
+          <w:tcPr>
+            <w:tcW w:type="dxa" w:w="2200"/>
+            <w:tcBorders>
+              <w:top w:val="single" w:color="BFBFBF" w:sz="4"/>
+              <w:left w:val="single" w:color="BFBFBF" w:sz="4"/>
+              <w:bottom w:val="single" w:color="BFBFBF" w:sz="4"/>
+              <w:right w:val="single" w:color="BFBFBF" w:sz="4"/>
+            </w:tcBorders>
+            <w:tcMar>
+              <w:top w:type="dxa" w:w="70"/>
+              <w:left w:type="dxa" w:w="100"/>
+              <w:bottom w:type="dxa" w:w="70"/>
+              <w:right w:type="dxa" w:w="100"/>
+            </w:tcMar>
+            <w:vAlign w:val="center"/>
+          </w:tcPr>
+          <w:p>
+            <w:pPr>
+              <w:spacing w:after="0" w:before="0" w:line="300"/>
+            </w:pPr>
+            <w:r>
+              <w:rPr>
+                <w:b/>
+                <w:bCs/>
+                <w:color w:val="1F3864"/>
+                <w:sz w:val="21"/>
+                <w:szCs w:val="21"/>
+              </w:rPr>
+              <w:t xml:space="preserve">Current status (Oct 2026)</w:t>
+            </w:r>
+          </w:p>
+        </w:tc>
+        <w:tc>
+          <w:tcPr>
+            <w:tcW w:type="dxa" w:w="7986"/>
+            <w:tcBorders>
+              <w:top w:val="single" w:color="BFBFBF" w:sz="4"/>
+              <w:left w:val="single" w:color="BFBFBF" w:sz="4"/>
+              <w:bottom w:val="single" w:color="BFBFBF" w:sz="4"/>
+              <w:right w:val="single" w:color="BFBFBF" w:sz="4"/>
+            </w:tcBorders>
+            <w:tcMar>
+              <w:top w:type="dxa" w:w="70"/>
+              <w:left w:type="dxa" w:w="100"/>
+              <w:bottom w:type="dxa" w:w="70"/>
+              <w:right w:type="dxa" w:w="100"/>
+            </w:tcMar>
+            <w:vAlign w:val="center"/>
+          </w:tcPr>
+          <w:p>
+            <w:pPr>
+              <w:tabs>
+                <w:tab w:val="left" w:pos="260"/>
+              </w:tabs>
+              <w:spacing w:after="0" w:before="0" w:line="280"/>
+              <w:ind w:left="260" w:hanging="260"/>
+            </w:pPr>
+            <w:r>
+              <w:rPr>
+                <w:b/>
+                <w:bCs/>
+                <w:color w:val="C00000"/>
+                <w:sz w:val="21"/>
+                <w:szCs w:val="21"/>
+              </w:rPr>
+              <w:t xml:space="preserve">→</w:t>
+            </w:r>
+            <w:r>
+              <w:tab/>
+            </w:r>
+            <w:r>
+              <w:rPr>
+                <w:b/>
+                <w:bCs/>
+                <w:sz w:val="21"/>
+                <w:szCs w:val="21"/>
+              </w:rPr>
+              <w:t xml:space="preserve">Summits:</w:t>
+            </w:r>
+            <w:r>
+              <w:rPr>
+                <w:sz w:val="21"/>
+                <w:szCs w:val="21"/>
+              </w:rPr>
+              <w:t xml:space="preserve"> Putin in India for BRICS (11–13 Sep 2026), his first in-person BRICS summit abroad since the Ukraine war; Modi–Putin bilateral (11 Sep); earlier meeting at the SCO in Bishkek</w:t>
+            </w:r>
+          </w:p>
+          <w:p>
+            <w:pPr>
+              <w:tabs>
+                <w:tab w:val="left" w:pos="260"/>
+              </w:tabs>
+              <w:spacing w:after="0" w:before="40" w:line="280"/>
+              <w:ind w:left="260" w:hanging="260"/>
+            </w:pPr>
+            <w:r>
+              <w:rPr>
+                <w:b/>
+                <w:bCs/>
+                <w:color w:val="C00000"/>
+                <w:sz w:val="21"/>
+                <w:szCs w:val="21"/>
+              </w:rPr>
+              <w:t xml:space="preserve">→</w:t>
+            </w:r>
+            <w:r>
+              <w:tab/>
+            </w:r>
+            <w:r>
+              <w:rPr>
+                <w:b/>
+                <w:bCs/>
+                <w:sz w:val="21"/>
+                <w:szCs w:val="21"/>
+              </w:rPr>
+              <w:t xml:space="preserve">Trade:</w:t>
+            </w:r>
+            <w:r>
+              <w:rPr>
+                <w:sz w:val="21"/>
+                <w:szCs w:val="21"/>
+              </w:rPr>
+              <w:t xml:space="preserve"> about $70 bn vs $100 bn target for 2030; India's deficit about $58.9 bn due to crude</w:t>
+            </w:r>
+          </w:p>
+          <w:p>
+            <w:pPr>
+              <w:tabs>
+                <w:tab w:val="left" w:pos="260"/>
+              </w:tabs>
+              <w:spacing w:after="0" w:before="40" w:line="280"/>
+              <w:ind w:left="260" w:hanging="260"/>
+            </w:pPr>
+            <w:r>
+              <w:rPr>
+                <w:b/>
+                <w:bCs/>
+                <w:color w:val="C00000"/>
+                <w:sz w:val="21"/>
+                <w:szCs w:val="21"/>
+              </w:rPr>
+              <w:t xml:space="preserve">→</w:t>
+            </w:r>
+            <w:r>
+              <w:tab/>
+            </w:r>
+            <w:r>
+              <w:rPr>
+                <w:b/>
+                <w:bCs/>
+                <w:sz w:val="21"/>
+                <w:szCs w:val="21"/>
+              </w:rPr>
+              <w:t xml:space="preserve">Targets:</w:t>
+            </w:r>
+            <w:r>
+              <w:rPr>
+                <w:sz w:val="21"/>
+                <w:szCs w:val="21"/>
+              </w:rPr>
+              <w:t xml:space="preserve"> $100 bn trade and $50 bn two-way investment by 2030 (Goyal)</w:t>
+            </w:r>
+          </w:p>
+          <w:p>
+            <w:pPr>
+              <w:tabs>
+                <w:tab w:val="left" w:pos="260"/>
+              </w:tabs>
+              <w:spacing w:after="0" w:before="40" w:line="280"/>
+              <w:ind w:left="260" w:hanging="260"/>
+            </w:pPr>
+            <w:r>
+              <w:rPr>
+                <w:b/>
+                <w:bCs/>
+                <w:color w:val="C00000"/>
+                <w:sz w:val="21"/>
+                <w:szCs w:val="21"/>
+              </w:rPr>
+              <w:t xml:space="preserve">→</w:t>
+            </w:r>
+            <w:r>
+              <w:tab/>
+            </w:r>
+            <w:r>
+              <w:rPr>
+                <w:b/>
+                <w:bCs/>
+                <w:sz w:val="21"/>
+                <w:szCs w:val="21"/>
+              </w:rPr>
+              <w:t xml:space="preserve">Cooperation:</w:t>
+            </w:r>
+            <w:r>
+              <w:rPr>
+                <w:sz w:val="21"/>
+                <w:szCs w:val="21"/>
+              </w:rPr>
+              <w:t xml:space="preserve"> rupee–rouble settlement, INSTC, rare earths (Murmansk), civil aviation (SJ-100), Northern Sea Route, labour mobility</w:t>
+            </w:r>
+          </w:p>
+          <w:p>
+            <w:pPr>
+              <w:tabs>
+                <w:tab w:val="left" w:pos="260"/>
+              </w:tabs>
+              <w:spacing w:after="0" w:before="40" w:line="280"/>
+              <w:ind w:left="260" w:hanging="260"/>
+            </w:pPr>
+            <w:r>
+              <w:rPr>
+                <w:b/>
+                <w:bCs/>
+                <w:color w:val="C00000"/>
+                <w:sz w:val="21"/>
+                <w:szCs w:val="21"/>
+              </w:rPr>
+              <w:t xml:space="preserve">→</w:t>
+            </w:r>
+            <w:r>
+              <w:tab/>
+            </w:r>
+            <w:r>
+              <w:rPr>
+                <w:b/>
+                <w:bCs/>
+                <w:sz w:val="21"/>
+                <w:szCs w:val="21"/>
+              </w:rPr>
+              <w:t xml:space="preserve">S-400:</w:t>
+            </w:r>
+            <w:r>
+              <w:rPr>
+                <w:sz w:val="21"/>
+                <w:szCs w:val="21"/>
+              </w:rPr>
+              <w:t xml:space="preserve"> four of five delivered ($5.43 bn, 2018 deal); fifth due Nov 2026</w:t>
+            </w:r>
+          </w:p>
+          <w:p>
+            <w:pPr>
+              <w:tabs>
+                <w:tab w:val="left" w:pos="260"/>
+              </w:tabs>
+              <w:spacing w:after="0" w:before="40" w:line="280"/>
+              <w:ind w:left="260" w:hanging="260"/>
+            </w:pPr>
+            <w:r>
+              <w:rPr>
+                <w:b/>
+                <w:bCs/>
+                <w:color w:val="C00000"/>
+                <w:sz w:val="21"/>
+                <w:szCs w:val="21"/>
+              </w:rPr>
+              <w:t xml:space="preserve">→</w:t>
+            </w:r>
+            <w:r>
+              <w:tab/>
+            </w:r>
+            <w:r>
+              <w:rPr>
+                <w:b/>
+                <w:bCs/>
+                <w:sz w:val="21"/>
+                <w:szCs w:val="21"/>
+              </w:rPr>
+              <w:t xml:space="preserve">Defence talks:</w:t>
+            </w:r>
+            <w:r>
+              <w:rPr>
+                <w:sz w:val="21"/>
+                <w:szCs w:val="21"/>
+              </w:rPr>
+              <w:t xml:space="preserve"> Su-57 jets, BrahMos upgrades, hints of technology sharing</w:t>
+            </w:r>
+          </w:p>
+          <w:p>
+            <w:pPr>
+              <w:tabs>
+                <w:tab w:val="left" w:pos="260"/>
+              </w:tabs>
+              <w:spacing w:after="0" w:before="40" w:line="280"/>
+              <w:ind w:left="260" w:hanging="260"/>
+            </w:pPr>
+            <w:r>
+              <w:rPr>
+                <w:b/>
+                <w:bCs/>
+                <w:color w:val="C00000"/>
+                <w:sz w:val="21"/>
+                <w:szCs w:val="21"/>
+              </w:rPr>
+              <w:t xml:space="preserve">→</w:t>
+            </w:r>
+            <w:r>
+              <w:tab/>
+            </w:r>
+            <w:r>
+              <w:rPr>
+                <w:b/>
+                <w:bCs/>
+                <w:sz w:val="21"/>
+                <w:szCs w:val="21"/>
+              </w:rPr>
+              <w:t xml:space="preserve">Diversification:</w:t>
+            </w:r>
+            <w:r>
+              <w:rPr>
+                <w:sz w:val="21"/>
+                <w:szCs w:val="21"/>
+              </w:rPr>
+              <w:t xml:space="preserve"> Russia's share of India's arms imports fell from 76% to 36% (decade to 2019–23); more buying from the US, France, Italy</w:t>
+            </w:r>
+          </w:p>
+          <w:p>
+            <w:pPr>
+              <w:tabs>
+                <w:tab w:val="left" w:pos="260"/>
+              </w:tabs>
+              <w:spacing w:after="0" w:before="40" w:line="280"/>
+              <w:ind w:left="260" w:hanging="260"/>
+            </w:pPr>
+            <w:r>
+              <w:rPr>
+                <w:b/>
+                <w:bCs/>
+                <w:color w:val="C00000"/>
+                <w:sz w:val="21"/>
+                <w:szCs w:val="21"/>
+              </w:rPr>
+              <w:t xml:space="preserve">→</w:t>
+            </w:r>
+            <w:r>
+              <w:tab/>
+            </w:r>
+            <w:r>
+              <w:rPr>
+                <w:b/>
+                <w:bCs/>
+                <w:sz w:val="21"/>
+                <w:szCs w:val="21"/>
+              </w:rPr>
+              <w:t xml:space="preserve">Energy:</w:t>
+            </w:r>
+            <w:r>
+              <w:rPr>
+                <w:sz w:val="21"/>
+                <w:szCs w:val="21"/>
+              </w:rPr>
+              <w:t xml:space="preserve"> India the world's second-largest buyer of Russian crude; new nuclear reactors under discussion</w:t>
+            </w:r>
+          </w:p>
+          <w:p>
+            <w:pPr>
+              <w:tabs>
+                <w:tab w:val="left" w:pos="260"/>
+              </w:tabs>
+              <w:spacing w:after="0" w:before="40" w:line="280"/>
+              <w:ind w:left="260" w:hanging="260"/>
+            </w:pPr>
+            <w:r>
+              <w:rPr>
+                <w:b/>
+                <w:bCs/>
+                <w:color w:val="C00000"/>
+                <w:sz w:val="21"/>
+                <w:szCs w:val="21"/>
+              </w:rPr>
+              <w:t xml:space="preserve">→</w:t>
+            </w:r>
+            <w:r>
+              <w:tab/>
+            </w:r>
+            <w:r>
+              <w:rPr>
+                <w:b/>
+                <w:bCs/>
+                <w:sz w:val="21"/>
+                <w:szCs w:val="21"/>
+              </w:rPr>
+              <w:t xml:space="preserve">US pressure:</w:t>
+            </w:r>
+            <w:r>
+              <w:rPr>
+                <w:sz w:val="21"/>
+                <w:szCs w:val="21"/>
+              </w:rPr>
+              <w:t xml:space="preserve"> 2025 tariffs and sanctions on Rosneft and Lukoil cut purchases for a time; Sanctioning Russia and Iran Act (2026) targets big energy buyers</w:t>
+            </w:r>
+          </w:p>
+        </w:tc>
+      </w:tr>
+      <w:tr>
+        <w:trPr>
+          <w:cantSplit/>
+        </w:trPr>
+        <w:tc>
+          <w:tcPr>
+            <w:tcW w:type="dxa" w:w="520"/>
+            <w:tcBorders>
+              <w:top w:val="single" w:color="BFBFBF" w:sz="4"/>
+              <w:left w:val="single" w:color="BFBFBF" w:sz="4"/>
+              <w:bottom w:val="single" w:color="BFBFBF" w:sz="4"/>
+              <w:right w:val="single" w:color="BFBFBF" w:sz="4"/>
+            </w:tcBorders>
+            <w:shd w:fill="F5F7FB" w:color="auto" w:val="clear"/>
+            <w:tcMar>
+              <w:top w:type="dxa" w:w="70"/>
+              <w:left w:type="dxa" w:w="100"/>
+              <w:bottom w:type="dxa" w:w="70"/>
+              <w:right w:type="dxa" w:w="100"/>
+            </w:tcMar>
+            <w:vAlign w:val="center"/>
+          </w:tcPr>
+          <w:p>
+            <w:pPr>
+              <w:spacing w:after="0" w:before="0" w:line="300"/>
+              <w:jc w:val="center"/>
+            </w:pPr>
+            <w:r>
+              <w:rPr>
+                <w:color w:val="7F7F7F"/>
+                <w:sz w:val="21"/>
+                <w:szCs w:val="21"/>
+              </w:rPr>
+              <w:t xml:space="preserve">4</w:t>
+            </w:r>
+          </w:p>
+        </w:tc>
+        <w:tc>
+          <w:tcPr>
+            <w:tcW w:type="dxa" w:w="2200"/>
+            <w:tcBorders>
+              <w:top w:val="single" w:color="BFBFBF" w:sz="4"/>
+              <w:left w:val="single" w:color="BFBFBF" w:sz="4"/>
+              <w:bottom w:val="single" w:color="BFBFBF" w:sz="4"/>
+              <w:right w:val="single" w:color="BFBFBF" w:sz="4"/>
+            </w:tcBorders>
+            <w:shd w:fill="F5F7FB" w:color="auto" w:val="clear"/>
+            <w:tcMar>
+              <w:top w:type="dxa" w:w="70"/>
+              <w:left w:type="dxa" w:w="100"/>
+              <w:bottom w:type="dxa" w:w="70"/>
+              <w:right w:type="dxa" w:w="100"/>
+            </w:tcMar>
+            <w:vAlign w:val="center"/>
+          </w:tcPr>
+          <w:p>
+            <w:pPr>
+              <w:spacing w:after="0" w:before="0" w:line="300"/>
+            </w:pPr>
+            <w:r>
+              <w:rPr>
+                <w:b/>
+                <w:bCs/>
+                <w:color w:val="1F3864"/>
+                <w:sz w:val="21"/>
+                <w:szCs w:val="21"/>
+              </w:rPr>
+              <w:t xml:space="preserve">Problems</w:t>
+            </w:r>
+          </w:p>
+        </w:tc>
+        <w:tc>
+          <w:tcPr>
+            <w:tcW w:type="dxa" w:w="7986"/>
+            <w:tcBorders>
+              <w:top w:val="single" w:color="BFBFBF" w:sz="4"/>
+              <w:left w:val="single" w:color="BFBFBF" w:sz="4"/>
+              <w:bottom w:val="single" w:color="BFBFBF" w:sz="4"/>
+              <w:right w:val="single" w:color="BFBFBF" w:sz="4"/>
+            </w:tcBorders>
+            <w:shd w:fill="F5F7FB" w:color="auto" w:val="clear"/>
+            <w:tcMar>
+              <w:top w:type="dxa" w:w="70"/>
+              <w:left w:type="dxa" w:w="100"/>
+              <w:bottom w:type="dxa" w:w="70"/>
+              <w:right w:type="dxa" w:w="100"/>
+            </w:tcMar>
+            <w:vAlign w:val="center"/>
+          </w:tcPr>
+          <w:p>
+            <w:pPr>
+              <w:tabs>
+                <w:tab w:val="left" w:pos="260"/>
+              </w:tabs>
+              <w:spacing w:after="0" w:before="0" w:line="280"/>
+              <w:ind w:left="260" w:hanging="260"/>
+            </w:pPr>
+            <w:r>
+              <w:rPr>
+                <w:b/>
+                <w:bCs/>
+                <w:color w:val="C00000"/>
+                <w:sz w:val="21"/>
+                <w:szCs w:val="21"/>
+              </w:rPr>
+              <w:t xml:space="preserve">→</w:t>
+            </w:r>
+            <w:r>
+              <w:tab/>
+            </w:r>
+            <w:r>
+              <w:rPr>
+                <w:b/>
+                <w:bCs/>
+                <w:sz w:val="21"/>
+                <w:szCs w:val="21"/>
+              </w:rPr>
+              <w:t xml:space="preserve">Ukraine war:</w:t>
+            </w:r>
+            <w:r>
+              <w:rPr>
+                <w:sz w:val="21"/>
+                <w:szCs w:val="21"/>
+              </w:rPr>
+              <w:t xml:space="preserve"> balancing Moscow, Washington and Europe</w:t>
+            </w:r>
+          </w:p>
+          <w:p>
+            <w:pPr>
+              <w:tabs>
+                <w:tab w:val="left" w:pos="260"/>
+              </w:tabs>
+              <w:spacing w:after="0" w:before="40" w:line="280"/>
+              <w:ind w:left="260" w:hanging="260"/>
+            </w:pPr>
+            <w:r>
+              <w:rPr>
+                <w:b/>
+                <w:bCs/>
+                <w:color w:val="C00000"/>
+                <w:sz w:val="21"/>
+                <w:szCs w:val="21"/>
+              </w:rPr>
+              <w:t xml:space="preserve">→</w:t>
+            </w:r>
+            <w:r>
+              <w:tab/>
+            </w:r>
+            <w:r>
+              <w:rPr>
+                <w:b/>
+                <w:bCs/>
+                <w:sz w:val="21"/>
+                <w:szCs w:val="21"/>
+              </w:rPr>
+              <w:t xml:space="preserve">Trade imbalance:</w:t>
+            </w:r>
+            <w:r>
+              <w:rPr>
+                <w:sz w:val="21"/>
+                <w:szCs w:val="21"/>
+              </w:rPr>
+              <w:t xml:space="preserve"> small Indian exports vs large oil imports</w:t>
+            </w:r>
+          </w:p>
+          <w:p>
+            <w:pPr>
+              <w:tabs>
+                <w:tab w:val="left" w:pos="260"/>
+              </w:tabs>
+              <w:spacing w:after="0" w:before="40" w:line="280"/>
+              <w:ind w:left="260" w:hanging="260"/>
+            </w:pPr>
+            <w:r>
+              <w:rPr>
+                <w:b/>
+                <w:bCs/>
+                <w:color w:val="C00000"/>
+                <w:sz w:val="21"/>
+                <w:szCs w:val="21"/>
+              </w:rPr>
+              <w:t xml:space="preserve">→</w:t>
+            </w:r>
+            <w:r>
+              <w:tab/>
+            </w:r>
+            <w:r>
+              <w:rPr>
+                <w:sz w:val="21"/>
+                <w:szCs w:val="21"/>
+              </w:rPr>
+              <w:t xml:space="preserve">US sanctions and secondary tariffs (CAATSA, Rosneft/Lukoil, new sanctions act)</w:t>
+            </w:r>
+          </w:p>
+          <w:p>
+            <w:pPr>
+              <w:tabs>
+                <w:tab w:val="left" w:pos="260"/>
+              </w:tabs>
+              <w:spacing w:after="0" w:before="40" w:line="280"/>
+              <w:ind w:left="260" w:hanging="260"/>
+            </w:pPr>
+            <w:r>
+              <w:rPr>
+                <w:b/>
+                <w:bCs/>
+                <w:color w:val="C00000"/>
+                <w:sz w:val="21"/>
+                <w:szCs w:val="21"/>
+              </w:rPr>
+              <w:t xml:space="preserve">→</w:t>
+            </w:r>
+            <w:r>
+              <w:tab/>
+            </w:r>
+            <w:r>
+              <w:rPr>
+                <w:sz w:val="21"/>
+                <w:szCs w:val="21"/>
+              </w:rPr>
+              <w:t xml:space="preserve">Payment and banking hurdles</w:t>
+            </w:r>
+          </w:p>
+          <w:p>
+            <w:pPr>
+              <w:tabs>
+                <w:tab w:val="left" w:pos="260"/>
+              </w:tabs>
+              <w:spacing w:after="0" w:before="40" w:line="280"/>
+              <w:ind w:left="260" w:hanging="260"/>
+            </w:pPr>
+            <w:r>
+              <w:rPr>
+                <w:b/>
+                <w:bCs/>
+                <w:color w:val="C00000"/>
+                <w:sz w:val="21"/>
+                <w:szCs w:val="21"/>
+              </w:rPr>
+              <w:t xml:space="preserve">→</w:t>
+            </w:r>
+            <w:r>
+              <w:tab/>
+            </w:r>
+            <w:r>
+              <w:rPr>
+                <w:sz w:val="21"/>
+                <w:szCs w:val="21"/>
+              </w:rPr>
+              <w:t xml:space="preserve">Delivery delays (S-400) and spares dependence</w:t>
+            </w:r>
+          </w:p>
+          <w:p>
+            <w:pPr>
+              <w:tabs>
+                <w:tab w:val="left" w:pos="260"/>
+              </w:tabs>
+              <w:spacing w:after="0" w:before="40" w:line="280"/>
+              <w:ind w:left="260" w:hanging="260"/>
+            </w:pPr>
+            <w:r>
+              <w:rPr>
+                <w:b/>
+                <w:bCs/>
+                <w:color w:val="C00000"/>
+                <w:sz w:val="21"/>
+                <w:szCs w:val="21"/>
+              </w:rPr>
+              <w:t xml:space="preserve">→</w:t>
+            </w:r>
+            <w:r>
+              <w:tab/>
+            </w:r>
+            <w:r>
+              <w:rPr>
+                <w:sz w:val="21"/>
+                <w:szCs w:val="21"/>
+              </w:rPr>
+              <w:t xml:space="preserve">Russia–China closeness; Russia's ties with Pakistan</w:t>
+            </w:r>
+          </w:p>
+          <w:p>
+            <w:pPr>
+              <w:tabs>
+                <w:tab w:val="left" w:pos="260"/>
+              </w:tabs>
+              <w:spacing w:after="0" w:before="40" w:line="280"/>
+              <w:ind w:left="260" w:hanging="260"/>
+            </w:pPr>
+            <w:r>
+              <w:rPr>
+                <w:b/>
+                <w:bCs/>
+                <w:color w:val="C00000"/>
+                <w:sz w:val="21"/>
+                <w:szCs w:val="21"/>
+              </w:rPr>
+              <w:t xml:space="preserve">→</w:t>
+            </w:r>
+            <w:r>
+              <w:tab/>
+            </w:r>
+            <w:r>
+              <w:rPr>
+                <w:sz w:val="21"/>
+                <w:szCs w:val="21"/>
+              </w:rPr>
+              <w:t xml:space="preserve">Russia's war-strained economy</w:t>
+            </w:r>
+          </w:p>
+          <w:p>
+            <w:pPr>
+              <w:tabs>
+                <w:tab w:val="left" w:pos="260"/>
+              </w:tabs>
+              <w:spacing w:after="0" w:before="40" w:line="280"/>
+              <w:ind w:left="260" w:hanging="260"/>
+            </w:pPr>
+            <w:r>
+              <w:rPr>
+                <w:b/>
+                <w:bCs/>
+                <w:color w:val="C00000"/>
+                <w:sz w:val="21"/>
+                <w:szCs w:val="21"/>
+              </w:rPr>
+              <w:t xml:space="preserve">→</w:t>
+            </w:r>
+            <w:r>
+              <w:tab/>
+            </w:r>
+            <w:r>
+              <w:rPr>
+                <w:sz w:val="21"/>
+                <w:szCs w:val="21"/>
+              </w:rPr>
+              <w:t xml:space="preserve">India's tilt to Western and indigenous defence suppliers</w:t>
+            </w:r>
+          </w:p>
+        </w:tc>
+      </w:tr>
+      <w:tr>
+        <w:trPr>
+          <w:cantSplit/>
+        </w:trPr>
+        <w:tc>
+          <w:tcPr>
+            <w:tcW w:type="dxa" w:w="520"/>
+            <w:tcBorders>
+              <w:top w:val="single" w:color="BFBFBF" w:sz="4"/>
+              <w:left w:val="single" w:color="BFBFBF" w:sz="4"/>
+              <w:bottom w:val="single" w:color="BFBFBF" w:sz="4"/>
+              <w:right w:val="single" w:color="BFBFBF" w:sz="4"/>
+            </w:tcBorders>
+            <w:tcMar>
+              <w:top w:type="dxa" w:w="70"/>
+              <w:left w:type="dxa" w:w="100"/>
+              <w:bottom w:type="dxa" w:w="70"/>
+              <w:right w:type="dxa" w:w="100"/>
+            </w:tcMar>
+            <w:vAlign w:val="center"/>
+          </w:tcPr>
+          <w:p>
+            <w:pPr>
+              <w:spacing w:after="0" w:before="0" w:line="300"/>
+              <w:jc w:val="center"/>
+            </w:pPr>
+            <w:r>
+              <w:rPr>
+                <w:color w:val="7F7F7F"/>
+                <w:sz w:val="21"/>
+                <w:szCs w:val="21"/>
+              </w:rPr>
+              <w:t xml:space="preserve">5</w:t>
+            </w:r>
+          </w:p>
+        </w:tc>
+        <w:tc>
+          <w:tcPr>
+            <w:tcW w:type="dxa" w:w="2200"/>
+            <w:tcBorders>
+              <w:top w:val="single" w:color="BFBFBF" w:sz="4"/>
+              <w:left w:val="single" w:color="BFBFBF" w:sz="4"/>
+              <w:bottom w:val="single" w:color="BFBFBF" w:sz="4"/>
+              <w:right w:val="single" w:color="BFBFBF" w:sz="4"/>
+            </w:tcBorders>
+            <w:tcMar>
+              <w:top w:type="dxa" w:w="70"/>
+              <w:left w:type="dxa" w:w="100"/>
+              <w:bottom w:type="dxa" w:w="70"/>
+              <w:right w:type="dxa" w:w="100"/>
+            </w:tcMar>
+            <w:vAlign w:val="center"/>
+          </w:tcPr>
+          <w:p>
+            <w:pPr>
+              <w:spacing w:after="0" w:before="0" w:line="300"/>
+            </w:pPr>
+            <w:r>
+              <w:rPr>
+                <w:b/>
+                <w:bCs/>
+                <w:color w:val="1F3864"/>
+                <w:sz w:val="21"/>
+                <w:szCs w:val="21"/>
+              </w:rPr>
+              <w:t xml:space="preserve">Solutions</w:t>
+            </w:r>
+          </w:p>
+        </w:tc>
+        <w:tc>
+          <w:tcPr>
+            <w:tcW w:type="dxa" w:w="7986"/>
+            <w:tcBorders>
+              <w:top w:val="single" w:color="BFBFBF" w:sz="4"/>
+              <w:left w:val="single" w:color="BFBFBF" w:sz="4"/>
+              <w:bottom w:val="single" w:color="BFBFBF" w:sz="4"/>
+              <w:right w:val="single" w:color="BFBFBF" w:sz="4"/>
+            </w:tcBorders>
+            <w:tcMar>
+              <w:top w:type="dxa" w:w="70"/>
+              <w:left w:type="dxa" w:w="100"/>
+              <w:bottom w:type="dxa" w:w="70"/>
+              <w:right w:type="dxa" w:w="100"/>
+            </w:tcMar>
+            <w:vAlign w:val="center"/>
+          </w:tcPr>
+          <w:p>
+            <w:pPr>
+              <w:tabs>
+                <w:tab w:val="left" w:pos="260"/>
+              </w:tabs>
+              <w:spacing w:after="0" w:before="0" w:line="280"/>
+              <w:ind w:left="260" w:hanging="260"/>
+            </w:pPr>
+            <w:r>
+              <w:rPr>
+                <w:b/>
+                <w:bCs/>
+                <w:color w:val="C00000"/>
+                <w:sz w:val="21"/>
+                <w:szCs w:val="21"/>
+              </w:rPr>
+              <w:t xml:space="preserve">→</w:t>
+            </w:r>
+            <w:r>
+              <w:tab/>
+            </w:r>
+            <w:r>
+              <w:rPr>
+                <w:b/>
+                <w:bCs/>
+                <w:sz w:val="21"/>
+                <w:szCs w:val="21"/>
+              </w:rPr>
+              <w:t xml:space="preserve">Strategic autonomy:</w:t>
+            </w:r>
+            <w:r>
+              <w:rPr>
+                <w:sz w:val="21"/>
+                <w:szCs w:val="21"/>
+              </w:rPr>
+              <w:t xml:space="preserve"> buy whatever serves India's energy and defence needs, and say so openly</w:t>
+            </w:r>
+          </w:p>
+          <w:p>
+            <w:pPr>
+              <w:tabs>
+                <w:tab w:val="left" w:pos="260"/>
+              </w:tabs>
+              <w:spacing w:after="0" w:before="40" w:line="280"/>
+              <w:ind w:left="260" w:hanging="260"/>
+            </w:pPr>
+            <w:r>
+              <w:rPr>
+                <w:b/>
+                <w:bCs/>
+                <w:color w:val="C00000"/>
+                <w:sz w:val="21"/>
+                <w:szCs w:val="21"/>
+              </w:rPr>
+              <w:t xml:space="preserve">→</w:t>
+            </w:r>
+            <w:r>
+              <w:tab/>
+            </w:r>
+            <w:r>
+              <w:rPr>
+                <w:sz w:val="21"/>
+                <w:szCs w:val="21"/>
+              </w:rPr>
+              <w:t xml:space="preserve">Move beyond oil and arms to manufacturing, localisation and technology transfer (Su-57, BrahMos, nuclear, critical minerals)</w:t>
+            </w:r>
+          </w:p>
+          <w:p>
+            <w:pPr>
+              <w:tabs>
+                <w:tab w:val="left" w:pos="260"/>
+              </w:tabs>
+              <w:spacing w:after="0" w:before="40" w:line="280"/>
+              <w:ind w:left="260" w:hanging="260"/>
+            </w:pPr>
+            <w:r>
+              <w:rPr>
+                <w:b/>
+                <w:bCs/>
+                <w:color w:val="C00000"/>
+                <w:sz w:val="21"/>
+                <w:szCs w:val="21"/>
+              </w:rPr>
+              <w:t xml:space="preserve">→</w:t>
+            </w:r>
+            <w:r>
+              <w:tab/>
+            </w:r>
+            <w:r>
+              <w:rPr>
+                <w:sz w:val="21"/>
+                <w:szCs w:val="21"/>
+              </w:rPr>
+              <w:t xml:space="preserve">Raise Indian exports (pharma, farm goods, engineering); settle in rupee–rouble and other currencies</w:t>
+            </w:r>
+          </w:p>
+          <w:p>
+            <w:pPr>
+              <w:tabs>
+                <w:tab w:val="left" w:pos="260"/>
+              </w:tabs>
+              <w:spacing w:after="0" w:before="40" w:line="280"/>
+              <w:ind w:left="260" w:hanging="260"/>
+            </w:pPr>
+            <w:r>
+              <w:rPr>
+                <w:b/>
+                <w:bCs/>
+                <w:color w:val="C00000"/>
+                <w:sz w:val="21"/>
+                <w:szCs w:val="21"/>
+              </w:rPr>
+              <w:t xml:space="preserve">→</w:t>
+            </w:r>
+            <w:r>
+              <w:tab/>
+            </w:r>
+            <w:r>
+              <w:rPr>
+                <w:sz w:val="21"/>
+                <w:szCs w:val="21"/>
+              </w:rPr>
+              <w:t xml:space="preserve">Develop INSTC, Chennai–Vladivostok and Arctic routes</w:t>
+            </w:r>
+          </w:p>
+          <w:p>
+            <w:pPr>
+              <w:tabs>
+                <w:tab w:val="left" w:pos="260"/>
+              </w:tabs>
+              <w:spacing w:after="0" w:before="40" w:line="280"/>
+              <w:ind w:left="260" w:hanging="260"/>
+            </w:pPr>
+            <w:r>
+              <w:rPr>
+                <w:b/>
+                <w:bCs/>
+                <w:color w:val="C00000"/>
+                <w:sz w:val="21"/>
+                <w:szCs w:val="21"/>
+              </w:rPr>
+              <w:t xml:space="preserve">→</w:t>
+            </w:r>
+            <w:r>
+              <w:tab/>
+            </w:r>
+            <w:r>
+              <w:rPr>
+                <w:sz w:val="21"/>
+                <w:szCs w:val="21"/>
+              </w:rPr>
+              <w:t xml:space="preserve">Keep diversifying defence imports; Make in India in defence</w:t>
+            </w:r>
+          </w:p>
+          <w:p>
+            <w:pPr>
+              <w:tabs>
+                <w:tab w:val="left" w:pos="260"/>
+              </w:tabs>
+              <w:spacing w:after="0" w:before="40" w:line="280"/>
+              <w:ind w:left="260" w:hanging="260"/>
+            </w:pPr>
+            <w:r>
+              <w:rPr>
+                <w:b/>
+                <w:bCs/>
+                <w:color w:val="C00000"/>
+                <w:sz w:val="21"/>
+                <w:szCs w:val="21"/>
+              </w:rPr>
+              <w:t xml:space="preserve">→</w:t>
+            </w:r>
+            <w:r>
+              <w:tab/>
+            </w:r>
+            <w:r>
+              <w:rPr>
+                <w:sz w:val="21"/>
+                <w:szCs w:val="21"/>
+              </w:rPr>
+              <w:t xml:space="preserve">Keep dialogue on Ukraine open; support peace diplomacy</w:t>
+            </w:r>
+          </w:p>
+          <w:p>
+            <w:pPr>
+              <w:tabs>
+                <w:tab w:val="left" w:pos="260"/>
+              </w:tabs>
+              <w:spacing w:after="0" w:before="40" w:line="280"/>
+              <w:ind w:left="260" w:hanging="260"/>
+            </w:pPr>
+            <w:r>
+              <w:rPr>
+                <w:b/>
+                <w:bCs/>
+                <w:color w:val="C00000"/>
+                <w:sz w:val="21"/>
+                <w:szCs w:val="21"/>
+              </w:rPr>
+              <w:t xml:space="preserve">→</w:t>
+            </w:r>
+            <w:r>
+              <w:tab/>
+            </w:r>
+            <w:r>
+              <w:rPr>
+                <w:b/>
+                <w:bCs/>
+                <w:sz w:val="21"/>
+                <w:szCs w:val="21"/>
+              </w:rPr>
+              <w:t xml:space="preserve">Handle the US carefully:</w:t>
+            </w:r>
+            <w:r>
+              <w:rPr>
+                <w:sz w:val="21"/>
+                <w:szCs w:val="21"/>
+              </w:rPr>
+              <w:t xml:space="preserve"> trade deal, clear red lines on energy security</w:t>
+            </w:r>
+          </w:p>
+        </w:tc>
+      </w:tr>
+      <w:tr>
+        <w:trPr>
+          <w:cantSplit/>
+        </w:trPr>
+        <w:tc>
+          <w:tcPr>
+            <w:tcW w:type="dxa" w:w="520"/>
+            <w:tcBorders>
+              <w:top w:val="single" w:color="BFBFBF" w:sz="4"/>
+              <w:left w:val="single" w:color="BFBFBF" w:sz="4"/>
+              <w:bottom w:val="single" w:color="BFBFBF" w:sz="4"/>
+              <w:right w:val="single" w:color="BFBFBF" w:sz="4"/>
+            </w:tcBorders>
+            <w:shd w:fill="F5F7FB" w:color="auto" w:val="clear"/>
+            <w:tcMar>
+              <w:top w:type="dxa" w:w="70"/>
+              <w:left w:type="dxa" w:w="100"/>
+              <w:bottom w:type="dxa" w:w="70"/>
+              <w:right w:type="dxa" w:w="100"/>
+            </w:tcMar>
+            <w:vAlign w:val="center"/>
+          </w:tcPr>
+          <w:p>
+            <w:pPr>
+              <w:spacing w:after="0" w:before="0" w:line="300"/>
+              <w:jc w:val="center"/>
+            </w:pPr>
+            <w:r>
+              <w:rPr>
+                <w:color w:val="7F7F7F"/>
+                <w:sz w:val="21"/>
+                <w:szCs w:val="21"/>
+              </w:rPr>
+              <w:t xml:space="preserve">6</w:t>
+            </w:r>
+          </w:p>
+        </w:tc>
+        <w:tc>
+          <w:tcPr>
+            <w:tcW w:type="dxa" w:w="2200"/>
+            <w:tcBorders>
+              <w:top w:val="single" w:color="BFBFBF" w:sz="4"/>
+              <w:left w:val="single" w:color="BFBFBF" w:sz="4"/>
+              <w:bottom w:val="single" w:color="BFBFBF" w:sz="4"/>
+              <w:right w:val="single" w:color="BFBFBF" w:sz="4"/>
+            </w:tcBorders>
+            <w:shd w:fill="F5F7FB" w:color="auto" w:val="clear"/>
+            <w:tcMar>
+              <w:top w:type="dxa" w:w="70"/>
+              <w:left w:type="dxa" w:w="100"/>
+              <w:bottom w:type="dxa" w:w="70"/>
+              <w:right w:type="dxa" w:w="100"/>
+            </w:tcMar>
+            <w:vAlign w:val="center"/>
+          </w:tcPr>
+          <w:p>
+            <w:pPr>
+              <w:spacing w:after="0" w:before="0" w:line="300"/>
+            </w:pPr>
+            <w:r>
+              <w:rPr>
+                <w:b/>
+                <w:bCs/>
+                <w:color w:val="1F3864"/>
+                <w:sz w:val="21"/>
+                <w:szCs w:val="21"/>
+              </w:rPr>
+              <w:t xml:space="preserve">Conclusion</w:t>
+            </w:r>
+          </w:p>
+        </w:tc>
+        <w:tc>
+          <w:tcPr>
+            <w:tcW w:type="dxa" w:w="7986"/>
+            <w:tcBorders>
+              <w:top w:val="single" w:color="BFBFBF" w:sz="4"/>
+              <w:left w:val="single" w:color="BFBFBF" w:sz="4"/>
+              <w:bottom w:val="single" w:color="BFBFBF" w:sz="4"/>
+              <w:right w:val="single" w:color="BFBFBF" w:sz="4"/>
+            </w:tcBorders>
+            <w:shd w:fill="F5F7FB" w:color="auto" w:val="clear"/>
+            <w:tcMar>
+              <w:top w:type="dxa" w:w="70"/>
+              <w:left w:type="dxa" w:w="100"/>
+              <w:bottom w:type="dxa" w:w="70"/>
+              <w:right w:type="dxa" w:w="100"/>
+            </w:tcMar>
+            <w:vAlign w:val="center"/>
+          </w:tcPr>
+          <w:p>
+            <w:pPr>
+              <w:tabs>
+                <w:tab w:val="left" w:pos="260"/>
+              </w:tabs>
+              <w:spacing w:after="0" w:before="0" w:line="280"/>
+              <w:ind w:left="260" w:hanging="260"/>
+            </w:pPr>
+            <w:r>
+              <w:rPr>
+                <w:b/>
+                <w:bCs/>
+                <w:color w:val="C00000"/>
+                <w:sz w:val="21"/>
+                <w:szCs w:val="21"/>
+              </w:rPr>
+              <w:t xml:space="preserve">→</w:t>
+            </w:r>
+            <w:r>
+              <w:tab/>
+            </w:r>
+            <w:r>
+              <w:rPr>
+                <w:sz w:val="21"/>
+                <w:szCs w:val="21"/>
+              </w:rPr>
+              <w:t xml:space="preserve">Time-tested ties built on trust</w:t>
+            </w:r>
+          </w:p>
+          <w:p>
+            <w:pPr>
+              <w:tabs>
+                <w:tab w:val="left" w:pos="260"/>
+              </w:tabs>
+              <w:spacing w:after="0" w:before="40" w:line="280"/>
+              <w:ind w:left="260" w:hanging="260"/>
+            </w:pPr>
+            <w:r>
+              <w:rPr>
+                <w:b/>
+                <w:bCs/>
+                <w:color w:val="C00000"/>
+                <w:sz w:val="21"/>
+                <w:szCs w:val="21"/>
+              </w:rPr>
+              <w:t xml:space="preserve">→</w:t>
+            </w:r>
+            <w:r>
+              <w:tab/>
+            </w:r>
+            <w:r>
+              <w:rPr>
+                <w:b/>
+                <w:bCs/>
+                <w:sz w:val="21"/>
+                <w:szCs w:val="21"/>
+              </w:rPr>
+              <w:t xml:space="preserve">Multi-alignment:</w:t>
+            </w:r>
+            <w:r>
+              <w:rPr>
+                <w:sz w:val="21"/>
+                <w:szCs w:val="21"/>
+              </w:rPr>
+              <w:t xml:space="preserve"> friends with all, dependent on none</w:t>
+            </w:r>
+          </w:p>
+          <w:p>
+            <w:pPr>
+              <w:tabs>
+                <w:tab w:val="left" w:pos="260"/>
+              </w:tabs>
+              <w:spacing w:after="0" w:before="40" w:line="280"/>
+              <w:ind w:left="260" w:hanging="260"/>
+            </w:pPr>
+            <w:r>
+              <w:rPr>
+                <w:b/>
+                <w:bCs/>
+                <w:color w:val="C00000"/>
+                <w:sz w:val="21"/>
+                <w:szCs w:val="21"/>
+              </w:rPr>
+              <w:t xml:space="preserve">→</w:t>
+            </w:r>
+            <w:r>
+              <w:tab/>
+            </w:r>
+            <w:r>
+              <w:rPr>
+                <w:sz w:val="21"/>
+                <w:szCs w:val="21"/>
+              </w:rPr>
+              <w:t xml:space="preserve">Strong ties with both Russia and the US are complementary, not contradictory, for a rising India</w:t>
             </w:r>
           </w:p>
         </w:tc>

</xml_diff>

<commit_message>
Add India–Iran Relations lecturette
Co-Authored-By: Claude Opus 5.5 <noreply@anthropic.com>
Claude-Session: https://claude.ai/code/session_01EyrV2JLtXrELkAF97b5fch
</commit_message>
<xml_diff>
--- a/SSB_Lecturettes.docx
+++ b/SSB_Lecturettes.docx
@@ -19480,6 +19480,1799 @@
                 <w:szCs w:val="21"/>
               </w:rPr>
               <w:t xml:space="preserve">Strong ties with both Russia and the US are complementary, not contradictory, for a rising India</w:t>
+            </w:r>
+          </w:p>
+        </w:tc>
+      </w:tr>
+    </w:tbl>
+    <w:p>
+      <w:pPr>
+        <w:pStyle w:val="Heading1"/>
+        <w:pageBreakBefore/>
+        <w:shd w:fill="1F3864" w:color="auto" w:val="clear"/>
+        <w:spacing w:after="160" w:before="0"/>
+        <w:ind w:left="100" w:right="100"/>
+      </w:pPr>
+      <w:r>
+        <w:t xml:space="preserve">Topic 12: India–Iran Relations</w:t>
+      </w:r>
+    </w:p>
+    <w:tbl>
+      <w:tblPr>
+        <w:tblW w:type="dxa" w:w="10706"/>
+        <w:tblBorders>
+          <w:top w:val="single" w:color="auto" w:sz="4"/>
+          <w:left w:val="single" w:color="auto" w:sz="4"/>
+          <w:bottom w:val="single" w:color="auto" w:sz="4"/>
+          <w:right w:val="single" w:color="auto" w:sz="4"/>
+          <w:insideH w:val="single" w:color="auto" w:sz="4"/>
+          <w:insideV w:val="single" w:color="auto" w:sz="4"/>
+        </w:tblBorders>
+      </w:tblPr>
+      <w:tblGrid>
+        <w:gridCol w:w="520"/>
+        <w:gridCol w:w="2200"/>
+        <w:gridCol w:w="7986"/>
+      </w:tblGrid>
+      <w:tr>
+        <w:trPr>
+          <w:tblHeader/>
+        </w:trPr>
+        <w:tc>
+          <w:tcPr>
+            <w:tcW w:type="dxa" w:w="520"/>
+            <w:tcBorders>
+              <w:top w:val="single" w:color="BFBFBF" w:sz="4"/>
+              <w:left w:val="single" w:color="BFBFBF" w:sz="4"/>
+              <w:bottom w:val="single" w:color="BFBFBF" w:sz="4"/>
+              <w:right w:val="single" w:color="BFBFBF" w:sz="4"/>
+            </w:tcBorders>
+            <w:shd w:fill="DCE3F0" w:color="auto" w:val="clear"/>
+            <w:tcMar>
+              <w:top w:type="dxa" w:w="70"/>
+              <w:left w:type="dxa" w:w="100"/>
+              <w:bottom w:type="dxa" w:w="70"/>
+              <w:right w:type="dxa" w:w="100"/>
+            </w:tcMar>
+            <w:vAlign w:val="center"/>
+          </w:tcPr>
+          <w:p>
+            <w:pPr>
+              <w:spacing w:after="0" w:before="0" w:line="300"/>
+              <w:jc w:val="center"/>
+            </w:pPr>
+            <w:r>
+              <w:rPr>
+                <w:b/>
+                <w:bCs/>
+                <w:sz w:val="21"/>
+                <w:szCs w:val="21"/>
+              </w:rPr>
+              <w:t xml:space="preserve">#</w:t>
+            </w:r>
+          </w:p>
+        </w:tc>
+        <w:tc>
+          <w:tcPr>
+            <w:tcW w:type="dxa" w:w="2200"/>
+            <w:tcBorders>
+              <w:top w:val="single" w:color="BFBFBF" w:sz="4"/>
+              <w:left w:val="single" w:color="BFBFBF" w:sz="4"/>
+              <w:bottom w:val="single" w:color="BFBFBF" w:sz="4"/>
+              <w:right w:val="single" w:color="BFBFBF" w:sz="4"/>
+            </w:tcBorders>
+            <w:shd w:fill="DCE3F0" w:color="auto" w:val="clear"/>
+            <w:tcMar>
+              <w:top w:type="dxa" w:w="70"/>
+              <w:left w:type="dxa" w:w="100"/>
+              <w:bottom w:type="dxa" w:w="70"/>
+              <w:right w:type="dxa" w:w="100"/>
+            </w:tcMar>
+            <w:vAlign w:val="center"/>
+          </w:tcPr>
+          <w:p>
+            <w:pPr>
+              <w:spacing w:after="0" w:before="0" w:line="300"/>
+            </w:pPr>
+            <w:r>
+              <w:rPr>
+                <w:b/>
+                <w:bCs/>
+                <w:sz w:val="21"/>
+                <w:szCs w:val="21"/>
+              </w:rPr>
+              <w:t xml:space="preserve">Stage</w:t>
+            </w:r>
+          </w:p>
+        </w:tc>
+        <w:tc>
+          <w:tcPr>
+            <w:tcW w:type="dxa" w:w="7986"/>
+            <w:tcBorders>
+              <w:top w:val="single" w:color="BFBFBF" w:sz="4"/>
+              <w:left w:val="single" w:color="BFBFBF" w:sz="4"/>
+              <w:bottom w:val="single" w:color="BFBFBF" w:sz="4"/>
+              <w:right w:val="single" w:color="BFBFBF" w:sz="4"/>
+            </w:tcBorders>
+            <w:shd w:fill="DCE3F0" w:color="auto" w:val="clear"/>
+            <w:tcMar>
+              <w:top w:type="dxa" w:w="70"/>
+              <w:left w:type="dxa" w:w="100"/>
+              <w:bottom w:type="dxa" w:w="70"/>
+              <w:right w:type="dxa" w:w="100"/>
+            </w:tcMar>
+            <w:vAlign w:val="center"/>
+          </w:tcPr>
+          <w:p>
+            <w:pPr>
+              <w:spacing w:after="0" w:before="0" w:line="300"/>
+            </w:pPr>
+            <w:r>
+              <w:rPr>
+                <w:b/>
+                <w:bCs/>
+                <w:sz w:val="21"/>
+                <w:szCs w:val="21"/>
+              </w:rPr>
+              <w:t xml:space="preserve">Flow</w:t>
+            </w:r>
+          </w:p>
+        </w:tc>
+      </w:tr>
+      <w:tr>
+        <w:trPr>
+          <w:cantSplit/>
+        </w:trPr>
+        <w:tc>
+          <w:tcPr>
+            <w:tcW w:type="dxa" w:w="520"/>
+            <w:tcBorders>
+              <w:top w:val="single" w:color="BFBFBF" w:sz="4"/>
+              <w:left w:val="single" w:color="BFBFBF" w:sz="4"/>
+              <w:bottom w:val="single" w:color="BFBFBF" w:sz="4"/>
+              <w:right w:val="single" w:color="BFBFBF" w:sz="4"/>
+            </w:tcBorders>
+            <w:tcMar>
+              <w:top w:type="dxa" w:w="70"/>
+              <w:left w:type="dxa" w:w="100"/>
+              <w:bottom w:type="dxa" w:w="70"/>
+              <w:right w:type="dxa" w:w="100"/>
+            </w:tcMar>
+            <w:vAlign w:val="center"/>
+          </w:tcPr>
+          <w:p>
+            <w:pPr>
+              <w:spacing w:after="0" w:before="0" w:line="300"/>
+              <w:jc w:val="center"/>
+            </w:pPr>
+            <w:r>
+              <w:rPr>
+                <w:color w:val="7F7F7F"/>
+                <w:sz w:val="21"/>
+                <w:szCs w:val="21"/>
+              </w:rPr>
+              <w:t xml:space="preserve">1</w:t>
+            </w:r>
+          </w:p>
+        </w:tc>
+        <w:tc>
+          <w:tcPr>
+            <w:tcW w:type="dxa" w:w="2200"/>
+            <w:tcBorders>
+              <w:top w:val="single" w:color="BFBFBF" w:sz="4"/>
+              <w:left w:val="single" w:color="BFBFBF" w:sz="4"/>
+              <w:bottom w:val="single" w:color="BFBFBF" w:sz="4"/>
+              <w:right w:val="single" w:color="BFBFBF" w:sz="4"/>
+            </w:tcBorders>
+            <w:tcMar>
+              <w:top w:type="dxa" w:w="70"/>
+              <w:left w:type="dxa" w:w="100"/>
+              <w:bottom w:type="dxa" w:w="70"/>
+              <w:right w:type="dxa" w:w="100"/>
+            </w:tcMar>
+            <w:vAlign w:val="center"/>
+          </w:tcPr>
+          <w:p>
+            <w:pPr>
+              <w:spacing w:after="0" w:before="0" w:line="300"/>
+            </w:pPr>
+            <w:r>
+              <w:rPr>
+                <w:b/>
+                <w:bCs/>
+                <w:color w:val="1F3864"/>
+                <w:sz w:val="21"/>
+                <w:szCs w:val="21"/>
+              </w:rPr>
+              <w:t xml:space="preserve">What is it</w:t>
+            </w:r>
+          </w:p>
+        </w:tc>
+        <w:tc>
+          <w:tcPr>
+            <w:tcW w:type="dxa" w:w="7986"/>
+            <w:tcBorders>
+              <w:top w:val="single" w:color="BFBFBF" w:sz="4"/>
+              <w:left w:val="single" w:color="BFBFBF" w:sz="4"/>
+              <w:bottom w:val="single" w:color="BFBFBF" w:sz="4"/>
+              <w:right w:val="single" w:color="BFBFBF" w:sz="4"/>
+            </w:tcBorders>
+            <w:tcMar>
+              <w:top w:type="dxa" w:w="70"/>
+              <w:left w:type="dxa" w:w="100"/>
+              <w:bottom w:type="dxa" w:w="70"/>
+              <w:right w:type="dxa" w:w="100"/>
+            </w:tcMar>
+            <w:vAlign w:val="center"/>
+          </w:tcPr>
+          <w:p>
+            <w:pPr>
+              <w:tabs>
+                <w:tab w:val="left" w:pos="260"/>
+              </w:tabs>
+              <w:spacing w:after="0" w:before="0" w:line="280"/>
+              <w:ind w:left="260" w:hanging="260"/>
+            </w:pPr>
+            <w:r>
+              <w:rPr>
+                <w:b/>
+                <w:bCs/>
+                <w:color w:val="C00000"/>
+                <w:sz w:val="21"/>
+                <w:szCs w:val="21"/>
+              </w:rPr>
+              <w:t xml:space="preserve">→</w:t>
+            </w:r>
+            <w:r>
+              <w:tab/>
+            </w:r>
+            <w:r>
+              <w:rPr>
+                <w:sz w:val="21"/>
+                <w:szCs w:val="21"/>
+              </w:rPr>
+              <w:t xml:space="preserve">Civilisational neighbours with ties of millennia (language, art, trade); diplomatic relations since 15 Mar 1950</w:t>
+            </w:r>
+          </w:p>
+          <w:p>
+            <w:pPr>
+              <w:tabs>
+                <w:tab w:val="left" w:pos="260"/>
+              </w:tabs>
+              <w:spacing w:after="0" w:before="40" w:line="280"/>
+              <w:ind w:left="260" w:hanging="260"/>
+            </w:pPr>
+            <w:r>
+              <w:rPr>
+                <w:b/>
+                <w:bCs/>
+                <w:color w:val="C00000"/>
+                <w:sz w:val="21"/>
+                <w:szCs w:val="21"/>
+              </w:rPr>
+              <w:t xml:space="preserve">→</w:t>
+            </w:r>
+            <w:r>
+              <w:tab/>
+            </w:r>
+            <w:r>
+              <w:rPr>
+                <w:sz w:val="21"/>
+                <w:szCs w:val="21"/>
+              </w:rPr>
+              <w:t xml:space="preserve">Gateway to Afghanistan and Central Asia via Chabahar and INSTC, bypassing Pakistan</w:t>
+            </w:r>
+          </w:p>
+          <w:p>
+            <w:pPr>
+              <w:tabs>
+                <w:tab w:val="left" w:pos="260"/>
+              </w:tabs>
+              <w:spacing w:after="0" w:before="40" w:line="280"/>
+              <w:ind w:left="260" w:hanging="260"/>
+            </w:pPr>
+            <w:r>
+              <w:rPr>
+                <w:b/>
+                <w:bCs/>
+                <w:color w:val="C00000"/>
+                <w:sz w:val="21"/>
+                <w:szCs w:val="21"/>
+              </w:rPr>
+              <w:t xml:space="preserve">→</w:t>
+            </w:r>
+            <w:r>
+              <w:tab/>
+            </w:r>
+            <w:r>
+              <w:rPr>
+                <w:sz w:val="21"/>
+                <w:szCs w:val="21"/>
+              </w:rPr>
+              <w:t xml:space="preserve">Historically a major oil supplier</w:t>
+            </w:r>
+          </w:p>
+          <w:p>
+            <w:pPr>
+              <w:tabs>
+                <w:tab w:val="left" w:pos="260"/>
+              </w:tabs>
+              <w:spacing w:after="0" w:before="40" w:line="280"/>
+              <w:ind w:left="260" w:hanging="260"/>
+            </w:pPr>
+            <w:r>
+              <w:rPr>
+                <w:b/>
+                <w:bCs/>
+                <w:color w:val="C00000"/>
+                <w:sz w:val="21"/>
+                <w:szCs w:val="21"/>
+              </w:rPr>
+              <w:t xml:space="preserve">→</w:t>
+            </w:r>
+            <w:r>
+              <w:tab/>
+            </w:r>
+            <w:r>
+              <w:rPr>
+                <w:sz w:val="21"/>
+                <w:szCs w:val="21"/>
+              </w:rPr>
+              <w:t xml:space="preserve">Complicated by Iran's ties with Pakistan and China, and by US sanctions</w:t>
+            </w:r>
+          </w:p>
+        </w:tc>
+      </w:tr>
+      <w:tr>
+        <w:trPr>
+          <w:cantSplit/>
+        </w:trPr>
+        <w:tc>
+          <w:tcPr>
+            <w:tcW w:type="dxa" w:w="520"/>
+            <w:tcBorders>
+              <w:top w:val="single" w:color="BFBFBF" w:sz="4"/>
+              <w:left w:val="single" w:color="BFBFBF" w:sz="4"/>
+              <w:bottom w:val="single" w:color="BFBFBF" w:sz="4"/>
+              <w:right w:val="single" w:color="BFBFBF" w:sz="4"/>
+            </w:tcBorders>
+            <w:shd w:fill="F5F7FB" w:color="auto" w:val="clear"/>
+            <w:tcMar>
+              <w:top w:type="dxa" w:w="70"/>
+              <w:left w:type="dxa" w:w="100"/>
+              <w:bottom w:type="dxa" w:w="70"/>
+              <w:right w:type="dxa" w:w="100"/>
+            </w:tcMar>
+            <w:vAlign w:val="center"/>
+          </w:tcPr>
+          <w:p>
+            <w:pPr>
+              <w:spacing w:after="0" w:before="0" w:line="300"/>
+              <w:jc w:val="center"/>
+            </w:pPr>
+            <w:r>
+              <w:rPr>
+                <w:color w:val="7F7F7F"/>
+                <w:sz w:val="21"/>
+                <w:szCs w:val="21"/>
+              </w:rPr>
+              <w:t xml:space="preserve">2</w:t>
+            </w:r>
+          </w:p>
+        </w:tc>
+        <w:tc>
+          <w:tcPr>
+            <w:tcW w:type="dxa" w:w="2200"/>
+            <w:tcBorders>
+              <w:top w:val="single" w:color="BFBFBF" w:sz="4"/>
+              <w:left w:val="single" w:color="BFBFBF" w:sz="4"/>
+              <w:bottom w:val="single" w:color="BFBFBF" w:sz="4"/>
+              <w:right w:val="single" w:color="BFBFBF" w:sz="4"/>
+            </w:tcBorders>
+            <w:shd w:fill="F5F7FB" w:color="auto" w:val="clear"/>
+            <w:tcMar>
+              <w:top w:type="dxa" w:w="70"/>
+              <w:left w:type="dxa" w:w="100"/>
+              <w:bottom w:type="dxa" w:w="70"/>
+              <w:right w:type="dxa" w:w="100"/>
+            </w:tcMar>
+            <w:vAlign w:val="center"/>
+          </w:tcPr>
+          <w:p>
+            <w:pPr>
+              <w:spacing w:after="0" w:before="0" w:line="300"/>
+            </w:pPr>
+            <w:r>
+              <w:rPr>
+                <w:b/>
+                <w:bCs/>
+                <w:color w:val="1F3864"/>
+                <w:sz w:val="21"/>
+                <w:szCs w:val="21"/>
+              </w:rPr>
+              <w:t xml:space="preserve">Why it matters</w:t>
+            </w:r>
+          </w:p>
+        </w:tc>
+        <w:tc>
+          <w:tcPr>
+            <w:tcW w:type="dxa" w:w="7986"/>
+            <w:tcBorders>
+              <w:top w:val="single" w:color="BFBFBF" w:sz="4"/>
+              <w:left w:val="single" w:color="BFBFBF" w:sz="4"/>
+              <w:bottom w:val="single" w:color="BFBFBF" w:sz="4"/>
+              <w:right w:val="single" w:color="BFBFBF" w:sz="4"/>
+            </w:tcBorders>
+            <w:shd w:fill="F5F7FB" w:color="auto" w:val="clear"/>
+            <w:tcMar>
+              <w:top w:type="dxa" w:w="70"/>
+              <w:left w:type="dxa" w:w="100"/>
+              <w:bottom w:type="dxa" w:w="70"/>
+              <w:right w:type="dxa" w:w="100"/>
+            </w:tcMar>
+            <w:vAlign w:val="center"/>
+          </w:tcPr>
+          <w:p>
+            <w:pPr>
+              <w:tabs>
+                <w:tab w:val="left" w:pos="260"/>
+              </w:tabs>
+              <w:spacing w:after="0" w:before="0" w:line="280"/>
+              <w:ind w:left="260" w:hanging="260"/>
+            </w:pPr>
+            <w:r>
+              <w:rPr>
+                <w:b/>
+                <w:bCs/>
+                <w:color w:val="C00000"/>
+                <w:sz w:val="21"/>
+                <w:szCs w:val="21"/>
+              </w:rPr>
+              <w:t xml:space="preserve">→</w:t>
+            </w:r>
+            <w:r>
+              <w:tab/>
+            </w:r>
+            <w:r>
+              <w:rPr>
+                <w:b/>
+                <w:bCs/>
+                <w:sz w:val="21"/>
+                <w:szCs w:val="21"/>
+              </w:rPr>
+              <w:t xml:space="preserve">Energy:</w:t>
+            </w:r>
+            <w:r>
+              <w:rPr>
+                <w:sz w:val="21"/>
+                <w:szCs w:val="21"/>
+              </w:rPr>
+              <w:t xml:space="preserve"> oil and gas security; the Gulf as India's lifeline</w:t>
+            </w:r>
+          </w:p>
+          <w:p>
+            <w:pPr>
+              <w:tabs>
+                <w:tab w:val="left" w:pos="260"/>
+              </w:tabs>
+              <w:spacing w:after="0" w:before="40" w:line="280"/>
+              <w:ind w:left="260" w:hanging="260"/>
+            </w:pPr>
+            <w:r>
+              <w:rPr>
+                <w:b/>
+                <w:bCs/>
+                <w:color w:val="C00000"/>
+                <w:sz w:val="21"/>
+                <w:szCs w:val="21"/>
+              </w:rPr>
+              <w:t xml:space="preserve">→</w:t>
+            </w:r>
+            <w:r>
+              <w:tab/>
+            </w:r>
+            <w:r>
+              <w:rPr>
+                <w:b/>
+                <w:bCs/>
+                <w:sz w:val="21"/>
+                <w:szCs w:val="21"/>
+              </w:rPr>
+              <w:t xml:space="preserve">Connectivity:</w:t>
+            </w:r>
+            <w:r>
+              <w:rPr>
+                <w:sz w:val="21"/>
+                <w:szCs w:val="21"/>
+              </w:rPr>
+              <w:t xml:space="preserve"> Chabahar and INSTC to Afghanistan, Central Asia and Russia</w:t>
+            </w:r>
+          </w:p>
+          <w:p>
+            <w:pPr>
+              <w:tabs>
+                <w:tab w:val="left" w:pos="260"/>
+              </w:tabs>
+              <w:spacing w:after="0" w:before="40" w:line="280"/>
+              <w:ind w:left="260" w:hanging="260"/>
+            </w:pPr>
+            <w:r>
+              <w:rPr>
+                <w:b/>
+                <w:bCs/>
+                <w:color w:val="C00000"/>
+                <w:sz w:val="21"/>
+                <w:szCs w:val="21"/>
+              </w:rPr>
+              <w:t xml:space="preserve">→</w:t>
+            </w:r>
+            <w:r>
+              <w:tab/>
+            </w:r>
+            <w:r>
+              <w:rPr>
+                <w:b/>
+                <w:bCs/>
+                <w:sz w:val="21"/>
+                <w:szCs w:val="21"/>
+              </w:rPr>
+              <w:t xml:space="preserve">Strategic:</w:t>
+            </w:r>
+            <w:r>
+              <w:rPr>
+                <w:sz w:val="21"/>
+                <w:szCs w:val="21"/>
+              </w:rPr>
+              <w:t xml:space="preserve"> counter to the China–Pakistan Gwadar axis</w:t>
+            </w:r>
+          </w:p>
+          <w:p>
+            <w:pPr>
+              <w:tabs>
+                <w:tab w:val="left" w:pos="260"/>
+              </w:tabs>
+              <w:spacing w:after="0" w:before="40" w:line="280"/>
+              <w:ind w:left="260" w:hanging="260"/>
+            </w:pPr>
+            <w:r>
+              <w:rPr>
+                <w:b/>
+                <w:bCs/>
+                <w:color w:val="C00000"/>
+                <w:sz w:val="21"/>
+                <w:szCs w:val="21"/>
+              </w:rPr>
+              <w:t xml:space="preserve">→</w:t>
+            </w:r>
+            <w:r>
+              <w:tab/>
+            </w:r>
+            <w:r>
+              <w:rPr>
+                <w:b/>
+                <w:bCs/>
+                <w:sz w:val="21"/>
+                <w:szCs w:val="21"/>
+              </w:rPr>
+              <w:t xml:space="preserve">Diaspora and trade:</w:t>
+            </w:r>
+            <w:r>
+              <w:rPr>
+                <w:sz w:val="21"/>
+                <w:szCs w:val="21"/>
+              </w:rPr>
+              <w:t xml:space="preserve"> about 9 million Indians in the Gulf; Hormuz shipping</w:t>
+            </w:r>
+          </w:p>
+          <w:p>
+            <w:pPr>
+              <w:tabs>
+                <w:tab w:val="left" w:pos="260"/>
+              </w:tabs>
+              <w:spacing w:after="0" w:before="40" w:line="280"/>
+              <w:ind w:left="260" w:hanging="260"/>
+            </w:pPr>
+            <w:r>
+              <w:rPr>
+                <w:b/>
+                <w:bCs/>
+                <w:color w:val="C00000"/>
+                <w:sz w:val="21"/>
+                <w:szCs w:val="21"/>
+              </w:rPr>
+              <w:t xml:space="preserve">→</w:t>
+            </w:r>
+            <w:r>
+              <w:tab/>
+            </w:r>
+            <w:r>
+              <w:rPr>
+                <w:b/>
+                <w:bCs/>
+                <w:sz w:val="21"/>
+                <w:szCs w:val="21"/>
+              </w:rPr>
+              <w:t xml:space="preserve">Balance:</w:t>
+            </w:r>
+            <w:r>
+              <w:rPr>
+                <w:sz w:val="21"/>
+                <w:szCs w:val="21"/>
+              </w:rPr>
+              <w:t xml:space="preserve"> India's ties with Gulf Arabs, Israel, the US and Iran all meet here</w:t>
+            </w:r>
+          </w:p>
+        </w:tc>
+      </w:tr>
+      <w:tr>
+        <w:trPr>
+          <w:cantSplit/>
+        </w:trPr>
+        <w:tc>
+          <w:tcPr>
+            <w:tcW w:type="dxa" w:w="520"/>
+            <w:tcBorders>
+              <w:top w:val="single" w:color="BFBFBF" w:sz="4"/>
+              <w:left w:val="single" w:color="BFBFBF" w:sz="4"/>
+              <w:bottom w:val="single" w:color="BFBFBF" w:sz="4"/>
+              <w:right w:val="single" w:color="BFBFBF" w:sz="4"/>
+            </w:tcBorders>
+            <w:tcMar>
+              <w:top w:type="dxa" w:w="70"/>
+              <w:left w:type="dxa" w:w="100"/>
+              <w:bottom w:type="dxa" w:w="70"/>
+              <w:right w:type="dxa" w:w="100"/>
+            </w:tcMar>
+            <w:vAlign w:val="center"/>
+          </w:tcPr>
+          <w:p>
+            <w:pPr>
+              <w:spacing w:after="0" w:before="0" w:line="300"/>
+              <w:jc w:val="center"/>
+            </w:pPr>
+            <w:r>
+              <w:rPr>
+                <w:color w:val="7F7F7F"/>
+                <w:sz w:val="21"/>
+                <w:szCs w:val="21"/>
+              </w:rPr>
+              <w:t xml:space="preserve">3</w:t>
+            </w:r>
+          </w:p>
+        </w:tc>
+        <w:tc>
+          <w:tcPr>
+            <w:tcW w:type="dxa" w:w="2200"/>
+            <w:tcBorders>
+              <w:top w:val="single" w:color="BFBFBF" w:sz="4"/>
+              <w:left w:val="single" w:color="BFBFBF" w:sz="4"/>
+              <w:bottom w:val="single" w:color="BFBFBF" w:sz="4"/>
+              <w:right w:val="single" w:color="BFBFBF" w:sz="4"/>
+            </w:tcBorders>
+            <w:tcMar>
+              <w:top w:type="dxa" w:w="70"/>
+              <w:left w:type="dxa" w:w="100"/>
+              <w:bottom w:type="dxa" w:w="70"/>
+              <w:right w:type="dxa" w:w="100"/>
+            </w:tcMar>
+            <w:vAlign w:val="center"/>
+          </w:tcPr>
+          <w:p>
+            <w:pPr>
+              <w:spacing w:after="0" w:before="0" w:line="300"/>
+            </w:pPr>
+            <w:r>
+              <w:rPr>
+                <w:b/>
+                <w:bCs/>
+                <w:color w:val="1F3864"/>
+                <w:sz w:val="21"/>
+                <w:szCs w:val="21"/>
+              </w:rPr>
+              <w:t xml:space="preserve">Current status (Oct 2026)</w:t>
+            </w:r>
+          </w:p>
+        </w:tc>
+        <w:tc>
+          <w:tcPr>
+            <w:tcW w:type="dxa" w:w="7986"/>
+            <w:tcBorders>
+              <w:top w:val="single" w:color="BFBFBF" w:sz="4"/>
+              <w:left w:val="single" w:color="BFBFBF" w:sz="4"/>
+              <w:bottom w:val="single" w:color="BFBFBF" w:sz="4"/>
+              <w:right w:val="single" w:color="BFBFBF" w:sz="4"/>
+            </w:tcBorders>
+            <w:tcMar>
+              <w:top w:type="dxa" w:w="70"/>
+              <w:left w:type="dxa" w:w="100"/>
+              <w:bottom w:type="dxa" w:w="70"/>
+              <w:right w:type="dxa" w:w="100"/>
+            </w:tcMar>
+            <w:vAlign w:val="center"/>
+          </w:tcPr>
+          <w:p>
+            <w:pPr>
+              <w:tabs>
+                <w:tab w:val="left" w:pos="260"/>
+              </w:tabs>
+              <w:spacing w:after="0" w:before="0" w:line="280"/>
+              <w:ind w:left="260" w:hanging="260"/>
+            </w:pPr>
+            <w:r>
+              <w:rPr>
+                <w:b/>
+                <w:bCs/>
+                <w:color w:val="C00000"/>
+                <w:sz w:val="21"/>
+                <w:szCs w:val="21"/>
+              </w:rPr>
+              <w:t xml:space="preserve">→</w:t>
+            </w:r>
+            <w:r>
+              <w:tab/>
+            </w:r>
+            <w:r>
+              <w:rPr>
+                <w:b/>
+                <w:bCs/>
+                <w:sz w:val="21"/>
+                <w:szCs w:val="21"/>
+              </w:rPr>
+              <w:t xml:space="preserve">Iran war:</w:t>
+            </w:r>
+            <w:r>
+              <w:rPr>
+                <w:sz w:val="21"/>
+                <w:szCs w:val="21"/>
+              </w:rPr>
+              <w:t xml:space="preserve"> US and Israel struck Iran (28 Feb 2026); Iran closed Hormuz; US naval blockade; ceasefire repeatedly broken</w:t>
+            </w:r>
+          </w:p>
+          <w:p>
+            <w:pPr>
+              <w:tabs>
+                <w:tab w:val="left" w:pos="260"/>
+              </w:tabs>
+              <w:spacing w:after="0" w:before="40" w:line="280"/>
+              <w:ind w:left="260" w:hanging="260"/>
+            </w:pPr>
+            <w:r>
+              <w:rPr>
+                <w:b/>
+                <w:bCs/>
+                <w:color w:val="C00000"/>
+                <w:sz w:val="21"/>
+                <w:szCs w:val="21"/>
+              </w:rPr>
+              <w:t xml:space="preserve">→</w:t>
+            </w:r>
+            <w:r>
+              <w:tab/>
+            </w:r>
+            <w:r>
+              <w:rPr>
+                <w:b/>
+                <w:bCs/>
+                <w:sz w:val="21"/>
+                <w:szCs w:val="21"/>
+              </w:rPr>
+              <w:t xml:space="preserve">India's stand:</w:t>
+            </w:r>
+            <w:r>
+              <w:rPr>
+                <w:sz w:val="21"/>
+                <w:szCs w:val="21"/>
+              </w:rPr>
+              <w:t xml:space="preserve"> neutral; condemned strikes on US bases without naming Iran; called for a peaceful solution</w:t>
+            </w:r>
+          </w:p>
+          <w:p>
+            <w:pPr>
+              <w:tabs>
+                <w:tab w:val="left" w:pos="260"/>
+              </w:tabs>
+              <w:spacing w:after="0" w:before="40" w:line="280"/>
+              <w:ind w:left="260" w:hanging="260"/>
+            </w:pPr>
+            <w:r>
+              <w:rPr>
+                <w:b/>
+                <w:bCs/>
+                <w:color w:val="C00000"/>
+                <w:sz w:val="21"/>
+                <w:szCs w:val="21"/>
+              </w:rPr>
+              <w:t xml:space="preserve">→</w:t>
+            </w:r>
+            <w:r>
+              <w:tab/>
+            </w:r>
+            <w:r>
+              <w:rPr>
+                <w:b/>
+                <w:bCs/>
+                <w:sz w:val="21"/>
+                <w:szCs w:val="21"/>
+              </w:rPr>
+              <w:t xml:space="preserve">Energy crisis:</w:t>
+            </w:r>
+            <w:r>
+              <w:rPr>
+                <w:sz w:val="21"/>
+                <w:szCs w:val="21"/>
+              </w:rPr>
+              <w:t xml:space="preserve"> Hormuz closure caused LPG shortage and protests at home</w:t>
+            </w:r>
+          </w:p>
+          <w:p>
+            <w:pPr>
+              <w:tabs>
+                <w:tab w:val="left" w:pos="260"/>
+              </w:tabs>
+              <w:spacing w:after="0" w:before="40" w:line="280"/>
+              <w:ind w:left="260" w:hanging="260"/>
+            </w:pPr>
+            <w:r>
+              <w:rPr>
+                <w:b/>
+                <w:bCs/>
+                <w:color w:val="C00000"/>
+                <w:sz w:val="21"/>
+                <w:szCs w:val="21"/>
+              </w:rPr>
+              <w:t xml:space="preserve">→</w:t>
+            </w:r>
+            <w:r>
+              <w:tab/>
+            </w:r>
+            <w:r>
+              <w:rPr>
+                <w:b/>
+                <w:bCs/>
+                <w:sz w:val="21"/>
+                <w:szCs w:val="21"/>
+              </w:rPr>
+              <w:t xml:space="preserve">Shipping:</w:t>
+            </w:r>
+            <w:r>
+              <w:rPr>
+                <w:sz w:val="21"/>
+                <w:szCs w:val="21"/>
+              </w:rPr>
+              <w:t xml:space="preserve"> Iran fired on two Indian ships (Apr) and seized an India-bound ship; at least 3 Indian sailors killed in a US strike on a tanker off Oman (12 Jun)</w:t>
+            </w:r>
+          </w:p>
+          <w:p>
+            <w:pPr>
+              <w:tabs>
+                <w:tab w:val="left" w:pos="260"/>
+              </w:tabs>
+              <w:spacing w:after="0" w:before="40" w:line="280"/>
+              <w:ind w:left="260" w:hanging="260"/>
+            </w:pPr>
+            <w:r>
+              <w:rPr>
+                <w:b/>
+                <w:bCs/>
+                <w:color w:val="C00000"/>
+                <w:sz w:val="21"/>
+                <w:szCs w:val="21"/>
+              </w:rPr>
+              <w:t xml:space="preserve">→</w:t>
+            </w:r>
+            <w:r>
+              <w:tab/>
+            </w:r>
+            <w:r>
+              <w:rPr>
+                <w:b/>
+                <w:bCs/>
+                <w:sz w:val="21"/>
+                <w:szCs w:val="21"/>
+              </w:rPr>
+              <w:t xml:space="preserve">Chabahar:</w:t>
+            </w:r>
+            <w:r>
+              <w:rPr>
+                <w:sz w:val="21"/>
+                <w:szCs w:val="21"/>
+              </w:rPr>
+              <w:t xml:space="preserve"> hit by US strikes (Jul 2026); India reportedly exited the project amid US sanctions</w:t>
+            </w:r>
+          </w:p>
+          <w:p>
+            <w:pPr>
+              <w:tabs>
+                <w:tab w:val="left" w:pos="260"/>
+              </w:tabs>
+              <w:spacing w:after="0" w:before="40" w:line="280"/>
+              <w:ind w:left="260" w:hanging="260"/>
+            </w:pPr>
+            <w:r>
+              <w:rPr>
+                <w:b/>
+                <w:bCs/>
+                <w:color w:val="C00000"/>
+                <w:sz w:val="21"/>
+                <w:szCs w:val="21"/>
+              </w:rPr>
+              <w:t xml:space="preserve">→</w:t>
+            </w:r>
+            <w:r>
+              <w:tab/>
+            </w:r>
+            <w:r>
+              <w:rPr>
+                <w:b/>
+                <w:bCs/>
+                <w:sz w:val="21"/>
+                <w:szCs w:val="21"/>
+              </w:rPr>
+              <w:t xml:space="preserve">Diplomacy:</w:t>
+            </w:r>
+            <w:r>
+              <w:rPr>
+                <w:sz w:val="21"/>
+                <w:szCs w:val="21"/>
+              </w:rPr>
+              <w:t xml:space="preserve"> Pezeshkian met Modi at BRICS, New Delhi (11 Sep) and earlier at SCO, Bishkek; Araghchi briefed Jaishankar at UNGA on Iran–Oman talks for safe Hormuz shipping (26 Sep)</w:t>
+            </w:r>
+          </w:p>
+          <w:p>
+            <w:pPr>
+              <w:tabs>
+                <w:tab w:val="left" w:pos="260"/>
+              </w:tabs>
+              <w:spacing w:after="0" w:before="40" w:line="280"/>
+              <w:ind w:left="260" w:hanging="260"/>
+            </w:pPr>
+            <w:r>
+              <w:rPr>
+                <w:b/>
+                <w:bCs/>
+                <w:color w:val="C00000"/>
+                <w:sz w:val="21"/>
+                <w:szCs w:val="21"/>
+              </w:rPr>
+              <w:t xml:space="preserve">→</w:t>
+            </w:r>
+            <w:r>
+              <w:tab/>
+            </w:r>
+            <w:r>
+              <w:rPr>
+                <w:sz w:val="21"/>
+                <w:szCs w:val="21"/>
+              </w:rPr>
+              <w:t xml:space="preserve">MoS Pabitra Margherita at Khamenei's funeral (3 Jul)</w:t>
+            </w:r>
+          </w:p>
+          <w:p>
+            <w:pPr>
+              <w:tabs>
+                <w:tab w:val="left" w:pos="260"/>
+              </w:tabs>
+              <w:spacing w:after="0" w:before="40" w:line="280"/>
+              <w:ind w:left="260" w:hanging="260"/>
+            </w:pPr>
+            <w:r>
+              <w:rPr>
+                <w:b/>
+                <w:bCs/>
+                <w:color w:val="C00000"/>
+                <w:sz w:val="21"/>
+                <w:szCs w:val="21"/>
+              </w:rPr>
+              <w:t xml:space="preserve">→</w:t>
+            </w:r>
+            <w:r>
+              <w:tab/>
+            </w:r>
+            <w:r>
+              <w:rPr>
+                <w:sz w:val="21"/>
+                <w:szCs w:val="21"/>
+              </w:rPr>
+              <w:t xml:space="preserve">Pakistan the main mediator on a US–Iran memorandum (Jun)</w:t>
+            </w:r>
+          </w:p>
+        </w:tc>
+      </w:tr>
+      <w:tr>
+        <w:trPr>
+          <w:cantSplit/>
+        </w:trPr>
+        <w:tc>
+          <w:tcPr>
+            <w:tcW w:type="dxa" w:w="520"/>
+            <w:tcBorders>
+              <w:top w:val="single" w:color="BFBFBF" w:sz="4"/>
+              <w:left w:val="single" w:color="BFBFBF" w:sz="4"/>
+              <w:bottom w:val="single" w:color="BFBFBF" w:sz="4"/>
+              <w:right w:val="single" w:color="BFBFBF" w:sz="4"/>
+            </w:tcBorders>
+            <w:shd w:fill="F5F7FB" w:color="auto" w:val="clear"/>
+            <w:tcMar>
+              <w:top w:type="dxa" w:w="70"/>
+              <w:left w:type="dxa" w:w="100"/>
+              <w:bottom w:type="dxa" w:w="70"/>
+              <w:right w:type="dxa" w:w="100"/>
+            </w:tcMar>
+            <w:vAlign w:val="center"/>
+          </w:tcPr>
+          <w:p>
+            <w:pPr>
+              <w:spacing w:after="0" w:before="0" w:line="300"/>
+              <w:jc w:val="center"/>
+            </w:pPr>
+            <w:r>
+              <w:rPr>
+                <w:color w:val="7F7F7F"/>
+                <w:sz w:val="21"/>
+                <w:szCs w:val="21"/>
+              </w:rPr>
+              <w:t xml:space="preserve">4</w:t>
+            </w:r>
+          </w:p>
+        </w:tc>
+        <w:tc>
+          <w:tcPr>
+            <w:tcW w:type="dxa" w:w="2200"/>
+            <w:tcBorders>
+              <w:top w:val="single" w:color="BFBFBF" w:sz="4"/>
+              <w:left w:val="single" w:color="BFBFBF" w:sz="4"/>
+              <w:bottom w:val="single" w:color="BFBFBF" w:sz="4"/>
+              <w:right w:val="single" w:color="BFBFBF" w:sz="4"/>
+            </w:tcBorders>
+            <w:shd w:fill="F5F7FB" w:color="auto" w:val="clear"/>
+            <w:tcMar>
+              <w:top w:type="dxa" w:w="70"/>
+              <w:left w:type="dxa" w:w="100"/>
+              <w:bottom w:type="dxa" w:w="70"/>
+              <w:right w:type="dxa" w:w="100"/>
+            </w:tcMar>
+            <w:vAlign w:val="center"/>
+          </w:tcPr>
+          <w:p>
+            <w:pPr>
+              <w:spacing w:after="0" w:before="0" w:line="300"/>
+            </w:pPr>
+            <w:r>
+              <w:rPr>
+                <w:b/>
+                <w:bCs/>
+                <w:color w:val="1F3864"/>
+                <w:sz w:val="21"/>
+                <w:szCs w:val="21"/>
+              </w:rPr>
+              <w:t xml:space="preserve">Problems</w:t>
+            </w:r>
+          </w:p>
+        </w:tc>
+        <w:tc>
+          <w:tcPr>
+            <w:tcW w:type="dxa" w:w="7986"/>
+            <w:tcBorders>
+              <w:top w:val="single" w:color="BFBFBF" w:sz="4"/>
+              <w:left w:val="single" w:color="BFBFBF" w:sz="4"/>
+              <w:bottom w:val="single" w:color="BFBFBF" w:sz="4"/>
+              <w:right w:val="single" w:color="BFBFBF" w:sz="4"/>
+            </w:tcBorders>
+            <w:shd w:fill="F5F7FB" w:color="auto" w:val="clear"/>
+            <w:tcMar>
+              <w:top w:type="dxa" w:w="70"/>
+              <w:left w:type="dxa" w:w="100"/>
+              <w:bottom w:type="dxa" w:w="70"/>
+              <w:right w:type="dxa" w:w="100"/>
+            </w:tcMar>
+            <w:vAlign w:val="center"/>
+          </w:tcPr>
+          <w:p>
+            <w:pPr>
+              <w:tabs>
+                <w:tab w:val="left" w:pos="260"/>
+              </w:tabs>
+              <w:spacing w:after="0" w:before="0" w:line="280"/>
+              <w:ind w:left="260" w:hanging="260"/>
+            </w:pPr>
+            <w:r>
+              <w:rPr>
+                <w:b/>
+                <w:bCs/>
+                <w:color w:val="C00000"/>
+                <w:sz w:val="21"/>
+                <w:szCs w:val="21"/>
+              </w:rPr>
+              <w:t xml:space="preserve">→</w:t>
+            </w:r>
+            <w:r>
+              <w:tab/>
+            </w:r>
+            <w:r>
+              <w:rPr>
+                <w:b/>
+                <w:bCs/>
+                <w:sz w:val="21"/>
+                <w:szCs w:val="21"/>
+              </w:rPr>
+              <w:t xml:space="preserve">Energy shock:</w:t>
+            </w:r>
+            <w:r>
+              <w:rPr>
+                <w:sz w:val="21"/>
+                <w:szCs w:val="21"/>
+              </w:rPr>
+              <w:t xml:space="preserve"> Hormuz closure, price spike, LPG shortage</w:t>
+            </w:r>
+          </w:p>
+          <w:p>
+            <w:pPr>
+              <w:tabs>
+                <w:tab w:val="left" w:pos="260"/>
+              </w:tabs>
+              <w:spacing w:after="0" w:before="40" w:line="280"/>
+              <w:ind w:left="260" w:hanging="260"/>
+            </w:pPr>
+            <w:r>
+              <w:rPr>
+                <w:b/>
+                <w:bCs/>
+                <w:color w:val="C00000"/>
+                <w:sz w:val="21"/>
+                <w:szCs w:val="21"/>
+              </w:rPr>
+              <w:t xml:space="preserve">→</w:t>
+            </w:r>
+            <w:r>
+              <w:tab/>
+            </w:r>
+            <w:r>
+              <w:rPr>
+                <w:sz w:val="21"/>
+                <w:szCs w:val="21"/>
+              </w:rPr>
+              <w:t xml:space="preserve">Safety of Indian sailors and about 9 million Indians in the Gulf</w:t>
+            </w:r>
+          </w:p>
+          <w:p>
+            <w:pPr>
+              <w:tabs>
+                <w:tab w:val="left" w:pos="260"/>
+              </w:tabs>
+              <w:spacing w:after="0" w:before="40" w:line="280"/>
+              <w:ind w:left="260" w:hanging="260"/>
+            </w:pPr>
+            <w:r>
+              <w:rPr>
+                <w:b/>
+                <w:bCs/>
+                <w:color w:val="C00000"/>
+                <w:sz w:val="21"/>
+                <w:szCs w:val="21"/>
+              </w:rPr>
+              <w:t xml:space="preserve">→</w:t>
+            </w:r>
+            <w:r>
+              <w:tab/>
+            </w:r>
+            <w:r>
+              <w:rPr>
+                <w:sz w:val="21"/>
+                <w:szCs w:val="21"/>
+              </w:rPr>
+              <w:t xml:space="preserve">Chabahar and INSTC stalled by war and sanctions (about $500 mn exposed)</w:t>
+            </w:r>
+          </w:p>
+          <w:p>
+            <w:pPr>
+              <w:tabs>
+                <w:tab w:val="left" w:pos="260"/>
+              </w:tabs>
+              <w:spacing w:after="0" w:before="40" w:line="280"/>
+              <w:ind w:left="260" w:hanging="260"/>
+            </w:pPr>
+            <w:r>
+              <w:rPr>
+                <w:b/>
+                <w:bCs/>
+                <w:color w:val="C00000"/>
+                <w:sz w:val="21"/>
+                <w:szCs w:val="21"/>
+              </w:rPr>
+              <w:t xml:space="preserve">→</w:t>
+            </w:r>
+            <w:r>
+              <w:tab/>
+            </w:r>
+            <w:r>
+              <w:rPr>
+                <w:sz w:val="21"/>
+                <w:szCs w:val="21"/>
+              </w:rPr>
+              <w:t xml:space="preserve">US pressure vs Iran ties; criticism at home over neutrality</w:t>
+            </w:r>
+          </w:p>
+          <w:p>
+            <w:pPr>
+              <w:tabs>
+                <w:tab w:val="left" w:pos="260"/>
+              </w:tabs>
+              <w:spacing w:after="0" w:before="40" w:line="280"/>
+              <w:ind w:left="260" w:hanging="260"/>
+            </w:pPr>
+            <w:r>
+              <w:rPr>
+                <w:b/>
+                <w:bCs/>
+                <w:color w:val="C00000"/>
+                <w:sz w:val="21"/>
+                <w:szCs w:val="21"/>
+              </w:rPr>
+              <w:t xml:space="preserve">→</w:t>
+            </w:r>
+            <w:r>
+              <w:tab/>
+            </w:r>
+            <w:r>
+              <w:rPr>
+                <w:sz w:val="21"/>
+                <w:szCs w:val="21"/>
+              </w:rPr>
+              <w:t xml:space="preserve">Iran–Pakistan and Iran–China closeness</w:t>
+            </w:r>
+          </w:p>
+          <w:p>
+            <w:pPr>
+              <w:tabs>
+                <w:tab w:val="left" w:pos="260"/>
+              </w:tabs>
+              <w:spacing w:after="0" w:before="40" w:line="280"/>
+              <w:ind w:left="260" w:hanging="260"/>
+            </w:pPr>
+            <w:r>
+              <w:rPr>
+                <w:b/>
+                <w:bCs/>
+                <w:color w:val="C00000"/>
+                <w:sz w:val="21"/>
+                <w:szCs w:val="21"/>
+              </w:rPr>
+              <w:t xml:space="preserve">→</w:t>
+            </w:r>
+            <w:r>
+              <w:tab/>
+            </w:r>
+            <w:r>
+              <w:rPr>
+                <w:sz w:val="21"/>
+                <w:szCs w:val="21"/>
+              </w:rPr>
+              <w:t xml:space="preserve">Balancing Gulf Arabs and Israel with Iran</w:t>
+            </w:r>
+          </w:p>
+          <w:p>
+            <w:pPr>
+              <w:tabs>
+                <w:tab w:val="left" w:pos="260"/>
+              </w:tabs>
+              <w:spacing w:after="0" w:before="40" w:line="280"/>
+              <w:ind w:left="260" w:hanging="260"/>
+            </w:pPr>
+            <w:r>
+              <w:rPr>
+                <w:b/>
+                <w:bCs/>
+                <w:color w:val="C00000"/>
+                <w:sz w:val="21"/>
+                <w:szCs w:val="21"/>
+              </w:rPr>
+              <w:t xml:space="preserve">→</w:t>
+            </w:r>
+            <w:r>
+              <w:tab/>
+            </w:r>
+            <w:r>
+              <w:rPr>
+                <w:sz w:val="21"/>
+                <w:szCs w:val="21"/>
+              </w:rPr>
+              <w:t xml:space="preserve">Banking and payment freeze from sanctions</w:t>
+            </w:r>
+          </w:p>
+        </w:tc>
+      </w:tr>
+      <w:tr>
+        <w:trPr>
+          <w:cantSplit/>
+        </w:trPr>
+        <w:tc>
+          <w:tcPr>
+            <w:tcW w:type="dxa" w:w="520"/>
+            <w:tcBorders>
+              <w:top w:val="single" w:color="BFBFBF" w:sz="4"/>
+              <w:left w:val="single" w:color="BFBFBF" w:sz="4"/>
+              <w:bottom w:val="single" w:color="BFBFBF" w:sz="4"/>
+              <w:right w:val="single" w:color="BFBFBF" w:sz="4"/>
+            </w:tcBorders>
+            <w:tcMar>
+              <w:top w:type="dxa" w:w="70"/>
+              <w:left w:type="dxa" w:w="100"/>
+              <w:bottom w:type="dxa" w:w="70"/>
+              <w:right w:type="dxa" w:w="100"/>
+            </w:tcMar>
+            <w:vAlign w:val="center"/>
+          </w:tcPr>
+          <w:p>
+            <w:pPr>
+              <w:spacing w:after="0" w:before="0" w:line="300"/>
+              <w:jc w:val="center"/>
+            </w:pPr>
+            <w:r>
+              <w:rPr>
+                <w:color w:val="7F7F7F"/>
+                <w:sz w:val="21"/>
+                <w:szCs w:val="21"/>
+              </w:rPr>
+              <w:t xml:space="preserve">5</w:t>
+            </w:r>
+          </w:p>
+        </w:tc>
+        <w:tc>
+          <w:tcPr>
+            <w:tcW w:type="dxa" w:w="2200"/>
+            <w:tcBorders>
+              <w:top w:val="single" w:color="BFBFBF" w:sz="4"/>
+              <w:left w:val="single" w:color="BFBFBF" w:sz="4"/>
+              <w:bottom w:val="single" w:color="BFBFBF" w:sz="4"/>
+              <w:right w:val="single" w:color="BFBFBF" w:sz="4"/>
+            </w:tcBorders>
+            <w:tcMar>
+              <w:top w:type="dxa" w:w="70"/>
+              <w:left w:type="dxa" w:w="100"/>
+              <w:bottom w:type="dxa" w:w="70"/>
+              <w:right w:type="dxa" w:w="100"/>
+            </w:tcMar>
+            <w:vAlign w:val="center"/>
+          </w:tcPr>
+          <w:p>
+            <w:pPr>
+              <w:spacing w:after="0" w:before="0" w:line="300"/>
+            </w:pPr>
+            <w:r>
+              <w:rPr>
+                <w:b/>
+                <w:bCs/>
+                <w:color w:val="1F3864"/>
+                <w:sz w:val="21"/>
+                <w:szCs w:val="21"/>
+              </w:rPr>
+              <w:t xml:space="preserve">Solutions</w:t>
+            </w:r>
+          </w:p>
+        </w:tc>
+        <w:tc>
+          <w:tcPr>
+            <w:tcW w:type="dxa" w:w="7986"/>
+            <w:tcBorders>
+              <w:top w:val="single" w:color="BFBFBF" w:sz="4"/>
+              <w:left w:val="single" w:color="BFBFBF" w:sz="4"/>
+              <w:bottom w:val="single" w:color="BFBFBF" w:sz="4"/>
+              <w:right w:val="single" w:color="BFBFBF" w:sz="4"/>
+            </w:tcBorders>
+            <w:tcMar>
+              <w:top w:type="dxa" w:w="70"/>
+              <w:left w:type="dxa" w:w="100"/>
+              <w:bottom w:type="dxa" w:w="70"/>
+              <w:right w:type="dxa" w:w="100"/>
+            </w:tcMar>
+            <w:vAlign w:val="center"/>
+          </w:tcPr>
+          <w:p>
+            <w:pPr>
+              <w:tabs>
+                <w:tab w:val="left" w:pos="260"/>
+              </w:tabs>
+              <w:spacing w:after="0" w:before="0" w:line="280"/>
+              <w:ind w:left="260" w:hanging="260"/>
+            </w:pPr>
+            <w:r>
+              <w:rPr>
+                <w:b/>
+                <w:bCs/>
+                <w:color w:val="C00000"/>
+                <w:sz w:val="21"/>
+                <w:szCs w:val="21"/>
+              </w:rPr>
+              <w:t xml:space="preserve">→</w:t>
+            </w:r>
+            <w:r>
+              <w:tab/>
+            </w:r>
+            <w:r>
+              <w:rPr>
+                <w:sz w:val="21"/>
+                <w:szCs w:val="21"/>
+              </w:rPr>
+              <w:t xml:space="preserve">Neutrality and strategic autonomy: dialogue with all; quiet diplomacy for a ceasefire</w:t>
+            </w:r>
+          </w:p>
+          <w:p>
+            <w:pPr>
+              <w:tabs>
+                <w:tab w:val="left" w:pos="260"/>
+              </w:tabs>
+              <w:spacing w:after="0" w:before="40" w:line="280"/>
+              <w:ind w:left="260" w:hanging="260"/>
+            </w:pPr>
+            <w:r>
+              <w:rPr>
+                <w:b/>
+                <w:bCs/>
+                <w:color w:val="C00000"/>
+                <w:sz w:val="21"/>
+                <w:szCs w:val="21"/>
+              </w:rPr>
+              <w:t xml:space="preserve">→</w:t>
+            </w:r>
+            <w:r>
+              <w:tab/>
+            </w:r>
+            <w:r>
+              <w:rPr>
+                <w:b/>
+                <w:bCs/>
+                <w:sz w:val="21"/>
+                <w:szCs w:val="21"/>
+              </w:rPr>
+              <w:t xml:space="preserve">Energy security:</w:t>
+            </w:r>
+            <w:r>
+              <w:rPr>
+                <w:sz w:val="21"/>
+                <w:szCs w:val="21"/>
+              </w:rPr>
+              <w:t xml:space="preserve"> diversify supply (Russia, US, Africa, Latin America), strategic reserves, renewables and alternative fuels</w:t>
+            </w:r>
+          </w:p>
+          <w:p>
+            <w:pPr>
+              <w:tabs>
+                <w:tab w:val="left" w:pos="260"/>
+              </w:tabs>
+              <w:spacing w:after="0" w:before="40" w:line="280"/>
+              <w:ind w:left="260" w:hanging="260"/>
+            </w:pPr>
+            <w:r>
+              <w:rPr>
+                <w:b/>
+                <w:bCs/>
+                <w:color w:val="C00000"/>
+                <w:sz w:val="21"/>
+                <w:szCs w:val="21"/>
+              </w:rPr>
+              <w:t xml:space="preserve">→</w:t>
+            </w:r>
+            <w:r>
+              <w:tab/>
+            </w:r>
+            <w:r>
+              <w:rPr>
+                <w:b/>
+                <w:bCs/>
+                <w:sz w:val="21"/>
+                <w:szCs w:val="21"/>
+              </w:rPr>
+              <w:t xml:space="preserve">Protect citizens:</w:t>
+            </w:r>
+            <w:r>
+              <w:rPr>
+                <w:sz w:val="21"/>
+                <w:szCs w:val="21"/>
+              </w:rPr>
+              <w:t xml:space="preserve"> evacuation capacity (Operation Sindhu-type), naval escorts, shipping advisories</w:t>
+            </w:r>
+          </w:p>
+          <w:p>
+            <w:pPr>
+              <w:tabs>
+                <w:tab w:val="left" w:pos="260"/>
+              </w:tabs>
+              <w:spacing w:after="0" w:before="40" w:line="280"/>
+              <w:ind w:left="260" w:hanging="260"/>
+            </w:pPr>
+            <w:r>
+              <w:rPr>
+                <w:b/>
+                <w:bCs/>
+                <w:color w:val="C00000"/>
+                <w:sz w:val="21"/>
+                <w:szCs w:val="21"/>
+              </w:rPr>
+              <w:t xml:space="preserve">→</w:t>
+            </w:r>
+            <w:r>
+              <w:tab/>
+            </w:r>
+            <w:r>
+              <w:rPr>
+                <w:sz w:val="21"/>
+                <w:szCs w:val="21"/>
+              </w:rPr>
+              <w:t xml:space="preserve">Keep Chabahar and INSTC alive through waivers; explore alternatives (IMEC, Oman, Duqm port)</w:t>
+            </w:r>
+          </w:p>
+          <w:p>
+            <w:pPr>
+              <w:tabs>
+                <w:tab w:val="left" w:pos="260"/>
+              </w:tabs>
+              <w:spacing w:after="0" w:before="40" w:line="280"/>
+              <w:ind w:left="260" w:hanging="260"/>
+            </w:pPr>
+            <w:r>
+              <w:rPr>
+                <w:b/>
+                <w:bCs/>
+                <w:color w:val="C00000"/>
+                <w:sz w:val="21"/>
+                <w:szCs w:val="21"/>
+              </w:rPr>
+              <w:t xml:space="preserve">→</w:t>
+            </w:r>
+            <w:r>
+              <w:tab/>
+            </w:r>
+            <w:r>
+              <w:rPr>
+                <w:sz w:val="21"/>
+                <w:szCs w:val="21"/>
+              </w:rPr>
+              <w:t xml:space="preserve">Indian Navy for Indian Ocean and Gulf of Oman security</w:t>
+            </w:r>
+          </w:p>
+          <w:p>
+            <w:pPr>
+              <w:tabs>
+                <w:tab w:val="left" w:pos="260"/>
+              </w:tabs>
+              <w:spacing w:after="0" w:before="40" w:line="280"/>
+              <w:ind w:left="260" w:hanging="260"/>
+            </w:pPr>
+            <w:r>
+              <w:rPr>
+                <w:b/>
+                <w:bCs/>
+                <w:color w:val="C00000"/>
+                <w:sz w:val="21"/>
+                <w:szCs w:val="21"/>
+              </w:rPr>
+              <w:t xml:space="preserve">→</w:t>
+            </w:r>
+            <w:r>
+              <w:tab/>
+            </w:r>
+            <w:r>
+              <w:rPr>
+                <w:sz w:val="21"/>
+                <w:szCs w:val="21"/>
+              </w:rPr>
+              <w:t xml:space="preserve">Engage Tehran, Riyadh, Abu Dhabi and Tel Aviv together</w:t>
+            </w:r>
+          </w:p>
+          <w:p>
+            <w:pPr>
+              <w:tabs>
+                <w:tab w:val="left" w:pos="260"/>
+              </w:tabs>
+              <w:spacing w:after="0" w:before="40" w:line="280"/>
+              <w:ind w:left="260" w:hanging="260"/>
+            </w:pPr>
+            <w:r>
+              <w:rPr>
+                <w:b/>
+                <w:bCs/>
+                <w:color w:val="C00000"/>
+                <w:sz w:val="21"/>
+                <w:szCs w:val="21"/>
+              </w:rPr>
+              <w:t xml:space="preserve">→</w:t>
+            </w:r>
+            <w:r>
+              <w:tab/>
+            </w:r>
+            <w:r>
+              <w:rPr>
+                <w:sz w:val="21"/>
+                <w:szCs w:val="21"/>
+              </w:rPr>
+              <w:t xml:space="preserve">Long-term plan for the Gulf and the diaspora</w:t>
+            </w:r>
+          </w:p>
+        </w:tc>
+      </w:tr>
+      <w:tr>
+        <w:trPr>
+          <w:cantSplit/>
+        </w:trPr>
+        <w:tc>
+          <w:tcPr>
+            <w:tcW w:type="dxa" w:w="520"/>
+            <w:tcBorders>
+              <w:top w:val="single" w:color="BFBFBF" w:sz="4"/>
+              <w:left w:val="single" w:color="BFBFBF" w:sz="4"/>
+              <w:bottom w:val="single" w:color="BFBFBF" w:sz="4"/>
+              <w:right w:val="single" w:color="BFBFBF" w:sz="4"/>
+            </w:tcBorders>
+            <w:shd w:fill="F5F7FB" w:color="auto" w:val="clear"/>
+            <w:tcMar>
+              <w:top w:type="dxa" w:w="70"/>
+              <w:left w:type="dxa" w:w="100"/>
+              <w:bottom w:type="dxa" w:w="70"/>
+              <w:right w:type="dxa" w:w="100"/>
+            </w:tcMar>
+            <w:vAlign w:val="center"/>
+          </w:tcPr>
+          <w:p>
+            <w:pPr>
+              <w:spacing w:after="0" w:before="0" w:line="300"/>
+              <w:jc w:val="center"/>
+            </w:pPr>
+            <w:r>
+              <w:rPr>
+                <w:color w:val="7F7F7F"/>
+                <w:sz w:val="21"/>
+                <w:szCs w:val="21"/>
+              </w:rPr>
+              <w:t xml:space="preserve">6</w:t>
+            </w:r>
+          </w:p>
+        </w:tc>
+        <w:tc>
+          <w:tcPr>
+            <w:tcW w:type="dxa" w:w="2200"/>
+            <w:tcBorders>
+              <w:top w:val="single" w:color="BFBFBF" w:sz="4"/>
+              <w:left w:val="single" w:color="BFBFBF" w:sz="4"/>
+              <w:bottom w:val="single" w:color="BFBFBF" w:sz="4"/>
+              <w:right w:val="single" w:color="BFBFBF" w:sz="4"/>
+            </w:tcBorders>
+            <w:shd w:fill="F5F7FB" w:color="auto" w:val="clear"/>
+            <w:tcMar>
+              <w:top w:type="dxa" w:w="70"/>
+              <w:left w:type="dxa" w:w="100"/>
+              <w:bottom w:type="dxa" w:w="70"/>
+              <w:right w:type="dxa" w:w="100"/>
+            </w:tcMar>
+            <w:vAlign w:val="center"/>
+          </w:tcPr>
+          <w:p>
+            <w:pPr>
+              <w:spacing w:after="0" w:before="0" w:line="300"/>
+            </w:pPr>
+            <w:r>
+              <w:rPr>
+                <w:b/>
+                <w:bCs/>
+                <w:color w:val="1F3864"/>
+                <w:sz w:val="21"/>
+                <w:szCs w:val="21"/>
+              </w:rPr>
+              <w:t xml:space="preserve">Conclusion</w:t>
+            </w:r>
+          </w:p>
+        </w:tc>
+        <w:tc>
+          <w:tcPr>
+            <w:tcW w:type="dxa" w:w="7986"/>
+            <w:tcBorders>
+              <w:top w:val="single" w:color="BFBFBF" w:sz="4"/>
+              <w:left w:val="single" w:color="BFBFBF" w:sz="4"/>
+              <w:bottom w:val="single" w:color="BFBFBF" w:sz="4"/>
+              <w:right w:val="single" w:color="BFBFBF" w:sz="4"/>
+            </w:tcBorders>
+            <w:shd w:fill="F5F7FB" w:color="auto" w:val="clear"/>
+            <w:tcMar>
+              <w:top w:type="dxa" w:w="70"/>
+              <w:left w:type="dxa" w:w="100"/>
+              <w:bottom w:type="dxa" w:w="70"/>
+              <w:right w:type="dxa" w:w="100"/>
+            </w:tcMar>
+            <w:vAlign w:val="center"/>
+          </w:tcPr>
+          <w:p>
+            <w:pPr>
+              <w:tabs>
+                <w:tab w:val="left" w:pos="260"/>
+              </w:tabs>
+              <w:spacing w:after="0" w:before="0" w:line="280"/>
+              <w:ind w:left="260" w:hanging="260"/>
+            </w:pPr>
+            <w:r>
+              <w:rPr>
+                <w:b/>
+                <w:bCs/>
+                <w:color w:val="C00000"/>
+                <w:sz w:val="21"/>
+                <w:szCs w:val="21"/>
+              </w:rPr>
+              <w:t xml:space="preserve">→</w:t>
+            </w:r>
+            <w:r>
+              <w:tab/>
+            </w:r>
+            <w:r>
+              <w:rPr>
+                <w:sz w:val="21"/>
+                <w:szCs w:val="21"/>
+              </w:rPr>
+              <w:t xml:space="preserve">Iran is a civilisational partner and a strategic necessity for India's connectivity</w:t>
+            </w:r>
+          </w:p>
+          <w:p>
+            <w:pPr>
+              <w:tabs>
+                <w:tab w:val="left" w:pos="260"/>
+              </w:tabs>
+              <w:spacing w:after="0" w:before="40" w:line="280"/>
+              <w:ind w:left="260" w:hanging="260"/>
+            </w:pPr>
+            <w:r>
+              <w:rPr>
+                <w:b/>
+                <w:bCs/>
+                <w:color w:val="C00000"/>
+                <w:sz w:val="21"/>
+                <w:szCs w:val="21"/>
+              </w:rPr>
+              <w:t xml:space="preserve">→</w:t>
+            </w:r>
+            <w:r>
+              <w:tab/>
+            </w:r>
+            <w:r>
+              <w:rPr>
+                <w:b/>
+                <w:bCs/>
+                <w:sz w:val="21"/>
+                <w:szCs w:val="21"/>
+              </w:rPr>
+              <w:t xml:space="preserve">India's wisest course:</w:t>
+            </w:r>
+            <w:r>
+              <w:rPr>
+                <w:sz w:val="21"/>
+                <w:szCs w:val="21"/>
+              </w:rPr>
+              <w:t xml:space="preserve"> neutrality, dialogue and diversified energy</w:t>
+            </w:r>
+          </w:p>
+          <w:p>
+            <w:pPr>
+              <w:tabs>
+                <w:tab w:val="left" w:pos="260"/>
+              </w:tabs>
+              <w:spacing w:after="0" w:before="40" w:line="280"/>
+              <w:ind w:left="260" w:hanging="260"/>
+            </w:pPr>
+            <w:r>
+              <w:rPr>
+                <w:b/>
+                <w:bCs/>
+                <w:color w:val="C00000"/>
+                <w:sz w:val="21"/>
+                <w:szCs w:val="21"/>
+              </w:rPr>
+              <w:t xml:space="preserve">→</w:t>
+            </w:r>
+            <w:r>
+              <w:tab/>
+            </w:r>
+            <w:r>
+              <w:rPr>
+                <w:sz w:val="21"/>
+                <w:szCs w:val="21"/>
+              </w:rPr>
+              <w:t xml:space="preserve">The war shows India's energy and connectivity strategy needs more than one route</w:t>
             </w:r>
           </w:p>
         </w:tc>

</xml_diff>

<commit_message>
Add India–Israel Relations lecturette
Co-Authored-By: Claude Opus 5.5 <noreply@anthropic.com>
Claude-Session: https://claude.ai/code/session_01EyrV2JLtXrELkAF97b5fch
</commit_message>
<xml_diff>
--- a/SSB_Lecturettes.docx
+++ b/SSB_Lecturettes.docx
@@ -21273,6 +21273,1830 @@
                 <w:szCs w:val="21"/>
               </w:rPr>
               <w:t xml:space="preserve">The war shows India's energy and connectivity strategy needs more than one route</w:t>
+            </w:r>
+          </w:p>
+        </w:tc>
+      </w:tr>
+    </w:tbl>
+    <w:p>
+      <w:pPr>
+        <w:pStyle w:val="Heading1"/>
+        <w:pageBreakBefore/>
+        <w:shd w:fill="1F3864" w:color="auto" w:val="clear"/>
+        <w:spacing w:after="160" w:before="0"/>
+        <w:ind w:left="100" w:right="100"/>
+      </w:pPr>
+      <w:r>
+        <w:t xml:space="preserve">Topic 13: India–Israel Relations</w:t>
+      </w:r>
+    </w:p>
+    <w:tbl>
+      <w:tblPr>
+        <w:tblW w:type="dxa" w:w="10706"/>
+        <w:tblBorders>
+          <w:top w:val="single" w:color="auto" w:sz="4"/>
+          <w:left w:val="single" w:color="auto" w:sz="4"/>
+          <w:bottom w:val="single" w:color="auto" w:sz="4"/>
+          <w:right w:val="single" w:color="auto" w:sz="4"/>
+          <w:insideH w:val="single" w:color="auto" w:sz="4"/>
+          <w:insideV w:val="single" w:color="auto" w:sz="4"/>
+        </w:tblBorders>
+      </w:tblPr>
+      <w:tblGrid>
+        <w:gridCol w:w="520"/>
+        <w:gridCol w:w="2200"/>
+        <w:gridCol w:w="7986"/>
+      </w:tblGrid>
+      <w:tr>
+        <w:trPr>
+          <w:tblHeader/>
+        </w:trPr>
+        <w:tc>
+          <w:tcPr>
+            <w:tcW w:type="dxa" w:w="520"/>
+            <w:tcBorders>
+              <w:top w:val="single" w:color="BFBFBF" w:sz="4"/>
+              <w:left w:val="single" w:color="BFBFBF" w:sz="4"/>
+              <w:bottom w:val="single" w:color="BFBFBF" w:sz="4"/>
+              <w:right w:val="single" w:color="BFBFBF" w:sz="4"/>
+            </w:tcBorders>
+            <w:shd w:fill="DCE3F0" w:color="auto" w:val="clear"/>
+            <w:tcMar>
+              <w:top w:type="dxa" w:w="70"/>
+              <w:left w:type="dxa" w:w="100"/>
+              <w:bottom w:type="dxa" w:w="70"/>
+              <w:right w:type="dxa" w:w="100"/>
+            </w:tcMar>
+            <w:vAlign w:val="center"/>
+          </w:tcPr>
+          <w:p>
+            <w:pPr>
+              <w:spacing w:after="0" w:before="0" w:line="300"/>
+              <w:jc w:val="center"/>
+            </w:pPr>
+            <w:r>
+              <w:rPr>
+                <w:b/>
+                <w:bCs/>
+                <w:sz w:val="21"/>
+                <w:szCs w:val="21"/>
+              </w:rPr>
+              <w:t xml:space="preserve">#</w:t>
+            </w:r>
+          </w:p>
+        </w:tc>
+        <w:tc>
+          <w:tcPr>
+            <w:tcW w:type="dxa" w:w="2200"/>
+            <w:tcBorders>
+              <w:top w:val="single" w:color="BFBFBF" w:sz="4"/>
+              <w:left w:val="single" w:color="BFBFBF" w:sz="4"/>
+              <w:bottom w:val="single" w:color="BFBFBF" w:sz="4"/>
+              <w:right w:val="single" w:color="BFBFBF" w:sz="4"/>
+            </w:tcBorders>
+            <w:shd w:fill="DCE3F0" w:color="auto" w:val="clear"/>
+            <w:tcMar>
+              <w:top w:type="dxa" w:w="70"/>
+              <w:left w:type="dxa" w:w="100"/>
+              <w:bottom w:type="dxa" w:w="70"/>
+              <w:right w:type="dxa" w:w="100"/>
+            </w:tcMar>
+            <w:vAlign w:val="center"/>
+          </w:tcPr>
+          <w:p>
+            <w:pPr>
+              <w:spacing w:after="0" w:before="0" w:line="300"/>
+            </w:pPr>
+            <w:r>
+              <w:rPr>
+                <w:b/>
+                <w:bCs/>
+                <w:sz w:val="21"/>
+                <w:szCs w:val="21"/>
+              </w:rPr>
+              <w:t xml:space="preserve">Stage</w:t>
+            </w:r>
+          </w:p>
+        </w:tc>
+        <w:tc>
+          <w:tcPr>
+            <w:tcW w:type="dxa" w:w="7986"/>
+            <w:tcBorders>
+              <w:top w:val="single" w:color="BFBFBF" w:sz="4"/>
+              <w:left w:val="single" w:color="BFBFBF" w:sz="4"/>
+              <w:bottom w:val="single" w:color="BFBFBF" w:sz="4"/>
+              <w:right w:val="single" w:color="BFBFBF" w:sz="4"/>
+            </w:tcBorders>
+            <w:shd w:fill="DCE3F0" w:color="auto" w:val="clear"/>
+            <w:tcMar>
+              <w:top w:type="dxa" w:w="70"/>
+              <w:left w:type="dxa" w:w="100"/>
+              <w:bottom w:type="dxa" w:w="70"/>
+              <w:right w:type="dxa" w:w="100"/>
+            </w:tcMar>
+            <w:vAlign w:val="center"/>
+          </w:tcPr>
+          <w:p>
+            <w:pPr>
+              <w:spacing w:after="0" w:before="0" w:line="300"/>
+            </w:pPr>
+            <w:r>
+              <w:rPr>
+                <w:b/>
+                <w:bCs/>
+                <w:sz w:val="21"/>
+                <w:szCs w:val="21"/>
+              </w:rPr>
+              <w:t xml:space="preserve">Flow</w:t>
+            </w:r>
+          </w:p>
+        </w:tc>
+      </w:tr>
+      <w:tr>
+        <w:trPr>
+          <w:cantSplit/>
+        </w:trPr>
+        <w:tc>
+          <w:tcPr>
+            <w:tcW w:type="dxa" w:w="520"/>
+            <w:tcBorders>
+              <w:top w:val="single" w:color="BFBFBF" w:sz="4"/>
+              <w:left w:val="single" w:color="BFBFBF" w:sz="4"/>
+              <w:bottom w:val="single" w:color="BFBFBF" w:sz="4"/>
+              <w:right w:val="single" w:color="BFBFBF" w:sz="4"/>
+            </w:tcBorders>
+            <w:tcMar>
+              <w:top w:type="dxa" w:w="70"/>
+              <w:left w:type="dxa" w:w="100"/>
+              <w:bottom w:type="dxa" w:w="70"/>
+              <w:right w:type="dxa" w:w="100"/>
+            </w:tcMar>
+            <w:vAlign w:val="center"/>
+          </w:tcPr>
+          <w:p>
+            <w:pPr>
+              <w:spacing w:after="0" w:before="0" w:line="300"/>
+              <w:jc w:val="center"/>
+            </w:pPr>
+            <w:r>
+              <w:rPr>
+                <w:color w:val="7F7F7F"/>
+                <w:sz w:val="21"/>
+                <w:szCs w:val="21"/>
+              </w:rPr>
+              <w:t xml:space="preserve">1</w:t>
+            </w:r>
+          </w:p>
+        </w:tc>
+        <w:tc>
+          <w:tcPr>
+            <w:tcW w:type="dxa" w:w="2200"/>
+            <w:tcBorders>
+              <w:top w:val="single" w:color="BFBFBF" w:sz="4"/>
+              <w:left w:val="single" w:color="BFBFBF" w:sz="4"/>
+              <w:bottom w:val="single" w:color="BFBFBF" w:sz="4"/>
+              <w:right w:val="single" w:color="BFBFBF" w:sz="4"/>
+            </w:tcBorders>
+            <w:tcMar>
+              <w:top w:type="dxa" w:w="70"/>
+              <w:left w:type="dxa" w:w="100"/>
+              <w:bottom w:type="dxa" w:w="70"/>
+              <w:right w:type="dxa" w:w="100"/>
+            </w:tcMar>
+            <w:vAlign w:val="center"/>
+          </w:tcPr>
+          <w:p>
+            <w:pPr>
+              <w:spacing w:after="0" w:before="0" w:line="300"/>
+            </w:pPr>
+            <w:r>
+              <w:rPr>
+                <w:b/>
+                <w:bCs/>
+                <w:color w:val="1F3864"/>
+                <w:sz w:val="21"/>
+                <w:szCs w:val="21"/>
+              </w:rPr>
+              <w:t xml:space="preserve">What is it</w:t>
+            </w:r>
+          </w:p>
+        </w:tc>
+        <w:tc>
+          <w:tcPr>
+            <w:tcW w:type="dxa" w:w="7986"/>
+            <w:tcBorders>
+              <w:top w:val="single" w:color="BFBFBF" w:sz="4"/>
+              <w:left w:val="single" w:color="BFBFBF" w:sz="4"/>
+              <w:bottom w:val="single" w:color="BFBFBF" w:sz="4"/>
+              <w:right w:val="single" w:color="BFBFBF" w:sz="4"/>
+            </w:tcBorders>
+            <w:tcMar>
+              <w:top w:type="dxa" w:w="70"/>
+              <w:left w:type="dxa" w:w="100"/>
+              <w:bottom w:type="dxa" w:w="70"/>
+              <w:right w:type="dxa" w:w="100"/>
+            </w:tcMar>
+            <w:vAlign w:val="center"/>
+          </w:tcPr>
+          <w:p>
+            <w:pPr>
+              <w:tabs>
+                <w:tab w:val="left" w:pos="260"/>
+              </w:tabs>
+              <w:spacing w:after="0" w:before="0" w:line="280"/>
+              <w:ind w:left="260" w:hanging="260"/>
+            </w:pPr>
+            <w:r>
+              <w:rPr>
+                <w:b/>
+                <w:bCs/>
+                <w:color w:val="C00000"/>
+                <w:sz w:val="21"/>
+                <w:szCs w:val="21"/>
+              </w:rPr>
+              <w:t xml:space="preserve">→</w:t>
+            </w:r>
+            <w:r>
+              <w:tab/>
+            </w:r>
+            <w:r>
+              <w:rPr>
+                <w:sz w:val="21"/>
+                <w:szCs w:val="21"/>
+              </w:rPr>
+              <w:t xml:space="preserve">Strategic partnership built on defence, technology, agriculture and counter-terrorism</w:t>
+            </w:r>
+          </w:p>
+          <w:p>
+            <w:pPr>
+              <w:tabs>
+                <w:tab w:val="left" w:pos="260"/>
+              </w:tabs>
+              <w:spacing w:after="0" w:before="40" w:line="280"/>
+              <w:ind w:left="260" w:hanging="260"/>
+            </w:pPr>
+            <w:r>
+              <w:rPr>
+                <w:b/>
+                <w:bCs/>
+                <w:color w:val="C00000"/>
+                <w:sz w:val="21"/>
+                <w:szCs w:val="21"/>
+              </w:rPr>
+              <w:t xml:space="preserve">→</w:t>
+            </w:r>
+            <w:r>
+              <w:tab/>
+            </w:r>
+            <w:r>
+              <w:rPr>
+                <w:sz w:val="21"/>
+                <w:szCs w:val="21"/>
+              </w:rPr>
+              <w:t xml:space="preserve">Recognised Israel in 1950; full diplomatic ties only in 1992, after the Cold War</w:t>
+            </w:r>
+          </w:p>
+          <w:p>
+            <w:pPr>
+              <w:tabs>
+                <w:tab w:val="left" w:pos="260"/>
+              </w:tabs>
+              <w:spacing w:after="0" w:before="40" w:line="280"/>
+              <w:ind w:left="260" w:hanging="260"/>
+            </w:pPr>
+            <w:r>
+              <w:rPr>
+                <w:b/>
+                <w:bCs/>
+                <w:color w:val="C00000"/>
+                <w:sz w:val="21"/>
+                <w:szCs w:val="21"/>
+              </w:rPr>
+              <w:t xml:space="preserve">→</w:t>
+            </w:r>
+            <w:r>
+              <w:tab/>
+            </w:r>
+            <w:r>
+              <w:rPr>
+                <w:sz w:val="21"/>
+                <w:szCs w:val="21"/>
+              </w:rPr>
+              <w:t xml:space="preserve">Continued support for Palestine; India backs a two-state solution</w:t>
+            </w:r>
+          </w:p>
+          <w:p>
+            <w:pPr>
+              <w:tabs>
+                <w:tab w:val="left" w:pos="260"/>
+              </w:tabs>
+              <w:spacing w:after="0" w:before="40" w:line="280"/>
+              <w:ind w:left="260" w:hanging="260"/>
+            </w:pPr>
+            <w:r>
+              <w:rPr>
+                <w:b/>
+                <w:bCs/>
+                <w:color w:val="C00000"/>
+                <w:sz w:val="21"/>
+                <w:szCs w:val="21"/>
+              </w:rPr>
+              <w:t xml:space="preserve">→</w:t>
+            </w:r>
+            <w:r>
+              <w:tab/>
+            </w:r>
+            <w:r>
+              <w:rPr>
+                <w:sz w:val="21"/>
+                <w:szCs w:val="21"/>
+              </w:rPr>
+              <w:t xml:space="preserve">Modi's visit (2017), first by an Indian PM; Netanyahu's visit (2018)</w:t>
+            </w:r>
+          </w:p>
+          <w:p>
+            <w:pPr>
+              <w:tabs>
+                <w:tab w:val="left" w:pos="260"/>
+              </w:tabs>
+              <w:spacing w:after="0" w:before="40" w:line="280"/>
+              <w:ind w:left="260" w:hanging="260"/>
+            </w:pPr>
+            <w:r>
+              <w:rPr>
+                <w:b/>
+                <w:bCs/>
+                <w:color w:val="C00000"/>
+                <w:sz w:val="21"/>
+                <w:szCs w:val="21"/>
+              </w:rPr>
+              <w:t xml:space="preserve">→</w:t>
+            </w:r>
+            <w:r>
+              <w:tab/>
+            </w:r>
+            <w:r>
+              <w:rPr>
+                <w:sz w:val="21"/>
+                <w:szCs w:val="21"/>
+              </w:rPr>
+              <w:t xml:space="preserve">Elevated to a "Special Strategic Partnership for Peace, Innovation &amp; Prosperity" (Feb 2026)</w:t>
+            </w:r>
+          </w:p>
+        </w:tc>
+      </w:tr>
+      <w:tr>
+        <w:trPr>
+          <w:cantSplit/>
+        </w:trPr>
+        <w:tc>
+          <w:tcPr>
+            <w:tcW w:type="dxa" w:w="520"/>
+            <w:tcBorders>
+              <w:top w:val="single" w:color="BFBFBF" w:sz="4"/>
+              <w:left w:val="single" w:color="BFBFBF" w:sz="4"/>
+              <w:bottom w:val="single" w:color="BFBFBF" w:sz="4"/>
+              <w:right w:val="single" w:color="BFBFBF" w:sz="4"/>
+            </w:tcBorders>
+            <w:shd w:fill="F5F7FB" w:color="auto" w:val="clear"/>
+            <w:tcMar>
+              <w:top w:type="dxa" w:w="70"/>
+              <w:left w:type="dxa" w:w="100"/>
+              <w:bottom w:type="dxa" w:w="70"/>
+              <w:right w:type="dxa" w:w="100"/>
+            </w:tcMar>
+            <w:vAlign w:val="center"/>
+          </w:tcPr>
+          <w:p>
+            <w:pPr>
+              <w:spacing w:after="0" w:before="0" w:line="300"/>
+              <w:jc w:val="center"/>
+            </w:pPr>
+            <w:r>
+              <w:rPr>
+                <w:color w:val="7F7F7F"/>
+                <w:sz w:val="21"/>
+                <w:szCs w:val="21"/>
+              </w:rPr>
+              <w:t xml:space="preserve">2</w:t>
+            </w:r>
+          </w:p>
+        </w:tc>
+        <w:tc>
+          <w:tcPr>
+            <w:tcW w:type="dxa" w:w="2200"/>
+            <w:tcBorders>
+              <w:top w:val="single" w:color="BFBFBF" w:sz="4"/>
+              <w:left w:val="single" w:color="BFBFBF" w:sz="4"/>
+              <w:bottom w:val="single" w:color="BFBFBF" w:sz="4"/>
+              <w:right w:val="single" w:color="BFBFBF" w:sz="4"/>
+            </w:tcBorders>
+            <w:shd w:fill="F5F7FB" w:color="auto" w:val="clear"/>
+            <w:tcMar>
+              <w:top w:type="dxa" w:w="70"/>
+              <w:left w:type="dxa" w:w="100"/>
+              <w:bottom w:type="dxa" w:w="70"/>
+              <w:right w:type="dxa" w:w="100"/>
+            </w:tcMar>
+            <w:vAlign w:val="center"/>
+          </w:tcPr>
+          <w:p>
+            <w:pPr>
+              <w:spacing w:after="0" w:before="0" w:line="300"/>
+            </w:pPr>
+            <w:r>
+              <w:rPr>
+                <w:b/>
+                <w:bCs/>
+                <w:color w:val="1F3864"/>
+                <w:sz w:val="21"/>
+                <w:szCs w:val="21"/>
+              </w:rPr>
+              <w:t xml:space="preserve">Why it matters</w:t>
+            </w:r>
+          </w:p>
+        </w:tc>
+        <w:tc>
+          <w:tcPr>
+            <w:tcW w:type="dxa" w:w="7986"/>
+            <w:tcBorders>
+              <w:top w:val="single" w:color="BFBFBF" w:sz="4"/>
+              <w:left w:val="single" w:color="BFBFBF" w:sz="4"/>
+              <w:bottom w:val="single" w:color="BFBFBF" w:sz="4"/>
+              <w:right w:val="single" w:color="BFBFBF" w:sz="4"/>
+            </w:tcBorders>
+            <w:shd w:fill="F5F7FB" w:color="auto" w:val="clear"/>
+            <w:tcMar>
+              <w:top w:type="dxa" w:w="70"/>
+              <w:left w:type="dxa" w:w="100"/>
+              <w:bottom w:type="dxa" w:w="70"/>
+              <w:right w:type="dxa" w:w="100"/>
+            </w:tcMar>
+            <w:vAlign w:val="center"/>
+          </w:tcPr>
+          <w:p>
+            <w:pPr>
+              <w:tabs>
+                <w:tab w:val="left" w:pos="260"/>
+              </w:tabs>
+              <w:spacing w:after="0" w:before="0" w:line="280"/>
+              <w:ind w:left="260" w:hanging="260"/>
+            </w:pPr>
+            <w:r>
+              <w:rPr>
+                <w:b/>
+                <w:bCs/>
+                <w:color w:val="C00000"/>
+                <w:sz w:val="21"/>
+                <w:szCs w:val="21"/>
+              </w:rPr>
+              <w:t xml:space="preserve">→</w:t>
+            </w:r>
+            <w:r>
+              <w:tab/>
+            </w:r>
+            <w:r>
+              <w:rPr>
+                <w:b/>
+                <w:bCs/>
+                <w:sz w:val="21"/>
+                <w:szCs w:val="21"/>
+              </w:rPr>
+              <w:t xml:space="preserve">Defence:</w:t>
+            </w:r>
+            <w:r>
+              <w:rPr>
+                <w:sz w:val="21"/>
+                <w:szCs w:val="21"/>
+              </w:rPr>
+              <w:t xml:space="preserve"> among India's top suppliers (missiles, UAVs, radars, border surveillance); a support since Kargil 1999</w:t>
+            </w:r>
+          </w:p>
+          <w:p>
+            <w:pPr>
+              <w:tabs>
+                <w:tab w:val="left" w:pos="260"/>
+              </w:tabs>
+              <w:spacing w:after="0" w:before="40" w:line="280"/>
+              <w:ind w:left="260" w:hanging="260"/>
+            </w:pPr>
+            <w:r>
+              <w:rPr>
+                <w:b/>
+                <w:bCs/>
+                <w:color w:val="C00000"/>
+                <w:sz w:val="21"/>
+                <w:szCs w:val="21"/>
+              </w:rPr>
+              <w:t xml:space="preserve">→</w:t>
+            </w:r>
+            <w:r>
+              <w:tab/>
+            </w:r>
+            <w:r>
+              <w:rPr>
+                <w:b/>
+                <w:bCs/>
+                <w:sz w:val="21"/>
+                <w:szCs w:val="21"/>
+              </w:rPr>
+              <w:t xml:space="preserve">Security:</w:t>
+            </w:r>
+            <w:r>
+              <w:rPr>
+                <w:sz w:val="21"/>
+                <w:szCs w:val="21"/>
+              </w:rPr>
+              <w:t xml:space="preserve"> intelligence sharing, shared concern over terrorism</w:t>
+            </w:r>
+          </w:p>
+          <w:p>
+            <w:pPr>
+              <w:tabs>
+                <w:tab w:val="left" w:pos="260"/>
+              </w:tabs>
+              <w:spacing w:after="0" w:before="40" w:line="280"/>
+              <w:ind w:left="260" w:hanging="260"/>
+            </w:pPr>
+            <w:r>
+              <w:rPr>
+                <w:b/>
+                <w:bCs/>
+                <w:color w:val="C00000"/>
+                <w:sz w:val="21"/>
+                <w:szCs w:val="21"/>
+              </w:rPr>
+              <w:t xml:space="preserve">→</w:t>
+            </w:r>
+            <w:r>
+              <w:tab/>
+            </w:r>
+            <w:r>
+              <w:rPr>
+                <w:b/>
+                <w:bCs/>
+                <w:sz w:val="21"/>
+                <w:szCs w:val="21"/>
+              </w:rPr>
+              <w:t xml:space="preserve">Technology:</w:t>
+            </w:r>
+            <w:r>
+              <w:rPr>
+                <w:sz w:val="21"/>
+                <w:szCs w:val="21"/>
+              </w:rPr>
+              <w:t xml:space="preserve"> AI, cyber, quantum, water and agri-tech</w:t>
+            </w:r>
+          </w:p>
+          <w:p>
+            <w:pPr>
+              <w:tabs>
+                <w:tab w:val="left" w:pos="260"/>
+              </w:tabs>
+              <w:spacing w:after="0" w:before="40" w:line="280"/>
+              <w:ind w:left="260" w:hanging="260"/>
+            </w:pPr>
+            <w:r>
+              <w:rPr>
+                <w:b/>
+                <w:bCs/>
+                <w:color w:val="C00000"/>
+                <w:sz w:val="21"/>
+                <w:szCs w:val="21"/>
+              </w:rPr>
+              <w:t xml:space="preserve">→</w:t>
+            </w:r>
+            <w:r>
+              <w:tab/>
+            </w:r>
+            <w:r>
+              <w:rPr>
+                <w:b/>
+                <w:bCs/>
+                <w:sz w:val="21"/>
+                <w:szCs w:val="21"/>
+              </w:rPr>
+              <w:t xml:space="preserve">Economic:</w:t>
+            </w:r>
+            <w:r>
+              <w:rPr>
+                <w:sz w:val="21"/>
+                <w:szCs w:val="21"/>
+              </w:rPr>
+              <w:t xml:space="preserve"> trade $3.62 bn (2024–25); FTA under negotiation</w:t>
+            </w:r>
+          </w:p>
+          <w:p>
+            <w:pPr>
+              <w:tabs>
+                <w:tab w:val="left" w:pos="260"/>
+              </w:tabs>
+              <w:spacing w:after="0" w:before="40" w:line="280"/>
+              <w:ind w:left="260" w:hanging="260"/>
+            </w:pPr>
+            <w:r>
+              <w:rPr>
+                <w:b/>
+                <w:bCs/>
+                <w:color w:val="C00000"/>
+                <w:sz w:val="21"/>
+                <w:szCs w:val="21"/>
+              </w:rPr>
+              <w:t xml:space="preserve">→</w:t>
+            </w:r>
+            <w:r>
+              <w:tab/>
+            </w:r>
+            <w:r>
+              <w:rPr>
+                <w:b/>
+                <w:bCs/>
+                <w:sz w:val="21"/>
+                <w:szCs w:val="21"/>
+              </w:rPr>
+              <w:t xml:space="preserve">Connectivity:</w:t>
+            </w:r>
+            <w:r>
+              <w:rPr>
+                <w:sz w:val="21"/>
+                <w:szCs w:val="21"/>
+              </w:rPr>
+              <w:t xml:space="preserve"> IMEC and I2U2</w:t>
+            </w:r>
+          </w:p>
+          <w:p>
+            <w:pPr>
+              <w:tabs>
+                <w:tab w:val="left" w:pos="260"/>
+              </w:tabs>
+              <w:spacing w:after="0" w:before="40" w:line="280"/>
+              <w:ind w:left="260" w:hanging="260"/>
+            </w:pPr>
+            <w:r>
+              <w:rPr>
+                <w:b/>
+                <w:bCs/>
+                <w:color w:val="C00000"/>
+                <w:sz w:val="21"/>
+                <w:szCs w:val="21"/>
+              </w:rPr>
+              <w:t xml:space="preserve">→</w:t>
+            </w:r>
+            <w:r>
+              <w:tab/>
+            </w:r>
+            <w:r>
+              <w:rPr>
+                <w:b/>
+                <w:bCs/>
+                <w:sz w:val="21"/>
+                <w:szCs w:val="21"/>
+              </w:rPr>
+              <w:t xml:space="preserve">People:</w:t>
+            </w:r>
+            <w:r>
+              <w:rPr>
+                <w:sz w:val="21"/>
+                <w:szCs w:val="21"/>
+              </w:rPr>
+              <w:t xml:space="preserve"> about 18,000–20,000 Indian workers in Israel; 100,000+ Jews of Indian origin</w:t>
+            </w:r>
+          </w:p>
+        </w:tc>
+      </w:tr>
+      <w:tr>
+        <w:trPr>
+          <w:cantSplit/>
+        </w:trPr>
+        <w:tc>
+          <w:tcPr>
+            <w:tcW w:type="dxa" w:w="520"/>
+            <w:tcBorders>
+              <w:top w:val="single" w:color="BFBFBF" w:sz="4"/>
+              <w:left w:val="single" w:color="BFBFBF" w:sz="4"/>
+              <w:bottom w:val="single" w:color="BFBFBF" w:sz="4"/>
+              <w:right w:val="single" w:color="BFBFBF" w:sz="4"/>
+            </w:tcBorders>
+            <w:tcMar>
+              <w:top w:type="dxa" w:w="70"/>
+              <w:left w:type="dxa" w:w="100"/>
+              <w:bottom w:type="dxa" w:w="70"/>
+              <w:right w:type="dxa" w:w="100"/>
+            </w:tcMar>
+            <w:vAlign w:val="center"/>
+          </w:tcPr>
+          <w:p>
+            <w:pPr>
+              <w:spacing w:after="0" w:before="0" w:line="300"/>
+              <w:jc w:val="center"/>
+            </w:pPr>
+            <w:r>
+              <w:rPr>
+                <w:color w:val="7F7F7F"/>
+                <w:sz w:val="21"/>
+                <w:szCs w:val="21"/>
+              </w:rPr>
+              <w:t xml:space="preserve">3</w:t>
+            </w:r>
+          </w:p>
+        </w:tc>
+        <w:tc>
+          <w:tcPr>
+            <w:tcW w:type="dxa" w:w="2200"/>
+            <w:tcBorders>
+              <w:top w:val="single" w:color="BFBFBF" w:sz="4"/>
+              <w:left w:val="single" w:color="BFBFBF" w:sz="4"/>
+              <w:bottom w:val="single" w:color="BFBFBF" w:sz="4"/>
+              <w:right w:val="single" w:color="BFBFBF" w:sz="4"/>
+            </w:tcBorders>
+            <w:tcMar>
+              <w:top w:type="dxa" w:w="70"/>
+              <w:left w:type="dxa" w:w="100"/>
+              <w:bottom w:type="dxa" w:w="70"/>
+              <w:right w:type="dxa" w:w="100"/>
+            </w:tcMar>
+            <w:vAlign w:val="center"/>
+          </w:tcPr>
+          <w:p>
+            <w:pPr>
+              <w:spacing w:after="0" w:before="0" w:line="300"/>
+            </w:pPr>
+            <w:r>
+              <w:rPr>
+                <w:b/>
+                <w:bCs/>
+                <w:color w:val="1F3864"/>
+                <w:sz w:val="21"/>
+                <w:szCs w:val="21"/>
+              </w:rPr>
+              <w:t xml:space="preserve">Current status (Oct 2026)</w:t>
+            </w:r>
+          </w:p>
+        </w:tc>
+        <w:tc>
+          <w:tcPr>
+            <w:tcW w:type="dxa" w:w="7986"/>
+            <w:tcBorders>
+              <w:top w:val="single" w:color="BFBFBF" w:sz="4"/>
+              <w:left w:val="single" w:color="BFBFBF" w:sz="4"/>
+              <w:bottom w:val="single" w:color="BFBFBF" w:sz="4"/>
+              <w:right w:val="single" w:color="BFBFBF" w:sz="4"/>
+            </w:tcBorders>
+            <w:tcMar>
+              <w:top w:type="dxa" w:w="70"/>
+              <w:left w:type="dxa" w:w="100"/>
+              <w:bottom w:type="dxa" w:w="70"/>
+              <w:right w:type="dxa" w:w="100"/>
+            </w:tcMar>
+            <w:vAlign w:val="center"/>
+          </w:tcPr>
+          <w:p>
+            <w:pPr>
+              <w:tabs>
+                <w:tab w:val="left" w:pos="260"/>
+              </w:tabs>
+              <w:spacing w:after="0" w:before="0" w:line="280"/>
+              <w:ind w:left="260" w:hanging="260"/>
+            </w:pPr>
+            <w:r>
+              <w:rPr>
+                <w:b/>
+                <w:bCs/>
+                <w:color w:val="C00000"/>
+                <w:sz w:val="21"/>
+                <w:szCs w:val="21"/>
+              </w:rPr>
+              <w:t xml:space="preserve">→</w:t>
+            </w:r>
+            <w:r>
+              <w:tab/>
+            </w:r>
+            <w:r>
+              <w:rPr>
+                <w:sz w:val="21"/>
+                <w:szCs w:val="21"/>
+              </w:rPr>
+              <w:t xml:space="preserve">Modi's state visit (25–26 Feb 2026): first Indian PM to address the Knesset; 27 outcomes, 17 agreements</w:t>
+            </w:r>
+          </w:p>
+          <w:p>
+            <w:pPr>
+              <w:tabs>
+                <w:tab w:val="left" w:pos="260"/>
+              </w:tabs>
+              <w:spacing w:after="0" w:before="40" w:line="280"/>
+              <w:ind w:left="260" w:hanging="260"/>
+            </w:pPr>
+            <w:r>
+              <w:rPr>
+                <w:b/>
+                <w:bCs/>
+                <w:color w:val="C00000"/>
+                <w:sz w:val="21"/>
+                <w:szCs w:val="21"/>
+              </w:rPr>
+              <w:t xml:space="preserve">→</w:t>
+            </w:r>
+            <w:r>
+              <w:tab/>
+            </w:r>
+            <w:r>
+              <w:rPr>
+                <w:b/>
+                <w:bCs/>
+                <w:sz w:val="21"/>
+                <w:szCs w:val="21"/>
+              </w:rPr>
+              <w:t xml:space="preserve">Defence roadmap:</w:t>
+            </w:r>
+            <w:r>
+              <w:rPr>
+                <w:sz w:val="21"/>
+                <w:szCs w:val="21"/>
+              </w:rPr>
+              <w:t xml:space="preserve"> joint development, joint production, technology transfer, air defence expertise</w:t>
+            </w:r>
+          </w:p>
+          <w:p>
+            <w:pPr>
+              <w:tabs>
+                <w:tab w:val="left" w:pos="260"/>
+              </w:tabs>
+              <w:spacing w:after="0" w:before="40" w:line="280"/>
+              <w:ind w:left="260" w:hanging="260"/>
+            </w:pPr>
+            <w:r>
+              <w:rPr>
+                <w:b/>
+                <w:bCs/>
+                <w:color w:val="C00000"/>
+                <w:sz w:val="21"/>
+                <w:szCs w:val="21"/>
+              </w:rPr>
+              <w:t xml:space="preserve">→</w:t>
+            </w:r>
+            <w:r>
+              <w:tab/>
+            </w:r>
+            <w:r>
+              <w:rPr>
+                <w:sz w:val="21"/>
+                <w:szCs w:val="21"/>
+              </w:rPr>
+              <w:t xml:space="preserve">Critical and Emerging Technologies Partnership led by the two NSAs</w:t>
+            </w:r>
+          </w:p>
+          <w:p>
+            <w:pPr>
+              <w:tabs>
+                <w:tab w:val="left" w:pos="260"/>
+              </w:tabs>
+              <w:spacing w:after="0" w:before="40" w:line="280"/>
+              <w:ind w:left="260" w:hanging="260"/>
+            </w:pPr>
+            <w:r>
+              <w:rPr>
+                <w:b/>
+                <w:bCs/>
+                <w:color w:val="C00000"/>
+                <w:sz w:val="21"/>
+                <w:szCs w:val="21"/>
+              </w:rPr>
+              <w:t xml:space="preserve">→</w:t>
+            </w:r>
+            <w:r>
+              <w:tab/>
+            </w:r>
+            <w:r>
+              <w:rPr>
+                <w:sz w:val="21"/>
+                <w:szCs w:val="21"/>
+              </w:rPr>
+              <w:t xml:space="preserve">UPI–Israel payments link; Israel to take 50,000 more Indian workers; India ready to help rebuild Gaza</w:t>
+            </w:r>
+          </w:p>
+          <w:p>
+            <w:pPr>
+              <w:tabs>
+                <w:tab w:val="left" w:pos="260"/>
+              </w:tabs>
+              <w:spacing w:after="0" w:before="40" w:line="280"/>
+              <w:ind w:left="260" w:hanging="260"/>
+            </w:pPr>
+            <w:r>
+              <w:rPr>
+                <w:b/>
+                <w:bCs/>
+                <w:color w:val="C00000"/>
+                <w:sz w:val="21"/>
+                <w:szCs w:val="21"/>
+              </w:rPr>
+              <w:t xml:space="preserve">→</w:t>
+            </w:r>
+            <w:r>
+              <w:tab/>
+            </w:r>
+            <w:r>
+              <w:rPr>
+                <w:b/>
+                <w:bCs/>
+                <w:sz w:val="21"/>
+                <w:szCs w:val="21"/>
+              </w:rPr>
+              <w:t xml:space="preserve">FTA:</w:t>
+            </w:r>
+            <w:r>
+              <w:rPr>
+                <w:sz w:val="21"/>
+                <w:szCs w:val="21"/>
+              </w:rPr>
+              <w:t xml:space="preserve"> Terms of Reference (Nov 2025); rounds one (Feb) and two (Jul 2026, New Delhi); aim for early conclusion</w:t>
+            </w:r>
+          </w:p>
+          <w:p>
+            <w:pPr>
+              <w:tabs>
+                <w:tab w:val="left" w:pos="260"/>
+              </w:tabs>
+              <w:spacing w:after="0" w:before="40" w:line="280"/>
+              <w:ind w:left="260" w:hanging="260"/>
+            </w:pPr>
+            <w:r>
+              <w:rPr>
+                <w:b/>
+                <w:bCs/>
+                <w:color w:val="C00000"/>
+                <w:sz w:val="21"/>
+                <w:szCs w:val="21"/>
+              </w:rPr>
+              <w:t xml:space="preserve">→</w:t>
+            </w:r>
+            <w:r>
+              <w:tab/>
+            </w:r>
+            <w:r>
+              <w:rPr>
+                <w:b/>
+                <w:bCs/>
+                <w:sz w:val="21"/>
+                <w:szCs w:val="21"/>
+              </w:rPr>
+              <w:t xml:space="preserve">BIT:</w:t>
+            </w:r>
+            <w:r>
+              <w:rPr>
+                <w:sz w:val="21"/>
+                <w:szCs w:val="21"/>
+              </w:rPr>
+              <w:t xml:space="preserve"> new Bilateral Investment Treaty (Sept 2025)</w:t>
+            </w:r>
+          </w:p>
+          <w:p>
+            <w:pPr>
+              <w:tabs>
+                <w:tab w:val="left" w:pos="260"/>
+              </w:tabs>
+              <w:spacing w:after="0" w:before="40" w:line="280"/>
+              <w:ind w:left="260" w:hanging="260"/>
+            </w:pPr>
+            <w:r>
+              <w:rPr>
+                <w:b/>
+                <w:bCs/>
+                <w:color w:val="C00000"/>
+                <w:sz w:val="21"/>
+                <w:szCs w:val="21"/>
+              </w:rPr>
+              <w:t xml:space="preserve">→</w:t>
+            </w:r>
+            <w:r>
+              <w:tab/>
+            </w:r>
+            <w:r>
+              <w:rPr>
+                <w:b/>
+                <w:bCs/>
+                <w:sz w:val="21"/>
+                <w:szCs w:val="21"/>
+              </w:rPr>
+              <w:t xml:space="preserve">Iran war:</w:t>
+            </w:r>
+            <w:r>
+              <w:rPr>
+                <w:sz w:val="21"/>
+                <w:szCs w:val="21"/>
+              </w:rPr>
+              <w:t xml:space="preserve"> US–Israel strikes began 28 Feb, two days after Modi's visit; India neutral, condemned attacks on US bases without naming Iran, offered medical aid to Iran; energy and LPG shocks from Hormuz</w:t>
+            </w:r>
+          </w:p>
+          <w:p>
+            <w:pPr>
+              <w:tabs>
+                <w:tab w:val="left" w:pos="260"/>
+              </w:tabs>
+              <w:spacing w:after="0" w:before="40" w:line="280"/>
+              <w:ind w:left="260" w:hanging="260"/>
+            </w:pPr>
+            <w:r>
+              <w:rPr>
+                <w:b/>
+                <w:bCs/>
+                <w:color w:val="C00000"/>
+                <w:sz w:val="21"/>
+                <w:szCs w:val="21"/>
+              </w:rPr>
+              <w:t xml:space="preserve">→</w:t>
+            </w:r>
+            <w:r>
+              <w:tab/>
+            </w:r>
+            <w:r>
+              <w:rPr>
+                <w:b/>
+                <w:bCs/>
+                <w:sz w:val="21"/>
+                <w:szCs w:val="21"/>
+              </w:rPr>
+              <w:t xml:space="preserve">Politics at home:</w:t>
+            </w:r>
+            <w:r>
+              <w:rPr>
+                <w:sz w:val="21"/>
+                <w:szCs w:val="21"/>
+              </w:rPr>
+              <w:t xml:space="preserve"> Congress criticised the visit and silence on Gaza; official stand remains dialogue and a two-state solution</w:t>
+            </w:r>
+          </w:p>
+        </w:tc>
+      </w:tr>
+      <w:tr>
+        <w:trPr>
+          <w:cantSplit/>
+        </w:trPr>
+        <w:tc>
+          <w:tcPr>
+            <w:tcW w:type="dxa" w:w="520"/>
+            <w:tcBorders>
+              <w:top w:val="single" w:color="BFBFBF" w:sz="4"/>
+              <w:left w:val="single" w:color="BFBFBF" w:sz="4"/>
+              <w:bottom w:val="single" w:color="BFBFBF" w:sz="4"/>
+              <w:right w:val="single" w:color="BFBFBF" w:sz="4"/>
+            </w:tcBorders>
+            <w:shd w:fill="F5F7FB" w:color="auto" w:val="clear"/>
+            <w:tcMar>
+              <w:top w:type="dxa" w:w="70"/>
+              <w:left w:type="dxa" w:w="100"/>
+              <w:bottom w:type="dxa" w:w="70"/>
+              <w:right w:type="dxa" w:w="100"/>
+            </w:tcMar>
+            <w:vAlign w:val="center"/>
+          </w:tcPr>
+          <w:p>
+            <w:pPr>
+              <w:spacing w:after="0" w:before="0" w:line="300"/>
+              <w:jc w:val="center"/>
+            </w:pPr>
+            <w:r>
+              <w:rPr>
+                <w:color w:val="7F7F7F"/>
+                <w:sz w:val="21"/>
+                <w:szCs w:val="21"/>
+              </w:rPr>
+              <w:t xml:space="preserve">4</w:t>
+            </w:r>
+          </w:p>
+        </w:tc>
+        <w:tc>
+          <w:tcPr>
+            <w:tcW w:type="dxa" w:w="2200"/>
+            <w:tcBorders>
+              <w:top w:val="single" w:color="BFBFBF" w:sz="4"/>
+              <w:left w:val="single" w:color="BFBFBF" w:sz="4"/>
+              <w:bottom w:val="single" w:color="BFBFBF" w:sz="4"/>
+              <w:right w:val="single" w:color="BFBFBF" w:sz="4"/>
+            </w:tcBorders>
+            <w:shd w:fill="F5F7FB" w:color="auto" w:val="clear"/>
+            <w:tcMar>
+              <w:top w:type="dxa" w:w="70"/>
+              <w:left w:type="dxa" w:w="100"/>
+              <w:bottom w:type="dxa" w:w="70"/>
+              <w:right w:type="dxa" w:w="100"/>
+            </w:tcMar>
+            <w:vAlign w:val="center"/>
+          </w:tcPr>
+          <w:p>
+            <w:pPr>
+              <w:spacing w:after="0" w:before="0" w:line="300"/>
+            </w:pPr>
+            <w:r>
+              <w:rPr>
+                <w:b/>
+                <w:bCs/>
+                <w:color w:val="1F3864"/>
+                <w:sz w:val="21"/>
+                <w:szCs w:val="21"/>
+              </w:rPr>
+              <w:t xml:space="preserve">Problems</w:t>
+            </w:r>
+          </w:p>
+        </w:tc>
+        <w:tc>
+          <w:tcPr>
+            <w:tcW w:type="dxa" w:w="7986"/>
+            <w:tcBorders>
+              <w:top w:val="single" w:color="BFBFBF" w:sz="4"/>
+              <w:left w:val="single" w:color="BFBFBF" w:sz="4"/>
+              <w:bottom w:val="single" w:color="BFBFBF" w:sz="4"/>
+              <w:right w:val="single" w:color="BFBFBF" w:sz="4"/>
+            </w:tcBorders>
+            <w:shd w:fill="F5F7FB" w:color="auto" w:val="clear"/>
+            <w:tcMar>
+              <w:top w:type="dxa" w:w="70"/>
+              <w:left w:type="dxa" w:w="100"/>
+              <w:bottom w:type="dxa" w:w="70"/>
+              <w:right w:type="dxa" w:w="100"/>
+            </w:tcMar>
+            <w:vAlign w:val="center"/>
+          </w:tcPr>
+          <w:p>
+            <w:pPr>
+              <w:tabs>
+                <w:tab w:val="left" w:pos="260"/>
+              </w:tabs>
+              <w:spacing w:after="0" w:before="0" w:line="280"/>
+              <w:ind w:left="260" w:hanging="260"/>
+            </w:pPr>
+            <w:r>
+              <w:rPr>
+                <w:b/>
+                <w:bCs/>
+                <w:color w:val="C00000"/>
+                <w:sz w:val="21"/>
+                <w:szCs w:val="21"/>
+              </w:rPr>
+              <w:t xml:space="preserve">→</w:t>
+            </w:r>
+            <w:r>
+              <w:tab/>
+            </w:r>
+            <w:r>
+              <w:rPr>
+                <w:sz w:val="21"/>
+                <w:szCs w:val="21"/>
+              </w:rPr>
+              <w:t xml:space="preserve">Balancing Israel with Iran (Chabahar, energy), the Gulf Arabs (diaspora, oil) and the Palestinian cause</w:t>
+            </w:r>
+          </w:p>
+          <w:p>
+            <w:pPr>
+              <w:tabs>
+                <w:tab w:val="left" w:pos="260"/>
+              </w:tabs>
+              <w:spacing w:after="0" w:before="40" w:line="280"/>
+              <w:ind w:left="260" w:hanging="260"/>
+            </w:pPr>
+            <w:r>
+              <w:rPr>
+                <w:b/>
+                <w:bCs/>
+                <w:color w:val="C00000"/>
+                <w:sz w:val="21"/>
+                <w:szCs w:val="21"/>
+              </w:rPr>
+              <w:t xml:space="preserve">→</w:t>
+            </w:r>
+            <w:r>
+              <w:tab/>
+            </w:r>
+            <w:r>
+              <w:rPr>
+                <w:sz w:val="21"/>
+                <w:szCs w:val="21"/>
+              </w:rPr>
+              <w:t xml:space="preserve">Iran war and Hormuz closure hitting India's energy and sailors</w:t>
+            </w:r>
+          </w:p>
+          <w:p>
+            <w:pPr>
+              <w:tabs>
+                <w:tab w:val="left" w:pos="260"/>
+              </w:tabs>
+              <w:spacing w:after="0" w:before="40" w:line="280"/>
+              <w:ind w:left="260" w:hanging="260"/>
+            </w:pPr>
+            <w:r>
+              <w:rPr>
+                <w:b/>
+                <w:bCs/>
+                <w:color w:val="C00000"/>
+                <w:sz w:val="21"/>
+                <w:szCs w:val="21"/>
+              </w:rPr>
+              <w:t xml:space="preserve">→</w:t>
+            </w:r>
+            <w:r>
+              <w:tab/>
+            </w:r>
+            <w:r>
+              <w:rPr>
+                <w:sz w:val="21"/>
+                <w:szCs w:val="21"/>
+              </w:rPr>
+              <w:t xml:space="preserve">Domestic criticism over Gaza; risk to India's Global South image</w:t>
+            </w:r>
+          </w:p>
+          <w:p>
+            <w:pPr>
+              <w:tabs>
+                <w:tab w:val="left" w:pos="260"/>
+              </w:tabs>
+              <w:spacing w:after="0" w:before="40" w:line="280"/>
+              <w:ind w:left="260" w:hanging="260"/>
+            </w:pPr>
+            <w:r>
+              <w:rPr>
+                <w:b/>
+                <w:bCs/>
+                <w:color w:val="C00000"/>
+                <w:sz w:val="21"/>
+                <w:szCs w:val="21"/>
+              </w:rPr>
+              <w:t xml:space="preserve">→</w:t>
+            </w:r>
+            <w:r>
+              <w:tab/>
+            </w:r>
+            <w:r>
+              <w:rPr>
+                <w:sz w:val="21"/>
+                <w:szCs w:val="21"/>
+              </w:rPr>
+              <w:t xml:space="preserve">Dependence on Israeli defence tech; need for self-reliance</w:t>
+            </w:r>
+          </w:p>
+          <w:p>
+            <w:pPr>
+              <w:tabs>
+                <w:tab w:val="left" w:pos="260"/>
+              </w:tabs>
+              <w:spacing w:after="0" w:before="40" w:line="280"/>
+              <w:ind w:left="260" w:hanging="260"/>
+            </w:pPr>
+            <w:r>
+              <w:rPr>
+                <w:b/>
+                <w:bCs/>
+                <w:color w:val="C00000"/>
+                <w:sz w:val="21"/>
+                <w:szCs w:val="21"/>
+              </w:rPr>
+              <w:t xml:space="preserve">→</w:t>
+            </w:r>
+            <w:r>
+              <w:tab/>
+            </w:r>
+            <w:r>
+              <w:rPr>
+                <w:sz w:val="21"/>
+                <w:szCs w:val="21"/>
+              </w:rPr>
+              <w:t xml:space="preserve">Safety of Indian workers in a conflict zone</w:t>
+            </w:r>
+          </w:p>
+          <w:p>
+            <w:pPr>
+              <w:tabs>
+                <w:tab w:val="left" w:pos="260"/>
+              </w:tabs>
+              <w:spacing w:after="0" w:before="40" w:line="280"/>
+              <w:ind w:left="260" w:hanging="260"/>
+            </w:pPr>
+            <w:r>
+              <w:rPr>
+                <w:b/>
+                <w:bCs/>
+                <w:color w:val="C00000"/>
+                <w:sz w:val="21"/>
+                <w:szCs w:val="21"/>
+              </w:rPr>
+              <w:t xml:space="preserve">→</w:t>
+            </w:r>
+            <w:r>
+              <w:tab/>
+            </w:r>
+            <w:r>
+              <w:rPr>
+                <w:sz w:val="21"/>
+                <w:szCs w:val="21"/>
+              </w:rPr>
+              <w:t xml:space="preserve">Pressure from the US and Arab states</w:t>
+            </w:r>
+          </w:p>
+          <w:p>
+            <w:pPr>
+              <w:tabs>
+                <w:tab w:val="left" w:pos="260"/>
+              </w:tabs>
+              <w:spacing w:after="0" w:before="40" w:line="280"/>
+              <w:ind w:left="260" w:hanging="260"/>
+            </w:pPr>
+            <w:r>
+              <w:rPr>
+                <w:b/>
+                <w:bCs/>
+                <w:color w:val="C00000"/>
+                <w:sz w:val="21"/>
+                <w:szCs w:val="21"/>
+              </w:rPr>
+              <w:t xml:space="preserve">→</w:t>
+            </w:r>
+            <w:r>
+              <w:tab/>
+            </w:r>
+            <w:r>
+              <w:rPr>
+                <w:sz w:val="21"/>
+                <w:szCs w:val="21"/>
+              </w:rPr>
+              <w:t xml:space="preserve">Slow FTA progress (stalled for a decade after 2013)</w:t>
+            </w:r>
+          </w:p>
+        </w:tc>
+      </w:tr>
+      <w:tr>
+        <w:trPr>
+          <w:cantSplit/>
+        </w:trPr>
+        <w:tc>
+          <w:tcPr>
+            <w:tcW w:type="dxa" w:w="520"/>
+            <w:tcBorders>
+              <w:top w:val="single" w:color="BFBFBF" w:sz="4"/>
+              <w:left w:val="single" w:color="BFBFBF" w:sz="4"/>
+              <w:bottom w:val="single" w:color="BFBFBF" w:sz="4"/>
+              <w:right w:val="single" w:color="BFBFBF" w:sz="4"/>
+            </w:tcBorders>
+            <w:tcMar>
+              <w:top w:type="dxa" w:w="70"/>
+              <w:left w:type="dxa" w:w="100"/>
+              <w:bottom w:type="dxa" w:w="70"/>
+              <w:right w:type="dxa" w:w="100"/>
+            </w:tcMar>
+            <w:vAlign w:val="center"/>
+          </w:tcPr>
+          <w:p>
+            <w:pPr>
+              <w:spacing w:after="0" w:before="0" w:line="300"/>
+              <w:jc w:val="center"/>
+            </w:pPr>
+            <w:r>
+              <w:rPr>
+                <w:color w:val="7F7F7F"/>
+                <w:sz w:val="21"/>
+                <w:szCs w:val="21"/>
+              </w:rPr>
+              <w:t xml:space="preserve">5</w:t>
+            </w:r>
+          </w:p>
+        </w:tc>
+        <w:tc>
+          <w:tcPr>
+            <w:tcW w:type="dxa" w:w="2200"/>
+            <w:tcBorders>
+              <w:top w:val="single" w:color="BFBFBF" w:sz="4"/>
+              <w:left w:val="single" w:color="BFBFBF" w:sz="4"/>
+              <w:bottom w:val="single" w:color="BFBFBF" w:sz="4"/>
+              <w:right w:val="single" w:color="BFBFBF" w:sz="4"/>
+            </w:tcBorders>
+            <w:tcMar>
+              <w:top w:type="dxa" w:w="70"/>
+              <w:left w:type="dxa" w:w="100"/>
+              <w:bottom w:type="dxa" w:w="70"/>
+              <w:right w:type="dxa" w:w="100"/>
+            </w:tcMar>
+            <w:vAlign w:val="center"/>
+          </w:tcPr>
+          <w:p>
+            <w:pPr>
+              <w:spacing w:after="0" w:before="0" w:line="300"/>
+            </w:pPr>
+            <w:r>
+              <w:rPr>
+                <w:b/>
+                <w:bCs/>
+                <w:color w:val="1F3864"/>
+                <w:sz w:val="21"/>
+                <w:szCs w:val="21"/>
+              </w:rPr>
+              <w:t xml:space="preserve">Solutions</w:t>
+            </w:r>
+          </w:p>
+        </w:tc>
+        <w:tc>
+          <w:tcPr>
+            <w:tcW w:type="dxa" w:w="7986"/>
+            <w:tcBorders>
+              <w:top w:val="single" w:color="BFBFBF" w:sz="4"/>
+              <w:left w:val="single" w:color="BFBFBF" w:sz="4"/>
+              <w:bottom w:val="single" w:color="BFBFBF" w:sz="4"/>
+              <w:right w:val="single" w:color="BFBFBF" w:sz="4"/>
+            </w:tcBorders>
+            <w:tcMar>
+              <w:top w:type="dxa" w:w="70"/>
+              <w:left w:type="dxa" w:w="100"/>
+              <w:bottom w:type="dxa" w:w="70"/>
+              <w:right w:type="dxa" w:w="100"/>
+            </w:tcMar>
+            <w:vAlign w:val="center"/>
+          </w:tcPr>
+          <w:p>
+            <w:pPr>
+              <w:tabs>
+                <w:tab w:val="left" w:pos="260"/>
+              </w:tabs>
+              <w:spacing w:after="0" w:before="0" w:line="280"/>
+              <w:ind w:left="260" w:hanging="260"/>
+            </w:pPr>
+            <w:r>
+              <w:rPr>
+                <w:b/>
+                <w:bCs/>
+                <w:color w:val="C00000"/>
+                <w:sz w:val="21"/>
+                <w:szCs w:val="21"/>
+              </w:rPr>
+              <w:t xml:space="preserve">→</w:t>
+            </w:r>
+            <w:r>
+              <w:tab/>
+            </w:r>
+            <w:r>
+              <w:rPr>
+                <w:b/>
+                <w:bCs/>
+                <w:sz w:val="21"/>
+                <w:szCs w:val="21"/>
+              </w:rPr>
+              <w:t xml:space="preserve">Multi-alignment:</w:t>
+            </w:r>
+            <w:r>
+              <w:rPr>
+                <w:sz w:val="21"/>
+                <w:szCs w:val="21"/>
+              </w:rPr>
+              <w:t xml:space="preserve"> close ties with Israel, the Gulf and Iran together; consistent on the two-state solution</w:t>
+            </w:r>
+          </w:p>
+          <w:p>
+            <w:pPr>
+              <w:tabs>
+                <w:tab w:val="left" w:pos="260"/>
+              </w:tabs>
+              <w:spacing w:after="0" w:before="40" w:line="280"/>
+              <w:ind w:left="260" w:hanging="260"/>
+            </w:pPr>
+            <w:r>
+              <w:rPr>
+                <w:b/>
+                <w:bCs/>
+                <w:color w:val="C00000"/>
+                <w:sz w:val="21"/>
+                <w:szCs w:val="21"/>
+              </w:rPr>
+              <w:t xml:space="preserve">→</w:t>
+            </w:r>
+            <w:r>
+              <w:tab/>
+            </w:r>
+            <w:r>
+              <w:rPr>
+                <w:sz w:val="21"/>
+                <w:szCs w:val="21"/>
+              </w:rPr>
+              <w:t xml:space="preserve">Move from buying to co-development and co-production (Make in India), with technology transfer</w:t>
+            </w:r>
+          </w:p>
+          <w:p>
+            <w:pPr>
+              <w:tabs>
+                <w:tab w:val="left" w:pos="260"/>
+              </w:tabs>
+              <w:spacing w:after="0" w:before="40" w:line="280"/>
+              <w:ind w:left="260" w:hanging="260"/>
+            </w:pPr>
+            <w:r>
+              <w:rPr>
+                <w:b/>
+                <w:bCs/>
+                <w:color w:val="C00000"/>
+                <w:sz w:val="21"/>
+                <w:szCs w:val="21"/>
+              </w:rPr>
+              <w:t xml:space="preserve">→</w:t>
+            </w:r>
+            <w:r>
+              <w:tab/>
+            </w:r>
+            <w:r>
+              <w:rPr>
+                <w:sz w:val="21"/>
+                <w:szCs w:val="21"/>
+              </w:rPr>
+              <w:t xml:space="preserve">Conclude the FTA; use the technology partnership for AI, cyber and quantum</w:t>
+            </w:r>
+          </w:p>
+          <w:p>
+            <w:pPr>
+              <w:tabs>
+                <w:tab w:val="left" w:pos="260"/>
+              </w:tabs>
+              <w:spacing w:after="0" w:before="40" w:line="280"/>
+              <w:ind w:left="260" w:hanging="260"/>
+            </w:pPr>
+            <w:r>
+              <w:rPr>
+                <w:b/>
+                <w:bCs/>
+                <w:color w:val="C00000"/>
+                <w:sz w:val="21"/>
+                <w:szCs w:val="21"/>
+              </w:rPr>
+              <w:t xml:space="preserve">→</w:t>
+            </w:r>
+            <w:r>
+              <w:tab/>
+            </w:r>
+            <w:r>
+              <w:rPr>
+                <w:sz w:val="21"/>
+                <w:szCs w:val="21"/>
+              </w:rPr>
+              <w:t xml:space="preserve">IMEC and I2U2 to link India, the Gulf, Israel and Europe; help rebuild Gaza</w:t>
+            </w:r>
+          </w:p>
+          <w:p>
+            <w:pPr>
+              <w:tabs>
+                <w:tab w:val="left" w:pos="260"/>
+              </w:tabs>
+              <w:spacing w:after="0" w:before="40" w:line="280"/>
+              <w:ind w:left="260" w:hanging="260"/>
+            </w:pPr>
+            <w:r>
+              <w:rPr>
+                <w:b/>
+                <w:bCs/>
+                <w:color w:val="C00000"/>
+                <w:sz w:val="21"/>
+                <w:szCs w:val="21"/>
+              </w:rPr>
+              <w:t xml:space="preserve">→</w:t>
+            </w:r>
+            <w:r>
+              <w:tab/>
+            </w:r>
+            <w:r>
+              <w:rPr>
+                <w:sz w:val="21"/>
+                <w:szCs w:val="21"/>
+              </w:rPr>
+              <w:t xml:space="preserve">Protect Indian workers and sailors: evacuation capacity, clear advisories</w:t>
+            </w:r>
+          </w:p>
+          <w:p>
+            <w:pPr>
+              <w:tabs>
+                <w:tab w:val="left" w:pos="260"/>
+              </w:tabs>
+              <w:spacing w:after="0" w:before="40" w:line="280"/>
+              <w:ind w:left="260" w:hanging="260"/>
+            </w:pPr>
+            <w:r>
+              <w:rPr>
+                <w:b/>
+                <w:bCs/>
+                <w:color w:val="C00000"/>
+                <w:sz w:val="21"/>
+                <w:szCs w:val="21"/>
+              </w:rPr>
+              <w:t xml:space="preserve">→</w:t>
+            </w:r>
+            <w:r>
+              <w:tab/>
+            </w:r>
+            <w:r>
+              <w:rPr>
+                <w:sz w:val="21"/>
+                <w:szCs w:val="21"/>
+              </w:rPr>
+              <w:t xml:space="preserve">Push for de-escalation in West Asia through quiet diplomacy</w:t>
+            </w:r>
+          </w:p>
+          <w:p>
+            <w:pPr>
+              <w:tabs>
+                <w:tab w:val="left" w:pos="260"/>
+              </w:tabs>
+              <w:spacing w:after="0" w:before="40" w:line="280"/>
+              <w:ind w:left="260" w:hanging="260"/>
+            </w:pPr>
+            <w:r>
+              <w:rPr>
+                <w:b/>
+                <w:bCs/>
+                <w:color w:val="C00000"/>
+                <w:sz w:val="21"/>
+                <w:szCs w:val="21"/>
+              </w:rPr>
+              <w:t xml:space="preserve">→</w:t>
+            </w:r>
+            <w:r>
+              <w:tab/>
+            </w:r>
+            <w:r>
+              <w:rPr>
+                <w:sz w:val="21"/>
+                <w:szCs w:val="21"/>
+              </w:rPr>
+              <w:t xml:space="preserve">Counter-terror cooperation; zero tolerance for terrorism anywhere</w:t>
+            </w:r>
+          </w:p>
+        </w:tc>
+      </w:tr>
+      <w:tr>
+        <w:trPr>
+          <w:cantSplit/>
+        </w:trPr>
+        <w:tc>
+          <w:tcPr>
+            <w:tcW w:type="dxa" w:w="520"/>
+            <w:tcBorders>
+              <w:top w:val="single" w:color="BFBFBF" w:sz="4"/>
+              <w:left w:val="single" w:color="BFBFBF" w:sz="4"/>
+              <w:bottom w:val="single" w:color="BFBFBF" w:sz="4"/>
+              <w:right w:val="single" w:color="BFBFBF" w:sz="4"/>
+            </w:tcBorders>
+            <w:shd w:fill="F5F7FB" w:color="auto" w:val="clear"/>
+            <w:tcMar>
+              <w:top w:type="dxa" w:w="70"/>
+              <w:left w:type="dxa" w:w="100"/>
+              <w:bottom w:type="dxa" w:w="70"/>
+              <w:right w:type="dxa" w:w="100"/>
+            </w:tcMar>
+            <w:vAlign w:val="center"/>
+          </w:tcPr>
+          <w:p>
+            <w:pPr>
+              <w:spacing w:after="0" w:before="0" w:line="300"/>
+              <w:jc w:val="center"/>
+            </w:pPr>
+            <w:r>
+              <w:rPr>
+                <w:color w:val="7F7F7F"/>
+                <w:sz w:val="21"/>
+                <w:szCs w:val="21"/>
+              </w:rPr>
+              <w:t xml:space="preserve">6</w:t>
+            </w:r>
+          </w:p>
+        </w:tc>
+        <w:tc>
+          <w:tcPr>
+            <w:tcW w:type="dxa" w:w="2200"/>
+            <w:tcBorders>
+              <w:top w:val="single" w:color="BFBFBF" w:sz="4"/>
+              <w:left w:val="single" w:color="BFBFBF" w:sz="4"/>
+              <w:bottom w:val="single" w:color="BFBFBF" w:sz="4"/>
+              <w:right w:val="single" w:color="BFBFBF" w:sz="4"/>
+            </w:tcBorders>
+            <w:shd w:fill="F5F7FB" w:color="auto" w:val="clear"/>
+            <w:tcMar>
+              <w:top w:type="dxa" w:w="70"/>
+              <w:left w:type="dxa" w:w="100"/>
+              <w:bottom w:type="dxa" w:w="70"/>
+              <w:right w:type="dxa" w:w="100"/>
+            </w:tcMar>
+            <w:vAlign w:val="center"/>
+          </w:tcPr>
+          <w:p>
+            <w:pPr>
+              <w:spacing w:after="0" w:before="0" w:line="300"/>
+            </w:pPr>
+            <w:r>
+              <w:rPr>
+                <w:b/>
+                <w:bCs/>
+                <w:color w:val="1F3864"/>
+                <w:sz w:val="21"/>
+                <w:szCs w:val="21"/>
+              </w:rPr>
+              <w:t xml:space="preserve">Conclusion</w:t>
+            </w:r>
+          </w:p>
+        </w:tc>
+        <w:tc>
+          <w:tcPr>
+            <w:tcW w:type="dxa" w:w="7986"/>
+            <w:tcBorders>
+              <w:top w:val="single" w:color="BFBFBF" w:sz="4"/>
+              <w:left w:val="single" w:color="BFBFBF" w:sz="4"/>
+              <w:bottom w:val="single" w:color="BFBFBF" w:sz="4"/>
+              <w:right w:val="single" w:color="BFBFBF" w:sz="4"/>
+            </w:tcBorders>
+            <w:shd w:fill="F5F7FB" w:color="auto" w:val="clear"/>
+            <w:tcMar>
+              <w:top w:type="dxa" w:w="70"/>
+              <w:left w:type="dxa" w:w="100"/>
+              <w:bottom w:type="dxa" w:w="70"/>
+              <w:right w:type="dxa" w:w="100"/>
+            </w:tcMar>
+            <w:vAlign w:val="center"/>
+          </w:tcPr>
+          <w:p>
+            <w:pPr>
+              <w:tabs>
+                <w:tab w:val="left" w:pos="260"/>
+              </w:tabs>
+              <w:spacing w:after="0" w:before="0" w:line="280"/>
+              <w:ind w:left="260" w:hanging="260"/>
+            </w:pPr>
+            <w:r>
+              <w:rPr>
+                <w:b/>
+                <w:bCs/>
+                <w:color w:val="C00000"/>
+                <w:sz w:val="21"/>
+                <w:szCs w:val="21"/>
+              </w:rPr>
+              <w:t xml:space="preserve">→</w:t>
+            </w:r>
+            <w:r>
+              <w:tab/>
+            </w:r>
+            <w:r>
+              <w:rPr>
+                <w:sz w:val="21"/>
+                <w:szCs w:val="21"/>
+              </w:rPr>
+              <w:t xml:space="preserve">Ties driven by interest and shared challenges, not ideology</w:t>
+            </w:r>
+          </w:p>
+          <w:p>
+            <w:pPr>
+              <w:tabs>
+                <w:tab w:val="left" w:pos="260"/>
+              </w:tabs>
+              <w:spacing w:after="0" w:before="40" w:line="280"/>
+              <w:ind w:left="260" w:hanging="260"/>
+            </w:pPr>
+            <w:r>
+              <w:rPr>
+                <w:b/>
+                <w:bCs/>
+                <w:color w:val="C00000"/>
+                <w:sz w:val="21"/>
+                <w:szCs w:val="21"/>
+              </w:rPr>
+              <w:t xml:space="preserve">→</w:t>
+            </w:r>
+            <w:r>
+              <w:tab/>
+            </w:r>
+            <w:r>
+              <w:rPr>
+                <w:sz w:val="21"/>
+                <w:szCs w:val="21"/>
+              </w:rPr>
+              <w:t xml:space="preserve">Engage all sides in West Asia while holding to India's principles</w:t>
+            </w:r>
+          </w:p>
+          <w:p>
+            <w:pPr>
+              <w:tabs>
+                <w:tab w:val="left" w:pos="260"/>
+              </w:tabs>
+              <w:spacing w:after="0" w:before="40" w:line="280"/>
+              <w:ind w:left="260" w:hanging="260"/>
+            </w:pPr>
+            <w:r>
+              <w:rPr>
+                <w:b/>
+                <w:bCs/>
+                <w:color w:val="C00000"/>
+                <w:sz w:val="21"/>
+                <w:szCs w:val="21"/>
+              </w:rPr>
+              <w:t xml:space="preserve">→</w:t>
+            </w:r>
+            <w:r>
+              <w:tab/>
+            </w:r>
+            <w:r>
+              <w:rPr>
+                <w:sz w:val="21"/>
+                <w:szCs w:val="21"/>
+              </w:rPr>
+              <w:t xml:space="preserve">A peaceful West Asia is directly in India's security and energy interest</w:t>
             </w:r>
           </w:p>
         </w:tc>

</xml_diff>